<commit_message>
Update quick start guide with flashlight and quicksave keybinds
</commit_message>
<xml_diff>
--- a/Doc/Project Apollo - NASSP/Programmers Notes/NASSP Quick Start Guide.docx
+++ b/Doc/Project Apollo - NASSP/Programmers Notes/NASSP Quick Start Guide.docx
@@ -9,6 +9,42 @@
       </w:pPr>
       <w:r>
         <w:t>NASSP Quick Start Guide</w:t>
+      </w:r>
+    </w:p>
+    <w:p>
+      <w:pPr>
+        <w:jc w:val="center"/>
+        <w:rPr>
+          <w:rStyle w:val="IntenseReference"/>
+          <w:b w:val="0"/>
+          <w:bCs w:val="0"/>
+        </w:rPr>
+      </w:pPr>
+      <w:r>
+        <w:rPr>
+          <w:rStyle w:val="IntenseReference"/>
+          <w:b w:val="0"/>
+          <w:bCs w:val="0"/>
+        </w:rPr>
+        <w:t xml:space="preserve">Revision 1.1 </w:t>
+      </w:r>
+    </w:p>
+    <w:p>
+      <w:pPr>
+        <w:jc w:val="center"/>
+        <w:rPr>
+          <w:rStyle w:val="IntenseReference"/>
+          <w:b w:val="0"/>
+          <w:bCs w:val="0"/>
+        </w:rPr>
+      </w:pPr>
+      <w:r>
+        <w:rPr>
+          <w:rStyle w:val="IntenseReference"/>
+          <w:b w:val="0"/>
+          <w:bCs w:val="0"/>
+        </w:rPr>
+        <w:t>15 APR 2025</w:t>
       </w:r>
     </w:p>
     <w:sdt>
@@ -512,16 +548,6 @@
     </w:p>
     <w:p>
       <w:pPr>
-        <w:jc w:val="center"/>
-        <w:rPr>
-          <w:b/>
-          <w:bCs/>
-        </w:rPr>
-      </w:pPr>
-    </w:p>
-    <w:p>
-      <w:pPr>
-        <w:jc w:val="center"/>
         <w:rPr>
           <w:b/>
           <w:bCs/>
@@ -979,14 +1005,11 @@
     <w:p/>
     <w:p>
       <w:r>
-        <w:lastRenderedPageBreak/>
-        <w:br/>
-      </w:r>
-      <w:r>
         <w:rPr>
           <w:b/>
           <w:bCs/>
         </w:rPr>
+        <w:lastRenderedPageBreak/>
         <w:t>Configure Project Apollo:</w:t>
       </w:r>
       <w:r>
@@ -1077,9 +1100,6 @@
         <w:t>Please note, timestamped saves (i.e. those within the "Apollo Mission Scenarios" folder) do not have the latest systems updates. Because of this, they may have alarms and other quirks when loading them. We encourage starting with a fresh launch.</w:t>
       </w:r>
     </w:p>
-    <w:p/>
-    <w:p/>
-    <w:p/>
     <w:p/>
     <w:p/>
     <w:p/>
@@ -1089,6 +1109,12 @@
         <w:pStyle w:val="Heading1"/>
       </w:pPr>
       <w:bookmarkStart w:id="1" w:name="_Toc192162523"/>
+    </w:p>
+    <w:p/>
+    <w:p>
+      <w:pPr>
+        <w:pStyle w:val="Heading1"/>
+      </w:pPr>
       <w:r>
         <w:lastRenderedPageBreak/>
         <w:t>Tips For Beginners:</w:t>
@@ -2044,52 +2070,80 @@
             <w:tcW w:w="1681" w:type="pct"/>
             <w:tcBorders>
               <w:top w:val="nil"/>
+              <w:left w:val="single" w:sz="4" w:space="0" w:color="auto"/>
+              <w:bottom w:val="single" w:sz="4" w:space="0" w:color="auto"/>
+              <w:right w:val="single" w:sz="4" w:space="0" w:color="auto"/>
+            </w:tcBorders>
+            <w:shd w:val="clear" w:color="auto" w:fill="auto"/>
+            <w:noWrap/>
+            <w:vAlign w:val="bottom"/>
+          </w:tcPr>
+          <w:p>
+            <w:pPr>
+              <w:spacing w:after="0" w:line="240" w:lineRule="auto"/>
+              <w:rPr>
+                <w:rFonts w:eastAsia="Times New Roman" w:cs="Times New Roman"/>
+                <w:color w:val="000000"/>
+                <w:kern w:val="0"/>
+                <w14:ligatures w14:val="none"/>
+              </w:rPr>
+            </w:pPr>
+            <w:proofErr w:type="spellStart"/>
+            <w:r>
+              <w:rPr>
+                <w:rFonts w:eastAsia="Times New Roman" w:cs="Times New Roman"/>
+                <w:color w:val="000000"/>
+                <w:kern w:val="0"/>
+                <w14:ligatures w14:val="none"/>
+              </w:rPr>
+              <w:t>Ctrl+Alt+S</w:t>
+            </w:r>
+            <w:proofErr w:type="spellEnd"/>
+          </w:p>
+        </w:tc>
+        <w:tc>
+          <w:tcPr>
+            <w:tcW w:w="3319" w:type="pct"/>
+            <w:tcBorders>
+              <w:top w:val="nil"/>
               <w:left w:val="nil"/>
-              <w:bottom w:val="nil"/>
-              <w:right w:val="nil"/>
-            </w:tcBorders>
-            <w:shd w:val="clear" w:color="auto" w:fill="auto"/>
-            <w:noWrap/>
-            <w:vAlign w:val="bottom"/>
-            <w:hideMark/>
-          </w:tcPr>
-          <w:p>
-            <w:pPr>
-              <w:spacing w:after="0" w:line="240" w:lineRule="auto"/>
-              <w:rPr>
-                <w:rFonts w:eastAsia="Times New Roman" w:cs="Times New Roman"/>
-                <w:color w:val="000000"/>
-                <w:kern w:val="0"/>
-                <w14:ligatures w14:val="none"/>
-              </w:rPr>
-            </w:pPr>
-          </w:p>
-        </w:tc>
-        <w:tc>
-          <w:tcPr>
-            <w:tcW w:w="3319" w:type="pct"/>
-            <w:tcBorders>
-              <w:top w:val="nil"/>
-              <w:left w:val="nil"/>
-              <w:bottom w:val="nil"/>
-              <w:right w:val="nil"/>
-            </w:tcBorders>
-            <w:shd w:val="clear" w:color="auto" w:fill="auto"/>
-            <w:noWrap/>
-            <w:vAlign w:val="bottom"/>
-            <w:hideMark/>
-          </w:tcPr>
-          <w:p>
-            <w:pPr>
-              <w:spacing w:after="0" w:line="240" w:lineRule="auto"/>
-              <w:rPr>
-                <w:rFonts w:eastAsia="Times New Roman" w:cs="Times New Roman"/>
-                <w:kern w:val="0"/>
-                <w:sz w:val="20"/>
-                <w:szCs w:val="20"/>
-                <w14:ligatures w14:val="none"/>
-              </w:rPr>
-            </w:pPr>
+              <w:bottom w:val="single" w:sz="4" w:space="0" w:color="auto"/>
+              <w:right w:val="single" w:sz="4" w:space="0" w:color="auto"/>
+            </w:tcBorders>
+            <w:shd w:val="clear" w:color="auto" w:fill="auto"/>
+            <w:noWrap/>
+            <w:vAlign w:val="bottom"/>
+          </w:tcPr>
+          <w:p>
+            <w:pPr>
+              <w:spacing w:after="0" w:line="240" w:lineRule="auto"/>
+              <w:rPr>
+                <w:rFonts w:eastAsia="Times New Roman" w:cs="Times New Roman"/>
+                <w:color w:val="000000"/>
+                <w:kern w:val="0"/>
+                <w14:ligatures w14:val="none"/>
+              </w:rPr>
+            </w:pPr>
+            <w:r>
+              <w:rPr>
+                <w:rFonts w:eastAsia="Times New Roman" w:cs="Times New Roman"/>
+                <w:color w:val="000000"/>
+                <w:kern w:val="0"/>
+                <w14:ligatures w14:val="none"/>
+              </w:rPr>
+              <w:t xml:space="preserve">Generate Mission Time-Stamped </w:t>
+            </w:r>
+            <w:proofErr w:type="spellStart"/>
+            <w:r>
+              <w:rPr>
+                <w:rFonts w:eastAsia="Times New Roman" w:cs="Times New Roman"/>
+                <w:color w:val="000000"/>
+                <w:kern w:val="0"/>
+                <w14:ligatures w14:val="none"/>
+              </w:rPr>
+              <w:t>Quicksave</w:t>
+            </w:r>
+            <w:proofErr w:type="spellEnd"/>
           </w:p>
         </w:tc>
       </w:tr>
@@ -2099,43 +2153,55 @@
         </w:trPr>
         <w:tc>
           <w:tcPr>
-            <w:tcW w:w="5000" w:type="pct"/>
-            <w:gridSpan w:val="2"/>
-            <w:tcBorders>
-              <w:top w:val="single" w:sz="4" w:space="0" w:color="auto"/>
-              <w:left w:val="single" w:sz="4" w:space="0" w:color="auto"/>
-              <w:bottom w:val="single" w:sz="4" w:space="0" w:color="auto"/>
-              <w:right w:val="single" w:sz="4" w:space="0" w:color="auto"/>
-            </w:tcBorders>
-            <w:shd w:val="clear" w:color="auto" w:fill="auto"/>
-            <w:noWrap/>
-            <w:vAlign w:val="bottom"/>
-            <w:hideMark/>
-          </w:tcPr>
-          <w:p>
-            <w:pPr>
-              <w:spacing w:after="0" w:line="240" w:lineRule="auto"/>
-              <w:jc w:val="center"/>
-              <w:rPr>
-                <w:rFonts w:eastAsia="Times New Roman" w:cs="Times New Roman"/>
-                <w:b/>
-                <w:bCs/>
-                <w:color w:val="000000"/>
-                <w:kern w:val="0"/>
-                <w14:ligatures w14:val="none"/>
-              </w:rPr>
-            </w:pPr>
-            <w:r>
-              <w:rPr>
-                <w:rFonts w:eastAsia="Times New Roman" w:cs="Times New Roman"/>
-                <w:b/>
-                <w:bCs/>
-                <w:color w:val="000000"/>
-                <w:kern w:val="0"/>
-                <w14:ligatures w14:val="none"/>
-              </w:rPr>
-              <w:t>Virtual Cockpit</w:t>
-            </w:r>
+            <w:tcW w:w="1681" w:type="pct"/>
+            <w:tcBorders>
+              <w:top w:val="nil"/>
+              <w:left w:val="nil"/>
+              <w:bottom w:val="nil"/>
+              <w:right w:val="nil"/>
+            </w:tcBorders>
+            <w:shd w:val="clear" w:color="auto" w:fill="auto"/>
+            <w:noWrap/>
+            <w:vAlign w:val="bottom"/>
+            <w:hideMark/>
+          </w:tcPr>
+          <w:p>
+            <w:pPr>
+              <w:spacing w:after="0" w:line="240" w:lineRule="auto"/>
+              <w:rPr>
+                <w:rFonts w:eastAsia="Times New Roman" w:cs="Times New Roman"/>
+                <w:color w:val="000000"/>
+                <w:kern w:val="0"/>
+                <w14:ligatures w14:val="none"/>
+              </w:rPr>
+            </w:pPr>
+          </w:p>
+        </w:tc>
+        <w:tc>
+          <w:tcPr>
+            <w:tcW w:w="3319" w:type="pct"/>
+            <w:tcBorders>
+              <w:top w:val="nil"/>
+              <w:left w:val="nil"/>
+              <w:bottom w:val="nil"/>
+              <w:right w:val="nil"/>
+            </w:tcBorders>
+            <w:shd w:val="clear" w:color="auto" w:fill="auto"/>
+            <w:noWrap/>
+            <w:vAlign w:val="bottom"/>
+            <w:hideMark/>
+          </w:tcPr>
+          <w:p>
+            <w:pPr>
+              <w:spacing w:after="0" w:line="240" w:lineRule="auto"/>
+              <w:rPr>
+                <w:rFonts w:eastAsia="Times New Roman" w:cs="Times New Roman"/>
+                <w:kern w:val="0"/>
+                <w:sz w:val="20"/>
+                <w:szCs w:val="20"/>
+                <w14:ligatures w14:val="none"/>
+              </w:rPr>
+            </w:pPr>
           </w:p>
         </w:tc>
       </w:tr>
@@ -2145,9 +2211,10 @@
         </w:trPr>
         <w:tc>
           <w:tcPr>
-            <w:tcW w:w="1681" w:type="pct"/>
-            <w:tcBorders>
-              <w:top w:val="nil"/>
+            <w:tcW w:w="5000" w:type="pct"/>
+            <w:gridSpan w:val="2"/>
+            <w:tcBorders>
+              <w:top w:val="single" w:sz="4" w:space="0" w:color="auto"/>
               <w:left w:val="single" w:sz="4" w:space="0" w:color="auto"/>
               <w:bottom w:val="single" w:sz="4" w:space="0" w:color="auto"/>
               <w:right w:val="single" w:sz="4" w:space="0" w:color="auto"/>
@@ -2160,56 +2227,26 @@
           <w:p>
             <w:pPr>
               <w:spacing w:after="0" w:line="240" w:lineRule="auto"/>
-              <w:rPr>
-                <w:rFonts w:eastAsia="Times New Roman" w:cs="Times New Roman"/>
-                <w:color w:val="000000"/>
-                <w:kern w:val="0"/>
-                <w14:ligatures w14:val="none"/>
-              </w:rPr>
-            </w:pPr>
-            <w:r>
-              <w:rPr>
-                <w:rFonts w:eastAsia="Times New Roman" w:cs="Times New Roman"/>
-                <w:color w:val="000000"/>
-                <w:kern w:val="0"/>
-                <w14:ligatures w14:val="none"/>
-              </w:rPr>
-              <w:t>Arrow keys</w:t>
-            </w:r>
-          </w:p>
-        </w:tc>
-        <w:tc>
-          <w:tcPr>
-            <w:tcW w:w="3319" w:type="pct"/>
-            <w:tcBorders>
-              <w:top w:val="nil"/>
-              <w:left w:val="nil"/>
-              <w:bottom w:val="single" w:sz="4" w:space="0" w:color="auto"/>
-              <w:right w:val="single" w:sz="4" w:space="0" w:color="auto"/>
-            </w:tcBorders>
-            <w:shd w:val="clear" w:color="auto" w:fill="auto"/>
-            <w:noWrap/>
-            <w:vAlign w:val="bottom"/>
-            <w:hideMark/>
-          </w:tcPr>
-          <w:p>
-            <w:pPr>
-              <w:spacing w:after="0" w:line="240" w:lineRule="auto"/>
-              <w:rPr>
-                <w:rFonts w:eastAsia="Times New Roman" w:cs="Times New Roman"/>
-                <w:color w:val="000000"/>
-                <w:kern w:val="0"/>
-                <w14:ligatures w14:val="none"/>
-              </w:rPr>
-            </w:pPr>
-            <w:r>
-              <w:rPr>
-                <w:rFonts w:eastAsia="Times New Roman" w:cs="Times New Roman"/>
-                <w:color w:val="000000"/>
-                <w:kern w:val="0"/>
-                <w14:ligatures w14:val="none"/>
-              </w:rPr>
-              <w:t>Scroll Left/Right/Up/Down</w:t>
+              <w:jc w:val="center"/>
+              <w:rPr>
+                <w:rFonts w:eastAsia="Times New Roman" w:cs="Times New Roman"/>
+                <w:b/>
+                <w:bCs/>
+                <w:color w:val="000000"/>
+                <w:kern w:val="0"/>
+                <w14:ligatures w14:val="none"/>
+              </w:rPr>
+            </w:pPr>
+            <w:r>
+              <w:rPr>
+                <w:rFonts w:eastAsia="Times New Roman" w:cs="Times New Roman"/>
+                <w:b/>
+                <w:bCs/>
+                <w:color w:val="000000"/>
+                <w:kern w:val="0"/>
+                <w14:ligatures w14:val="none"/>
+              </w:rPr>
+              <w:t>Virtual Cockpit</w:t>
             </w:r>
           </w:p>
         </w:tc>
@@ -2249,7 +2286,7 @@
                 <w:kern w:val="0"/>
                 <w14:ligatures w14:val="none"/>
               </w:rPr>
-              <w:t>Insert/Delete</w:t>
+              <w:t>Arrow keys</w:t>
             </w:r>
           </w:p>
         </w:tc>
@@ -2284,7 +2321,7 @@
                 <w:kern w:val="0"/>
                 <w14:ligatures w14:val="none"/>
               </w:rPr>
-              <w:t>Scroll Forward/Backward</w:t>
+              <w:t>Scroll Left/Right/Up/Down</w:t>
             </w:r>
           </w:p>
         </w:tc>
@@ -2324,7 +2361,7 @@
                 <w:kern w:val="0"/>
                 <w14:ligatures w14:val="none"/>
               </w:rPr>
-              <w:t>Shift</w:t>
+              <w:t>Insert/Delete</w:t>
             </w:r>
           </w:p>
         </w:tc>
@@ -2359,7 +2396,7 @@
                 <w:kern w:val="0"/>
                 <w14:ligatures w14:val="none"/>
               </w:rPr>
-              <w:t>Scroll Slowly</w:t>
+              <w:t>Scroll Forward/Backward</w:t>
             </w:r>
           </w:p>
         </w:tc>
@@ -2373,52 +2410,69 @@
             <w:tcW w:w="1681" w:type="pct"/>
             <w:tcBorders>
               <w:top w:val="nil"/>
+              <w:left w:val="single" w:sz="4" w:space="0" w:color="auto"/>
+              <w:bottom w:val="single" w:sz="4" w:space="0" w:color="auto"/>
+              <w:right w:val="single" w:sz="4" w:space="0" w:color="auto"/>
+            </w:tcBorders>
+            <w:shd w:val="clear" w:color="auto" w:fill="auto"/>
+            <w:noWrap/>
+            <w:vAlign w:val="bottom"/>
+            <w:hideMark/>
+          </w:tcPr>
+          <w:p>
+            <w:pPr>
+              <w:spacing w:after="0" w:line="240" w:lineRule="auto"/>
+              <w:rPr>
+                <w:rFonts w:eastAsia="Times New Roman" w:cs="Times New Roman"/>
+                <w:color w:val="000000"/>
+                <w:kern w:val="0"/>
+                <w14:ligatures w14:val="none"/>
+              </w:rPr>
+            </w:pPr>
+            <w:r>
+              <w:rPr>
+                <w:rFonts w:eastAsia="Times New Roman" w:cs="Times New Roman"/>
+                <w:color w:val="000000"/>
+                <w:kern w:val="0"/>
+                <w14:ligatures w14:val="none"/>
+              </w:rPr>
+              <w:t>Shift</w:t>
+            </w:r>
+          </w:p>
+        </w:tc>
+        <w:tc>
+          <w:tcPr>
+            <w:tcW w:w="3319" w:type="pct"/>
+            <w:tcBorders>
+              <w:top w:val="nil"/>
               <w:left w:val="nil"/>
-              <w:bottom w:val="nil"/>
-              <w:right w:val="nil"/>
-            </w:tcBorders>
-            <w:shd w:val="clear" w:color="auto" w:fill="auto"/>
-            <w:noWrap/>
-            <w:vAlign w:val="bottom"/>
-            <w:hideMark/>
-          </w:tcPr>
-          <w:p>
-            <w:pPr>
-              <w:spacing w:after="0" w:line="240" w:lineRule="auto"/>
-              <w:rPr>
-                <w:rFonts w:eastAsia="Times New Roman" w:cs="Times New Roman"/>
-                <w:color w:val="000000"/>
-                <w:kern w:val="0"/>
-                <w14:ligatures w14:val="none"/>
-              </w:rPr>
-            </w:pPr>
-          </w:p>
-        </w:tc>
-        <w:tc>
-          <w:tcPr>
-            <w:tcW w:w="3319" w:type="pct"/>
-            <w:tcBorders>
-              <w:top w:val="nil"/>
-              <w:left w:val="nil"/>
-              <w:bottom w:val="nil"/>
-              <w:right w:val="nil"/>
-            </w:tcBorders>
-            <w:shd w:val="clear" w:color="auto" w:fill="auto"/>
-            <w:noWrap/>
-            <w:vAlign w:val="bottom"/>
-            <w:hideMark/>
-          </w:tcPr>
-          <w:p>
-            <w:pPr>
-              <w:spacing w:after="0" w:line="240" w:lineRule="auto"/>
-              <w:rPr>
-                <w:rFonts w:eastAsia="Times New Roman" w:cs="Times New Roman"/>
-                <w:kern w:val="0"/>
-                <w:sz w:val="20"/>
-                <w:szCs w:val="20"/>
-                <w14:ligatures w14:val="none"/>
-              </w:rPr>
-            </w:pPr>
+              <w:bottom w:val="single" w:sz="4" w:space="0" w:color="auto"/>
+              <w:right w:val="single" w:sz="4" w:space="0" w:color="auto"/>
+            </w:tcBorders>
+            <w:shd w:val="clear" w:color="auto" w:fill="auto"/>
+            <w:noWrap/>
+            <w:vAlign w:val="bottom"/>
+            <w:hideMark/>
+          </w:tcPr>
+          <w:p>
+            <w:pPr>
+              <w:spacing w:after="0" w:line="240" w:lineRule="auto"/>
+              <w:rPr>
+                <w:rFonts w:eastAsia="Times New Roman" w:cs="Times New Roman"/>
+                <w:color w:val="000000"/>
+                <w:kern w:val="0"/>
+                <w14:ligatures w14:val="none"/>
+              </w:rPr>
+            </w:pPr>
+            <w:r>
+              <w:rPr>
+                <w:rFonts w:eastAsia="Times New Roman" w:cs="Times New Roman"/>
+                <w:color w:val="000000"/>
+                <w:kern w:val="0"/>
+                <w14:ligatures w14:val="none"/>
+              </w:rPr>
+              <w:t>Scroll Slowly</w:t>
+            </w:r>
           </w:p>
         </w:tc>
       </w:tr>
@@ -2428,10 +2482,9 @@
         </w:trPr>
         <w:tc>
           <w:tcPr>
-            <w:tcW w:w="5000" w:type="pct"/>
-            <w:gridSpan w:val="2"/>
-            <w:tcBorders>
-              <w:top w:val="single" w:sz="4" w:space="0" w:color="auto"/>
+            <w:tcW w:w="1681" w:type="pct"/>
+            <w:tcBorders>
+              <w:top w:val="nil"/>
               <w:left w:val="single" w:sz="4" w:space="0" w:color="auto"/>
               <w:bottom w:val="single" w:sz="4" w:space="0" w:color="auto"/>
               <w:right w:val="single" w:sz="4" w:space="0" w:color="auto"/>
@@ -2439,31 +2492,59 @@
             <w:shd w:val="clear" w:color="auto" w:fill="auto"/>
             <w:noWrap/>
             <w:vAlign w:val="bottom"/>
-            <w:hideMark/>
-          </w:tcPr>
-          <w:p>
-            <w:pPr>
-              <w:spacing w:after="0" w:line="240" w:lineRule="auto"/>
-              <w:jc w:val="center"/>
-              <w:rPr>
-                <w:rFonts w:eastAsia="Times New Roman" w:cs="Times New Roman"/>
-                <w:b/>
-                <w:bCs/>
-                <w:color w:val="000000"/>
-                <w:kern w:val="0"/>
-                <w14:ligatures w14:val="none"/>
-              </w:rPr>
-            </w:pPr>
-            <w:r>
-              <w:rPr>
-                <w:rFonts w:eastAsia="Times New Roman" w:cs="Times New Roman"/>
-                <w:b/>
-                <w:bCs/>
-                <w:color w:val="000000"/>
-                <w:kern w:val="0"/>
-                <w14:ligatures w14:val="none"/>
-              </w:rPr>
-              <w:t>Spacecraft Rotation</w:t>
+          </w:tcPr>
+          <w:p>
+            <w:pPr>
+              <w:spacing w:after="0" w:line="240" w:lineRule="auto"/>
+              <w:rPr>
+                <w:rFonts w:eastAsia="Times New Roman" w:cs="Times New Roman"/>
+                <w:color w:val="000000"/>
+                <w:kern w:val="0"/>
+                <w14:ligatures w14:val="none"/>
+              </w:rPr>
+            </w:pPr>
+            <w:r>
+              <w:rPr>
+                <w:rFonts w:eastAsia="Times New Roman" w:cs="Times New Roman"/>
+                <w:color w:val="000000"/>
+                <w:kern w:val="0"/>
+                <w14:ligatures w14:val="none"/>
+              </w:rPr>
+              <w:t>F</w:t>
+            </w:r>
+          </w:p>
+        </w:tc>
+        <w:tc>
+          <w:tcPr>
+            <w:tcW w:w="3319" w:type="pct"/>
+            <w:tcBorders>
+              <w:top w:val="nil"/>
+              <w:left w:val="nil"/>
+              <w:bottom w:val="single" w:sz="4" w:space="0" w:color="auto"/>
+              <w:right w:val="single" w:sz="4" w:space="0" w:color="auto"/>
+            </w:tcBorders>
+            <w:shd w:val="clear" w:color="auto" w:fill="auto"/>
+            <w:noWrap/>
+            <w:vAlign w:val="bottom"/>
+          </w:tcPr>
+          <w:p>
+            <w:pPr>
+              <w:spacing w:after="0" w:line="240" w:lineRule="auto"/>
+              <w:rPr>
+                <w:rFonts w:eastAsia="Times New Roman" w:cs="Times New Roman"/>
+                <w:color w:val="000000"/>
+                <w:kern w:val="0"/>
+                <w14:ligatures w14:val="none"/>
+              </w:rPr>
+            </w:pPr>
+            <w:r>
+              <w:rPr>
+                <w:rFonts w:eastAsia="Times New Roman" w:cs="Times New Roman"/>
+                <w:color w:val="000000"/>
+                <w:kern w:val="0"/>
+                <w14:ligatures w14:val="none"/>
+              </w:rPr>
+              <w:t>Enable/Disable Flashlight</w:t>
             </w:r>
           </w:p>
         </w:tc>
@@ -2477,34 +2558,25 @@
             <w:tcW w:w="1681" w:type="pct"/>
             <w:tcBorders>
               <w:top w:val="nil"/>
-              <w:left w:val="single" w:sz="4" w:space="0" w:color="auto"/>
-              <w:bottom w:val="single" w:sz="4" w:space="0" w:color="auto"/>
-              <w:right w:val="single" w:sz="4" w:space="0" w:color="auto"/>
-            </w:tcBorders>
-            <w:shd w:val="clear" w:color="auto" w:fill="auto"/>
-            <w:noWrap/>
-            <w:vAlign w:val="bottom"/>
-            <w:hideMark/>
-          </w:tcPr>
-          <w:p>
-            <w:pPr>
-              <w:spacing w:after="0" w:line="240" w:lineRule="auto"/>
-              <w:rPr>
-                <w:rFonts w:eastAsia="Times New Roman" w:cs="Times New Roman"/>
-                <w:color w:val="000000"/>
-                <w:kern w:val="0"/>
-                <w14:ligatures w14:val="none"/>
-              </w:rPr>
-            </w:pPr>
-            <w:r>
-              <w:rPr>
-                <w:rFonts w:eastAsia="Times New Roman" w:cs="Times New Roman"/>
-                <w:color w:val="000000"/>
-                <w:kern w:val="0"/>
-                <w14:ligatures w14:val="none"/>
-              </w:rPr>
-              <w:t>2 (Numpad)</w:t>
-            </w:r>
+              <w:left w:val="nil"/>
+              <w:bottom w:val="nil"/>
+              <w:right w:val="nil"/>
+            </w:tcBorders>
+            <w:shd w:val="clear" w:color="auto" w:fill="auto"/>
+            <w:noWrap/>
+            <w:vAlign w:val="bottom"/>
+            <w:hideMark/>
+          </w:tcPr>
+          <w:p>
+            <w:pPr>
+              <w:spacing w:after="0" w:line="240" w:lineRule="auto"/>
+              <w:rPr>
+                <w:rFonts w:eastAsia="Times New Roman" w:cs="Times New Roman"/>
+                <w:color w:val="000000"/>
+                <w:kern w:val="0"/>
+                <w14:ligatures w14:val="none"/>
+              </w:rPr>
+            </w:pPr>
           </w:p>
         </w:tc>
         <w:tc>
@@ -2513,33 +2585,25 @@
             <w:tcBorders>
               <w:top w:val="nil"/>
               <w:left w:val="nil"/>
-              <w:bottom w:val="single" w:sz="4" w:space="0" w:color="auto"/>
-              <w:right w:val="single" w:sz="4" w:space="0" w:color="auto"/>
-            </w:tcBorders>
-            <w:shd w:val="clear" w:color="auto" w:fill="auto"/>
-            <w:noWrap/>
-            <w:vAlign w:val="bottom"/>
-            <w:hideMark/>
-          </w:tcPr>
-          <w:p>
-            <w:pPr>
-              <w:spacing w:after="0" w:line="240" w:lineRule="auto"/>
-              <w:rPr>
-                <w:rFonts w:eastAsia="Times New Roman" w:cs="Times New Roman"/>
-                <w:color w:val="000000"/>
-                <w:kern w:val="0"/>
-                <w14:ligatures w14:val="none"/>
-              </w:rPr>
-            </w:pPr>
-            <w:r>
-              <w:rPr>
-                <w:rFonts w:eastAsia="Times New Roman" w:cs="Times New Roman"/>
-                <w:color w:val="000000"/>
-                <w:kern w:val="0"/>
-                <w14:ligatures w14:val="none"/>
-              </w:rPr>
-              <w:t>Pitch Up</w:t>
-            </w:r>
+              <w:bottom w:val="nil"/>
+              <w:right w:val="nil"/>
+            </w:tcBorders>
+            <w:shd w:val="clear" w:color="auto" w:fill="auto"/>
+            <w:noWrap/>
+            <w:vAlign w:val="bottom"/>
+            <w:hideMark/>
+          </w:tcPr>
+          <w:p>
+            <w:pPr>
+              <w:spacing w:after="0" w:line="240" w:lineRule="auto"/>
+              <w:rPr>
+                <w:rFonts w:eastAsia="Times New Roman" w:cs="Times New Roman"/>
+                <w:kern w:val="0"/>
+                <w:sz w:val="20"/>
+                <w:szCs w:val="20"/>
+                <w14:ligatures w14:val="none"/>
+              </w:rPr>
+            </w:pPr>
           </w:p>
         </w:tc>
       </w:tr>
@@ -2549,9 +2613,10 @@
         </w:trPr>
         <w:tc>
           <w:tcPr>
-            <w:tcW w:w="1681" w:type="pct"/>
-            <w:tcBorders>
-              <w:top w:val="nil"/>
+            <w:tcW w:w="5000" w:type="pct"/>
+            <w:gridSpan w:val="2"/>
+            <w:tcBorders>
+              <w:top w:val="single" w:sz="4" w:space="0" w:color="auto"/>
               <w:left w:val="single" w:sz="4" w:space="0" w:color="auto"/>
               <w:bottom w:val="single" w:sz="4" w:space="0" w:color="auto"/>
               <w:right w:val="single" w:sz="4" w:space="0" w:color="auto"/>
@@ -2564,56 +2629,26 @@
           <w:p>
             <w:pPr>
               <w:spacing w:after="0" w:line="240" w:lineRule="auto"/>
-              <w:rPr>
-                <w:rFonts w:eastAsia="Times New Roman" w:cs="Times New Roman"/>
-                <w:color w:val="000000"/>
-                <w:kern w:val="0"/>
-                <w14:ligatures w14:val="none"/>
-              </w:rPr>
-            </w:pPr>
-            <w:r>
-              <w:rPr>
-                <w:rFonts w:eastAsia="Times New Roman" w:cs="Times New Roman"/>
-                <w:color w:val="000000"/>
-                <w:kern w:val="0"/>
-                <w14:ligatures w14:val="none"/>
-              </w:rPr>
-              <w:t>8 (Numpad)</w:t>
-            </w:r>
-          </w:p>
-        </w:tc>
-        <w:tc>
-          <w:tcPr>
-            <w:tcW w:w="3319" w:type="pct"/>
-            <w:tcBorders>
-              <w:top w:val="nil"/>
-              <w:left w:val="nil"/>
-              <w:bottom w:val="single" w:sz="4" w:space="0" w:color="auto"/>
-              <w:right w:val="single" w:sz="4" w:space="0" w:color="auto"/>
-            </w:tcBorders>
-            <w:shd w:val="clear" w:color="auto" w:fill="auto"/>
-            <w:noWrap/>
-            <w:vAlign w:val="bottom"/>
-            <w:hideMark/>
-          </w:tcPr>
-          <w:p>
-            <w:pPr>
-              <w:spacing w:after="0" w:line="240" w:lineRule="auto"/>
-              <w:rPr>
-                <w:rFonts w:eastAsia="Times New Roman" w:cs="Times New Roman"/>
-                <w:color w:val="000000"/>
-                <w:kern w:val="0"/>
-                <w14:ligatures w14:val="none"/>
-              </w:rPr>
-            </w:pPr>
-            <w:r>
-              <w:rPr>
-                <w:rFonts w:eastAsia="Times New Roman" w:cs="Times New Roman"/>
-                <w:color w:val="000000"/>
-                <w:kern w:val="0"/>
-                <w14:ligatures w14:val="none"/>
-              </w:rPr>
-              <w:t>Pitch Down</w:t>
+              <w:jc w:val="center"/>
+              <w:rPr>
+                <w:rFonts w:eastAsia="Times New Roman" w:cs="Times New Roman"/>
+                <w:b/>
+                <w:bCs/>
+                <w:color w:val="000000"/>
+                <w:kern w:val="0"/>
+                <w14:ligatures w14:val="none"/>
+              </w:rPr>
+            </w:pPr>
+            <w:r>
+              <w:rPr>
+                <w:rFonts w:eastAsia="Times New Roman" w:cs="Times New Roman"/>
+                <w:b/>
+                <w:bCs/>
+                <w:color w:val="000000"/>
+                <w:kern w:val="0"/>
+                <w14:ligatures w14:val="none"/>
+              </w:rPr>
+              <w:t>Spacecraft Rotation</w:t>
             </w:r>
           </w:p>
         </w:tc>
@@ -2653,7 +2688,7 @@
                 <w:kern w:val="0"/>
                 <w14:ligatures w14:val="none"/>
               </w:rPr>
-              <w:t>1 (Numpad)</w:t>
+              <w:t>2 (Numpad)</w:t>
             </w:r>
           </w:p>
         </w:tc>
@@ -2688,7 +2723,7 @@
                 <w:kern w:val="0"/>
                 <w14:ligatures w14:val="none"/>
               </w:rPr>
-              <w:t>Yaw Left</w:t>
+              <w:t>Pitch Up</w:t>
             </w:r>
           </w:p>
         </w:tc>
@@ -2728,7 +2763,7 @@
                 <w:kern w:val="0"/>
                 <w14:ligatures w14:val="none"/>
               </w:rPr>
-              <w:t>3 (Numpad)</w:t>
+              <w:t>8 (Numpad)</w:t>
             </w:r>
           </w:p>
         </w:tc>
@@ -2763,7 +2798,7 @@
                 <w:kern w:val="0"/>
                 <w14:ligatures w14:val="none"/>
               </w:rPr>
-              <w:t>Yaw Right</w:t>
+              <w:t>Pitch Down</w:t>
             </w:r>
           </w:p>
         </w:tc>
@@ -2803,7 +2838,7 @@
                 <w:kern w:val="0"/>
                 <w14:ligatures w14:val="none"/>
               </w:rPr>
-              <w:t>4 (Numpad)</w:t>
+              <w:t>1 (Numpad)</w:t>
             </w:r>
           </w:p>
         </w:tc>
@@ -2838,7 +2873,7 @@
                 <w:kern w:val="0"/>
                 <w14:ligatures w14:val="none"/>
               </w:rPr>
-              <w:t>Roll Left</w:t>
+              <w:t>Yaw Left</w:t>
             </w:r>
           </w:p>
         </w:tc>
@@ -2878,7 +2913,7 @@
                 <w:kern w:val="0"/>
                 <w14:ligatures w14:val="none"/>
               </w:rPr>
-              <w:t>6 (Numpad)</w:t>
+              <w:t>3 (Numpad)</w:t>
             </w:r>
           </w:p>
         </w:tc>
@@ -2913,7 +2948,7 @@
                 <w:kern w:val="0"/>
                 <w14:ligatures w14:val="none"/>
               </w:rPr>
-              <w:t>Roll Right</w:t>
+              <w:t>Yaw Right</w:t>
             </w:r>
           </w:p>
         </w:tc>
@@ -2927,52 +2962,69 @@
             <w:tcW w:w="1681" w:type="pct"/>
             <w:tcBorders>
               <w:top w:val="nil"/>
+              <w:left w:val="single" w:sz="4" w:space="0" w:color="auto"/>
+              <w:bottom w:val="single" w:sz="4" w:space="0" w:color="auto"/>
+              <w:right w:val="single" w:sz="4" w:space="0" w:color="auto"/>
+            </w:tcBorders>
+            <w:shd w:val="clear" w:color="auto" w:fill="auto"/>
+            <w:noWrap/>
+            <w:vAlign w:val="bottom"/>
+            <w:hideMark/>
+          </w:tcPr>
+          <w:p>
+            <w:pPr>
+              <w:spacing w:after="0" w:line="240" w:lineRule="auto"/>
+              <w:rPr>
+                <w:rFonts w:eastAsia="Times New Roman" w:cs="Times New Roman"/>
+                <w:color w:val="000000"/>
+                <w:kern w:val="0"/>
+                <w14:ligatures w14:val="none"/>
+              </w:rPr>
+            </w:pPr>
+            <w:r>
+              <w:rPr>
+                <w:rFonts w:eastAsia="Times New Roman" w:cs="Times New Roman"/>
+                <w:color w:val="000000"/>
+                <w:kern w:val="0"/>
+                <w14:ligatures w14:val="none"/>
+              </w:rPr>
+              <w:t>4 (Numpad)</w:t>
+            </w:r>
+          </w:p>
+        </w:tc>
+        <w:tc>
+          <w:tcPr>
+            <w:tcW w:w="3319" w:type="pct"/>
+            <w:tcBorders>
+              <w:top w:val="nil"/>
               <w:left w:val="nil"/>
-              <w:bottom w:val="nil"/>
-              <w:right w:val="nil"/>
-            </w:tcBorders>
-            <w:shd w:val="clear" w:color="auto" w:fill="auto"/>
-            <w:noWrap/>
-            <w:vAlign w:val="bottom"/>
-            <w:hideMark/>
-          </w:tcPr>
-          <w:p>
-            <w:pPr>
-              <w:spacing w:after="0" w:line="240" w:lineRule="auto"/>
-              <w:rPr>
-                <w:rFonts w:eastAsia="Times New Roman" w:cs="Times New Roman"/>
-                <w:color w:val="000000"/>
-                <w:kern w:val="0"/>
-                <w14:ligatures w14:val="none"/>
-              </w:rPr>
-            </w:pPr>
-          </w:p>
-        </w:tc>
-        <w:tc>
-          <w:tcPr>
-            <w:tcW w:w="3319" w:type="pct"/>
-            <w:tcBorders>
-              <w:top w:val="nil"/>
-              <w:left w:val="nil"/>
-              <w:bottom w:val="nil"/>
-              <w:right w:val="nil"/>
-            </w:tcBorders>
-            <w:shd w:val="clear" w:color="auto" w:fill="auto"/>
-            <w:noWrap/>
-            <w:vAlign w:val="bottom"/>
-            <w:hideMark/>
-          </w:tcPr>
-          <w:p>
-            <w:pPr>
-              <w:spacing w:after="0" w:line="240" w:lineRule="auto"/>
-              <w:rPr>
-                <w:rFonts w:eastAsia="Times New Roman" w:cs="Times New Roman"/>
-                <w:kern w:val="0"/>
-                <w:sz w:val="20"/>
-                <w:szCs w:val="20"/>
-                <w14:ligatures w14:val="none"/>
-              </w:rPr>
-            </w:pPr>
+              <w:bottom w:val="single" w:sz="4" w:space="0" w:color="auto"/>
+              <w:right w:val="single" w:sz="4" w:space="0" w:color="auto"/>
+            </w:tcBorders>
+            <w:shd w:val="clear" w:color="auto" w:fill="auto"/>
+            <w:noWrap/>
+            <w:vAlign w:val="bottom"/>
+            <w:hideMark/>
+          </w:tcPr>
+          <w:p>
+            <w:pPr>
+              <w:spacing w:after="0" w:line="240" w:lineRule="auto"/>
+              <w:rPr>
+                <w:rFonts w:eastAsia="Times New Roman" w:cs="Times New Roman"/>
+                <w:color w:val="000000"/>
+                <w:kern w:val="0"/>
+                <w14:ligatures w14:val="none"/>
+              </w:rPr>
+            </w:pPr>
+            <w:r>
+              <w:rPr>
+                <w:rFonts w:eastAsia="Times New Roman" w:cs="Times New Roman"/>
+                <w:color w:val="000000"/>
+                <w:kern w:val="0"/>
+                <w14:ligatures w14:val="none"/>
+              </w:rPr>
+              <w:t>Roll Left</w:t>
+            </w:r>
           </w:p>
         </w:tc>
       </w:tr>
@@ -2982,10 +3034,9 @@
         </w:trPr>
         <w:tc>
           <w:tcPr>
-            <w:tcW w:w="5000" w:type="pct"/>
-            <w:gridSpan w:val="2"/>
-            <w:tcBorders>
-              <w:top w:val="single" w:sz="4" w:space="0" w:color="auto"/>
+            <w:tcW w:w="1681" w:type="pct"/>
+            <w:tcBorders>
+              <w:top w:val="nil"/>
               <w:left w:val="single" w:sz="4" w:space="0" w:color="auto"/>
               <w:bottom w:val="single" w:sz="4" w:space="0" w:color="auto"/>
               <w:right w:val="single" w:sz="4" w:space="0" w:color="auto"/>
@@ -2998,26 +3049,56 @@
           <w:p>
             <w:pPr>
               <w:spacing w:after="0" w:line="240" w:lineRule="auto"/>
-              <w:jc w:val="center"/>
-              <w:rPr>
-                <w:rFonts w:eastAsia="Times New Roman" w:cs="Times New Roman"/>
-                <w:b/>
-                <w:bCs/>
-                <w:color w:val="000000"/>
-                <w:kern w:val="0"/>
-                <w14:ligatures w14:val="none"/>
-              </w:rPr>
-            </w:pPr>
-            <w:r>
-              <w:rPr>
-                <w:rFonts w:eastAsia="Times New Roman" w:cs="Times New Roman"/>
-                <w:b/>
-                <w:bCs/>
-                <w:color w:val="000000"/>
-                <w:kern w:val="0"/>
-                <w14:ligatures w14:val="none"/>
-              </w:rPr>
-              <w:t>DSKY</w:t>
+              <w:rPr>
+                <w:rFonts w:eastAsia="Times New Roman" w:cs="Times New Roman"/>
+                <w:color w:val="000000"/>
+                <w:kern w:val="0"/>
+                <w14:ligatures w14:val="none"/>
+              </w:rPr>
+            </w:pPr>
+            <w:r>
+              <w:rPr>
+                <w:rFonts w:eastAsia="Times New Roman" w:cs="Times New Roman"/>
+                <w:color w:val="000000"/>
+                <w:kern w:val="0"/>
+                <w14:ligatures w14:val="none"/>
+              </w:rPr>
+              <w:t>6 (Numpad)</w:t>
+            </w:r>
+          </w:p>
+        </w:tc>
+        <w:tc>
+          <w:tcPr>
+            <w:tcW w:w="3319" w:type="pct"/>
+            <w:tcBorders>
+              <w:top w:val="nil"/>
+              <w:left w:val="nil"/>
+              <w:bottom w:val="single" w:sz="4" w:space="0" w:color="auto"/>
+              <w:right w:val="single" w:sz="4" w:space="0" w:color="auto"/>
+            </w:tcBorders>
+            <w:shd w:val="clear" w:color="auto" w:fill="auto"/>
+            <w:noWrap/>
+            <w:vAlign w:val="bottom"/>
+            <w:hideMark/>
+          </w:tcPr>
+          <w:p>
+            <w:pPr>
+              <w:spacing w:after="0" w:line="240" w:lineRule="auto"/>
+              <w:rPr>
+                <w:rFonts w:eastAsia="Times New Roman" w:cs="Times New Roman"/>
+                <w:color w:val="000000"/>
+                <w:kern w:val="0"/>
+                <w14:ligatures w14:val="none"/>
+              </w:rPr>
+            </w:pPr>
+            <w:r>
+              <w:rPr>
+                <w:rFonts w:eastAsia="Times New Roman" w:cs="Times New Roman"/>
+                <w:color w:val="000000"/>
+                <w:kern w:val="0"/>
+                <w14:ligatures w14:val="none"/>
+              </w:rPr>
+              <w:t>Roll Right</w:t>
             </w:r>
           </w:p>
         </w:tc>
@@ -3031,45 +3112,25 @@
             <w:tcW w:w="1681" w:type="pct"/>
             <w:tcBorders>
               <w:top w:val="nil"/>
-              <w:left w:val="single" w:sz="4" w:space="0" w:color="auto"/>
-              <w:bottom w:val="single" w:sz="4" w:space="0" w:color="auto"/>
-              <w:right w:val="single" w:sz="4" w:space="0" w:color="auto"/>
-            </w:tcBorders>
-            <w:shd w:val="clear" w:color="auto" w:fill="auto"/>
-            <w:noWrap/>
-            <w:vAlign w:val="bottom"/>
-            <w:hideMark/>
-          </w:tcPr>
-          <w:p>
-            <w:pPr>
-              <w:spacing w:after="0" w:line="240" w:lineRule="auto"/>
-              <w:rPr>
-                <w:rFonts w:eastAsia="Times New Roman" w:cs="Times New Roman"/>
-                <w:color w:val="000000"/>
-                <w:kern w:val="0"/>
-                <w14:ligatures w14:val="none"/>
-              </w:rPr>
-            </w:pPr>
-            <w:proofErr w:type="spellStart"/>
-            <w:r>
-              <w:rPr>
-                <w:rFonts w:eastAsia="Times New Roman" w:cs="Times New Roman"/>
-                <w:color w:val="000000"/>
-                <w:kern w:val="0"/>
-                <w14:ligatures w14:val="none"/>
-              </w:rPr>
-              <w:t>Shift+Decimal</w:t>
-            </w:r>
-            <w:proofErr w:type="spellEnd"/>
-            <w:r>
-              <w:rPr>
-                <w:rFonts w:eastAsia="Times New Roman" w:cs="Times New Roman"/>
-                <w:color w:val="000000"/>
-                <w:kern w:val="0"/>
-                <w14:ligatures w14:val="none"/>
-              </w:rPr>
-              <w:t xml:space="preserve"> (Numpad)</w:t>
-            </w:r>
+              <w:left w:val="nil"/>
+              <w:bottom w:val="nil"/>
+              <w:right w:val="nil"/>
+            </w:tcBorders>
+            <w:shd w:val="clear" w:color="auto" w:fill="auto"/>
+            <w:noWrap/>
+            <w:vAlign w:val="bottom"/>
+            <w:hideMark/>
+          </w:tcPr>
+          <w:p>
+            <w:pPr>
+              <w:spacing w:after="0" w:line="240" w:lineRule="auto"/>
+              <w:rPr>
+                <w:rFonts w:eastAsia="Times New Roman" w:cs="Times New Roman"/>
+                <w:color w:val="000000"/>
+                <w:kern w:val="0"/>
+                <w14:ligatures w14:val="none"/>
+              </w:rPr>
+            </w:pPr>
           </w:p>
         </w:tc>
         <w:tc>
@@ -3078,33 +3139,25 @@
             <w:tcBorders>
               <w:top w:val="nil"/>
               <w:left w:val="nil"/>
-              <w:bottom w:val="single" w:sz="4" w:space="0" w:color="auto"/>
-              <w:right w:val="single" w:sz="4" w:space="0" w:color="auto"/>
-            </w:tcBorders>
-            <w:shd w:val="clear" w:color="auto" w:fill="auto"/>
-            <w:noWrap/>
-            <w:vAlign w:val="bottom"/>
-            <w:hideMark/>
-          </w:tcPr>
-          <w:p>
-            <w:pPr>
-              <w:spacing w:after="0" w:line="240" w:lineRule="auto"/>
-              <w:rPr>
-                <w:rFonts w:eastAsia="Times New Roman" w:cs="Times New Roman"/>
-                <w:color w:val="000000"/>
-                <w:kern w:val="0"/>
-                <w14:ligatures w14:val="none"/>
-              </w:rPr>
-            </w:pPr>
-            <w:r>
-              <w:rPr>
-                <w:rFonts w:eastAsia="Times New Roman" w:cs="Times New Roman"/>
-                <w:color w:val="000000"/>
-                <w:kern w:val="0"/>
-                <w14:ligatures w14:val="none"/>
-              </w:rPr>
-              <w:t>DSKY Clear</w:t>
-            </w:r>
+              <w:bottom w:val="nil"/>
+              <w:right w:val="nil"/>
+            </w:tcBorders>
+            <w:shd w:val="clear" w:color="auto" w:fill="auto"/>
+            <w:noWrap/>
+            <w:vAlign w:val="bottom"/>
+            <w:hideMark/>
+          </w:tcPr>
+          <w:p>
+            <w:pPr>
+              <w:spacing w:after="0" w:line="240" w:lineRule="auto"/>
+              <w:rPr>
+                <w:rFonts w:eastAsia="Times New Roman" w:cs="Times New Roman"/>
+                <w:kern w:val="0"/>
+                <w:sz w:val="20"/>
+                <w:szCs w:val="20"/>
+                <w14:ligatures w14:val="none"/>
+              </w:rPr>
+            </w:pPr>
           </w:p>
         </w:tc>
       </w:tr>
@@ -3114,9 +3167,10 @@
         </w:trPr>
         <w:tc>
           <w:tcPr>
-            <w:tcW w:w="1681" w:type="pct"/>
-            <w:tcBorders>
-              <w:top w:val="nil"/>
+            <w:tcW w:w="5000" w:type="pct"/>
+            <w:gridSpan w:val="2"/>
+            <w:tcBorders>
+              <w:top w:val="single" w:sz="4" w:space="0" w:color="auto"/>
               <w:left w:val="single" w:sz="4" w:space="0" w:color="auto"/>
               <w:bottom w:val="single" w:sz="4" w:space="0" w:color="auto"/>
               <w:right w:val="single" w:sz="4" w:space="0" w:color="auto"/>
@@ -3129,67 +3183,26 @@
           <w:p>
             <w:pPr>
               <w:spacing w:after="0" w:line="240" w:lineRule="auto"/>
-              <w:rPr>
-                <w:rFonts w:eastAsia="Times New Roman" w:cs="Times New Roman"/>
-                <w:color w:val="000000"/>
-                <w:kern w:val="0"/>
-                <w14:ligatures w14:val="none"/>
-              </w:rPr>
-            </w:pPr>
-            <w:proofErr w:type="spellStart"/>
-            <w:r>
-              <w:rPr>
-                <w:rFonts w:eastAsia="Times New Roman" w:cs="Times New Roman"/>
-                <w:color w:val="000000"/>
-                <w:kern w:val="0"/>
-                <w14:ligatures w14:val="none"/>
-              </w:rPr>
-              <w:t>Shift+Page</w:t>
-            </w:r>
-            <w:proofErr w:type="spellEnd"/>
-            <w:r>
-              <w:rPr>
-                <w:rFonts w:eastAsia="Times New Roman" w:cs="Times New Roman"/>
-                <w:color w:val="000000"/>
-                <w:kern w:val="0"/>
-                <w14:ligatures w14:val="none"/>
-              </w:rPr>
-              <w:t xml:space="preserve"> Up</w:t>
-            </w:r>
-          </w:p>
-        </w:tc>
-        <w:tc>
-          <w:tcPr>
-            <w:tcW w:w="3319" w:type="pct"/>
-            <w:tcBorders>
-              <w:top w:val="nil"/>
-              <w:left w:val="nil"/>
-              <w:bottom w:val="single" w:sz="4" w:space="0" w:color="auto"/>
-              <w:right w:val="single" w:sz="4" w:space="0" w:color="auto"/>
-            </w:tcBorders>
-            <w:shd w:val="clear" w:color="auto" w:fill="auto"/>
-            <w:noWrap/>
-            <w:vAlign w:val="bottom"/>
-            <w:hideMark/>
-          </w:tcPr>
-          <w:p>
-            <w:pPr>
-              <w:spacing w:after="0" w:line="240" w:lineRule="auto"/>
-              <w:rPr>
-                <w:rFonts w:eastAsia="Times New Roman" w:cs="Times New Roman"/>
-                <w:color w:val="000000"/>
-                <w:kern w:val="0"/>
-                <w14:ligatures w14:val="none"/>
-              </w:rPr>
-            </w:pPr>
-            <w:r>
-              <w:rPr>
-                <w:rFonts w:eastAsia="Times New Roman" w:cs="Times New Roman"/>
-                <w:color w:val="000000"/>
-                <w:kern w:val="0"/>
-                <w14:ligatures w14:val="none"/>
-              </w:rPr>
-              <w:t>DSKY Reset</w:t>
+              <w:jc w:val="center"/>
+              <w:rPr>
+                <w:rFonts w:eastAsia="Times New Roman" w:cs="Times New Roman"/>
+                <w:b/>
+                <w:bCs/>
+                <w:color w:val="000000"/>
+                <w:kern w:val="0"/>
+                <w14:ligatures w14:val="none"/>
+              </w:rPr>
+            </w:pPr>
+            <w:r>
+              <w:rPr>
+                <w:rFonts w:eastAsia="Times New Roman" w:cs="Times New Roman"/>
+                <w:b/>
+                <w:bCs/>
+                <w:color w:val="000000"/>
+                <w:kern w:val="0"/>
+                <w14:ligatures w14:val="none"/>
+              </w:rPr>
+              <w:t>DSKY</w:t>
             </w:r>
           </w:p>
         </w:tc>
@@ -3230,9 +3243,18 @@
                 <w:kern w:val="0"/>
                 <w14:ligatures w14:val="none"/>
               </w:rPr>
-              <w:t>Shift+Home</w:t>
+              <w:t>Shift+Decimal</w:t>
             </w:r>
             <w:proofErr w:type="spellEnd"/>
+            <w:r>
+              <w:rPr>
+                <w:rFonts w:eastAsia="Times New Roman" w:cs="Times New Roman"/>
+                <w:color w:val="000000"/>
+                <w:kern w:val="0"/>
+                <w14:ligatures w14:val="none"/>
+              </w:rPr>
+              <w:t xml:space="preserve"> (Numpad)</w:t>
+            </w:r>
           </w:p>
         </w:tc>
         <w:tc>
@@ -3266,7 +3288,7 @@
                 <w:kern w:val="0"/>
                 <w14:ligatures w14:val="none"/>
               </w:rPr>
-              <w:t>DSKY Key Release</w:t>
+              <w:t>DSKY Clear</w:t>
             </w:r>
           </w:p>
         </w:tc>
@@ -3307,7 +3329,7 @@
                 <w:kern w:val="0"/>
                 <w14:ligatures w14:val="none"/>
               </w:rPr>
-              <w:t>Shift+Enter</w:t>
+              <w:t>Shift+Page</w:t>
             </w:r>
             <w:proofErr w:type="spellEnd"/>
             <w:r>
@@ -3317,7 +3339,7 @@
                 <w:kern w:val="0"/>
                 <w14:ligatures w14:val="none"/>
               </w:rPr>
-              <w:t xml:space="preserve"> (Numpad)</w:t>
+              <w:t xml:space="preserve"> Up</w:t>
             </w:r>
           </w:p>
         </w:tc>
@@ -3352,7 +3374,7 @@
                 <w:kern w:val="0"/>
                 <w14:ligatures w14:val="none"/>
               </w:rPr>
-              <w:t>DSKY Enter</w:t>
+              <w:t>DSKY Reset</w:t>
             </w:r>
           </w:p>
         </w:tc>
@@ -3393,18 +3415,9 @@
                 <w:kern w:val="0"/>
                 <w14:ligatures w14:val="none"/>
               </w:rPr>
-              <w:t>Shift+Divide</w:t>
+              <w:t>Shift+Home</w:t>
             </w:r>
             <w:proofErr w:type="spellEnd"/>
-            <w:r>
-              <w:rPr>
-                <w:rFonts w:eastAsia="Times New Roman" w:cs="Times New Roman"/>
-                <w:color w:val="000000"/>
-                <w:kern w:val="0"/>
-                <w14:ligatures w14:val="none"/>
-              </w:rPr>
-              <w:t xml:space="preserve"> (Numpad /)</w:t>
-            </w:r>
           </w:p>
         </w:tc>
         <w:tc>
@@ -3438,7 +3451,7 @@
                 <w:kern w:val="0"/>
                 <w14:ligatures w14:val="none"/>
               </w:rPr>
-              <w:t>DSKY Verb</w:t>
+              <w:t>DSKY Key Release</w:t>
             </w:r>
           </w:p>
         </w:tc>
@@ -3479,7 +3492,7 @@
                 <w:kern w:val="0"/>
                 <w14:ligatures w14:val="none"/>
               </w:rPr>
-              <w:t>Shift+Multiply</w:t>
+              <w:t>Shift+Enter</w:t>
             </w:r>
             <w:proofErr w:type="spellEnd"/>
             <w:r>
@@ -3489,7 +3502,7 @@
                 <w:kern w:val="0"/>
                 <w14:ligatures w14:val="none"/>
               </w:rPr>
-              <w:t xml:space="preserve"> (Numpad *)</w:t>
+              <w:t xml:space="preserve"> (Numpad)</w:t>
             </w:r>
           </w:p>
         </w:tc>
@@ -3524,7 +3537,7 @@
                 <w:kern w:val="0"/>
                 <w14:ligatures w14:val="none"/>
               </w:rPr>
-              <w:t>DSKY Noun</w:t>
+              <w:t>DSKY Enter</w:t>
             </w:r>
           </w:p>
         </w:tc>
@@ -3565,7 +3578,7 @@
                 <w:kern w:val="0"/>
                 <w14:ligatures w14:val="none"/>
               </w:rPr>
-              <w:t>Shift+Plus</w:t>
+              <w:t>Shift+Divide</w:t>
             </w:r>
             <w:proofErr w:type="spellEnd"/>
             <w:r>
@@ -3575,7 +3588,7 @@
                 <w:kern w:val="0"/>
                 <w14:ligatures w14:val="none"/>
               </w:rPr>
-              <w:t xml:space="preserve"> (Numpad +)</w:t>
+              <w:t xml:space="preserve"> (Numpad /)</w:t>
             </w:r>
           </w:p>
         </w:tc>
@@ -3610,7 +3623,7 @@
                 <w:kern w:val="0"/>
                 <w14:ligatures w14:val="none"/>
               </w:rPr>
-              <w:t>DSKY Plus</w:t>
+              <w:t>DSKY Verb</w:t>
             </w:r>
           </w:p>
         </w:tc>
@@ -3651,7 +3664,7 @@
                 <w:kern w:val="0"/>
                 <w14:ligatures w14:val="none"/>
               </w:rPr>
-              <w:t>Shift+Minus</w:t>
+              <w:t>Shift+Multiply</w:t>
             </w:r>
             <w:proofErr w:type="spellEnd"/>
             <w:r>
@@ -3661,7 +3674,7 @@
                 <w:kern w:val="0"/>
                 <w14:ligatures w14:val="none"/>
               </w:rPr>
-              <w:t xml:space="preserve"> (Numpad -)</w:t>
+              <w:t xml:space="preserve"> (Numpad *)</w:t>
             </w:r>
           </w:p>
         </w:tc>
@@ -3696,7 +3709,7 @@
                 <w:kern w:val="0"/>
                 <w14:ligatures w14:val="none"/>
               </w:rPr>
-              <w:t>DSKY Minus</w:t>
+              <w:t>DSKY Noun</w:t>
             </w:r>
           </w:p>
         </w:tc>
@@ -3737,9 +3750,18 @@
                 <w:kern w:val="0"/>
                 <w14:ligatures w14:val="none"/>
               </w:rPr>
-              <w:t>Shift+End</w:t>
+              <w:t>Shift+Plus</w:t>
             </w:r>
             <w:proofErr w:type="spellEnd"/>
+            <w:r>
+              <w:rPr>
+                <w:rFonts w:eastAsia="Times New Roman" w:cs="Times New Roman"/>
+                <w:color w:val="000000"/>
+                <w:kern w:val="0"/>
+                <w14:ligatures w14:val="none"/>
+              </w:rPr>
+              <w:t xml:space="preserve"> (Numpad +)</w:t>
+            </w:r>
           </w:p>
         </w:tc>
         <w:tc>
@@ -3773,7 +3795,7 @@
                 <w:kern w:val="0"/>
                 <w14:ligatures w14:val="none"/>
               </w:rPr>
-              <w:t>DSKY Proceed</w:t>
+              <w:t>DSKY Plus</w:t>
             </w:r>
           </w:p>
         </w:tc>
@@ -3806,6 +3828,169 @@
                 <w14:ligatures w14:val="none"/>
               </w:rPr>
             </w:pPr>
+            <w:proofErr w:type="spellStart"/>
+            <w:r>
+              <w:rPr>
+                <w:rFonts w:eastAsia="Times New Roman" w:cs="Times New Roman"/>
+                <w:color w:val="000000"/>
+                <w:kern w:val="0"/>
+                <w14:ligatures w14:val="none"/>
+              </w:rPr>
+              <w:t>Shift+Minus</w:t>
+            </w:r>
+            <w:proofErr w:type="spellEnd"/>
+            <w:r>
+              <w:rPr>
+                <w:rFonts w:eastAsia="Times New Roman" w:cs="Times New Roman"/>
+                <w:color w:val="000000"/>
+                <w:kern w:val="0"/>
+                <w14:ligatures w14:val="none"/>
+              </w:rPr>
+              <w:t xml:space="preserve"> (Numpad -)</w:t>
+            </w:r>
+          </w:p>
+        </w:tc>
+        <w:tc>
+          <w:tcPr>
+            <w:tcW w:w="3319" w:type="pct"/>
+            <w:tcBorders>
+              <w:top w:val="nil"/>
+              <w:left w:val="nil"/>
+              <w:bottom w:val="single" w:sz="4" w:space="0" w:color="auto"/>
+              <w:right w:val="single" w:sz="4" w:space="0" w:color="auto"/>
+            </w:tcBorders>
+            <w:shd w:val="clear" w:color="auto" w:fill="auto"/>
+            <w:noWrap/>
+            <w:vAlign w:val="bottom"/>
+            <w:hideMark/>
+          </w:tcPr>
+          <w:p>
+            <w:pPr>
+              <w:spacing w:after="0" w:line="240" w:lineRule="auto"/>
+              <w:rPr>
+                <w:rFonts w:eastAsia="Times New Roman" w:cs="Times New Roman"/>
+                <w:color w:val="000000"/>
+                <w:kern w:val="0"/>
+                <w14:ligatures w14:val="none"/>
+              </w:rPr>
+            </w:pPr>
+            <w:r>
+              <w:rPr>
+                <w:rFonts w:eastAsia="Times New Roman" w:cs="Times New Roman"/>
+                <w:color w:val="000000"/>
+                <w:kern w:val="0"/>
+                <w14:ligatures w14:val="none"/>
+              </w:rPr>
+              <w:t>DSKY Minus</w:t>
+            </w:r>
+          </w:p>
+        </w:tc>
+      </w:tr>
+      <w:tr>
+        <w:trPr>
+          <w:trHeight w:val="300"/>
+        </w:trPr>
+        <w:tc>
+          <w:tcPr>
+            <w:tcW w:w="1681" w:type="pct"/>
+            <w:tcBorders>
+              <w:top w:val="nil"/>
+              <w:left w:val="single" w:sz="4" w:space="0" w:color="auto"/>
+              <w:bottom w:val="single" w:sz="4" w:space="0" w:color="auto"/>
+              <w:right w:val="single" w:sz="4" w:space="0" w:color="auto"/>
+            </w:tcBorders>
+            <w:shd w:val="clear" w:color="auto" w:fill="auto"/>
+            <w:noWrap/>
+            <w:vAlign w:val="bottom"/>
+            <w:hideMark/>
+          </w:tcPr>
+          <w:p>
+            <w:pPr>
+              <w:spacing w:after="0" w:line="240" w:lineRule="auto"/>
+              <w:rPr>
+                <w:rFonts w:eastAsia="Times New Roman" w:cs="Times New Roman"/>
+                <w:color w:val="000000"/>
+                <w:kern w:val="0"/>
+                <w14:ligatures w14:val="none"/>
+              </w:rPr>
+            </w:pPr>
+            <w:proofErr w:type="spellStart"/>
+            <w:r>
+              <w:rPr>
+                <w:rFonts w:eastAsia="Times New Roman" w:cs="Times New Roman"/>
+                <w:color w:val="000000"/>
+                <w:kern w:val="0"/>
+                <w14:ligatures w14:val="none"/>
+              </w:rPr>
+              <w:t>Shift+End</w:t>
+            </w:r>
+            <w:proofErr w:type="spellEnd"/>
+          </w:p>
+        </w:tc>
+        <w:tc>
+          <w:tcPr>
+            <w:tcW w:w="3319" w:type="pct"/>
+            <w:tcBorders>
+              <w:top w:val="nil"/>
+              <w:left w:val="nil"/>
+              <w:bottom w:val="single" w:sz="4" w:space="0" w:color="auto"/>
+              <w:right w:val="single" w:sz="4" w:space="0" w:color="auto"/>
+            </w:tcBorders>
+            <w:shd w:val="clear" w:color="auto" w:fill="auto"/>
+            <w:noWrap/>
+            <w:vAlign w:val="bottom"/>
+            <w:hideMark/>
+          </w:tcPr>
+          <w:p>
+            <w:pPr>
+              <w:spacing w:after="0" w:line="240" w:lineRule="auto"/>
+              <w:rPr>
+                <w:rFonts w:eastAsia="Times New Roman" w:cs="Times New Roman"/>
+                <w:color w:val="000000"/>
+                <w:kern w:val="0"/>
+                <w14:ligatures w14:val="none"/>
+              </w:rPr>
+            </w:pPr>
+            <w:r>
+              <w:rPr>
+                <w:rFonts w:eastAsia="Times New Roman" w:cs="Times New Roman"/>
+                <w:color w:val="000000"/>
+                <w:kern w:val="0"/>
+                <w14:ligatures w14:val="none"/>
+              </w:rPr>
+              <w:t>DSKY Proceed</w:t>
+            </w:r>
+          </w:p>
+        </w:tc>
+      </w:tr>
+      <w:tr>
+        <w:trPr>
+          <w:trHeight w:val="300"/>
+        </w:trPr>
+        <w:tc>
+          <w:tcPr>
+            <w:tcW w:w="1681" w:type="pct"/>
+            <w:tcBorders>
+              <w:top w:val="nil"/>
+              <w:left w:val="single" w:sz="4" w:space="0" w:color="auto"/>
+              <w:bottom w:val="single" w:sz="4" w:space="0" w:color="auto"/>
+              <w:right w:val="single" w:sz="4" w:space="0" w:color="auto"/>
+            </w:tcBorders>
+            <w:shd w:val="clear" w:color="auto" w:fill="auto"/>
+            <w:noWrap/>
+            <w:vAlign w:val="bottom"/>
+            <w:hideMark/>
+          </w:tcPr>
+          <w:p>
+            <w:pPr>
+              <w:spacing w:after="0" w:line="240" w:lineRule="auto"/>
+              <w:rPr>
+                <w:rFonts w:eastAsia="Times New Roman" w:cs="Times New Roman"/>
+                <w:color w:val="000000"/>
+                <w:kern w:val="0"/>
+                <w14:ligatures w14:val="none"/>
+              </w:rPr>
+            </w:pPr>
             <w:r>
               <w:rPr>
                 <w:rFonts w:eastAsia="Times New Roman" w:cs="Times New Roman"/>
@@ -3854,12 +4039,12 @@
         </w:tc>
       </w:tr>
     </w:tbl>
+    <w:p/>
+    <w:p/>
+    <w:p/>
     <w:p>
       <w:r>
-        <w:br/>
-      </w:r>
-      <w:r>
-        <w:br/>
+        <w:lastRenderedPageBreak/>
         <w:t xml:space="preserve">Note: By </w:t>
       </w:r>
       <w:r>
@@ -3882,7 +4067,6 @@
         <w:pStyle w:val="Subtitle"/>
       </w:pPr>
       <w:r>
-        <w:lastRenderedPageBreak/>
         <w:t>C</w:t>
       </w:r>
       <w:r>
@@ -6111,21 +6295,6 @@
       </w:tr>
     </w:tbl>
     <w:p>
-      <w:r>
-        <w:br/>
-      </w:r>
-    </w:p>
-    <w:p>
-      <w:pPr>
-        <w:pStyle w:val="Subtitle"/>
-      </w:pPr>
-    </w:p>
-    <w:p>
-      <w:pPr>
-        <w:pStyle w:val="Subtitle"/>
-      </w:pPr>
-    </w:p>
-    <w:p>
       <w:pPr>
         <w:pStyle w:val="Subtitle"/>
       </w:pPr>
@@ -9273,14 +9442,22 @@
           </w:tcPr>
           <w:p>
             <w:pPr>
-              <w:spacing w:after="0" w:line="240" w:lineRule="auto"/>
-              <w:rPr>
-                <w:rFonts w:eastAsia="Times New Roman" w:cs="Times New Roman"/>
-                <w:color w:val="000000"/>
-                <w:kern w:val="0"/>
-                <w14:ligatures w14:val="none"/>
-              </w:rPr>
-            </w:pPr>
+              <w:pStyle w:val="Subtitle"/>
+              <w:rPr>
+                <w:rFonts w:eastAsia="Times New Roman"/>
+              </w:rPr>
+            </w:pPr>
+          </w:p>
+          <w:p>
+            <w:pPr>
+              <w:pStyle w:val="Subtitle"/>
+            </w:pPr>
+            <w:r>
+              <w:t>EVA</w:t>
+            </w:r>
+            <w:r>
+              <w:t xml:space="preserve"> Controls:</w:t>
+            </w:r>
           </w:p>
         </w:tc>
         <w:tc>

</xml_diff>

<commit_message>
Update QSG With ORDEAL Keybinds & NASSP 9 Links
</commit_message>
<xml_diff>
--- a/Doc/Project Apollo - NASSP/Programmers Notes/NASSP Quick Start Guide.docx
+++ b/Doc/Project Apollo - NASSP/Programmers Notes/NASSP Quick Start Guide.docx
@@ -26,7 +26,23 @@
           <w:b w:val="0"/>
           <w:bCs w:val="0"/>
         </w:rPr>
-        <w:t xml:space="preserve">Revision 1.1 </w:t>
+        <w:t>Revision 1.</w:t>
+      </w:r>
+      <w:r>
+        <w:rPr>
+          <w:rStyle w:val="IntenseReference"/>
+          <w:b w:val="0"/>
+          <w:bCs w:val="0"/>
+        </w:rPr>
+        <w:t>2</w:t>
+      </w:r>
+      <w:r>
+        <w:rPr>
+          <w:rStyle w:val="IntenseReference"/>
+          <w:b w:val="0"/>
+          <w:bCs w:val="0"/>
+        </w:rPr>
+        <w:t xml:space="preserve"> </w:t>
       </w:r>
     </w:p>
     <w:p>
@@ -44,7 +60,31 @@
           <w:b w:val="0"/>
           <w:bCs w:val="0"/>
         </w:rPr>
-        <w:t>15 APR 2025</w:t>
+        <w:t>30</w:t>
+      </w:r>
+      <w:r>
+        <w:rPr>
+          <w:rStyle w:val="IntenseReference"/>
+          <w:b w:val="0"/>
+          <w:bCs w:val="0"/>
+        </w:rPr>
+        <w:t xml:space="preserve"> </w:t>
+      </w:r>
+      <w:r>
+        <w:rPr>
+          <w:rStyle w:val="IntenseReference"/>
+          <w:b w:val="0"/>
+          <w:bCs w:val="0"/>
+        </w:rPr>
+        <w:t>MAY</w:t>
+      </w:r>
+      <w:r>
+        <w:rPr>
+          <w:rStyle w:val="IntenseReference"/>
+          <w:b w:val="0"/>
+          <w:bCs w:val="0"/>
+        </w:rPr>
+        <w:t xml:space="preserve"> 2025</w:t>
       </w:r>
     </w:p>
     <w:sdt>
@@ -101,13 +141,13 @@
           <w:r>
             <w:fldChar w:fldCharType="separate"/>
           </w:r>
-          <w:hyperlink w:anchor="_Toc192162522" w:history="1">
+          <w:hyperlink w:anchor="_Toc199486487" w:history="1">
             <w:r>
               <w:rPr>
                 <w:rStyle w:val="Hyperlink"/>
                 <w:noProof/>
               </w:rPr>
-              <w:t>Installation (NASSP 8/Orbiter 2016 Beta):</w:t>
+              <w:t>Installation (NASSP 8.0/Orbiter 2016 Beta):</w:t>
             </w:r>
             <w:r>
               <w:rPr>
@@ -128,7 +168,7 @@
                 <w:noProof/>
                 <w:webHidden/>
               </w:rPr>
-              <w:instrText xml:space="preserve"> PAGEREF _Toc192162522 \h </w:instrText>
+              <w:instrText xml:space="preserve"> PAGEREF _Toc199486487 \h </w:instrText>
             </w:r>
             <w:r>
               <w:rPr>
@@ -172,13 +212,13 @@
               <w:szCs w:val="24"/>
             </w:rPr>
           </w:pPr>
-          <w:hyperlink w:anchor="_Toc192162523" w:history="1">
+          <w:hyperlink w:anchor="_Toc199486488" w:history="1">
             <w:r>
               <w:rPr>
                 <w:rStyle w:val="Hyperlink"/>
                 <w:noProof/>
               </w:rPr>
-              <w:t>Tips For Beginners:</w:t>
+              <w:t>Installation (NASSP 9.0/Orbiter 2024):</w:t>
             </w:r>
             <w:r>
               <w:rPr>
@@ -199,7 +239,7 @@
                 <w:noProof/>
                 <w:webHidden/>
               </w:rPr>
-              <w:instrText xml:space="preserve"> PAGEREF _Toc192162523 \h </w:instrText>
+              <w:instrText xml:space="preserve"> PAGEREF _Toc199486488 \h </w:instrText>
             </w:r>
             <w:r>
               <w:rPr>
@@ -243,13 +283,13 @@
               <w:szCs w:val="24"/>
             </w:rPr>
           </w:pPr>
-          <w:hyperlink w:anchor="_Toc192162524" w:history="1">
+          <w:hyperlink w:anchor="_Toc199486489" w:history="1">
             <w:r>
               <w:rPr>
                 <w:rStyle w:val="Hyperlink"/>
                 <w:noProof/>
               </w:rPr>
-              <w:t>Keyboard Commands:</w:t>
+              <w:t>Tips For Beginners:</w:t>
             </w:r>
             <w:r>
               <w:rPr>
@@ -270,7 +310,7 @@
                 <w:noProof/>
                 <w:webHidden/>
               </w:rPr>
-              <w:instrText xml:space="preserve"> PAGEREF _Toc192162524 \h </w:instrText>
+              <w:instrText xml:space="preserve"> PAGEREF _Toc199486489 \h </w:instrText>
             </w:r>
             <w:r>
               <w:rPr>
@@ -290,7 +330,7 @@
                 <w:noProof/>
                 <w:webHidden/>
               </w:rPr>
-              <w:t>10</w:t>
+              <w:t>6</w:t>
             </w:r>
             <w:r>
               <w:rPr>
@@ -314,13 +354,13 @@
               <w:szCs w:val="24"/>
             </w:rPr>
           </w:pPr>
-          <w:hyperlink w:anchor="_Toc192162525" w:history="1">
+          <w:hyperlink w:anchor="_Toc199486490" w:history="1">
             <w:r>
               <w:rPr>
                 <w:rStyle w:val="Hyperlink"/>
                 <w:noProof/>
               </w:rPr>
-              <w:t>Important Links:</w:t>
+              <w:t>Keyboard Commands:</w:t>
             </w:r>
             <w:r>
               <w:rPr>
@@ -341,7 +381,7 @@
                 <w:noProof/>
                 <w:webHidden/>
               </w:rPr>
-              <w:instrText xml:space="preserve"> PAGEREF _Toc192162525 \h </w:instrText>
+              <w:instrText xml:space="preserve"> PAGEREF _Toc199486490 \h </w:instrText>
             </w:r>
             <w:r>
               <w:rPr>
@@ -361,7 +401,78 @@
                 <w:noProof/>
                 <w:webHidden/>
               </w:rPr>
-              <w:t>14</w:t>
+              <w:t>11</w:t>
+            </w:r>
+            <w:r>
+              <w:rPr>
+                <w:noProof/>
+                <w:webHidden/>
+              </w:rPr>
+              <w:fldChar w:fldCharType="end"/>
+            </w:r>
+          </w:hyperlink>
+        </w:p>
+        <w:p>
+          <w:pPr>
+            <w:pStyle w:val="TOC1"/>
+            <w:tabs>
+              <w:tab w:val="right" w:leader="dot" w:pos="9350"/>
+            </w:tabs>
+            <w:rPr>
+              <w:rFonts w:eastAsiaTheme="minorEastAsia"/>
+              <w:noProof/>
+              <w:sz w:val="24"/>
+              <w:szCs w:val="24"/>
+            </w:rPr>
+          </w:pPr>
+          <w:hyperlink w:anchor="_Toc199486491" w:history="1">
+            <w:r>
+              <w:rPr>
+                <w:rStyle w:val="Hyperlink"/>
+                <w:noProof/>
+              </w:rPr>
+              <w:t>Important Links:</w:t>
+            </w:r>
+            <w:r>
+              <w:rPr>
+                <w:noProof/>
+                <w:webHidden/>
+              </w:rPr>
+              <w:tab/>
+            </w:r>
+            <w:r>
+              <w:rPr>
+                <w:noProof/>
+                <w:webHidden/>
+              </w:rPr>
+              <w:fldChar w:fldCharType="begin"/>
+            </w:r>
+            <w:r>
+              <w:rPr>
+                <w:noProof/>
+                <w:webHidden/>
+              </w:rPr>
+              <w:instrText xml:space="preserve"> PAGEREF _Toc199486491 \h </w:instrText>
+            </w:r>
+            <w:r>
+              <w:rPr>
+                <w:noProof/>
+                <w:webHidden/>
+              </w:rPr>
+            </w:r>
+            <w:r>
+              <w:rPr>
+                <w:noProof/>
+                <w:webHidden/>
+              </w:rPr>
+              <w:fldChar w:fldCharType="separate"/>
+            </w:r>
+            <w:r>
+              <w:rPr>
+                <w:noProof/>
+                <w:webHidden/>
+              </w:rPr>
+              <w:t>15</w:t>
             </w:r>
             <w:r>
               <w:rPr>
@@ -558,10 +669,15 @@
       <w:pPr>
         <w:pStyle w:val="Heading1"/>
       </w:pPr>
-      <w:bookmarkStart w:id="0" w:name="_Toc192162522"/>
-      <w:r>
-        <w:lastRenderedPageBreak/>
-        <w:t>Installation (NASSP 8/Orbiter 2016 Beta):</w:t>
+      <w:bookmarkStart w:id="0" w:name="_Toc199486487"/>
+      <w:r>
+        <w:t>Installation (NASSP 8</w:t>
+      </w:r>
+      <w:r>
+        <w:t>.0</w:t>
+      </w:r>
+      <w:r>
+        <w:t>/Orbiter 2016 Beta):</w:t>
       </w:r>
       <w:bookmarkEnd w:id="0"/>
     </w:p>
@@ -602,7 +718,13 @@
         <w:t>- Latest Orbiter Beta</w:t>
       </w:r>
       <w:r>
-        <w:t> NASSP 8.0 is not compatible with Orbiter 2010 or Orbiter 2016 and is at this time only compatible with the latest Beta release of Orbiter Beta R90 which includes a crucial fix to docked spacecraft physics which is not in the release version.</w:t>
+        <w:t> NASSP 8.0 is not compatible with Orbiter 2010 or Orbiter 2016 and is at this time only compatible with the latest Beta release of Orbiter</w:t>
+      </w:r>
+      <w:r>
+        <w:t xml:space="preserve"> 2016</w:t>
+      </w:r>
+      <w:r>
+        <w:t xml:space="preserve"> Beta R90 which includes a crucial fix to docked spacecraft physics which is not in the release version.</w:t>
       </w:r>
       <w:r>
         <w:br/>
@@ -666,14 +788,26 @@
       </w:r>
       <w:r>
         <w:br/>
-        <w:t>1. Install Orbiter Beta:</w:t>
+        <w:t xml:space="preserve">1. Install Orbiter </w:t>
+      </w:r>
+      <w:r>
+        <w:t xml:space="preserve">2016 </w:t>
+      </w:r>
+      <w:r>
+        <w:t>Beta:</w:t>
       </w:r>
       <w:r>
         <w:br/>
       </w:r>
       <w:r>
         <w:br/>
-        <w:t>We recommend using the snapshot of Orbiter Beta R90 here: </w:t>
+        <w:t xml:space="preserve">We recommend using the snapshot of Orbiter </w:t>
+      </w:r>
+      <w:r>
+        <w:t xml:space="preserve">2016 </w:t>
+      </w:r>
+      <w:r>
+        <w:t>Beta R90 here: </w:t>
       </w:r>
       <w:hyperlink r:id="rId10" w:tgtFrame="_blank" w:history="1">
         <w:r>
@@ -797,6 +931,7 @@
         <w:br/>
       </w:r>
       <w:r>
+        <w:lastRenderedPageBreak/>
         <w:br/>
       </w:r>
     </w:p>
@@ -806,7 +941,6 @@
           <w:b/>
           <w:bCs/>
         </w:rPr>
-        <w:lastRenderedPageBreak/>
         <w:t>-Optional:</w:t>
       </w:r>
       <w:r>
@@ -890,7 +1024,13 @@
         </w:r>
       </w:hyperlink>
       <w:r>
-        <w:t> to get the latest version of the client for Orbiter Beta R90.</w:t>
+        <w:t> to get the latest version of the client for Orbiter</w:t>
+      </w:r>
+      <w:r>
+        <w:t xml:space="preserve"> 2016</w:t>
+      </w:r>
+      <w:r>
+        <w:t xml:space="preserve"> Beta R90.</w:t>
       </w:r>
       <w:r>
         <w:br/>
@@ -977,7 +1117,13 @@
       </w:r>
       <w:r>
         <w:br/>
-        <w:t>5. Finally, download the latest build of NASSP at this link: </w:t>
+        <w:t xml:space="preserve">5. Finally, download the latest build of NASSP </w:t>
+      </w:r>
+      <w:r>
+        <w:t xml:space="preserve">8.0 </w:t>
+      </w:r>
+      <w:r>
+        <w:t>at this link: </w:t>
       </w:r>
       <w:hyperlink r:id="rId18" w:tgtFrame="_blank" w:history="1">
         <w:r>
@@ -990,11 +1136,9 @@
       <w:r>
         <w:t xml:space="preserve"> and unzip to your Orbiter directory. Do the same with the small XRSound config zip file that can be found at the link as well. These files only </w:t>
       </w:r>
-      <w:proofErr w:type="gramStart"/>
-      <w:r>
-        <w:t>have to</w:t>
-      </w:r>
-      <w:proofErr w:type="gramEnd"/>
+      <w:r>
+        <w:t>must</w:t>
+      </w:r>
       <w:r>
         <w:t xml:space="preserve"> be downloaded once. They are not part of the main NASSP build so that personalized changes can be made to the sound configuration, without being overwritten by a later NASSP build.</w:t>
       </w:r>
@@ -1004,76 +1148,139 @@
     </w:p>
     <w:p/>
     <w:p>
-      <w:r>
+      <w:pPr>
         <w:rPr>
           <w:b/>
           <w:bCs/>
         </w:rPr>
-        <w:lastRenderedPageBreak/>
-        <w:t>Configure Project Apollo:</w:t>
-      </w:r>
-      <w:r>
-        <w:br/>
-      </w:r>
-      <w:r>
-        <w:br/>
-        <w:t xml:space="preserve">1. Start Orbiter, go to the "Parameters" tab and make sure that at least Complex flight model, Limited fuel and Nonspherical gravity sources are enabled. Note: At this time, it is recommended to leave "Gravity-gradient torque" and "Atmospheric wind effects" disabled as </w:t>
-      </w:r>
-      <w:r>
-        <w:t>on</w:t>
-      </w:r>
-      <w:r>
-        <w:t xml:space="preserve"> some occasions they can cause CTDs with NASSP. Go to "Visual effects" tab and configure to your liking. Make sure to have a check on surface elevation, using LINEAR interpolation </w:t>
-      </w:r>
-      <w:proofErr w:type="gramStart"/>
-      <w:r>
-        <w:t>in order to</w:t>
-      </w:r>
-      <w:proofErr w:type="gramEnd"/>
-      <w:r>
-        <w:t xml:space="preserve"> not have the landed LM seem sunken into/floating over the lunar terrain. You can also check "Particle streams" to see the various particle/dust effects in NASSP and "Local light sources" for the night-time launch pad lighting.</w:t>
-      </w:r>
-      <w:r>
-        <w:br/>
-      </w:r>
-      <w:r>
-        <w:br/>
-        <w:t>2. Go to the "Modules" tab and activate the "XRSound" and "ProjectApolloMFD" and "ApolloRTCCMFD" modules.</w:t>
-      </w:r>
-      <w:r>
-        <w:br/>
-      </w:r>
-      <w:r>
-        <w:br/>
-        <w:t>3. Go to the Launchpad Configuration Options on the "Extra" tab. If you have a joystick, this is where you can configure your joystick for use in NASSP. Do not use the normal Orbiter controls page to configure your joystick, there it should be &lt;Disabled&gt;. In the "Miscellaneous" tab, make sure "</w:t>
-      </w:r>
-      <w:proofErr w:type="gramStart"/>
-      <w:r>
-        <w:t>Multi-Threading</w:t>
-      </w:r>
-      <w:proofErr w:type="gramEnd"/>
-      <w:r>
-        <w:t xml:space="preserve"> in time acceleration" is checked. It is also recommended to set a limit for time acceleration, NASSP runs best at 50x or less depending on the hardware you are using.</w:t>
-      </w:r>
-      <w:r>
-        <w:br/>
-      </w:r>
-      <w:r>
-        <w:br/>
-      </w:r>
+      </w:pPr>
       <w:r>
         <w:rPr>
           <w:b/>
           <w:bCs/>
         </w:rPr>
-        <w:t>How to update NASSP:</w:t>
+        <w:t>Configure Project Apollo</w:t>
+      </w:r>
+      <w:r>
+        <w:rPr>
+          <w:b/>
+          <w:bCs/>
+        </w:rPr>
+        <w:t xml:space="preserve"> </w:t>
+      </w:r>
+      <w:proofErr w:type="gramStart"/>
+      <w:r>
+        <w:rPr>
+          <w:b/>
+          <w:bCs/>
+        </w:rPr>
+        <w:t>For</w:t>
+      </w:r>
+      <w:proofErr w:type="gramEnd"/>
+      <w:r>
+        <w:rPr>
+          <w:b/>
+          <w:bCs/>
+        </w:rPr>
+        <w:t xml:space="preserve"> Orbiter 2016 Beta</w:t>
+      </w:r>
+      <w:r>
+        <w:rPr>
+          <w:b/>
+          <w:bCs/>
+        </w:rPr>
+        <w:t>:</w:t>
       </w:r>
       <w:r>
         <w:br/>
       </w:r>
       <w:r>
         <w:br/>
-        <w:t>Download the latest build of NASSP at this link: </w:t>
+        <w:t xml:space="preserve">1. Start Orbiter, go to the "Parameters" tab and make sure that at least Complex flight model, Limited fuel and Nonspherical gravity sources are enabled. Note: At this time, it is recommended to leave "Gravity-gradient torque" and "Atmospheric wind effects" disabled as </w:t>
+      </w:r>
+      <w:r>
+        <w:t>on</w:t>
+      </w:r>
+      <w:r>
+        <w:t xml:space="preserve"> some occasions they can cause CTDs with NASSP. Go to "Visual effects" tab and configure to your liking. Make sure to have a check on surface elevation, using LINEAR interpolation </w:t>
+      </w:r>
+      <w:r>
+        <w:t>to</w:t>
+      </w:r>
+      <w:r>
+        <w:t xml:space="preserve"> not have the landed LM seem sunken into/floating over the lunar terrain. You can also check "Particle streams" to see the various particle/dust effects in NASSP and "Local light sources" for the night-time launch pad lighting.</w:t>
+      </w:r>
+      <w:r>
+        <w:br/>
+      </w:r>
+      <w:r>
+        <w:br/>
+        <w:t>2. Go to the "Modules" tab and activate the "XRSound" and "ProjectApolloMFD" and "ApolloRTCCMFD" modules.</w:t>
+      </w:r>
+      <w:r>
+        <w:br/>
+      </w:r>
+      <w:r>
+        <w:br/>
+        <w:t>3. Go to the Launchpad Configuration Options on the "Extra" tab. If you have a joystick, this is where you can configure your joystick for use in NASSP. Do not use the normal Orbiter controls page to configure your joystick, there it should be &lt;Disabled&gt;. In the "Miscellaneous" tab, make sure "</w:t>
+      </w:r>
+      <w:proofErr w:type="gramStart"/>
+      <w:r>
+        <w:t>Multi-Threading</w:t>
+      </w:r>
+      <w:proofErr w:type="gramEnd"/>
+      <w:r>
+        <w:t xml:space="preserve"> in time acceleration" is checked. It is also recommended to set a limit for time acceleration, NASSP runs best at 50x or less depending on the hardware you are using.</w:t>
+      </w:r>
+      <w:r>
+        <w:br/>
+      </w:r>
+      <w:r>
+        <w:br/>
+      </w:r>
+      <w:r>
+        <w:rPr>
+          <w:b/>
+          <w:bCs/>
+        </w:rPr>
+        <w:t>How to update NASSP</w:t>
+      </w:r>
+      <w:r>
+        <w:rPr>
+          <w:b/>
+          <w:bCs/>
+        </w:rPr>
+        <w:t xml:space="preserve"> 8</w:t>
+      </w:r>
+      <w:r>
+        <w:rPr>
+          <w:b/>
+          <w:bCs/>
+        </w:rPr>
+        <w:t>.0</w:t>
+      </w:r>
+      <w:r>
+        <w:rPr>
+          <w:b/>
+          <w:bCs/>
+        </w:rPr>
+        <w:t>:</w:t>
+      </w:r>
+      <w:r>
+        <w:br/>
+      </w:r>
+      <w:r>
+        <w:br/>
+        <w:t>Download the latest build of NASSP</w:t>
+      </w:r>
+      <w:r>
+        <w:t xml:space="preserve"> 8</w:t>
+      </w:r>
+      <w:r>
+        <w:t>.0</w:t>
+      </w:r>
+      <w:r>
+        <w:t xml:space="preserve"> at this link: </w:t>
       </w:r>
       <w:hyperlink r:id="rId19" w:tgtFrame="_blank" w:history="1">
         <w:r>
@@ -1100,6 +1307,130 @@
         <w:t>Please note, timestamped saves (i.e. those within the "Apollo Mission Scenarios" folder) do not have the latest systems updates. Because of this, they may have alarms and other quirks when loading them. We encourage starting with a fresh launch.</w:t>
       </w:r>
     </w:p>
+    <w:p>
+      <w:pPr>
+        <w:rPr>
+          <w:b/>
+          <w:bCs/>
+        </w:rPr>
+      </w:pPr>
+    </w:p>
+    <w:p>
+      <w:pPr>
+        <w:rPr>
+          <w:b/>
+          <w:bCs/>
+        </w:rPr>
+      </w:pPr>
+    </w:p>
+    <w:p>
+      <w:pPr>
+        <w:rPr>
+          <w:b/>
+          <w:bCs/>
+        </w:rPr>
+      </w:pPr>
+    </w:p>
+    <w:p>
+      <w:pPr>
+        <w:rPr>
+          <w:b/>
+          <w:bCs/>
+        </w:rPr>
+      </w:pPr>
+    </w:p>
+    <w:p>
+      <w:pPr>
+        <w:rPr>
+          <w:b/>
+          <w:bCs/>
+        </w:rPr>
+      </w:pPr>
+    </w:p>
+    <w:p>
+      <w:pPr>
+        <w:rPr>
+          <w:b/>
+          <w:bCs/>
+        </w:rPr>
+      </w:pPr>
+    </w:p>
+    <w:p>
+      <w:pPr>
+        <w:rPr>
+          <w:b/>
+          <w:bCs/>
+        </w:rPr>
+      </w:pPr>
+    </w:p>
+    <w:p>
+      <w:pPr>
+        <w:rPr>
+          <w:b/>
+          <w:bCs/>
+        </w:rPr>
+      </w:pPr>
+    </w:p>
+    <w:p>
+      <w:pPr>
+        <w:rPr>
+          <w:b/>
+          <w:bCs/>
+        </w:rPr>
+      </w:pPr>
+    </w:p>
+    <w:p>
+      <w:pPr>
+        <w:pStyle w:val="Heading1"/>
+      </w:pPr>
+      <w:bookmarkStart w:id="1" w:name="_Toc199486488"/>
+      <w:r>
+        <w:t xml:space="preserve">Installation (NASSP </w:t>
+      </w:r>
+      <w:r>
+        <w:t>9</w:t>
+      </w:r>
+      <w:r>
+        <w:t>.0</w:t>
+      </w:r>
+      <w:r>
+        <w:t>/Orbiter 20</w:t>
+      </w:r>
+      <w:r>
+        <w:t>24</w:t>
+      </w:r>
+      <w:r>
+        <w:t>):</w:t>
+      </w:r>
+      <w:bookmarkEnd w:id="1"/>
+    </w:p>
+    <w:p>
+      <w:r>
+        <w:rPr>
+          <w:b/>
+          <w:bCs/>
+        </w:rPr>
+        <w:t>Work In Progress/To Be Added</w:t>
+      </w:r>
+    </w:p>
+    <w:p/>
+    <w:p/>
+    <w:p/>
+    <w:p/>
+    <w:p/>
+    <w:p/>
+    <w:p/>
+    <w:p/>
+    <w:p/>
+    <w:p/>
+    <w:p/>
+    <w:p/>
+    <w:p/>
+    <w:p/>
+    <w:p/>
+    <w:p/>
+    <w:p/>
+    <w:p/>
     <w:p/>
     <w:p/>
     <w:p/>
@@ -1108,18 +1439,18 @@
       <w:pPr>
         <w:pStyle w:val="Heading1"/>
       </w:pPr>
-      <w:bookmarkStart w:id="1" w:name="_Toc192162523"/>
     </w:p>
     <w:p/>
     <w:p>
       <w:pPr>
         <w:pStyle w:val="Heading1"/>
       </w:pPr>
+      <w:bookmarkStart w:id="2" w:name="_Toc199486489"/>
       <w:r>
         <w:lastRenderedPageBreak/>
         <w:t>Tips For Beginners:</w:t>
       </w:r>
-      <w:bookmarkEnd w:id="1"/>
+      <w:bookmarkEnd w:id="2"/>
     </w:p>
     <w:p>
       <w:pPr>
@@ -1837,12 +2168,12 @@
       <w:pPr>
         <w:pStyle w:val="Heading1"/>
       </w:pPr>
-      <w:bookmarkStart w:id="2" w:name="_Toc192162524"/>
+      <w:bookmarkStart w:id="3" w:name="_Toc199486490"/>
       <w:r>
         <w:lastRenderedPageBreak/>
         <w:t>Keyboard Commands:</w:t>
       </w:r>
-      <w:bookmarkEnd w:id="2"/>
+      <w:bookmarkEnd w:id="3"/>
     </w:p>
     <w:p>
       <w:pPr>
@@ -4040,8 +4371,212 @@
       </w:tr>
     </w:tbl>
     <w:p/>
-    <w:p/>
-    <w:p/>
+    <w:tbl>
+      <w:tblPr>
+        <w:tblW w:w="5000" w:type="pct"/>
+        <w:tblLook w:val="04A0" w:firstRow="1" w:lastRow="0" w:firstColumn="1" w:lastColumn="0" w:noHBand="0" w:noVBand="1"/>
+      </w:tblPr>
+      <w:tblGrid>
+        <w:gridCol w:w="2618"/>
+        <w:gridCol w:w="6732"/>
+      </w:tblGrid>
+      <w:tr>
+        <w:trPr>
+          <w:trHeight w:val="300"/>
+        </w:trPr>
+        <w:tc>
+          <w:tcPr>
+            <w:tcW w:w="5000" w:type="pct"/>
+            <w:gridSpan w:val="2"/>
+            <w:tcBorders>
+              <w:top w:val="single" w:sz="4" w:space="0" w:color="auto"/>
+              <w:left w:val="single" w:sz="4" w:space="0" w:color="auto"/>
+              <w:bottom w:val="single" w:sz="4" w:space="0" w:color="auto"/>
+              <w:right w:val="single" w:sz="4" w:space="0" w:color="auto"/>
+            </w:tcBorders>
+            <w:shd w:val="clear" w:color="auto" w:fill="auto"/>
+            <w:noWrap/>
+            <w:vAlign w:val="bottom"/>
+            <w:hideMark/>
+          </w:tcPr>
+          <w:p>
+            <w:pPr>
+              <w:spacing w:after="0" w:line="240" w:lineRule="auto"/>
+              <w:jc w:val="center"/>
+              <w:rPr>
+                <w:rFonts w:eastAsia="Times New Roman" w:cs="Times New Roman"/>
+                <w:b/>
+                <w:bCs/>
+                <w:color w:val="000000"/>
+                <w:kern w:val="0"/>
+                <w14:ligatures w14:val="none"/>
+              </w:rPr>
+            </w:pPr>
+            <w:r>
+              <w:rPr>
+                <w:rFonts w:eastAsia="Times New Roman" w:cs="Times New Roman"/>
+                <w:b/>
+                <w:bCs/>
+                <w:color w:val="000000"/>
+                <w:kern w:val="0"/>
+                <w14:ligatures w14:val="none"/>
+              </w:rPr>
+              <w:t>ORDEAL</w:t>
+            </w:r>
+          </w:p>
+        </w:tc>
+      </w:tr>
+      <w:tr>
+        <w:trPr>
+          <w:trHeight w:val="300"/>
+        </w:trPr>
+        <w:tc>
+          <w:tcPr>
+            <w:tcW w:w="1400" w:type="pct"/>
+            <w:tcBorders>
+              <w:top w:val="nil"/>
+              <w:left w:val="single" w:sz="4" w:space="0" w:color="auto"/>
+              <w:bottom w:val="single" w:sz="4" w:space="0" w:color="auto"/>
+              <w:right w:val="single" w:sz="4" w:space="0" w:color="auto"/>
+            </w:tcBorders>
+            <w:shd w:val="clear" w:color="auto" w:fill="auto"/>
+            <w:noWrap/>
+            <w:vAlign w:val="bottom"/>
+            <w:hideMark/>
+          </w:tcPr>
+          <w:p>
+            <w:pPr>
+              <w:spacing w:after="0" w:line="240" w:lineRule="auto"/>
+              <w:rPr>
+                <w:rFonts w:eastAsia="Times New Roman" w:cs="Times New Roman"/>
+                <w:color w:val="000000"/>
+                <w:kern w:val="0"/>
+                <w14:ligatures w14:val="none"/>
+              </w:rPr>
+            </w:pPr>
+            <w:r>
+              <w:rPr>
+                <w:rFonts w:eastAsia="Times New Roman" w:cs="Times New Roman"/>
+                <w:color w:val="000000"/>
+                <w:kern w:val="0"/>
+                <w14:ligatures w14:val="none"/>
+              </w:rPr>
+              <w:t>Alt-O</w:t>
+            </w:r>
+          </w:p>
+        </w:tc>
+        <w:tc>
+          <w:tcPr>
+            <w:tcW w:w="3600" w:type="pct"/>
+            <w:tcBorders>
+              <w:top w:val="nil"/>
+              <w:left w:val="nil"/>
+              <w:bottom w:val="single" w:sz="4" w:space="0" w:color="auto"/>
+              <w:right w:val="single" w:sz="4" w:space="0" w:color="auto"/>
+            </w:tcBorders>
+            <w:shd w:val="clear" w:color="auto" w:fill="auto"/>
+            <w:noWrap/>
+            <w:vAlign w:val="bottom"/>
+            <w:hideMark/>
+          </w:tcPr>
+          <w:p>
+            <w:pPr>
+              <w:spacing w:after="0" w:line="240" w:lineRule="auto"/>
+              <w:rPr>
+                <w:rFonts w:eastAsia="Times New Roman" w:cs="Times New Roman"/>
+                <w:color w:val="000000"/>
+                <w:kern w:val="0"/>
+                <w14:ligatures w14:val="none"/>
+              </w:rPr>
+            </w:pPr>
+            <w:r>
+              <w:rPr>
+                <w:rFonts w:eastAsia="Times New Roman" w:cs="Times New Roman"/>
+                <w:color w:val="000000"/>
+                <w:kern w:val="0"/>
+                <w14:ligatures w14:val="none"/>
+              </w:rPr>
+              <w:t>Slew ORDEAL Up</w:t>
+            </w:r>
+          </w:p>
+        </w:tc>
+      </w:tr>
+      <w:tr>
+        <w:trPr>
+          <w:trHeight w:val="300"/>
+        </w:trPr>
+        <w:tc>
+          <w:tcPr>
+            <w:tcW w:w="1400" w:type="pct"/>
+            <w:tcBorders>
+              <w:top w:val="nil"/>
+              <w:left w:val="single" w:sz="4" w:space="0" w:color="auto"/>
+              <w:bottom w:val="single" w:sz="4" w:space="0" w:color="auto"/>
+              <w:right w:val="single" w:sz="4" w:space="0" w:color="auto"/>
+            </w:tcBorders>
+            <w:shd w:val="clear" w:color="auto" w:fill="auto"/>
+            <w:noWrap/>
+            <w:vAlign w:val="bottom"/>
+            <w:hideMark/>
+          </w:tcPr>
+          <w:p>
+            <w:pPr>
+              <w:spacing w:after="0" w:line="240" w:lineRule="auto"/>
+              <w:rPr>
+                <w:rFonts w:eastAsia="Times New Roman" w:cs="Times New Roman"/>
+                <w:color w:val="000000"/>
+                <w:kern w:val="0"/>
+                <w14:ligatures w14:val="none"/>
+              </w:rPr>
+            </w:pPr>
+            <w:r>
+              <w:rPr>
+                <w:rFonts w:eastAsia="Times New Roman" w:cs="Times New Roman"/>
+                <w:color w:val="000000"/>
+                <w:kern w:val="0"/>
+                <w14:ligatures w14:val="none"/>
+              </w:rPr>
+              <w:t>Alt-L</w:t>
+            </w:r>
+          </w:p>
+        </w:tc>
+        <w:tc>
+          <w:tcPr>
+            <w:tcW w:w="3600" w:type="pct"/>
+            <w:tcBorders>
+              <w:top w:val="nil"/>
+              <w:left w:val="nil"/>
+              <w:bottom w:val="single" w:sz="4" w:space="0" w:color="auto"/>
+              <w:right w:val="single" w:sz="4" w:space="0" w:color="auto"/>
+            </w:tcBorders>
+            <w:shd w:val="clear" w:color="auto" w:fill="auto"/>
+            <w:noWrap/>
+            <w:vAlign w:val="bottom"/>
+            <w:hideMark/>
+          </w:tcPr>
+          <w:p>
+            <w:pPr>
+              <w:spacing w:after="0" w:line="240" w:lineRule="auto"/>
+              <w:rPr>
+                <w:rFonts w:eastAsia="Times New Roman" w:cs="Times New Roman"/>
+                <w:color w:val="000000"/>
+                <w:kern w:val="0"/>
+                <w14:ligatures w14:val="none"/>
+              </w:rPr>
+            </w:pPr>
+            <w:r>
+              <w:rPr>
+                <w:rFonts w:eastAsia="Times New Roman" w:cs="Times New Roman"/>
+                <w:color w:val="000000"/>
+                <w:kern w:val="0"/>
+                <w14:ligatures w14:val="none"/>
+              </w:rPr>
+              <w:t>Slew ORDEAL Down</w:t>
+            </w:r>
+          </w:p>
+        </w:tc>
+      </w:tr>
+    </w:tbl>
     <w:p>
       <w:r>
         <w:lastRenderedPageBreak/>
@@ -8881,6 +9416,17 @@
                 <w14:ligatures w14:val="none"/>
               </w:rPr>
               <w:lastRenderedPageBreak/>
+              <w:t xml:space="preserve">LM </w:t>
+            </w:r>
+            <w:r>
+              <w:rPr>
+                <w:rFonts w:eastAsia="Times New Roman" w:cs="Times New Roman"/>
+                <w:b/>
+                <w:bCs/>
+                <w:color w:val="000000"/>
+                <w:kern w:val="0"/>
+                <w14:ligatures w14:val="none"/>
+              </w:rPr>
               <w:t>Miscellaneous</w:t>
             </w:r>
           </w:p>
@@ -9453,10 +9999,7 @@
               <w:pStyle w:val="Subtitle"/>
             </w:pPr>
             <w:r>
-              <w:t>EVA</w:t>
-            </w:r>
-            <w:r>
-              <w:t xml:space="preserve"> Controls:</w:t>
+              <w:t>EVA Controls:</w:t>
             </w:r>
           </w:p>
         </w:tc>
@@ -9579,6 +10122,7 @@
                 <w14:ligatures w14:val="none"/>
               </w:rPr>
             </w:pPr>
+            <w:bookmarkStart w:id="4" w:name="_Hlk199486662"/>
             <w:r>
               <w:rPr>
                 <w:rFonts w:eastAsia="Times New Roman" w:cs="Times New Roman"/>
@@ -9663,7 +10207,25 @@
                 <w:kern w:val="0"/>
                 <w14:ligatures w14:val="none"/>
               </w:rPr>
-              <w:t>Boards LM (Standing by ladder)</w:t>
+              <w:t xml:space="preserve">Boards LM (Standing by </w:t>
+            </w:r>
+            <w:r>
+              <w:rPr>
+                <w:rFonts w:eastAsia="Times New Roman" w:cs="Times New Roman"/>
+                <w:color w:val="000000"/>
+                <w:kern w:val="0"/>
+                <w14:ligatures w14:val="none"/>
+              </w:rPr>
+              <w:t xml:space="preserve">LM </w:t>
+            </w:r>
+            <w:r>
+              <w:rPr>
+                <w:rFonts w:eastAsia="Times New Roman" w:cs="Times New Roman"/>
+                <w:color w:val="000000"/>
+                <w:kern w:val="0"/>
+                <w14:ligatures w14:val="none"/>
+              </w:rPr>
+              <w:t>ladder)</w:t>
             </w:r>
           </w:p>
         </w:tc>
@@ -9813,7 +10375,16 @@
                 <w:kern w:val="0"/>
                 <w14:ligatures w14:val="none"/>
               </w:rPr>
-              <w:t>Deploy Rover</w:t>
+              <w:t xml:space="preserve">Deploy </w:t>
+            </w:r>
+            <w:r>
+              <w:rPr>
+                <w:rFonts w:eastAsia="Times New Roman" w:cs="Times New Roman"/>
+                <w:color w:val="000000"/>
+                <w:kern w:val="0"/>
+                <w14:ligatures w14:val="none"/>
+              </w:rPr>
+              <w:t>LRV</w:t>
             </w:r>
           </w:p>
         </w:tc>
@@ -9888,7 +10459,61 @@
                 <w:kern w:val="0"/>
                 <w14:ligatures w14:val="none"/>
               </w:rPr>
-              <w:t>Boards/Deboards Rover (Standing by rover)</w:t>
+              <w:t xml:space="preserve">Boards/Deboards </w:t>
+            </w:r>
+            <w:r>
+              <w:rPr>
+                <w:rFonts w:eastAsia="Times New Roman" w:cs="Times New Roman"/>
+                <w:color w:val="000000"/>
+                <w:kern w:val="0"/>
+                <w14:ligatures w14:val="none"/>
+              </w:rPr>
+              <w:t>LRV</w:t>
+            </w:r>
+            <w:r>
+              <w:rPr>
+                <w:rFonts w:eastAsia="Times New Roman" w:cs="Times New Roman"/>
+                <w:color w:val="000000"/>
+                <w:kern w:val="0"/>
+                <w14:ligatures w14:val="none"/>
+              </w:rPr>
+              <w:t xml:space="preserve"> (Standing </w:t>
+            </w:r>
+            <w:r>
+              <w:rPr>
+                <w:rFonts w:eastAsia="Times New Roman" w:cs="Times New Roman"/>
+                <w:color w:val="000000"/>
+                <w:kern w:val="0"/>
+                <w14:ligatures w14:val="none"/>
+              </w:rPr>
+              <w:t>by</w:t>
+            </w:r>
+            <w:r>
+              <w:rPr>
+                <w:rFonts w:eastAsia="Times New Roman" w:cs="Times New Roman"/>
+                <w:color w:val="000000"/>
+                <w:kern w:val="0"/>
+                <w14:ligatures w14:val="none"/>
+              </w:rPr>
+              <w:t xml:space="preserve"> </w:t>
+            </w:r>
+            <w:r>
+              <w:rPr>
+                <w:rFonts w:eastAsia="Times New Roman" w:cs="Times New Roman"/>
+                <w:color w:val="000000"/>
+                <w:kern w:val="0"/>
+                <w14:ligatures w14:val="none"/>
+              </w:rPr>
+              <w:t>LRV</w:t>
+            </w:r>
+            <w:r>
+              <w:rPr>
+                <w:rFonts w:eastAsia="Times New Roman" w:cs="Times New Roman"/>
+                <w:color w:val="000000"/>
+                <w:kern w:val="0"/>
+                <w14:ligatures w14:val="none"/>
+              </w:rPr>
+              <w:t>)</w:t>
             </w:r>
           </w:p>
         </w:tc>
@@ -9963,7 +10588,16 @@
                 <w:kern w:val="0"/>
                 <w14:ligatures w14:val="none"/>
               </w:rPr>
-              <w:t>Drive Forward</w:t>
+              <w:t xml:space="preserve">LRV </w:t>
+            </w:r>
+            <w:r>
+              <w:rPr>
+                <w:rFonts w:eastAsia="Times New Roman" w:cs="Times New Roman"/>
+                <w:color w:val="000000"/>
+                <w:kern w:val="0"/>
+                <w14:ligatures w14:val="none"/>
+              </w:rPr>
+              <w:t>Forward</w:t>
             </w:r>
           </w:p>
         </w:tc>
@@ -10038,7 +10672,16 @@
                 <w:kern w:val="0"/>
                 <w14:ligatures w14:val="none"/>
               </w:rPr>
-              <w:t>Drive Reverse</w:t>
+              <w:t xml:space="preserve">LRV </w:t>
+            </w:r>
+            <w:r>
+              <w:rPr>
+                <w:rFonts w:eastAsia="Times New Roman" w:cs="Times New Roman"/>
+                <w:color w:val="000000"/>
+                <w:kern w:val="0"/>
+                <w14:ligatures w14:val="none"/>
+              </w:rPr>
+              <w:t>Reverse</w:t>
             </w:r>
           </w:p>
         </w:tc>
@@ -10113,7 +10756,25 @@
                 <w:kern w:val="0"/>
                 <w14:ligatures w14:val="none"/>
               </w:rPr>
-              <w:t>Steer Left</w:t>
+              <w:t xml:space="preserve">Steer </w:t>
+            </w:r>
+            <w:r>
+              <w:rPr>
+                <w:rFonts w:eastAsia="Times New Roman" w:cs="Times New Roman"/>
+                <w:color w:val="000000"/>
+                <w:kern w:val="0"/>
+                <w14:ligatures w14:val="none"/>
+              </w:rPr>
+              <w:t xml:space="preserve">LRV </w:t>
+            </w:r>
+            <w:r>
+              <w:rPr>
+                <w:rFonts w:eastAsia="Times New Roman" w:cs="Times New Roman"/>
+                <w:color w:val="000000"/>
+                <w:kern w:val="0"/>
+                <w14:ligatures w14:val="none"/>
+              </w:rPr>
+              <w:t>Left</w:t>
             </w:r>
           </w:p>
         </w:tc>
@@ -10188,7 +10849,25 @@
                 <w:kern w:val="0"/>
                 <w14:ligatures w14:val="none"/>
               </w:rPr>
-              <w:t>Steer Right</w:t>
+              <w:t xml:space="preserve">Steer </w:t>
+            </w:r>
+            <w:r>
+              <w:rPr>
+                <w:rFonts w:eastAsia="Times New Roman" w:cs="Times New Roman"/>
+                <w:color w:val="000000"/>
+                <w:kern w:val="0"/>
+                <w14:ligatures w14:val="none"/>
+              </w:rPr>
+              <w:t xml:space="preserve">LRV </w:t>
+            </w:r>
+            <w:r>
+              <w:rPr>
+                <w:rFonts w:eastAsia="Times New Roman" w:cs="Times New Roman"/>
+                <w:color w:val="000000"/>
+                <w:kern w:val="0"/>
+                <w14:ligatures w14:val="none"/>
+              </w:rPr>
+              <w:t>Right</w:t>
             </w:r>
           </w:p>
         </w:tc>
@@ -10263,11 +10942,30 @@
                 <w:kern w:val="0"/>
                 <w14:ligatures w14:val="none"/>
               </w:rPr>
-              <w:t>Center Steering</w:t>
+              <w:t xml:space="preserve">Center </w:t>
+            </w:r>
+            <w:r>
+              <w:rPr>
+                <w:rFonts w:eastAsia="Times New Roman" w:cs="Times New Roman"/>
+                <w:color w:val="000000"/>
+                <w:kern w:val="0"/>
+                <w14:ligatures w14:val="none"/>
+              </w:rPr>
+              <w:t xml:space="preserve">LRV </w:t>
+            </w:r>
+            <w:r>
+              <w:rPr>
+                <w:rFonts w:eastAsia="Times New Roman" w:cs="Times New Roman"/>
+                <w:color w:val="000000"/>
+                <w:kern w:val="0"/>
+                <w14:ligatures w14:val="none"/>
+              </w:rPr>
+              <w:t>Steering</w:t>
             </w:r>
           </w:p>
         </w:tc>
       </w:tr>
+      <w:bookmarkEnd w:id="4"/>
       <w:tr>
         <w:trPr>
           <w:trHeight w:val="300"/>
@@ -10286,6 +10984,19 @@
             <w:vAlign w:val="bottom"/>
             <w:hideMark/>
           </w:tcPr>
+          <w:p>
+            <w:pPr>
+              <w:spacing w:after="0" w:line="240" w:lineRule="auto"/>
+              <w:rPr>
+                <w:rFonts w:eastAsia="Times New Roman" w:cs="Times New Roman"/>
+                <w:b/>
+                <w:bCs/>
+                <w:color w:val="000000"/>
+                <w:kern w:val="0"/>
+                <w14:ligatures w14:val="none"/>
+              </w:rPr>
+            </w:pPr>
+          </w:p>
           <w:p>
             <w:pPr>
               <w:spacing w:after="0" w:line="240" w:lineRule="auto"/>
@@ -10465,12 +11176,12 @@
       <w:pPr>
         <w:pStyle w:val="Heading1"/>
       </w:pPr>
-      <w:bookmarkStart w:id="3" w:name="_Toc192162525"/>
+      <w:bookmarkStart w:id="5" w:name="_Toc199486491"/>
       <w:r>
         <w:lastRenderedPageBreak/>
         <w:t>Important Links:</w:t>
       </w:r>
-      <w:bookmarkEnd w:id="3"/>
+      <w:bookmarkEnd w:id="5"/>
     </w:p>
     <w:p>
       <w:hyperlink r:id="rId20" w:history="1">
@@ -10482,7 +11193,13 @@
         </w:r>
       </w:hyperlink>
       <w:r>
-        <w:t xml:space="preserve"> Contains the latest and greatest from Open Orbiter</w:t>
+        <w:t xml:space="preserve"> Contains the latest and greatest from </w:t>
+      </w:r>
+      <w:r>
+        <w:t>Orbiter 2024/</w:t>
+      </w:r>
+      <w:r>
+        <w:t>Open Orbiter</w:t>
       </w:r>
     </w:p>
     <w:p>
@@ -10497,6 +11214,9 @@
       <w:r>
         <w:t xml:space="preserve"> Latest releases from NASSP</w:t>
       </w:r>
+      <w:r>
+        <w:t xml:space="preserve"> 8</w:t>
+      </w:r>
     </w:p>
     <w:p>
       <w:hyperlink r:id="rId22" w:history="1">
@@ -10504,11 +11224,26 @@
           <w:rPr>
             <w:rStyle w:val="Hyperlink"/>
           </w:rPr>
-          <w:t>NASSP Orbiter Forum:</w:t>
+          <w:t>NASSP</w:t>
+        </w:r>
+        <w:r>
+          <w:rPr>
+            <w:rStyle w:val="Hyperlink"/>
+          </w:rPr>
+          <w:t xml:space="preserve"> 9 Downloads</w:t>
+        </w:r>
+        <w:r>
+          <w:rPr>
+            <w:rStyle w:val="Hyperlink"/>
+          </w:rPr>
+          <w:t>:</w:t>
         </w:r>
       </w:hyperlink>
       <w:r>
-        <w:t xml:space="preserve"> Latest release update descriptions and additional information</w:t>
+        <w:t xml:space="preserve"> Latest releases from NASSP</w:t>
+      </w:r>
+      <w:r>
+        <w:t xml:space="preserve"> 9 (Experimental)</w:t>
       </w:r>
     </w:p>
     <w:p>
@@ -10517,11 +11252,11 @@
           <w:rPr>
             <w:rStyle w:val="Hyperlink"/>
           </w:rPr>
-          <w:t>Flight Data Files:</w:t>
+          <w:t>NASSP Orbiter Forum:</w:t>
         </w:r>
       </w:hyperlink>
       <w:r>
-        <w:t xml:space="preserve"> Real life mission specific documents for all flights</w:t>
+        <w:t xml:space="preserve"> Latest release update descriptions and additional information</w:t>
       </w:r>
     </w:p>
     <w:p>
@@ -10530,14 +11265,11 @@
           <w:rPr>
             <w:rStyle w:val="Hyperlink"/>
           </w:rPr>
-          <w:t>Virtual AGC:</w:t>
+          <w:t>Flight Data Files:</w:t>
         </w:r>
       </w:hyperlink>
       <w:r>
-        <w:t xml:space="preserve"> Anything you wanted to know about the Apollo Guidance Computer, plus an enormous document </w:t>
-      </w:r>
-      <w:r>
-        <w:t>repository.</w:t>
+        <w:t xml:space="preserve"> Real life mission specific documents for all flights</w:t>
       </w:r>
     </w:p>
     <w:p>
@@ -10546,6 +11278,22 @@
           <w:rPr>
             <w:rStyle w:val="Hyperlink"/>
           </w:rPr>
+          <w:t>Virtual AGC:</w:t>
+        </w:r>
+      </w:hyperlink>
+      <w:r>
+        <w:t xml:space="preserve"> Anything you wanted to know about the Apollo Guidance Computer, plus an enormous document </w:t>
+      </w:r>
+      <w:r>
+        <w:t>repository.</w:t>
+      </w:r>
+    </w:p>
+    <w:p>
+      <w:hyperlink r:id="rId26" w:history="1">
+        <w:r>
+          <w:rPr>
+            <w:rStyle w:val="Hyperlink"/>
+          </w:rPr>
           <w:t>NASSP Discord:</w:t>
         </w:r>
       </w:hyperlink>
@@ -10555,7 +11303,7 @@
     </w:p>
     <w:p/>
     <w:sectPr>
-      <w:footerReference w:type="default" r:id="rId26"/>
+      <w:footerReference w:type="default" r:id="rId27"/>
       <w:pgSz w:w="12240" w:h="15840"/>
       <w:pgMar w:top="1440" w:right="1440" w:bottom="1440" w:left="1440" w:header="720" w:footer="720" w:gutter="0"/>
       <w:cols w:space="720"/>

</xml_diff>

<commit_message>
Change VC text from "scroll" to "move"
</commit_message>
<xml_diff>
--- a/Doc/Project Apollo - NASSP/Programmers Notes/NASSP Quick Start Guide.docx
+++ b/Doc/Project Apollo - NASSP/Programmers Notes/NASSP Quick Start Guide.docx
@@ -2652,7 +2652,16 @@
                 <w:kern w:val="0"/>
                 <w14:ligatures w14:val="none"/>
               </w:rPr>
-              <w:t>Scroll Left/Right/Up/Down</w:t>
+              <w:t>Move</w:t>
+            </w:r>
+            <w:r>
+              <w:rPr>
+                <w:rFonts w:eastAsia="Times New Roman" w:cs="Times New Roman"/>
+                <w:color w:val="000000"/>
+                <w:kern w:val="0"/>
+                <w14:ligatures w14:val="none"/>
+              </w:rPr>
+              <w:t xml:space="preserve"> Left/Right/Up/Down</w:t>
             </w:r>
           </w:p>
         </w:tc>
@@ -2727,7 +2736,16 @@
                 <w:kern w:val="0"/>
                 <w14:ligatures w14:val="none"/>
               </w:rPr>
-              <w:t>Scroll Forward/Backward</w:t>
+              <w:t>Move</w:t>
+            </w:r>
+            <w:r>
+              <w:rPr>
+                <w:rFonts w:eastAsia="Times New Roman" w:cs="Times New Roman"/>
+                <w:color w:val="000000"/>
+                <w:kern w:val="0"/>
+                <w14:ligatures w14:val="none"/>
+              </w:rPr>
+              <w:t xml:space="preserve"> Forward/Backward</w:t>
             </w:r>
           </w:p>
         </w:tc>
@@ -2802,7 +2820,16 @@
                 <w:kern w:val="0"/>
                 <w14:ligatures w14:val="none"/>
               </w:rPr>
-              <w:t>Scroll Slowly</w:t>
+              <w:t>Move</w:t>
+            </w:r>
+            <w:r>
+              <w:rPr>
+                <w:rFonts w:eastAsia="Times New Roman" w:cs="Times New Roman"/>
+                <w:color w:val="000000"/>
+                <w:kern w:val="0"/>
+                <w14:ligatures w14:val="none"/>
+              </w:rPr>
+              <w:t xml:space="preserve"> Slowly</w:t>
             </w:r>
           </w:p>
         </w:tc>
@@ -11240,10 +11267,7 @@
         </w:r>
       </w:hyperlink>
       <w:r>
-        <w:t xml:space="preserve"> Latest releases from NASSP</w:t>
-      </w:r>
-      <w:r>
-        <w:t xml:space="preserve"> 9 (Experimental)</w:t>
+        <w:t xml:space="preserve"> Latest releases from NASSP 9 (Experimental)</w:t>
       </w:r>
     </w:p>
     <w:p>

</xml_diff>

<commit_message>
Update QSG to REVISION 1.2.1
</commit_message>
<xml_diff>
--- a/Doc/Project Apollo - NASSP/Programmers Notes/NASSP Quick Start Guide.docx
+++ b/Doc/Project Apollo - NASSP/Programmers Notes/NASSP Quick Start Guide.docx
@@ -42,6 +42,14 @@
           <w:b w:val="0"/>
           <w:bCs w:val="0"/>
         </w:rPr>
+        <w:t>.1</w:t>
+      </w:r>
+      <w:r>
+        <w:rPr>
+          <w:rStyle w:val="IntenseReference"/>
+          <w:b w:val="0"/>
+          <w:bCs w:val="0"/>
+        </w:rPr>
         <w:t xml:space="preserve"> </w:t>
       </w:r>
     </w:p>
@@ -60,7 +68,7 @@
           <w:b w:val="0"/>
           <w:bCs w:val="0"/>
         </w:rPr>
-        <w:t>30</w:t>
+        <w:t>7</w:t>
       </w:r>
       <w:r>
         <w:rPr>
@@ -76,7 +84,7 @@
           <w:b w:val="0"/>
           <w:bCs w:val="0"/>
         </w:rPr>
-        <w:t>MAY</w:t>
+        <w:t>NOV</w:t>
       </w:r>
       <w:r>
         <w:rPr>
@@ -1065,7 +1073,7 @@
           <w:b/>
           <w:bCs/>
         </w:rPr>
-        <w:t xml:space="preserve">IMPORTANT: Click "Advanced" and add a check beside "Enable absolute animation handling" to prevent animation </w:t>
+        <w:t xml:space="preserve">IMPORTANT: Click "Advanced" and add a check beside "Enable absolute animation handling" to prevent </w:t>
       </w:r>
       <w:proofErr w:type="gramStart"/>
       <w:r>
@@ -1073,7 +1081,7 @@
           <w:b/>
           <w:bCs/>
         </w:rPr>
-        <w:t>drift</w:t>
+        <w:t>animation drift</w:t>
       </w:r>
       <w:proofErr w:type="gramEnd"/>
       <w:r>
@@ -1081,7 +1089,21 @@
           <w:b/>
           <w:bCs/>
         </w:rPr>
-        <w:t xml:space="preserve"> happening in certain cases in the VC. You can also configure the other options </w:t>
+        <w:t xml:space="preserve"> </w:t>
+      </w:r>
+      <w:r>
+        <w:rPr>
+          <w:b/>
+          <w:bCs/>
+        </w:rPr>
+        <w:t xml:space="preserve">from </w:t>
+      </w:r>
+      <w:r>
+        <w:rPr>
+          <w:b/>
+          <w:bCs/>
+        </w:rPr>
+        <w:t xml:space="preserve">happening in certain cases in the VC. You can also configure the other options </w:t>
       </w:r>
       <w:r>
         <w:rPr>
@@ -1168,15 +1190,13 @@
         </w:rPr>
         <w:t xml:space="preserve"> </w:t>
       </w:r>
-      <w:proofErr w:type="gramStart"/>
       <w:r>
         <w:rPr>
           <w:b/>
           <w:bCs/>
         </w:rPr>
-        <w:t>For</w:t>
-      </w:r>
-      <w:proofErr w:type="gramEnd"/>
+        <w:t>for</w:t>
+      </w:r>
       <w:r>
         <w:rPr>
           <w:b/>
@@ -1304,24 +1324,43 @@
           <w:b/>
           <w:bCs/>
         </w:rPr>
-        <w:t>Please note, timestamped saves (i.e. those within the "Apollo Mission Scenarios" folder) do not have the latest systems updates. Because of this, they may have alarms and other quirks when loading them. We encourage starting with a fresh launch.</w:t>
-      </w:r>
-    </w:p>
-    <w:p>
-      <w:pPr>
+        <w:t xml:space="preserve">Please note, timestamped saves (i.e. those within the "Apollo Mission Scenarios" folder) </w:t>
+      </w:r>
+      <w:r>
         <w:rPr>
           <w:b/>
           <w:bCs/>
         </w:rPr>
-      </w:pPr>
-    </w:p>
-    <w:p>
-      <w:pPr>
+        <w:t>may not</w:t>
+      </w:r>
+      <w:r>
         <w:rPr>
           <w:b/>
           <w:bCs/>
         </w:rPr>
-      </w:pPr>
+        <w:t xml:space="preserve"> have the latest systems updates. Because of this, they may have alarms and other quirks when loading them. </w:t>
+      </w:r>
+      <w:r>
+        <w:rPr>
+          <w:b/>
+          <w:bCs/>
+        </w:rPr>
+        <w:t>While we work to keep them updated, we still always</w:t>
+      </w:r>
+      <w:r>
+        <w:rPr>
+          <w:b/>
+          <w:bCs/>
+        </w:rPr>
+        <w:t xml:space="preserve"> encourage starting with a fresh launch</w:t>
+      </w:r>
+      <w:r>
+        <w:rPr>
+          <w:b/>
+          <w:bCs/>
+        </w:rPr>
+        <w:t>!</w:t>
+      </w:r>
     </w:p>
     <w:p>
       <w:pPr>
@@ -1385,6 +1424,7 @@
       </w:pPr>
       <w:bookmarkStart w:id="1" w:name="_Toc199486488"/>
       <w:r>
+        <w:lastRenderedPageBreak/>
         <w:t xml:space="preserve">Installation (NASSP </w:t>
       </w:r>
       <w:r>
@@ -1557,246 +1597,25 @@
         <w:t>To switch between the 2D cockpit and the more modern 3D cockpit, press the F8 key.</w:t>
       </w:r>
       <w:r>
-        <w:t> You will need to do this occasionally, because the CSM and LM optics views are only functional in the 2D view. We do hope to add optics support to the 3D cockpit, but adding this functionality is complicated and we don't currently have the knowledge to do so. Also, be sure to use the lighting knobs inside each vehicle's cockpit to adjust the lights to your liking.</w:t>
-      </w:r>
-      <w:r>
-        <w:br/>
-      </w:r>
-    </w:p>
-    <w:p>
-      <w:pPr>
-        <w:ind w:left="360"/>
-      </w:pPr>
-      <w:r>
-        <w:rPr>
-          <w:b/>
-          <w:bCs/>
-        </w:rPr>
-        <w:t>How do I move around the cockpit? </w:t>
-      </w:r>
-      <w:r>
-        <w:rPr>
-          <w:b/>
-          <w:bCs/>
-        </w:rPr>
-        <w:br/>
-      </w:r>
-      <w:r>
-        <w:t xml:space="preserve">The 2D and 3D cockpit views are divided up into multiple viewpoints, usually centered on a specific panel or group of panels. Think of these a bit like choosing which "seat" you're positioned at in the spacecraft. In each view, you can use the arrow keys to move the camera up, down, left, and right. You can switch between </w:t>
-      </w:r>
-      <w:r>
-        <w:lastRenderedPageBreak/>
-        <w:t>these seats by holding the Control/Ctrl key and pressing an arrow key. It may take some time to get used to where each of the viewpoints are located within the cockpit. In the 3D cockpit specifically, from any "seat" you can hold Ctrl and Alt and press an arrow key to adjust the camera to one of several preset angles, to help get a better view of certain switches or components in that area. For example, from the left seat of the CM, you can press Ctrl + Alt + Right Arrow to zoom the camera in on the DSKY, or Ctrl + Alt + Left Arrow to look to your left, at the side panels near your armrest. Every "seat" has its own set of preset views, many of which are very helpful in finding switches that are out of sight or not as easily viewable.</w:t>
-      </w:r>
-      <w:r>
-        <w:br/>
-      </w:r>
-    </w:p>
-    <w:p>
-      <w:pPr>
-        <w:ind w:left="360"/>
-      </w:pPr>
-      <w:r>
-        <w:rPr>
-          <w:b/>
-          <w:bCs/>
-        </w:rPr>
-        <w:t>How do I interact with switches? </w:t>
-      </w:r>
-      <w:r>
-        <w:rPr>
-          <w:b/>
-          <w:bCs/>
-        </w:rPr>
-        <w:br/>
-      </w:r>
-      <w:r>
-        <w:t xml:space="preserve">Most switches can be controlled by </w:t>
-      </w:r>
-      <w:r>
-        <w:t>left clicking</w:t>
-      </w:r>
-      <w:r>
-        <w:t>. Click slightly above the switch to push it up, and slightly below to push it down. Some switches may have three positions, so to move the switch from its "up" position to the "down" position, you'll need to click twice. If a switch has a guard or cover, right-click the switch to open or close its cover.</w:t>
-      </w:r>
-      <w:r>
-        <w:br/>
-      </w:r>
-    </w:p>
-    <w:p>
-      <w:pPr>
-        <w:ind w:left="360"/>
-      </w:pPr>
-      <w:r>
-        <w:rPr>
-          <w:b/>
-          <w:bCs/>
-        </w:rPr>
-        <w:t>How do I interact with circuit breakers and computer keys? </w:t>
-      </w:r>
-      <w:r>
-        <w:rPr>
-          <w:b/>
-          <w:bCs/>
-        </w:rPr>
-        <w:br/>
-      </w:r>
-      <w:r>
-        <w:t xml:space="preserve">These are </w:t>
-      </w:r>
-      <w:proofErr w:type="gramStart"/>
-      <w:r>
-        <w:t>pretty easy</w:t>
-      </w:r>
-      <w:proofErr w:type="gramEnd"/>
-      <w:r>
-        <w:t xml:space="preserve">. You can </w:t>
-      </w:r>
-      <w:r>
-        <w:t>click on the left</w:t>
-      </w:r>
-      <w:r>
-        <w:t xml:space="preserve"> circuit breakers to close or open them. For computer keys like the DSKY or DEDA, just click on each button to press it. If you find that the computer isn't always responding to your key presses, you may be letting go of the button too quickly. Each computer key needs to be held for a small fraction of a second, and sometimes a fast click doesn't hold the button down for quite long enough. You don't need to hold them for a long time, only for </w:t>
-      </w:r>
-      <w:proofErr w:type="gramStart"/>
-      <w:r>
-        <w:t>a brief moment</w:t>
-      </w:r>
-      <w:proofErr w:type="gramEnd"/>
-      <w:r>
-        <w:t xml:space="preserve"> to ensure they register.</w:t>
-      </w:r>
-      <w:r>
-        <w:br/>
-      </w:r>
-    </w:p>
-    <w:p>
-      <w:pPr>
-        <w:ind w:left="360"/>
-        <w:rPr>
-          <w:b/>
-          <w:bCs/>
-        </w:rPr>
-      </w:pPr>
-      <w:r>
-        <w:rPr>
-          <w:b/>
-          <w:bCs/>
-        </w:rPr>
-        <w:t>How do I interact with rheostats/knobs? </w:t>
-      </w:r>
-    </w:p>
-    <w:p>
-      <w:pPr>
-        <w:ind w:left="360"/>
-      </w:pPr>
-      <w:r>
-        <w:t xml:space="preserve">A "rheostat" is one of the gray knob-like controls. Some of </w:t>
-      </w:r>
-      <w:proofErr w:type="gramStart"/>
-      <w:r>
-        <w:t>these work</w:t>
-      </w:r>
-      <w:proofErr w:type="gramEnd"/>
-      <w:r>
-        <w:t xml:space="preserve"> differently than others. Certain rheostats for controlling the cockpit lighting or the S-Band antenna angles are continuous, meaning they can be rotated freely to any position. To adjust these, click and hold on the knob, and then drag left or right to adjust its position. For other rheostats with discrete positions, left-click to rotate the knob to the left, and right-click to rotate it to the right.</w:t>
-      </w:r>
-      <w:r>
-        <w:br/>
-      </w:r>
-    </w:p>
-    <w:p>
-      <w:pPr>
-        <w:ind w:left="360"/>
-        <w:rPr>
-          <w:b/>
-          <w:bCs/>
-        </w:rPr>
-      </w:pPr>
-      <w:r>
-        <w:rPr>
-          <w:b/>
-          <w:bCs/>
-        </w:rPr>
-        <w:t>How do I interact with thumbwheels? </w:t>
-      </w:r>
-    </w:p>
-    <w:p>
-      <w:pPr>
-        <w:ind w:left="360"/>
-      </w:pPr>
-      <w:r>
-        <w:t xml:space="preserve">Thumbwheels are the vertical numbered controls, found on the gimbal trim control panel and the attitude set control panel. Left-click the upper or lower part of each thumbwheel to increase/decrease its value by 1, or right-click them to increase/decrease by 0.1. The dV/Range Set switch on the EMS works similarly: hold the switch on the top or bottom to increase or decrease the </w:t>
-      </w:r>
-      <w:r>
-        <w:t>value and</w:t>
-      </w:r>
-      <w:r>
-        <w:t xml:space="preserve"> left-click or right-click to do so fast/slowly.</w:t>
-      </w:r>
-    </w:p>
-    <w:p>
-      <w:pPr>
-        <w:ind w:left="360"/>
-      </w:pPr>
-      <w:r>
-        <w:lastRenderedPageBreak/>
-        <w:t>While the 2D cockpit has MFDs built right into its main panel, the 3D cockpit does not. To open an MFD in the 3D cockpit, move your mouse near the top of the Orbiter window. A menu bar should drop down. Click on "Function" and then choose "External MFD". If this option does not appear, make sure the "ExtMFD" module is enabled in the Orbiter settings.</w:t>
-      </w:r>
-    </w:p>
-    <w:p>
-      <w:pPr>
-        <w:ind w:left="360"/>
-      </w:pPr>
-      <w:r>
-        <w:t>When looking at the Checklist MFD, you'll notice the text has multiple colors. Green checklist entries will automatically proceed once the relevant switch, circuit breaker, button, etc. is in the correct position. Yellow entries need to be manually verified/completed, and then proceeded past with the "PRO" button on the MFD. Blue entries indicate a jump to another checklist within the current one. Sometimes these happen automatically, or you may need to click "PRO" or "FAIL" to decide whether you want to activate the new checklist or skip it. To enable or disable the auto-proceed function of the checklist, click the "AUTO" button on the MFD.</w:t>
-      </w:r>
-    </w:p>
-    <w:p>
-      <w:pPr>
-        <w:ind w:left="360"/>
-      </w:pPr>
-      <w:r>
-        <w:t>If you need to navigate to another part of the current checklist being displayed, you can use the UP/DN or PG UP/PG DN buttons to temporarily move the cursor to a different entry in the checklist. Then, click "GOTO" to confirm you want to move to this new location, or "BACK" to return to the previous location.</w:t>
-      </w:r>
-    </w:p>
-    <w:p>
-      <w:pPr>
-        <w:ind w:left="360"/>
-      </w:pPr>
-      <w:r>
-        <w:t>For optics sightings, you'll need to enable the AGC star markers. To do this, move your mouse near the top of the Orbiter window. A menu bar should drop down. Choose "Options", then choose "Visual helpers &gt; Planetarium". Make sure to enable "Planetarium mode (F9)" and then enable "Celestial markers</w:t>
-      </w:r>
-      <w:r>
-        <w:t>” and</w:t>
-      </w:r>
-      <w:r>
-        <w:t xml:space="preserve"> ensure "Apollo AGC navigation stars" is selected. Now, you should be able to see green markers indicating the positions, ID numbers, and names of the stars that the AGC knows about. Once you've enabled the markers in the settings window, you can quickly toggle them on or off with the F9 key.</w:t>
-      </w:r>
-      <w:r>
-        <w:br/>
-      </w:r>
-    </w:p>
-    <w:p>
-      <w:pPr>
-        <w:ind w:left="360"/>
-      </w:pPr>
-      <w:r>
-        <w:rPr>
-          <w:b/>
-          <w:bCs/>
-        </w:rPr>
-        <w:t>Take screenshots of your PADs, always! </w:t>
-      </w:r>
-      <w:r>
-        <w:rPr>
-          <w:b/>
-          <w:bCs/>
-        </w:rPr>
-        <w:br/>
-      </w:r>
-      <w:r>
-        <w:t>On missions with automated MCC support, you'll periodically receive Pre-Advisory Data (PAD) on the left side of the screen. Whenever you receive one of these, it's a good idea to take a screenshot of this data and save it somewhere. Each new PAD will replace the previous one, and certain parts of a mission might send you several over the course of a few minutes, so you will often need to keep track of them longer than the automated system keeps them there. Additionally, if you ever encounter problems with a burn or a trajectory calculation, sending us your PAD for that maneuver can be useful for debugging and troubleshooting.</w:t>
+        <w:t> You will need to do this occasionally, because the CSM and LM optics views are only functional in the 2D view. We do hope to add optics support to the 3D cockpit, but adding this functionality is complicated and we</w:t>
+      </w:r>
+      <w:r>
+        <w:t xml:space="preserve"> c</w:t>
+      </w:r>
+      <w:r>
+        <w:t xml:space="preserve">urrently </w:t>
+      </w:r>
+      <w:r>
+        <w:t>lack</w:t>
+      </w:r>
+      <w:r>
+        <w:t xml:space="preserve"> the </w:t>
+      </w:r>
+      <w:r>
+        <w:t>ability</w:t>
+      </w:r>
+      <w:r>
+        <w:t xml:space="preserve"> to do so. Also, be sure to use the lighting knobs inside each vehicle's cockpit to adjust the lights to your liking.</w:t>
       </w:r>
       <w:r>
         <w:br/>
@@ -1827,30 +1646,17 @@
           <w:bCs/>
         </w:rPr>
         <w:lastRenderedPageBreak/>
-        <w:t xml:space="preserve">Save </w:t>
+        <w:t>How do I move around the cockpit? </w:t>
       </w:r>
       <w:r>
         <w:rPr>
           <w:b/>
           <w:bCs/>
         </w:rPr>
-        <w:t>frequently and</w:t>
-      </w:r>
-      <w:r>
-        <w:rPr>
-          <w:b/>
-          <w:bCs/>
-        </w:rPr>
-        <w:t xml:space="preserve"> keep your save files organized!</w:t>
-      </w:r>
-      <w:r>
-        <w:t> </w:t>
-      </w:r>
-      <w:r>
         <w:br/>
       </w:r>
       <w:r>
-        <w:t>While we work hard to make sure the sim is stable and the instructions are clear, glitches and human errors can cause problems. Saving often and organizing those save files will help ensure that any issues don't result in losing hours of progress. I find it's helpful to periodically rename my latest save file to the mission time when I saved, plus a short remark about what I was doing.</w:t>
+        <w:t>The 2D and 3D cockpit views are divided up into multiple viewpoints, usually centered on a specific panel or group of panels. Think of these a bit like choosing which "seat" you're positioned at in the spacecraft. In each view, you can use the arrow keys to move the camera up, down, left, and right. You can switch between these seats by holding the Control/Ctrl key and pressing an arrow key. It may take some time to get used to where each of the viewpoints are located within the cockpit. In the 3D cockpit specifically, from any "seat" you can hold Ctrl and Alt and press an arrow key to adjust the camera to one of several preset angles, to help get a better view of certain switches or components in that area. For example, from the left seat of the CM, you can press Ctrl + Alt + Right Arrow to zoom the camera in on the DSKY, or Ctrl + Alt + Left Arrow to look to your left, at the side panels near your armrest. Every "seat" has its own set of preset views, many of which are very helpful in finding switches that are out of sight or not as easily viewable.</w:t>
       </w:r>
       <w:r>
         <w:br/>
@@ -1865,48 +1671,23 @@
           <w:b/>
           <w:bCs/>
         </w:rPr>
-        <w:t xml:space="preserve">Be careful with </w:t>
+        <w:t>How do I interact with switches? </w:t>
       </w:r>
       <w:r>
         <w:rPr>
           <w:b/>
           <w:bCs/>
         </w:rPr>
-        <w:t>time warp</w:t>
-      </w:r>
-      <w:r>
-        <w:rPr>
-          <w:b/>
-          <w:bCs/>
-        </w:rPr>
-        <w:t>!</w:t>
-      </w:r>
-      <w:r>
-        <w:t> </w:t>
-      </w:r>
-      <w:r>
         <w:br/>
       </w:r>
       <w:r>
-        <w:t xml:space="preserve">NASSP does a lot of complex calculations in the background, and </w:t>
-      </w:r>
-      <w:r>
-        <w:t>time warping</w:t>
-      </w:r>
-      <w:r>
-        <w:t xml:space="preserve"> too fast can cause these calculations to fail, which can cause your current simulation session to temporarily glitch or completely break. As a rule of thumb, if you notice that the simulator's framerate is dropping significantly when you use </w:t>
-      </w:r>
-      <w:r>
-        <w:t>time warp</w:t>
-      </w:r>
-      <w:r>
-        <w:t xml:space="preserve">, it probably means you are going too fast. We developers have moderately powerful computers, but they're far from high-end, mega-expensive machines. We can usually manage somewhere between 50x and 100x </w:t>
-      </w:r>
-      <w:r>
-        <w:t>time warp</w:t>
-      </w:r>
-      <w:r>
-        <w:t xml:space="preserve"> at the absolute maximum.</w:t>
+        <w:t xml:space="preserve">Most switches can be controlled by </w:t>
+      </w:r>
+      <w:r>
+        <w:t>left clicking</w:t>
+      </w:r>
+      <w:r>
+        <w:t>. Click slightly above the switch to push it up, and slightly below to push it down. Some switches may have three positions, so to move the switch from its "up" position to the "down" position, you'll need to click twice. If a switch has a guard or cover, right-click the switch to open or close its cover.</w:t>
       </w:r>
       <w:r>
         <w:br/>
@@ -1921,87 +1702,50 @@
           <w:b/>
           <w:bCs/>
         </w:rPr>
-        <w:t xml:space="preserve">Be careful with </w:t>
+        <w:t>How do I interact with circuit breakers and computer keys? </w:t>
       </w:r>
       <w:r>
         <w:rPr>
           <w:b/>
           <w:bCs/>
         </w:rPr>
-        <w:t>time warp</w:t>
-      </w:r>
-      <w:r>
+        <w:br/>
+      </w:r>
+      <w:r>
+        <w:t xml:space="preserve">You can </w:t>
+      </w:r>
+      <w:r>
+        <w:t>click on the left</w:t>
+      </w:r>
+      <w:r>
+        <w:t xml:space="preserve"> circuit breakers to close or open them. For computer keys like the DSKY or DEDA, just click on each button to press it. If you find that the computer isn't always responding to your key presses, you may be letting go of the button too quickly. Each computer key needs to be held for a small fraction of a second, and sometimes a fast click doesn't hold the button down for quite long enough. You don't need to hold them for a long time, only for </w:t>
+      </w:r>
+      <w:proofErr w:type="gramStart"/>
+      <w:r>
+        <w:t>a brief moment</w:t>
+      </w:r>
+      <w:proofErr w:type="gramEnd"/>
+      <w:r>
+        <w:t xml:space="preserve"> to ensure they register.</w:t>
+      </w:r>
+      <w:r>
+        <w:br/>
+      </w:r>
+    </w:p>
+    <w:p>
+      <w:pPr>
+        <w:ind w:left="360"/>
         <w:rPr>
           <w:b/>
           <w:bCs/>
         </w:rPr>
-        <w:t>, part 2!</w:t>
-      </w:r>
-      <w:r>
-        <w:t> </w:t>
-      </w:r>
-      <w:r>
-        <w:br/>
-      </w:r>
-      <w:r>
-        <w:t xml:space="preserve">If any vessel is actively maneuvering or holding attitude (attempting to rotate or remain stationary with RCS turned on), be aware that high </w:t>
-      </w:r>
-      <w:r>
-        <w:t>time warp</w:t>
-      </w:r>
-      <w:r>
-        <w:t xml:space="preserve"> levels can cause them to waste fuel or even spin out of control. This is a limitation of how we simulate the physics of RCS, and it may happen even if your computer is able to deal with fast </w:t>
-      </w:r>
-      <w:r>
-        <w:t>time warp</w:t>
-      </w:r>
-      <w:r>
-        <w:t xml:space="preserve"> normally. It will even affect vessels that you're not currently </w:t>
-      </w:r>
-      <w:proofErr w:type="gramStart"/>
-      <w:r>
-        <w:t>controlling:</w:t>
-      </w:r>
-      <w:proofErr w:type="gramEnd"/>
-      <w:r>
-        <w:t xml:space="preserve"> </w:t>
-      </w:r>
-      <w:r>
-        <w:t>time warping</w:t>
-      </w:r>
-      <w:r>
-        <w:t xml:space="preserve"> in the CSM while the LM is trying to hold </w:t>
-      </w:r>
-      <w:proofErr w:type="gramStart"/>
-      <w:r>
-        <w:t>attitude</w:t>
-      </w:r>
-      <w:proofErr w:type="gramEnd"/>
-      <w:r>
-        <w:t xml:space="preserve"> will cause problems for the LM. Usually going up to about 5x or 10x is safe. If you want </w:t>
-      </w:r>
-      <w:proofErr w:type="gramStart"/>
-      <w:r>
-        <w:t xml:space="preserve">to </w:t>
-      </w:r>
-      <w:r>
-        <w:t>time</w:t>
-      </w:r>
-      <w:proofErr w:type="gramEnd"/>
-      <w:r>
-        <w:t xml:space="preserve"> warp</w:t>
-      </w:r>
-      <w:r>
-        <w:t xml:space="preserve"> faster, be sure to disable any kind of attitude-hold mode in the CSM and LM before </w:t>
-      </w:r>
-      <w:r>
-        <w:t>continuing but</w:t>
-      </w:r>
-      <w:r>
-        <w:t xml:space="preserve"> watch out to make sure you don't slowly drift into gimbal lock!</w:t>
-      </w:r>
-      <w:r>
-        <w:br/>
+      </w:pPr>
+      <w:r>
+        <w:rPr>
+          <w:b/>
+          <w:bCs/>
+        </w:rPr>
+        <w:t>How do I interact with rheostats/knobs? </w:t>
       </w:r>
     </w:p>
     <w:p>
@@ -2009,27 +1753,7 @@
         <w:ind w:left="360"/>
       </w:pPr>
       <w:r>
-        <w:rPr>
-          <w:b/>
-          <w:bCs/>
-        </w:rPr>
-        <w:t>Remember the CSM O2 Hose. </w:t>
-      </w:r>
-      <w:r>
-        <w:rPr>
-          <w:b/>
-          <w:bCs/>
-        </w:rPr>
-        <w:br/>
-      </w:r>
-      <w:r>
-        <w:t xml:space="preserve">When you're performing LM activation, be sure to use the Project Apollo MFD's "ECS" section to connect the O2 hose from the CSM. This creates a flow of fresh oxygen into the LM so that the cabin doesn't fill up with deadly CO2 and poison your crew before the LM ECS is activated. Having this O2 hose connected also prevents you from closing the CSM forward hatch, so if you can't get it </w:t>
-      </w:r>
-      <w:r>
-        <w:t>too</w:t>
-      </w:r>
-      <w:r>
-        <w:t xml:space="preserve"> close, make sure you've disconnected the hose.</w:t>
+        <w:t>A "rheostat" is one of the gray knob-like controls. Some of these work differently than others. Certain rheostats for controlling the cockpit lighting or the S-Band antenna angles are continuous, meaning they can be rotated freely to any position. To adjust these, click and hold on the knob, and then drag left or right to adjust its position. For other rheostats with discrete positions, left-click to rotate the knob to the left, and right-click to rotate it to the right.</w:t>
       </w:r>
       <w:r>
         <w:br/>
@@ -2048,40 +1772,108 @@
     <w:p>
       <w:pPr>
         <w:ind w:left="360"/>
+        <w:rPr>
+          <w:b/>
+          <w:bCs/>
+        </w:rPr>
+      </w:pPr>
+      <w:r>
+        <w:rPr>
+          <w:b/>
+          <w:bCs/>
+        </w:rPr>
+        <w:lastRenderedPageBreak/>
+        <w:t>How do I interact with thumbwheels? </w:t>
+      </w:r>
+    </w:p>
+    <w:p>
+      <w:pPr>
+        <w:ind w:left="360"/>
+      </w:pPr>
+      <w:r>
+        <w:t xml:space="preserve">Thumbwheels are the vertical numbered controls, found on the gimbal trim control panel and the attitude set control panel. Left-click the upper or lower part of each thumbwheel to increase/decrease its value by 1, or right-click them to increase/decrease by 0.1. The dV/Range Set switch on the EMS works similarly: hold the switch on the top or bottom to increase or decrease the </w:t>
+      </w:r>
+      <w:r>
+        <w:t>value and</w:t>
+      </w:r>
+      <w:r>
+        <w:t xml:space="preserve"> left-click or right-click to do so fast/slowly.</w:t>
+      </w:r>
+    </w:p>
+    <w:p>
+      <w:pPr>
+        <w:ind w:left="360"/>
       </w:pPr>
     </w:p>
     <w:p>
       <w:pPr>
         <w:ind w:left="360"/>
-      </w:pPr>
-      <w:r>
         <w:rPr>
           <w:b/>
           <w:bCs/>
         </w:rPr>
-        <w:lastRenderedPageBreak/>
-        <w:t>Pay attention to whether your LM crew should be in the cabin or their suits.</w:t>
-      </w:r>
-      <w:r>
-        <w:t> </w:t>
+      </w:pPr>
+      <w:r>
+        <w:rPr>
+          <w:b/>
+          <w:bCs/>
+        </w:rPr>
+        <w:t xml:space="preserve">How do I </w:t>
+      </w:r>
+      <w:r>
+        <w:rPr>
+          <w:b/>
+          <w:bCs/>
+        </w:rPr>
+        <w:t>use the available MFDs</w:t>
+      </w:r>
+      <w:r>
+        <w:rPr>
+          <w:b/>
+          <w:bCs/>
+        </w:rPr>
+        <w:t>? </w:t>
+      </w:r>
+    </w:p>
+    <w:p>
+      <w:pPr>
+        <w:ind w:left="360"/>
+      </w:pPr>
+      <w:r>
+        <w:t>While the 2D cockpit has MFDs built right into its main panel, the 3D cockpit does not. To open an MFD in the 3D cockpit, move your mouse near the top of the Orbiter window. A menu bar should drop down. Click on "Function" and then choose "External MFD". If this option does not appear, make sure the "ExtMFD" module is enabled in the Orbiter settings.</w:t>
+      </w:r>
+    </w:p>
+    <w:p>
+      <w:pPr>
+        <w:ind w:left="360"/>
+      </w:pPr>
+      <w:r>
+        <w:t>When looking at the Checklist MFD, you'll notice the text has multiple colors. Green checklist entries will automatically proceed once the relevant switch, circuit breaker, button, etc. is in the correct position. Yellow entries need to be manually verified/completed, and then proceeded past with the "PRO" button on the MFD. Blue entries indicate a jump to another checklist within the current one. Sometimes these happen automatically, or you may need to click "PRO" or "FAIL" to decide whether you want to activate the new checklist or skip it. To enable or disable the auto-proceed function of the checklist, click the "AUTO" button on the MFD.</w:t>
+      </w:r>
+    </w:p>
+    <w:p>
+      <w:pPr>
+        <w:ind w:left="360"/>
+      </w:pPr>
+      <w:r>
+        <w:t>If you need to navigate to another part of the current checklist being displayed, you can use the UP/DN or PG UP/PG DN buttons to temporarily move the cursor to a different entry in the checklist. Then, click "GOTO" to confirm you want to move to this new location, or "BACK" to return to the previous location.</w:t>
+      </w:r>
+    </w:p>
+    <w:p>
+      <w:pPr>
+        <w:ind w:left="360"/>
+      </w:pPr>
+      <w:r>
+        <w:t>For optics sightings, you'll need to enable the AGC star markers. To do this, move your mouse near the top of the Orbiter window. A menu bar should drop down. Choose "Options", then choose "Visual helpers &gt; Planetarium". Make sure to enable "Planetarium mode (F9)" and then enable "Celestial markers</w:t>
+      </w:r>
+      <w:r>
+        <w:t>” and</w:t>
+      </w:r>
+      <w:r>
+        <w:t xml:space="preserve"> ensure "Apollo AGC navigation stars" is selected. Now, you should be able to see green markers indicating the positions, ID numbers, and names of the stars that the AGC knows about. Once you've enabled the markers in the settings window, you can quickly toggle them on or off with the F9 key.</w:t>
       </w:r>
       <w:r>
         <w:br/>
-      </w:r>
-      <w:r>
-        <w:t xml:space="preserve">Some of the most common causes of sim crew death are accidents involving your LM ECS configuration. In addition to the controls in the spacecraft itself, there's also some important options in the Project Apollo MFD, in the "ECS" section. If you're </w:t>
-      </w:r>
-      <w:r>
-        <w:t>depressurizing</w:t>
-      </w:r>
-      <w:r>
-        <w:t xml:space="preserve"> the cabin, be sure both your crew members are in the suits! If the suit hose knob is set to "suit disconnect" for either crewmember, they should probably be in the cabin! If the suits are hooked up to the ECS but the crew are in the cabin, CO2 might be building up without the gauge on the panel being able to detect it, because the airflow is only going through the suits. The checklists should steer you in the right direction, but it is easy for mistakes to happen, so be vigilant. In the future, we intend to overhaul the Command Module ECS to also simulate the crew being suited or unsuited, so getting </w:t>
-      </w:r>
-      <w:r>
-        <w:t>into</w:t>
-      </w:r>
-      <w:r>
-        <w:t xml:space="preserve"> the habit of paying attention to this is highly recommended.</w:t>
       </w:r>
     </w:p>
     <w:p>
@@ -2097,7 +1889,308 @@
     <w:p>
       <w:pPr>
         <w:ind w:left="360"/>
+        <w:rPr>
+          <w:b/>
+          <w:bCs/>
+        </w:rPr>
       </w:pPr>
+    </w:p>
+    <w:p>
+      <w:pPr>
+        <w:ind w:left="360"/>
+      </w:pPr>
+      <w:r>
+        <w:rPr>
+          <w:b/>
+          <w:bCs/>
+        </w:rPr>
+        <w:lastRenderedPageBreak/>
+        <w:t>Take screenshots of your PADs, always! </w:t>
+      </w:r>
+      <w:r>
+        <w:rPr>
+          <w:b/>
+          <w:bCs/>
+        </w:rPr>
+        <w:br/>
+      </w:r>
+      <w:r>
+        <w:t>On missions with automated MCC support, you'll periodically receive Pre-Advisory Data (PAD) on the left side of the screen. Whenever you receive one of these, it's a good idea to take a screenshot of this data and save it somewhere. Each new PAD will replace the previous one, and certain parts of a mission might send you several over the course of a few minutes, so you will often need to keep track of them longer than the automated system keeps them there. Additionally, if you ever encounter problems with a burn or a trajectory calculation, sending us your PAD for that maneuver can be useful for debugging and troubleshooting</w:t>
+      </w:r>
+      <w:r>
+        <w:t>.</w:t>
+      </w:r>
+    </w:p>
+    <w:p>
+      <w:pPr>
+        <w:ind w:left="360"/>
+      </w:pPr>
+    </w:p>
+    <w:p>
+      <w:pPr>
+        <w:ind w:left="360"/>
+      </w:pPr>
+      <w:r>
+        <w:rPr>
+          <w:b/>
+          <w:bCs/>
+        </w:rPr>
+        <w:t xml:space="preserve">Save </w:t>
+      </w:r>
+      <w:r>
+        <w:rPr>
+          <w:b/>
+          <w:bCs/>
+        </w:rPr>
+        <w:t>frequently and</w:t>
+      </w:r>
+      <w:r>
+        <w:rPr>
+          <w:b/>
+          <w:bCs/>
+        </w:rPr>
+        <w:t xml:space="preserve"> keep </w:t>
+      </w:r>
+      <w:proofErr w:type="gramStart"/>
+      <w:r>
+        <w:rPr>
+          <w:b/>
+          <w:bCs/>
+        </w:rPr>
+        <w:t>your save</w:t>
+      </w:r>
+      <w:proofErr w:type="gramEnd"/>
+      <w:r>
+        <w:rPr>
+          <w:b/>
+          <w:bCs/>
+        </w:rPr>
+        <w:t xml:space="preserve"> files organized!</w:t>
+      </w:r>
+      <w:r>
+        <w:t> </w:t>
+      </w:r>
+      <w:r>
+        <w:br/>
+      </w:r>
+      <w:r>
+        <w:t>While we work hard to make sure the sim is stable and the instructions are clear, glitches and human errors can cause problems. Saving often and organizing those save files will help ensure that any issues don't result in losing hours of progress. I find it's helpful to periodically rename my latest save file to the mission time when I saved, plus a short remark about what I was doing.</w:t>
+      </w:r>
+      <w:r>
+        <w:br/>
+      </w:r>
+    </w:p>
+    <w:p>
+      <w:pPr>
+        <w:ind w:left="360"/>
+      </w:pPr>
+      <w:r>
+        <w:rPr>
+          <w:b/>
+          <w:bCs/>
+        </w:rPr>
+        <w:t xml:space="preserve">Be careful with </w:t>
+      </w:r>
+      <w:r>
+        <w:rPr>
+          <w:b/>
+          <w:bCs/>
+        </w:rPr>
+        <w:t>time-warp</w:t>
+      </w:r>
+      <w:r>
+        <w:rPr>
+          <w:b/>
+          <w:bCs/>
+        </w:rPr>
+        <w:t>!</w:t>
+      </w:r>
+      <w:r>
+        <w:t> </w:t>
+      </w:r>
+      <w:r>
+        <w:br/>
+      </w:r>
+      <w:r>
+        <w:t xml:space="preserve">NASSP does a lot of complex calculations in the background, and </w:t>
+      </w:r>
+      <w:r>
+        <w:t>time-warp</w:t>
+      </w:r>
+      <w:r>
+        <w:t>ing</w:t>
+      </w:r>
+      <w:r>
+        <w:t xml:space="preserve"> too fast can cause these calculations to fail, which can cause your current simulation session to temporarily glitch or completely break. As a rule of thumb, if you notice that the simulator's framerate is dropping significantly when you use </w:t>
+      </w:r>
+      <w:r>
+        <w:t>time-warp</w:t>
+      </w:r>
+      <w:r>
+        <w:t xml:space="preserve">, it probably means you are going too fast. We developers have moderately powerful computers, but they're far from high-end, mega-expensive machines. We can usually manage somewhere between 50x and 100x </w:t>
+      </w:r>
+      <w:r>
+        <w:t>time-warp</w:t>
+      </w:r>
+      <w:r>
+        <w:t xml:space="preserve"> at the absolute maximum</w:t>
+      </w:r>
+      <w:r>
+        <w:t>, with 50X being generally a safe upper limit</w:t>
+      </w:r>
+      <w:r>
+        <w:t>.</w:t>
+      </w:r>
+      <w:r>
+        <w:br/>
+      </w:r>
+    </w:p>
+    <w:p>
+      <w:pPr>
+        <w:ind w:left="360"/>
+      </w:pPr>
+      <w:r>
+        <w:rPr>
+          <w:b/>
+          <w:bCs/>
+        </w:rPr>
+        <w:t xml:space="preserve">Be careful with </w:t>
+      </w:r>
+      <w:r>
+        <w:rPr>
+          <w:b/>
+          <w:bCs/>
+        </w:rPr>
+        <w:t>time-warp</w:t>
+      </w:r>
+      <w:r>
+        <w:rPr>
+          <w:b/>
+          <w:bCs/>
+        </w:rPr>
+        <w:t>, part 2!</w:t>
+      </w:r>
+      <w:r>
+        <w:t> </w:t>
+      </w:r>
+      <w:r>
+        <w:br/>
+      </w:r>
+      <w:r>
+        <w:t xml:space="preserve">If any vessel is actively maneuvering or holding attitude (attempting to rotate or remain stationary with RCS turned on), be aware that high </w:t>
+      </w:r>
+      <w:r>
+        <w:t>time-warp</w:t>
+      </w:r>
+      <w:r>
+        <w:t xml:space="preserve"> levels can cause them to waste fuel or even spin out of control. This is a limitation of how we simulate the physics of RCS, and it may happen even if your computer is able to deal with fast </w:t>
+      </w:r>
+      <w:r>
+        <w:t>time-warp</w:t>
+      </w:r>
+      <w:r>
+        <w:t xml:space="preserve"> normally. It will even affect vessels that you're not currently controlling</w:t>
+      </w:r>
+      <w:r>
+        <w:t>. For instance,</w:t>
+      </w:r>
+      <w:r>
+        <w:t xml:space="preserve"> </w:t>
+      </w:r>
+      <w:r>
+        <w:t>time-warp</w:t>
+      </w:r>
+      <w:r>
+        <w:t>ing</w:t>
+      </w:r>
+      <w:r>
+        <w:t xml:space="preserve"> in the CSM while the LM is trying to hold attitude will cause problems for the LM. Usually going up to about 5x or 10x is safe. If you want to </w:t>
+      </w:r>
+      <w:r>
+        <w:t>time-warp</w:t>
+      </w:r>
+      <w:r>
+        <w:t xml:space="preserve"> faster, be sure to disable any kind of attitude-hold mode in the CSM and LM before </w:t>
+      </w:r>
+      <w:r>
+        <w:t>continuing but</w:t>
+      </w:r>
+      <w:r>
+        <w:t xml:space="preserve"> watch out to make sure you don't slowly drift into gimbal lock!</w:t>
+      </w:r>
+      <w:r>
+        <w:br/>
+      </w:r>
+    </w:p>
+    <w:p>
+      <w:pPr>
+        <w:ind w:left="360"/>
+      </w:pPr>
+    </w:p>
+    <w:p>
+      <w:pPr>
+        <w:ind w:left="360"/>
+      </w:pPr>
+      <w:r>
+        <w:rPr>
+          <w:b/>
+          <w:bCs/>
+        </w:rPr>
+        <w:lastRenderedPageBreak/>
+        <w:t>Remember the CSM O2 Hose. </w:t>
+      </w:r>
+      <w:r>
+        <w:rPr>
+          <w:b/>
+          <w:bCs/>
+        </w:rPr>
+        <w:br/>
+      </w:r>
+      <w:r>
+        <w:t xml:space="preserve">When you're performing LM activation, be sure to use the Project Apollo MFD's "ECS" section to connect the O2 hose from the CSM. This creates a flow of fresh oxygen into the LM so that the cabin doesn't fill up with deadly CO2 and poison your crew before the LM ECS is activated. Having this O2 hose connected also prevents you from closing the CSM forward hatch, so if you can't get it </w:t>
+      </w:r>
+      <w:r>
+        <w:t>too</w:t>
+      </w:r>
+      <w:r>
+        <w:t xml:space="preserve"> close, make sure you've disconnected the hose.</w:t>
+      </w:r>
+      <w:r>
+        <w:br/>
+      </w:r>
+    </w:p>
+    <w:p>
+      <w:pPr>
+        <w:ind w:left="360"/>
+      </w:pPr>
+      <w:r>
+        <w:rPr>
+          <w:b/>
+          <w:bCs/>
+        </w:rPr>
+        <w:t>Pay attention to whether your LM crew should be in the cabin or their suits.</w:t>
+      </w:r>
+      <w:r>
+        <w:t> </w:t>
+      </w:r>
+      <w:r>
+        <w:br/>
+      </w:r>
+      <w:r>
+        <w:t xml:space="preserve">Some of the most common causes of sim crew death are accidents involving your LM ECS configuration. In addition to the controls in the spacecraft itself, there's also some important options in the Project Apollo MFD, in the "ECS" section. If you're </w:t>
+      </w:r>
+      <w:r>
+        <w:t>depressurizing</w:t>
+      </w:r>
+      <w:r>
+        <w:t xml:space="preserve"> the cabin, be sure both your crew members are in the suits! If the suit hose knob is set to "suit disconnect" for either crewmember, they should probably be in the cabin! If the suits are hooked up to the ECS but the crew are in the cabin, CO2 might be building up without the gauge on the panel being able to detect it, because the airflow is only going through the suits. The checklists should steer you in the right direction, but it is easy for mistakes to happen, so be vigilant. In the future, we intend to overhaul the Command Module ECS to also simulate the crew being suited or unsuited, so getting </w:t>
+      </w:r>
+      <w:r>
+        <w:t>into</w:t>
+      </w:r>
+      <w:r>
+        <w:t xml:space="preserve"> the habit of paying attention to this is highly recommended.</w:t>
+      </w:r>
     </w:p>
     <w:p>
       <w:pPr>
@@ -2210,7 +2303,6 @@
               <w:bottom w:val="single" w:sz="4" w:space="0" w:color="auto"/>
               <w:right w:val="single" w:sz="4" w:space="0" w:color="auto"/>
             </w:tcBorders>
-            <w:shd w:val="clear" w:color="auto" w:fill="auto"/>
             <w:noWrap/>
             <w:vAlign w:val="bottom"/>
             <w:hideMark/>
@@ -2255,7 +2347,6 @@
               <w:bottom w:val="single" w:sz="4" w:space="0" w:color="auto"/>
               <w:right w:val="single" w:sz="4" w:space="0" w:color="auto"/>
             </w:tcBorders>
-            <w:shd w:val="clear" w:color="auto" w:fill="auto"/>
             <w:noWrap/>
             <w:vAlign w:val="bottom"/>
             <w:hideMark/>
@@ -2290,7 +2381,6 @@
               <w:bottom w:val="single" w:sz="4" w:space="0" w:color="auto"/>
               <w:right w:val="single" w:sz="4" w:space="0" w:color="auto"/>
             </w:tcBorders>
-            <w:shd w:val="clear" w:color="auto" w:fill="auto"/>
             <w:noWrap/>
             <w:vAlign w:val="bottom"/>
             <w:hideMark/>
@@ -2330,7 +2420,6 @@
               <w:bottom w:val="single" w:sz="4" w:space="0" w:color="auto"/>
               <w:right w:val="single" w:sz="4" w:space="0" w:color="auto"/>
             </w:tcBorders>
-            <w:shd w:val="clear" w:color="auto" w:fill="auto"/>
             <w:noWrap/>
             <w:vAlign w:val="bottom"/>
             <w:hideMark/>
@@ -2365,7 +2454,6 @@
               <w:bottom w:val="single" w:sz="4" w:space="0" w:color="auto"/>
               <w:right w:val="single" w:sz="4" w:space="0" w:color="auto"/>
             </w:tcBorders>
-            <w:shd w:val="clear" w:color="auto" w:fill="auto"/>
             <w:noWrap/>
             <w:vAlign w:val="bottom"/>
             <w:hideMark/>
@@ -2405,7 +2493,6 @@
               <w:bottom w:val="single" w:sz="4" w:space="0" w:color="auto"/>
               <w:right w:val="single" w:sz="4" w:space="0" w:color="auto"/>
             </w:tcBorders>
-            <w:shd w:val="clear" w:color="auto" w:fill="auto"/>
             <w:noWrap/>
             <w:vAlign w:val="bottom"/>
           </w:tcPr>
@@ -2441,7 +2528,6 @@
               <w:bottom w:val="single" w:sz="4" w:space="0" w:color="auto"/>
               <w:right w:val="single" w:sz="4" w:space="0" w:color="auto"/>
             </w:tcBorders>
-            <w:shd w:val="clear" w:color="auto" w:fill="auto"/>
             <w:noWrap/>
             <w:vAlign w:val="bottom"/>
           </w:tcPr>
@@ -2491,7 +2577,6 @@
               <w:bottom w:val="nil"/>
               <w:right w:val="nil"/>
             </w:tcBorders>
-            <w:shd w:val="clear" w:color="auto" w:fill="auto"/>
             <w:noWrap/>
             <w:vAlign w:val="bottom"/>
             <w:hideMark/>
@@ -2517,7 +2602,6 @@
               <w:bottom w:val="nil"/>
               <w:right w:val="nil"/>
             </w:tcBorders>
-            <w:shd w:val="clear" w:color="auto" w:fill="auto"/>
             <w:noWrap/>
             <w:vAlign w:val="bottom"/>
             <w:hideMark/>
@@ -2550,7 +2634,6 @@
               <w:bottom w:val="single" w:sz="4" w:space="0" w:color="auto"/>
               <w:right w:val="single" w:sz="4" w:space="0" w:color="auto"/>
             </w:tcBorders>
-            <w:shd w:val="clear" w:color="auto" w:fill="auto"/>
             <w:noWrap/>
             <w:vAlign w:val="bottom"/>
             <w:hideMark/>
@@ -2595,7 +2678,6 @@
               <w:bottom w:val="single" w:sz="4" w:space="0" w:color="auto"/>
               <w:right w:val="single" w:sz="4" w:space="0" w:color="auto"/>
             </w:tcBorders>
-            <w:shd w:val="clear" w:color="auto" w:fill="auto"/>
             <w:noWrap/>
             <w:vAlign w:val="bottom"/>
             <w:hideMark/>
@@ -2630,7 +2712,6 @@
               <w:bottom w:val="single" w:sz="4" w:space="0" w:color="auto"/>
               <w:right w:val="single" w:sz="4" w:space="0" w:color="auto"/>
             </w:tcBorders>
-            <w:shd w:val="clear" w:color="auto" w:fill="auto"/>
             <w:noWrap/>
             <w:vAlign w:val="bottom"/>
             <w:hideMark/>
@@ -2679,7 +2760,6 @@
               <w:bottom w:val="single" w:sz="4" w:space="0" w:color="auto"/>
               <w:right w:val="single" w:sz="4" w:space="0" w:color="auto"/>
             </w:tcBorders>
-            <w:shd w:val="clear" w:color="auto" w:fill="auto"/>
             <w:noWrap/>
             <w:vAlign w:val="bottom"/>
             <w:hideMark/>
@@ -2714,7 +2794,6 @@
               <w:bottom w:val="single" w:sz="4" w:space="0" w:color="auto"/>
               <w:right w:val="single" w:sz="4" w:space="0" w:color="auto"/>
             </w:tcBorders>
-            <w:shd w:val="clear" w:color="auto" w:fill="auto"/>
             <w:noWrap/>
             <w:vAlign w:val="bottom"/>
             <w:hideMark/>
@@ -2763,7 +2842,6 @@
               <w:bottom w:val="single" w:sz="4" w:space="0" w:color="auto"/>
               <w:right w:val="single" w:sz="4" w:space="0" w:color="auto"/>
             </w:tcBorders>
-            <w:shd w:val="clear" w:color="auto" w:fill="auto"/>
             <w:noWrap/>
             <w:vAlign w:val="bottom"/>
             <w:hideMark/>
@@ -2798,7 +2876,6 @@
               <w:bottom w:val="single" w:sz="4" w:space="0" w:color="auto"/>
               <w:right w:val="single" w:sz="4" w:space="0" w:color="auto"/>
             </w:tcBorders>
-            <w:shd w:val="clear" w:color="auto" w:fill="auto"/>
             <w:noWrap/>
             <w:vAlign w:val="bottom"/>
             <w:hideMark/>
@@ -2847,7 +2924,6 @@
               <w:bottom w:val="single" w:sz="4" w:space="0" w:color="auto"/>
               <w:right w:val="single" w:sz="4" w:space="0" w:color="auto"/>
             </w:tcBorders>
-            <w:shd w:val="clear" w:color="auto" w:fill="auto"/>
             <w:noWrap/>
             <w:vAlign w:val="bottom"/>
           </w:tcPr>
@@ -2881,7 +2957,6 @@
               <w:bottom w:val="single" w:sz="4" w:space="0" w:color="auto"/>
               <w:right w:val="single" w:sz="4" w:space="0" w:color="auto"/>
             </w:tcBorders>
-            <w:shd w:val="clear" w:color="auto" w:fill="auto"/>
             <w:noWrap/>
             <w:vAlign w:val="bottom"/>
           </w:tcPr>
@@ -2920,7 +2995,6 @@
               <w:bottom w:val="nil"/>
               <w:right w:val="nil"/>
             </w:tcBorders>
-            <w:shd w:val="clear" w:color="auto" w:fill="auto"/>
             <w:noWrap/>
             <w:vAlign w:val="bottom"/>
             <w:hideMark/>
@@ -2946,7 +3020,6 @@
               <w:bottom w:val="nil"/>
               <w:right w:val="nil"/>
             </w:tcBorders>
-            <w:shd w:val="clear" w:color="auto" w:fill="auto"/>
             <w:noWrap/>
             <w:vAlign w:val="bottom"/>
             <w:hideMark/>
@@ -2979,7 +3052,6 @@
               <w:bottom w:val="single" w:sz="4" w:space="0" w:color="auto"/>
               <w:right w:val="single" w:sz="4" w:space="0" w:color="auto"/>
             </w:tcBorders>
-            <w:shd w:val="clear" w:color="auto" w:fill="auto"/>
             <w:noWrap/>
             <w:vAlign w:val="bottom"/>
             <w:hideMark/>
@@ -3024,7 +3096,6 @@
               <w:bottom w:val="single" w:sz="4" w:space="0" w:color="auto"/>
               <w:right w:val="single" w:sz="4" w:space="0" w:color="auto"/>
             </w:tcBorders>
-            <w:shd w:val="clear" w:color="auto" w:fill="auto"/>
             <w:noWrap/>
             <w:vAlign w:val="bottom"/>
             <w:hideMark/>
@@ -3059,7 +3130,6 @@
               <w:bottom w:val="single" w:sz="4" w:space="0" w:color="auto"/>
               <w:right w:val="single" w:sz="4" w:space="0" w:color="auto"/>
             </w:tcBorders>
-            <w:shd w:val="clear" w:color="auto" w:fill="auto"/>
             <w:noWrap/>
             <w:vAlign w:val="bottom"/>
             <w:hideMark/>
@@ -3099,7 +3169,6 @@
               <w:bottom w:val="single" w:sz="4" w:space="0" w:color="auto"/>
               <w:right w:val="single" w:sz="4" w:space="0" w:color="auto"/>
             </w:tcBorders>
-            <w:shd w:val="clear" w:color="auto" w:fill="auto"/>
             <w:noWrap/>
             <w:vAlign w:val="bottom"/>
             <w:hideMark/>
@@ -3134,7 +3203,6 @@
               <w:bottom w:val="single" w:sz="4" w:space="0" w:color="auto"/>
               <w:right w:val="single" w:sz="4" w:space="0" w:color="auto"/>
             </w:tcBorders>
-            <w:shd w:val="clear" w:color="auto" w:fill="auto"/>
             <w:noWrap/>
             <w:vAlign w:val="bottom"/>
             <w:hideMark/>
@@ -3174,7 +3242,6 @@
               <w:bottom w:val="single" w:sz="4" w:space="0" w:color="auto"/>
               <w:right w:val="single" w:sz="4" w:space="0" w:color="auto"/>
             </w:tcBorders>
-            <w:shd w:val="clear" w:color="auto" w:fill="auto"/>
             <w:noWrap/>
             <w:vAlign w:val="bottom"/>
             <w:hideMark/>
@@ -3209,7 +3276,6 @@
               <w:bottom w:val="single" w:sz="4" w:space="0" w:color="auto"/>
               <w:right w:val="single" w:sz="4" w:space="0" w:color="auto"/>
             </w:tcBorders>
-            <w:shd w:val="clear" w:color="auto" w:fill="auto"/>
             <w:noWrap/>
             <w:vAlign w:val="bottom"/>
             <w:hideMark/>
@@ -3249,7 +3315,6 @@
               <w:bottom w:val="single" w:sz="4" w:space="0" w:color="auto"/>
               <w:right w:val="single" w:sz="4" w:space="0" w:color="auto"/>
             </w:tcBorders>
-            <w:shd w:val="clear" w:color="auto" w:fill="auto"/>
             <w:noWrap/>
             <w:vAlign w:val="bottom"/>
             <w:hideMark/>
@@ -3284,7 +3349,6 @@
               <w:bottom w:val="single" w:sz="4" w:space="0" w:color="auto"/>
               <w:right w:val="single" w:sz="4" w:space="0" w:color="auto"/>
             </w:tcBorders>
-            <w:shd w:val="clear" w:color="auto" w:fill="auto"/>
             <w:noWrap/>
             <w:vAlign w:val="bottom"/>
             <w:hideMark/>
@@ -3324,7 +3388,6 @@
               <w:bottom w:val="single" w:sz="4" w:space="0" w:color="auto"/>
               <w:right w:val="single" w:sz="4" w:space="0" w:color="auto"/>
             </w:tcBorders>
-            <w:shd w:val="clear" w:color="auto" w:fill="auto"/>
             <w:noWrap/>
             <w:vAlign w:val="bottom"/>
             <w:hideMark/>
@@ -3359,7 +3422,6 @@
               <w:bottom w:val="single" w:sz="4" w:space="0" w:color="auto"/>
               <w:right w:val="single" w:sz="4" w:space="0" w:color="auto"/>
             </w:tcBorders>
-            <w:shd w:val="clear" w:color="auto" w:fill="auto"/>
             <w:noWrap/>
             <w:vAlign w:val="bottom"/>
             <w:hideMark/>
@@ -3399,7 +3461,6 @@
               <w:bottom w:val="single" w:sz="4" w:space="0" w:color="auto"/>
               <w:right w:val="single" w:sz="4" w:space="0" w:color="auto"/>
             </w:tcBorders>
-            <w:shd w:val="clear" w:color="auto" w:fill="auto"/>
             <w:noWrap/>
             <w:vAlign w:val="bottom"/>
             <w:hideMark/>
@@ -3434,7 +3495,6 @@
               <w:bottom w:val="single" w:sz="4" w:space="0" w:color="auto"/>
               <w:right w:val="single" w:sz="4" w:space="0" w:color="auto"/>
             </w:tcBorders>
-            <w:shd w:val="clear" w:color="auto" w:fill="auto"/>
             <w:noWrap/>
             <w:vAlign w:val="bottom"/>
             <w:hideMark/>
@@ -3474,7 +3534,6 @@
               <w:bottom w:val="nil"/>
               <w:right w:val="nil"/>
             </w:tcBorders>
-            <w:shd w:val="clear" w:color="auto" w:fill="auto"/>
             <w:noWrap/>
             <w:vAlign w:val="bottom"/>
             <w:hideMark/>
@@ -3500,7 +3559,6 @@
               <w:bottom w:val="nil"/>
               <w:right w:val="nil"/>
             </w:tcBorders>
-            <w:shd w:val="clear" w:color="auto" w:fill="auto"/>
             <w:noWrap/>
             <w:vAlign w:val="bottom"/>
             <w:hideMark/>
@@ -3533,7 +3591,6 @@
               <w:bottom w:val="single" w:sz="4" w:space="0" w:color="auto"/>
               <w:right w:val="single" w:sz="4" w:space="0" w:color="auto"/>
             </w:tcBorders>
-            <w:shd w:val="clear" w:color="auto" w:fill="auto"/>
             <w:noWrap/>
             <w:vAlign w:val="bottom"/>
             <w:hideMark/>
@@ -3578,7 +3635,6 @@
               <w:bottom w:val="single" w:sz="4" w:space="0" w:color="auto"/>
               <w:right w:val="single" w:sz="4" w:space="0" w:color="auto"/>
             </w:tcBorders>
-            <w:shd w:val="clear" w:color="auto" w:fill="auto"/>
             <w:noWrap/>
             <w:vAlign w:val="bottom"/>
             <w:hideMark/>
@@ -3624,7 +3680,6 @@
               <w:bottom w:val="single" w:sz="4" w:space="0" w:color="auto"/>
               <w:right w:val="single" w:sz="4" w:space="0" w:color="auto"/>
             </w:tcBorders>
-            <w:shd w:val="clear" w:color="auto" w:fill="auto"/>
             <w:noWrap/>
             <w:vAlign w:val="bottom"/>
             <w:hideMark/>
@@ -3664,7 +3719,6 @@
               <w:bottom w:val="single" w:sz="4" w:space="0" w:color="auto"/>
               <w:right w:val="single" w:sz="4" w:space="0" w:color="auto"/>
             </w:tcBorders>
-            <w:shd w:val="clear" w:color="auto" w:fill="auto"/>
             <w:noWrap/>
             <w:vAlign w:val="bottom"/>
             <w:hideMark/>
@@ -3710,7 +3764,6 @@
               <w:bottom w:val="single" w:sz="4" w:space="0" w:color="auto"/>
               <w:right w:val="single" w:sz="4" w:space="0" w:color="auto"/>
             </w:tcBorders>
-            <w:shd w:val="clear" w:color="auto" w:fill="auto"/>
             <w:noWrap/>
             <w:vAlign w:val="bottom"/>
             <w:hideMark/>
@@ -3750,7 +3803,6 @@
               <w:bottom w:val="single" w:sz="4" w:space="0" w:color="auto"/>
               <w:right w:val="single" w:sz="4" w:space="0" w:color="auto"/>
             </w:tcBorders>
-            <w:shd w:val="clear" w:color="auto" w:fill="auto"/>
             <w:noWrap/>
             <w:vAlign w:val="bottom"/>
             <w:hideMark/>
@@ -3787,7 +3839,6 @@
               <w:bottom w:val="single" w:sz="4" w:space="0" w:color="auto"/>
               <w:right w:val="single" w:sz="4" w:space="0" w:color="auto"/>
             </w:tcBorders>
-            <w:shd w:val="clear" w:color="auto" w:fill="auto"/>
             <w:noWrap/>
             <w:vAlign w:val="bottom"/>
             <w:hideMark/>
@@ -3827,7 +3878,6 @@
               <w:bottom w:val="single" w:sz="4" w:space="0" w:color="auto"/>
               <w:right w:val="single" w:sz="4" w:space="0" w:color="auto"/>
             </w:tcBorders>
-            <w:shd w:val="clear" w:color="auto" w:fill="auto"/>
             <w:noWrap/>
             <w:vAlign w:val="bottom"/>
             <w:hideMark/>
@@ -3873,7 +3923,6 @@
               <w:bottom w:val="single" w:sz="4" w:space="0" w:color="auto"/>
               <w:right w:val="single" w:sz="4" w:space="0" w:color="auto"/>
             </w:tcBorders>
-            <w:shd w:val="clear" w:color="auto" w:fill="auto"/>
             <w:noWrap/>
             <w:vAlign w:val="bottom"/>
             <w:hideMark/>
@@ -3913,7 +3962,6 @@
               <w:bottom w:val="single" w:sz="4" w:space="0" w:color="auto"/>
               <w:right w:val="single" w:sz="4" w:space="0" w:color="auto"/>
             </w:tcBorders>
-            <w:shd w:val="clear" w:color="auto" w:fill="auto"/>
             <w:noWrap/>
             <w:vAlign w:val="bottom"/>
             <w:hideMark/>
@@ -3959,7 +4007,6 @@
               <w:bottom w:val="single" w:sz="4" w:space="0" w:color="auto"/>
               <w:right w:val="single" w:sz="4" w:space="0" w:color="auto"/>
             </w:tcBorders>
-            <w:shd w:val="clear" w:color="auto" w:fill="auto"/>
             <w:noWrap/>
             <w:vAlign w:val="bottom"/>
             <w:hideMark/>
@@ -3999,7 +4046,6 @@
               <w:bottom w:val="single" w:sz="4" w:space="0" w:color="auto"/>
               <w:right w:val="single" w:sz="4" w:space="0" w:color="auto"/>
             </w:tcBorders>
-            <w:shd w:val="clear" w:color="auto" w:fill="auto"/>
             <w:noWrap/>
             <w:vAlign w:val="bottom"/>
             <w:hideMark/>
@@ -4045,7 +4091,6 @@
               <w:bottom w:val="single" w:sz="4" w:space="0" w:color="auto"/>
               <w:right w:val="single" w:sz="4" w:space="0" w:color="auto"/>
             </w:tcBorders>
-            <w:shd w:val="clear" w:color="auto" w:fill="auto"/>
             <w:noWrap/>
             <w:vAlign w:val="bottom"/>
             <w:hideMark/>
@@ -4085,7 +4130,6 @@
               <w:bottom w:val="single" w:sz="4" w:space="0" w:color="auto"/>
               <w:right w:val="single" w:sz="4" w:space="0" w:color="auto"/>
             </w:tcBorders>
-            <w:shd w:val="clear" w:color="auto" w:fill="auto"/>
             <w:noWrap/>
             <w:vAlign w:val="bottom"/>
             <w:hideMark/>
@@ -4131,7 +4175,6 @@
               <w:bottom w:val="single" w:sz="4" w:space="0" w:color="auto"/>
               <w:right w:val="single" w:sz="4" w:space="0" w:color="auto"/>
             </w:tcBorders>
-            <w:shd w:val="clear" w:color="auto" w:fill="auto"/>
             <w:noWrap/>
             <w:vAlign w:val="bottom"/>
             <w:hideMark/>
@@ -4171,7 +4214,6 @@
               <w:bottom w:val="single" w:sz="4" w:space="0" w:color="auto"/>
               <w:right w:val="single" w:sz="4" w:space="0" w:color="auto"/>
             </w:tcBorders>
-            <w:shd w:val="clear" w:color="auto" w:fill="auto"/>
             <w:noWrap/>
             <w:vAlign w:val="bottom"/>
             <w:hideMark/>
@@ -4217,7 +4259,6 @@
               <w:bottom w:val="single" w:sz="4" w:space="0" w:color="auto"/>
               <w:right w:val="single" w:sz="4" w:space="0" w:color="auto"/>
             </w:tcBorders>
-            <w:shd w:val="clear" w:color="auto" w:fill="auto"/>
             <w:noWrap/>
             <w:vAlign w:val="bottom"/>
             <w:hideMark/>
@@ -4257,7 +4298,6 @@
               <w:bottom w:val="single" w:sz="4" w:space="0" w:color="auto"/>
               <w:right w:val="single" w:sz="4" w:space="0" w:color="auto"/>
             </w:tcBorders>
-            <w:shd w:val="clear" w:color="auto" w:fill="auto"/>
             <w:noWrap/>
             <w:vAlign w:val="bottom"/>
             <w:hideMark/>
@@ -4294,7 +4334,6 @@
               <w:bottom w:val="single" w:sz="4" w:space="0" w:color="auto"/>
               <w:right w:val="single" w:sz="4" w:space="0" w:color="auto"/>
             </w:tcBorders>
-            <w:shd w:val="clear" w:color="auto" w:fill="auto"/>
             <w:noWrap/>
             <w:vAlign w:val="bottom"/>
             <w:hideMark/>
@@ -4334,7 +4373,6 @@
               <w:bottom w:val="single" w:sz="4" w:space="0" w:color="auto"/>
               <w:right w:val="single" w:sz="4" w:space="0" w:color="auto"/>
             </w:tcBorders>
-            <w:shd w:val="clear" w:color="auto" w:fill="auto"/>
             <w:noWrap/>
             <w:vAlign w:val="bottom"/>
             <w:hideMark/>
@@ -4369,7 +4407,6 @@
               <w:bottom w:val="single" w:sz="4" w:space="0" w:color="auto"/>
               <w:right w:val="single" w:sz="4" w:space="0" w:color="auto"/>
             </w:tcBorders>
-            <w:shd w:val="clear" w:color="auto" w:fill="auto"/>
             <w:noWrap/>
             <w:vAlign w:val="bottom"/>
             <w:hideMark/>
@@ -4421,7 +4458,6 @@
               <w:bottom w:val="single" w:sz="4" w:space="0" w:color="auto"/>
               <w:right w:val="single" w:sz="4" w:space="0" w:color="auto"/>
             </w:tcBorders>
-            <w:shd w:val="clear" w:color="auto" w:fill="auto"/>
             <w:noWrap/>
             <w:vAlign w:val="bottom"/>
             <w:hideMark/>
@@ -4466,7 +4502,6 @@
               <w:bottom w:val="single" w:sz="4" w:space="0" w:color="auto"/>
               <w:right w:val="single" w:sz="4" w:space="0" w:color="auto"/>
             </w:tcBorders>
-            <w:shd w:val="clear" w:color="auto" w:fill="auto"/>
             <w:noWrap/>
             <w:vAlign w:val="bottom"/>
             <w:hideMark/>
@@ -4501,7 +4536,6 @@
               <w:bottom w:val="single" w:sz="4" w:space="0" w:color="auto"/>
               <w:right w:val="single" w:sz="4" w:space="0" w:color="auto"/>
             </w:tcBorders>
-            <w:shd w:val="clear" w:color="auto" w:fill="auto"/>
             <w:noWrap/>
             <w:vAlign w:val="bottom"/>
             <w:hideMark/>
@@ -4541,7 +4575,6 @@
               <w:bottom w:val="single" w:sz="4" w:space="0" w:color="auto"/>
               <w:right w:val="single" w:sz="4" w:space="0" w:color="auto"/>
             </w:tcBorders>
-            <w:shd w:val="clear" w:color="auto" w:fill="auto"/>
             <w:noWrap/>
             <w:vAlign w:val="bottom"/>
             <w:hideMark/>
@@ -4576,7 +4609,6 @@
               <w:bottom w:val="single" w:sz="4" w:space="0" w:color="auto"/>
               <w:right w:val="single" w:sz="4" w:space="0" w:color="auto"/>
             </w:tcBorders>
-            <w:shd w:val="clear" w:color="auto" w:fill="auto"/>
             <w:noWrap/>
             <w:vAlign w:val="bottom"/>
             <w:hideMark/>
@@ -4670,7 +4702,6 @@
               <w:bottom w:val="single" w:sz="4" w:space="0" w:color="auto"/>
               <w:right w:val="single" w:sz="4" w:space="0" w:color="auto"/>
             </w:tcBorders>
-            <w:shd w:val="clear" w:color="auto" w:fill="auto"/>
             <w:noWrap/>
             <w:vAlign w:val="bottom"/>
             <w:hideMark/>
@@ -4715,7 +4746,6 @@
               <w:bottom w:val="single" w:sz="4" w:space="0" w:color="auto"/>
               <w:right w:val="single" w:sz="4" w:space="0" w:color="auto"/>
             </w:tcBorders>
-            <w:shd w:val="clear" w:color="auto" w:fill="auto"/>
             <w:noWrap/>
             <w:vAlign w:val="bottom"/>
             <w:hideMark/>
@@ -4750,7 +4780,6 @@
               <w:bottom w:val="single" w:sz="4" w:space="0" w:color="auto"/>
               <w:right w:val="single" w:sz="4" w:space="0" w:color="auto"/>
             </w:tcBorders>
-            <w:shd w:val="clear" w:color="auto" w:fill="auto"/>
             <w:noWrap/>
             <w:vAlign w:val="bottom"/>
             <w:hideMark/>
@@ -4790,7 +4819,6 @@
               <w:bottom w:val="single" w:sz="4" w:space="0" w:color="auto"/>
               <w:right w:val="single" w:sz="4" w:space="0" w:color="auto"/>
             </w:tcBorders>
-            <w:shd w:val="clear" w:color="auto" w:fill="auto"/>
             <w:noWrap/>
             <w:vAlign w:val="bottom"/>
             <w:hideMark/>
@@ -4825,7 +4853,6 @@
               <w:bottom w:val="single" w:sz="4" w:space="0" w:color="auto"/>
               <w:right w:val="single" w:sz="4" w:space="0" w:color="auto"/>
             </w:tcBorders>
-            <w:shd w:val="clear" w:color="auto" w:fill="auto"/>
             <w:noWrap/>
             <w:vAlign w:val="bottom"/>
             <w:hideMark/>
@@ -4865,7 +4892,6 @@
               <w:bottom w:val="single" w:sz="4" w:space="0" w:color="auto"/>
               <w:right w:val="single" w:sz="4" w:space="0" w:color="auto"/>
             </w:tcBorders>
-            <w:shd w:val="clear" w:color="auto" w:fill="auto"/>
             <w:noWrap/>
             <w:vAlign w:val="bottom"/>
             <w:hideMark/>
@@ -4900,7 +4926,6 @@
               <w:bottom w:val="single" w:sz="4" w:space="0" w:color="auto"/>
               <w:right w:val="single" w:sz="4" w:space="0" w:color="auto"/>
             </w:tcBorders>
-            <w:shd w:val="clear" w:color="auto" w:fill="auto"/>
             <w:noWrap/>
             <w:vAlign w:val="bottom"/>
             <w:hideMark/>
@@ -4940,7 +4965,6 @@
               <w:bottom w:val="single" w:sz="4" w:space="0" w:color="auto"/>
               <w:right w:val="single" w:sz="4" w:space="0" w:color="auto"/>
             </w:tcBorders>
-            <w:shd w:val="clear" w:color="auto" w:fill="auto"/>
             <w:noWrap/>
             <w:vAlign w:val="bottom"/>
             <w:hideMark/>
@@ -4975,7 +4999,6 @@
               <w:bottom w:val="single" w:sz="4" w:space="0" w:color="auto"/>
               <w:right w:val="single" w:sz="4" w:space="0" w:color="auto"/>
             </w:tcBorders>
-            <w:shd w:val="clear" w:color="auto" w:fill="auto"/>
             <w:noWrap/>
             <w:vAlign w:val="bottom"/>
             <w:hideMark/>
@@ -5015,7 +5038,6 @@
               <w:bottom w:val="single" w:sz="4" w:space="0" w:color="auto"/>
               <w:right w:val="single" w:sz="4" w:space="0" w:color="auto"/>
             </w:tcBorders>
-            <w:shd w:val="clear" w:color="auto" w:fill="auto"/>
             <w:noWrap/>
             <w:vAlign w:val="bottom"/>
             <w:hideMark/>
@@ -5050,7 +5072,6 @@
               <w:bottom w:val="single" w:sz="4" w:space="0" w:color="auto"/>
               <w:right w:val="single" w:sz="4" w:space="0" w:color="auto"/>
             </w:tcBorders>
-            <w:shd w:val="clear" w:color="auto" w:fill="auto"/>
             <w:noWrap/>
             <w:vAlign w:val="bottom"/>
             <w:hideMark/>
@@ -5090,7 +5111,6 @@
               <w:bottom w:val="single" w:sz="4" w:space="0" w:color="auto"/>
               <w:right w:val="single" w:sz="4" w:space="0" w:color="auto"/>
             </w:tcBorders>
-            <w:shd w:val="clear" w:color="auto" w:fill="auto"/>
             <w:noWrap/>
             <w:vAlign w:val="bottom"/>
             <w:hideMark/>
@@ -5125,7 +5145,6 @@
               <w:bottom w:val="single" w:sz="4" w:space="0" w:color="auto"/>
               <w:right w:val="single" w:sz="4" w:space="0" w:color="auto"/>
             </w:tcBorders>
-            <w:shd w:val="clear" w:color="auto" w:fill="auto"/>
             <w:noWrap/>
             <w:vAlign w:val="bottom"/>
             <w:hideMark/>
@@ -5165,7 +5184,6 @@
               <w:bottom w:val="nil"/>
               <w:right w:val="nil"/>
             </w:tcBorders>
-            <w:shd w:val="clear" w:color="auto" w:fill="auto"/>
             <w:noWrap/>
             <w:vAlign w:val="bottom"/>
             <w:hideMark/>
@@ -5191,7 +5209,6 @@
               <w:bottom w:val="nil"/>
               <w:right w:val="nil"/>
             </w:tcBorders>
-            <w:shd w:val="clear" w:color="auto" w:fill="auto"/>
             <w:noWrap/>
             <w:vAlign w:val="bottom"/>
             <w:hideMark/>
@@ -5224,7 +5241,6 @@
               <w:bottom w:val="single" w:sz="4" w:space="0" w:color="auto"/>
               <w:right w:val="single" w:sz="4" w:space="0" w:color="auto"/>
             </w:tcBorders>
-            <w:shd w:val="clear" w:color="auto" w:fill="auto"/>
             <w:noWrap/>
             <w:vAlign w:val="bottom"/>
             <w:hideMark/>
@@ -5269,7 +5285,6 @@
               <w:bottom w:val="single" w:sz="4" w:space="0" w:color="auto"/>
               <w:right w:val="single" w:sz="4" w:space="0" w:color="auto"/>
             </w:tcBorders>
-            <w:shd w:val="clear" w:color="auto" w:fill="auto"/>
             <w:noWrap/>
             <w:vAlign w:val="bottom"/>
             <w:hideMark/>
@@ -5304,7 +5319,6 @@
               <w:bottom w:val="single" w:sz="4" w:space="0" w:color="auto"/>
               <w:right w:val="single" w:sz="4" w:space="0" w:color="auto"/>
             </w:tcBorders>
-            <w:shd w:val="clear" w:color="auto" w:fill="auto"/>
             <w:noWrap/>
             <w:vAlign w:val="bottom"/>
             <w:hideMark/>
@@ -5344,7 +5358,6 @@
               <w:bottom w:val="single" w:sz="4" w:space="0" w:color="auto"/>
               <w:right w:val="single" w:sz="4" w:space="0" w:color="auto"/>
             </w:tcBorders>
-            <w:shd w:val="clear" w:color="auto" w:fill="auto"/>
             <w:noWrap/>
             <w:vAlign w:val="bottom"/>
             <w:hideMark/>
@@ -5379,7 +5392,6 @@
               <w:bottom w:val="single" w:sz="4" w:space="0" w:color="auto"/>
               <w:right w:val="single" w:sz="4" w:space="0" w:color="auto"/>
             </w:tcBorders>
-            <w:shd w:val="clear" w:color="auto" w:fill="auto"/>
             <w:noWrap/>
             <w:vAlign w:val="bottom"/>
             <w:hideMark/>
@@ -5419,7 +5431,6 @@
               <w:bottom w:val="single" w:sz="4" w:space="0" w:color="auto"/>
               <w:right w:val="single" w:sz="4" w:space="0" w:color="auto"/>
             </w:tcBorders>
-            <w:shd w:val="clear" w:color="auto" w:fill="auto"/>
             <w:noWrap/>
             <w:vAlign w:val="bottom"/>
             <w:hideMark/>
@@ -5454,7 +5465,6 @@
               <w:bottom w:val="single" w:sz="4" w:space="0" w:color="auto"/>
               <w:right w:val="single" w:sz="4" w:space="0" w:color="auto"/>
             </w:tcBorders>
-            <w:shd w:val="clear" w:color="auto" w:fill="auto"/>
             <w:noWrap/>
             <w:vAlign w:val="bottom"/>
             <w:hideMark/>
@@ -5494,7 +5504,6 @@
               <w:bottom w:val="single" w:sz="4" w:space="0" w:color="auto"/>
               <w:right w:val="single" w:sz="4" w:space="0" w:color="auto"/>
             </w:tcBorders>
-            <w:shd w:val="clear" w:color="auto" w:fill="auto"/>
             <w:noWrap/>
             <w:vAlign w:val="bottom"/>
             <w:hideMark/>
@@ -5529,7 +5538,6 @@
               <w:bottom w:val="single" w:sz="4" w:space="0" w:color="auto"/>
               <w:right w:val="single" w:sz="4" w:space="0" w:color="auto"/>
             </w:tcBorders>
-            <w:shd w:val="clear" w:color="auto" w:fill="auto"/>
             <w:noWrap/>
             <w:vAlign w:val="bottom"/>
             <w:hideMark/>
@@ -5569,7 +5577,6 @@
               <w:bottom w:val="single" w:sz="4" w:space="0" w:color="auto"/>
               <w:right w:val="single" w:sz="4" w:space="0" w:color="auto"/>
             </w:tcBorders>
-            <w:shd w:val="clear" w:color="auto" w:fill="auto"/>
             <w:noWrap/>
             <w:vAlign w:val="bottom"/>
             <w:hideMark/>
@@ -5604,7 +5611,6 @@
               <w:bottom w:val="single" w:sz="4" w:space="0" w:color="auto"/>
               <w:right w:val="single" w:sz="4" w:space="0" w:color="auto"/>
             </w:tcBorders>
-            <w:shd w:val="clear" w:color="auto" w:fill="auto"/>
             <w:noWrap/>
             <w:vAlign w:val="bottom"/>
             <w:hideMark/>
@@ -5644,7 +5650,6 @@
               <w:bottom w:val="single" w:sz="4" w:space="0" w:color="auto"/>
               <w:right w:val="single" w:sz="4" w:space="0" w:color="auto"/>
             </w:tcBorders>
-            <w:shd w:val="clear" w:color="auto" w:fill="auto"/>
             <w:noWrap/>
             <w:vAlign w:val="bottom"/>
             <w:hideMark/>
@@ -5679,7 +5684,6 @@
               <w:bottom w:val="single" w:sz="4" w:space="0" w:color="auto"/>
               <w:right w:val="single" w:sz="4" w:space="0" w:color="auto"/>
             </w:tcBorders>
-            <w:shd w:val="clear" w:color="auto" w:fill="auto"/>
             <w:noWrap/>
             <w:vAlign w:val="bottom"/>
             <w:hideMark/>
@@ -5719,7 +5723,6 @@
               <w:bottom w:val="single" w:sz="4" w:space="0" w:color="auto"/>
               <w:right w:val="single" w:sz="4" w:space="0" w:color="auto"/>
             </w:tcBorders>
-            <w:shd w:val="clear" w:color="auto" w:fill="auto"/>
             <w:noWrap/>
             <w:vAlign w:val="bottom"/>
             <w:hideMark/>
@@ -5754,7 +5757,6 @@
               <w:bottom w:val="single" w:sz="4" w:space="0" w:color="auto"/>
               <w:right w:val="single" w:sz="4" w:space="0" w:color="auto"/>
             </w:tcBorders>
-            <w:shd w:val="clear" w:color="auto" w:fill="auto"/>
             <w:noWrap/>
             <w:vAlign w:val="bottom"/>
             <w:hideMark/>
@@ -5794,7 +5796,6 @@
               <w:bottom w:val="nil"/>
               <w:right w:val="nil"/>
             </w:tcBorders>
-            <w:shd w:val="clear" w:color="auto" w:fill="auto"/>
             <w:noWrap/>
             <w:vAlign w:val="bottom"/>
             <w:hideMark/>
@@ -5820,7 +5821,6 @@
               <w:bottom w:val="nil"/>
               <w:right w:val="nil"/>
             </w:tcBorders>
-            <w:shd w:val="clear" w:color="auto" w:fill="auto"/>
             <w:noWrap/>
             <w:vAlign w:val="bottom"/>
             <w:hideMark/>
@@ -5853,7 +5853,6 @@
               <w:bottom w:val="single" w:sz="4" w:space="0" w:color="auto"/>
               <w:right w:val="single" w:sz="4" w:space="0" w:color="auto"/>
             </w:tcBorders>
-            <w:shd w:val="clear" w:color="auto" w:fill="auto"/>
             <w:noWrap/>
             <w:vAlign w:val="bottom"/>
             <w:hideMark/>
@@ -5898,7 +5897,6 @@
               <w:bottom w:val="single" w:sz="4" w:space="0" w:color="auto"/>
               <w:right w:val="single" w:sz="4" w:space="0" w:color="auto"/>
             </w:tcBorders>
-            <w:shd w:val="clear" w:color="auto" w:fill="auto"/>
             <w:noWrap/>
             <w:vAlign w:val="bottom"/>
             <w:hideMark/>
@@ -5935,7 +5933,6 @@
               <w:bottom w:val="single" w:sz="4" w:space="0" w:color="auto"/>
               <w:right w:val="single" w:sz="4" w:space="0" w:color="auto"/>
             </w:tcBorders>
-            <w:shd w:val="clear" w:color="auto" w:fill="auto"/>
             <w:noWrap/>
             <w:vAlign w:val="bottom"/>
             <w:hideMark/>
@@ -5975,7 +5972,6 @@
               <w:bottom w:val="single" w:sz="4" w:space="0" w:color="auto"/>
               <w:right w:val="single" w:sz="4" w:space="0" w:color="auto"/>
             </w:tcBorders>
-            <w:shd w:val="clear" w:color="auto" w:fill="auto"/>
             <w:noWrap/>
             <w:vAlign w:val="bottom"/>
             <w:hideMark/>
@@ -6012,7 +6008,6 @@
               <w:bottom w:val="single" w:sz="4" w:space="0" w:color="auto"/>
               <w:right w:val="single" w:sz="4" w:space="0" w:color="auto"/>
             </w:tcBorders>
-            <w:shd w:val="clear" w:color="auto" w:fill="auto"/>
             <w:noWrap/>
             <w:vAlign w:val="bottom"/>
             <w:hideMark/>
@@ -6052,7 +6047,6 @@
               <w:bottom w:val="single" w:sz="4" w:space="0" w:color="auto"/>
               <w:right w:val="single" w:sz="4" w:space="0" w:color="auto"/>
             </w:tcBorders>
-            <w:shd w:val="clear" w:color="auto" w:fill="auto"/>
             <w:noWrap/>
             <w:vAlign w:val="bottom"/>
             <w:hideMark/>
@@ -6089,7 +6083,6 @@
               <w:bottom w:val="single" w:sz="4" w:space="0" w:color="auto"/>
               <w:right w:val="single" w:sz="4" w:space="0" w:color="auto"/>
             </w:tcBorders>
-            <w:shd w:val="clear" w:color="auto" w:fill="auto"/>
             <w:noWrap/>
             <w:vAlign w:val="bottom"/>
             <w:hideMark/>
@@ -6129,7 +6122,6 @@
               <w:bottom w:val="single" w:sz="4" w:space="0" w:color="auto"/>
               <w:right w:val="single" w:sz="4" w:space="0" w:color="auto"/>
             </w:tcBorders>
-            <w:shd w:val="clear" w:color="auto" w:fill="auto"/>
             <w:noWrap/>
             <w:vAlign w:val="bottom"/>
             <w:hideMark/>
@@ -6166,7 +6158,6 @@
               <w:bottom w:val="single" w:sz="4" w:space="0" w:color="auto"/>
               <w:right w:val="single" w:sz="4" w:space="0" w:color="auto"/>
             </w:tcBorders>
-            <w:shd w:val="clear" w:color="auto" w:fill="auto"/>
             <w:noWrap/>
             <w:vAlign w:val="bottom"/>
             <w:hideMark/>
@@ -6206,7 +6197,6 @@
               <w:bottom w:val="single" w:sz="4" w:space="0" w:color="auto"/>
               <w:right w:val="single" w:sz="4" w:space="0" w:color="auto"/>
             </w:tcBorders>
-            <w:shd w:val="clear" w:color="auto" w:fill="auto"/>
             <w:noWrap/>
             <w:vAlign w:val="bottom"/>
             <w:hideMark/>
@@ -6243,7 +6233,6 @@
               <w:bottom w:val="single" w:sz="4" w:space="0" w:color="auto"/>
               <w:right w:val="single" w:sz="4" w:space="0" w:color="auto"/>
             </w:tcBorders>
-            <w:shd w:val="clear" w:color="auto" w:fill="auto"/>
             <w:noWrap/>
             <w:vAlign w:val="bottom"/>
             <w:hideMark/>
@@ -6283,7 +6272,6 @@
               <w:bottom w:val="single" w:sz="4" w:space="0" w:color="auto"/>
               <w:right w:val="single" w:sz="4" w:space="0" w:color="auto"/>
             </w:tcBorders>
-            <w:shd w:val="clear" w:color="auto" w:fill="auto"/>
             <w:noWrap/>
             <w:vAlign w:val="bottom"/>
             <w:hideMark/>
@@ -6320,7 +6308,6 @@
               <w:bottom w:val="single" w:sz="4" w:space="0" w:color="auto"/>
               <w:right w:val="single" w:sz="4" w:space="0" w:color="auto"/>
             </w:tcBorders>
-            <w:shd w:val="clear" w:color="auto" w:fill="auto"/>
             <w:noWrap/>
             <w:vAlign w:val="bottom"/>
             <w:hideMark/>
@@ -6360,7 +6347,6 @@
               <w:bottom w:val="nil"/>
               <w:right w:val="nil"/>
             </w:tcBorders>
-            <w:shd w:val="clear" w:color="auto" w:fill="auto"/>
             <w:noWrap/>
             <w:vAlign w:val="bottom"/>
             <w:hideMark/>
@@ -6386,7 +6372,6 @@
               <w:bottom w:val="nil"/>
               <w:right w:val="nil"/>
             </w:tcBorders>
-            <w:shd w:val="clear" w:color="auto" w:fill="auto"/>
             <w:noWrap/>
             <w:vAlign w:val="bottom"/>
             <w:hideMark/>
@@ -6419,7 +6404,6 @@
               <w:bottom w:val="single" w:sz="4" w:space="0" w:color="auto"/>
               <w:right w:val="single" w:sz="4" w:space="0" w:color="auto"/>
             </w:tcBorders>
-            <w:shd w:val="clear" w:color="auto" w:fill="auto"/>
             <w:noWrap/>
             <w:vAlign w:val="bottom"/>
             <w:hideMark/>
@@ -6464,7 +6448,6 @@
               <w:bottom w:val="single" w:sz="4" w:space="0" w:color="auto"/>
               <w:right w:val="single" w:sz="4" w:space="0" w:color="auto"/>
             </w:tcBorders>
-            <w:shd w:val="clear" w:color="auto" w:fill="auto"/>
             <w:noWrap/>
             <w:vAlign w:val="bottom"/>
             <w:hideMark/>
@@ -6499,7 +6482,6 @@
               <w:bottom w:val="single" w:sz="4" w:space="0" w:color="auto"/>
               <w:right w:val="single" w:sz="4" w:space="0" w:color="auto"/>
             </w:tcBorders>
-            <w:shd w:val="clear" w:color="auto" w:fill="auto"/>
             <w:noWrap/>
             <w:vAlign w:val="bottom"/>
             <w:hideMark/>
@@ -6539,7 +6521,6 @@
               <w:bottom w:val="single" w:sz="4" w:space="0" w:color="auto"/>
               <w:right w:val="single" w:sz="4" w:space="0" w:color="auto"/>
             </w:tcBorders>
-            <w:shd w:val="clear" w:color="auto" w:fill="auto"/>
             <w:noWrap/>
             <w:vAlign w:val="bottom"/>
             <w:hideMark/>
@@ -6574,7 +6555,6 @@
               <w:bottom w:val="single" w:sz="4" w:space="0" w:color="auto"/>
               <w:right w:val="single" w:sz="4" w:space="0" w:color="auto"/>
             </w:tcBorders>
-            <w:shd w:val="clear" w:color="auto" w:fill="auto"/>
             <w:noWrap/>
             <w:vAlign w:val="bottom"/>
             <w:hideMark/>
@@ -6614,7 +6594,6 @@
               <w:bottom w:val="nil"/>
               <w:right w:val="nil"/>
             </w:tcBorders>
-            <w:shd w:val="clear" w:color="auto" w:fill="auto"/>
             <w:noWrap/>
             <w:vAlign w:val="bottom"/>
             <w:hideMark/>
@@ -6640,7 +6619,6 @@
               <w:bottom w:val="nil"/>
               <w:right w:val="nil"/>
             </w:tcBorders>
-            <w:shd w:val="clear" w:color="auto" w:fill="auto"/>
             <w:noWrap/>
             <w:vAlign w:val="bottom"/>
             <w:hideMark/>
@@ -6673,7 +6651,6 @@
               <w:bottom w:val="single" w:sz="4" w:space="0" w:color="auto"/>
               <w:right w:val="single" w:sz="4" w:space="0" w:color="auto"/>
             </w:tcBorders>
-            <w:shd w:val="clear" w:color="auto" w:fill="auto"/>
             <w:noWrap/>
             <w:vAlign w:val="bottom"/>
             <w:hideMark/>
@@ -6718,7 +6695,6 @@
               <w:bottom w:val="single" w:sz="4" w:space="0" w:color="auto"/>
               <w:right w:val="single" w:sz="4" w:space="0" w:color="auto"/>
             </w:tcBorders>
-            <w:shd w:val="clear" w:color="auto" w:fill="auto"/>
             <w:noWrap/>
             <w:vAlign w:val="bottom"/>
             <w:hideMark/>
@@ -6753,7 +6729,6 @@
               <w:bottom w:val="single" w:sz="4" w:space="0" w:color="auto"/>
               <w:right w:val="single" w:sz="4" w:space="0" w:color="auto"/>
             </w:tcBorders>
-            <w:shd w:val="clear" w:color="auto" w:fill="auto"/>
             <w:noWrap/>
             <w:vAlign w:val="bottom"/>
             <w:hideMark/>
@@ -6793,7 +6768,6 @@
               <w:bottom w:val="single" w:sz="4" w:space="0" w:color="auto"/>
               <w:right w:val="single" w:sz="4" w:space="0" w:color="auto"/>
             </w:tcBorders>
-            <w:shd w:val="clear" w:color="auto" w:fill="auto"/>
             <w:noWrap/>
             <w:vAlign w:val="bottom"/>
             <w:hideMark/>
@@ -6828,7 +6802,6 @@
               <w:bottom w:val="single" w:sz="4" w:space="0" w:color="auto"/>
               <w:right w:val="single" w:sz="4" w:space="0" w:color="auto"/>
             </w:tcBorders>
-            <w:shd w:val="clear" w:color="auto" w:fill="auto"/>
             <w:noWrap/>
             <w:vAlign w:val="bottom"/>
             <w:hideMark/>
@@ -6897,7 +6870,6 @@
               <w:bottom w:val="single" w:sz="4" w:space="0" w:color="auto"/>
               <w:right w:val="single" w:sz="4" w:space="0" w:color="auto"/>
             </w:tcBorders>
-            <w:shd w:val="clear" w:color="auto" w:fill="auto"/>
             <w:noWrap/>
             <w:vAlign w:val="bottom"/>
             <w:hideMark/>
@@ -6942,7 +6914,6 @@
               <w:bottom w:val="single" w:sz="4" w:space="0" w:color="auto"/>
               <w:right w:val="single" w:sz="4" w:space="0" w:color="auto"/>
             </w:tcBorders>
-            <w:shd w:val="clear" w:color="auto" w:fill="auto"/>
             <w:noWrap/>
             <w:vAlign w:val="bottom"/>
             <w:hideMark/>
@@ -6977,7 +6948,6 @@
               <w:bottom w:val="single" w:sz="4" w:space="0" w:color="auto"/>
               <w:right w:val="single" w:sz="4" w:space="0" w:color="auto"/>
             </w:tcBorders>
-            <w:shd w:val="clear" w:color="auto" w:fill="auto"/>
             <w:noWrap/>
             <w:vAlign w:val="bottom"/>
             <w:hideMark/>
@@ -7017,7 +6987,6 @@
               <w:bottom w:val="single" w:sz="4" w:space="0" w:color="auto"/>
               <w:right w:val="single" w:sz="4" w:space="0" w:color="auto"/>
             </w:tcBorders>
-            <w:shd w:val="clear" w:color="auto" w:fill="auto"/>
             <w:noWrap/>
             <w:vAlign w:val="bottom"/>
             <w:hideMark/>
@@ -7052,7 +7021,6 @@
               <w:bottom w:val="single" w:sz="4" w:space="0" w:color="auto"/>
               <w:right w:val="single" w:sz="4" w:space="0" w:color="auto"/>
             </w:tcBorders>
-            <w:shd w:val="clear" w:color="auto" w:fill="auto"/>
             <w:noWrap/>
             <w:vAlign w:val="bottom"/>
             <w:hideMark/>
@@ -7092,7 +7060,6 @@
               <w:bottom w:val="single" w:sz="4" w:space="0" w:color="auto"/>
               <w:right w:val="single" w:sz="4" w:space="0" w:color="auto"/>
             </w:tcBorders>
-            <w:shd w:val="clear" w:color="auto" w:fill="auto"/>
             <w:noWrap/>
             <w:vAlign w:val="bottom"/>
             <w:hideMark/>
@@ -7127,7 +7094,6 @@
               <w:bottom w:val="single" w:sz="4" w:space="0" w:color="auto"/>
               <w:right w:val="single" w:sz="4" w:space="0" w:color="auto"/>
             </w:tcBorders>
-            <w:shd w:val="clear" w:color="auto" w:fill="auto"/>
             <w:noWrap/>
             <w:vAlign w:val="bottom"/>
             <w:hideMark/>
@@ -7167,7 +7133,6 @@
               <w:bottom w:val="single" w:sz="4" w:space="0" w:color="auto"/>
               <w:right w:val="single" w:sz="4" w:space="0" w:color="auto"/>
             </w:tcBorders>
-            <w:shd w:val="clear" w:color="auto" w:fill="auto"/>
             <w:noWrap/>
             <w:vAlign w:val="bottom"/>
             <w:hideMark/>
@@ -7202,7 +7167,6 @@
               <w:bottom w:val="single" w:sz="4" w:space="0" w:color="auto"/>
               <w:right w:val="single" w:sz="4" w:space="0" w:color="auto"/>
             </w:tcBorders>
-            <w:shd w:val="clear" w:color="auto" w:fill="auto"/>
             <w:noWrap/>
             <w:vAlign w:val="bottom"/>
             <w:hideMark/>
@@ -7242,7 +7206,6 @@
               <w:bottom w:val="single" w:sz="4" w:space="0" w:color="auto"/>
               <w:right w:val="single" w:sz="4" w:space="0" w:color="auto"/>
             </w:tcBorders>
-            <w:shd w:val="clear" w:color="auto" w:fill="auto"/>
             <w:noWrap/>
             <w:vAlign w:val="bottom"/>
             <w:hideMark/>
@@ -7277,7 +7240,6 @@
               <w:bottom w:val="single" w:sz="4" w:space="0" w:color="auto"/>
               <w:right w:val="single" w:sz="4" w:space="0" w:color="auto"/>
             </w:tcBorders>
-            <w:shd w:val="clear" w:color="auto" w:fill="auto"/>
             <w:noWrap/>
             <w:vAlign w:val="bottom"/>
             <w:hideMark/>
@@ -7317,7 +7279,6 @@
               <w:bottom w:val="single" w:sz="4" w:space="0" w:color="auto"/>
               <w:right w:val="single" w:sz="4" w:space="0" w:color="auto"/>
             </w:tcBorders>
-            <w:shd w:val="clear" w:color="auto" w:fill="auto"/>
             <w:noWrap/>
             <w:vAlign w:val="bottom"/>
             <w:hideMark/>
@@ -7352,7 +7313,6 @@
               <w:bottom w:val="single" w:sz="4" w:space="0" w:color="auto"/>
               <w:right w:val="single" w:sz="4" w:space="0" w:color="auto"/>
             </w:tcBorders>
-            <w:shd w:val="clear" w:color="auto" w:fill="auto"/>
             <w:noWrap/>
             <w:vAlign w:val="bottom"/>
             <w:hideMark/>
@@ -7392,7 +7352,6 @@
               <w:bottom w:val="nil"/>
               <w:right w:val="nil"/>
             </w:tcBorders>
-            <w:shd w:val="clear" w:color="auto" w:fill="auto"/>
             <w:noWrap/>
             <w:vAlign w:val="bottom"/>
             <w:hideMark/>
@@ -7418,7 +7377,6 @@
               <w:bottom w:val="nil"/>
               <w:right w:val="nil"/>
             </w:tcBorders>
-            <w:shd w:val="clear" w:color="auto" w:fill="auto"/>
             <w:noWrap/>
             <w:vAlign w:val="bottom"/>
             <w:hideMark/>
@@ -7450,7 +7408,6 @@
               <w:bottom w:val="nil"/>
               <w:right w:val="nil"/>
             </w:tcBorders>
-            <w:shd w:val="clear" w:color="auto" w:fill="auto"/>
             <w:noWrap/>
             <w:vAlign w:val="bottom"/>
             <w:hideMark/>
@@ -7477,7 +7434,6 @@
               <w:bottom w:val="nil"/>
               <w:right w:val="nil"/>
             </w:tcBorders>
-            <w:shd w:val="clear" w:color="auto" w:fill="auto"/>
             <w:noWrap/>
             <w:vAlign w:val="bottom"/>
             <w:hideMark/>
@@ -7510,7 +7466,6 @@
               <w:bottom w:val="single" w:sz="4" w:space="0" w:color="auto"/>
               <w:right w:val="single" w:sz="4" w:space="0" w:color="auto"/>
             </w:tcBorders>
-            <w:shd w:val="clear" w:color="auto" w:fill="auto"/>
             <w:noWrap/>
             <w:vAlign w:val="bottom"/>
             <w:hideMark/>
@@ -7555,7 +7510,6 @@
               <w:bottom w:val="single" w:sz="4" w:space="0" w:color="auto"/>
               <w:right w:val="single" w:sz="4" w:space="0" w:color="auto"/>
             </w:tcBorders>
-            <w:shd w:val="clear" w:color="auto" w:fill="auto"/>
             <w:noWrap/>
             <w:vAlign w:val="bottom"/>
             <w:hideMark/>
@@ -7601,7 +7555,6 @@
               <w:bottom w:val="single" w:sz="4" w:space="0" w:color="auto"/>
               <w:right w:val="single" w:sz="4" w:space="0" w:color="auto"/>
             </w:tcBorders>
-            <w:shd w:val="clear" w:color="auto" w:fill="auto"/>
             <w:noWrap/>
             <w:vAlign w:val="bottom"/>
             <w:hideMark/>
@@ -7641,7 +7594,6 @@
               <w:bottom w:val="single" w:sz="4" w:space="0" w:color="auto"/>
               <w:right w:val="single" w:sz="4" w:space="0" w:color="auto"/>
             </w:tcBorders>
-            <w:shd w:val="clear" w:color="auto" w:fill="auto"/>
             <w:noWrap/>
             <w:vAlign w:val="bottom"/>
             <w:hideMark/>
@@ -7687,7 +7639,6 @@
               <w:bottom w:val="single" w:sz="4" w:space="0" w:color="auto"/>
               <w:right w:val="single" w:sz="4" w:space="0" w:color="auto"/>
             </w:tcBorders>
-            <w:shd w:val="clear" w:color="auto" w:fill="auto"/>
             <w:noWrap/>
             <w:vAlign w:val="bottom"/>
             <w:hideMark/>
@@ -7727,7 +7678,6 @@
               <w:bottom w:val="single" w:sz="4" w:space="0" w:color="auto"/>
               <w:right w:val="single" w:sz="4" w:space="0" w:color="auto"/>
             </w:tcBorders>
-            <w:shd w:val="clear" w:color="auto" w:fill="auto"/>
             <w:noWrap/>
             <w:vAlign w:val="bottom"/>
             <w:hideMark/>
@@ -7773,7 +7723,6 @@
               <w:bottom w:val="single" w:sz="4" w:space="0" w:color="auto"/>
               <w:right w:val="single" w:sz="4" w:space="0" w:color="auto"/>
             </w:tcBorders>
-            <w:shd w:val="clear" w:color="auto" w:fill="auto"/>
             <w:noWrap/>
             <w:vAlign w:val="bottom"/>
             <w:hideMark/>
@@ -7813,7 +7762,6 @@
               <w:bottom w:val="single" w:sz="4" w:space="0" w:color="auto"/>
               <w:right w:val="single" w:sz="4" w:space="0" w:color="auto"/>
             </w:tcBorders>
-            <w:shd w:val="clear" w:color="auto" w:fill="auto"/>
             <w:noWrap/>
             <w:vAlign w:val="bottom"/>
             <w:hideMark/>
@@ -7859,7 +7807,6 @@
               <w:bottom w:val="single" w:sz="4" w:space="0" w:color="auto"/>
               <w:right w:val="single" w:sz="4" w:space="0" w:color="auto"/>
             </w:tcBorders>
-            <w:shd w:val="clear" w:color="auto" w:fill="auto"/>
             <w:noWrap/>
             <w:vAlign w:val="bottom"/>
             <w:hideMark/>
@@ -7899,7 +7846,6 @@
               <w:bottom w:val="single" w:sz="4" w:space="0" w:color="auto"/>
               <w:right w:val="single" w:sz="4" w:space="0" w:color="auto"/>
             </w:tcBorders>
-            <w:shd w:val="clear" w:color="auto" w:fill="auto"/>
             <w:noWrap/>
             <w:vAlign w:val="bottom"/>
             <w:hideMark/>
@@ -7945,7 +7891,6 @@
               <w:bottom w:val="single" w:sz="4" w:space="0" w:color="auto"/>
               <w:right w:val="single" w:sz="4" w:space="0" w:color="auto"/>
             </w:tcBorders>
-            <w:shd w:val="clear" w:color="auto" w:fill="auto"/>
             <w:noWrap/>
             <w:vAlign w:val="bottom"/>
             <w:hideMark/>
@@ -7985,7 +7930,6 @@
               <w:bottom w:val="single" w:sz="4" w:space="0" w:color="auto"/>
               <w:right w:val="single" w:sz="4" w:space="0" w:color="auto"/>
             </w:tcBorders>
-            <w:shd w:val="clear" w:color="auto" w:fill="auto"/>
             <w:noWrap/>
             <w:vAlign w:val="bottom"/>
             <w:hideMark/>
@@ -8031,7 +7975,6 @@
               <w:bottom w:val="single" w:sz="4" w:space="0" w:color="auto"/>
               <w:right w:val="single" w:sz="4" w:space="0" w:color="auto"/>
             </w:tcBorders>
-            <w:shd w:val="clear" w:color="auto" w:fill="auto"/>
             <w:noWrap/>
             <w:vAlign w:val="bottom"/>
             <w:hideMark/>
@@ -8071,7 +8014,6 @@
               <w:bottom w:val="single" w:sz="4" w:space="0" w:color="auto"/>
               <w:right w:val="single" w:sz="4" w:space="0" w:color="auto"/>
             </w:tcBorders>
-            <w:shd w:val="clear" w:color="auto" w:fill="auto"/>
             <w:noWrap/>
             <w:vAlign w:val="bottom"/>
             <w:hideMark/>
@@ -8106,7 +8048,6 @@
               <w:bottom w:val="single" w:sz="4" w:space="0" w:color="auto"/>
               <w:right w:val="single" w:sz="4" w:space="0" w:color="auto"/>
             </w:tcBorders>
-            <w:shd w:val="clear" w:color="auto" w:fill="auto"/>
             <w:noWrap/>
             <w:vAlign w:val="bottom"/>
             <w:hideMark/>
@@ -8146,7 +8087,6 @@
               <w:bottom w:val="nil"/>
               <w:right w:val="nil"/>
             </w:tcBorders>
-            <w:shd w:val="clear" w:color="auto" w:fill="auto"/>
             <w:noWrap/>
             <w:vAlign w:val="bottom"/>
             <w:hideMark/>
@@ -8172,7 +8112,6 @@
               <w:bottom w:val="nil"/>
               <w:right w:val="nil"/>
             </w:tcBorders>
-            <w:shd w:val="clear" w:color="auto" w:fill="auto"/>
             <w:noWrap/>
             <w:vAlign w:val="bottom"/>
             <w:hideMark/>
@@ -8205,7 +8144,6 @@
               <w:bottom w:val="single" w:sz="4" w:space="0" w:color="auto"/>
               <w:right w:val="single" w:sz="4" w:space="0" w:color="auto"/>
             </w:tcBorders>
-            <w:shd w:val="clear" w:color="auto" w:fill="auto"/>
             <w:noWrap/>
             <w:vAlign w:val="bottom"/>
             <w:hideMark/>
@@ -8250,7 +8188,6 @@
               <w:bottom w:val="single" w:sz="4" w:space="0" w:color="auto"/>
               <w:right w:val="single" w:sz="4" w:space="0" w:color="auto"/>
             </w:tcBorders>
-            <w:shd w:val="clear" w:color="auto" w:fill="auto"/>
             <w:noWrap/>
             <w:vAlign w:val="bottom"/>
             <w:hideMark/>
@@ -8285,7 +8222,6 @@
               <w:bottom w:val="single" w:sz="4" w:space="0" w:color="auto"/>
               <w:right w:val="single" w:sz="4" w:space="0" w:color="auto"/>
             </w:tcBorders>
-            <w:shd w:val="clear" w:color="auto" w:fill="auto"/>
             <w:noWrap/>
             <w:vAlign w:val="bottom"/>
             <w:hideMark/>
@@ -8325,7 +8261,6 @@
               <w:bottom w:val="single" w:sz="4" w:space="0" w:color="auto"/>
               <w:right w:val="single" w:sz="4" w:space="0" w:color="auto"/>
             </w:tcBorders>
-            <w:shd w:val="clear" w:color="auto" w:fill="auto"/>
             <w:noWrap/>
             <w:vAlign w:val="bottom"/>
             <w:hideMark/>
@@ -8360,7 +8295,6 @@
               <w:bottom w:val="single" w:sz="4" w:space="0" w:color="auto"/>
               <w:right w:val="single" w:sz="4" w:space="0" w:color="auto"/>
             </w:tcBorders>
-            <w:shd w:val="clear" w:color="auto" w:fill="auto"/>
             <w:noWrap/>
             <w:vAlign w:val="bottom"/>
             <w:hideMark/>
@@ -8400,7 +8334,6 @@
               <w:bottom w:val="single" w:sz="4" w:space="0" w:color="auto"/>
               <w:right w:val="single" w:sz="4" w:space="0" w:color="auto"/>
             </w:tcBorders>
-            <w:shd w:val="clear" w:color="auto" w:fill="auto"/>
             <w:noWrap/>
             <w:vAlign w:val="bottom"/>
             <w:hideMark/>
@@ -8435,7 +8368,6 @@
               <w:bottom w:val="single" w:sz="4" w:space="0" w:color="auto"/>
               <w:right w:val="single" w:sz="4" w:space="0" w:color="auto"/>
             </w:tcBorders>
-            <w:shd w:val="clear" w:color="auto" w:fill="auto"/>
             <w:noWrap/>
             <w:vAlign w:val="bottom"/>
             <w:hideMark/>
@@ -8475,7 +8407,6 @@
               <w:bottom w:val="single" w:sz="4" w:space="0" w:color="auto"/>
               <w:right w:val="single" w:sz="4" w:space="0" w:color="auto"/>
             </w:tcBorders>
-            <w:shd w:val="clear" w:color="auto" w:fill="auto"/>
             <w:noWrap/>
             <w:vAlign w:val="bottom"/>
             <w:hideMark/>
@@ -8512,7 +8443,6 @@
               <w:bottom w:val="single" w:sz="4" w:space="0" w:color="auto"/>
               <w:right w:val="single" w:sz="4" w:space="0" w:color="auto"/>
             </w:tcBorders>
-            <w:shd w:val="clear" w:color="auto" w:fill="auto"/>
             <w:noWrap/>
             <w:vAlign w:val="bottom"/>
             <w:hideMark/>
@@ -8552,7 +8482,6 @@
               <w:bottom w:val="single" w:sz="4" w:space="0" w:color="auto"/>
               <w:right w:val="single" w:sz="4" w:space="0" w:color="auto"/>
             </w:tcBorders>
-            <w:shd w:val="clear" w:color="auto" w:fill="auto"/>
             <w:noWrap/>
             <w:vAlign w:val="bottom"/>
             <w:hideMark/>
@@ -8587,7 +8516,6 @@
               <w:bottom w:val="single" w:sz="4" w:space="0" w:color="auto"/>
               <w:right w:val="single" w:sz="4" w:space="0" w:color="auto"/>
             </w:tcBorders>
-            <w:shd w:val="clear" w:color="auto" w:fill="auto"/>
             <w:noWrap/>
             <w:vAlign w:val="bottom"/>
             <w:hideMark/>
@@ -8627,7 +8555,6 @@
               <w:bottom w:val="single" w:sz="4" w:space="0" w:color="auto"/>
               <w:right w:val="single" w:sz="4" w:space="0" w:color="auto"/>
             </w:tcBorders>
-            <w:shd w:val="clear" w:color="auto" w:fill="auto"/>
             <w:noWrap/>
             <w:vAlign w:val="bottom"/>
             <w:hideMark/>
@@ -8664,7 +8591,6 @@
               <w:bottom w:val="single" w:sz="4" w:space="0" w:color="auto"/>
               <w:right w:val="single" w:sz="4" w:space="0" w:color="auto"/>
             </w:tcBorders>
-            <w:shd w:val="clear" w:color="auto" w:fill="auto"/>
             <w:noWrap/>
             <w:vAlign w:val="bottom"/>
             <w:hideMark/>
@@ -8704,7 +8630,6 @@
               <w:bottom w:val="single" w:sz="4" w:space="0" w:color="auto"/>
               <w:right w:val="single" w:sz="4" w:space="0" w:color="auto"/>
             </w:tcBorders>
-            <w:shd w:val="clear" w:color="auto" w:fill="auto"/>
             <w:noWrap/>
             <w:vAlign w:val="bottom"/>
             <w:hideMark/>
@@ -8739,7 +8664,6 @@
               <w:bottom w:val="single" w:sz="4" w:space="0" w:color="auto"/>
               <w:right w:val="single" w:sz="4" w:space="0" w:color="auto"/>
             </w:tcBorders>
-            <w:shd w:val="clear" w:color="auto" w:fill="auto"/>
             <w:noWrap/>
             <w:vAlign w:val="bottom"/>
             <w:hideMark/>
@@ -8779,7 +8703,6 @@
               <w:bottom w:val="single" w:sz="4" w:space="0" w:color="auto"/>
               <w:right w:val="single" w:sz="4" w:space="0" w:color="auto"/>
             </w:tcBorders>
-            <w:shd w:val="clear" w:color="auto" w:fill="auto"/>
             <w:noWrap/>
             <w:vAlign w:val="bottom"/>
             <w:hideMark/>
@@ -8814,7 +8737,6 @@
               <w:bottom w:val="single" w:sz="4" w:space="0" w:color="auto"/>
               <w:right w:val="single" w:sz="4" w:space="0" w:color="auto"/>
             </w:tcBorders>
-            <w:shd w:val="clear" w:color="auto" w:fill="auto"/>
             <w:noWrap/>
             <w:vAlign w:val="bottom"/>
             <w:hideMark/>
@@ -8854,7 +8776,6 @@
               <w:bottom w:val="single" w:sz="4" w:space="0" w:color="auto"/>
               <w:right w:val="single" w:sz="4" w:space="0" w:color="auto"/>
             </w:tcBorders>
-            <w:shd w:val="clear" w:color="auto" w:fill="auto"/>
             <w:noWrap/>
             <w:vAlign w:val="bottom"/>
             <w:hideMark/>
@@ -8889,7 +8810,6 @@
               <w:bottom w:val="single" w:sz="4" w:space="0" w:color="auto"/>
               <w:right w:val="single" w:sz="4" w:space="0" w:color="auto"/>
             </w:tcBorders>
-            <w:shd w:val="clear" w:color="auto" w:fill="auto"/>
             <w:noWrap/>
             <w:vAlign w:val="bottom"/>
             <w:hideMark/>
@@ -8929,7 +8849,6 @@
               <w:bottom w:val="nil"/>
               <w:right w:val="nil"/>
             </w:tcBorders>
-            <w:shd w:val="clear" w:color="auto" w:fill="auto"/>
             <w:noWrap/>
             <w:vAlign w:val="bottom"/>
             <w:hideMark/>
@@ -8955,7 +8874,6 @@
               <w:bottom w:val="nil"/>
               <w:right w:val="nil"/>
             </w:tcBorders>
-            <w:shd w:val="clear" w:color="auto" w:fill="auto"/>
             <w:noWrap/>
             <w:vAlign w:val="bottom"/>
             <w:hideMark/>
@@ -8988,7 +8906,6 @@
               <w:bottom w:val="single" w:sz="4" w:space="0" w:color="auto"/>
               <w:right w:val="single" w:sz="4" w:space="0" w:color="auto"/>
             </w:tcBorders>
-            <w:shd w:val="clear" w:color="auto" w:fill="auto"/>
             <w:noWrap/>
             <w:vAlign w:val="bottom"/>
             <w:hideMark/>
@@ -9033,7 +8950,6 @@
               <w:bottom w:val="single" w:sz="4" w:space="0" w:color="auto"/>
               <w:right w:val="single" w:sz="4" w:space="0" w:color="auto"/>
             </w:tcBorders>
-            <w:shd w:val="clear" w:color="auto" w:fill="auto"/>
             <w:noWrap/>
             <w:vAlign w:val="bottom"/>
             <w:hideMark/>
@@ -9068,7 +8984,6 @@
               <w:bottom w:val="single" w:sz="4" w:space="0" w:color="auto"/>
               <w:right w:val="single" w:sz="4" w:space="0" w:color="auto"/>
             </w:tcBorders>
-            <w:shd w:val="clear" w:color="auto" w:fill="auto"/>
             <w:noWrap/>
             <w:vAlign w:val="bottom"/>
             <w:hideMark/>
@@ -9119,7 +9034,6 @@
               <w:bottom w:val="single" w:sz="4" w:space="0" w:color="auto"/>
               <w:right w:val="single" w:sz="4" w:space="0" w:color="auto"/>
             </w:tcBorders>
-            <w:shd w:val="clear" w:color="auto" w:fill="auto"/>
             <w:noWrap/>
             <w:vAlign w:val="bottom"/>
             <w:hideMark/>
@@ -9154,7 +9068,6 @@
               <w:bottom w:val="single" w:sz="4" w:space="0" w:color="auto"/>
               <w:right w:val="single" w:sz="4" w:space="0" w:color="auto"/>
             </w:tcBorders>
-            <w:shd w:val="clear" w:color="auto" w:fill="auto"/>
             <w:noWrap/>
             <w:vAlign w:val="bottom"/>
             <w:hideMark/>
@@ -9194,7 +9107,6 @@
               <w:bottom w:val="nil"/>
               <w:right w:val="nil"/>
             </w:tcBorders>
-            <w:shd w:val="clear" w:color="auto" w:fill="auto"/>
             <w:noWrap/>
             <w:vAlign w:val="bottom"/>
             <w:hideMark/>
@@ -9286,7 +9198,6 @@
               <w:bottom w:val="nil"/>
               <w:right w:val="nil"/>
             </w:tcBorders>
-            <w:shd w:val="clear" w:color="auto" w:fill="auto"/>
             <w:noWrap/>
             <w:vAlign w:val="bottom"/>
             <w:hideMark/>
@@ -9415,7 +9326,6 @@
               <w:bottom w:val="single" w:sz="4" w:space="0" w:color="auto"/>
               <w:right w:val="single" w:sz="4" w:space="0" w:color="auto"/>
             </w:tcBorders>
-            <w:shd w:val="clear" w:color="auto" w:fill="auto"/>
             <w:noWrap/>
             <w:vAlign w:val="bottom"/>
             <w:hideMark/>
@@ -9472,7 +9382,6 @@
               <w:bottom w:val="single" w:sz="4" w:space="0" w:color="auto"/>
               <w:right w:val="single" w:sz="4" w:space="0" w:color="auto"/>
             </w:tcBorders>
-            <w:shd w:val="clear" w:color="auto" w:fill="auto"/>
             <w:noWrap/>
             <w:vAlign w:val="bottom"/>
             <w:hideMark/>
@@ -9507,7 +9416,6 @@
               <w:bottom w:val="single" w:sz="4" w:space="0" w:color="auto"/>
               <w:right w:val="single" w:sz="4" w:space="0" w:color="auto"/>
             </w:tcBorders>
-            <w:shd w:val="clear" w:color="auto" w:fill="auto"/>
             <w:noWrap/>
             <w:vAlign w:val="bottom"/>
             <w:hideMark/>
@@ -9547,7 +9455,6 @@
               <w:bottom w:val="single" w:sz="4" w:space="0" w:color="auto"/>
               <w:right w:val="single" w:sz="4" w:space="0" w:color="auto"/>
             </w:tcBorders>
-            <w:shd w:val="clear" w:color="auto" w:fill="auto"/>
             <w:noWrap/>
             <w:vAlign w:val="bottom"/>
             <w:hideMark/>
@@ -9582,7 +9489,6 @@
               <w:bottom w:val="single" w:sz="4" w:space="0" w:color="auto"/>
               <w:right w:val="single" w:sz="4" w:space="0" w:color="auto"/>
             </w:tcBorders>
-            <w:shd w:val="clear" w:color="auto" w:fill="auto"/>
             <w:noWrap/>
             <w:vAlign w:val="bottom"/>
             <w:hideMark/>
@@ -9622,7 +9528,6 @@
               <w:bottom w:val="single" w:sz="4" w:space="0" w:color="auto"/>
               <w:right w:val="single" w:sz="4" w:space="0" w:color="auto"/>
             </w:tcBorders>
-            <w:shd w:val="clear" w:color="auto" w:fill="auto"/>
             <w:noWrap/>
             <w:vAlign w:val="bottom"/>
             <w:hideMark/>
@@ -9657,7 +9562,6 @@
               <w:bottom w:val="single" w:sz="4" w:space="0" w:color="auto"/>
               <w:right w:val="single" w:sz="4" w:space="0" w:color="auto"/>
             </w:tcBorders>
-            <w:shd w:val="clear" w:color="auto" w:fill="auto"/>
             <w:noWrap/>
             <w:vAlign w:val="bottom"/>
             <w:hideMark/>
@@ -9708,7 +9612,6 @@
               <w:bottom w:val="single" w:sz="4" w:space="0" w:color="auto"/>
               <w:right w:val="single" w:sz="4" w:space="0" w:color="auto"/>
             </w:tcBorders>
-            <w:shd w:val="clear" w:color="auto" w:fill="auto"/>
             <w:noWrap/>
             <w:vAlign w:val="bottom"/>
             <w:hideMark/>
@@ -9743,7 +9646,6 @@
               <w:bottom w:val="single" w:sz="4" w:space="0" w:color="auto"/>
               <w:right w:val="single" w:sz="4" w:space="0" w:color="auto"/>
             </w:tcBorders>
-            <w:shd w:val="clear" w:color="auto" w:fill="auto"/>
             <w:noWrap/>
             <w:vAlign w:val="bottom"/>
             <w:hideMark/>
@@ -9783,7 +9685,6 @@
               <w:bottom w:val="single" w:sz="4" w:space="0" w:color="auto"/>
               <w:right w:val="single" w:sz="4" w:space="0" w:color="auto"/>
             </w:tcBorders>
-            <w:shd w:val="clear" w:color="auto" w:fill="auto"/>
             <w:noWrap/>
             <w:vAlign w:val="bottom"/>
             <w:hideMark/>
@@ -9818,7 +9719,6 @@
               <w:bottom w:val="single" w:sz="4" w:space="0" w:color="auto"/>
               <w:right w:val="single" w:sz="4" w:space="0" w:color="auto"/>
             </w:tcBorders>
-            <w:shd w:val="clear" w:color="auto" w:fill="auto"/>
             <w:noWrap/>
             <w:vAlign w:val="bottom"/>
             <w:hideMark/>
@@ -9858,7 +9758,6 @@
               <w:bottom w:val="single" w:sz="4" w:space="0" w:color="auto"/>
               <w:right w:val="single" w:sz="4" w:space="0" w:color="auto"/>
             </w:tcBorders>
-            <w:shd w:val="clear" w:color="auto" w:fill="auto"/>
             <w:noWrap/>
             <w:vAlign w:val="bottom"/>
             <w:hideMark/>
@@ -9893,7 +9792,6 @@
               <w:bottom w:val="single" w:sz="4" w:space="0" w:color="auto"/>
               <w:right w:val="single" w:sz="4" w:space="0" w:color="auto"/>
             </w:tcBorders>
-            <w:shd w:val="clear" w:color="auto" w:fill="auto"/>
             <w:noWrap/>
             <w:vAlign w:val="bottom"/>
             <w:hideMark/>
@@ -9933,7 +9831,6 @@
               <w:bottom w:val="single" w:sz="4" w:space="0" w:color="auto"/>
               <w:right w:val="single" w:sz="4" w:space="0" w:color="auto"/>
             </w:tcBorders>
-            <w:shd w:val="clear" w:color="auto" w:fill="auto"/>
             <w:noWrap/>
             <w:vAlign w:val="bottom"/>
             <w:hideMark/>
@@ -9968,7 +9865,6 @@
               <w:bottom w:val="single" w:sz="4" w:space="0" w:color="auto"/>
               <w:right w:val="single" w:sz="4" w:space="0" w:color="auto"/>
             </w:tcBorders>
-            <w:shd w:val="clear" w:color="auto" w:fill="auto"/>
             <w:noWrap/>
             <w:vAlign w:val="bottom"/>
             <w:hideMark/>
@@ -10008,7 +9904,6 @@
               <w:bottom w:val="nil"/>
               <w:right w:val="nil"/>
             </w:tcBorders>
-            <w:shd w:val="clear" w:color="auto" w:fill="auto"/>
             <w:noWrap/>
             <w:vAlign w:val="bottom"/>
             <w:hideMark/>
@@ -10039,7 +9934,6 @@
               <w:bottom w:val="nil"/>
               <w:right w:val="nil"/>
             </w:tcBorders>
-            <w:shd w:val="clear" w:color="auto" w:fill="auto"/>
             <w:noWrap/>
             <w:vAlign w:val="bottom"/>
             <w:hideMark/>
@@ -10071,7 +9965,6 @@
               <w:bottom w:val="nil"/>
               <w:right w:val="nil"/>
             </w:tcBorders>
-            <w:shd w:val="clear" w:color="auto" w:fill="auto"/>
             <w:noWrap/>
             <w:vAlign w:val="bottom"/>
             <w:hideMark/>
@@ -10098,7 +9991,6 @@
               <w:bottom w:val="nil"/>
               <w:right w:val="nil"/>
             </w:tcBorders>
-            <w:shd w:val="clear" w:color="auto" w:fill="auto"/>
             <w:noWrap/>
             <w:vAlign w:val="bottom"/>
             <w:hideMark/>
@@ -10131,7 +10023,6 @@
               <w:bottom w:val="single" w:sz="4" w:space="0" w:color="auto"/>
               <w:right w:val="single" w:sz="4" w:space="0" w:color="auto"/>
             </w:tcBorders>
-            <w:shd w:val="clear" w:color="auto" w:fill="auto"/>
             <w:noWrap/>
             <w:vAlign w:val="bottom"/>
             <w:hideMark/>
@@ -10177,7 +10068,6 @@
               <w:bottom w:val="single" w:sz="4" w:space="0" w:color="auto"/>
               <w:right w:val="single" w:sz="4" w:space="0" w:color="auto"/>
             </w:tcBorders>
-            <w:shd w:val="clear" w:color="auto" w:fill="auto"/>
             <w:noWrap/>
             <w:vAlign w:val="bottom"/>
             <w:hideMark/>
@@ -10212,7 +10102,6 @@
               <w:bottom w:val="single" w:sz="4" w:space="0" w:color="auto"/>
               <w:right w:val="single" w:sz="4" w:space="0" w:color="auto"/>
             </w:tcBorders>
-            <w:shd w:val="clear" w:color="auto" w:fill="auto"/>
             <w:noWrap/>
             <w:vAlign w:val="bottom"/>
             <w:hideMark/>
@@ -10270,7 +10159,6 @@
               <w:bottom w:val="single" w:sz="4" w:space="0" w:color="auto"/>
               <w:right w:val="single" w:sz="4" w:space="0" w:color="auto"/>
             </w:tcBorders>
-            <w:shd w:val="clear" w:color="auto" w:fill="auto"/>
             <w:noWrap/>
             <w:vAlign w:val="bottom"/>
             <w:hideMark/>
@@ -10305,7 +10193,6 @@
               <w:bottom w:val="single" w:sz="4" w:space="0" w:color="auto"/>
               <w:right w:val="single" w:sz="4" w:space="0" w:color="auto"/>
             </w:tcBorders>
-            <w:shd w:val="clear" w:color="auto" w:fill="auto"/>
             <w:noWrap/>
             <w:vAlign w:val="bottom"/>
             <w:hideMark/>
@@ -10345,7 +10232,6 @@
               <w:bottom w:val="single" w:sz="4" w:space="0" w:color="auto"/>
               <w:right w:val="single" w:sz="4" w:space="0" w:color="auto"/>
             </w:tcBorders>
-            <w:shd w:val="clear" w:color="auto" w:fill="auto"/>
             <w:noWrap/>
             <w:vAlign w:val="bottom"/>
             <w:hideMark/>
@@ -10380,7 +10266,6 @@
               <w:bottom w:val="single" w:sz="4" w:space="0" w:color="auto"/>
               <w:right w:val="single" w:sz="4" w:space="0" w:color="auto"/>
             </w:tcBorders>
-            <w:shd w:val="clear" w:color="auto" w:fill="auto"/>
             <w:noWrap/>
             <w:vAlign w:val="bottom"/>
             <w:hideMark/>
@@ -10429,7 +10314,6 @@
               <w:bottom w:val="single" w:sz="4" w:space="0" w:color="auto"/>
               <w:right w:val="single" w:sz="4" w:space="0" w:color="auto"/>
             </w:tcBorders>
-            <w:shd w:val="clear" w:color="auto" w:fill="auto"/>
             <w:noWrap/>
             <w:vAlign w:val="bottom"/>
             <w:hideMark/>
@@ -10464,7 +10348,6 @@
               <w:bottom w:val="single" w:sz="4" w:space="0" w:color="auto"/>
               <w:right w:val="single" w:sz="4" w:space="0" w:color="auto"/>
             </w:tcBorders>
-            <w:shd w:val="clear" w:color="auto" w:fill="auto"/>
             <w:noWrap/>
             <w:vAlign w:val="bottom"/>
             <w:hideMark/>
@@ -10558,7 +10441,6 @@
               <w:bottom w:val="single" w:sz="4" w:space="0" w:color="auto"/>
               <w:right w:val="single" w:sz="4" w:space="0" w:color="auto"/>
             </w:tcBorders>
-            <w:shd w:val="clear" w:color="auto" w:fill="auto"/>
             <w:noWrap/>
             <w:vAlign w:val="bottom"/>
             <w:hideMark/>
@@ -10593,7 +10475,6 @@
               <w:bottom w:val="single" w:sz="4" w:space="0" w:color="auto"/>
               <w:right w:val="single" w:sz="4" w:space="0" w:color="auto"/>
             </w:tcBorders>
-            <w:shd w:val="clear" w:color="auto" w:fill="auto"/>
             <w:noWrap/>
             <w:vAlign w:val="bottom"/>
             <w:hideMark/>
@@ -10642,7 +10523,6 @@
               <w:bottom w:val="single" w:sz="4" w:space="0" w:color="auto"/>
               <w:right w:val="single" w:sz="4" w:space="0" w:color="auto"/>
             </w:tcBorders>
-            <w:shd w:val="clear" w:color="auto" w:fill="auto"/>
             <w:noWrap/>
             <w:vAlign w:val="bottom"/>
             <w:hideMark/>
@@ -10677,7 +10557,6 @@
               <w:bottom w:val="single" w:sz="4" w:space="0" w:color="auto"/>
               <w:right w:val="single" w:sz="4" w:space="0" w:color="auto"/>
             </w:tcBorders>
-            <w:shd w:val="clear" w:color="auto" w:fill="auto"/>
             <w:noWrap/>
             <w:vAlign w:val="bottom"/>
             <w:hideMark/>
@@ -10726,7 +10605,6 @@
               <w:bottom w:val="single" w:sz="4" w:space="0" w:color="auto"/>
               <w:right w:val="single" w:sz="4" w:space="0" w:color="auto"/>
             </w:tcBorders>
-            <w:shd w:val="clear" w:color="auto" w:fill="auto"/>
             <w:noWrap/>
             <w:vAlign w:val="bottom"/>
             <w:hideMark/>
@@ -10761,7 +10639,6 @@
               <w:bottom w:val="single" w:sz="4" w:space="0" w:color="auto"/>
               <w:right w:val="single" w:sz="4" w:space="0" w:color="auto"/>
             </w:tcBorders>
-            <w:shd w:val="clear" w:color="auto" w:fill="auto"/>
             <w:noWrap/>
             <w:vAlign w:val="bottom"/>
             <w:hideMark/>
@@ -10819,7 +10696,6 @@
               <w:bottom w:val="single" w:sz="4" w:space="0" w:color="auto"/>
               <w:right w:val="single" w:sz="4" w:space="0" w:color="auto"/>
             </w:tcBorders>
-            <w:shd w:val="clear" w:color="auto" w:fill="auto"/>
             <w:noWrap/>
             <w:vAlign w:val="bottom"/>
             <w:hideMark/>
@@ -10854,7 +10730,6 @@
               <w:bottom w:val="single" w:sz="4" w:space="0" w:color="auto"/>
               <w:right w:val="single" w:sz="4" w:space="0" w:color="auto"/>
             </w:tcBorders>
-            <w:shd w:val="clear" w:color="auto" w:fill="auto"/>
             <w:noWrap/>
             <w:vAlign w:val="bottom"/>
             <w:hideMark/>
@@ -10912,7 +10787,6 @@
               <w:bottom w:val="single" w:sz="4" w:space="0" w:color="auto"/>
               <w:right w:val="single" w:sz="4" w:space="0" w:color="auto"/>
             </w:tcBorders>
-            <w:shd w:val="clear" w:color="auto" w:fill="auto"/>
             <w:noWrap/>
             <w:vAlign w:val="bottom"/>
             <w:hideMark/>
@@ -10947,7 +10821,6 @@
               <w:bottom w:val="single" w:sz="4" w:space="0" w:color="auto"/>
               <w:right w:val="single" w:sz="4" w:space="0" w:color="auto"/>
             </w:tcBorders>
-            <w:shd w:val="clear" w:color="auto" w:fill="auto"/>
             <w:noWrap/>
             <w:vAlign w:val="bottom"/>
             <w:hideMark/>
@@ -10988,6 +10861,77 @@
                 <w14:ligatures w14:val="none"/>
               </w:rPr>
               <w:t>Steering</w:t>
+            </w:r>
+          </w:p>
+        </w:tc>
+      </w:tr>
+      <w:tr>
+        <w:trPr>
+          <w:trHeight w:val="300"/>
+        </w:trPr>
+        <w:tc>
+          <w:tcPr>
+            <w:tcW w:w="1845" w:type="pct"/>
+            <w:tcBorders>
+              <w:top w:val="nil"/>
+              <w:left w:val="single" w:sz="4" w:space="0" w:color="auto"/>
+              <w:bottom w:val="single" w:sz="4" w:space="0" w:color="auto"/>
+              <w:right w:val="single" w:sz="4" w:space="0" w:color="auto"/>
+            </w:tcBorders>
+            <w:noWrap/>
+            <w:vAlign w:val="bottom"/>
+          </w:tcPr>
+          <w:p>
+            <w:pPr>
+              <w:spacing w:after="0" w:line="240" w:lineRule="auto"/>
+              <w:rPr>
+                <w:rFonts w:eastAsia="Times New Roman" w:cs="Times New Roman"/>
+                <w:color w:val="000000"/>
+                <w:kern w:val="0"/>
+                <w14:ligatures w14:val="none"/>
+              </w:rPr>
+            </w:pPr>
+            <w:r>
+              <w:rPr>
+                <w:rFonts w:eastAsia="Times New Roman" w:cs="Times New Roman"/>
+                <w:color w:val="000000"/>
+                <w:kern w:val="0"/>
+                <w14:ligatures w14:val="none"/>
+              </w:rPr>
+              <w:t>K</w:t>
+            </w:r>
+          </w:p>
+        </w:tc>
+        <w:tc>
+          <w:tcPr>
+            <w:tcW w:w="3155" w:type="pct"/>
+            <w:tcBorders>
+              <w:top w:val="nil"/>
+              <w:left w:val="nil"/>
+              <w:bottom w:val="single" w:sz="4" w:space="0" w:color="auto"/>
+              <w:right w:val="single" w:sz="4" w:space="0" w:color="auto"/>
+            </w:tcBorders>
+            <w:noWrap/>
+            <w:vAlign w:val="bottom"/>
+          </w:tcPr>
+          <w:p>
+            <w:pPr>
+              <w:spacing w:after="0" w:line="240" w:lineRule="auto"/>
+              <w:rPr>
+                <w:rFonts w:eastAsia="Times New Roman" w:cs="Times New Roman"/>
+                <w:color w:val="000000"/>
+                <w:kern w:val="0"/>
+                <w14:ligatures w14:val="none"/>
+              </w:rPr>
+            </w:pPr>
+            <w:r>
+              <w:rPr>
+                <w:rFonts w:eastAsia="Times New Roman" w:cs="Times New Roman"/>
+                <w:color w:val="000000"/>
+                <w:kern w:val="0"/>
+                <w14:ligatures w14:val="none"/>
+              </w:rPr>
+              <w:t>Deploy EASEP/ALSEP Item</w:t>
             </w:r>
           </w:p>
         </w:tc>
@@ -11006,7 +10950,6 @@
               <w:bottom w:val="nil"/>
               <w:right w:val="nil"/>
             </w:tcBorders>
-            <w:shd w:val="clear" w:color="auto" w:fill="auto"/>
             <w:noWrap/>
             <w:vAlign w:val="bottom"/>
             <w:hideMark/>
@@ -11047,7 +10990,6 @@
               <w:bottom w:val="nil"/>
               <w:right w:val="nil"/>
             </w:tcBorders>
-            <w:shd w:val="clear" w:color="auto" w:fill="auto"/>
             <w:noWrap/>
             <w:vAlign w:val="bottom"/>
             <w:hideMark/>
@@ -11080,7 +11022,6 @@
               <w:bottom w:val="single" w:sz="4" w:space="0" w:color="auto"/>
               <w:right w:val="single" w:sz="4" w:space="0" w:color="auto"/>
             </w:tcBorders>
-            <w:shd w:val="clear" w:color="auto" w:fill="auto"/>
             <w:noWrap/>
             <w:vAlign w:val="bottom"/>
             <w:hideMark/>
@@ -11107,7 +11048,18 @@
                 <w:kern w:val="0"/>
                 <w14:ligatures w14:val="none"/>
               </w:rPr>
-              <w:t>EASEP/ALSEP</w:t>
+              <w:t>EASEP</w:t>
+            </w:r>
+            <w:r>
+              <w:rPr>
+                <w:rFonts w:eastAsia="Times New Roman" w:cs="Times New Roman"/>
+                <w:b/>
+                <w:bCs/>
+                <w:color w:val="000000"/>
+                <w:kern w:val="0"/>
+                <w14:ligatures w14:val="none"/>
+              </w:rPr>
+              <w:t xml:space="preserve"> Order</w:t>
             </w:r>
           </w:p>
         </w:tc>
@@ -11125,29 +11077,28 @@
               <w:bottom w:val="single" w:sz="4" w:space="0" w:color="auto"/>
               <w:right w:val="single" w:sz="4" w:space="0" w:color="auto"/>
             </w:tcBorders>
-            <w:shd w:val="clear" w:color="auto" w:fill="auto"/>
-            <w:noWrap/>
-            <w:vAlign w:val="bottom"/>
-            <w:hideMark/>
-          </w:tcPr>
-          <w:p>
-            <w:pPr>
-              <w:spacing w:after="0" w:line="240" w:lineRule="auto"/>
-              <w:rPr>
-                <w:rFonts w:eastAsia="Times New Roman" w:cs="Times New Roman"/>
-                <w:color w:val="000000"/>
-                <w:kern w:val="0"/>
-                <w14:ligatures w14:val="none"/>
-              </w:rPr>
-            </w:pPr>
-            <w:r>
-              <w:rPr>
-                <w:rFonts w:eastAsia="Times New Roman" w:cs="Times New Roman"/>
-                <w:color w:val="000000"/>
-                <w:kern w:val="0"/>
-                <w14:ligatures w14:val="none"/>
-              </w:rPr>
-              <w:t>K</w:t>
+            <w:noWrap/>
+            <w:vAlign w:val="bottom"/>
+            <w:hideMark/>
+          </w:tcPr>
+          <w:p>
+            <w:pPr>
+              <w:spacing w:after="0" w:line="240" w:lineRule="auto"/>
+              <w:rPr>
+                <w:rFonts w:eastAsia="Times New Roman" w:cs="Times New Roman"/>
+                <w:color w:val="000000"/>
+                <w:kern w:val="0"/>
+                <w14:ligatures w14:val="none"/>
+              </w:rPr>
+            </w:pPr>
+            <w:r>
+              <w:rPr>
+                <w:rFonts w:eastAsia="Times New Roman" w:cs="Times New Roman"/>
+                <w:color w:val="000000"/>
+                <w:kern w:val="0"/>
+                <w14:ligatures w14:val="none"/>
+              </w:rPr>
+              <w:t>CDR</w:t>
             </w:r>
           </w:p>
         </w:tc>
@@ -11160,40 +11111,527 @@
               <w:bottom w:val="single" w:sz="4" w:space="0" w:color="auto"/>
               <w:right w:val="single" w:sz="4" w:space="0" w:color="auto"/>
             </w:tcBorders>
-            <w:shd w:val="clear" w:color="auto" w:fill="auto"/>
-            <w:noWrap/>
-            <w:vAlign w:val="bottom"/>
-            <w:hideMark/>
-          </w:tcPr>
-          <w:p>
-            <w:pPr>
-              <w:spacing w:after="0" w:line="240" w:lineRule="auto"/>
-              <w:rPr>
-                <w:rFonts w:eastAsia="Times New Roman" w:cs="Times New Roman"/>
-                <w:color w:val="000000"/>
-                <w:kern w:val="0"/>
-                <w14:ligatures w14:val="none"/>
-              </w:rPr>
-            </w:pPr>
-            <w:r>
-              <w:rPr>
-                <w:rFonts w:eastAsia="Times New Roman" w:cs="Times New Roman"/>
-                <w:color w:val="000000"/>
-                <w:kern w:val="0"/>
-                <w14:ligatures w14:val="none"/>
-              </w:rPr>
-              <w:t>Deploy Next Item</w:t>
+            <w:noWrap/>
+            <w:vAlign w:val="bottom"/>
+            <w:hideMark/>
+          </w:tcPr>
+          <w:p>
+            <w:pPr>
+              <w:spacing w:after="0" w:line="240" w:lineRule="auto"/>
+              <w:rPr>
+                <w:rFonts w:eastAsia="Times New Roman" w:cs="Times New Roman"/>
+                <w:color w:val="000000"/>
+                <w:kern w:val="0"/>
+                <w14:ligatures w14:val="none"/>
+              </w:rPr>
+            </w:pPr>
+            <w:r>
+              <w:rPr>
+                <w:rFonts w:eastAsia="Times New Roman" w:cs="Times New Roman"/>
+                <w:color w:val="000000"/>
+                <w:kern w:val="0"/>
+                <w14:ligatures w14:val="none"/>
+              </w:rPr>
+              <w:t>Camera</w:t>
+            </w:r>
+            <w:r>
+              <w:rPr>
+                <w:rFonts w:eastAsia="Times New Roman" w:cs="Times New Roman"/>
+                <w:color w:val="000000"/>
+                <w:kern w:val="0"/>
+                <w14:ligatures w14:val="none"/>
+              </w:rPr>
+              <w:t xml:space="preserve"> -&gt; Erectable </w:t>
+            </w:r>
+            <w:r>
+              <w:rPr>
+                <w:rFonts w:eastAsia="Times New Roman" w:cs="Times New Roman"/>
+                <w:color w:val="000000"/>
+                <w:kern w:val="0"/>
+                <w14:ligatures w14:val="none"/>
+              </w:rPr>
+              <w:t>S</w:t>
+            </w:r>
+            <w:r>
+              <w:rPr>
+                <w:rFonts w:eastAsia="Times New Roman" w:cs="Times New Roman"/>
+                <w:color w:val="000000"/>
+                <w:kern w:val="0"/>
+                <w14:ligatures w14:val="none"/>
+              </w:rPr>
+              <w:t>-B</w:t>
+            </w:r>
+            <w:r>
+              <w:rPr>
+                <w:rFonts w:eastAsia="Times New Roman" w:cs="Times New Roman"/>
+                <w:color w:val="000000"/>
+                <w:kern w:val="0"/>
+                <w14:ligatures w14:val="none"/>
+              </w:rPr>
+              <w:t>and</w:t>
+            </w:r>
+          </w:p>
+        </w:tc>
+      </w:tr>
+      <w:tr>
+        <w:trPr>
+          <w:trHeight w:val="300"/>
+        </w:trPr>
+        <w:tc>
+          <w:tcPr>
+            <w:tcW w:w="1845" w:type="pct"/>
+            <w:tcBorders>
+              <w:top w:val="single" w:sz="4" w:space="0" w:color="auto"/>
+              <w:left w:val="single" w:sz="4" w:space="0" w:color="auto"/>
+              <w:bottom w:val="single" w:sz="4" w:space="0" w:color="auto"/>
+              <w:right w:val="single" w:sz="4" w:space="0" w:color="auto"/>
+            </w:tcBorders>
+            <w:noWrap/>
+            <w:vAlign w:val="bottom"/>
+          </w:tcPr>
+          <w:p>
+            <w:pPr>
+              <w:spacing w:after="0" w:line="240" w:lineRule="auto"/>
+              <w:rPr>
+                <w:rFonts w:eastAsia="Times New Roman" w:cs="Times New Roman"/>
+                <w:color w:val="000000"/>
+                <w:kern w:val="0"/>
+                <w14:ligatures w14:val="none"/>
+              </w:rPr>
+            </w:pPr>
+            <w:r>
+              <w:rPr>
+                <w:rFonts w:eastAsia="Times New Roman" w:cs="Times New Roman"/>
+                <w:color w:val="000000"/>
+                <w:kern w:val="0"/>
+                <w14:ligatures w14:val="none"/>
+              </w:rPr>
+              <w:t>LMP</w:t>
+            </w:r>
+          </w:p>
+        </w:tc>
+        <w:tc>
+          <w:tcPr>
+            <w:tcW w:w="3155" w:type="pct"/>
+            <w:tcBorders>
+              <w:top w:val="single" w:sz="4" w:space="0" w:color="auto"/>
+              <w:left w:val="nil"/>
+              <w:bottom w:val="single" w:sz="4" w:space="0" w:color="auto"/>
+              <w:right w:val="single" w:sz="4" w:space="0" w:color="auto"/>
+            </w:tcBorders>
+            <w:noWrap/>
+            <w:vAlign w:val="bottom"/>
+          </w:tcPr>
+          <w:p>
+            <w:pPr>
+              <w:spacing w:after="0" w:line="240" w:lineRule="auto"/>
+              <w:rPr>
+                <w:rFonts w:eastAsia="Times New Roman" w:cs="Times New Roman"/>
+                <w:color w:val="000000"/>
+                <w:kern w:val="0"/>
+                <w14:ligatures w14:val="none"/>
+              </w:rPr>
+            </w:pPr>
+            <w:r>
+              <w:rPr>
+                <w:rFonts w:eastAsia="Times New Roman" w:cs="Times New Roman"/>
+                <w:color w:val="000000"/>
+                <w:kern w:val="0"/>
+                <w14:ligatures w14:val="none"/>
+              </w:rPr>
+              <w:t>SWC</w:t>
+            </w:r>
+            <w:r>
+              <w:rPr>
+                <w:rFonts w:eastAsia="Times New Roman" w:cs="Times New Roman"/>
+                <w:color w:val="000000"/>
+                <w:kern w:val="0"/>
+                <w14:ligatures w14:val="none"/>
+              </w:rPr>
+              <w:t xml:space="preserve"> -&gt; </w:t>
+            </w:r>
+            <w:r>
+              <w:rPr>
+                <w:rFonts w:eastAsia="Times New Roman" w:cs="Times New Roman"/>
+                <w:color w:val="000000"/>
+                <w:kern w:val="0"/>
+                <w14:ligatures w14:val="none"/>
+              </w:rPr>
+              <w:t>PSEP</w:t>
+            </w:r>
+            <w:r>
+              <w:rPr>
+                <w:rFonts w:eastAsia="Times New Roman" w:cs="Times New Roman"/>
+                <w:color w:val="000000"/>
+                <w:kern w:val="0"/>
+                <w14:ligatures w14:val="none"/>
+              </w:rPr>
+              <w:t xml:space="preserve"> -&gt; </w:t>
+            </w:r>
+            <w:r>
+              <w:rPr>
+                <w:rFonts w:eastAsia="Times New Roman" w:cs="Times New Roman"/>
+                <w:color w:val="000000"/>
+                <w:kern w:val="0"/>
+                <w14:ligatures w14:val="none"/>
+              </w:rPr>
+              <w:t>LRRR</w:t>
             </w:r>
           </w:p>
         </w:tc>
       </w:tr>
     </w:tbl>
     <w:p/>
-    <w:p/>
-    <w:p/>
-    <w:p/>
-    <w:p/>
-    <w:p/>
+    <w:tbl>
+      <w:tblPr>
+        <w:tblW w:w="5000" w:type="pct"/>
+        <w:tblBorders>
+          <w:top w:val="single" w:sz="4" w:space="0" w:color="auto"/>
+          <w:left w:val="single" w:sz="4" w:space="0" w:color="auto"/>
+          <w:bottom w:val="single" w:sz="4" w:space="0" w:color="auto"/>
+          <w:right w:val="single" w:sz="4" w:space="0" w:color="auto"/>
+          <w:insideH w:val="single" w:sz="4" w:space="0" w:color="auto"/>
+          <w:insideV w:val="single" w:sz="4" w:space="0" w:color="auto"/>
+        </w:tblBorders>
+        <w:tblLook w:val="04A0" w:firstRow="1" w:lastRow="0" w:firstColumn="1" w:lastColumn="0" w:noHBand="0" w:noVBand="1"/>
+      </w:tblPr>
+      <w:tblGrid>
+        <w:gridCol w:w="3450"/>
+        <w:gridCol w:w="5900"/>
+      </w:tblGrid>
+      <w:tr>
+        <w:trPr>
+          <w:trHeight w:val="300"/>
+        </w:trPr>
+        <w:tc>
+          <w:tcPr>
+            <w:tcW w:w="5000" w:type="pct"/>
+            <w:gridSpan w:val="2"/>
+            <w:noWrap/>
+            <w:vAlign w:val="bottom"/>
+            <w:hideMark/>
+          </w:tcPr>
+          <w:p>
+            <w:pPr>
+              <w:spacing w:after="0" w:line="240" w:lineRule="auto"/>
+              <w:jc w:val="center"/>
+              <w:rPr>
+                <w:rFonts w:eastAsia="Times New Roman" w:cs="Times New Roman"/>
+                <w:b/>
+                <w:bCs/>
+                <w:color w:val="000000"/>
+                <w:kern w:val="0"/>
+                <w14:ligatures w14:val="none"/>
+              </w:rPr>
+            </w:pPr>
+            <w:r>
+              <w:rPr>
+                <w:rFonts w:eastAsia="Times New Roman" w:cs="Times New Roman"/>
+                <w:b/>
+                <w:bCs/>
+                <w:color w:val="000000"/>
+                <w:kern w:val="0"/>
+                <w14:ligatures w14:val="none"/>
+              </w:rPr>
+              <w:t>ALSEP</w:t>
+            </w:r>
+            <w:r>
+              <w:rPr>
+                <w:rFonts w:eastAsia="Times New Roman" w:cs="Times New Roman"/>
+                <w:b/>
+                <w:bCs/>
+                <w:color w:val="000000"/>
+                <w:kern w:val="0"/>
+                <w14:ligatures w14:val="none"/>
+              </w:rPr>
+              <w:t xml:space="preserve"> Order</w:t>
+            </w:r>
+          </w:p>
+        </w:tc>
+      </w:tr>
+      <w:tr>
+        <w:trPr>
+          <w:trHeight w:val="300"/>
+        </w:trPr>
+        <w:tc>
+          <w:tcPr>
+            <w:tcW w:w="1845" w:type="pct"/>
+            <w:noWrap/>
+            <w:vAlign w:val="bottom"/>
+            <w:hideMark/>
+          </w:tcPr>
+          <w:p>
+            <w:pPr>
+              <w:spacing w:after="0" w:line="240" w:lineRule="auto"/>
+              <w:rPr>
+                <w:rFonts w:eastAsia="Times New Roman" w:cs="Times New Roman"/>
+                <w:color w:val="000000"/>
+                <w:kern w:val="0"/>
+                <w14:ligatures w14:val="none"/>
+              </w:rPr>
+            </w:pPr>
+            <w:r>
+              <w:rPr>
+                <w:rFonts w:eastAsia="Times New Roman" w:cs="Times New Roman"/>
+                <w:color w:val="000000"/>
+                <w:kern w:val="0"/>
+                <w14:ligatures w14:val="none"/>
+              </w:rPr>
+              <w:t>CDR</w:t>
+            </w:r>
+          </w:p>
+        </w:tc>
+        <w:tc>
+          <w:tcPr>
+            <w:tcW w:w="3155" w:type="pct"/>
+            <w:noWrap/>
+            <w:vAlign w:val="bottom"/>
+            <w:hideMark/>
+          </w:tcPr>
+          <w:p>
+            <w:pPr>
+              <w:spacing w:after="0" w:line="240" w:lineRule="auto"/>
+              <w:rPr>
+                <w:rFonts w:eastAsia="Times New Roman" w:cs="Times New Roman"/>
+                <w:color w:val="000000"/>
+                <w:kern w:val="0"/>
+                <w14:ligatures w14:val="none"/>
+              </w:rPr>
+            </w:pPr>
+            <w:r>
+              <w:rPr>
+                <w:rFonts w:eastAsia="Times New Roman" w:cs="Times New Roman"/>
+                <w:color w:val="000000"/>
+                <w:kern w:val="0"/>
+                <w14:ligatures w14:val="none"/>
+              </w:rPr>
+              <w:t xml:space="preserve">Erectable </w:t>
+            </w:r>
+            <w:r>
+              <w:rPr>
+                <w:rFonts w:eastAsia="Times New Roman" w:cs="Times New Roman"/>
+                <w:color w:val="000000"/>
+                <w:kern w:val="0"/>
+                <w14:ligatures w14:val="none"/>
+              </w:rPr>
+              <w:t>S</w:t>
+            </w:r>
+            <w:r>
+              <w:rPr>
+                <w:rFonts w:eastAsia="Times New Roman" w:cs="Times New Roman"/>
+                <w:color w:val="000000"/>
+                <w:kern w:val="0"/>
+                <w14:ligatures w14:val="none"/>
+              </w:rPr>
+              <w:t>-B</w:t>
+            </w:r>
+            <w:r>
+              <w:rPr>
+                <w:rFonts w:eastAsia="Times New Roman" w:cs="Times New Roman"/>
+                <w:color w:val="000000"/>
+                <w:kern w:val="0"/>
+                <w14:ligatures w14:val="none"/>
+              </w:rPr>
+              <w:t>and</w:t>
+            </w:r>
+            <w:r>
+              <w:rPr>
+                <w:rFonts w:eastAsia="Times New Roman" w:cs="Times New Roman"/>
+                <w:color w:val="000000"/>
+                <w:kern w:val="0"/>
+                <w14:ligatures w14:val="none"/>
+              </w:rPr>
+              <w:t xml:space="preserve"> -&gt; </w:t>
+            </w:r>
+            <w:r>
+              <w:rPr>
+                <w:rFonts w:eastAsia="Times New Roman" w:cs="Times New Roman"/>
+                <w:color w:val="000000"/>
+                <w:kern w:val="0"/>
+                <w14:ligatures w14:val="none"/>
+              </w:rPr>
+              <w:t>Central Station</w:t>
+            </w:r>
+            <w:r>
+              <w:rPr>
+                <w:rFonts w:eastAsia="Times New Roman" w:cs="Times New Roman"/>
+                <w:color w:val="000000"/>
+                <w:kern w:val="0"/>
+                <w14:ligatures w14:val="none"/>
+              </w:rPr>
+              <w:t xml:space="preserve"> -&gt; </w:t>
+            </w:r>
+            <w:r>
+              <w:rPr>
+                <w:rFonts w:eastAsia="Times New Roman" w:cs="Times New Roman"/>
+                <w:color w:val="000000"/>
+                <w:kern w:val="0"/>
+                <w14:ligatures w14:val="none"/>
+              </w:rPr>
+              <w:t>SWS</w:t>
+            </w:r>
+          </w:p>
+        </w:tc>
+      </w:tr>
+      <w:tr>
+        <w:trPr>
+          <w:trHeight w:val="300"/>
+        </w:trPr>
+        <w:tc>
+          <w:tcPr>
+            <w:tcW w:w="1845" w:type="pct"/>
+            <w:noWrap/>
+            <w:vAlign w:val="bottom"/>
+          </w:tcPr>
+          <w:p>
+            <w:pPr>
+              <w:spacing w:after="0" w:line="240" w:lineRule="auto"/>
+              <w:rPr>
+                <w:rFonts w:eastAsia="Times New Roman" w:cs="Times New Roman"/>
+                <w:color w:val="000000"/>
+                <w:kern w:val="0"/>
+                <w14:ligatures w14:val="none"/>
+              </w:rPr>
+            </w:pPr>
+            <w:r>
+              <w:rPr>
+                <w:rFonts w:eastAsia="Times New Roman" w:cs="Times New Roman"/>
+                <w:color w:val="000000"/>
+                <w:kern w:val="0"/>
+                <w14:ligatures w14:val="none"/>
+              </w:rPr>
+              <w:t>LMP</w:t>
+            </w:r>
+          </w:p>
+        </w:tc>
+        <w:tc>
+          <w:tcPr>
+            <w:tcW w:w="3155" w:type="pct"/>
+            <w:noWrap/>
+            <w:vAlign w:val="bottom"/>
+          </w:tcPr>
+          <w:p>
+            <w:pPr>
+              <w:spacing w:after="0" w:line="240" w:lineRule="auto"/>
+              <w:rPr>
+                <w:rFonts w:eastAsia="Times New Roman" w:cs="Times New Roman"/>
+                <w:color w:val="000000"/>
+                <w:kern w:val="0"/>
+                <w14:ligatures w14:val="none"/>
+              </w:rPr>
+            </w:pPr>
+            <w:r>
+              <w:rPr>
+                <w:rFonts w:eastAsia="Times New Roman" w:cs="Times New Roman"/>
+                <w:color w:val="000000"/>
+                <w:kern w:val="0"/>
+                <w14:ligatures w14:val="none"/>
+              </w:rPr>
+              <w:t>T</w:t>
+            </w:r>
+            <w:r>
+              <w:rPr>
+                <w:rFonts w:eastAsia="Times New Roman" w:cs="Times New Roman"/>
+                <w:color w:val="000000"/>
+                <w:kern w:val="0"/>
+                <w14:ligatures w14:val="none"/>
+              </w:rPr>
+              <w:t>V</w:t>
+            </w:r>
+            <w:r>
+              <w:rPr>
+                <w:rFonts w:eastAsia="Times New Roman" w:cs="Times New Roman"/>
+                <w:color w:val="000000"/>
+                <w:kern w:val="0"/>
+                <w14:ligatures w14:val="none"/>
+              </w:rPr>
+              <w:t xml:space="preserve"> -&gt; </w:t>
+            </w:r>
+            <w:r>
+              <w:rPr>
+                <w:rFonts w:eastAsia="Times New Roman" w:cs="Times New Roman"/>
+                <w:color w:val="000000"/>
+                <w:kern w:val="0"/>
+                <w14:ligatures w14:val="none"/>
+              </w:rPr>
+              <w:t>SWC</w:t>
+            </w:r>
+            <w:r>
+              <w:rPr>
+                <w:rFonts w:eastAsia="Times New Roman" w:cs="Times New Roman"/>
+                <w:color w:val="000000"/>
+                <w:kern w:val="0"/>
+                <w14:ligatures w14:val="none"/>
+              </w:rPr>
+              <w:t xml:space="preserve"> -&gt;</w:t>
+            </w:r>
+            <w:r>
+              <w:rPr>
+                <w:rFonts w:eastAsia="Times New Roman" w:cs="Times New Roman"/>
+                <w:color w:val="000000"/>
+                <w:kern w:val="0"/>
+                <w14:ligatures w14:val="none"/>
+              </w:rPr>
+              <w:t xml:space="preserve"> RTG</w:t>
+            </w:r>
+            <w:r>
+              <w:rPr>
+                <w:rFonts w:eastAsia="Times New Roman" w:cs="Times New Roman"/>
+                <w:color w:val="000000"/>
+                <w:kern w:val="0"/>
+                <w14:ligatures w14:val="none"/>
+              </w:rPr>
+              <w:t xml:space="preserve"> -&gt;</w:t>
+            </w:r>
+            <w:r>
+              <w:rPr>
+                <w:rFonts w:eastAsia="Times New Roman" w:cs="Times New Roman"/>
+                <w:color w:val="000000"/>
+                <w:kern w:val="0"/>
+                <w14:ligatures w14:val="none"/>
+              </w:rPr>
+              <w:t xml:space="preserve"> PSE</w:t>
+            </w:r>
+            <w:r>
+              <w:rPr>
+                <w:rFonts w:eastAsia="Times New Roman" w:cs="Times New Roman"/>
+                <w:color w:val="000000"/>
+                <w:kern w:val="0"/>
+                <w14:ligatures w14:val="none"/>
+              </w:rPr>
+              <w:t xml:space="preserve"> -&gt;</w:t>
+            </w:r>
+            <w:r>
+              <w:rPr>
+                <w:rFonts w:eastAsia="Times New Roman" w:cs="Times New Roman"/>
+                <w:color w:val="000000"/>
+                <w:kern w:val="0"/>
+                <w14:ligatures w14:val="none"/>
+              </w:rPr>
+              <w:t xml:space="preserve"> LSM</w:t>
+            </w:r>
+            <w:r>
+              <w:rPr>
+                <w:rFonts w:eastAsia="Times New Roman" w:cs="Times New Roman"/>
+                <w:color w:val="000000"/>
+                <w:kern w:val="0"/>
+                <w14:ligatures w14:val="none"/>
+              </w:rPr>
+              <w:t xml:space="preserve"> -&gt;</w:t>
+            </w:r>
+            <w:r>
+              <w:rPr>
+                <w:rFonts w:eastAsia="Times New Roman" w:cs="Times New Roman"/>
+                <w:color w:val="000000"/>
+                <w:kern w:val="0"/>
+                <w14:ligatures w14:val="none"/>
+              </w:rPr>
+              <w:t xml:space="preserve"> SIDE</w:t>
+            </w:r>
+          </w:p>
+        </w:tc>
+      </w:tr>
+    </w:tbl>
     <w:p/>
     <w:p/>
     <w:p/>
@@ -12352,7 +12790,6 @@
   <w:style w:type="character" w:default="1" w:styleId="DefaultParagraphFont">
     <w:name w:val="Default Paragraph Font"/>
     <w:uiPriority w:val="1"/>
-    <w:semiHidden/>
     <w:unhideWhenUsed/>
   </w:style>
   <w:style w:type="table" w:default="1" w:styleId="TableNormal">

</xml_diff>

<commit_message>
Add NASSP 9 information
</commit_message>
<xml_diff>
--- a/Doc/Project Apollo - NASSP/Programmers Notes/NASSP Quick Start Guide.docx
+++ b/Doc/Project Apollo - NASSP/Programmers Notes/NASSP Quick Start Guide.docx
@@ -34,23 +34,7 @@
           <w:b w:val="0"/>
           <w:bCs w:val="0"/>
         </w:rPr>
-        <w:t>2</w:t>
-      </w:r>
-      <w:r>
-        <w:rPr>
-          <w:rStyle w:val="IntenseReference"/>
-          <w:b w:val="0"/>
-          <w:bCs w:val="0"/>
-        </w:rPr>
-        <w:t>.1</w:t>
-      </w:r>
-      <w:r>
-        <w:rPr>
-          <w:rStyle w:val="IntenseReference"/>
-          <w:b w:val="0"/>
-          <w:bCs w:val="0"/>
-        </w:rPr>
-        <w:t xml:space="preserve"> </w:t>
+        <w:t>3</w:t>
       </w:r>
     </w:p>
     <w:p>
@@ -68,7 +52,7 @@
           <w:b w:val="0"/>
           <w:bCs w:val="0"/>
         </w:rPr>
-        <w:t>7</w:t>
+        <w:t>23</w:t>
       </w:r>
       <w:r>
         <w:rPr>
@@ -84,7 +68,7 @@
           <w:b w:val="0"/>
           <w:bCs w:val="0"/>
         </w:rPr>
-        <w:t>NOV</w:t>
+        <w:t>DEC</w:t>
       </w:r>
       <w:r>
         <w:rPr>
@@ -723,7 +707,21 @@
           <w:bCs/>
         </w:rPr>
         <w:br/>
-        <w:t>- Latest Orbiter Beta</w:t>
+        <w:t>- Latest Orbiter</w:t>
+      </w:r>
+      <w:r>
+        <w:rPr>
+          <w:b/>
+          <w:bCs/>
+        </w:rPr>
+        <w:t xml:space="preserve"> 2016</w:t>
+      </w:r>
+      <w:r>
+        <w:rPr>
+          <w:b/>
+          <w:bCs/>
+        </w:rPr>
+        <w:t xml:space="preserve"> Beta</w:t>
       </w:r>
       <w:r>
         <w:t> NASSP 8.0 is not compatible with Orbiter 2010 or Orbiter 2016 and is at this time only compatible with the latest Beta release of Orbiter</w:t>
@@ -733,6 +731,9 @@
       </w:r>
       <w:r>
         <w:t xml:space="preserve"> Beta R90 which includes a crucial fix to docked spacecraft physics which is not in the release version.</w:t>
+      </w:r>
+      <w:r>
+        <w:t xml:space="preserve"> NASSP 8.0 is also not compatible with Orbiter 2024 or Open Orbiter releases. NASSP 9.0 development will be released for those versions.</w:t>
       </w:r>
       <w:r>
         <w:br/>
@@ -914,11 +915,14 @@
       <w:r>
         <w:br/>
       </w:r>
+    </w:p>
+    <w:p>
       <w:r>
         <w:rPr>
           <w:b/>
           <w:bCs/>
         </w:rPr>
+        <w:lastRenderedPageBreak/>
         <w:t>-Optional:</w:t>
       </w:r>
       <w:r>
@@ -935,13 +939,6 @@
       <w:r>
         <w:t> and copy to your Textures/Earth and Textures/Moon folders respectively.</w:t>
       </w:r>
-      <w:r>
-        <w:br/>
-      </w:r>
-      <w:r>
-        <w:lastRenderedPageBreak/>
-        <w:br/>
-      </w:r>
     </w:p>
     <w:p>
       <w:r>
@@ -1052,15 +1049,7 @@
       </w:r>
       <w:r>
         <w:br/>
-        <w:t xml:space="preserve">- Start Orbiter_ng.exe (NOT Orbiter.exe) from your Orbiter installation folder. Go to the "Modules" tab and activate the "D3D9Client" module. The "Video" tab appears, configure the video settings as you like, they are quite </w:t>
-      </w:r>
-      <w:proofErr w:type="gramStart"/>
-      <w:r>
-        <w:t>similar to</w:t>
-      </w:r>
-      <w:proofErr w:type="gramEnd"/>
-      <w:r>
-        <w:t xml:space="preserve"> the usual Orbiter video settings. It is recommended to use "Full Screen Window" mode.</w:t>
+        <w:t>- Start Orbiter_ng.exe (NOT Orbiter.exe) from your Orbiter installation folder. Go to the "Modules" tab and activate the "D3D9Client" module. The "Video" tab appears, configure the video settings as you like, they are quite similar to the usual Orbiter video settings. It is recommended to use "Full Screen Window" mode.</w:t>
       </w:r>
       <w:r>
         <w:br/>
@@ -1073,37 +1062,7 @@
           <w:b/>
           <w:bCs/>
         </w:rPr>
-        <w:t xml:space="preserve">IMPORTANT: Click "Advanced" and add a check beside "Enable absolute animation handling" to prevent </w:t>
-      </w:r>
-      <w:proofErr w:type="gramStart"/>
-      <w:r>
-        <w:rPr>
-          <w:b/>
-          <w:bCs/>
-        </w:rPr>
-        <w:t>animation drift</w:t>
-      </w:r>
-      <w:proofErr w:type="gramEnd"/>
-      <w:r>
-        <w:rPr>
-          <w:b/>
-          <w:bCs/>
-        </w:rPr>
-        <w:t xml:space="preserve"> </w:t>
-      </w:r>
-      <w:r>
-        <w:rPr>
-          <w:b/>
-          <w:bCs/>
-        </w:rPr>
-        <w:t xml:space="preserve">from </w:t>
-      </w:r>
-      <w:r>
-        <w:rPr>
-          <w:b/>
-          <w:bCs/>
-        </w:rPr>
-        <w:t xml:space="preserve">happening in certain cases in the VC. You can also configure the other options </w:t>
+        <w:t xml:space="preserve">IMPORTANT: Click "Advanced" and add a check beside "Enable absolute animation handling" to prevent animation drift happening in certain cases in the VC. You can also configure the other options </w:t>
       </w:r>
       <w:r>
         <w:rPr>
@@ -1168,7 +1127,6 @@
         <w:br/>
       </w:r>
     </w:p>
-    <w:p/>
     <w:p>
       <w:pPr>
         <w:rPr>
@@ -1181,6 +1139,7 @@
           <w:b/>
           <w:bCs/>
         </w:rPr>
+        <w:lastRenderedPageBreak/>
         <w:t>Configure Project Apollo</w:t>
       </w:r>
       <w:r>
@@ -1188,21 +1147,7 @@
           <w:b/>
           <w:bCs/>
         </w:rPr>
-        <w:t xml:space="preserve"> </w:t>
-      </w:r>
-      <w:r>
-        <w:rPr>
-          <w:b/>
-          <w:bCs/>
-        </w:rPr>
-        <w:t>for</w:t>
-      </w:r>
-      <w:r>
-        <w:rPr>
-          <w:b/>
-          <w:bCs/>
-        </w:rPr>
-        <w:t xml:space="preserve"> Orbiter 2016 Beta</w:t>
+        <w:t xml:space="preserve"> For Orbiter 2016 Beta</w:t>
       </w:r>
       <w:r>
         <w:rPr>
@@ -1242,15 +1187,7 @@
       </w:r>
       <w:r>
         <w:br/>
-        <w:t>3. Go to the Launchpad Configuration Options on the "Extra" tab. If you have a joystick, this is where you can configure your joystick for use in NASSP. Do not use the normal Orbiter controls page to configure your joystick, there it should be &lt;Disabled&gt;. In the "Miscellaneous" tab, make sure "</w:t>
-      </w:r>
-      <w:proofErr w:type="gramStart"/>
-      <w:r>
-        <w:t>Multi-Threading</w:t>
-      </w:r>
-      <w:proofErr w:type="gramEnd"/>
-      <w:r>
-        <w:t xml:space="preserve"> in time acceleration" is checked. It is also recommended to set a limit for time acceleration, NASSP runs best at 50x or less depending on the hardware you are using.</w:t>
+        <w:t>3. Go to the Launchpad Configuration Options on the "Extra" tab. If you have a joystick, this is where you can configure your joystick for use in NASSP. Do not use the normal Orbiter controls page to configure your joystick, there it should be &lt;Disabled&gt;. In the "Miscellaneous" tab, make sure "Multi-Threading in time acceleration" is checked. It is also recommended to set a limit for time acceleration, NASSP runs best at 50x or less depending on the hardware you are using.</w:t>
       </w:r>
       <w:r>
         <w:br/>
@@ -1324,43 +1261,24 @@
           <w:b/>
           <w:bCs/>
         </w:rPr>
-        <w:t xml:space="preserve">Please note, timestamped saves (i.e. those within the "Apollo Mission Scenarios" folder) </w:t>
-      </w:r>
-      <w:r>
+        <w:t>Please note, timestamped saves (i.e. those within the "Apollo Mission Scenarios" folder) do not have the latest systems updates. Because of this, they may have alarms and other quirks when loading them. We encourage starting with a fresh launch.</w:t>
+      </w:r>
+    </w:p>
+    <w:p>
+      <w:pPr>
         <w:rPr>
           <w:b/>
           <w:bCs/>
         </w:rPr>
-        <w:t>may not</w:t>
-      </w:r>
-      <w:r>
+      </w:pPr>
+    </w:p>
+    <w:p>
+      <w:pPr>
         <w:rPr>
           <w:b/>
           <w:bCs/>
         </w:rPr>
-        <w:t xml:space="preserve"> have the latest systems updates. Because of this, they may have alarms and other quirks when loading them. </w:t>
-      </w:r>
-      <w:r>
-        <w:rPr>
-          <w:b/>
-          <w:bCs/>
-        </w:rPr>
-        <w:t>While we work to keep them updated, we still always</w:t>
-      </w:r>
-      <w:r>
-        <w:rPr>
-          <w:b/>
-          <w:bCs/>
-        </w:rPr>
-        <w:t xml:space="preserve"> encourage starting with a fresh launch</w:t>
-      </w:r>
-      <w:r>
-        <w:rPr>
-          <w:b/>
-          <w:bCs/>
-        </w:rPr>
-        <w:t>!</w:t>
-      </w:r>
+      </w:pPr>
     </w:p>
     <w:p>
       <w:pPr>
@@ -1445,42 +1363,225 @@
       <w:bookmarkEnd w:id="1"/>
     </w:p>
     <w:p>
-      <w:r>
+      <w:pPr>
         <w:rPr>
           <w:b/>
           <w:bCs/>
         </w:rPr>
-        <w:t>Work In Progress/To Be Added</w:t>
+      </w:pPr>
+      <w:r>
+        <w:rPr>
+          <w:b/>
+          <w:bCs/>
+        </w:rPr>
+        <w:t>Download Orbiter:</w:t>
       </w:r>
     </w:p>
-    <w:p/>
-    <w:p/>
-    <w:p/>
-    <w:p/>
-    <w:p/>
-    <w:p/>
-    <w:p/>
-    <w:p/>
-    <w:p/>
-    <w:p/>
-    <w:p/>
-    <w:p/>
-    <w:p/>
-    <w:p/>
-    <w:p/>
-    <w:p/>
-    <w:p/>
-    <w:p/>
-    <w:p/>
-    <w:p/>
-    <w:p/>
-    <w:p/>
+    <w:p>
+      <w:r>
+        <w:t xml:space="preserve">1) Download Orbiter 2024 x64 or the latest Open Orbiter development release x64 from </w:t>
+      </w:r>
+      <w:hyperlink r:id="rId20" w:history="1">
+        <w:r>
+          <w:rPr>
+            <w:rStyle w:val="Hyperlink"/>
+          </w:rPr>
+          <w:t>Orbiter GitHub</w:t>
+        </w:r>
+      </w:hyperlink>
+      <w:r>
+        <w:t xml:space="preserve"> or optionally a build from </w:t>
+      </w:r>
+      <w:hyperlink r:id="rId21" w:history="1">
+        <w:r>
+          <w:rPr>
+            <w:rStyle w:val="Hyperlink"/>
+          </w:rPr>
+          <w:t>OneDrive</w:t>
+        </w:r>
+      </w:hyperlink>
+    </w:p>
+    <w:p>
+      <w:r>
+        <w:t xml:space="preserve">2) </w:t>
+      </w:r>
+      <w:r>
+        <w:t xml:space="preserve">Extract the </w:t>
+      </w:r>
+      <w:r>
+        <w:t xml:space="preserve">Orbiter 2024 or Open Orbiter x64 </w:t>
+      </w:r>
+      <w:r>
+        <w:t>into a folder of your choosing, this will become the orbiter root</w:t>
+      </w:r>
+    </w:p>
     <w:p>
       <w:pPr>
-        <w:pStyle w:val="Heading1"/>
+        <w:rPr>
+          <w:b/>
+          <w:bCs/>
+        </w:rPr>
       </w:pPr>
+      <w:r>
+        <w:rPr>
+          <w:b/>
+          <w:bCs/>
+        </w:rPr>
+        <w:t>Download Textures:</w:t>
+      </w:r>
     </w:p>
-    <w:p/>
+    <w:p>
+      <w:r>
+        <w:t xml:space="preserve">1) Download Orbiter 2024 Release and extract the textures folder. Optionally you may download the Low Res and Landing Site Textures </w:t>
+      </w:r>
+      <w:hyperlink r:id="rId22" w:history="1">
+        <w:r>
+          <w:rPr>
+            <w:rStyle w:val="Hyperlink"/>
+          </w:rPr>
+          <w:t>here</w:t>
+        </w:r>
+      </w:hyperlink>
+    </w:p>
+    <w:p>
+      <w:r>
+        <w:t>2) Extract the Textures folder in the Low Res and LS textures zips into the orbiter root</w:t>
+      </w:r>
+    </w:p>
+    <w:p>
+      <w:r>
+        <w:t xml:space="preserve">3) If you </w:t>
+      </w:r>
+      <w:r>
+        <w:t>choose</w:t>
+      </w:r>
+      <w:r>
+        <w:t xml:space="preserve"> to download all the </w:t>
+      </w:r>
+      <w:r>
+        <w:t>high-res</w:t>
+      </w:r>
+      <w:r>
+        <w:t xml:space="preserve"> textures, make sure you have the folder organization correct (Earth/Archive and Moon/Archive) and put those into the Textures folder of your orbiter root</w:t>
+      </w:r>
+    </w:p>
+    <w:p>
+      <w:pPr>
+        <w:rPr>
+          <w:b/>
+          <w:bCs/>
+        </w:rPr>
+      </w:pPr>
+      <w:r>
+        <w:rPr>
+          <w:b/>
+          <w:bCs/>
+        </w:rPr>
+        <w:t>Download NASSP</w:t>
+      </w:r>
+      <w:r>
+        <w:rPr>
+          <w:b/>
+          <w:bCs/>
+        </w:rPr>
+        <w:t>:</w:t>
+      </w:r>
+    </w:p>
+    <w:p>
+      <w:r>
+        <w:t xml:space="preserve">1) Download the latest NASSP Release or Pre Release from </w:t>
+      </w:r>
+      <w:hyperlink r:id="rId23" w:history="1">
+        <w:r>
+          <w:rPr>
+            <w:rStyle w:val="Hyperlink"/>
+          </w:rPr>
+          <w:t>GitHub</w:t>
+        </w:r>
+      </w:hyperlink>
+    </w:p>
+    <w:p>
+      <w:r>
+        <w:t>2</w:t>
+      </w:r>
+      <w:r>
+        <w:t>) Extract NASSP into your orbiter root</w:t>
+      </w:r>
+    </w:p>
+    <w:p>
+      <w:r>
+        <w:t>3</w:t>
+      </w:r>
+      <w:r>
+        <w:t xml:space="preserve">) Launch orbiter and </w:t>
+      </w:r>
+      <w:r>
+        <w:t>g</w:t>
+      </w:r>
+      <w:r>
+        <w:t>o to the "Modules" tab and activate the "ExtMFD", XRSound", "ProjectApolloMFD" and "ApolloRTCCMFD" modules. Do not use the DX9MFD as it is known to cause crashes</w:t>
+      </w:r>
+    </w:p>
+    <w:p>
+      <w:r>
+        <w:t>4</w:t>
+      </w:r>
+      <w:r>
+        <w:t>) In Options-&gt;Visual Settings make sure "local light sources" is enabled, and configure the rest how you wish</w:t>
+      </w:r>
+    </w:p>
+    <w:p>
+      <w:r>
+        <w:t>5</w:t>
+      </w:r>
+      <w:r>
+        <w:t>) In Options-&gt;Physics Settings I personally leave all enabled except atmospheric wind effects as that will cause issues</w:t>
+      </w:r>
+    </w:p>
+    <w:p>
+      <w:r>
+        <w:t>6</w:t>
+      </w:r>
+      <w:r>
+        <w:t>) In Video, make sure you select D3D9Client as the graphics engine and then select your GPU, and I encourage using "full screen window"</w:t>
+      </w:r>
+    </w:p>
+    <w:p>
+      <w:r>
+        <w:t>7</w:t>
+      </w:r>
+      <w:r>
+        <w:t>) In the advanced settings of video, configure however you wish, but you must have "enable absolute animation handling" checked and texture mipmaps must be set to "load as defined"</w:t>
+      </w:r>
+    </w:p>
+    <w:p>
+      <w:r>
+        <w:t>8</w:t>
+      </w:r>
+      <w:r>
+        <w:t>) In Extra-&gt;debugging options-&gt;orbiter shutdown options, I recommend making it terminate orbiter process to prevent multiple instances of orbiter from launching causing problems</w:t>
+      </w:r>
+    </w:p>
+    <w:p>
+      <w:r>
+        <w:t>9</w:t>
+      </w:r>
+      <w:r>
+        <w:t xml:space="preserve">) </w:t>
+      </w:r>
+      <w:r>
+        <w:t>Also,</w:t>
+      </w:r>
+      <w:r>
+        <w:t xml:space="preserve"> in Extra, go to vessel configuration-&gt;project apollo configuration and at the very least make sure mesh is set to high resolution, FDAI is on smooth scrolling, and on the miscellaneous tab, check </w:t>
+      </w:r>
+      <w:r>
+        <w:t>multi-threading</w:t>
+      </w:r>
+      <w:r>
+        <w:t xml:space="preserve"> in time acceleration</w:t>
+      </w:r>
+    </w:p>
     <w:p>
       <w:pPr>
         <w:pStyle w:val="Heading1"/>
@@ -1511,15 +1612,7 @@
         <w:br/>
       </w:r>
       <w:r>
-        <w:t xml:space="preserve">That's ultimately up to you, but we generally recommend Apollo 8. While Apollo 7 is chronologically first, it's a very long mission that is meant to test vehicle systems and procedures from the relative safety of low Earth orbit. As such, it involves a very unusual and often repetitive schedule, with procedures that are rather unrefined. Apollo 8, by contrast, is a relatively short mission with more straightforward goals and mission design. You get to experience most of the lunar mission milestones without needing to worry about managing two separate vehicles on your first journey. After Apollo 8 concludes, Apollo 11 or 12 would be our next recommendation. You get to use </w:t>
-      </w:r>
-      <w:proofErr w:type="gramStart"/>
-      <w:r>
-        <w:t>the LM</w:t>
-      </w:r>
-      <w:proofErr w:type="gramEnd"/>
-      <w:r>
-        <w:t xml:space="preserve"> and land on the moon, and the procedures have been improved and optimized thanks to the lessons learned on all the previous missions.</w:t>
+        <w:t>That's ultimately up to you, but we generally recommend Apollo 8. While Apollo 7 is chronologically first, it's a very long mission that is meant to test vehicle systems and procedures from the relative safety of low Earth orbit. As such, it involves a very unusual and often repetitive schedule, with procedures that are rather unrefined. Apollo 8, by contrast, is a relatively short mission with more straightforward goals and mission design. You get to experience most of the lunar mission milestones without needing to worry about managing two separate vehicles on your first journey. After Apollo 8 concludes, Apollo 11 or 12 would be our next recommendation. You get to use the LM and land on the moon, and the procedures have been improved and optimized thanks to the lessons learned on all the previous missions.</w:t>
       </w:r>
       <w:r>
         <w:br/>
@@ -1597,25 +1690,222 @@
         <w:t>To switch between the 2D cockpit and the more modern 3D cockpit, press the F8 key.</w:t>
       </w:r>
       <w:r>
-        <w:t> You will need to do this occasionally, because the CSM and LM optics views are only functional in the 2D view. We do hope to add optics support to the 3D cockpit, but adding this functionality is complicated and we</w:t>
-      </w:r>
-      <w:r>
-        <w:t xml:space="preserve"> c</w:t>
-      </w:r>
-      <w:r>
-        <w:t xml:space="preserve">urrently </w:t>
-      </w:r>
-      <w:r>
-        <w:t>lack</w:t>
-      </w:r>
-      <w:r>
-        <w:t xml:space="preserve"> the </w:t>
-      </w:r>
-      <w:r>
-        <w:t>ability</w:t>
-      </w:r>
-      <w:r>
-        <w:t xml:space="preserve"> to do so. Also, be sure to use the lighting knobs inside each vehicle's cockpit to adjust the lights to your liking.</w:t>
+        <w:t> You will need to do this occasionally, because the CSM and LM optics views are only functional in the 2D view. We do hope to add optics support to the 3D cockpit, but adding this functionality is complicated and we don't currently have the knowledge to do so. Also, be sure to use the lighting knobs inside each vehicle's cockpit to adjust the lights to your liking.</w:t>
+      </w:r>
+      <w:r>
+        <w:br/>
+      </w:r>
+    </w:p>
+    <w:p>
+      <w:pPr>
+        <w:ind w:left="360"/>
+      </w:pPr>
+      <w:r>
+        <w:rPr>
+          <w:b/>
+          <w:bCs/>
+        </w:rPr>
+        <w:t>How do I move around the cockpit? </w:t>
+      </w:r>
+      <w:r>
+        <w:rPr>
+          <w:b/>
+          <w:bCs/>
+        </w:rPr>
+        <w:br/>
+      </w:r>
+      <w:r>
+        <w:t xml:space="preserve">The 2D and 3D cockpit views are divided up into multiple viewpoints, usually centered on a specific panel or group of panels. Think of these a bit like choosing which "seat" you're positioned at in the spacecraft. In each view, you can use the arrow keys to move the camera up, down, left, and right. You can switch between </w:t>
+      </w:r>
+      <w:r>
+        <w:lastRenderedPageBreak/>
+        <w:t>these seats by holding the Control/Ctrl key and pressing an arrow key. It may take some time to get used to where each of the viewpoints are located within the cockpit. In the 3D cockpit specifically, from any "seat" you can hold Ctrl and Alt and press an arrow key to adjust the camera to one of several preset angles, to help get a better view of certain switches or components in that area. For example, from the left seat of the CM, you can press Ctrl + Alt + Right Arrow to zoom the camera in on the DSKY, or Ctrl + Alt + Left Arrow to look to your left, at the side panels near your armrest. Every "seat" has its own set of preset views, many of which are very helpful in finding switches that are out of sight or not as easily viewable.</w:t>
+      </w:r>
+      <w:r>
+        <w:br/>
+      </w:r>
+    </w:p>
+    <w:p>
+      <w:pPr>
+        <w:ind w:left="360"/>
+      </w:pPr>
+      <w:r>
+        <w:rPr>
+          <w:b/>
+          <w:bCs/>
+        </w:rPr>
+        <w:t>How do I interact with switches? </w:t>
+      </w:r>
+      <w:r>
+        <w:rPr>
+          <w:b/>
+          <w:bCs/>
+        </w:rPr>
+        <w:br/>
+      </w:r>
+      <w:r>
+        <w:t xml:space="preserve">Most switches can be controlled by </w:t>
+      </w:r>
+      <w:r>
+        <w:t>left clicking</w:t>
+      </w:r>
+      <w:r>
+        <w:t>. Click slightly above the switch to push it up, and slightly below to push it down. Some switches may have three positions, so to move the switch from its "up" position to the "down" position, you'll need to click twice. If a switch has a guard or cover, right-click the switch to open or close its cover.</w:t>
+      </w:r>
+      <w:r>
+        <w:br/>
+      </w:r>
+    </w:p>
+    <w:p>
+      <w:pPr>
+        <w:ind w:left="360"/>
+      </w:pPr>
+      <w:r>
+        <w:rPr>
+          <w:b/>
+          <w:bCs/>
+        </w:rPr>
+        <w:t>How do I interact with circuit breakers and computer keys? </w:t>
+      </w:r>
+      <w:r>
+        <w:rPr>
+          <w:b/>
+          <w:bCs/>
+        </w:rPr>
+        <w:br/>
+      </w:r>
+      <w:r>
+        <w:t xml:space="preserve">These are pretty easy. You can </w:t>
+      </w:r>
+      <w:r>
+        <w:t>click on the left</w:t>
+      </w:r>
+      <w:r>
+        <w:t xml:space="preserve"> circuit breakers to close or open them. For computer keys like the DSKY or DEDA, just click on each button to press it. If you find that the computer isn't always responding to your key presses, you may be letting go of the button too quickly. Each computer key needs to be held for a small fraction of a second, and sometimes a fast click doesn't hold the button down for quite long enough. You don't need to hold them for a long time, only for a brief moment to ensure they register.</w:t>
+      </w:r>
+      <w:r>
+        <w:br/>
+      </w:r>
+    </w:p>
+    <w:p>
+      <w:pPr>
+        <w:ind w:left="360"/>
+        <w:rPr>
+          <w:b/>
+          <w:bCs/>
+        </w:rPr>
+      </w:pPr>
+      <w:r>
+        <w:rPr>
+          <w:b/>
+          <w:bCs/>
+        </w:rPr>
+        <w:t>How do I interact with rheostats/knobs? </w:t>
+      </w:r>
+    </w:p>
+    <w:p>
+      <w:pPr>
+        <w:ind w:left="360"/>
+      </w:pPr>
+      <w:r>
+        <w:t>A "rheostat" is one of the gray knob-like controls. Some of these work differently than others. Certain rheostats for controlling the cockpit lighting or the S-Band antenna angles are continuous, meaning they can be rotated freely to any position. To adjust these, click and hold on the knob, and then drag left or right to adjust its position. For other rheostats with discrete positions, left-click to rotate the knob to the left, and right-click to rotate it to the right.</w:t>
+      </w:r>
+      <w:r>
+        <w:br/>
+      </w:r>
+    </w:p>
+    <w:p>
+      <w:pPr>
+        <w:ind w:left="360"/>
+        <w:rPr>
+          <w:b/>
+          <w:bCs/>
+        </w:rPr>
+      </w:pPr>
+      <w:r>
+        <w:rPr>
+          <w:b/>
+          <w:bCs/>
+        </w:rPr>
+        <w:t>How do I interact with thumbwheels? </w:t>
+      </w:r>
+    </w:p>
+    <w:p>
+      <w:pPr>
+        <w:ind w:left="360"/>
+      </w:pPr>
+      <w:r>
+        <w:t xml:space="preserve">Thumbwheels are the vertical numbered controls, found on the gimbal trim control panel and the attitude set control panel. Left-click the upper or lower part of each thumbwheel to increase/decrease its value by 1, or right-click them to increase/decrease by 0.1. The dV/Range Set switch on the EMS works similarly: hold the switch on the top or bottom to increase or decrease the </w:t>
+      </w:r>
+      <w:r>
+        <w:t>value and</w:t>
+      </w:r>
+      <w:r>
+        <w:t xml:space="preserve"> left-click or right-click to do so fast/slowly.</w:t>
+      </w:r>
+    </w:p>
+    <w:p>
+      <w:pPr>
+        <w:ind w:left="360"/>
+      </w:pPr>
+      <w:r>
+        <w:lastRenderedPageBreak/>
+        <w:t>While the 2D cockpit has MFDs built right into its main panel, the 3D cockpit does not. To open an MFD in the 3D cockpit, move your mouse near the top of the Orbiter window. A menu bar should drop down. Click on "Function" and then choose "External MFD". If this option does not appear, make sure the "ExtMFD" module is enabled in the Orbiter settings.</w:t>
+      </w:r>
+    </w:p>
+    <w:p>
+      <w:pPr>
+        <w:ind w:left="360"/>
+      </w:pPr>
+      <w:r>
+        <w:t>When looking at the Checklist MFD, you'll notice the text has multiple colors. Green checklist entries will automatically proceed once the relevant switch, circuit breaker, button, etc. is in the correct position. Yellow entries need to be manually verified/completed, and then proceeded past with the "PRO" button on the MFD. Blue entries indicate a jump to another checklist within the current one. Sometimes these happen automatically, or you may need to click "PRO" or "FAIL" to decide whether you want to activate the new checklist or skip it. To enable or disable the auto-proceed function of the checklist, click the "AUTO" button on the MFD.</w:t>
+      </w:r>
+    </w:p>
+    <w:p>
+      <w:pPr>
+        <w:ind w:left="360"/>
+      </w:pPr>
+      <w:r>
+        <w:t>If you need to navigate to another part of the current checklist being displayed, you can use the UP/DN or PG UP/PG DN buttons to temporarily move the cursor to a different entry in the checklist. Then, click "GOTO" to confirm you want to move to this new location, or "BACK" to return to the previous location.</w:t>
+      </w:r>
+    </w:p>
+    <w:p>
+      <w:pPr>
+        <w:ind w:left="360"/>
+      </w:pPr>
+      <w:r>
+        <w:t>For optics sightings, you'll need to enable the AGC star markers. To do this, move your mouse near the top of the Orbiter window. A menu bar should drop down. Choose "Options", then choose "Visual helpers &gt; Planetarium". Make sure to enable "Planetarium mode (F9)" and then enable "Celestial markers</w:t>
+      </w:r>
+      <w:r>
+        <w:t>” and</w:t>
+      </w:r>
+      <w:r>
+        <w:t xml:space="preserve"> ensure "Apollo AGC navigation stars" is selected. Now, you should be able to see green markers indicating the positions, ID numbers, and names of the stars that the AGC knows about. Once you've enabled the markers in the settings window, you can quickly toggle them on or off with the F9 key.</w:t>
+      </w:r>
+      <w:r>
+        <w:br/>
+      </w:r>
+    </w:p>
+    <w:p>
+      <w:pPr>
+        <w:ind w:left="360"/>
+      </w:pPr>
+      <w:r>
+        <w:rPr>
+          <w:b/>
+          <w:bCs/>
+        </w:rPr>
+        <w:t>Take screenshots of your PADs, always! </w:t>
+      </w:r>
+      <w:r>
+        <w:rPr>
+          <w:b/>
+          <w:bCs/>
+        </w:rPr>
+        <w:br/>
+      </w:r>
+      <w:r>
+        <w:t>On missions with automated MCC support, you'll periodically receive Pre-Advisory Data (PAD) on the left side of the screen. Whenever you receive one of these, it's a good idea to take a screenshot of this data and save it somewhere. Each new PAD will replace the previous one, and certain parts of a mission might send you several over the course of a few minutes, so you will often need to keep track of them longer than the automated system keeps them there. Additionally, if you ever encounter problems with a burn or a trajectory calculation, sending us your PAD for that maneuver can be useful for debugging and troubleshooting.</w:t>
       </w:r>
       <w:r>
         <w:br/>
@@ -1646,7 +1936,169 @@
           <w:bCs/>
         </w:rPr>
         <w:lastRenderedPageBreak/>
-        <w:t>How do I move around the cockpit? </w:t>
+        <w:t xml:space="preserve">Save </w:t>
+      </w:r>
+      <w:r>
+        <w:rPr>
+          <w:b/>
+          <w:bCs/>
+        </w:rPr>
+        <w:t>frequently and</w:t>
+      </w:r>
+      <w:r>
+        <w:rPr>
+          <w:b/>
+          <w:bCs/>
+        </w:rPr>
+        <w:t xml:space="preserve"> keep your save files organized!</w:t>
+      </w:r>
+      <w:r>
+        <w:t> </w:t>
+      </w:r>
+      <w:r>
+        <w:br/>
+      </w:r>
+      <w:r>
+        <w:t>While we work hard to make sure the sim is stable and the instructions are clear, glitches and human errors can cause problems. Saving often and organizing those save files will help ensure that any issues don't result in losing hours of progress. I find it's helpful to periodically rename my latest save file to the mission time when I saved, plus a short remark about what I was doing.</w:t>
+      </w:r>
+      <w:r>
+        <w:br/>
+      </w:r>
+    </w:p>
+    <w:p>
+      <w:pPr>
+        <w:ind w:left="360"/>
+      </w:pPr>
+      <w:r>
+        <w:rPr>
+          <w:b/>
+          <w:bCs/>
+        </w:rPr>
+        <w:t xml:space="preserve">Be careful with </w:t>
+      </w:r>
+      <w:r>
+        <w:rPr>
+          <w:b/>
+          <w:bCs/>
+        </w:rPr>
+        <w:t>time warp</w:t>
+      </w:r>
+      <w:r>
+        <w:rPr>
+          <w:b/>
+          <w:bCs/>
+        </w:rPr>
+        <w:t>!</w:t>
+      </w:r>
+      <w:r>
+        <w:t> </w:t>
+      </w:r>
+      <w:r>
+        <w:br/>
+      </w:r>
+      <w:r>
+        <w:t xml:space="preserve">NASSP does a lot of complex calculations in the background, and </w:t>
+      </w:r>
+      <w:r>
+        <w:t>time warping</w:t>
+      </w:r>
+      <w:r>
+        <w:t xml:space="preserve"> too fast can cause these calculations to fail, which can cause your current simulation session to temporarily glitch or completely break. As a rule of thumb, if you notice that the simulator's framerate is dropping significantly when you use </w:t>
+      </w:r>
+      <w:r>
+        <w:t>time warp</w:t>
+      </w:r>
+      <w:r>
+        <w:t xml:space="preserve">, it probably means you are going too fast. We developers have moderately powerful computers, but they're far from high-end, mega-expensive machines. We can usually manage somewhere between 50x and 100x </w:t>
+      </w:r>
+      <w:r>
+        <w:t>time warp</w:t>
+      </w:r>
+      <w:r>
+        <w:t xml:space="preserve"> at the absolute maximum.</w:t>
+      </w:r>
+      <w:r>
+        <w:br/>
+      </w:r>
+    </w:p>
+    <w:p>
+      <w:pPr>
+        <w:ind w:left="360"/>
+      </w:pPr>
+      <w:r>
+        <w:rPr>
+          <w:b/>
+          <w:bCs/>
+        </w:rPr>
+        <w:t xml:space="preserve">Be careful with </w:t>
+      </w:r>
+      <w:r>
+        <w:rPr>
+          <w:b/>
+          <w:bCs/>
+        </w:rPr>
+        <w:t>time warp</w:t>
+      </w:r>
+      <w:r>
+        <w:rPr>
+          <w:b/>
+          <w:bCs/>
+        </w:rPr>
+        <w:t>, part 2!</w:t>
+      </w:r>
+      <w:r>
+        <w:t> </w:t>
+      </w:r>
+      <w:r>
+        <w:br/>
+      </w:r>
+      <w:r>
+        <w:t xml:space="preserve">If any vessel is actively maneuvering or holding attitude (attempting to rotate or remain stationary with RCS turned on), be aware that high </w:t>
+      </w:r>
+      <w:r>
+        <w:t>time warp</w:t>
+      </w:r>
+      <w:r>
+        <w:t xml:space="preserve"> levels can cause them to waste fuel or even spin out of control. This is a limitation of how we simulate the physics of RCS, and it may happen even if your computer is able to deal with fast </w:t>
+      </w:r>
+      <w:r>
+        <w:t>time warp</w:t>
+      </w:r>
+      <w:r>
+        <w:t xml:space="preserve"> normally. It will even affect vessels that you're not currently controlling: </w:t>
+      </w:r>
+      <w:r>
+        <w:t>time warping</w:t>
+      </w:r>
+      <w:r>
+        <w:t xml:space="preserve"> in the CSM while the LM is trying to hold attitude will cause problems for the LM. Usually going up to about 5x or 10x is safe. If you want to </w:t>
+      </w:r>
+      <w:r>
+        <w:t>time warp</w:t>
+      </w:r>
+      <w:r>
+        <w:t xml:space="preserve"> faster, be sure to disable any kind of attitude-hold mode in the CSM and LM before </w:t>
+      </w:r>
+      <w:r>
+        <w:t>continuing but</w:t>
+      </w:r>
+      <w:r>
+        <w:t xml:space="preserve"> watch out to make sure you don't slowly drift into gimbal lock!</w:t>
+      </w:r>
+      <w:r>
+        <w:br/>
+      </w:r>
+    </w:p>
+    <w:p>
+      <w:pPr>
+        <w:ind w:left="360"/>
+      </w:pPr>
+      <w:r>
+        <w:rPr>
+          <w:b/>
+          <w:bCs/>
+        </w:rPr>
+        <w:t>Remember the CSM O2 Hose. </w:t>
       </w:r>
       <w:r>
         <w:rPr>
@@ -1656,104 +2108,13 @@
         <w:br/>
       </w:r>
       <w:r>
-        <w:t>The 2D and 3D cockpit views are divided up into multiple viewpoints, usually centered on a specific panel or group of panels. Think of these a bit like choosing which "seat" you're positioned at in the spacecraft. In each view, you can use the arrow keys to move the camera up, down, left, and right. You can switch between these seats by holding the Control/Ctrl key and pressing an arrow key. It may take some time to get used to where each of the viewpoints are located within the cockpit. In the 3D cockpit specifically, from any "seat" you can hold Ctrl and Alt and press an arrow key to adjust the camera to one of several preset angles, to help get a better view of certain switches or components in that area. For example, from the left seat of the CM, you can press Ctrl + Alt + Right Arrow to zoom the camera in on the DSKY, or Ctrl + Alt + Left Arrow to look to your left, at the side panels near your armrest. Every "seat" has its own set of preset views, many of which are very helpful in finding switches that are out of sight or not as easily viewable.</w:t>
-      </w:r>
-      <w:r>
-        <w:br/>
-      </w:r>
-    </w:p>
-    <w:p>
-      <w:pPr>
-        <w:ind w:left="360"/>
-      </w:pPr>
-      <w:r>
-        <w:rPr>
-          <w:b/>
-          <w:bCs/>
-        </w:rPr>
-        <w:t>How do I interact with switches? </w:t>
-      </w:r>
-      <w:r>
-        <w:rPr>
-          <w:b/>
-          <w:bCs/>
-        </w:rPr>
-        <w:br/>
-      </w:r>
-      <w:r>
-        <w:t xml:space="preserve">Most switches can be controlled by </w:t>
-      </w:r>
-      <w:r>
-        <w:t>left clicking</w:t>
-      </w:r>
-      <w:r>
-        <w:t>. Click slightly above the switch to push it up, and slightly below to push it down. Some switches may have three positions, so to move the switch from its "up" position to the "down" position, you'll need to click twice. If a switch has a guard or cover, right-click the switch to open or close its cover.</w:t>
-      </w:r>
-      <w:r>
-        <w:br/>
-      </w:r>
-    </w:p>
-    <w:p>
-      <w:pPr>
-        <w:ind w:left="360"/>
-      </w:pPr>
-      <w:r>
-        <w:rPr>
-          <w:b/>
-          <w:bCs/>
-        </w:rPr>
-        <w:t>How do I interact with circuit breakers and computer keys? </w:t>
-      </w:r>
-      <w:r>
-        <w:rPr>
-          <w:b/>
-          <w:bCs/>
-        </w:rPr>
-        <w:br/>
-      </w:r>
-      <w:r>
-        <w:t xml:space="preserve">You can </w:t>
-      </w:r>
-      <w:r>
-        <w:t>click on the left</w:t>
-      </w:r>
-      <w:r>
-        <w:t xml:space="preserve"> circuit breakers to close or open them. For computer keys like the DSKY or DEDA, just click on each button to press it. If you find that the computer isn't always responding to your key presses, you may be letting go of the button too quickly. Each computer key needs to be held for a small fraction of a second, and sometimes a fast click doesn't hold the button down for quite long enough. You don't need to hold them for a long time, only for </w:t>
-      </w:r>
-      <w:proofErr w:type="gramStart"/>
-      <w:r>
-        <w:t>a brief moment</w:t>
-      </w:r>
-      <w:proofErr w:type="gramEnd"/>
-      <w:r>
-        <w:t xml:space="preserve"> to ensure they register.</w:t>
-      </w:r>
-      <w:r>
-        <w:br/>
-      </w:r>
-    </w:p>
-    <w:p>
-      <w:pPr>
-        <w:ind w:left="360"/>
-        <w:rPr>
-          <w:b/>
-          <w:bCs/>
-        </w:rPr>
-      </w:pPr>
-      <w:r>
-        <w:rPr>
-          <w:b/>
-          <w:bCs/>
-        </w:rPr>
-        <w:t>How do I interact with rheostats/knobs? </w:t>
-      </w:r>
-    </w:p>
-    <w:p>
-      <w:pPr>
-        <w:ind w:left="360"/>
-      </w:pPr>
-      <w:r>
-        <w:t>A "rheostat" is one of the gray knob-like controls. Some of these work differently than others. Certain rheostats for controlling the cockpit lighting or the S-Band antenna angles are continuous, meaning they can be rotated freely to any position. To adjust these, click and hold on the knob, and then drag left or right to adjust its position. For other rheostats with discrete positions, left-click to rotate the knob to the left, and right-click to rotate it to the right.</w:t>
+        <w:t xml:space="preserve">When you're performing LM activation, be sure to use the Project Apollo MFD's "ECS" section to connect the O2 hose from the CSM. This creates a flow of fresh oxygen into the LM so that the cabin doesn't fill up with deadly CO2 and poison your crew before the LM ECS is activated. Having this O2 hose connected also prevents you from closing the CSM forward hatch, so if you can't get it </w:t>
+      </w:r>
+      <w:r>
+        <w:t>too</w:t>
+      </w:r>
+      <w:r>
+        <w:t xml:space="preserve"> close, make sure you've disconnected the hose.</w:t>
       </w:r>
       <w:r>
         <w:br/>
@@ -1772,10 +2133,11 @@
     <w:p>
       <w:pPr>
         <w:ind w:left="360"/>
-        <w:rPr>
-          <w:b/>
-          <w:bCs/>
-        </w:rPr>
+      </w:pPr>
+    </w:p>
+    <w:p>
+      <w:pPr>
+        <w:ind w:left="360"/>
       </w:pPr>
       <w:r>
         <w:rPr>
@@ -1783,97 +2145,28 @@
           <w:bCs/>
         </w:rPr>
         <w:lastRenderedPageBreak/>
-        <w:t>How do I interact with thumbwheels? </w:t>
-      </w:r>
-    </w:p>
-    <w:p>
-      <w:pPr>
-        <w:ind w:left="360"/>
-      </w:pPr>
-      <w:r>
-        <w:t xml:space="preserve">Thumbwheels are the vertical numbered controls, found on the gimbal trim control panel and the attitude set control panel. Left-click the upper or lower part of each thumbwheel to increase/decrease its value by 1, or right-click them to increase/decrease by 0.1. The dV/Range Set switch on the EMS works similarly: hold the switch on the top or bottom to increase or decrease the </w:t>
-      </w:r>
-      <w:r>
-        <w:t>value and</w:t>
-      </w:r>
-      <w:r>
-        <w:t xml:space="preserve"> left-click or right-click to do so fast/slowly.</w:t>
-      </w:r>
-    </w:p>
-    <w:p>
-      <w:pPr>
-        <w:ind w:left="360"/>
-      </w:pPr>
-    </w:p>
-    <w:p>
-      <w:pPr>
-        <w:ind w:left="360"/>
-        <w:rPr>
-          <w:b/>
-          <w:bCs/>
-        </w:rPr>
-      </w:pPr>
-      <w:r>
-        <w:rPr>
-          <w:b/>
-          <w:bCs/>
-        </w:rPr>
-        <w:t xml:space="preserve">How do I </w:t>
-      </w:r>
-      <w:r>
-        <w:rPr>
-          <w:b/>
-          <w:bCs/>
-        </w:rPr>
-        <w:t>use the available MFDs</w:t>
-      </w:r>
-      <w:r>
-        <w:rPr>
-          <w:b/>
-          <w:bCs/>
-        </w:rPr>
-        <w:t>? </w:t>
-      </w:r>
-    </w:p>
-    <w:p>
-      <w:pPr>
-        <w:ind w:left="360"/>
-      </w:pPr>
-      <w:r>
-        <w:t>While the 2D cockpit has MFDs built right into its main panel, the 3D cockpit does not. To open an MFD in the 3D cockpit, move your mouse near the top of the Orbiter window. A menu bar should drop down. Click on "Function" and then choose "External MFD". If this option does not appear, make sure the "ExtMFD" module is enabled in the Orbiter settings.</w:t>
-      </w:r>
-    </w:p>
-    <w:p>
-      <w:pPr>
-        <w:ind w:left="360"/>
-      </w:pPr>
-      <w:r>
-        <w:t>When looking at the Checklist MFD, you'll notice the text has multiple colors. Green checklist entries will automatically proceed once the relevant switch, circuit breaker, button, etc. is in the correct position. Yellow entries need to be manually verified/completed, and then proceeded past with the "PRO" button on the MFD. Blue entries indicate a jump to another checklist within the current one. Sometimes these happen automatically, or you may need to click "PRO" or "FAIL" to decide whether you want to activate the new checklist or skip it. To enable or disable the auto-proceed function of the checklist, click the "AUTO" button on the MFD.</w:t>
-      </w:r>
-    </w:p>
-    <w:p>
-      <w:pPr>
-        <w:ind w:left="360"/>
-      </w:pPr>
-      <w:r>
-        <w:t>If you need to navigate to another part of the current checklist being displayed, you can use the UP/DN or PG UP/PG DN buttons to temporarily move the cursor to a different entry in the checklist. Then, click "GOTO" to confirm you want to move to this new location, or "BACK" to return to the previous location.</w:t>
-      </w:r>
-    </w:p>
-    <w:p>
-      <w:pPr>
-        <w:ind w:left="360"/>
-      </w:pPr>
-      <w:r>
-        <w:t>For optics sightings, you'll need to enable the AGC star markers. To do this, move your mouse near the top of the Orbiter window. A menu bar should drop down. Choose "Options", then choose "Visual helpers &gt; Planetarium". Make sure to enable "Planetarium mode (F9)" and then enable "Celestial markers</w:t>
-      </w:r>
-      <w:r>
-        <w:t>” and</w:t>
-      </w:r>
-      <w:r>
-        <w:t xml:space="preserve"> ensure "Apollo AGC navigation stars" is selected. Now, you should be able to see green markers indicating the positions, ID numbers, and names of the stars that the AGC knows about. Once you've enabled the markers in the settings window, you can quickly toggle them on or off with the F9 key.</w:t>
+        <w:t>Pay attention to whether your LM crew should be in the cabin or their suits.</w:t>
+      </w:r>
+      <w:r>
+        <w:t> </w:t>
       </w:r>
       <w:r>
         <w:br/>
+      </w:r>
+      <w:r>
+        <w:t xml:space="preserve">Some of the most common causes of sim crew death are accidents involving your LM ECS configuration. In addition to the controls in the spacecraft itself, there's also some important options in the Project Apollo MFD, in the "ECS" section. If you're </w:t>
+      </w:r>
+      <w:r>
+        <w:t>depressurizing</w:t>
+      </w:r>
+      <w:r>
+        <w:t xml:space="preserve"> the cabin, be sure both your crew members are in the suits! If the suit hose knob is set to "suit disconnect" for either crewmember, they should probably be in the cabin! If the suits are hooked up to the ECS but the crew are in the cabin, CO2 might be building up without the gauge on the panel being able to detect it, because the airflow is only going through the suits. The checklists should steer you in the right direction, but it is easy for mistakes to happen, so be vigilant. In the future, we intend to overhaul the Command Module ECS to also simulate the crew being suited or unsuited, so getting </w:t>
+      </w:r>
+      <w:r>
+        <w:t>into</w:t>
+      </w:r>
+      <w:r>
+        <w:t xml:space="preserve"> the habit of paying attention to this is highly recommended.</w:t>
       </w:r>
     </w:p>
     <w:p>
@@ -1889,308 +2182,7 @@
     <w:p>
       <w:pPr>
         <w:ind w:left="360"/>
-        <w:rPr>
-          <w:b/>
-          <w:bCs/>
-        </w:rPr>
       </w:pPr>
-    </w:p>
-    <w:p>
-      <w:pPr>
-        <w:ind w:left="360"/>
-      </w:pPr>
-      <w:r>
-        <w:rPr>
-          <w:b/>
-          <w:bCs/>
-        </w:rPr>
-        <w:lastRenderedPageBreak/>
-        <w:t>Take screenshots of your PADs, always! </w:t>
-      </w:r>
-      <w:r>
-        <w:rPr>
-          <w:b/>
-          <w:bCs/>
-        </w:rPr>
-        <w:br/>
-      </w:r>
-      <w:r>
-        <w:t>On missions with automated MCC support, you'll periodically receive Pre-Advisory Data (PAD) on the left side of the screen. Whenever you receive one of these, it's a good idea to take a screenshot of this data and save it somewhere. Each new PAD will replace the previous one, and certain parts of a mission might send you several over the course of a few minutes, so you will often need to keep track of them longer than the automated system keeps them there. Additionally, if you ever encounter problems with a burn or a trajectory calculation, sending us your PAD for that maneuver can be useful for debugging and troubleshooting</w:t>
-      </w:r>
-      <w:r>
-        <w:t>.</w:t>
-      </w:r>
-    </w:p>
-    <w:p>
-      <w:pPr>
-        <w:ind w:left="360"/>
-      </w:pPr>
-    </w:p>
-    <w:p>
-      <w:pPr>
-        <w:ind w:left="360"/>
-      </w:pPr>
-      <w:r>
-        <w:rPr>
-          <w:b/>
-          <w:bCs/>
-        </w:rPr>
-        <w:t xml:space="preserve">Save </w:t>
-      </w:r>
-      <w:r>
-        <w:rPr>
-          <w:b/>
-          <w:bCs/>
-        </w:rPr>
-        <w:t>frequently and</w:t>
-      </w:r>
-      <w:r>
-        <w:rPr>
-          <w:b/>
-          <w:bCs/>
-        </w:rPr>
-        <w:t xml:space="preserve"> keep </w:t>
-      </w:r>
-      <w:proofErr w:type="gramStart"/>
-      <w:r>
-        <w:rPr>
-          <w:b/>
-          <w:bCs/>
-        </w:rPr>
-        <w:t>your save</w:t>
-      </w:r>
-      <w:proofErr w:type="gramEnd"/>
-      <w:r>
-        <w:rPr>
-          <w:b/>
-          <w:bCs/>
-        </w:rPr>
-        <w:t xml:space="preserve"> files organized!</w:t>
-      </w:r>
-      <w:r>
-        <w:t> </w:t>
-      </w:r>
-      <w:r>
-        <w:br/>
-      </w:r>
-      <w:r>
-        <w:t>While we work hard to make sure the sim is stable and the instructions are clear, glitches and human errors can cause problems. Saving often and organizing those save files will help ensure that any issues don't result in losing hours of progress. I find it's helpful to periodically rename my latest save file to the mission time when I saved, plus a short remark about what I was doing.</w:t>
-      </w:r>
-      <w:r>
-        <w:br/>
-      </w:r>
-    </w:p>
-    <w:p>
-      <w:pPr>
-        <w:ind w:left="360"/>
-      </w:pPr>
-      <w:r>
-        <w:rPr>
-          <w:b/>
-          <w:bCs/>
-        </w:rPr>
-        <w:t xml:space="preserve">Be careful with </w:t>
-      </w:r>
-      <w:r>
-        <w:rPr>
-          <w:b/>
-          <w:bCs/>
-        </w:rPr>
-        <w:t>time-warp</w:t>
-      </w:r>
-      <w:r>
-        <w:rPr>
-          <w:b/>
-          <w:bCs/>
-        </w:rPr>
-        <w:t>!</w:t>
-      </w:r>
-      <w:r>
-        <w:t> </w:t>
-      </w:r>
-      <w:r>
-        <w:br/>
-      </w:r>
-      <w:r>
-        <w:t xml:space="preserve">NASSP does a lot of complex calculations in the background, and </w:t>
-      </w:r>
-      <w:r>
-        <w:t>time-warp</w:t>
-      </w:r>
-      <w:r>
-        <w:t>ing</w:t>
-      </w:r>
-      <w:r>
-        <w:t xml:space="preserve"> too fast can cause these calculations to fail, which can cause your current simulation session to temporarily glitch or completely break. As a rule of thumb, if you notice that the simulator's framerate is dropping significantly when you use </w:t>
-      </w:r>
-      <w:r>
-        <w:t>time-warp</w:t>
-      </w:r>
-      <w:r>
-        <w:t xml:space="preserve">, it probably means you are going too fast. We developers have moderately powerful computers, but they're far from high-end, mega-expensive machines. We can usually manage somewhere between 50x and 100x </w:t>
-      </w:r>
-      <w:r>
-        <w:t>time-warp</w:t>
-      </w:r>
-      <w:r>
-        <w:t xml:space="preserve"> at the absolute maximum</w:t>
-      </w:r>
-      <w:r>
-        <w:t>, with 50X being generally a safe upper limit</w:t>
-      </w:r>
-      <w:r>
-        <w:t>.</w:t>
-      </w:r>
-      <w:r>
-        <w:br/>
-      </w:r>
-    </w:p>
-    <w:p>
-      <w:pPr>
-        <w:ind w:left="360"/>
-      </w:pPr>
-      <w:r>
-        <w:rPr>
-          <w:b/>
-          <w:bCs/>
-        </w:rPr>
-        <w:t xml:space="preserve">Be careful with </w:t>
-      </w:r>
-      <w:r>
-        <w:rPr>
-          <w:b/>
-          <w:bCs/>
-        </w:rPr>
-        <w:t>time-warp</w:t>
-      </w:r>
-      <w:r>
-        <w:rPr>
-          <w:b/>
-          <w:bCs/>
-        </w:rPr>
-        <w:t>, part 2!</w:t>
-      </w:r>
-      <w:r>
-        <w:t> </w:t>
-      </w:r>
-      <w:r>
-        <w:br/>
-      </w:r>
-      <w:r>
-        <w:t xml:space="preserve">If any vessel is actively maneuvering or holding attitude (attempting to rotate or remain stationary with RCS turned on), be aware that high </w:t>
-      </w:r>
-      <w:r>
-        <w:t>time-warp</w:t>
-      </w:r>
-      <w:r>
-        <w:t xml:space="preserve"> levels can cause them to waste fuel or even spin out of control. This is a limitation of how we simulate the physics of RCS, and it may happen even if your computer is able to deal with fast </w:t>
-      </w:r>
-      <w:r>
-        <w:t>time-warp</w:t>
-      </w:r>
-      <w:r>
-        <w:t xml:space="preserve"> normally. It will even affect vessels that you're not currently controlling</w:t>
-      </w:r>
-      <w:r>
-        <w:t>. For instance,</w:t>
-      </w:r>
-      <w:r>
-        <w:t xml:space="preserve"> </w:t>
-      </w:r>
-      <w:r>
-        <w:t>time-warp</w:t>
-      </w:r>
-      <w:r>
-        <w:t>ing</w:t>
-      </w:r>
-      <w:r>
-        <w:t xml:space="preserve"> in the CSM while the LM is trying to hold attitude will cause problems for the LM. Usually going up to about 5x or 10x is safe. If you want to </w:t>
-      </w:r>
-      <w:r>
-        <w:t>time-warp</w:t>
-      </w:r>
-      <w:r>
-        <w:t xml:space="preserve"> faster, be sure to disable any kind of attitude-hold mode in the CSM and LM before </w:t>
-      </w:r>
-      <w:r>
-        <w:t>continuing but</w:t>
-      </w:r>
-      <w:r>
-        <w:t xml:space="preserve"> watch out to make sure you don't slowly drift into gimbal lock!</w:t>
-      </w:r>
-      <w:r>
-        <w:br/>
-      </w:r>
-    </w:p>
-    <w:p>
-      <w:pPr>
-        <w:ind w:left="360"/>
-      </w:pPr>
-    </w:p>
-    <w:p>
-      <w:pPr>
-        <w:ind w:left="360"/>
-      </w:pPr>
-      <w:r>
-        <w:rPr>
-          <w:b/>
-          <w:bCs/>
-        </w:rPr>
-        <w:lastRenderedPageBreak/>
-        <w:t>Remember the CSM O2 Hose. </w:t>
-      </w:r>
-      <w:r>
-        <w:rPr>
-          <w:b/>
-          <w:bCs/>
-        </w:rPr>
-        <w:br/>
-      </w:r>
-      <w:r>
-        <w:t xml:space="preserve">When you're performing LM activation, be sure to use the Project Apollo MFD's "ECS" section to connect the O2 hose from the CSM. This creates a flow of fresh oxygen into the LM so that the cabin doesn't fill up with deadly CO2 and poison your crew before the LM ECS is activated. Having this O2 hose connected also prevents you from closing the CSM forward hatch, so if you can't get it </w:t>
-      </w:r>
-      <w:r>
-        <w:t>too</w:t>
-      </w:r>
-      <w:r>
-        <w:t xml:space="preserve"> close, make sure you've disconnected the hose.</w:t>
-      </w:r>
-      <w:r>
-        <w:br/>
-      </w:r>
-    </w:p>
-    <w:p>
-      <w:pPr>
-        <w:ind w:left="360"/>
-      </w:pPr>
-      <w:r>
-        <w:rPr>
-          <w:b/>
-          <w:bCs/>
-        </w:rPr>
-        <w:t>Pay attention to whether your LM crew should be in the cabin or their suits.</w:t>
-      </w:r>
-      <w:r>
-        <w:t> </w:t>
-      </w:r>
-      <w:r>
-        <w:br/>
-      </w:r>
-      <w:r>
-        <w:t xml:space="preserve">Some of the most common causes of sim crew death are accidents involving your LM ECS configuration. In addition to the controls in the spacecraft itself, there's also some important options in the Project Apollo MFD, in the "ECS" section. If you're </w:t>
-      </w:r>
-      <w:r>
-        <w:t>depressurizing</w:t>
-      </w:r>
-      <w:r>
-        <w:t xml:space="preserve"> the cabin, be sure both your crew members are in the suits! If the suit hose knob is set to "suit disconnect" for either crewmember, they should probably be in the cabin! If the suits are hooked up to the ECS but the crew are in the cabin, CO2 might be building up without the gauge on the panel being able to detect it, because the airflow is only going through the suits. The checklists should steer you in the right direction, but it is easy for mistakes to happen, so be vigilant. In the future, we intend to overhaul the Command Module ECS to also simulate the crew being suited or unsuited, so getting </w:t>
-      </w:r>
-      <w:r>
-        <w:t>into</w:t>
-      </w:r>
-      <w:r>
-        <w:t xml:space="preserve"> the habit of paying attention to this is highly recommended.</w:t>
-      </w:r>
     </w:p>
     <w:p>
       <w:pPr>
@@ -2506,7 +2498,6 @@
                 <w14:ligatures w14:val="none"/>
               </w:rPr>
             </w:pPr>
-            <w:proofErr w:type="spellStart"/>
             <w:r>
               <w:rPr>
                 <w:rFonts w:eastAsia="Times New Roman" w:cs="Times New Roman"/>
@@ -2516,7 +2507,6 @@
               </w:rPr>
               <w:t>Ctrl+Alt+S</w:t>
             </w:r>
-            <w:proofErr w:type="spellEnd"/>
           </w:p>
         </w:tc>
         <w:tc>
@@ -2548,19 +2538,8 @@
                 <w:kern w:val="0"/>
                 <w14:ligatures w14:val="none"/>
               </w:rPr>
-              <w:t xml:space="preserve">Generate Mission Time-Stamped </w:t>
-            </w:r>
-            <w:proofErr w:type="spellStart"/>
-            <w:r>
-              <w:rPr>
-                <w:rFonts w:eastAsia="Times New Roman" w:cs="Times New Roman"/>
-                <w:color w:val="000000"/>
-                <w:kern w:val="0"/>
-                <w14:ligatures w14:val="none"/>
-              </w:rPr>
-              <w:t>Quicksave</w:t>
-            </w:r>
-            <w:proofErr w:type="spellEnd"/>
+              <w:t>Generate Mission Time-Stamped Quicksave</w:t>
+            </w:r>
           </w:p>
         </w:tc>
       </w:tr>
@@ -3649,25 +3628,14 @@
                 <w14:ligatures w14:val="none"/>
               </w:rPr>
             </w:pPr>
-            <w:proofErr w:type="spellStart"/>
-            <w:r>
-              <w:rPr>
-                <w:rFonts w:eastAsia="Times New Roman" w:cs="Times New Roman"/>
-                <w:color w:val="000000"/>
-                <w:kern w:val="0"/>
-                <w14:ligatures w14:val="none"/>
-              </w:rPr>
-              <w:t>Shift+Decimal</w:t>
-            </w:r>
-            <w:proofErr w:type="spellEnd"/>
-            <w:r>
-              <w:rPr>
-                <w:rFonts w:eastAsia="Times New Roman" w:cs="Times New Roman"/>
-                <w:color w:val="000000"/>
-                <w:kern w:val="0"/>
-                <w14:ligatures w14:val="none"/>
-              </w:rPr>
-              <w:t xml:space="preserve"> (Numpad)</w:t>
+            <w:r>
+              <w:rPr>
+                <w:rFonts w:eastAsia="Times New Roman" w:cs="Times New Roman"/>
+                <w:color w:val="000000"/>
+                <w:kern w:val="0"/>
+                <w14:ligatures w14:val="none"/>
+              </w:rPr>
+              <w:t>Shift+Decimal (Numpad)</w:t>
             </w:r>
           </w:p>
         </w:tc>
@@ -3733,25 +3701,14 @@
                 <w14:ligatures w14:val="none"/>
               </w:rPr>
             </w:pPr>
-            <w:proofErr w:type="spellStart"/>
-            <w:r>
-              <w:rPr>
-                <w:rFonts w:eastAsia="Times New Roman" w:cs="Times New Roman"/>
-                <w:color w:val="000000"/>
-                <w:kern w:val="0"/>
-                <w14:ligatures w14:val="none"/>
-              </w:rPr>
-              <w:t>Shift+Page</w:t>
-            </w:r>
-            <w:proofErr w:type="spellEnd"/>
-            <w:r>
-              <w:rPr>
-                <w:rFonts w:eastAsia="Times New Roman" w:cs="Times New Roman"/>
-                <w:color w:val="000000"/>
-                <w:kern w:val="0"/>
-                <w14:ligatures w14:val="none"/>
-              </w:rPr>
-              <w:t xml:space="preserve"> Up</w:t>
+            <w:r>
+              <w:rPr>
+                <w:rFonts w:eastAsia="Times New Roman" w:cs="Times New Roman"/>
+                <w:color w:val="000000"/>
+                <w:kern w:val="0"/>
+                <w14:ligatures w14:val="none"/>
+              </w:rPr>
+              <w:t>Shift+Page Up</w:t>
             </w:r>
           </w:p>
         </w:tc>
@@ -3817,7 +3774,6 @@
                 <w14:ligatures w14:val="none"/>
               </w:rPr>
             </w:pPr>
-            <w:proofErr w:type="spellStart"/>
             <w:r>
               <w:rPr>
                 <w:rFonts w:eastAsia="Times New Roman" w:cs="Times New Roman"/>
@@ -3827,7 +3783,6 @@
               </w:rPr>
               <w:t>Shift+Home</w:t>
             </w:r>
-            <w:proofErr w:type="spellEnd"/>
           </w:p>
         </w:tc>
         <w:tc>
@@ -3892,25 +3847,14 @@
                 <w14:ligatures w14:val="none"/>
               </w:rPr>
             </w:pPr>
-            <w:proofErr w:type="spellStart"/>
-            <w:r>
-              <w:rPr>
-                <w:rFonts w:eastAsia="Times New Roman" w:cs="Times New Roman"/>
-                <w:color w:val="000000"/>
-                <w:kern w:val="0"/>
-                <w14:ligatures w14:val="none"/>
-              </w:rPr>
-              <w:t>Shift+Enter</w:t>
-            </w:r>
-            <w:proofErr w:type="spellEnd"/>
-            <w:r>
-              <w:rPr>
-                <w:rFonts w:eastAsia="Times New Roman" w:cs="Times New Roman"/>
-                <w:color w:val="000000"/>
-                <w:kern w:val="0"/>
-                <w14:ligatures w14:val="none"/>
-              </w:rPr>
-              <w:t xml:space="preserve"> (Numpad)</w:t>
+            <w:r>
+              <w:rPr>
+                <w:rFonts w:eastAsia="Times New Roman" w:cs="Times New Roman"/>
+                <w:color w:val="000000"/>
+                <w:kern w:val="0"/>
+                <w14:ligatures w14:val="none"/>
+              </w:rPr>
+              <w:t>Shift+Enter (Numpad)</w:t>
             </w:r>
           </w:p>
         </w:tc>
@@ -3976,25 +3920,14 @@
                 <w14:ligatures w14:val="none"/>
               </w:rPr>
             </w:pPr>
-            <w:proofErr w:type="spellStart"/>
-            <w:r>
-              <w:rPr>
-                <w:rFonts w:eastAsia="Times New Roman" w:cs="Times New Roman"/>
-                <w:color w:val="000000"/>
-                <w:kern w:val="0"/>
-                <w14:ligatures w14:val="none"/>
-              </w:rPr>
-              <w:t>Shift+Divide</w:t>
-            </w:r>
-            <w:proofErr w:type="spellEnd"/>
-            <w:r>
-              <w:rPr>
-                <w:rFonts w:eastAsia="Times New Roman" w:cs="Times New Roman"/>
-                <w:color w:val="000000"/>
-                <w:kern w:val="0"/>
-                <w14:ligatures w14:val="none"/>
-              </w:rPr>
-              <w:t xml:space="preserve"> (Numpad /)</w:t>
+            <w:r>
+              <w:rPr>
+                <w:rFonts w:eastAsia="Times New Roman" w:cs="Times New Roman"/>
+                <w:color w:val="000000"/>
+                <w:kern w:val="0"/>
+                <w14:ligatures w14:val="none"/>
+              </w:rPr>
+              <w:t>Shift+Divide (Numpad /)</w:t>
             </w:r>
           </w:p>
         </w:tc>
@@ -4060,25 +3993,14 @@
                 <w14:ligatures w14:val="none"/>
               </w:rPr>
             </w:pPr>
-            <w:proofErr w:type="spellStart"/>
-            <w:r>
-              <w:rPr>
-                <w:rFonts w:eastAsia="Times New Roman" w:cs="Times New Roman"/>
-                <w:color w:val="000000"/>
-                <w:kern w:val="0"/>
-                <w14:ligatures w14:val="none"/>
-              </w:rPr>
-              <w:t>Shift+Multiply</w:t>
-            </w:r>
-            <w:proofErr w:type="spellEnd"/>
-            <w:r>
-              <w:rPr>
-                <w:rFonts w:eastAsia="Times New Roman" w:cs="Times New Roman"/>
-                <w:color w:val="000000"/>
-                <w:kern w:val="0"/>
-                <w14:ligatures w14:val="none"/>
-              </w:rPr>
-              <w:t xml:space="preserve"> (Numpad *)</w:t>
+            <w:r>
+              <w:rPr>
+                <w:rFonts w:eastAsia="Times New Roman" w:cs="Times New Roman"/>
+                <w:color w:val="000000"/>
+                <w:kern w:val="0"/>
+                <w14:ligatures w14:val="none"/>
+              </w:rPr>
+              <w:t>Shift+Multiply (Numpad *)</w:t>
             </w:r>
           </w:p>
         </w:tc>
@@ -4144,25 +4066,14 @@
                 <w14:ligatures w14:val="none"/>
               </w:rPr>
             </w:pPr>
-            <w:proofErr w:type="spellStart"/>
-            <w:r>
-              <w:rPr>
-                <w:rFonts w:eastAsia="Times New Roman" w:cs="Times New Roman"/>
-                <w:color w:val="000000"/>
-                <w:kern w:val="0"/>
-                <w14:ligatures w14:val="none"/>
-              </w:rPr>
-              <w:t>Shift+Plus</w:t>
-            </w:r>
-            <w:proofErr w:type="spellEnd"/>
-            <w:r>
-              <w:rPr>
-                <w:rFonts w:eastAsia="Times New Roman" w:cs="Times New Roman"/>
-                <w:color w:val="000000"/>
-                <w:kern w:val="0"/>
-                <w14:ligatures w14:val="none"/>
-              </w:rPr>
-              <w:t xml:space="preserve"> (Numpad +)</w:t>
+            <w:r>
+              <w:rPr>
+                <w:rFonts w:eastAsia="Times New Roman" w:cs="Times New Roman"/>
+                <w:color w:val="000000"/>
+                <w:kern w:val="0"/>
+                <w14:ligatures w14:val="none"/>
+              </w:rPr>
+              <w:t>Shift+Plus (Numpad +)</w:t>
             </w:r>
           </w:p>
         </w:tc>
@@ -4228,25 +4139,14 @@
                 <w14:ligatures w14:val="none"/>
               </w:rPr>
             </w:pPr>
-            <w:proofErr w:type="spellStart"/>
-            <w:r>
-              <w:rPr>
-                <w:rFonts w:eastAsia="Times New Roman" w:cs="Times New Roman"/>
-                <w:color w:val="000000"/>
-                <w:kern w:val="0"/>
-                <w14:ligatures w14:val="none"/>
-              </w:rPr>
-              <w:t>Shift+Minus</w:t>
-            </w:r>
-            <w:proofErr w:type="spellEnd"/>
-            <w:r>
-              <w:rPr>
-                <w:rFonts w:eastAsia="Times New Roman" w:cs="Times New Roman"/>
-                <w:color w:val="000000"/>
-                <w:kern w:val="0"/>
-                <w14:ligatures w14:val="none"/>
-              </w:rPr>
-              <w:t xml:space="preserve"> (Numpad -)</w:t>
+            <w:r>
+              <w:rPr>
+                <w:rFonts w:eastAsia="Times New Roman" w:cs="Times New Roman"/>
+                <w:color w:val="000000"/>
+                <w:kern w:val="0"/>
+                <w14:ligatures w14:val="none"/>
+              </w:rPr>
+              <w:t>Shift+Minus (Numpad -)</w:t>
             </w:r>
           </w:p>
         </w:tc>
@@ -4312,7 +4212,6 @@
                 <w14:ligatures w14:val="none"/>
               </w:rPr>
             </w:pPr>
-            <w:proofErr w:type="spellStart"/>
             <w:r>
               <w:rPr>
                 <w:rFonts w:eastAsia="Times New Roman" w:cs="Times New Roman"/>
@@ -4322,7 +4221,6 @@
               </w:rPr>
               <w:t>Shift+End</w:t>
             </w:r>
-            <w:proofErr w:type="spellEnd"/>
           </w:p>
         </w:tc>
         <w:tc>
@@ -4645,15 +4543,7 @@
         <w:t>default,</w:t>
       </w:r>
       <w:r>
-        <w:t xml:space="preserve"> these commands use the soft stop of the RHC or ACA. To get full deflection of the attitude controller and command direct/</w:t>
-      </w:r>
-      <w:proofErr w:type="spellStart"/>
-      <w:r>
-        <w:t>hardover</w:t>
-      </w:r>
-      <w:proofErr w:type="spellEnd"/>
-      <w:r>
-        <w:t xml:space="preserve"> RCS firing in the CSM/LM respectively, hold the left or right Alt key while commanding rotation. To move the ACA out of detent in the LM without commanding RCS thrust, hold Ctrl and Alt while commanding rotation.</w:t>
+        <w:t xml:space="preserve"> these commands use the soft stop of the RHC or ACA. To get full deflection of the attitude controller and command direct/hardover RCS firing in the CSM/LM respectively, hold the left or right Alt key while commanding rotation. To move the ACA out of detent in the LM without commanding RCS thrust, hold Ctrl and Alt while commanding rotation.</w:t>
       </w:r>
     </w:p>
     <w:p>
@@ -5911,7 +5801,6 @@
                 <w14:ligatures w14:val="none"/>
               </w:rPr>
             </w:pPr>
-            <w:proofErr w:type="spellStart"/>
             <w:r>
               <w:rPr>
                 <w:rFonts w:eastAsia="Times New Roman" w:cs="Times New Roman"/>
@@ -5921,7 +5810,6 @@
               </w:rPr>
               <w:t>Shift+W</w:t>
             </w:r>
-            <w:proofErr w:type="spellEnd"/>
           </w:p>
         </w:tc>
         <w:tc>
@@ -5986,7 +5874,6 @@
                 <w14:ligatures w14:val="none"/>
               </w:rPr>
             </w:pPr>
-            <w:proofErr w:type="spellStart"/>
             <w:r>
               <w:rPr>
                 <w:rFonts w:eastAsia="Times New Roman" w:cs="Times New Roman"/>
@@ -5996,7 +5883,6 @@
               </w:rPr>
               <w:t>Shift+S</w:t>
             </w:r>
-            <w:proofErr w:type="spellEnd"/>
           </w:p>
         </w:tc>
         <w:tc>
@@ -6061,7 +5947,6 @@
                 <w14:ligatures w14:val="none"/>
               </w:rPr>
             </w:pPr>
-            <w:proofErr w:type="spellStart"/>
             <w:r>
               <w:rPr>
                 <w:rFonts w:eastAsia="Times New Roman" w:cs="Times New Roman"/>
@@ -6071,7 +5956,6 @@
               </w:rPr>
               <w:t>Shift+A</w:t>
             </w:r>
-            <w:proofErr w:type="spellEnd"/>
           </w:p>
         </w:tc>
         <w:tc>
@@ -6136,7 +6020,6 @@
                 <w14:ligatures w14:val="none"/>
               </w:rPr>
             </w:pPr>
-            <w:proofErr w:type="spellStart"/>
             <w:r>
               <w:rPr>
                 <w:rFonts w:eastAsia="Times New Roman" w:cs="Times New Roman"/>
@@ -6146,7 +6029,6 @@
               </w:rPr>
               <w:t>Shift+D</w:t>
             </w:r>
-            <w:proofErr w:type="spellEnd"/>
           </w:p>
         </w:tc>
         <w:tc>
@@ -6211,7 +6093,6 @@
                 <w14:ligatures w14:val="none"/>
               </w:rPr>
             </w:pPr>
-            <w:proofErr w:type="spellStart"/>
             <w:r>
               <w:rPr>
                 <w:rFonts w:eastAsia="Times New Roman" w:cs="Times New Roman"/>
@@ -6221,7 +6102,6 @@
               </w:rPr>
               <w:t>Shift+Q</w:t>
             </w:r>
-            <w:proofErr w:type="spellEnd"/>
           </w:p>
         </w:tc>
         <w:tc>
@@ -6286,7 +6166,6 @@
                 <w14:ligatures w14:val="none"/>
               </w:rPr>
             </w:pPr>
-            <w:proofErr w:type="spellStart"/>
             <w:r>
               <w:rPr>
                 <w:rFonts w:eastAsia="Times New Roman" w:cs="Times New Roman"/>
@@ -6296,7 +6175,6 @@
               </w:rPr>
               <w:t>Shift+E</w:t>
             </w:r>
-            <w:proofErr w:type="spellEnd"/>
           </w:p>
         </w:tc>
         <w:tc>
@@ -7524,25 +7402,14 @@
                 <w14:ligatures w14:val="none"/>
               </w:rPr>
             </w:pPr>
-            <w:proofErr w:type="spellStart"/>
-            <w:r>
-              <w:rPr>
-                <w:rFonts w:eastAsia="Times New Roman" w:cs="Times New Roman"/>
-                <w:color w:val="000000"/>
-                <w:kern w:val="0"/>
-                <w14:ligatures w14:val="none"/>
-              </w:rPr>
-              <w:t>Ctrl+Decimal</w:t>
-            </w:r>
-            <w:proofErr w:type="spellEnd"/>
-            <w:r>
-              <w:rPr>
-                <w:rFonts w:eastAsia="Times New Roman" w:cs="Times New Roman"/>
-                <w:color w:val="000000"/>
-                <w:kern w:val="0"/>
-                <w14:ligatures w14:val="none"/>
-              </w:rPr>
-              <w:t xml:space="preserve"> (Numpad .)</w:t>
+            <w:r>
+              <w:rPr>
+                <w:rFonts w:eastAsia="Times New Roman" w:cs="Times New Roman"/>
+                <w:color w:val="000000"/>
+                <w:kern w:val="0"/>
+                <w14:ligatures w14:val="none"/>
+              </w:rPr>
+              <w:t>Ctrl+Decimal (Numpad .)</w:t>
             </w:r>
           </w:p>
         </w:tc>
@@ -7608,25 +7475,14 @@
                 <w14:ligatures w14:val="none"/>
               </w:rPr>
             </w:pPr>
-            <w:proofErr w:type="spellStart"/>
-            <w:r>
-              <w:rPr>
-                <w:rFonts w:eastAsia="Times New Roman" w:cs="Times New Roman"/>
-                <w:color w:val="000000"/>
-                <w:kern w:val="0"/>
-                <w14:ligatures w14:val="none"/>
-              </w:rPr>
-              <w:t>Ctrl+Enter</w:t>
-            </w:r>
-            <w:proofErr w:type="spellEnd"/>
-            <w:r>
-              <w:rPr>
-                <w:rFonts w:eastAsia="Times New Roman" w:cs="Times New Roman"/>
-                <w:color w:val="000000"/>
-                <w:kern w:val="0"/>
-                <w14:ligatures w14:val="none"/>
-              </w:rPr>
-              <w:t xml:space="preserve"> (Numpad)</w:t>
+            <w:r>
+              <w:rPr>
+                <w:rFonts w:eastAsia="Times New Roman" w:cs="Times New Roman"/>
+                <w:color w:val="000000"/>
+                <w:kern w:val="0"/>
+                <w14:ligatures w14:val="none"/>
+              </w:rPr>
+              <w:t>Ctrl+Enter (Numpad)</w:t>
             </w:r>
           </w:p>
         </w:tc>
@@ -7692,25 +7548,14 @@
                 <w14:ligatures w14:val="none"/>
               </w:rPr>
             </w:pPr>
-            <w:proofErr w:type="spellStart"/>
-            <w:r>
-              <w:rPr>
-                <w:rFonts w:eastAsia="Times New Roman" w:cs="Times New Roman"/>
-                <w:color w:val="000000"/>
-                <w:kern w:val="0"/>
-                <w14:ligatures w14:val="none"/>
-              </w:rPr>
-              <w:t>Ctrl+Page</w:t>
-            </w:r>
-            <w:proofErr w:type="spellEnd"/>
-            <w:r>
-              <w:rPr>
-                <w:rFonts w:eastAsia="Times New Roman" w:cs="Times New Roman"/>
-                <w:color w:val="000000"/>
-                <w:kern w:val="0"/>
-                <w14:ligatures w14:val="none"/>
-              </w:rPr>
-              <w:t xml:space="preserve"> Up</w:t>
+            <w:r>
+              <w:rPr>
+                <w:rFonts w:eastAsia="Times New Roman" w:cs="Times New Roman"/>
+                <w:color w:val="000000"/>
+                <w:kern w:val="0"/>
+                <w14:ligatures w14:val="none"/>
+              </w:rPr>
+              <w:t>Ctrl+Page Up</w:t>
             </w:r>
           </w:p>
         </w:tc>
@@ -7776,25 +7621,14 @@
                 <w14:ligatures w14:val="none"/>
               </w:rPr>
             </w:pPr>
-            <w:proofErr w:type="spellStart"/>
-            <w:r>
-              <w:rPr>
-                <w:rFonts w:eastAsia="Times New Roman" w:cs="Times New Roman"/>
-                <w:color w:val="000000"/>
-                <w:kern w:val="0"/>
-                <w14:ligatures w14:val="none"/>
-              </w:rPr>
-              <w:t>Ctrl+Multiply</w:t>
-            </w:r>
-            <w:proofErr w:type="spellEnd"/>
-            <w:r>
-              <w:rPr>
-                <w:rFonts w:eastAsia="Times New Roman" w:cs="Times New Roman"/>
-                <w:color w:val="000000"/>
-                <w:kern w:val="0"/>
-                <w14:ligatures w14:val="none"/>
-              </w:rPr>
-              <w:t xml:space="preserve"> (Numpad *)</w:t>
+            <w:r>
+              <w:rPr>
+                <w:rFonts w:eastAsia="Times New Roman" w:cs="Times New Roman"/>
+                <w:color w:val="000000"/>
+                <w:kern w:val="0"/>
+                <w14:ligatures w14:val="none"/>
+              </w:rPr>
+              <w:t>Ctrl+Multiply (Numpad *)</w:t>
             </w:r>
           </w:p>
         </w:tc>
@@ -7860,25 +7694,14 @@
                 <w14:ligatures w14:val="none"/>
               </w:rPr>
             </w:pPr>
-            <w:proofErr w:type="spellStart"/>
-            <w:r>
-              <w:rPr>
-                <w:rFonts w:eastAsia="Times New Roman" w:cs="Times New Roman"/>
-                <w:color w:val="000000"/>
-                <w:kern w:val="0"/>
-                <w14:ligatures w14:val="none"/>
-              </w:rPr>
-              <w:t>Ctrl+Plus</w:t>
-            </w:r>
-            <w:proofErr w:type="spellEnd"/>
-            <w:r>
-              <w:rPr>
-                <w:rFonts w:eastAsia="Times New Roman" w:cs="Times New Roman"/>
-                <w:color w:val="000000"/>
-                <w:kern w:val="0"/>
-                <w14:ligatures w14:val="none"/>
-              </w:rPr>
-              <w:t xml:space="preserve"> (Numpad +)</w:t>
+            <w:r>
+              <w:rPr>
+                <w:rFonts w:eastAsia="Times New Roman" w:cs="Times New Roman"/>
+                <w:color w:val="000000"/>
+                <w:kern w:val="0"/>
+                <w14:ligatures w14:val="none"/>
+              </w:rPr>
+              <w:t>Ctrl+Plus (Numpad +)</w:t>
             </w:r>
           </w:p>
         </w:tc>
@@ -7944,25 +7767,14 @@
                 <w14:ligatures w14:val="none"/>
               </w:rPr>
             </w:pPr>
-            <w:proofErr w:type="spellStart"/>
-            <w:r>
-              <w:rPr>
-                <w:rFonts w:eastAsia="Times New Roman" w:cs="Times New Roman"/>
-                <w:color w:val="000000"/>
-                <w:kern w:val="0"/>
-                <w14:ligatures w14:val="none"/>
-              </w:rPr>
-              <w:t>Ctrl+Minus</w:t>
-            </w:r>
-            <w:proofErr w:type="spellEnd"/>
-            <w:r>
-              <w:rPr>
-                <w:rFonts w:eastAsia="Times New Roman" w:cs="Times New Roman"/>
-                <w:color w:val="000000"/>
-                <w:kern w:val="0"/>
-                <w14:ligatures w14:val="none"/>
-              </w:rPr>
-              <w:t xml:space="preserve"> (Numpad -)</w:t>
+            <w:r>
+              <w:rPr>
+                <w:rFonts w:eastAsia="Times New Roman" w:cs="Times New Roman"/>
+                <w:color w:val="000000"/>
+                <w:kern w:val="0"/>
+                <w14:ligatures w14:val="none"/>
+              </w:rPr>
+              <w:t>Ctrl+Minus (Numpad -)</w:t>
             </w:r>
           </w:p>
         </w:tc>
@@ -8421,7 +8233,6 @@
                 <w14:ligatures w14:val="none"/>
               </w:rPr>
             </w:pPr>
-            <w:proofErr w:type="spellStart"/>
             <w:r>
               <w:rPr>
                 <w:rFonts w:eastAsia="Times New Roman" w:cs="Times New Roman"/>
@@ -8431,7 +8242,6 @@
               </w:rPr>
               <w:t>Alt+W</w:t>
             </w:r>
-            <w:proofErr w:type="spellEnd"/>
           </w:p>
         </w:tc>
         <w:tc>
@@ -8569,7 +8379,6 @@
                 <w14:ligatures w14:val="none"/>
               </w:rPr>
             </w:pPr>
-            <w:proofErr w:type="spellStart"/>
             <w:r>
               <w:rPr>
                 <w:rFonts w:eastAsia="Times New Roman" w:cs="Times New Roman"/>
@@ -8579,7 +8388,6 @@
               </w:rPr>
               <w:t>Alt+S</w:t>
             </w:r>
-            <w:proofErr w:type="spellEnd"/>
           </w:p>
         </w:tc>
         <w:tc>
@@ -8632,26 +8440,25 @@
             </w:tcBorders>
             <w:noWrap/>
             <w:vAlign w:val="bottom"/>
-            <w:hideMark/>
-          </w:tcPr>
-          <w:p>
-            <w:pPr>
-              <w:spacing w:after="0" w:line="240" w:lineRule="auto"/>
-              <w:rPr>
-                <w:rFonts w:eastAsia="Times New Roman" w:cs="Times New Roman"/>
-                <w:color w:val="000000"/>
-                <w:kern w:val="0"/>
-                <w14:ligatures w14:val="none"/>
-              </w:rPr>
-            </w:pPr>
-            <w:r>
-              <w:rPr>
-                <w:rFonts w:eastAsia="Times New Roman" w:cs="Times New Roman"/>
-                <w:color w:val="000000"/>
-                <w:kern w:val="0"/>
-                <w14:ligatures w14:val="none"/>
-              </w:rPr>
-              <w:t>Q</w:t>
+          </w:tcPr>
+          <w:p>
+            <w:pPr>
+              <w:spacing w:after="0" w:line="240" w:lineRule="auto"/>
+              <w:rPr>
+                <w:rFonts w:eastAsia="Times New Roman" w:cs="Times New Roman"/>
+                <w:color w:val="000000"/>
+                <w:kern w:val="0"/>
+                <w14:ligatures w14:val="none"/>
+              </w:rPr>
+            </w:pPr>
+            <w:r>
+              <w:rPr>
+                <w:rFonts w:eastAsia="Times New Roman" w:cs="Times New Roman"/>
+                <w:color w:val="000000"/>
+                <w:kern w:val="0"/>
+                <w14:ligatures w14:val="none"/>
+              </w:rPr>
+              <w:t>Alt+Z</w:t>
             </w:r>
           </w:p>
         </w:tc>
@@ -8666,26 +8473,25 @@
             </w:tcBorders>
             <w:noWrap/>
             <w:vAlign w:val="bottom"/>
-            <w:hideMark/>
-          </w:tcPr>
-          <w:p>
-            <w:pPr>
-              <w:spacing w:after="0" w:line="240" w:lineRule="auto"/>
-              <w:rPr>
-                <w:rFonts w:eastAsia="Times New Roman" w:cs="Times New Roman"/>
-                <w:color w:val="000000"/>
-                <w:kern w:val="0"/>
-                <w14:ligatures w14:val="none"/>
-              </w:rPr>
-            </w:pPr>
-            <w:r>
-              <w:rPr>
-                <w:rFonts w:eastAsia="Times New Roman" w:cs="Times New Roman"/>
-                <w:color w:val="000000"/>
-                <w:kern w:val="0"/>
-                <w14:ligatures w14:val="none"/>
-              </w:rPr>
-              <w:t>Mark X</w:t>
+          </w:tcPr>
+          <w:p>
+            <w:pPr>
+              <w:spacing w:after="0" w:line="240" w:lineRule="auto"/>
+              <w:rPr>
+                <w:rFonts w:eastAsia="Times New Roman" w:cs="Times New Roman"/>
+                <w:color w:val="000000"/>
+                <w:kern w:val="0"/>
+                <w14:ligatures w14:val="none"/>
+              </w:rPr>
+            </w:pPr>
+            <w:r>
+              <w:rPr>
+                <w:rFonts w:eastAsia="Times New Roman" w:cs="Times New Roman"/>
+                <w:color w:val="000000"/>
+                <w:kern w:val="0"/>
+                <w14:ligatures w14:val="none"/>
+              </w:rPr>
+              <w:t>AOT Reticle Knob Detent Toggle</w:t>
             </w:r>
           </w:p>
         </w:tc>
@@ -8724,7 +8530,7 @@
                 <w:kern w:val="0"/>
                 <w14:ligatures w14:val="none"/>
               </w:rPr>
-              <w:t>Y</w:t>
+              <w:t>Q</w:t>
             </w:r>
           </w:p>
         </w:tc>
@@ -8758,7 +8564,7 @@
                 <w:kern w:val="0"/>
                 <w14:ligatures w14:val="none"/>
               </w:rPr>
-              <w:t>Mark Y</w:t>
+              <w:t>Mark X</w:t>
             </w:r>
           </w:p>
         </w:tc>
@@ -8797,7 +8603,7 @@
                 <w:kern w:val="0"/>
                 <w14:ligatures w14:val="none"/>
               </w:rPr>
-              <w:t>E</w:t>
+              <w:t>Y</w:t>
             </w:r>
           </w:p>
         </w:tc>
@@ -8831,7 +8637,7 @@
                 <w:kern w:val="0"/>
                 <w14:ligatures w14:val="none"/>
               </w:rPr>
-              <w:t>Mark Reject</w:t>
+              <w:t>Mark Y</w:t>
             </w:r>
           </w:p>
         </w:tc>
@@ -8845,50 +8651,67 @@
             <w:tcW w:w="1845" w:type="pct"/>
             <w:tcBorders>
               <w:top w:val="nil"/>
+              <w:left w:val="single" w:sz="4" w:space="0" w:color="auto"/>
+              <w:bottom w:val="single" w:sz="4" w:space="0" w:color="auto"/>
+              <w:right w:val="single" w:sz="4" w:space="0" w:color="auto"/>
+            </w:tcBorders>
+            <w:noWrap/>
+            <w:vAlign w:val="bottom"/>
+            <w:hideMark/>
+          </w:tcPr>
+          <w:p>
+            <w:pPr>
+              <w:spacing w:after="0" w:line="240" w:lineRule="auto"/>
+              <w:rPr>
+                <w:rFonts w:eastAsia="Times New Roman" w:cs="Times New Roman"/>
+                <w:color w:val="000000"/>
+                <w:kern w:val="0"/>
+                <w14:ligatures w14:val="none"/>
+              </w:rPr>
+            </w:pPr>
+            <w:r>
+              <w:rPr>
+                <w:rFonts w:eastAsia="Times New Roman" w:cs="Times New Roman"/>
+                <w:color w:val="000000"/>
+                <w:kern w:val="0"/>
+                <w14:ligatures w14:val="none"/>
+              </w:rPr>
+              <w:t>E</w:t>
+            </w:r>
+          </w:p>
+        </w:tc>
+        <w:tc>
+          <w:tcPr>
+            <w:tcW w:w="3155" w:type="pct"/>
+            <w:tcBorders>
+              <w:top w:val="nil"/>
               <w:left w:val="nil"/>
-              <w:bottom w:val="nil"/>
-              <w:right w:val="nil"/>
-            </w:tcBorders>
-            <w:noWrap/>
-            <w:vAlign w:val="bottom"/>
-            <w:hideMark/>
-          </w:tcPr>
-          <w:p>
-            <w:pPr>
-              <w:spacing w:after="0" w:line="240" w:lineRule="auto"/>
-              <w:rPr>
-                <w:rFonts w:eastAsia="Times New Roman" w:cs="Times New Roman"/>
-                <w:color w:val="000000"/>
-                <w:kern w:val="0"/>
-                <w14:ligatures w14:val="none"/>
-              </w:rPr>
-            </w:pPr>
-          </w:p>
-        </w:tc>
-        <w:tc>
-          <w:tcPr>
-            <w:tcW w:w="3155" w:type="pct"/>
-            <w:tcBorders>
-              <w:top w:val="nil"/>
-              <w:left w:val="nil"/>
-              <w:bottom w:val="nil"/>
-              <w:right w:val="nil"/>
-            </w:tcBorders>
-            <w:noWrap/>
-            <w:vAlign w:val="bottom"/>
-            <w:hideMark/>
-          </w:tcPr>
-          <w:p>
-            <w:pPr>
-              <w:spacing w:after="0" w:line="240" w:lineRule="auto"/>
-              <w:rPr>
-                <w:rFonts w:eastAsia="Times New Roman" w:cs="Times New Roman"/>
-                <w:kern w:val="0"/>
-                <w:sz w:val="20"/>
-                <w:szCs w:val="20"/>
-                <w14:ligatures w14:val="none"/>
-              </w:rPr>
-            </w:pPr>
+              <w:bottom w:val="single" w:sz="4" w:space="0" w:color="auto"/>
+              <w:right w:val="single" w:sz="4" w:space="0" w:color="auto"/>
+            </w:tcBorders>
+            <w:noWrap/>
+            <w:vAlign w:val="bottom"/>
+            <w:hideMark/>
+          </w:tcPr>
+          <w:p>
+            <w:pPr>
+              <w:spacing w:after="0" w:line="240" w:lineRule="auto"/>
+              <w:rPr>
+                <w:rFonts w:eastAsia="Times New Roman" w:cs="Times New Roman"/>
+                <w:color w:val="000000"/>
+                <w:kern w:val="0"/>
+                <w14:ligatures w14:val="none"/>
+              </w:rPr>
+            </w:pPr>
+            <w:r>
+              <w:rPr>
+                <w:rFonts w:eastAsia="Times New Roman" w:cs="Times New Roman"/>
+                <w:color w:val="000000"/>
+                <w:kern w:val="0"/>
+                <w14:ligatures w14:val="none"/>
+              </w:rPr>
+              <w:t>Mark Reject</w:t>
+            </w:r>
           </w:p>
         </w:tc>
       </w:tr>
@@ -8898,42 +8721,53 @@
         </w:trPr>
         <w:tc>
           <w:tcPr>
-            <w:tcW w:w="5000" w:type="pct"/>
-            <w:gridSpan w:val="2"/>
-            <w:tcBorders>
-              <w:top w:val="single" w:sz="4" w:space="0" w:color="auto"/>
-              <w:left w:val="single" w:sz="4" w:space="0" w:color="auto"/>
-              <w:bottom w:val="single" w:sz="4" w:space="0" w:color="auto"/>
-              <w:right w:val="single" w:sz="4" w:space="0" w:color="auto"/>
-            </w:tcBorders>
-            <w:noWrap/>
-            <w:vAlign w:val="bottom"/>
-            <w:hideMark/>
-          </w:tcPr>
-          <w:p>
-            <w:pPr>
-              <w:spacing w:after="0" w:line="240" w:lineRule="auto"/>
-              <w:jc w:val="center"/>
-              <w:rPr>
-                <w:rFonts w:eastAsia="Times New Roman" w:cs="Times New Roman"/>
-                <w:b/>
-                <w:bCs/>
-                <w:color w:val="000000"/>
-                <w:kern w:val="0"/>
-                <w14:ligatures w14:val="none"/>
-              </w:rPr>
-            </w:pPr>
-            <w:r>
-              <w:rPr>
-                <w:rFonts w:eastAsia="Times New Roman" w:cs="Times New Roman"/>
-                <w:b/>
-                <w:bCs/>
-                <w:color w:val="000000"/>
-                <w:kern w:val="0"/>
-                <w14:ligatures w14:val="none"/>
-              </w:rPr>
-              <w:t>Rate Of Descent (ROD) Switch</w:t>
-            </w:r>
+            <w:tcW w:w="1845" w:type="pct"/>
+            <w:tcBorders>
+              <w:top w:val="nil"/>
+              <w:left w:val="nil"/>
+              <w:bottom w:val="nil"/>
+              <w:right w:val="nil"/>
+            </w:tcBorders>
+            <w:noWrap/>
+            <w:vAlign w:val="bottom"/>
+            <w:hideMark/>
+          </w:tcPr>
+          <w:p>
+            <w:pPr>
+              <w:spacing w:after="0" w:line="240" w:lineRule="auto"/>
+              <w:rPr>
+                <w:rFonts w:eastAsia="Times New Roman" w:cs="Times New Roman"/>
+                <w:color w:val="000000"/>
+                <w:kern w:val="0"/>
+                <w14:ligatures w14:val="none"/>
+              </w:rPr>
+            </w:pPr>
+          </w:p>
+        </w:tc>
+        <w:tc>
+          <w:tcPr>
+            <w:tcW w:w="3155" w:type="pct"/>
+            <w:tcBorders>
+              <w:top w:val="nil"/>
+              <w:left w:val="nil"/>
+              <w:bottom w:val="nil"/>
+              <w:right w:val="nil"/>
+            </w:tcBorders>
+            <w:noWrap/>
+            <w:vAlign w:val="bottom"/>
+            <w:hideMark/>
+          </w:tcPr>
+          <w:p>
+            <w:pPr>
+              <w:spacing w:after="0" w:line="240" w:lineRule="auto"/>
+              <w:rPr>
+                <w:rFonts w:eastAsia="Times New Roman" w:cs="Times New Roman"/>
+                <w:kern w:val="0"/>
+                <w:sz w:val="20"/>
+                <w:szCs w:val="20"/>
+                <w14:ligatures w14:val="none"/>
+              </w:rPr>
+            </w:pPr>
           </w:p>
         </w:tc>
       </w:tr>
@@ -8943,9 +8777,10 @@
         </w:trPr>
         <w:tc>
           <w:tcPr>
-            <w:tcW w:w="1845" w:type="pct"/>
-            <w:tcBorders>
-              <w:top w:val="nil"/>
+            <w:tcW w:w="5000" w:type="pct"/>
+            <w:gridSpan w:val="2"/>
+            <w:tcBorders>
+              <w:top w:val="single" w:sz="4" w:space="0" w:color="auto"/>
               <w:left w:val="single" w:sz="4" w:space="0" w:color="auto"/>
               <w:bottom w:val="single" w:sz="4" w:space="0" w:color="auto"/>
               <w:right w:val="single" w:sz="4" w:space="0" w:color="auto"/>
@@ -8957,66 +8792,26 @@
           <w:p>
             <w:pPr>
               <w:spacing w:after="0" w:line="240" w:lineRule="auto"/>
-              <w:rPr>
-                <w:rFonts w:eastAsia="Times New Roman" w:cs="Times New Roman"/>
-                <w:color w:val="000000"/>
-                <w:kern w:val="0"/>
-                <w14:ligatures w14:val="none"/>
-              </w:rPr>
-            </w:pPr>
-            <w:r>
-              <w:rPr>
-                <w:rFonts w:eastAsia="Times New Roman" w:cs="Times New Roman"/>
-                <w:color w:val="000000"/>
-                <w:kern w:val="0"/>
-                <w14:ligatures w14:val="none"/>
-              </w:rPr>
-              <w:t>Minus</w:t>
-            </w:r>
-          </w:p>
-        </w:tc>
-        <w:tc>
-          <w:tcPr>
-            <w:tcW w:w="3155" w:type="pct"/>
-            <w:tcBorders>
-              <w:top w:val="nil"/>
-              <w:left w:val="nil"/>
-              <w:bottom w:val="single" w:sz="4" w:space="0" w:color="auto"/>
-              <w:right w:val="single" w:sz="4" w:space="0" w:color="auto"/>
-            </w:tcBorders>
-            <w:noWrap/>
-            <w:vAlign w:val="bottom"/>
-            <w:hideMark/>
-          </w:tcPr>
-          <w:p>
-            <w:pPr>
-              <w:spacing w:after="0" w:line="240" w:lineRule="auto"/>
-              <w:rPr>
-                <w:rFonts w:eastAsia="Times New Roman" w:cs="Times New Roman"/>
-                <w:color w:val="000000"/>
-                <w:kern w:val="0"/>
-                <w14:ligatures w14:val="none"/>
-              </w:rPr>
-            </w:pPr>
-            <w:proofErr w:type="gramStart"/>
-            <w:r>
-              <w:rPr>
-                <w:rFonts w:eastAsia="Times New Roman" w:cs="Times New Roman"/>
-                <w:color w:val="000000"/>
-                <w:kern w:val="0"/>
-                <w14:ligatures w14:val="none"/>
-              </w:rPr>
-              <w:t>Increase</w:t>
-            </w:r>
-            <w:proofErr w:type="gramEnd"/>
-            <w:r>
-              <w:rPr>
-                <w:rFonts w:eastAsia="Times New Roman" w:cs="Times New Roman"/>
-                <w:color w:val="000000"/>
-                <w:kern w:val="0"/>
-                <w14:ligatures w14:val="none"/>
-              </w:rPr>
-              <w:t xml:space="preserve"> Descent Rate</w:t>
+              <w:jc w:val="center"/>
+              <w:rPr>
+                <w:rFonts w:eastAsia="Times New Roman" w:cs="Times New Roman"/>
+                <w:b/>
+                <w:bCs/>
+                <w:color w:val="000000"/>
+                <w:kern w:val="0"/>
+                <w14:ligatures w14:val="none"/>
+              </w:rPr>
+            </w:pPr>
+            <w:r>
+              <w:rPr>
+                <w:rFonts w:eastAsia="Times New Roman" w:cs="Times New Roman"/>
+                <w:b/>
+                <w:bCs/>
+                <w:color w:val="000000"/>
+                <w:kern w:val="0"/>
+                <w14:ligatures w14:val="none"/>
+              </w:rPr>
+              <w:t>Rate Of Descent (ROD) Switch</w:t>
             </w:r>
           </w:p>
         </w:tc>
@@ -9055,7 +8850,7 @@
                 <w:kern w:val="0"/>
                 <w14:ligatures w14:val="none"/>
               </w:rPr>
-              <w:t>Equals</w:t>
+              <w:t>Minus</w:t>
             </w:r>
           </w:p>
         </w:tc>
@@ -9089,7 +8884,7 @@
                 <w:kern w:val="0"/>
                 <w14:ligatures w14:val="none"/>
               </w:rPr>
-              <w:t>Decrease Descent Rate</w:t>
+              <w:t>Increase Descent Rate</w:t>
             </w:r>
           </w:p>
         </w:tc>
@@ -9103,212 +8898,67 @@
             <w:tcW w:w="1845" w:type="pct"/>
             <w:tcBorders>
               <w:top w:val="nil"/>
+              <w:left w:val="single" w:sz="4" w:space="0" w:color="auto"/>
+              <w:bottom w:val="single" w:sz="4" w:space="0" w:color="auto"/>
+              <w:right w:val="single" w:sz="4" w:space="0" w:color="auto"/>
+            </w:tcBorders>
+            <w:noWrap/>
+            <w:vAlign w:val="bottom"/>
+            <w:hideMark/>
+          </w:tcPr>
+          <w:p>
+            <w:pPr>
+              <w:spacing w:after="0" w:line="240" w:lineRule="auto"/>
+              <w:rPr>
+                <w:rFonts w:eastAsia="Times New Roman" w:cs="Times New Roman"/>
+                <w:color w:val="000000"/>
+                <w:kern w:val="0"/>
+                <w14:ligatures w14:val="none"/>
+              </w:rPr>
+            </w:pPr>
+            <w:r>
+              <w:rPr>
+                <w:rFonts w:eastAsia="Times New Roman" w:cs="Times New Roman"/>
+                <w:color w:val="000000"/>
+                <w:kern w:val="0"/>
+                <w14:ligatures w14:val="none"/>
+              </w:rPr>
+              <w:t>Equals</w:t>
+            </w:r>
+          </w:p>
+        </w:tc>
+        <w:tc>
+          <w:tcPr>
+            <w:tcW w:w="3155" w:type="pct"/>
+            <w:tcBorders>
+              <w:top w:val="nil"/>
               <w:left w:val="nil"/>
-              <w:bottom w:val="nil"/>
-              <w:right w:val="nil"/>
-            </w:tcBorders>
-            <w:noWrap/>
-            <w:vAlign w:val="bottom"/>
-            <w:hideMark/>
-          </w:tcPr>
-          <w:p>
-            <w:pPr>
-              <w:spacing w:after="0" w:line="240" w:lineRule="auto"/>
-              <w:rPr>
-                <w:rFonts w:eastAsia="Times New Roman" w:cs="Times New Roman"/>
-                <w:color w:val="000000"/>
-                <w:kern w:val="0"/>
-                <w14:ligatures w14:val="none"/>
-              </w:rPr>
-            </w:pPr>
-          </w:p>
-          <w:p>
-            <w:pPr>
-              <w:spacing w:after="0" w:line="240" w:lineRule="auto"/>
-              <w:rPr>
-                <w:rFonts w:eastAsia="Times New Roman" w:cs="Times New Roman"/>
-                <w:color w:val="000000"/>
-                <w:kern w:val="0"/>
-                <w14:ligatures w14:val="none"/>
-              </w:rPr>
-            </w:pPr>
-          </w:p>
-          <w:p>
-            <w:pPr>
-              <w:spacing w:after="0" w:line="240" w:lineRule="auto"/>
-              <w:rPr>
-                <w:rFonts w:eastAsia="Times New Roman" w:cs="Times New Roman"/>
-                <w:color w:val="000000"/>
-                <w:kern w:val="0"/>
-                <w14:ligatures w14:val="none"/>
-              </w:rPr>
-            </w:pPr>
-          </w:p>
-          <w:p>
-            <w:pPr>
-              <w:spacing w:after="0" w:line="240" w:lineRule="auto"/>
-              <w:rPr>
-                <w:rFonts w:eastAsia="Times New Roman" w:cs="Times New Roman"/>
-                <w:color w:val="000000"/>
-                <w:kern w:val="0"/>
-                <w14:ligatures w14:val="none"/>
-              </w:rPr>
-            </w:pPr>
-          </w:p>
-          <w:p>
-            <w:pPr>
-              <w:spacing w:after="0" w:line="240" w:lineRule="auto"/>
-              <w:rPr>
-                <w:rFonts w:eastAsia="Times New Roman" w:cs="Times New Roman"/>
-                <w:color w:val="000000"/>
-                <w:kern w:val="0"/>
-                <w14:ligatures w14:val="none"/>
-              </w:rPr>
-            </w:pPr>
-          </w:p>
-          <w:p>
-            <w:pPr>
-              <w:spacing w:after="0" w:line="240" w:lineRule="auto"/>
-              <w:rPr>
-                <w:rFonts w:eastAsia="Times New Roman" w:cs="Times New Roman"/>
-                <w:color w:val="000000"/>
-                <w:kern w:val="0"/>
-                <w14:ligatures w14:val="none"/>
-              </w:rPr>
-            </w:pPr>
-          </w:p>
-          <w:p>
-            <w:pPr>
-              <w:spacing w:after="0" w:line="240" w:lineRule="auto"/>
-              <w:rPr>
-                <w:rFonts w:eastAsia="Times New Roman" w:cs="Times New Roman"/>
-                <w:color w:val="000000"/>
-                <w:kern w:val="0"/>
-                <w14:ligatures w14:val="none"/>
-              </w:rPr>
-            </w:pPr>
-          </w:p>
-        </w:tc>
-        <w:tc>
-          <w:tcPr>
-            <w:tcW w:w="3155" w:type="pct"/>
-            <w:tcBorders>
-              <w:top w:val="nil"/>
-              <w:left w:val="nil"/>
-              <w:bottom w:val="nil"/>
-              <w:right w:val="nil"/>
-            </w:tcBorders>
-            <w:noWrap/>
-            <w:vAlign w:val="bottom"/>
-            <w:hideMark/>
-          </w:tcPr>
-          <w:p>
-            <w:pPr>
-              <w:spacing w:after="0" w:line="240" w:lineRule="auto"/>
-              <w:rPr>
-                <w:rFonts w:eastAsia="Times New Roman" w:cs="Times New Roman"/>
-                <w:kern w:val="0"/>
-                <w:sz w:val="20"/>
-                <w:szCs w:val="20"/>
-                <w14:ligatures w14:val="none"/>
-              </w:rPr>
-            </w:pPr>
-          </w:p>
-          <w:p>
-            <w:pPr>
-              <w:spacing w:after="0" w:line="240" w:lineRule="auto"/>
-              <w:rPr>
-                <w:rFonts w:eastAsia="Times New Roman" w:cs="Times New Roman"/>
-                <w:kern w:val="0"/>
-                <w:sz w:val="20"/>
-                <w:szCs w:val="20"/>
-                <w14:ligatures w14:val="none"/>
-              </w:rPr>
-            </w:pPr>
-          </w:p>
-          <w:p>
-            <w:pPr>
-              <w:spacing w:after="0" w:line="240" w:lineRule="auto"/>
-              <w:rPr>
-                <w:rFonts w:eastAsia="Times New Roman" w:cs="Times New Roman"/>
-                <w:kern w:val="0"/>
-                <w:sz w:val="20"/>
-                <w:szCs w:val="20"/>
-                <w14:ligatures w14:val="none"/>
-              </w:rPr>
-            </w:pPr>
-          </w:p>
-          <w:p>
-            <w:pPr>
-              <w:spacing w:after="0" w:line="240" w:lineRule="auto"/>
-              <w:rPr>
-                <w:rFonts w:eastAsia="Times New Roman" w:cs="Times New Roman"/>
-                <w:kern w:val="0"/>
-                <w:sz w:val="20"/>
-                <w:szCs w:val="20"/>
-                <w14:ligatures w14:val="none"/>
-              </w:rPr>
-            </w:pPr>
-          </w:p>
-          <w:p>
-            <w:pPr>
-              <w:spacing w:after="0" w:line="240" w:lineRule="auto"/>
-              <w:rPr>
-                <w:rFonts w:eastAsia="Times New Roman" w:cs="Times New Roman"/>
-                <w:kern w:val="0"/>
-                <w:sz w:val="20"/>
-                <w:szCs w:val="20"/>
-                <w14:ligatures w14:val="none"/>
-              </w:rPr>
-            </w:pPr>
-          </w:p>
-          <w:p>
-            <w:pPr>
-              <w:spacing w:after="0" w:line="240" w:lineRule="auto"/>
-              <w:rPr>
-                <w:rFonts w:eastAsia="Times New Roman" w:cs="Times New Roman"/>
-                <w:kern w:val="0"/>
-                <w:sz w:val="20"/>
-                <w:szCs w:val="20"/>
-                <w14:ligatures w14:val="none"/>
-              </w:rPr>
-            </w:pPr>
-          </w:p>
-          <w:p>
-            <w:pPr>
-              <w:spacing w:after="0" w:line="240" w:lineRule="auto"/>
-              <w:rPr>
-                <w:rFonts w:eastAsia="Times New Roman" w:cs="Times New Roman"/>
-                <w:kern w:val="0"/>
-                <w:sz w:val="20"/>
-                <w:szCs w:val="20"/>
-                <w14:ligatures w14:val="none"/>
-              </w:rPr>
-            </w:pPr>
-          </w:p>
-          <w:p>
-            <w:pPr>
-              <w:spacing w:after="0" w:line="240" w:lineRule="auto"/>
-              <w:rPr>
-                <w:rFonts w:eastAsia="Times New Roman" w:cs="Times New Roman"/>
-                <w:kern w:val="0"/>
-                <w:sz w:val="20"/>
-                <w:szCs w:val="20"/>
-                <w14:ligatures w14:val="none"/>
-              </w:rPr>
-            </w:pPr>
-          </w:p>
-          <w:p>
-            <w:pPr>
-              <w:spacing w:after="0" w:line="240" w:lineRule="auto"/>
-              <w:rPr>
-                <w:rFonts w:eastAsia="Times New Roman" w:cs="Times New Roman"/>
-                <w:kern w:val="0"/>
-                <w:sz w:val="20"/>
-                <w:szCs w:val="20"/>
-                <w14:ligatures w14:val="none"/>
-              </w:rPr>
-            </w:pPr>
+              <w:bottom w:val="single" w:sz="4" w:space="0" w:color="auto"/>
+              <w:right w:val="single" w:sz="4" w:space="0" w:color="auto"/>
+            </w:tcBorders>
+            <w:noWrap/>
+            <w:vAlign w:val="bottom"/>
+            <w:hideMark/>
+          </w:tcPr>
+          <w:p>
+            <w:pPr>
+              <w:spacing w:after="0" w:line="240" w:lineRule="auto"/>
+              <w:rPr>
+                <w:rFonts w:eastAsia="Times New Roman" w:cs="Times New Roman"/>
+                <w:color w:val="000000"/>
+                <w:kern w:val="0"/>
+                <w14:ligatures w14:val="none"/>
+              </w:rPr>
+            </w:pPr>
+            <w:r>
+              <w:rPr>
+                <w:rFonts w:eastAsia="Times New Roman" w:cs="Times New Roman"/>
+                <w:color w:val="000000"/>
+                <w:kern w:val="0"/>
+                <w14:ligatures w14:val="none"/>
+              </w:rPr>
+              <w:t>Decrease Descent Rate</w:t>
+            </w:r>
           </w:p>
         </w:tc>
       </w:tr>
@@ -9318,54 +8968,203 @@
         </w:trPr>
         <w:tc>
           <w:tcPr>
-            <w:tcW w:w="5000" w:type="pct"/>
-            <w:gridSpan w:val="2"/>
-            <w:tcBorders>
-              <w:top w:val="single" w:sz="4" w:space="0" w:color="auto"/>
-              <w:left w:val="single" w:sz="4" w:space="0" w:color="auto"/>
-              <w:bottom w:val="single" w:sz="4" w:space="0" w:color="auto"/>
-              <w:right w:val="single" w:sz="4" w:space="0" w:color="auto"/>
-            </w:tcBorders>
-            <w:noWrap/>
-            <w:vAlign w:val="bottom"/>
-            <w:hideMark/>
-          </w:tcPr>
-          <w:p>
-            <w:pPr>
-              <w:spacing w:after="0" w:line="240" w:lineRule="auto"/>
-              <w:jc w:val="center"/>
-              <w:rPr>
-                <w:rFonts w:eastAsia="Times New Roman" w:cs="Times New Roman"/>
-                <w:b/>
-                <w:bCs/>
-                <w:color w:val="000000"/>
-                <w:kern w:val="0"/>
-                <w14:ligatures w14:val="none"/>
-              </w:rPr>
-            </w:pPr>
-            <w:r>
-              <w:rPr>
-                <w:rFonts w:eastAsia="Times New Roman" w:cs="Times New Roman"/>
-                <w:b/>
-                <w:bCs/>
-                <w:color w:val="000000"/>
-                <w:kern w:val="0"/>
-                <w14:ligatures w14:val="none"/>
-              </w:rPr>
-              <w:lastRenderedPageBreak/>
-              <w:t xml:space="preserve">LM </w:t>
-            </w:r>
-            <w:r>
-              <w:rPr>
-                <w:rFonts w:eastAsia="Times New Roman" w:cs="Times New Roman"/>
-                <w:b/>
-                <w:bCs/>
-                <w:color w:val="000000"/>
-                <w:kern w:val="0"/>
-                <w14:ligatures w14:val="none"/>
-              </w:rPr>
-              <w:t>Miscellaneous</w:t>
-            </w:r>
+            <w:tcW w:w="1845" w:type="pct"/>
+            <w:tcBorders>
+              <w:top w:val="nil"/>
+              <w:left w:val="nil"/>
+              <w:bottom w:val="nil"/>
+              <w:right w:val="nil"/>
+            </w:tcBorders>
+            <w:noWrap/>
+            <w:vAlign w:val="bottom"/>
+            <w:hideMark/>
+          </w:tcPr>
+          <w:p>
+            <w:pPr>
+              <w:spacing w:after="0" w:line="240" w:lineRule="auto"/>
+              <w:rPr>
+                <w:rFonts w:eastAsia="Times New Roman" w:cs="Times New Roman"/>
+                <w:color w:val="000000"/>
+                <w:kern w:val="0"/>
+                <w14:ligatures w14:val="none"/>
+              </w:rPr>
+            </w:pPr>
+          </w:p>
+          <w:p>
+            <w:pPr>
+              <w:spacing w:after="0" w:line="240" w:lineRule="auto"/>
+              <w:rPr>
+                <w:rFonts w:eastAsia="Times New Roman" w:cs="Times New Roman"/>
+                <w:color w:val="000000"/>
+                <w:kern w:val="0"/>
+                <w14:ligatures w14:val="none"/>
+              </w:rPr>
+            </w:pPr>
+          </w:p>
+          <w:p>
+            <w:pPr>
+              <w:spacing w:after="0" w:line="240" w:lineRule="auto"/>
+              <w:rPr>
+                <w:rFonts w:eastAsia="Times New Roman" w:cs="Times New Roman"/>
+                <w:color w:val="000000"/>
+                <w:kern w:val="0"/>
+                <w14:ligatures w14:val="none"/>
+              </w:rPr>
+            </w:pPr>
+          </w:p>
+          <w:p>
+            <w:pPr>
+              <w:spacing w:after="0" w:line="240" w:lineRule="auto"/>
+              <w:rPr>
+                <w:rFonts w:eastAsia="Times New Roman" w:cs="Times New Roman"/>
+                <w:color w:val="000000"/>
+                <w:kern w:val="0"/>
+                <w14:ligatures w14:val="none"/>
+              </w:rPr>
+            </w:pPr>
+          </w:p>
+          <w:p>
+            <w:pPr>
+              <w:spacing w:after="0" w:line="240" w:lineRule="auto"/>
+              <w:rPr>
+                <w:rFonts w:eastAsia="Times New Roman" w:cs="Times New Roman"/>
+                <w:color w:val="000000"/>
+                <w:kern w:val="0"/>
+                <w14:ligatures w14:val="none"/>
+              </w:rPr>
+            </w:pPr>
+          </w:p>
+          <w:p>
+            <w:pPr>
+              <w:spacing w:after="0" w:line="240" w:lineRule="auto"/>
+              <w:rPr>
+                <w:rFonts w:eastAsia="Times New Roman" w:cs="Times New Roman"/>
+                <w:color w:val="000000"/>
+                <w:kern w:val="0"/>
+                <w14:ligatures w14:val="none"/>
+              </w:rPr>
+            </w:pPr>
+          </w:p>
+          <w:p>
+            <w:pPr>
+              <w:spacing w:after="0" w:line="240" w:lineRule="auto"/>
+              <w:rPr>
+                <w:rFonts w:eastAsia="Times New Roman" w:cs="Times New Roman"/>
+                <w:color w:val="000000"/>
+                <w:kern w:val="0"/>
+                <w14:ligatures w14:val="none"/>
+              </w:rPr>
+            </w:pPr>
+          </w:p>
+        </w:tc>
+        <w:tc>
+          <w:tcPr>
+            <w:tcW w:w="3155" w:type="pct"/>
+            <w:tcBorders>
+              <w:top w:val="nil"/>
+              <w:left w:val="nil"/>
+              <w:bottom w:val="nil"/>
+              <w:right w:val="nil"/>
+            </w:tcBorders>
+            <w:noWrap/>
+            <w:vAlign w:val="bottom"/>
+            <w:hideMark/>
+          </w:tcPr>
+          <w:p>
+            <w:pPr>
+              <w:spacing w:after="0" w:line="240" w:lineRule="auto"/>
+              <w:rPr>
+                <w:rFonts w:eastAsia="Times New Roman" w:cs="Times New Roman"/>
+                <w:kern w:val="0"/>
+                <w:sz w:val="20"/>
+                <w:szCs w:val="20"/>
+                <w14:ligatures w14:val="none"/>
+              </w:rPr>
+            </w:pPr>
+          </w:p>
+          <w:p>
+            <w:pPr>
+              <w:spacing w:after="0" w:line="240" w:lineRule="auto"/>
+              <w:rPr>
+                <w:rFonts w:eastAsia="Times New Roman" w:cs="Times New Roman"/>
+                <w:kern w:val="0"/>
+                <w:sz w:val="20"/>
+                <w:szCs w:val="20"/>
+                <w14:ligatures w14:val="none"/>
+              </w:rPr>
+            </w:pPr>
+          </w:p>
+          <w:p>
+            <w:pPr>
+              <w:spacing w:after="0" w:line="240" w:lineRule="auto"/>
+              <w:rPr>
+                <w:rFonts w:eastAsia="Times New Roman" w:cs="Times New Roman"/>
+                <w:kern w:val="0"/>
+                <w:sz w:val="20"/>
+                <w:szCs w:val="20"/>
+                <w14:ligatures w14:val="none"/>
+              </w:rPr>
+            </w:pPr>
+          </w:p>
+          <w:p>
+            <w:pPr>
+              <w:spacing w:after="0" w:line="240" w:lineRule="auto"/>
+              <w:rPr>
+                <w:rFonts w:eastAsia="Times New Roman" w:cs="Times New Roman"/>
+                <w:kern w:val="0"/>
+                <w:sz w:val="20"/>
+                <w:szCs w:val="20"/>
+                <w14:ligatures w14:val="none"/>
+              </w:rPr>
+            </w:pPr>
+          </w:p>
+          <w:p>
+            <w:pPr>
+              <w:spacing w:after="0" w:line="240" w:lineRule="auto"/>
+              <w:rPr>
+                <w:rFonts w:eastAsia="Times New Roman" w:cs="Times New Roman"/>
+                <w:kern w:val="0"/>
+                <w:sz w:val="20"/>
+                <w:szCs w:val="20"/>
+                <w14:ligatures w14:val="none"/>
+              </w:rPr>
+            </w:pPr>
+          </w:p>
+          <w:p>
+            <w:pPr>
+              <w:spacing w:after="0" w:line="240" w:lineRule="auto"/>
+              <w:rPr>
+                <w:rFonts w:eastAsia="Times New Roman" w:cs="Times New Roman"/>
+                <w:kern w:val="0"/>
+                <w:sz w:val="20"/>
+                <w:szCs w:val="20"/>
+                <w14:ligatures w14:val="none"/>
+              </w:rPr>
+            </w:pPr>
+          </w:p>
+          <w:p>
+            <w:pPr>
+              <w:spacing w:after="0" w:line="240" w:lineRule="auto"/>
+              <w:rPr>
+                <w:rFonts w:eastAsia="Times New Roman" w:cs="Times New Roman"/>
+                <w:kern w:val="0"/>
+                <w:sz w:val="20"/>
+                <w:szCs w:val="20"/>
+                <w14:ligatures w14:val="none"/>
+              </w:rPr>
+            </w:pPr>
+          </w:p>
+          <w:p>
+            <w:pPr>
+              <w:spacing w:after="0" w:line="240" w:lineRule="auto"/>
+              <w:rPr>
+                <w:rFonts w:eastAsia="Times New Roman" w:cs="Times New Roman"/>
+                <w:kern w:val="0"/>
+                <w:sz w:val="20"/>
+                <w:szCs w:val="20"/>
+                <w14:ligatures w14:val="none"/>
+              </w:rPr>
+            </w:pPr>
           </w:p>
         </w:tc>
       </w:tr>
@@ -9375,9 +9174,10 @@
         </w:trPr>
         <w:tc>
           <w:tcPr>
-            <w:tcW w:w="1845" w:type="pct"/>
-            <w:tcBorders>
-              <w:top w:val="nil"/>
+            <w:tcW w:w="5000" w:type="pct"/>
+            <w:gridSpan w:val="2"/>
+            <w:tcBorders>
+              <w:top w:val="single" w:sz="4" w:space="0" w:color="auto"/>
               <w:left w:val="single" w:sz="4" w:space="0" w:color="auto"/>
               <w:bottom w:val="single" w:sz="4" w:space="0" w:color="auto"/>
               <w:right w:val="single" w:sz="4" w:space="0" w:color="auto"/>
@@ -9389,55 +9189,38 @@
           <w:p>
             <w:pPr>
               <w:spacing w:after="0" w:line="240" w:lineRule="auto"/>
-              <w:rPr>
-                <w:rFonts w:eastAsia="Times New Roman" w:cs="Times New Roman"/>
-                <w:color w:val="000000"/>
-                <w:kern w:val="0"/>
-                <w14:ligatures w14:val="none"/>
-              </w:rPr>
-            </w:pPr>
-            <w:r>
-              <w:rPr>
-                <w:rFonts w:eastAsia="Times New Roman" w:cs="Times New Roman"/>
-                <w:color w:val="000000"/>
-                <w:kern w:val="0"/>
-                <w14:ligatures w14:val="none"/>
-              </w:rPr>
-              <w:t>K</w:t>
-            </w:r>
-          </w:p>
-        </w:tc>
-        <w:tc>
-          <w:tcPr>
-            <w:tcW w:w="3155" w:type="pct"/>
-            <w:tcBorders>
-              <w:top w:val="nil"/>
-              <w:left w:val="nil"/>
-              <w:bottom w:val="single" w:sz="4" w:space="0" w:color="auto"/>
-              <w:right w:val="single" w:sz="4" w:space="0" w:color="auto"/>
-            </w:tcBorders>
-            <w:noWrap/>
-            <w:vAlign w:val="bottom"/>
-            <w:hideMark/>
-          </w:tcPr>
-          <w:p>
-            <w:pPr>
-              <w:spacing w:after="0" w:line="240" w:lineRule="auto"/>
-              <w:rPr>
-                <w:rFonts w:eastAsia="Times New Roman" w:cs="Times New Roman"/>
-                <w:color w:val="000000"/>
-                <w:kern w:val="0"/>
-                <w14:ligatures w14:val="none"/>
-              </w:rPr>
-            </w:pPr>
-            <w:r>
-              <w:rPr>
-                <w:rFonts w:eastAsia="Times New Roman" w:cs="Times New Roman"/>
-                <w:color w:val="000000"/>
-                <w:kern w:val="0"/>
-                <w14:ligatures w14:val="none"/>
-              </w:rPr>
-              <w:t>Toggle PGNS mode control AUTO/ATT HOLD</w:t>
+              <w:jc w:val="center"/>
+              <w:rPr>
+                <w:rFonts w:eastAsia="Times New Roman" w:cs="Times New Roman"/>
+                <w:b/>
+                <w:bCs/>
+                <w:color w:val="000000"/>
+                <w:kern w:val="0"/>
+                <w14:ligatures w14:val="none"/>
+              </w:rPr>
+            </w:pPr>
+            <w:r>
+              <w:rPr>
+                <w:rFonts w:eastAsia="Times New Roman" w:cs="Times New Roman"/>
+                <w:b/>
+                <w:bCs/>
+                <w:color w:val="000000"/>
+                <w:kern w:val="0"/>
+                <w14:ligatures w14:val="none"/>
+              </w:rPr>
+              <w:lastRenderedPageBreak/>
+              <w:t xml:space="preserve">LM </w:t>
+            </w:r>
+            <w:r>
+              <w:rPr>
+                <w:rFonts w:eastAsia="Times New Roman" w:cs="Times New Roman"/>
+                <w:b/>
+                <w:bCs/>
+                <w:color w:val="000000"/>
+                <w:kern w:val="0"/>
+                <w14:ligatures w14:val="none"/>
+              </w:rPr>
+              <w:t>Miscellaneous</w:t>
             </w:r>
           </w:p>
         </w:tc>
@@ -9476,7 +9259,7 @@
                 <w:kern w:val="0"/>
                 <w14:ligatures w14:val="none"/>
               </w:rPr>
-              <w:t>M</w:t>
+              <w:t>K</w:t>
             </w:r>
           </w:p>
         </w:tc>
@@ -9510,7 +9293,7 @@
                 <w:kern w:val="0"/>
                 <w14:ligatures w14:val="none"/>
               </w:rPr>
-              <w:t>Toggle throttle control AUTO/MAN</w:t>
+              <w:t>Toggle PGNS mode control AUTO/ATT HOLD</w:t>
             </w:r>
           </w:p>
         </w:tc>
@@ -9549,7 +9332,7 @@
                 <w:kern w:val="0"/>
                 <w14:ligatures w14:val="none"/>
               </w:rPr>
-              <w:t>SHIFT+A</w:t>
+              <w:t>M</w:t>
             </w:r>
           </w:p>
         </w:tc>
@@ -9576,25 +9359,14 @@
                 <w14:ligatures w14:val="none"/>
               </w:rPr>
             </w:pPr>
-            <w:proofErr w:type="gramStart"/>
-            <w:r>
-              <w:rPr>
-                <w:rFonts w:eastAsia="Times New Roman" w:cs="Times New Roman"/>
-                <w:color w:val="000000"/>
-                <w:kern w:val="0"/>
-                <w14:ligatures w14:val="none"/>
-              </w:rPr>
-              <w:t>Abort</w:t>
-            </w:r>
-            <w:proofErr w:type="gramEnd"/>
-            <w:r>
-              <w:rPr>
-                <w:rFonts w:eastAsia="Times New Roman" w:cs="Times New Roman"/>
-                <w:color w:val="000000"/>
-                <w:kern w:val="0"/>
-                <w14:ligatures w14:val="none"/>
-              </w:rPr>
-              <w:t xml:space="preserve"> Stage PUSH</w:t>
+            <w:r>
+              <w:rPr>
+                <w:rFonts w:eastAsia="Times New Roman" w:cs="Times New Roman"/>
+                <w:color w:val="000000"/>
+                <w:kern w:val="0"/>
+                <w14:ligatures w14:val="none"/>
+              </w:rPr>
+              <w:t>Toggle throttle control AUTO/MAN</w:t>
             </w:r>
           </w:p>
         </w:tc>
@@ -9633,7 +9405,7 @@
                 <w:kern w:val="0"/>
                 <w14:ligatures w14:val="none"/>
               </w:rPr>
-              <w:t>Zero (Numpad)</w:t>
+              <w:t>SHIFT+A</w:t>
             </w:r>
           </w:p>
         </w:tc>
@@ -9667,7 +9439,7 @@
                 <w:kern w:val="0"/>
                 <w14:ligatures w14:val="none"/>
               </w:rPr>
-              <w:t>Throttle Up</w:t>
+              <w:t>Abort Stage PUSH</w:t>
             </w:r>
           </w:p>
         </w:tc>
@@ -9706,7 +9478,7 @@
                 <w:kern w:val="0"/>
                 <w14:ligatures w14:val="none"/>
               </w:rPr>
-              <w:t>Decimal (Numpad)</w:t>
+              <w:t>Zero (Numpad)</w:t>
             </w:r>
           </w:p>
         </w:tc>
@@ -9740,7 +9512,7 @@
                 <w:kern w:val="0"/>
                 <w14:ligatures w14:val="none"/>
               </w:rPr>
-              <w:t>Throttle Down</w:t>
+              <w:t>Throttle Up</w:t>
             </w:r>
           </w:p>
         </w:tc>
@@ -9779,7 +9551,7 @@
                 <w:kern w:val="0"/>
                 <w14:ligatures w14:val="none"/>
               </w:rPr>
-              <w:t>Minus (Numpad)</w:t>
+              <w:t>Decimal (Numpad)</w:t>
             </w:r>
           </w:p>
         </w:tc>
@@ -9813,7 +9585,7 @@
                 <w:kern w:val="0"/>
                 <w14:ligatures w14:val="none"/>
               </w:rPr>
-              <w:t>Toggle Engine Stop Button</w:t>
+              <w:t>Throttle Down</w:t>
             </w:r>
           </w:p>
         </w:tc>
@@ -9852,7 +9624,7 @@
                 <w:kern w:val="0"/>
                 <w14:ligatures w14:val="none"/>
               </w:rPr>
-              <w:t>Plus (Numpad)</w:t>
+              <w:t>Minus (Numpad)</w:t>
             </w:r>
           </w:p>
         </w:tc>
@@ -9886,7 +9658,7 @@
                 <w:kern w:val="0"/>
                 <w14:ligatures w14:val="none"/>
               </w:rPr>
-              <w:t>Depress Engine Start Button</w:t>
+              <w:t>Toggle Engine Stop Button</w:t>
             </w:r>
           </w:p>
         </w:tc>
@@ -9900,55 +9672,67 @@
             <w:tcW w:w="1845" w:type="pct"/>
             <w:tcBorders>
               <w:top w:val="nil"/>
+              <w:left w:val="single" w:sz="4" w:space="0" w:color="auto"/>
+              <w:bottom w:val="single" w:sz="4" w:space="0" w:color="auto"/>
+              <w:right w:val="single" w:sz="4" w:space="0" w:color="auto"/>
+            </w:tcBorders>
+            <w:noWrap/>
+            <w:vAlign w:val="bottom"/>
+            <w:hideMark/>
+          </w:tcPr>
+          <w:p>
+            <w:pPr>
+              <w:spacing w:after="0" w:line="240" w:lineRule="auto"/>
+              <w:rPr>
+                <w:rFonts w:eastAsia="Times New Roman" w:cs="Times New Roman"/>
+                <w:color w:val="000000"/>
+                <w:kern w:val="0"/>
+                <w14:ligatures w14:val="none"/>
+              </w:rPr>
+            </w:pPr>
+            <w:r>
+              <w:rPr>
+                <w:rFonts w:eastAsia="Times New Roman" w:cs="Times New Roman"/>
+                <w:color w:val="000000"/>
+                <w:kern w:val="0"/>
+                <w14:ligatures w14:val="none"/>
+              </w:rPr>
+              <w:t>Plus (Numpad)</w:t>
+            </w:r>
+          </w:p>
+        </w:tc>
+        <w:tc>
+          <w:tcPr>
+            <w:tcW w:w="3155" w:type="pct"/>
+            <w:tcBorders>
+              <w:top w:val="nil"/>
               <w:left w:val="nil"/>
-              <w:bottom w:val="nil"/>
-              <w:right w:val="nil"/>
-            </w:tcBorders>
-            <w:noWrap/>
-            <w:vAlign w:val="bottom"/>
-            <w:hideMark/>
-          </w:tcPr>
-          <w:p>
-            <w:pPr>
-              <w:pStyle w:val="Subtitle"/>
-              <w:rPr>
-                <w:rFonts w:eastAsia="Times New Roman"/>
-              </w:rPr>
-            </w:pPr>
-          </w:p>
-          <w:p>
-            <w:pPr>
-              <w:pStyle w:val="Subtitle"/>
-            </w:pPr>
-            <w:r>
-              <w:t>EVA Controls:</w:t>
-            </w:r>
-          </w:p>
-        </w:tc>
-        <w:tc>
-          <w:tcPr>
-            <w:tcW w:w="3155" w:type="pct"/>
-            <w:tcBorders>
-              <w:top w:val="nil"/>
-              <w:left w:val="nil"/>
-              <w:bottom w:val="nil"/>
-              <w:right w:val="nil"/>
-            </w:tcBorders>
-            <w:noWrap/>
-            <w:vAlign w:val="bottom"/>
-            <w:hideMark/>
-          </w:tcPr>
-          <w:p>
-            <w:pPr>
-              <w:spacing w:after="0" w:line="240" w:lineRule="auto"/>
-              <w:rPr>
-                <w:rFonts w:eastAsia="Times New Roman" w:cs="Times New Roman"/>
-                <w:kern w:val="0"/>
-                <w:sz w:val="20"/>
-                <w:szCs w:val="20"/>
-                <w14:ligatures w14:val="none"/>
-              </w:rPr>
-            </w:pPr>
+              <w:bottom w:val="single" w:sz="4" w:space="0" w:color="auto"/>
+              <w:right w:val="single" w:sz="4" w:space="0" w:color="auto"/>
+            </w:tcBorders>
+            <w:noWrap/>
+            <w:vAlign w:val="bottom"/>
+            <w:hideMark/>
+          </w:tcPr>
+          <w:p>
+            <w:pPr>
+              <w:spacing w:after="0" w:line="240" w:lineRule="auto"/>
+              <w:rPr>
+                <w:rFonts w:eastAsia="Times New Roman" w:cs="Times New Roman"/>
+                <w:color w:val="000000"/>
+                <w:kern w:val="0"/>
+                <w14:ligatures w14:val="none"/>
+              </w:rPr>
+            </w:pPr>
+            <w:r>
+              <w:rPr>
+                <w:rFonts w:eastAsia="Times New Roman" w:cs="Times New Roman"/>
+                <w:color w:val="000000"/>
+                <w:kern w:val="0"/>
+                <w14:ligatures w14:val="none"/>
+              </w:rPr>
+              <w:t>Depress Engine Start Button</w:t>
+            </w:r>
           </w:p>
         </w:tc>
       </w:tr>
@@ -9971,15 +9755,19 @@
           </w:tcPr>
           <w:p>
             <w:pPr>
-              <w:spacing w:after="0" w:line="240" w:lineRule="auto"/>
-              <w:rPr>
-                <w:rFonts w:eastAsia="Times New Roman" w:cs="Times New Roman"/>
-                <w:kern w:val="0"/>
-                <w:sz w:val="20"/>
-                <w:szCs w:val="20"/>
-                <w14:ligatures w14:val="none"/>
-              </w:rPr>
-            </w:pPr>
+              <w:pStyle w:val="Subtitle"/>
+              <w:rPr>
+                <w:rFonts w:eastAsia="Times New Roman"/>
+              </w:rPr>
+            </w:pPr>
+          </w:p>
+          <w:p>
+            <w:pPr>
+              <w:pStyle w:val="Subtitle"/>
+            </w:pPr>
+            <w:r>
+              <w:t>EVA Controls:</w:t>
+            </w:r>
           </w:p>
         </w:tc>
         <w:tc>
@@ -10015,43 +9803,54 @@
         </w:trPr>
         <w:tc>
           <w:tcPr>
-            <w:tcW w:w="5000" w:type="pct"/>
-            <w:gridSpan w:val="2"/>
-            <w:tcBorders>
-              <w:top w:val="single" w:sz="4" w:space="0" w:color="auto"/>
-              <w:left w:val="single" w:sz="4" w:space="0" w:color="auto"/>
-              <w:bottom w:val="single" w:sz="4" w:space="0" w:color="auto"/>
-              <w:right w:val="single" w:sz="4" w:space="0" w:color="auto"/>
-            </w:tcBorders>
-            <w:noWrap/>
-            <w:vAlign w:val="bottom"/>
-            <w:hideMark/>
-          </w:tcPr>
-          <w:p>
-            <w:pPr>
-              <w:spacing w:after="0" w:line="240" w:lineRule="auto"/>
-              <w:jc w:val="center"/>
-              <w:rPr>
-                <w:rFonts w:eastAsia="Times New Roman" w:cs="Times New Roman"/>
-                <w:b/>
-                <w:bCs/>
-                <w:color w:val="000000"/>
-                <w:kern w:val="0"/>
-                <w14:ligatures w14:val="none"/>
-              </w:rPr>
-            </w:pPr>
-            <w:bookmarkStart w:id="4" w:name="_Hlk199486662"/>
-            <w:r>
-              <w:rPr>
-                <w:rFonts w:eastAsia="Times New Roman" w:cs="Times New Roman"/>
-                <w:b/>
-                <w:bCs/>
-                <w:color w:val="000000"/>
-                <w:kern w:val="0"/>
-                <w14:ligatures w14:val="none"/>
-              </w:rPr>
-              <w:t>EVA</w:t>
-            </w:r>
+            <w:tcW w:w="1845" w:type="pct"/>
+            <w:tcBorders>
+              <w:top w:val="nil"/>
+              <w:left w:val="nil"/>
+              <w:bottom w:val="nil"/>
+              <w:right w:val="nil"/>
+            </w:tcBorders>
+            <w:noWrap/>
+            <w:vAlign w:val="bottom"/>
+            <w:hideMark/>
+          </w:tcPr>
+          <w:p>
+            <w:pPr>
+              <w:spacing w:after="0" w:line="240" w:lineRule="auto"/>
+              <w:rPr>
+                <w:rFonts w:eastAsia="Times New Roman" w:cs="Times New Roman"/>
+                <w:kern w:val="0"/>
+                <w:sz w:val="20"/>
+                <w:szCs w:val="20"/>
+                <w14:ligatures w14:val="none"/>
+              </w:rPr>
+            </w:pPr>
+          </w:p>
+        </w:tc>
+        <w:tc>
+          <w:tcPr>
+            <w:tcW w:w="3155" w:type="pct"/>
+            <w:tcBorders>
+              <w:top w:val="nil"/>
+              <w:left w:val="nil"/>
+              <w:bottom w:val="nil"/>
+              <w:right w:val="nil"/>
+            </w:tcBorders>
+            <w:noWrap/>
+            <w:vAlign w:val="bottom"/>
+            <w:hideMark/>
+          </w:tcPr>
+          <w:p>
+            <w:pPr>
+              <w:spacing w:after="0" w:line="240" w:lineRule="auto"/>
+              <w:rPr>
+                <w:rFonts w:eastAsia="Times New Roman" w:cs="Times New Roman"/>
+                <w:kern w:val="0"/>
+                <w:sz w:val="20"/>
+                <w:szCs w:val="20"/>
+                <w14:ligatures w14:val="none"/>
+              </w:rPr>
+            </w:pPr>
           </w:p>
         </w:tc>
       </w:tr>
@@ -10061,9 +9860,10 @@
         </w:trPr>
         <w:tc>
           <w:tcPr>
-            <w:tcW w:w="1845" w:type="pct"/>
-            <w:tcBorders>
-              <w:top w:val="nil"/>
+            <w:tcW w:w="5000" w:type="pct"/>
+            <w:gridSpan w:val="2"/>
+            <w:tcBorders>
+              <w:top w:val="single" w:sz="4" w:space="0" w:color="auto"/>
               <w:left w:val="single" w:sz="4" w:space="0" w:color="auto"/>
               <w:bottom w:val="single" w:sz="4" w:space="0" w:color="auto"/>
               <w:right w:val="single" w:sz="4" w:space="0" w:color="auto"/>
@@ -10075,73 +9875,27 @@
           <w:p>
             <w:pPr>
               <w:spacing w:after="0" w:line="240" w:lineRule="auto"/>
-              <w:rPr>
-                <w:rFonts w:eastAsia="Times New Roman" w:cs="Times New Roman"/>
-                <w:color w:val="000000"/>
-                <w:kern w:val="0"/>
-                <w14:ligatures w14:val="none"/>
-              </w:rPr>
-            </w:pPr>
-            <w:r>
-              <w:rPr>
-                <w:rFonts w:eastAsia="Times New Roman" w:cs="Times New Roman"/>
-                <w:color w:val="000000"/>
-                <w:kern w:val="0"/>
-                <w14:ligatures w14:val="none"/>
-              </w:rPr>
-              <w:t>E</w:t>
-            </w:r>
-          </w:p>
-        </w:tc>
-        <w:tc>
-          <w:tcPr>
-            <w:tcW w:w="3155" w:type="pct"/>
-            <w:tcBorders>
-              <w:top w:val="nil"/>
-              <w:left w:val="nil"/>
-              <w:bottom w:val="single" w:sz="4" w:space="0" w:color="auto"/>
-              <w:right w:val="single" w:sz="4" w:space="0" w:color="auto"/>
-            </w:tcBorders>
-            <w:noWrap/>
-            <w:vAlign w:val="bottom"/>
-            <w:hideMark/>
-          </w:tcPr>
-          <w:p>
-            <w:pPr>
-              <w:spacing w:after="0" w:line="240" w:lineRule="auto"/>
-              <w:rPr>
-                <w:rFonts w:eastAsia="Times New Roman" w:cs="Times New Roman"/>
-                <w:color w:val="000000"/>
-                <w:kern w:val="0"/>
-                <w14:ligatures w14:val="none"/>
-              </w:rPr>
-            </w:pPr>
-            <w:r>
-              <w:rPr>
-                <w:rFonts w:eastAsia="Times New Roman" w:cs="Times New Roman"/>
-                <w:color w:val="000000"/>
-                <w:kern w:val="0"/>
-                <w14:ligatures w14:val="none"/>
-              </w:rPr>
-              <w:t xml:space="preserve">Boards LM (Standing by </w:t>
-            </w:r>
-            <w:r>
-              <w:rPr>
-                <w:rFonts w:eastAsia="Times New Roman" w:cs="Times New Roman"/>
-                <w:color w:val="000000"/>
-                <w:kern w:val="0"/>
-                <w14:ligatures w14:val="none"/>
-              </w:rPr>
-              <w:t xml:space="preserve">LM </w:t>
-            </w:r>
-            <w:r>
-              <w:rPr>
-                <w:rFonts w:eastAsia="Times New Roman" w:cs="Times New Roman"/>
-                <w:color w:val="000000"/>
-                <w:kern w:val="0"/>
-                <w14:ligatures w14:val="none"/>
-              </w:rPr>
-              <w:t>ladder)</w:t>
+              <w:jc w:val="center"/>
+              <w:rPr>
+                <w:rFonts w:eastAsia="Times New Roman" w:cs="Times New Roman"/>
+                <w:b/>
+                <w:bCs/>
+                <w:color w:val="000000"/>
+                <w:kern w:val="0"/>
+                <w14:ligatures w14:val="none"/>
+              </w:rPr>
+            </w:pPr>
+            <w:bookmarkStart w:id="4" w:name="_Hlk199486662"/>
+            <w:r>
+              <w:rPr>
+                <w:rFonts w:eastAsia="Times New Roman" w:cs="Times New Roman"/>
+                <w:b/>
+                <w:bCs/>
+                <w:color w:val="000000"/>
+                <w:kern w:val="0"/>
+                <w14:ligatures w14:val="none"/>
+              </w:rPr>
+              <w:t>EVA</w:t>
             </w:r>
           </w:p>
         </w:tc>
@@ -10180,7 +9934,7 @@
                 <w:kern w:val="0"/>
                 <w14:ligatures w14:val="none"/>
               </w:rPr>
-              <w:t>F</w:t>
+              <w:t>E</w:t>
             </w:r>
           </w:p>
         </w:tc>
@@ -10214,7 +9968,25 @@
                 <w:kern w:val="0"/>
                 <w14:ligatures w14:val="none"/>
               </w:rPr>
-              <w:t>Plant Flag</w:t>
+              <w:t xml:space="preserve">Boards LM (Standing by </w:t>
+            </w:r>
+            <w:r>
+              <w:rPr>
+                <w:rFonts w:eastAsia="Times New Roman" w:cs="Times New Roman"/>
+                <w:color w:val="000000"/>
+                <w:kern w:val="0"/>
+                <w14:ligatures w14:val="none"/>
+              </w:rPr>
+              <w:t xml:space="preserve">LM </w:t>
+            </w:r>
+            <w:r>
+              <w:rPr>
+                <w:rFonts w:eastAsia="Times New Roman" w:cs="Times New Roman"/>
+                <w:color w:val="000000"/>
+                <w:kern w:val="0"/>
+                <w14:ligatures w14:val="none"/>
+              </w:rPr>
+              <w:t>ladder)</w:t>
             </w:r>
           </w:p>
         </w:tc>
@@ -10253,7 +10025,7 @@
                 <w:kern w:val="0"/>
                 <w14:ligatures w14:val="none"/>
               </w:rPr>
-              <w:t>V</w:t>
+              <w:t>F</w:t>
             </w:r>
           </w:p>
         </w:tc>
@@ -10287,16 +10059,7 @@
                 <w:kern w:val="0"/>
                 <w14:ligatures w14:val="none"/>
               </w:rPr>
-              <w:t xml:space="preserve">Deploy </w:t>
-            </w:r>
-            <w:r>
-              <w:rPr>
-                <w:rFonts w:eastAsia="Times New Roman" w:cs="Times New Roman"/>
-                <w:color w:val="000000"/>
-                <w:kern w:val="0"/>
-                <w14:ligatures w14:val="none"/>
-              </w:rPr>
-              <w:t>LRV</w:t>
+              <w:t>Plant Flag</w:t>
             </w:r>
           </w:p>
         </w:tc>
@@ -10335,7 +10098,7 @@
                 <w:kern w:val="0"/>
                 <w14:ligatures w14:val="none"/>
               </w:rPr>
-              <w:t>B</w:t>
+              <w:t>V</w:t>
             </w:r>
           </w:p>
         </w:tc>
@@ -10369,7 +10132,7 @@
                 <w:kern w:val="0"/>
                 <w14:ligatures w14:val="none"/>
               </w:rPr>
-              <w:t xml:space="preserve">Boards/Deboards </w:t>
+              <w:t xml:space="preserve">Deploy </w:t>
             </w:r>
             <w:r>
               <w:rPr>
@@ -10379,51 +10142,6 @@
                 <w14:ligatures w14:val="none"/>
               </w:rPr>
               <w:t>LRV</w:t>
-            </w:r>
-            <w:r>
-              <w:rPr>
-                <w:rFonts w:eastAsia="Times New Roman" w:cs="Times New Roman"/>
-                <w:color w:val="000000"/>
-                <w:kern w:val="0"/>
-                <w14:ligatures w14:val="none"/>
-              </w:rPr>
-              <w:t xml:space="preserve"> (Standing </w:t>
-            </w:r>
-            <w:r>
-              <w:rPr>
-                <w:rFonts w:eastAsia="Times New Roman" w:cs="Times New Roman"/>
-                <w:color w:val="000000"/>
-                <w:kern w:val="0"/>
-                <w14:ligatures w14:val="none"/>
-              </w:rPr>
-              <w:t>by</w:t>
-            </w:r>
-            <w:r>
-              <w:rPr>
-                <w:rFonts w:eastAsia="Times New Roman" w:cs="Times New Roman"/>
-                <w:color w:val="000000"/>
-                <w:kern w:val="0"/>
-                <w14:ligatures w14:val="none"/>
-              </w:rPr>
-              <w:t xml:space="preserve"> </w:t>
-            </w:r>
-            <w:r>
-              <w:rPr>
-                <w:rFonts w:eastAsia="Times New Roman" w:cs="Times New Roman"/>
-                <w:color w:val="000000"/>
-                <w:kern w:val="0"/>
-                <w14:ligatures w14:val="none"/>
-              </w:rPr>
-              <w:t>LRV</w:t>
-            </w:r>
-            <w:r>
-              <w:rPr>
-                <w:rFonts w:eastAsia="Times New Roman" w:cs="Times New Roman"/>
-                <w:color w:val="000000"/>
-                <w:kern w:val="0"/>
-                <w14:ligatures w14:val="none"/>
-              </w:rPr>
-              <w:t>)</w:t>
             </w:r>
           </w:p>
         </w:tc>
@@ -10462,7 +10180,7 @@
                 <w:kern w:val="0"/>
                 <w14:ligatures w14:val="none"/>
               </w:rPr>
-              <w:t>Plus (Numpad +)</w:t>
+              <w:t>B</w:t>
             </w:r>
           </w:p>
         </w:tc>
@@ -10496,16 +10214,61 @@
                 <w:kern w:val="0"/>
                 <w14:ligatures w14:val="none"/>
               </w:rPr>
-              <w:t xml:space="preserve">LRV </w:t>
-            </w:r>
-            <w:r>
-              <w:rPr>
-                <w:rFonts w:eastAsia="Times New Roman" w:cs="Times New Roman"/>
-                <w:color w:val="000000"/>
-                <w:kern w:val="0"/>
-                <w14:ligatures w14:val="none"/>
-              </w:rPr>
-              <w:t>Forward</w:t>
+              <w:t xml:space="preserve">Boards/Deboards </w:t>
+            </w:r>
+            <w:r>
+              <w:rPr>
+                <w:rFonts w:eastAsia="Times New Roman" w:cs="Times New Roman"/>
+                <w:color w:val="000000"/>
+                <w:kern w:val="0"/>
+                <w14:ligatures w14:val="none"/>
+              </w:rPr>
+              <w:t>LRV</w:t>
+            </w:r>
+            <w:r>
+              <w:rPr>
+                <w:rFonts w:eastAsia="Times New Roman" w:cs="Times New Roman"/>
+                <w:color w:val="000000"/>
+                <w:kern w:val="0"/>
+                <w14:ligatures w14:val="none"/>
+              </w:rPr>
+              <w:t xml:space="preserve"> (Standing </w:t>
+            </w:r>
+            <w:r>
+              <w:rPr>
+                <w:rFonts w:eastAsia="Times New Roman" w:cs="Times New Roman"/>
+                <w:color w:val="000000"/>
+                <w:kern w:val="0"/>
+                <w14:ligatures w14:val="none"/>
+              </w:rPr>
+              <w:t>by</w:t>
+            </w:r>
+            <w:r>
+              <w:rPr>
+                <w:rFonts w:eastAsia="Times New Roman" w:cs="Times New Roman"/>
+                <w:color w:val="000000"/>
+                <w:kern w:val="0"/>
+                <w14:ligatures w14:val="none"/>
+              </w:rPr>
+              <w:t xml:space="preserve"> </w:t>
+            </w:r>
+            <w:r>
+              <w:rPr>
+                <w:rFonts w:eastAsia="Times New Roman" w:cs="Times New Roman"/>
+                <w:color w:val="000000"/>
+                <w:kern w:val="0"/>
+                <w14:ligatures w14:val="none"/>
+              </w:rPr>
+              <w:t>LRV</w:t>
+            </w:r>
+            <w:r>
+              <w:rPr>
+                <w:rFonts w:eastAsia="Times New Roman" w:cs="Times New Roman"/>
+                <w:color w:val="000000"/>
+                <w:kern w:val="0"/>
+                <w14:ligatures w14:val="none"/>
+              </w:rPr>
+              <w:t>)</w:t>
             </w:r>
           </w:p>
         </w:tc>
@@ -10544,7 +10307,7 @@
                 <w:kern w:val="0"/>
                 <w14:ligatures w14:val="none"/>
               </w:rPr>
-              <w:t>Minus (Numpad -)</w:t>
+              <w:t>Plus (Numpad +)</w:t>
             </w:r>
           </w:p>
         </w:tc>
@@ -10587,7 +10350,7 @@
                 <w:kern w:val="0"/>
                 <w14:ligatures w14:val="none"/>
               </w:rPr>
-              <w:t>Reverse</w:t>
+              <w:t>Forward</w:t>
             </w:r>
           </w:p>
         </w:tc>
@@ -10626,7 +10389,7 @@
                 <w:kern w:val="0"/>
                 <w14:ligatures w14:val="none"/>
               </w:rPr>
-              <w:t>1 (Numpad)</w:t>
+              <w:t>Minus (Numpad -)</w:t>
             </w:r>
           </w:p>
         </w:tc>
@@ -10660,15 +10423,6 @@
                 <w:kern w:val="0"/>
                 <w14:ligatures w14:val="none"/>
               </w:rPr>
-              <w:t xml:space="preserve">Steer </w:t>
-            </w:r>
-            <w:r>
-              <w:rPr>
-                <w:rFonts w:eastAsia="Times New Roman" w:cs="Times New Roman"/>
-                <w:color w:val="000000"/>
-                <w:kern w:val="0"/>
-                <w14:ligatures w14:val="none"/>
-              </w:rPr>
               <w:t xml:space="preserve">LRV </w:t>
             </w:r>
             <w:r>
@@ -10678,7 +10432,7 @@
                 <w:kern w:val="0"/>
                 <w14:ligatures w14:val="none"/>
               </w:rPr>
-              <w:t>Left</w:t>
+              <w:t>Reverse</w:t>
             </w:r>
           </w:p>
         </w:tc>
@@ -10717,7 +10471,7 @@
                 <w:kern w:val="0"/>
                 <w14:ligatures w14:val="none"/>
               </w:rPr>
-              <w:t>3 (Numpad)</w:t>
+              <w:t>1 (Numpad)</w:t>
             </w:r>
           </w:p>
         </w:tc>
@@ -10769,7 +10523,7 @@
                 <w:kern w:val="0"/>
                 <w14:ligatures w14:val="none"/>
               </w:rPr>
-              <w:t>Right</w:t>
+              <w:t>Left</w:t>
             </w:r>
           </w:p>
         </w:tc>
@@ -10808,7 +10562,7 @@
                 <w:kern w:val="0"/>
                 <w14:ligatures w14:val="none"/>
               </w:rPr>
-              <w:t>5 (Numpad)</w:t>
+              <w:t>3 (Numpad)</w:t>
             </w:r>
           </w:p>
         </w:tc>
@@ -10842,7 +10596,7 @@
                 <w:kern w:val="0"/>
                 <w14:ligatures w14:val="none"/>
               </w:rPr>
-              <w:t xml:space="preserve">Center </w:t>
+              <w:t xml:space="preserve">Steer </w:t>
             </w:r>
             <w:r>
               <w:rPr>
@@ -10860,7 +10614,7 @@
                 <w:kern w:val="0"/>
                 <w14:ligatures w14:val="none"/>
               </w:rPr>
-              <w:t>Steering</w:t>
+              <w:t>Right</w:t>
             </w:r>
           </w:p>
         </w:tc>
@@ -10880,25 +10634,26 @@
             </w:tcBorders>
             <w:noWrap/>
             <w:vAlign w:val="bottom"/>
-          </w:tcPr>
-          <w:p>
-            <w:pPr>
-              <w:spacing w:after="0" w:line="240" w:lineRule="auto"/>
-              <w:rPr>
-                <w:rFonts w:eastAsia="Times New Roman" w:cs="Times New Roman"/>
-                <w:color w:val="000000"/>
-                <w:kern w:val="0"/>
-                <w14:ligatures w14:val="none"/>
-              </w:rPr>
-            </w:pPr>
-            <w:r>
-              <w:rPr>
-                <w:rFonts w:eastAsia="Times New Roman" w:cs="Times New Roman"/>
-                <w:color w:val="000000"/>
-                <w:kern w:val="0"/>
-                <w14:ligatures w14:val="none"/>
-              </w:rPr>
-              <w:t>K</w:t>
+            <w:hideMark/>
+          </w:tcPr>
+          <w:p>
+            <w:pPr>
+              <w:spacing w:after="0" w:line="240" w:lineRule="auto"/>
+              <w:rPr>
+                <w:rFonts w:eastAsia="Times New Roman" w:cs="Times New Roman"/>
+                <w:color w:val="000000"/>
+                <w:kern w:val="0"/>
+                <w14:ligatures w14:val="none"/>
+              </w:rPr>
+            </w:pPr>
+            <w:r>
+              <w:rPr>
+                <w:rFonts w:eastAsia="Times New Roman" w:cs="Times New Roman"/>
+                <w:color w:val="000000"/>
+                <w:kern w:val="0"/>
+                <w14:ligatures w14:val="none"/>
+              </w:rPr>
+              <w:t>5 (Numpad)</w:t>
             </w:r>
           </w:p>
         </w:tc>
@@ -10913,25 +10668,44 @@
             </w:tcBorders>
             <w:noWrap/>
             <w:vAlign w:val="bottom"/>
-          </w:tcPr>
-          <w:p>
-            <w:pPr>
-              <w:spacing w:after="0" w:line="240" w:lineRule="auto"/>
-              <w:rPr>
-                <w:rFonts w:eastAsia="Times New Roman" w:cs="Times New Roman"/>
-                <w:color w:val="000000"/>
-                <w:kern w:val="0"/>
-                <w14:ligatures w14:val="none"/>
-              </w:rPr>
-            </w:pPr>
-            <w:r>
-              <w:rPr>
-                <w:rFonts w:eastAsia="Times New Roman" w:cs="Times New Roman"/>
-                <w:color w:val="000000"/>
-                <w:kern w:val="0"/>
-                <w14:ligatures w14:val="none"/>
-              </w:rPr>
-              <w:t>Deploy EASEP/ALSEP Item</w:t>
+            <w:hideMark/>
+          </w:tcPr>
+          <w:p>
+            <w:pPr>
+              <w:spacing w:after="0" w:line="240" w:lineRule="auto"/>
+              <w:rPr>
+                <w:rFonts w:eastAsia="Times New Roman" w:cs="Times New Roman"/>
+                <w:color w:val="000000"/>
+                <w:kern w:val="0"/>
+                <w14:ligatures w14:val="none"/>
+              </w:rPr>
+            </w:pPr>
+            <w:r>
+              <w:rPr>
+                <w:rFonts w:eastAsia="Times New Roman" w:cs="Times New Roman"/>
+                <w:color w:val="000000"/>
+                <w:kern w:val="0"/>
+                <w14:ligatures w14:val="none"/>
+              </w:rPr>
+              <w:t xml:space="preserve">Center </w:t>
+            </w:r>
+            <w:r>
+              <w:rPr>
+                <w:rFonts w:eastAsia="Times New Roman" w:cs="Times New Roman"/>
+                <w:color w:val="000000"/>
+                <w:kern w:val="0"/>
+                <w14:ligatures w14:val="none"/>
+              </w:rPr>
+              <w:t xml:space="preserve">LRV </w:t>
+            </w:r>
+            <w:r>
+              <w:rPr>
+                <w:rFonts w:eastAsia="Times New Roman" w:cs="Times New Roman"/>
+                <w:color w:val="000000"/>
+                <w:kern w:val="0"/>
+                <w14:ligatures w14:val="none"/>
+              </w:rPr>
+              <w:t>Steering</w:t>
             </w:r>
           </w:p>
         </w:tc>
@@ -11048,18 +10822,7 @@
                 <w:kern w:val="0"/>
                 <w14:ligatures w14:val="none"/>
               </w:rPr>
-              <w:t>EASEP</w:t>
-            </w:r>
-            <w:r>
-              <w:rPr>
-                <w:rFonts w:eastAsia="Times New Roman" w:cs="Times New Roman"/>
-                <w:b/>
-                <w:bCs/>
-                <w:color w:val="000000"/>
-                <w:kern w:val="0"/>
-                <w14:ligatures w14:val="none"/>
-              </w:rPr>
-              <w:t xml:space="preserve"> Order</w:t>
+              <w:t>EASEP/ALSEP</w:t>
             </w:r>
           </w:p>
         </w:tc>
@@ -11098,7 +10861,7 @@
                 <w:kern w:val="0"/>
                 <w14:ligatures w14:val="none"/>
               </w:rPr>
-              <w:t>CDR</w:t>
+              <w:t>K</w:t>
             </w:r>
           </w:p>
         </w:tc>
@@ -11132,506 +10895,17 @@
                 <w:kern w:val="0"/>
                 <w14:ligatures w14:val="none"/>
               </w:rPr>
-              <w:t>Camera</w:t>
-            </w:r>
-            <w:r>
-              <w:rPr>
-                <w:rFonts w:eastAsia="Times New Roman" w:cs="Times New Roman"/>
-                <w:color w:val="000000"/>
-                <w:kern w:val="0"/>
-                <w14:ligatures w14:val="none"/>
-              </w:rPr>
-              <w:t xml:space="preserve"> -&gt; Erectable </w:t>
-            </w:r>
-            <w:r>
-              <w:rPr>
-                <w:rFonts w:eastAsia="Times New Roman" w:cs="Times New Roman"/>
-                <w:color w:val="000000"/>
-                <w:kern w:val="0"/>
-                <w14:ligatures w14:val="none"/>
-              </w:rPr>
-              <w:t>S</w:t>
-            </w:r>
-            <w:r>
-              <w:rPr>
-                <w:rFonts w:eastAsia="Times New Roman" w:cs="Times New Roman"/>
-                <w:color w:val="000000"/>
-                <w:kern w:val="0"/>
-                <w14:ligatures w14:val="none"/>
-              </w:rPr>
-              <w:t>-B</w:t>
-            </w:r>
-            <w:r>
-              <w:rPr>
-                <w:rFonts w:eastAsia="Times New Roman" w:cs="Times New Roman"/>
-                <w:color w:val="000000"/>
-                <w:kern w:val="0"/>
-                <w14:ligatures w14:val="none"/>
-              </w:rPr>
-              <w:t>and</w:t>
-            </w:r>
-          </w:p>
-        </w:tc>
-      </w:tr>
-      <w:tr>
-        <w:trPr>
-          <w:trHeight w:val="300"/>
-        </w:trPr>
-        <w:tc>
-          <w:tcPr>
-            <w:tcW w:w="1845" w:type="pct"/>
-            <w:tcBorders>
-              <w:top w:val="single" w:sz="4" w:space="0" w:color="auto"/>
-              <w:left w:val="single" w:sz="4" w:space="0" w:color="auto"/>
-              <w:bottom w:val="single" w:sz="4" w:space="0" w:color="auto"/>
-              <w:right w:val="single" w:sz="4" w:space="0" w:color="auto"/>
-            </w:tcBorders>
-            <w:noWrap/>
-            <w:vAlign w:val="bottom"/>
-          </w:tcPr>
-          <w:p>
-            <w:pPr>
-              <w:spacing w:after="0" w:line="240" w:lineRule="auto"/>
-              <w:rPr>
-                <w:rFonts w:eastAsia="Times New Roman" w:cs="Times New Roman"/>
-                <w:color w:val="000000"/>
-                <w:kern w:val="0"/>
-                <w14:ligatures w14:val="none"/>
-              </w:rPr>
-            </w:pPr>
-            <w:r>
-              <w:rPr>
-                <w:rFonts w:eastAsia="Times New Roman" w:cs="Times New Roman"/>
-                <w:color w:val="000000"/>
-                <w:kern w:val="0"/>
-                <w14:ligatures w14:val="none"/>
-              </w:rPr>
-              <w:t>LMP</w:t>
-            </w:r>
-          </w:p>
-        </w:tc>
-        <w:tc>
-          <w:tcPr>
-            <w:tcW w:w="3155" w:type="pct"/>
-            <w:tcBorders>
-              <w:top w:val="single" w:sz="4" w:space="0" w:color="auto"/>
-              <w:left w:val="nil"/>
-              <w:bottom w:val="single" w:sz="4" w:space="0" w:color="auto"/>
-              <w:right w:val="single" w:sz="4" w:space="0" w:color="auto"/>
-            </w:tcBorders>
-            <w:noWrap/>
-            <w:vAlign w:val="bottom"/>
-          </w:tcPr>
-          <w:p>
-            <w:pPr>
-              <w:spacing w:after="0" w:line="240" w:lineRule="auto"/>
-              <w:rPr>
-                <w:rFonts w:eastAsia="Times New Roman" w:cs="Times New Roman"/>
-                <w:color w:val="000000"/>
-                <w:kern w:val="0"/>
-                <w14:ligatures w14:val="none"/>
-              </w:rPr>
-            </w:pPr>
-            <w:r>
-              <w:rPr>
-                <w:rFonts w:eastAsia="Times New Roman" w:cs="Times New Roman"/>
-                <w:color w:val="000000"/>
-                <w:kern w:val="0"/>
-                <w14:ligatures w14:val="none"/>
-              </w:rPr>
-              <w:t>SWC</w:t>
-            </w:r>
-            <w:r>
-              <w:rPr>
-                <w:rFonts w:eastAsia="Times New Roman" w:cs="Times New Roman"/>
-                <w:color w:val="000000"/>
-                <w:kern w:val="0"/>
-                <w14:ligatures w14:val="none"/>
-              </w:rPr>
-              <w:t xml:space="preserve"> -&gt; </w:t>
-            </w:r>
-            <w:r>
-              <w:rPr>
-                <w:rFonts w:eastAsia="Times New Roman" w:cs="Times New Roman"/>
-                <w:color w:val="000000"/>
-                <w:kern w:val="0"/>
-                <w14:ligatures w14:val="none"/>
-              </w:rPr>
-              <w:t>PSEP</w:t>
-            </w:r>
-            <w:r>
-              <w:rPr>
-                <w:rFonts w:eastAsia="Times New Roman" w:cs="Times New Roman"/>
-                <w:color w:val="000000"/>
-                <w:kern w:val="0"/>
-                <w14:ligatures w14:val="none"/>
-              </w:rPr>
-              <w:t xml:space="preserve"> -&gt; </w:t>
-            </w:r>
-            <w:r>
-              <w:rPr>
-                <w:rFonts w:eastAsia="Times New Roman" w:cs="Times New Roman"/>
-                <w:color w:val="000000"/>
-                <w:kern w:val="0"/>
-                <w14:ligatures w14:val="none"/>
-              </w:rPr>
-              <w:t>LRRR</w:t>
+              <w:t>Deploy Next Item</w:t>
             </w:r>
           </w:p>
         </w:tc>
       </w:tr>
     </w:tbl>
     <w:p/>
-    <w:tbl>
-      <w:tblPr>
-        <w:tblW w:w="5000" w:type="pct"/>
-        <w:tblBorders>
-          <w:top w:val="single" w:sz="4" w:space="0" w:color="auto"/>
-          <w:left w:val="single" w:sz="4" w:space="0" w:color="auto"/>
-          <w:bottom w:val="single" w:sz="4" w:space="0" w:color="auto"/>
-          <w:right w:val="single" w:sz="4" w:space="0" w:color="auto"/>
-          <w:insideH w:val="single" w:sz="4" w:space="0" w:color="auto"/>
-          <w:insideV w:val="single" w:sz="4" w:space="0" w:color="auto"/>
-        </w:tblBorders>
-        <w:tblLook w:val="04A0" w:firstRow="1" w:lastRow="0" w:firstColumn="1" w:lastColumn="0" w:noHBand="0" w:noVBand="1"/>
-      </w:tblPr>
-      <w:tblGrid>
-        <w:gridCol w:w="3450"/>
-        <w:gridCol w:w="5900"/>
-      </w:tblGrid>
-      <w:tr>
-        <w:trPr>
-          <w:trHeight w:val="300"/>
-        </w:trPr>
-        <w:tc>
-          <w:tcPr>
-            <w:tcW w:w="5000" w:type="pct"/>
-            <w:gridSpan w:val="2"/>
-            <w:noWrap/>
-            <w:vAlign w:val="bottom"/>
-            <w:hideMark/>
-          </w:tcPr>
-          <w:p>
-            <w:pPr>
-              <w:spacing w:after="0" w:line="240" w:lineRule="auto"/>
-              <w:jc w:val="center"/>
-              <w:rPr>
-                <w:rFonts w:eastAsia="Times New Roman" w:cs="Times New Roman"/>
-                <w:b/>
-                <w:bCs/>
-                <w:color w:val="000000"/>
-                <w:kern w:val="0"/>
-                <w14:ligatures w14:val="none"/>
-              </w:rPr>
-            </w:pPr>
-            <w:r>
-              <w:rPr>
-                <w:rFonts w:eastAsia="Times New Roman" w:cs="Times New Roman"/>
-                <w:b/>
-                <w:bCs/>
-                <w:color w:val="000000"/>
-                <w:kern w:val="0"/>
-                <w14:ligatures w14:val="none"/>
-              </w:rPr>
-              <w:t>ALSEP</w:t>
-            </w:r>
-            <w:r>
-              <w:rPr>
-                <w:rFonts w:eastAsia="Times New Roman" w:cs="Times New Roman"/>
-                <w:b/>
-                <w:bCs/>
-                <w:color w:val="000000"/>
-                <w:kern w:val="0"/>
-                <w14:ligatures w14:val="none"/>
-              </w:rPr>
-              <w:t xml:space="preserve"> Order</w:t>
-            </w:r>
-          </w:p>
-        </w:tc>
-      </w:tr>
-      <w:tr>
-        <w:trPr>
-          <w:trHeight w:val="300"/>
-        </w:trPr>
-        <w:tc>
-          <w:tcPr>
-            <w:tcW w:w="1845" w:type="pct"/>
-            <w:noWrap/>
-            <w:vAlign w:val="bottom"/>
-            <w:hideMark/>
-          </w:tcPr>
-          <w:p>
-            <w:pPr>
-              <w:spacing w:after="0" w:line="240" w:lineRule="auto"/>
-              <w:rPr>
-                <w:rFonts w:eastAsia="Times New Roman" w:cs="Times New Roman"/>
-                <w:color w:val="000000"/>
-                <w:kern w:val="0"/>
-                <w14:ligatures w14:val="none"/>
-              </w:rPr>
-            </w:pPr>
-            <w:r>
-              <w:rPr>
-                <w:rFonts w:eastAsia="Times New Roman" w:cs="Times New Roman"/>
-                <w:color w:val="000000"/>
-                <w:kern w:val="0"/>
-                <w14:ligatures w14:val="none"/>
-              </w:rPr>
-              <w:t>CDR</w:t>
-            </w:r>
-          </w:p>
-        </w:tc>
-        <w:tc>
-          <w:tcPr>
-            <w:tcW w:w="3155" w:type="pct"/>
-            <w:noWrap/>
-            <w:vAlign w:val="bottom"/>
-            <w:hideMark/>
-          </w:tcPr>
-          <w:p>
-            <w:pPr>
-              <w:spacing w:after="0" w:line="240" w:lineRule="auto"/>
-              <w:rPr>
-                <w:rFonts w:eastAsia="Times New Roman" w:cs="Times New Roman"/>
-                <w:color w:val="000000"/>
-                <w:kern w:val="0"/>
-                <w14:ligatures w14:val="none"/>
-              </w:rPr>
-            </w:pPr>
-            <w:r>
-              <w:rPr>
-                <w:rFonts w:eastAsia="Times New Roman" w:cs="Times New Roman"/>
-                <w:color w:val="000000"/>
-                <w:kern w:val="0"/>
-                <w14:ligatures w14:val="none"/>
-              </w:rPr>
-              <w:t xml:space="preserve">Erectable </w:t>
-            </w:r>
-            <w:r>
-              <w:rPr>
-                <w:rFonts w:eastAsia="Times New Roman" w:cs="Times New Roman"/>
-                <w:color w:val="000000"/>
-                <w:kern w:val="0"/>
-                <w14:ligatures w14:val="none"/>
-              </w:rPr>
-              <w:t>S</w:t>
-            </w:r>
-            <w:r>
-              <w:rPr>
-                <w:rFonts w:eastAsia="Times New Roman" w:cs="Times New Roman"/>
-                <w:color w:val="000000"/>
-                <w:kern w:val="0"/>
-                <w14:ligatures w14:val="none"/>
-              </w:rPr>
-              <w:t>-B</w:t>
-            </w:r>
-            <w:r>
-              <w:rPr>
-                <w:rFonts w:eastAsia="Times New Roman" w:cs="Times New Roman"/>
-                <w:color w:val="000000"/>
-                <w:kern w:val="0"/>
-                <w14:ligatures w14:val="none"/>
-              </w:rPr>
-              <w:t>and</w:t>
-            </w:r>
-            <w:r>
-              <w:rPr>
-                <w:rFonts w:eastAsia="Times New Roman" w:cs="Times New Roman"/>
-                <w:color w:val="000000"/>
-                <w:kern w:val="0"/>
-                <w14:ligatures w14:val="none"/>
-              </w:rPr>
-              <w:t xml:space="preserve"> -&gt; </w:t>
-            </w:r>
-            <w:r>
-              <w:rPr>
-                <w:rFonts w:eastAsia="Times New Roman" w:cs="Times New Roman"/>
-                <w:color w:val="000000"/>
-                <w:kern w:val="0"/>
-                <w14:ligatures w14:val="none"/>
-              </w:rPr>
-              <w:t>Central Station</w:t>
-            </w:r>
-            <w:r>
-              <w:rPr>
-                <w:rFonts w:eastAsia="Times New Roman" w:cs="Times New Roman"/>
-                <w:color w:val="000000"/>
-                <w:kern w:val="0"/>
-                <w14:ligatures w14:val="none"/>
-              </w:rPr>
-              <w:t xml:space="preserve"> -&gt; </w:t>
-            </w:r>
-            <w:r>
-              <w:rPr>
-                <w:rFonts w:eastAsia="Times New Roman" w:cs="Times New Roman"/>
-                <w:color w:val="000000"/>
-                <w:kern w:val="0"/>
-                <w14:ligatures w14:val="none"/>
-              </w:rPr>
-              <w:t>SWS</w:t>
-            </w:r>
-          </w:p>
-        </w:tc>
-      </w:tr>
-      <w:tr>
-        <w:trPr>
-          <w:trHeight w:val="300"/>
-        </w:trPr>
-        <w:tc>
-          <w:tcPr>
-            <w:tcW w:w="1845" w:type="pct"/>
-            <w:noWrap/>
-            <w:vAlign w:val="bottom"/>
-          </w:tcPr>
-          <w:p>
-            <w:pPr>
-              <w:spacing w:after="0" w:line="240" w:lineRule="auto"/>
-              <w:rPr>
-                <w:rFonts w:eastAsia="Times New Roman" w:cs="Times New Roman"/>
-                <w:color w:val="000000"/>
-                <w:kern w:val="0"/>
-                <w14:ligatures w14:val="none"/>
-              </w:rPr>
-            </w:pPr>
-            <w:r>
-              <w:rPr>
-                <w:rFonts w:eastAsia="Times New Roman" w:cs="Times New Roman"/>
-                <w:color w:val="000000"/>
-                <w:kern w:val="0"/>
-                <w14:ligatures w14:val="none"/>
-              </w:rPr>
-              <w:t>LMP</w:t>
-            </w:r>
-          </w:p>
-        </w:tc>
-        <w:tc>
-          <w:tcPr>
-            <w:tcW w:w="3155" w:type="pct"/>
-            <w:noWrap/>
-            <w:vAlign w:val="bottom"/>
-          </w:tcPr>
-          <w:p>
-            <w:pPr>
-              <w:spacing w:after="0" w:line="240" w:lineRule="auto"/>
-              <w:rPr>
-                <w:rFonts w:eastAsia="Times New Roman" w:cs="Times New Roman"/>
-                <w:color w:val="000000"/>
-                <w:kern w:val="0"/>
-                <w14:ligatures w14:val="none"/>
-              </w:rPr>
-            </w:pPr>
-            <w:r>
-              <w:rPr>
-                <w:rFonts w:eastAsia="Times New Roman" w:cs="Times New Roman"/>
-                <w:color w:val="000000"/>
-                <w:kern w:val="0"/>
-                <w14:ligatures w14:val="none"/>
-              </w:rPr>
-              <w:t>T</w:t>
-            </w:r>
-            <w:r>
-              <w:rPr>
-                <w:rFonts w:eastAsia="Times New Roman" w:cs="Times New Roman"/>
-                <w:color w:val="000000"/>
-                <w:kern w:val="0"/>
-                <w14:ligatures w14:val="none"/>
-              </w:rPr>
-              <w:t>V</w:t>
-            </w:r>
-            <w:r>
-              <w:rPr>
-                <w:rFonts w:eastAsia="Times New Roman" w:cs="Times New Roman"/>
-                <w:color w:val="000000"/>
-                <w:kern w:val="0"/>
-                <w14:ligatures w14:val="none"/>
-              </w:rPr>
-              <w:t xml:space="preserve"> -&gt; </w:t>
-            </w:r>
-            <w:r>
-              <w:rPr>
-                <w:rFonts w:eastAsia="Times New Roman" w:cs="Times New Roman"/>
-                <w:color w:val="000000"/>
-                <w:kern w:val="0"/>
-                <w14:ligatures w14:val="none"/>
-              </w:rPr>
-              <w:t>SWC</w:t>
-            </w:r>
-            <w:r>
-              <w:rPr>
-                <w:rFonts w:eastAsia="Times New Roman" w:cs="Times New Roman"/>
-                <w:color w:val="000000"/>
-                <w:kern w:val="0"/>
-                <w14:ligatures w14:val="none"/>
-              </w:rPr>
-              <w:t xml:space="preserve"> -&gt;</w:t>
-            </w:r>
-            <w:r>
-              <w:rPr>
-                <w:rFonts w:eastAsia="Times New Roman" w:cs="Times New Roman"/>
-                <w:color w:val="000000"/>
-                <w:kern w:val="0"/>
-                <w14:ligatures w14:val="none"/>
-              </w:rPr>
-              <w:t xml:space="preserve"> RTG</w:t>
-            </w:r>
-            <w:r>
-              <w:rPr>
-                <w:rFonts w:eastAsia="Times New Roman" w:cs="Times New Roman"/>
-                <w:color w:val="000000"/>
-                <w:kern w:val="0"/>
-                <w14:ligatures w14:val="none"/>
-              </w:rPr>
-              <w:t xml:space="preserve"> -&gt;</w:t>
-            </w:r>
-            <w:r>
-              <w:rPr>
-                <w:rFonts w:eastAsia="Times New Roman" w:cs="Times New Roman"/>
-                <w:color w:val="000000"/>
-                <w:kern w:val="0"/>
-                <w14:ligatures w14:val="none"/>
-              </w:rPr>
-              <w:t xml:space="preserve"> PSE</w:t>
-            </w:r>
-            <w:r>
-              <w:rPr>
-                <w:rFonts w:eastAsia="Times New Roman" w:cs="Times New Roman"/>
-                <w:color w:val="000000"/>
-                <w:kern w:val="0"/>
-                <w14:ligatures w14:val="none"/>
-              </w:rPr>
-              <w:t xml:space="preserve"> -&gt;</w:t>
-            </w:r>
-            <w:r>
-              <w:rPr>
-                <w:rFonts w:eastAsia="Times New Roman" w:cs="Times New Roman"/>
-                <w:color w:val="000000"/>
-                <w:kern w:val="0"/>
-                <w14:ligatures w14:val="none"/>
-              </w:rPr>
-              <w:t xml:space="preserve"> LSM</w:t>
-            </w:r>
-            <w:r>
-              <w:rPr>
-                <w:rFonts w:eastAsia="Times New Roman" w:cs="Times New Roman"/>
-                <w:color w:val="000000"/>
-                <w:kern w:val="0"/>
-                <w14:ligatures w14:val="none"/>
-              </w:rPr>
-              <w:t xml:space="preserve"> -&gt;</w:t>
-            </w:r>
-            <w:r>
-              <w:rPr>
-                <w:rFonts w:eastAsia="Times New Roman" w:cs="Times New Roman"/>
-                <w:color w:val="000000"/>
-                <w:kern w:val="0"/>
-                <w14:ligatures w14:val="none"/>
-              </w:rPr>
-              <w:t xml:space="preserve"> SIDE</w:t>
-            </w:r>
-          </w:p>
-        </w:tc>
-      </w:tr>
-    </w:tbl>
+    <w:p/>
+    <w:p/>
+    <w:p/>
+    <w:p/>
     <w:p/>
     <w:p/>
     <w:p/>
@@ -11649,7 +10923,7 @@
       <w:bookmarkEnd w:id="5"/>
     </w:p>
     <w:p>
-      <w:hyperlink r:id="rId20" w:history="1">
+      <w:hyperlink r:id="rId24" w:history="1">
         <w:r>
           <w:rPr>
             <w:rStyle w:val="Hyperlink"/>
@@ -11668,7 +10942,7 @@
       </w:r>
     </w:p>
     <w:p>
-      <w:hyperlink r:id="rId21" w:history="1">
+      <w:hyperlink r:id="rId25" w:history="1">
         <w:r>
           <w:rPr>
             <w:rStyle w:val="Hyperlink"/>
@@ -11684,7 +10958,7 @@
       </w:r>
     </w:p>
     <w:p>
-      <w:hyperlink r:id="rId22" w:history="1">
+      <w:hyperlink r:id="rId26" w:history="1">
         <w:r>
           <w:rPr>
             <w:rStyle w:val="Hyperlink"/>
@@ -11709,7 +10983,7 @@
       </w:r>
     </w:p>
     <w:p>
-      <w:hyperlink r:id="rId23" w:history="1">
+      <w:hyperlink r:id="rId27" w:history="1">
         <w:r>
           <w:rPr>
             <w:rStyle w:val="Hyperlink"/>
@@ -11722,7 +10996,7 @@
       </w:r>
     </w:p>
     <w:p>
-      <w:hyperlink r:id="rId24" w:history="1">
+      <w:hyperlink r:id="rId28" w:history="1">
         <w:r>
           <w:rPr>
             <w:rStyle w:val="Hyperlink"/>
@@ -11735,7 +11009,7 @@
       </w:r>
     </w:p>
     <w:p>
-      <w:hyperlink r:id="rId25" w:history="1">
+      <w:hyperlink r:id="rId29" w:history="1">
         <w:r>
           <w:rPr>
             <w:rStyle w:val="Hyperlink"/>
@@ -11751,7 +11025,7 @@
       </w:r>
     </w:p>
     <w:p>
-      <w:hyperlink r:id="rId26" w:history="1">
+      <w:hyperlink r:id="rId30" w:history="1">
         <w:r>
           <w:rPr>
             <w:rStyle w:val="Hyperlink"/>
@@ -11765,7 +11039,7 @@
     </w:p>
     <w:p/>
     <w:sectPr>
-      <w:footerReference w:type="default" r:id="rId27"/>
+      <w:footerReference w:type="default" r:id="rId31"/>
       <w:pgSz w:w="12240" w:h="15840"/>
       <w:pgMar w:top="1440" w:right="1440" w:bottom="1440" w:left="1440" w:header="720" w:footer="720" w:gutter="0"/>
       <w:cols w:space="720"/>
@@ -12790,6 +12064,7 @@
   <w:style w:type="character" w:default="1" w:styleId="DefaultParagraphFont">
     <w:name w:val="Default Paragraph Font"/>
     <w:uiPriority w:val="1"/>
+    <w:semiHidden/>
     <w:unhideWhenUsed/>
   </w:style>
   <w:style w:type="table" w:default="1" w:styleId="TableNormal">

</xml_diff>

<commit_message>
Remove "I" and add hyperlink update
</commit_message>
<xml_diff>
--- a/Doc/Project Apollo - NASSP/Programmers Notes/NASSP Quick Start Guide.docx
+++ b/Doc/Project Apollo - NASSP/Programmers Notes/NASSP Quick Start Guide.docx
@@ -42,7 +42,7 @@
           <w:b w:val="0"/>
           <w:bCs w:val="0"/>
         </w:rPr>
-        <w:t>1</w:t>
+        <w:t>2</w:t>
       </w:r>
     </w:p>
     <w:p>
@@ -60,7 +60,7 @@
           <w:b w:val="0"/>
           <w:bCs w:val="0"/>
         </w:rPr>
-        <w:t>26</w:t>
+        <w:t>1</w:t>
       </w:r>
       <w:r>
         <w:rPr>
@@ -76,7 +76,7 @@
           <w:b w:val="0"/>
           <w:bCs w:val="0"/>
         </w:rPr>
-        <w:t>JAN</w:t>
+        <w:t>FEB</w:t>
       </w:r>
       <w:r>
         <w:rPr>
@@ -1039,6 +1039,30 @@
         <w:t>Note: The high-resolution textures and micro textures are optional but really add to the visual experience</w:t>
       </w:r>
       <w:r>
+        <w:rPr>
+          <w:b/>
+          <w:bCs/>
+        </w:rPr>
+        <w:t>. Alternatively, they are also available</w:t>
+      </w:r>
+      <w:r>
+        <w:rPr>
+          <w:b/>
+          <w:bCs/>
+        </w:rPr>
+        <w:t xml:space="preserve"> </w:t>
+      </w:r>
+      <w:hyperlink r:id="rId16" w:history="1">
+        <w:r>
+          <w:rPr>
+            <w:rStyle w:val="Hyperlink"/>
+            <w:b/>
+            <w:bCs/>
+          </w:rPr>
+          <w:t>here</w:t>
+        </w:r>
+      </w:hyperlink>
+      <w:r>
         <w:br/>
       </w:r>
       <w:r>
@@ -1052,7 +1076,7 @@
         <w:br/>
         <w:t>- Go to </w:t>
       </w:r>
-      <w:hyperlink r:id="rId16" w:history="1">
+      <w:hyperlink r:id="rId17" w:history="1">
         <w:r>
           <w:rPr>
             <w:rStyle w:val="Hyperlink"/>
@@ -1094,23 +1118,21 @@
           <w:b/>
           <w:bCs/>
         </w:rPr>
-        <w:t xml:space="preserve">IMPORTANT: Click "Advanced" and add a check beside "Enable absolute animation handling" to prevent animation </w:t>
-      </w:r>
-      <w:proofErr w:type="gramStart"/>
+        <w:t xml:space="preserve">IMPORTANT: Click "Advanced" and add a check beside "Enable absolute animation handling" to prevent animation drift </w:t>
+      </w:r>
       <w:r>
         <w:rPr>
           <w:b/>
           <w:bCs/>
         </w:rPr>
-        <w:t>drift</w:t>
-      </w:r>
-      <w:proofErr w:type="gramEnd"/>
+        <w:t xml:space="preserve">from </w:t>
+      </w:r>
       <w:r>
         <w:rPr>
           <w:b/>
           <w:bCs/>
         </w:rPr>
-        <w:t xml:space="preserve"> happening in certain cases in the VC. You can also configure the other options </w:t>
+        <w:t xml:space="preserve">happening in certain cases in the VC. You can also configure the other options </w:t>
       </w:r>
       <w:r>
         <w:rPr>
@@ -1141,7 +1163,7 @@
       <w:r>
         <w:t xml:space="preserve"> 2.0: </w:t>
       </w:r>
-      <w:hyperlink r:id="rId17" w:history="1">
+      <w:hyperlink r:id="rId18" w:history="1">
         <w:r>
           <w:rPr>
             <w:rStyle w:val="Hyperlink"/>
@@ -1162,7 +1184,7 @@
       <w:r>
         <w:t>at this link: </w:t>
       </w:r>
-      <w:hyperlink r:id="rId18" w:tgtFrame="_blank" w:history="1">
+      <w:hyperlink r:id="rId19" w:tgtFrame="_blank" w:history="1">
         <w:r>
           <w:rPr>
             <w:rStyle w:val="Hyperlink"/>
@@ -1211,23 +1233,7 @@
           <w:b/>
           <w:bCs/>
         </w:rPr>
-        <w:t xml:space="preserve"> </w:t>
-      </w:r>
-      <w:proofErr w:type="gramStart"/>
-      <w:r>
-        <w:rPr>
-          <w:b/>
-          <w:bCs/>
-        </w:rPr>
-        <w:t>For</w:t>
-      </w:r>
-      <w:proofErr w:type="gramEnd"/>
-      <w:r>
-        <w:rPr>
-          <w:b/>
-          <w:bCs/>
-        </w:rPr>
-        <w:t xml:space="preserve"> Orbiter 2016 Beta</w:t>
+        <w:t xml:space="preserve"> For Orbiter 2016 Beta</w:t>
       </w:r>
       <w:r>
         <w:rPr>
@@ -1297,15 +1303,7 @@
         <w:t>Vessel Configuration-&gt;Project Apollo Configuration</w:t>
       </w:r>
       <w:r>
-        <w:t xml:space="preserve"> on the "Extra" tab. If you have a joystick, this is where you can configure your joystick for use in NASSP. Do not use the normal Orbiter controls page to configure your joystick, there it should be &lt;Disabled&gt;. In the "Miscellaneous" tab, make sure "</w:t>
-      </w:r>
-      <w:proofErr w:type="gramStart"/>
-      <w:r>
-        <w:t>Multi-Threading</w:t>
-      </w:r>
-      <w:proofErr w:type="gramEnd"/>
-      <w:r>
-        <w:t xml:space="preserve"> in time acceleration" is checked. It is also recommended to set a limit for time acceleration, NASSP runs best at 50x or less depending on the hardware you are using.</w:t>
+        <w:t xml:space="preserve"> on the "Extra" tab. If you have a joystick, this is where you can configure your joystick for use in NASSP. Do not use the normal Orbiter controls page to configure your joystick, there it should be &lt;Disabled&gt;. In the "Miscellaneous" tab, make sure "Multi-Threading in time acceleration" is checked. It is also recommended to set a limit for time acceleration, NASSP runs best at 50x or less depending on the hardware you are using.</w:t>
       </w:r>
       <w:r>
         <w:br/>
@@ -1357,7 +1355,7 @@
       <w:r>
         <w:t xml:space="preserve"> at this link: </w:t>
       </w:r>
-      <w:hyperlink r:id="rId19" w:tgtFrame="_blank" w:history="1">
+      <w:hyperlink r:id="rId20" w:tgtFrame="_blank" w:history="1">
         <w:r>
           <w:rPr>
             <w:rStyle w:val="Hyperlink"/>
@@ -1499,7 +1497,7 @@
       <w:r>
         <w:t xml:space="preserve">1) Download Orbiter 2024 x64 or the latest Open Orbiter development release x64 from </w:t>
       </w:r>
-      <w:hyperlink r:id="rId20" w:history="1">
+      <w:hyperlink r:id="rId21" w:history="1">
         <w:r>
           <w:rPr>
             <w:rStyle w:val="Hyperlink"/>
@@ -1510,7 +1508,7 @@
       <w:r>
         <w:t xml:space="preserve"> or optionally a build from </w:t>
       </w:r>
-      <w:hyperlink r:id="rId21" w:history="1">
+      <w:hyperlink r:id="rId22" w:history="1">
         <w:r>
           <w:rPr>
             <w:rStyle w:val="Hyperlink"/>
@@ -1543,7 +1541,7 @@
       <w:r>
         <w:t xml:space="preserve">1) Download Orbiter 2024 Release and extract the textures folder. Optionally you may download the Low Res and Landing Site Textures </w:t>
       </w:r>
-      <w:hyperlink r:id="rId22" w:history="1">
+      <w:hyperlink r:id="rId23" w:history="1">
         <w:r>
           <w:rPr>
             <w:rStyle w:val="Hyperlink"/>
@@ -1592,9 +1590,15 @@
     </w:p>
     <w:p>
       <w:r>
-        <w:t xml:space="preserve">1) Download the latest NASSP Release or Pre Release from </w:t>
-      </w:r>
-      <w:hyperlink r:id="rId23" w:history="1">
+        <w:t>1) Download the latest NASSP Release or Pre</w:t>
+      </w:r>
+      <w:r>
+        <w:t>-</w:t>
+      </w:r>
+      <w:r>
+        <w:t xml:space="preserve">Release from </w:t>
+      </w:r>
+      <w:hyperlink r:id="rId24" w:history="1">
         <w:r>
           <w:rPr>
             <w:rStyle w:val="Hyperlink"/>
@@ -1662,15 +1666,7 @@
         <w:t>4</w:t>
       </w:r>
       <w:r>
-        <w:t xml:space="preserve">) In Options-&gt;Visual Settings make sure "local light sources" </w:t>
-      </w:r>
-      <w:proofErr w:type="gramStart"/>
-      <w:r>
-        <w:t>is</w:t>
-      </w:r>
-      <w:proofErr w:type="gramEnd"/>
-      <w:r>
-        <w:t xml:space="preserve"> enabled,</w:t>
+        <w:t>) In Options-&gt;Visual Settings make sure "local light sources" is enabled,</w:t>
       </w:r>
       <w:r>
         <w:t xml:space="preserve"> enable </w:t>
@@ -1687,7 +1683,16 @@
         <w:t>5</w:t>
       </w:r>
       <w:r>
-        <w:t>) In Options-&gt;Physics Settings I personally leave all enabled except atmospheric wind effects as that will cause issues</w:t>
+        <w:t>) In Options-&gt;Physics Settings</w:t>
+      </w:r>
+      <w:r>
+        <w:t>,</w:t>
+      </w:r>
+      <w:r>
+        <w:t xml:space="preserve"> leave all enabled except atmospheric wind effects</w:t>
+      </w:r>
+      <w:r>
+        <w:t>.</w:t>
       </w:r>
     </w:p>
     <w:p>
@@ -1695,7 +1700,13 @@
         <w:t>6</w:t>
       </w:r>
       <w:r>
-        <w:t>) In Video, make sure you select D3D9Client as the graphics engine and then select your GPU, and I encourage using "full screen window</w:t>
+        <w:t xml:space="preserve">) In Video, make sure you select D3D9Client as the graphics engine and then select your GPU, and </w:t>
+      </w:r>
+      <w:r>
+        <w:t>we</w:t>
+      </w:r>
+      <w:r>
+        <w:t xml:space="preserve"> encourage using "full screen window</w:t>
       </w:r>
       <w:r>
         <w:t>.</w:t>
@@ -1720,7 +1731,19 @@
         <w:t>8</w:t>
       </w:r>
       <w:r>
-        <w:t>) In Extra-&gt;debugging options-&gt;orbiter shutdown options, I recommend making it terminate orbiter process to prevent multiple instances of orbiter from launching causing problems</w:t>
+        <w:t xml:space="preserve">) In Extra-&gt;debugging options-&gt;orbiter shutdown options, </w:t>
+      </w:r>
+      <w:r>
+        <w:t>we</w:t>
+      </w:r>
+      <w:r>
+        <w:t xml:space="preserve"> recommend </w:t>
+      </w:r>
+      <w:r>
+        <w:t xml:space="preserve">setting it to </w:t>
+      </w:r>
+      <w:r>
+        <w:t>terminate orbiter process to prevent multiple instances of orbiter from launching causing problems</w:t>
       </w:r>
     </w:p>
     <w:p>
@@ -1798,15 +1821,7 @@
         <w:br/>
       </w:r>
       <w:r>
-        <w:t xml:space="preserve">That's ultimately up to you, but we generally recommend Apollo 8. While Apollo 7 is chronologically first, it's a very long mission that is meant to test vehicle systems and procedures from the relative safety of low Earth orbit. As such, it involves a very unusual and often repetitive schedule, with procedures that are rather unrefined. Apollo 8, by contrast, is a relatively short mission with more straightforward goals and mission design. You get to experience most of the lunar mission milestones without needing to worry about managing two separate vehicles on your first journey. After Apollo 8 concludes, Apollo 11 or 12 would be our next recommendation. You get to use </w:t>
-      </w:r>
-      <w:proofErr w:type="gramStart"/>
-      <w:r>
-        <w:t>the LM</w:t>
-      </w:r>
-      <w:proofErr w:type="gramEnd"/>
-      <w:r>
-        <w:t xml:space="preserve"> and land on the moon, and the procedures have been improved and optimized thanks to the lessons learned on all the previous missions.</w:t>
+        <w:t>That's ultimately up to you, but we generally recommend Apollo 8. While Apollo 7 is chronologically first, it's a very long mission that is meant to test vehicle systems and procedures from the relative safety of low Earth orbit. As such, it involves a very unusual and often repetitive schedule, with procedures that are rather unrefined. Apollo 8, by contrast, is a relatively short mission with more straightforward goals and mission design. You get to experience most of the lunar mission milestones without needing to worry about managing two separate vehicles on your first journey. After Apollo 8 concludes, Apollo 11 or 12 would be our next recommendation. You get to use the LM and land on the moon, and the procedures have been improved and optimized thanks to the lessons learned on all the previous missions.</w:t>
       </w:r>
       <w:r>
         <w:br/>
@@ -1969,29 +1984,13 @@
         <w:br/>
       </w:r>
       <w:r>
-        <w:t xml:space="preserve">These are </w:t>
-      </w:r>
-      <w:proofErr w:type="gramStart"/>
-      <w:r>
-        <w:t>pretty easy</w:t>
-      </w:r>
-      <w:proofErr w:type="gramEnd"/>
-      <w:r>
-        <w:t xml:space="preserve">. You can </w:t>
+        <w:t xml:space="preserve">These are pretty easy. You can </w:t>
       </w:r>
       <w:r>
         <w:t>click on the left</w:t>
       </w:r>
       <w:r>
-        <w:t xml:space="preserve"> circuit breakers to close or open them. For computer keys like the DSKY or DEDA, just click on each button to press it. If you find that the computer isn't always responding to your key presses, you may be letting go of the button too quickly. Each computer key needs to be held for a small fraction of a second, and sometimes a fast click doesn't hold the button down for quite long enough. You don't need to hold them for a long time, only for </w:t>
-      </w:r>
-      <w:proofErr w:type="gramStart"/>
-      <w:r>
-        <w:t>a brief moment</w:t>
-      </w:r>
-      <w:proofErr w:type="gramEnd"/>
-      <w:r>
-        <w:t xml:space="preserve"> to ensure they register.</w:t>
+        <w:t xml:space="preserve"> circuit breakers to close or open them. For computer keys like the DSKY or DEDA, just click on each button to press it. If you find that the computer isn't always responding to your key presses, you may be letting go of the button too quickly. Each computer key needs to be held for a small fraction of a second, and sometimes a fast click doesn't hold the button down for quite long enough. You don't need to hold them for a long time, only for a brief moment to ensure they register.</w:t>
       </w:r>
       <w:r>
         <w:br/>
@@ -2084,15 +2083,7 @@
         <w:ind w:left="360"/>
       </w:pPr>
       <w:r>
-        <w:t>When looking at the Checklist MFD, you'll notice the text has multiple colors. Green checklist entries will automatically proceed once the relevant switch, circuit breaker, button, etc. is in the correct position. Yellow entries need to be manually verified/</w:t>
-      </w:r>
-      <w:proofErr w:type="gramStart"/>
-      <w:r>
-        <w:t>completed, and</w:t>
-      </w:r>
-      <w:proofErr w:type="gramEnd"/>
-      <w:r>
-        <w:t xml:space="preserve"> then proceeded past with the "PRO" button on the MFD. Blue entries indicate a jump to another checklist within the current one. Sometimes these happen automatically, or you may need to click "PRO" or "FAIL" to decide whether you want to activate the new checklist or skip it. To enable or disable the auto-proceed function of the checklist, click the "AUTO" button on the MFD.</w:t>
+        <w:t>When looking at the Checklist MFD, you'll notice the text has multiple colors. Green checklist entries will automatically proceed once the relevant switch, circuit breaker, button, etc. is in the correct position. Yellow entries need to be manually verified/completed, and then proceeded past with the "PRO" button on the MFD. Blue entries indicate a jump to another checklist within the current one. Sometimes these happen automatically, or you may need to click "PRO" or "FAIL" to decide whether you want to activate the new checklist or skip it. To enable or disable the auto-proceed function of the checklist, click the "AUTO" button on the MFD.</w:t>
       </w:r>
     </w:p>
     <w:p>
@@ -2184,23 +2175,7 @@
           <w:b/>
           <w:bCs/>
         </w:rPr>
-        <w:t xml:space="preserve"> keep </w:t>
-      </w:r>
-      <w:proofErr w:type="gramStart"/>
-      <w:r>
-        <w:rPr>
-          <w:b/>
-          <w:bCs/>
-        </w:rPr>
-        <w:t>your save</w:t>
-      </w:r>
-      <w:proofErr w:type="gramEnd"/>
-      <w:r>
-        <w:rPr>
-          <w:b/>
-          <w:bCs/>
-        </w:rPr>
-        <w:t xml:space="preserve"> files organized!</w:t>
+        <w:t xml:space="preserve"> keep your save files organized!</w:t>
       </w:r>
       <w:r>
         <w:t> </w:t>
@@ -2315,32 +2290,16 @@
         <w:t>time warp</w:t>
       </w:r>
       <w:r>
-        <w:t xml:space="preserve"> normally. It will even affect vessels that you're not currently </w:t>
-      </w:r>
-      <w:proofErr w:type="gramStart"/>
-      <w:r>
-        <w:t>controlling:</w:t>
-      </w:r>
-      <w:proofErr w:type="gramEnd"/>
-      <w:r>
-        <w:t xml:space="preserve"> </w:t>
+        <w:t xml:space="preserve"> normally. It will even affect vessels that you're not currently controlling: </w:t>
       </w:r>
       <w:r>
         <w:t>time warping</w:t>
       </w:r>
       <w:r>
-        <w:t xml:space="preserve"> in the CSM while the LM is trying to hold attitude will cause problems for the LM. Usually going up to about 5x or 10x is safe. If you want </w:t>
-      </w:r>
-      <w:proofErr w:type="gramStart"/>
-      <w:r>
-        <w:t xml:space="preserve">to </w:t>
-      </w:r>
-      <w:r>
-        <w:t>time</w:t>
-      </w:r>
-      <w:proofErr w:type="gramEnd"/>
-      <w:r>
-        <w:t xml:space="preserve"> warp</w:t>
+        <w:t xml:space="preserve"> in the CSM while the LM is trying to hold attitude will cause problems for the LM. Usually going up to about 5x or 10x is safe. If you want to </w:t>
+      </w:r>
+      <w:r>
+        <w:t>time warp</w:t>
       </w:r>
       <w:r>
         <w:t xml:space="preserve"> faster, be sure to disable any kind of attitude-hold mode in the CSM and LM before </w:t>
@@ -2374,23 +2333,7 @@
         <w:br/>
       </w:r>
       <w:r>
-        <w:t xml:space="preserve">When you're performing LM activation, be sure to use </w:t>
-      </w:r>
-      <w:proofErr w:type="gramStart"/>
-      <w:r>
-        <w:t>the Project</w:t>
-      </w:r>
-      <w:proofErr w:type="gramEnd"/>
-      <w:r>
-        <w:t xml:space="preserve"> Apollo MFD's "ECS" section to connect the O2 hose from the CSM. This creates a flow of fresh oxygen into the LM so that the cabin doesn't fill up with deadly CO2 and </w:t>
-      </w:r>
-      <w:proofErr w:type="gramStart"/>
-      <w:r>
-        <w:t>poison</w:t>
-      </w:r>
-      <w:proofErr w:type="gramEnd"/>
-      <w:r>
-        <w:t xml:space="preserve"> your crew before the LM ECS is activated. Having this O2 hose connected also prevents you from closing the CSM forward hatch, so if you can't get it </w:t>
+        <w:t xml:space="preserve">When you're performing LM activation, be sure to use the Project Apollo MFD's "ECS" section to connect the O2 hose from the CSM. This creates a flow of fresh oxygen into the LM so that the cabin doesn't fill up with deadly CO2 and poison your crew before the LM ECS is activated. Having this O2 hose connected also prevents you from closing the CSM forward hatch, so if you can't get it </w:t>
       </w:r>
       <w:r>
         <w:t>too</w:t>
@@ -9272,25 +9215,14 @@
                 <w14:ligatures w14:val="none"/>
               </w:rPr>
             </w:pPr>
-            <w:proofErr w:type="gramStart"/>
-            <w:r>
-              <w:rPr>
-                <w:rFonts w:eastAsia="Times New Roman" w:cs="Times New Roman"/>
-                <w:color w:val="000000"/>
-                <w:kern w:val="0"/>
-                <w14:ligatures w14:val="none"/>
-              </w:rPr>
-              <w:t>Increase</w:t>
-            </w:r>
-            <w:proofErr w:type="gramEnd"/>
-            <w:r>
-              <w:rPr>
-                <w:rFonts w:eastAsia="Times New Roman" w:cs="Times New Roman"/>
-                <w:color w:val="000000"/>
-                <w:kern w:val="0"/>
-                <w14:ligatures w14:val="none"/>
-              </w:rPr>
-              <w:t xml:space="preserve"> Descent Rate</w:t>
+            <w:r>
+              <w:rPr>
+                <w:rFonts w:eastAsia="Times New Roman" w:cs="Times New Roman"/>
+                <w:color w:val="000000"/>
+                <w:kern w:val="0"/>
+                <w14:ligatures w14:val="none"/>
+              </w:rPr>
+              <w:t>Increase Descent Rate</w:t>
             </w:r>
           </w:p>
         </w:tc>
@@ -9849,25 +9781,14 @@
                 <w14:ligatures w14:val="none"/>
               </w:rPr>
             </w:pPr>
-            <w:proofErr w:type="gramStart"/>
-            <w:r>
-              <w:rPr>
-                <w:rFonts w:eastAsia="Times New Roman" w:cs="Times New Roman"/>
-                <w:color w:val="000000"/>
-                <w:kern w:val="0"/>
-                <w14:ligatures w14:val="none"/>
-              </w:rPr>
-              <w:t>Abort</w:t>
-            </w:r>
-            <w:proofErr w:type="gramEnd"/>
-            <w:r>
-              <w:rPr>
-                <w:rFonts w:eastAsia="Times New Roman" w:cs="Times New Roman"/>
-                <w:color w:val="000000"/>
-                <w:kern w:val="0"/>
-                <w14:ligatures w14:val="none"/>
-              </w:rPr>
-              <w:t xml:space="preserve"> Stage PUSH</w:t>
+            <w:r>
+              <w:rPr>
+                <w:rFonts w:eastAsia="Times New Roman" w:cs="Times New Roman"/>
+                <w:color w:val="000000"/>
+                <w:kern w:val="0"/>
+                <w14:ligatures w14:val="none"/>
+              </w:rPr>
+              <w:t>Abort Stage PUSH</w:t>
             </w:r>
           </w:p>
         </w:tc>
@@ -10316,27 +10237,7 @@
                 <w:kern w:val="0"/>
                 <w14:ligatures w14:val="none"/>
               </w:rPr>
-              <w:t xml:space="preserve">ACA Out </w:t>
-            </w:r>
-            <w:proofErr w:type="gramStart"/>
-            <w:r>
-              <w:rPr>
-                <w:rFonts w:eastAsia="Times New Roman" w:cs="Times New Roman"/>
-                <w:color w:val="000000"/>
-                <w:kern w:val="0"/>
-                <w14:ligatures w14:val="none"/>
-              </w:rPr>
-              <w:t>Of</w:t>
-            </w:r>
-            <w:proofErr w:type="gramEnd"/>
-            <w:r>
-              <w:rPr>
-                <w:rFonts w:eastAsia="Times New Roman" w:cs="Times New Roman"/>
-                <w:color w:val="000000"/>
-                <w:kern w:val="0"/>
-                <w14:ligatures w14:val="none"/>
-              </w:rPr>
-              <w:t xml:space="preserve"> Detent</w:t>
+              <w:t>ACA Out Of Detent</w:t>
             </w:r>
           </w:p>
         </w:tc>
@@ -12037,7 +11938,7 @@
       <w:bookmarkEnd w:id="5"/>
     </w:p>
     <w:p>
-      <w:hyperlink r:id="rId24" w:history="1">
+      <w:hyperlink r:id="rId25" w:history="1">
         <w:r>
           <w:rPr>
             <w:rStyle w:val="Hyperlink"/>
@@ -12056,7 +11957,7 @@
       </w:r>
     </w:p>
     <w:p>
-      <w:hyperlink r:id="rId25" w:history="1">
+      <w:hyperlink r:id="rId26" w:history="1">
         <w:r>
           <w:rPr>
             <w:rStyle w:val="Hyperlink"/>
@@ -12072,7 +11973,7 @@
       </w:r>
     </w:p>
     <w:p>
-      <w:hyperlink r:id="rId26" w:history="1">
+      <w:hyperlink r:id="rId27" w:history="1">
         <w:r>
           <w:rPr>
             <w:rStyle w:val="Hyperlink"/>
@@ -12097,7 +11998,7 @@
       </w:r>
     </w:p>
     <w:p>
-      <w:hyperlink r:id="rId27" w:history="1">
+      <w:hyperlink r:id="rId28" w:history="1">
         <w:r>
           <w:rPr>
             <w:rStyle w:val="Hyperlink"/>
@@ -12110,7 +12011,7 @@
       </w:r>
     </w:p>
     <w:p>
-      <w:hyperlink r:id="rId28" w:history="1">
+      <w:hyperlink r:id="rId29" w:history="1">
         <w:r>
           <w:rPr>
             <w:rStyle w:val="Hyperlink"/>
@@ -12123,7 +12024,7 @@
       </w:r>
     </w:p>
     <w:p>
-      <w:hyperlink r:id="rId29" w:history="1">
+      <w:hyperlink r:id="rId30" w:history="1">
         <w:r>
           <w:rPr>
             <w:rStyle w:val="Hyperlink"/>
@@ -12139,7 +12040,7 @@
       </w:r>
     </w:p>
     <w:p>
-      <w:hyperlink r:id="rId30" w:history="1">
+      <w:hyperlink r:id="rId31" w:history="1">
         <w:r>
           <w:rPr>
             <w:rStyle w:val="Hyperlink"/>
@@ -12153,7 +12054,7 @@
     </w:p>
     <w:p/>
     <w:sectPr>
-      <w:footerReference w:type="default" r:id="rId31"/>
+      <w:footerReference w:type="default" r:id="rId32"/>
       <w:pgSz w:w="12240" w:h="15840"/>
       <w:pgMar w:top="1440" w:right="1440" w:bottom="1440" w:left="1440" w:header="720" w:footer="720" w:gutter="0"/>
       <w:cols w:space="720"/>

</xml_diff>

<commit_message>
Add notes about EVA control and Apollo 8 PTC during time warp
</commit_message>
<xml_diff>
--- a/Doc/Project Apollo - NASSP/Programmers Notes/NASSP Quick Start Guide.docx
+++ b/Doc/Project Apollo - NASSP/Programmers Notes/NASSP Quick Start Guide.docx
@@ -42,7 +42,7 @@
           <w:b w:val="0"/>
           <w:bCs w:val="0"/>
         </w:rPr>
-        <w:t>2</w:t>
+        <w:t>3</w:t>
       </w:r>
     </w:p>
     <w:p>
@@ -60,7 +60,7 @@
           <w:b w:val="0"/>
           <w:bCs w:val="0"/>
         </w:rPr>
-        <w:t>1</w:t>
+        <w:t>22</w:t>
       </w:r>
       <w:r>
         <w:rPr>
@@ -1539,7 +1539,45 @@
     </w:p>
     <w:p>
       <w:r>
-        <w:t xml:space="preserve">1) Download Orbiter 2024 Release and extract the textures folder. Optionally you may download the Low Res and Landing Site Textures </w:t>
+        <w:t>1</w:t>
+      </w:r>
+      <w:r>
+        <w:t>a</w:t>
+      </w:r>
+      <w:r>
+        <w:t>) Download Orbiter 2024 Release and extract the textures folder</w:t>
+      </w:r>
+      <w:r>
+        <w:t xml:space="preserve"> into your orbiter root</w:t>
+      </w:r>
+      <w:r>
+        <w:t>.</w:t>
+      </w:r>
+      <w:r>
+        <w:t xml:space="preserve"> </w:t>
+      </w:r>
+      <w:r>
+        <w:t>This contains only Low Res textures</w:t>
+      </w:r>
+    </w:p>
+    <w:p>
+      <w:r>
+        <w:t>1b</w:t>
+      </w:r>
+      <w:r>
+        <w:t>)</w:t>
+      </w:r>
+      <w:r>
+        <w:t xml:space="preserve"> </w:t>
+      </w:r>
+      <w:r>
+        <w:t xml:space="preserve">Optionally you may </w:t>
+      </w:r>
+      <w:r>
+        <w:t xml:space="preserve">instead </w:t>
+      </w:r>
+      <w:r>
+        <w:t xml:space="preserve">download the Low Res and Landing Site Textures </w:t>
       </w:r>
       <w:hyperlink r:id="rId23" w:history="1">
         <w:r>
@@ -1549,21 +1587,39 @@
           <w:t>here</w:t>
         </w:r>
       </w:hyperlink>
+      <w:r>
+        <w:t>.</w:t>
+      </w:r>
+      <w:r>
+        <w:t xml:space="preserve"> Extract the Textures folder in the Low Res and LS textures zips into the orbiter root</w:t>
+      </w:r>
     </w:p>
     <w:p>
       <w:r>
-        <w:t>2) Extract the Textures folder in the Low Res and LS textures zips into the orbiter root</w:t>
-      </w:r>
-    </w:p>
-    <w:p>
-      <w:r>
-        <w:t xml:space="preserve">3) If you choose to download all the </w:t>
+        <w:t>2</w:t>
+      </w:r>
+      <w:r>
+        <w:t xml:space="preserve">) If you choose to download all the </w:t>
       </w:r>
       <w:r>
         <w:t>high-res</w:t>
       </w:r>
       <w:r>
-        <w:t xml:space="preserve"> textures, make sure you have the folder organization correct (Earth/Archive and Moon/Archive) and put those into the Textures folder of your orbiter root</w:t>
+        <w:t xml:space="preserve"> textures</w:t>
+      </w:r>
+      <w:r>
+        <w:t xml:space="preserve"> </w:t>
+      </w:r>
+      <w:hyperlink r:id="rId24" w:history="1">
+        <w:r>
+          <w:rPr>
+            <w:rStyle w:val="Hyperlink"/>
+          </w:rPr>
+          <w:t>here</w:t>
+        </w:r>
+      </w:hyperlink>
+      <w:r>
+        <w:t>, make sure you have the folder organization correct (Earth/Archive and Moon/Archive) and put those into the Textures folder of your orbiter root</w:t>
       </w:r>
     </w:p>
     <w:p>
@@ -1598,7 +1654,7 @@
       <w:r>
         <w:t xml:space="preserve">Release from </w:t>
       </w:r>
-      <w:hyperlink r:id="rId24" w:history="1">
+      <w:hyperlink r:id="rId25" w:history="1">
         <w:r>
           <w:rPr>
             <w:rStyle w:val="Hyperlink"/>
@@ -2083,7 +2139,13 @@
         <w:ind w:left="360"/>
       </w:pPr>
       <w:r>
-        <w:t>When looking at the Checklist MFD, you'll notice the text has multiple colors. Green checklist entries will automatically proceed once the relevant switch, circuit breaker, button, etc. is in the correct position. Yellow entries need to be manually verified/completed, and then proceeded past with the "PRO" button on the MFD. Blue entries indicate a jump to another checklist within the current one. Sometimes these happen automatically, or you may need to click "PRO" or "FAIL" to decide whether you want to activate the new checklist or skip it. To enable or disable the auto-proceed function of the checklist, click the "AUTO" button on the MFD.</w:t>
+        <w:t>When looking at the Checklist MFD, you'll notice the text has multiple colors. Green checklist entries will automatically proceed once the relevant switch, circuit breaker, button, etc. is in the correct position. Yellow entries need to be manually verified/</w:t>
+      </w:r>
+      <w:r>
+        <w:t>completed and</w:t>
+      </w:r>
+      <w:r>
+        <w:t xml:space="preserve"> then proceeded past with the "PRO" button on the MFD. Blue entries indicate a jump to another checklist within the current one. Sometimes these happen automatically, or you may need to click "PRO" or "FAIL" to decide whether you want to activate the new checklist or skip it. To enable or disable the auto-proceed function of the checklist, click the "AUTO" button on the MFD.</w:t>
       </w:r>
     </w:p>
     <w:p>
@@ -2311,6 +2373,9 @@
         <w:t xml:space="preserve"> watch out to make sure you don't slowly drift into gimbal lock!</w:t>
       </w:r>
       <w:r>
+        <w:t xml:space="preserve"> This is especially important for rest periods using any control mode during PTC like Apollo 8. Just as above, on Apollo 8 SCS PTC, disabling attitude control (SC CONT – CMC and CMC MODE – FREE) is advised for rest periods or extended warp in PTC.</w:t>
+      </w:r>
+      <w:r>
         <w:br/>
       </w:r>
     </w:p>
@@ -2350,16 +2415,7 @@
         <w:ind w:left="360"/>
       </w:pPr>
     </w:p>
-    <w:p>
-      <w:pPr>
-        <w:ind w:left="360"/>
-      </w:pPr>
-    </w:p>
-    <w:p>
-      <w:pPr>
-        <w:ind w:left="360"/>
-      </w:pPr>
-    </w:p>
+    <w:p/>
     <w:p>
       <w:pPr>
         <w:ind w:left="360"/>
@@ -10421,6 +10477,148 @@
             </w:tcBorders>
             <w:noWrap/>
             <w:vAlign w:val="bottom"/>
+          </w:tcPr>
+          <w:p>
+            <w:pPr>
+              <w:spacing w:after="0" w:line="240" w:lineRule="auto"/>
+              <w:rPr>
+                <w:rFonts w:eastAsia="Times New Roman" w:cs="Times New Roman"/>
+                <w:color w:val="000000"/>
+                <w:kern w:val="0"/>
+                <w14:ligatures w14:val="none"/>
+              </w:rPr>
+            </w:pPr>
+            <w:r>
+              <w:rPr>
+                <w:rFonts w:eastAsia="Times New Roman" w:cs="Times New Roman"/>
+                <w:color w:val="000000"/>
+                <w:kern w:val="0"/>
+                <w14:ligatures w14:val="none"/>
+              </w:rPr>
+              <w:t>Numpad Rotation</w:t>
+            </w:r>
+          </w:p>
+        </w:tc>
+        <w:tc>
+          <w:tcPr>
+            <w:tcW w:w="3155" w:type="pct"/>
+            <w:tcBorders>
+              <w:top w:val="nil"/>
+              <w:left w:val="nil"/>
+              <w:bottom w:val="single" w:sz="4" w:space="0" w:color="auto"/>
+              <w:right w:val="single" w:sz="4" w:space="0" w:color="auto"/>
+            </w:tcBorders>
+            <w:noWrap/>
+            <w:vAlign w:val="bottom"/>
+          </w:tcPr>
+          <w:p>
+            <w:pPr>
+              <w:spacing w:after="0" w:line="240" w:lineRule="auto"/>
+              <w:rPr>
+                <w:rFonts w:eastAsia="Times New Roman" w:cs="Times New Roman"/>
+                <w:color w:val="000000"/>
+                <w:kern w:val="0"/>
+                <w14:ligatures w14:val="none"/>
+              </w:rPr>
+            </w:pPr>
+            <w:r>
+              <w:rPr>
+                <w:rFonts w:eastAsia="Times New Roman" w:cs="Times New Roman"/>
+                <w:color w:val="000000"/>
+                <w:kern w:val="0"/>
+                <w14:ligatures w14:val="none"/>
+              </w:rPr>
+              <w:t>Controls Look Position</w:t>
+            </w:r>
+          </w:p>
+        </w:tc>
+      </w:tr>
+      <w:tr>
+        <w:trPr>
+          <w:trHeight w:val="300"/>
+        </w:trPr>
+        <w:tc>
+          <w:tcPr>
+            <w:tcW w:w="1845" w:type="pct"/>
+            <w:tcBorders>
+              <w:top w:val="nil"/>
+              <w:left w:val="single" w:sz="4" w:space="0" w:color="auto"/>
+              <w:bottom w:val="single" w:sz="4" w:space="0" w:color="auto"/>
+              <w:right w:val="single" w:sz="4" w:space="0" w:color="auto"/>
+            </w:tcBorders>
+            <w:noWrap/>
+            <w:vAlign w:val="bottom"/>
+          </w:tcPr>
+          <w:p>
+            <w:pPr>
+              <w:spacing w:after="0" w:line="240" w:lineRule="auto"/>
+              <w:rPr>
+                <w:rFonts w:eastAsia="Times New Roman" w:cs="Times New Roman"/>
+                <w:color w:val="000000"/>
+                <w:kern w:val="0"/>
+                <w14:ligatures w14:val="none"/>
+              </w:rPr>
+            </w:pPr>
+            <w:r>
+              <w:rPr>
+                <w:rFonts w:eastAsia="Times New Roman" w:cs="Times New Roman"/>
+                <w:color w:val="000000"/>
+                <w:kern w:val="0"/>
+                <w14:ligatures w14:val="none"/>
+              </w:rPr>
+              <w:t>Numpad Translation</w:t>
+            </w:r>
+          </w:p>
+        </w:tc>
+        <w:tc>
+          <w:tcPr>
+            <w:tcW w:w="3155" w:type="pct"/>
+            <w:tcBorders>
+              <w:top w:val="nil"/>
+              <w:left w:val="nil"/>
+              <w:bottom w:val="single" w:sz="4" w:space="0" w:color="auto"/>
+              <w:right w:val="single" w:sz="4" w:space="0" w:color="auto"/>
+            </w:tcBorders>
+            <w:noWrap/>
+            <w:vAlign w:val="bottom"/>
+          </w:tcPr>
+          <w:p>
+            <w:pPr>
+              <w:spacing w:after="0" w:line="240" w:lineRule="auto"/>
+              <w:rPr>
+                <w:rFonts w:eastAsia="Times New Roman" w:cs="Times New Roman"/>
+                <w:color w:val="000000"/>
+                <w:kern w:val="0"/>
+                <w14:ligatures w14:val="none"/>
+              </w:rPr>
+            </w:pPr>
+            <w:r>
+              <w:rPr>
+                <w:rFonts w:eastAsia="Times New Roman" w:cs="Times New Roman"/>
+                <w:color w:val="000000"/>
+                <w:kern w:val="0"/>
+                <w14:ligatures w14:val="none"/>
+              </w:rPr>
+              <w:t>Walks or Moves during EVA</w:t>
+            </w:r>
+          </w:p>
+        </w:tc>
+      </w:tr>
+      <w:tr>
+        <w:trPr>
+          <w:trHeight w:val="300"/>
+        </w:trPr>
+        <w:tc>
+          <w:tcPr>
+            <w:tcW w:w="1845" w:type="pct"/>
+            <w:tcBorders>
+              <w:top w:val="nil"/>
+              <w:left w:val="single" w:sz="4" w:space="0" w:color="auto"/>
+              <w:bottom w:val="single" w:sz="4" w:space="0" w:color="auto"/>
+              <w:right w:val="single" w:sz="4" w:space="0" w:color="auto"/>
+            </w:tcBorders>
+            <w:noWrap/>
+            <w:vAlign w:val="bottom"/>
             <w:hideMark/>
           </w:tcPr>
           <w:p>
@@ -11938,7 +12136,7 @@
       <w:bookmarkEnd w:id="5"/>
     </w:p>
     <w:p>
-      <w:hyperlink r:id="rId25" w:history="1">
+      <w:hyperlink r:id="rId26" w:history="1">
         <w:r>
           <w:rPr>
             <w:rStyle w:val="Hyperlink"/>
@@ -11957,7 +12155,7 @@
       </w:r>
     </w:p>
     <w:p>
-      <w:hyperlink r:id="rId26" w:history="1">
+      <w:hyperlink r:id="rId27" w:history="1">
         <w:r>
           <w:rPr>
             <w:rStyle w:val="Hyperlink"/>
@@ -11973,7 +12171,7 @@
       </w:r>
     </w:p>
     <w:p>
-      <w:hyperlink r:id="rId27" w:history="1">
+      <w:hyperlink r:id="rId28" w:history="1">
         <w:r>
           <w:rPr>
             <w:rStyle w:val="Hyperlink"/>
@@ -11998,7 +12196,7 @@
       </w:r>
     </w:p>
     <w:p>
-      <w:hyperlink r:id="rId28" w:history="1">
+      <w:hyperlink r:id="rId29" w:history="1">
         <w:r>
           <w:rPr>
             <w:rStyle w:val="Hyperlink"/>
@@ -12011,7 +12209,7 @@
       </w:r>
     </w:p>
     <w:p>
-      <w:hyperlink r:id="rId29" w:history="1">
+      <w:hyperlink r:id="rId30" w:history="1">
         <w:r>
           <w:rPr>
             <w:rStyle w:val="Hyperlink"/>
@@ -12024,7 +12222,7 @@
       </w:r>
     </w:p>
     <w:p>
-      <w:hyperlink r:id="rId30" w:history="1">
+      <w:hyperlink r:id="rId31" w:history="1">
         <w:r>
           <w:rPr>
             <w:rStyle w:val="Hyperlink"/>
@@ -12040,7 +12238,7 @@
       </w:r>
     </w:p>
     <w:p>
-      <w:hyperlink r:id="rId31" w:history="1">
+      <w:hyperlink r:id="rId32" w:history="1">
         <w:r>
           <w:rPr>
             <w:rStyle w:val="Hyperlink"/>
@@ -12054,7 +12252,7 @@
     </w:p>
     <w:p/>
     <w:sectPr>
-      <w:footerReference w:type="default" r:id="rId32"/>
+      <w:footerReference w:type="default" r:id="rId33"/>
       <w:pgSz w:w="12240" w:h="15840"/>
       <w:pgMar w:top="1440" w:right="1440" w:bottom="1440" w:left="1440" w:header="720" w:footer="720" w:gutter="0"/>
       <w:cols w:space="720"/>

</xml_diff>

<commit_message>
Add reflection mode note to 2024 install instructions
</commit_message>
<xml_diff>
--- a/Doc/Project Apollo - NASSP/Programmers Notes/NASSP Quick Start Guide.docx
+++ b/Doc/Project Apollo - NASSP/Programmers Notes/NASSP Quick Start Guide.docx
@@ -34,15 +34,7 @@
           <w:b w:val="0"/>
           <w:bCs w:val="0"/>
         </w:rPr>
-        <w:t>3</w:t>
-      </w:r>
-      <w:r>
-        <w:rPr>
-          <w:rStyle w:val="IntenseReference"/>
-          <w:b w:val="0"/>
-          <w:bCs w:val="0"/>
-        </w:rPr>
-        <w:t>3</w:t>
+        <w:t>4.1</w:t>
       </w:r>
     </w:p>
     <w:p>
@@ -60,23 +52,7 @@
           <w:b w:val="0"/>
           <w:bCs w:val="0"/>
         </w:rPr>
-        <w:t>22</w:t>
-      </w:r>
-      <w:r>
-        <w:rPr>
-          <w:rStyle w:val="IntenseReference"/>
-          <w:b w:val="0"/>
-          <w:bCs w:val="0"/>
-        </w:rPr>
-        <w:t xml:space="preserve"> </w:t>
-      </w:r>
-      <w:r>
-        <w:rPr>
-          <w:rStyle w:val="IntenseReference"/>
-          <w:b w:val="0"/>
-          <w:bCs w:val="0"/>
-        </w:rPr>
-        <w:t>FEB</w:t>
+        <w:t>1 MAR</w:t>
       </w:r>
       <w:r>
         <w:rPr>
@@ -976,15 +952,7 @@
         </w:r>
       </w:hyperlink>
       <w:r>
-        <w:t> Scroll down to "</w:t>
-      </w:r>
-      <w:proofErr w:type="spellStart"/>
-      <w:r>
-        <w:t>MicroTexture</w:t>
-      </w:r>
-      <w:proofErr w:type="spellEnd"/>
-      <w:r>
-        <w:t xml:space="preserve"> Pack for D3D9Client" and unzip to your Orbiter directory.</w:t>
+        <w:t> Scroll down to "MicroTexture Pack for D3D9Client" and unzip to your Orbiter directory.</w:t>
       </w:r>
       <w:r>
         <w:br/>
@@ -1000,15 +968,7 @@
         <w:t>-Optional:</w:t>
       </w:r>
       <w:r>
-        <w:t xml:space="preserve"> Download "Apollo Landing Sites for Orbiter 2016" by </w:t>
-      </w:r>
-      <w:proofErr w:type="spellStart"/>
-      <w:r>
-        <w:t>ggalfi</w:t>
-      </w:r>
-      <w:proofErr w:type="spellEnd"/>
-      <w:r>
-        <w:t xml:space="preserve"> here: </w:t>
+        <w:t> Download "Apollo Landing Sites for Orbiter 2016" by ggalfi here: </w:t>
       </w:r>
       <w:hyperlink r:id="rId15" w:tgtFrame="_blank" w:history="1">
         <w:r>
@@ -1118,7 +1078,23 @@
           <w:b/>
           <w:bCs/>
         </w:rPr>
-        <w:t xml:space="preserve">IMPORTANT: Click "Advanced" and add a check beside "Enable absolute animation handling" to prevent animation drift </w:t>
+        <w:t xml:space="preserve">IMPORTANT: Click "Advanced" and add a check beside "Enable absolute animation handling" to prevent </w:t>
+      </w:r>
+      <w:proofErr w:type="gramStart"/>
+      <w:r>
+        <w:rPr>
+          <w:b/>
+          <w:bCs/>
+        </w:rPr>
+        <w:t>animation drift</w:t>
+      </w:r>
+      <w:proofErr w:type="gramEnd"/>
+      <w:r>
+        <w:rPr>
+          <w:b/>
+          <w:bCs/>
+        </w:rPr>
+        <w:t xml:space="preserve"> </w:t>
       </w:r>
       <w:r>
         <w:rPr>
@@ -1153,15 +1129,7 @@
       </w:r>
       <w:r>
         <w:br/>
-        <w:t xml:space="preserve">4. Install </w:t>
-      </w:r>
-      <w:proofErr w:type="spellStart"/>
-      <w:r>
-        <w:t>XRSound</w:t>
-      </w:r>
-      <w:proofErr w:type="spellEnd"/>
-      <w:r>
-        <w:t xml:space="preserve"> 2.0: </w:t>
+        <w:t>4. Install XRSound 2.0: </w:t>
       </w:r>
       <w:hyperlink r:id="rId18" w:history="1">
         <w:r>
@@ -1193,15 +1161,7 @@
         </w:r>
       </w:hyperlink>
       <w:r>
-        <w:t xml:space="preserve"> and unzip to your Orbiter directory. Do the same with the small </w:t>
-      </w:r>
-      <w:proofErr w:type="spellStart"/>
-      <w:r>
-        <w:t>XRSound</w:t>
-      </w:r>
-      <w:proofErr w:type="spellEnd"/>
-      <w:r>
-        <w:t xml:space="preserve"> config zip file that can be found at the link as well. These files only </w:t>
+        <w:t xml:space="preserve"> and unzip to your Orbiter directory. Do the same with the small XRSound config zip file that can be found at the link as well. These files only </w:t>
       </w:r>
       <w:r>
         <w:t>must</w:t>
@@ -1233,7 +1193,23 @@
           <w:b/>
           <w:bCs/>
         </w:rPr>
-        <w:t xml:space="preserve"> For Orbiter 2016 Beta</w:t>
+        <w:t xml:space="preserve"> </w:t>
+      </w:r>
+      <w:proofErr w:type="gramStart"/>
+      <w:r>
+        <w:rPr>
+          <w:b/>
+          <w:bCs/>
+        </w:rPr>
+        <w:t>For</w:t>
+      </w:r>
+      <w:proofErr w:type="gramEnd"/>
+      <w:r>
+        <w:rPr>
+          <w:b/>
+          <w:bCs/>
+        </w:rPr>
+        <w:t xml:space="preserve"> Orbiter 2016 Beta</w:t>
       </w:r>
       <w:r>
         <w:rPr>
@@ -1266,31 +1242,7 @@
       </w:r>
       <w:r>
         <w:br/>
-        <w:t>2. Go to the "Modules" tab and activate the "</w:t>
-      </w:r>
-      <w:proofErr w:type="spellStart"/>
-      <w:r>
-        <w:t>XRSound</w:t>
-      </w:r>
-      <w:proofErr w:type="spellEnd"/>
-      <w:r>
-        <w:t>" and "</w:t>
-      </w:r>
-      <w:proofErr w:type="spellStart"/>
-      <w:r>
-        <w:t>ProjectApolloMFD</w:t>
-      </w:r>
-      <w:proofErr w:type="spellEnd"/>
-      <w:r>
-        <w:t>" and "</w:t>
-      </w:r>
-      <w:proofErr w:type="spellStart"/>
-      <w:r>
-        <w:t>ApolloRTCCMFD</w:t>
-      </w:r>
-      <w:proofErr w:type="spellEnd"/>
-      <w:r>
-        <w:t>" modules.</w:t>
+        <w:t>2. Go to the "Modules" tab and activate the "XRSound" and "ProjectApolloMFD" and "ApolloRTCCMFD" modules.</w:t>
       </w:r>
       <w:r>
         <w:br/>
@@ -1303,7 +1255,15 @@
         <w:t>Vessel Configuration-&gt;Project Apollo Configuration</w:t>
       </w:r>
       <w:r>
-        <w:t xml:space="preserve"> on the "Extra" tab. If you have a joystick, this is where you can configure your joystick for use in NASSP. Do not use the normal Orbiter controls page to configure your joystick, there it should be &lt;Disabled&gt;. In the "Miscellaneous" tab, make sure "Multi-Threading in time acceleration" is checked. It is also recommended to set a limit for time acceleration, NASSP runs best at 50x or less depending on the hardware you are using.</w:t>
+        <w:t xml:space="preserve"> on the "Extra" tab. If you have a joystick, this is where you can configure your joystick for use in NASSP. Do not use the normal Orbiter controls page to configure your joystick, there it should be &lt;Disabled&gt;. In the "Miscellaneous" tab, make sure "</w:t>
+      </w:r>
+      <w:proofErr w:type="gramStart"/>
+      <w:r>
+        <w:t>Multi-Threading</w:t>
+      </w:r>
+      <w:proofErr w:type="gramEnd"/>
+      <w:r>
+        <w:t xml:space="preserve"> in time acceleration" is checked. It is also recommended to set a limit for time acceleration, NASSP runs best at 50x or less depending on the hardware you are using.</w:t>
       </w:r>
       <w:r>
         <w:br/>
@@ -1495,7 +1455,13 @@
     </w:p>
     <w:p>
       <w:r>
-        <w:t xml:space="preserve">1) Download Orbiter 2024 x64 or the latest Open Orbiter development release x64 from </w:t>
+        <w:t>1</w:t>
+      </w:r>
+      <w:r>
+        <w:t>.</w:t>
+      </w:r>
+      <w:r>
+        <w:t xml:space="preserve"> Download Orbiter 2024 x64 or the latest Open Orbiter development release x64 from </w:t>
       </w:r>
       <w:hyperlink r:id="rId21" w:history="1">
         <w:r>
@@ -1519,7 +1485,13 @@
     </w:p>
     <w:p>
       <w:r>
-        <w:t>2) Extract the Orbiter 2024 or Open Orbiter x64 into a folder of your choosing, this will become the orbiter root</w:t>
+        <w:t>2</w:t>
+      </w:r>
+      <w:r>
+        <w:t>.</w:t>
+      </w:r>
+      <w:r>
+        <w:t xml:space="preserve"> Extract the Orbiter 2024 or Open Orbiter x64 into a folder of your choosing, this will become the orbiter root</w:t>
       </w:r>
     </w:p>
     <w:p>
@@ -1545,7 +1517,10 @@
         <w:t>a</w:t>
       </w:r>
       <w:r>
-        <w:t>) Download Orbiter 2024 Release and extract the textures folder</w:t>
+        <w:t>.</w:t>
+      </w:r>
+      <w:r>
+        <w:t xml:space="preserve"> Download Orbiter 2024 Release and extract the textures folder</w:t>
       </w:r>
       <w:r>
         <w:t xml:space="preserve"> into your orbiter root</w:t>
@@ -1557,7 +1532,15 @@
         <w:t xml:space="preserve"> </w:t>
       </w:r>
       <w:r>
-        <w:t>This contains only Low Res textures</w:t>
+        <w:t xml:space="preserve">This contains only </w:t>
+      </w:r>
+      <w:proofErr w:type="gramStart"/>
+      <w:r>
+        <w:t>Low Res</w:t>
+      </w:r>
+      <w:proofErr w:type="gramEnd"/>
+      <w:r>
+        <w:t xml:space="preserve"> textures</w:t>
       </w:r>
     </w:p>
     <w:p>
@@ -1565,7 +1548,7 @@
         <w:t>1b</w:t>
       </w:r>
       <w:r>
-        <w:t>)</w:t>
+        <w:t>.</w:t>
       </w:r>
       <w:r>
         <w:t xml:space="preserve"> </w:t>
@@ -1599,7 +1582,10 @@
         <w:t>2</w:t>
       </w:r>
       <w:r>
-        <w:t xml:space="preserve">) If you choose to download all the </w:t>
+        <w:t>.</w:t>
+      </w:r>
+      <w:r>
+        <w:t xml:space="preserve"> If you choose to download all the </w:t>
       </w:r>
       <w:r>
         <w:t>high-res</w:t>
@@ -1646,7 +1632,13 @@
     </w:p>
     <w:p>
       <w:r>
-        <w:t>1) Download the latest NASSP Release or Pre</w:t>
+        <w:t>1</w:t>
+      </w:r>
+      <w:r>
+        <w:t>.</w:t>
+      </w:r>
+      <w:r>
+        <w:t xml:space="preserve"> Download the latest NASSP Release or Pre</w:t>
       </w:r>
       <w:r>
         <w:t>-</w:t>
@@ -1668,7 +1660,10 @@
         <w:t>2</w:t>
       </w:r>
       <w:r>
-        <w:t>) Extract NASSP into your orbiter root</w:t>
+        <w:t>.</w:t>
+      </w:r>
+      <w:r>
+        <w:t xml:space="preserve"> Extract NASSP into your orbiter root</w:t>
       </w:r>
     </w:p>
     <w:p>
@@ -1676,45 +1671,16 @@
         <w:t>3</w:t>
       </w:r>
       <w:r>
-        <w:t xml:space="preserve">) Launch orbiter and </w:t>
+        <w:t>.</w:t>
+      </w:r>
+      <w:r>
+        <w:t xml:space="preserve"> Launch orbiter and </w:t>
       </w:r>
       <w:r>
         <w:t>g</w:t>
       </w:r>
       <w:r>
-        <w:t>o to the "Modules" tab and activate the "</w:t>
-      </w:r>
-      <w:proofErr w:type="spellStart"/>
-      <w:r>
-        <w:t>ExtMFD</w:t>
-      </w:r>
-      <w:proofErr w:type="spellEnd"/>
-      <w:r>
-        <w:t xml:space="preserve">", </w:t>
-      </w:r>
-      <w:proofErr w:type="spellStart"/>
-      <w:r>
-        <w:t>XRSound</w:t>
-      </w:r>
-      <w:proofErr w:type="spellEnd"/>
-      <w:r>
-        <w:t>", "</w:t>
-      </w:r>
-      <w:proofErr w:type="spellStart"/>
-      <w:r>
-        <w:t>ProjectApolloMFD</w:t>
-      </w:r>
-      <w:proofErr w:type="spellEnd"/>
-      <w:r>
-        <w:t>" and "</w:t>
-      </w:r>
-      <w:proofErr w:type="spellStart"/>
-      <w:r>
-        <w:t>ApolloRTCCMFD</w:t>
-      </w:r>
-      <w:proofErr w:type="spellEnd"/>
-      <w:r>
-        <w:t>" modules. Do not use the DX9MFD as it is known to cause crashes</w:t>
+        <w:t>o to the "Modules" tab and activate the "ExtMFD", XRSound", "ProjectApolloMFD" and "ApolloRTCCMFD" modules. Do not use the DX9MFD as it is known to cause crashes</w:t>
       </w:r>
     </w:p>
     <w:p>
@@ -1722,7 +1688,18 @@
         <w:t>4</w:t>
       </w:r>
       <w:r>
-        <w:t>) In Options-&gt;Visual Settings make sure "local light sources" is enabled,</w:t>
+        <w:t>.</w:t>
+      </w:r>
+      <w:r>
+        <w:t xml:space="preserve"> In Options-&gt;Visual Settings make sure "local light sources" </w:t>
+      </w:r>
+      <w:proofErr w:type="gramStart"/>
+      <w:r>
+        <w:t>is</w:t>
+      </w:r>
+      <w:proofErr w:type="gramEnd"/>
+      <w:r>
+        <w:t xml:space="preserve"> enabled,</w:t>
       </w:r>
       <w:r>
         <w:t xml:space="preserve"> enable </w:t>
@@ -1739,7 +1716,10 @@
         <w:t>5</w:t>
       </w:r>
       <w:r>
-        <w:t>) In Options-&gt;Physics Settings</w:t>
+        <w:t>.</w:t>
+      </w:r>
+      <w:r>
+        <w:t xml:space="preserve"> In Options-&gt;Physics Settings</w:t>
       </w:r>
       <w:r>
         <w:t>,</w:t>
@@ -1756,7 +1736,10 @@
         <w:t>6</w:t>
       </w:r>
       <w:r>
-        <w:t xml:space="preserve">) In Video, make sure you select D3D9Client as the graphics engine and then select your GPU, and </w:t>
+        <w:t>.</w:t>
+      </w:r>
+      <w:r>
+        <w:t xml:space="preserve"> In Video, make sure you select D3D9Client as the graphics engine and then select your GPU, and </w:t>
       </w:r>
       <w:r>
         <w:t>we</w:t>
@@ -1779,7 +1762,19 @@
         <w:t>7</w:t>
       </w:r>
       <w:r>
-        <w:t>) In the advanced settings of video, configure however you wish, but you must have "enable absolute animation handling" checked and texture mipmaps must be set to "load as defined"</w:t>
+        <w:t>.</w:t>
+      </w:r>
+      <w:r>
+        <w:t xml:space="preserve"> In the advanced settings of video, configure however you wish, but you must have "enable absolute animation handling" checked and texture mipmaps must be set to "load as defined</w:t>
+      </w:r>
+      <w:r>
+        <w:t>.</w:t>
+      </w:r>
+      <w:r>
+        <w:t>"</w:t>
+      </w:r>
+      <w:r>
+        <w:t xml:space="preserve"> Additionally, set reflection mode to “full scene” to get the most out of the CM textures </w:t>
       </w:r>
     </w:p>
     <w:p>
@@ -1787,7 +1782,10 @@
         <w:t>8</w:t>
       </w:r>
       <w:r>
-        <w:t xml:space="preserve">) In Extra-&gt;debugging options-&gt;orbiter shutdown options, </w:t>
+        <w:t>.</w:t>
+      </w:r>
+      <w:r>
+        <w:t xml:space="preserve"> In Extra-&gt;debugging options-&gt;orbiter shutdown options, </w:t>
       </w:r>
       <w:r>
         <w:t>we</w:t>
@@ -1808,7 +1806,10 @@
         <w:t>9</w:t>
       </w:r>
       <w:r>
-        <w:t xml:space="preserve">) </w:t>
+        <w:t>.</w:t>
+      </w:r>
+      <w:r>
+        <w:t xml:space="preserve"> </w:t>
       </w:r>
       <w:r>
         <w:t>I</w:t>
@@ -1877,7 +1878,15 @@
         <w:br/>
       </w:r>
       <w:r>
-        <w:t>That's ultimately up to you, but we generally recommend Apollo 8. While Apollo 7 is chronologically first, it's a very long mission that is meant to test vehicle systems and procedures from the relative safety of low Earth orbit. As such, it involves a very unusual and often repetitive schedule, with procedures that are rather unrefined. Apollo 8, by contrast, is a relatively short mission with more straightforward goals and mission design. You get to experience most of the lunar mission milestones without needing to worry about managing two separate vehicles on your first journey. After Apollo 8 concludes, Apollo 11 or 12 would be our next recommendation. You get to use the LM and land on the moon, and the procedures have been improved and optimized thanks to the lessons learned on all the previous missions.</w:t>
+        <w:t xml:space="preserve">That's ultimately up to you, but we generally recommend Apollo 8. While Apollo 7 is chronologically first, it's a very long mission that is meant to test vehicle systems and procedures from the relative safety of low Earth orbit. As such, it involves a very unusual and often repetitive schedule, with procedures that are rather unrefined. Apollo 8, by contrast, is a relatively short mission with more straightforward goals and mission design. You get to experience most of the lunar mission milestones without needing to worry about managing two separate vehicles on your first journey. After Apollo 8 concludes, Apollo 11 or 12 would be our next recommendation. You get to use </w:t>
+      </w:r>
+      <w:proofErr w:type="gramStart"/>
+      <w:r>
+        <w:t>the LM</w:t>
+      </w:r>
+      <w:proofErr w:type="gramEnd"/>
+      <w:r>
+        <w:t xml:space="preserve"> and land on the moon, and the procedures have been improved and optimized thanks to the lessons learned on all the previous missions.</w:t>
       </w:r>
       <w:r>
         <w:br/>
@@ -2040,13 +2049,29 @@
         <w:br/>
       </w:r>
       <w:r>
-        <w:t xml:space="preserve">These are pretty easy. You can </w:t>
+        <w:t xml:space="preserve">These are </w:t>
+      </w:r>
+      <w:proofErr w:type="gramStart"/>
+      <w:r>
+        <w:t>pretty easy</w:t>
+      </w:r>
+      <w:proofErr w:type="gramEnd"/>
+      <w:r>
+        <w:t xml:space="preserve">. You can </w:t>
       </w:r>
       <w:r>
         <w:t>click on the left</w:t>
       </w:r>
       <w:r>
-        <w:t xml:space="preserve"> circuit breakers to close or open them. For computer keys like the DSKY or DEDA, just click on each button to press it. If you find that the computer isn't always responding to your key presses, you may be letting go of the button too quickly. Each computer key needs to be held for a small fraction of a second, and sometimes a fast click doesn't hold the button down for quite long enough. You don't need to hold them for a long time, only for a brief moment to ensure they register.</w:t>
+        <w:t xml:space="preserve"> circuit breakers to close or open them. For computer keys like the DSKY or DEDA, just click on each button to press it. If you find that the computer isn't always responding to your key presses, you may be letting go of the button too quickly. Each computer key needs to be held for a small fraction of a second, and sometimes a fast click doesn't hold the button down for quite long enough. You don't need to hold them for a long time, only for </w:t>
+      </w:r>
+      <w:proofErr w:type="gramStart"/>
+      <w:r>
+        <w:t>a brief moment</w:t>
+      </w:r>
+      <w:proofErr w:type="gramEnd"/>
+      <w:r>
+        <w:t xml:space="preserve"> to ensure they register.</w:t>
       </w:r>
       <w:r>
         <w:br/>
@@ -2100,15 +2125,7 @@
         <w:ind w:left="360"/>
       </w:pPr>
       <w:r>
-        <w:t xml:space="preserve">Thumbwheels are the vertical numbered controls, found on the gimbal trim control panel and the attitude set control panel. Left-click the upper or lower part of each thumbwheel to increase/decrease its value by 1, or right-click them to increase/decrease by 0.1. The </w:t>
-      </w:r>
-      <w:proofErr w:type="spellStart"/>
-      <w:r>
-        <w:t>dV</w:t>
-      </w:r>
-      <w:proofErr w:type="spellEnd"/>
-      <w:r>
-        <w:t xml:space="preserve">/Range Set switch on the EMS works similarly: hold the switch on the top or bottom to increase or decrease the </w:t>
+        <w:t xml:space="preserve">Thumbwheels are the vertical numbered controls, found on the gimbal trim control panel and the attitude set control panel. Left-click the upper or lower part of each thumbwheel to increase/decrease its value by 1, or right-click them to increase/decrease by 0.1. The dV/Range Set switch on the EMS works similarly: hold the switch on the top or bottom to increase or decrease the </w:t>
       </w:r>
       <w:r>
         <w:t>value and</w:t>
@@ -2123,15 +2140,7 @@
       </w:pPr>
       <w:r>
         <w:lastRenderedPageBreak/>
-        <w:t>While the 2D cockpit has MFDs built right into its main panel, the 3D cockpit does not. To open an MFD in the 3D cockpit, move your mouse near the top of the Orbiter window. A menu bar should drop down. Click on "Function" and then choose "External MFD". If this option does not appear, make sure the "</w:t>
-      </w:r>
-      <w:proofErr w:type="spellStart"/>
-      <w:r>
-        <w:t>ExtMFD</w:t>
-      </w:r>
-      <w:proofErr w:type="spellEnd"/>
-      <w:r>
-        <w:t>" module is enabled in the Orbiter settings.</w:t>
+        <w:t>While the 2D cockpit has MFDs built right into its main panel, the 3D cockpit does not. To open an MFD in the 3D cockpit, move your mouse near the top of the Orbiter window. A menu bar should drop down. Click on "Function" and then choose "External MFD". If this option does not appear, make sure the "ExtMFD" module is enabled in the Orbiter settings.</w:t>
       </w:r>
     </w:p>
     <w:p>
@@ -2237,7 +2246,23 @@
           <w:b/>
           <w:bCs/>
         </w:rPr>
-        <w:t xml:space="preserve"> keep your save files organized!</w:t>
+        <w:t xml:space="preserve"> keep </w:t>
+      </w:r>
+      <w:proofErr w:type="gramStart"/>
+      <w:r>
+        <w:rPr>
+          <w:b/>
+          <w:bCs/>
+        </w:rPr>
+        <w:t>your save</w:t>
+      </w:r>
+      <w:proofErr w:type="gramEnd"/>
+      <w:r>
+        <w:rPr>
+          <w:b/>
+          <w:bCs/>
+        </w:rPr>
+        <w:t xml:space="preserve"> files organized!</w:t>
       </w:r>
       <w:r>
         <w:t> </w:t>
@@ -2352,16 +2377,32 @@
         <w:t>time warp</w:t>
       </w:r>
       <w:r>
-        <w:t xml:space="preserve"> normally. It will even affect vessels that you're not currently controlling: </w:t>
+        <w:t xml:space="preserve"> normally. It will even affect vessels that you're not currently </w:t>
+      </w:r>
+      <w:proofErr w:type="gramStart"/>
+      <w:r>
+        <w:t>controlling:</w:t>
+      </w:r>
+      <w:proofErr w:type="gramEnd"/>
+      <w:r>
+        <w:t xml:space="preserve"> </w:t>
       </w:r>
       <w:r>
         <w:t>time warping</w:t>
       </w:r>
       <w:r>
-        <w:t xml:space="preserve"> in the CSM while the LM is trying to hold attitude will cause problems for the LM. Usually going up to about 5x or 10x is safe. If you want to </w:t>
-      </w:r>
-      <w:r>
-        <w:t>time warp</w:t>
+        <w:t xml:space="preserve"> in the CSM while the LM is trying to hold attitude will cause problems for the LM. Usually going up to about 5x or 10x is safe. If you want </w:t>
+      </w:r>
+      <w:proofErr w:type="gramStart"/>
+      <w:r>
+        <w:t xml:space="preserve">to </w:t>
+      </w:r>
+      <w:r>
+        <w:t>time</w:t>
+      </w:r>
+      <w:proofErr w:type="gramEnd"/>
+      <w:r>
+        <w:t xml:space="preserve"> warp</w:t>
       </w:r>
       <w:r>
         <w:t xml:space="preserve"> faster, be sure to disable any kind of attitude-hold mode in the CSM and LM before </w:t>
@@ -2398,7 +2439,23 @@
         <w:br/>
       </w:r>
       <w:r>
-        <w:t xml:space="preserve">When you're performing LM activation, be sure to use the Project Apollo MFD's "ECS" section to connect the O2 hose from the CSM. This creates a flow of fresh oxygen into the LM so that the cabin doesn't fill up with deadly CO2 and poison your crew before the LM ECS is activated. Having this O2 hose connected also prevents you from closing the CSM forward hatch, so if you can't get it </w:t>
+        <w:t xml:space="preserve">When you're performing LM activation, be sure to use </w:t>
+      </w:r>
+      <w:proofErr w:type="gramStart"/>
+      <w:r>
+        <w:t>the Project</w:t>
+      </w:r>
+      <w:proofErr w:type="gramEnd"/>
+      <w:r>
+        <w:t xml:space="preserve"> Apollo MFD's "ECS" section to connect the O2 hose from the CSM. This creates a flow of fresh oxygen into the LM so that the cabin doesn't fill up with deadly CO2 and </w:t>
+      </w:r>
+      <w:proofErr w:type="gramStart"/>
+      <w:r>
+        <w:t>poison</w:t>
+      </w:r>
+      <w:proofErr w:type="gramEnd"/>
+      <w:r>
+        <w:t xml:space="preserve"> your crew before the LM ECS is activated. Having this O2 hose connected also prevents you from closing the CSM forward hatch, so if you can't get it </w:t>
       </w:r>
       <w:r>
         <w:t>too</w:t>
@@ -2779,7 +2836,6 @@
                 <w14:ligatures w14:val="none"/>
               </w:rPr>
             </w:pPr>
-            <w:proofErr w:type="spellStart"/>
             <w:r>
               <w:rPr>
                 <w:rFonts w:eastAsia="Times New Roman" w:cs="Times New Roman"/>
@@ -2789,7 +2845,6 @@
               </w:rPr>
               <w:t>Ctrl+Alt+S</w:t>
             </w:r>
-            <w:proofErr w:type="spellEnd"/>
           </w:p>
         </w:tc>
         <w:tc>
@@ -2821,19 +2876,8 @@
                 <w:kern w:val="0"/>
                 <w14:ligatures w14:val="none"/>
               </w:rPr>
-              <w:t xml:space="preserve">Generate Mission Time-Stamped </w:t>
-            </w:r>
-            <w:proofErr w:type="spellStart"/>
-            <w:r>
-              <w:rPr>
-                <w:rFonts w:eastAsia="Times New Roman" w:cs="Times New Roman"/>
-                <w:color w:val="000000"/>
-                <w:kern w:val="0"/>
-                <w14:ligatures w14:val="none"/>
-              </w:rPr>
-              <w:t>Quicksave</w:t>
-            </w:r>
-            <w:proofErr w:type="spellEnd"/>
+              <w:t>Generate Mission Time-Stamped Quicksave</w:t>
+            </w:r>
           </w:p>
         </w:tc>
       </w:tr>
@@ -3922,25 +3966,14 @@
                 <w14:ligatures w14:val="none"/>
               </w:rPr>
             </w:pPr>
-            <w:proofErr w:type="spellStart"/>
-            <w:r>
-              <w:rPr>
-                <w:rFonts w:eastAsia="Times New Roman" w:cs="Times New Roman"/>
-                <w:color w:val="000000"/>
-                <w:kern w:val="0"/>
-                <w14:ligatures w14:val="none"/>
-              </w:rPr>
-              <w:t>Shift+Decimal</w:t>
-            </w:r>
-            <w:proofErr w:type="spellEnd"/>
-            <w:r>
-              <w:rPr>
-                <w:rFonts w:eastAsia="Times New Roman" w:cs="Times New Roman"/>
-                <w:color w:val="000000"/>
-                <w:kern w:val="0"/>
-                <w14:ligatures w14:val="none"/>
-              </w:rPr>
-              <w:t xml:space="preserve"> (Numpad)</w:t>
+            <w:r>
+              <w:rPr>
+                <w:rFonts w:eastAsia="Times New Roman" w:cs="Times New Roman"/>
+                <w:color w:val="000000"/>
+                <w:kern w:val="0"/>
+                <w14:ligatures w14:val="none"/>
+              </w:rPr>
+              <w:t>Shift+Decimal (Numpad)</w:t>
             </w:r>
           </w:p>
         </w:tc>
@@ -4006,25 +4039,14 @@
                 <w14:ligatures w14:val="none"/>
               </w:rPr>
             </w:pPr>
-            <w:proofErr w:type="spellStart"/>
-            <w:r>
-              <w:rPr>
-                <w:rFonts w:eastAsia="Times New Roman" w:cs="Times New Roman"/>
-                <w:color w:val="000000"/>
-                <w:kern w:val="0"/>
-                <w14:ligatures w14:val="none"/>
-              </w:rPr>
-              <w:t>Shift+Page</w:t>
-            </w:r>
-            <w:proofErr w:type="spellEnd"/>
-            <w:r>
-              <w:rPr>
-                <w:rFonts w:eastAsia="Times New Roman" w:cs="Times New Roman"/>
-                <w:color w:val="000000"/>
-                <w:kern w:val="0"/>
-                <w14:ligatures w14:val="none"/>
-              </w:rPr>
-              <w:t xml:space="preserve"> Up</w:t>
+            <w:r>
+              <w:rPr>
+                <w:rFonts w:eastAsia="Times New Roman" w:cs="Times New Roman"/>
+                <w:color w:val="000000"/>
+                <w:kern w:val="0"/>
+                <w14:ligatures w14:val="none"/>
+              </w:rPr>
+              <w:t>Shift+Page Up</w:t>
             </w:r>
           </w:p>
         </w:tc>
@@ -4090,7 +4112,6 @@
                 <w14:ligatures w14:val="none"/>
               </w:rPr>
             </w:pPr>
-            <w:proofErr w:type="spellStart"/>
             <w:r>
               <w:rPr>
                 <w:rFonts w:eastAsia="Times New Roman" w:cs="Times New Roman"/>
@@ -4100,7 +4121,6 @@
               </w:rPr>
               <w:t>Shift+Home</w:t>
             </w:r>
-            <w:proofErr w:type="spellEnd"/>
           </w:p>
         </w:tc>
         <w:tc>
@@ -4165,25 +4185,14 @@
                 <w14:ligatures w14:val="none"/>
               </w:rPr>
             </w:pPr>
-            <w:proofErr w:type="spellStart"/>
-            <w:r>
-              <w:rPr>
-                <w:rFonts w:eastAsia="Times New Roman" w:cs="Times New Roman"/>
-                <w:color w:val="000000"/>
-                <w:kern w:val="0"/>
-                <w14:ligatures w14:val="none"/>
-              </w:rPr>
-              <w:t>Shift+Enter</w:t>
-            </w:r>
-            <w:proofErr w:type="spellEnd"/>
-            <w:r>
-              <w:rPr>
-                <w:rFonts w:eastAsia="Times New Roman" w:cs="Times New Roman"/>
-                <w:color w:val="000000"/>
-                <w:kern w:val="0"/>
-                <w14:ligatures w14:val="none"/>
-              </w:rPr>
-              <w:t xml:space="preserve"> (Numpad)</w:t>
+            <w:r>
+              <w:rPr>
+                <w:rFonts w:eastAsia="Times New Roman" w:cs="Times New Roman"/>
+                <w:color w:val="000000"/>
+                <w:kern w:val="0"/>
+                <w14:ligatures w14:val="none"/>
+              </w:rPr>
+              <w:t>Shift+Enter (Numpad)</w:t>
             </w:r>
           </w:p>
         </w:tc>
@@ -4249,25 +4258,14 @@
                 <w14:ligatures w14:val="none"/>
               </w:rPr>
             </w:pPr>
-            <w:proofErr w:type="spellStart"/>
-            <w:r>
-              <w:rPr>
-                <w:rFonts w:eastAsia="Times New Roman" w:cs="Times New Roman"/>
-                <w:color w:val="000000"/>
-                <w:kern w:val="0"/>
-                <w14:ligatures w14:val="none"/>
-              </w:rPr>
-              <w:t>Shift+Divide</w:t>
-            </w:r>
-            <w:proofErr w:type="spellEnd"/>
-            <w:r>
-              <w:rPr>
-                <w:rFonts w:eastAsia="Times New Roman" w:cs="Times New Roman"/>
-                <w:color w:val="000000"/>
-                <w:kern w:val="0"/>
-                <w14:ligatures w14:val="none"/>
-              </w:rPr>
-              <w:t xml:space="preserve"> (Numpad /)</w:t>
+            <w:r>
+              <w:rPr>
+                <w:rFonts w:eastAsia="Times New Roman" w:cs="Times New Roman"/>
+                <w:color w:val="000000"/>
+                <w:kern w:val="0"/>
+                <w14:ligatures w14:val="none"/>
+              </w:rPr>
+              <w:t>Shift+Divide (Numpad /)</w:t>
             </w:r>
           </w:p>
         </w:tc>
@@ -4333,25 +4331,14 @@
                 <w14:ligatures w14:val="none"/>
               </w:rPr>
             </w:pPr>
-            <w:proofErr w:type="spellStart"/>
-            <w:r>
-              <w:rPr>
-                <w:rFonts w:eastAsia="Times New Roman" w:cs="Times New Roman"/>
-                <w:color w:val="000000"/>
-                <w:kern w:val="0"/>
-                <w14:ligatures w14:val="none"/>
-              </w:rPr>
-              <w:t>Shift+Multiply</w:t>
-            </w:r>
-            <w:proofErr w:type="spellEnd"/>
-            <w:r>
-              <w:rPr>
-                <w:rFonts w:eastAsia="Times New Roman" w:cs="Times New Roman"/>
-                <w:color w:val="000000"/>
-                <w:kern w:val="0"/>
-                <w14:ligatures w14:val="none"/>
-              </w:rPr>
-              <w:t xml:space="preserve"> (Numpad *)</w:t>
+            <w:r>
+              <w:rPr>
+                <w:rFonts w:eastAsia="Times New Roman" w:cs="Times New Roman"/>
+                <w:color w:val="000000"/>
+                <w:kern w:val="0"/>
+                <w14:ligatures w14:val="none"/>
+              </w:rPr>
+              <w:t>Shift+Multiply (Numpad *)</w:t>
             </w:r>
           </w:p>
         </w:tc>
@@ -4417,25 +4404,14 @@
                 <w14:ligatures w14:val="none"/>
               </w:rPr>
             </w:pPr>
-            <w:proofErr w:type="spellStart"/>
-            <w:r>
-              <w:rPr>
-                <w:rFonts w:eastAsia="Times New Roman" w:cs="Times New Roman"/>
-                <w:color w:val="000000"/>
-                <w:kern w:val="0"/>
-                <w14:ligatures w14:val="none"/>
-              </w:rPr>
-              <w:t>Shift+Plus</w:t>
-            </w:r>
-            <w:proofErr w:type="spellEnd"/>
-            <w:r>
-              <w:rPr>
-                <w:rFonts w:eastAsia="Times New Roman" w:cs="Times New Roman"/>
-                <w:color w:val="000000"/>
-                <w:kern w:val="0"/>
-                <w14:ligatures w14:val="none"/>
-              </w:rPr>
-              <w:t xml:space="preserve"> (Numpad +)</w:t>
+            <w:r>
+              <w:rPr>
+                <w:rFonts w:eastAsia="Times New Roman" w:cs="Times New Roman"/>
+                <w:color w:val="000000"/>
+                <w:kern w:val="0"/>
+                <w14:ligatures w14:val="none"/>
+              </w:rPr>
+              <w:t>Shift+Plus (Numpad +)</w:t>
             </w:r>
           </w:p>
         </w:tc>
@@ -4501,25 +4477,14 @@
                 <w14:ligatures w14:val="none"/>
               </w:rPr>
             </w:pPr>
-            <w:proofErr w:type="spellStart"/>
-            <w:r>
-              <w:rPr>
-                <w:rFonts w:eastAsia="Times New Roman" w:cs="Times New Roman"/>
-                <w:color w:val="000000"/>
-                <w:kern w:val="0"/>
-                <w14:ligatures w14:val="none"/>
-              </w:rPr>
-              <w:t>Shift+Minus</w:t>
-            </w:r>
-            <w:proofErr w:type="spellEnd"/>
-            <w:r>
-              <w:rPr>
-                <w:rFonts w:eastAsia="Times New Roman" w:cs="Times New Roman"/>
-                <w:color w:val="000000"/>
-                <w:kern w:val="0"/>
-                <w14:ligatures w14:val="none"/>
-              </w:rPr>
-              <w:t xml:space="preserve"> (Numpad -)</w:t>
+            <w:r>
+              <w:rPr>
+                <w:rFonts w:eastAsia="Times New Roman" w:cs="Times New Roman"/>
+                <w:color w:val="000000"/>
+                <w:kern w:val="0"/>
+                <w14:ligatures w14:val="none"/>
+              </w:rPr>
+              <w:t>Shift+Minus (Numpad -)</w:t>
             </w:r>
           </w:p>
         </w:tc>
@@ -4585,7 +4550,6 @@
                 <w14:ligatures w14:val="none"/>
               </w:rPr>
             </w:pPr>
-            <w:proofErr w:type="spellStart"/>
             <w:r>
               <w:rPr>
                 <w:rFonts w:eastAsia="Times New Roman" w:cs="Times New Roman"/>
@@ -4595,7 +4559,6 @@
               </w:rPr>
               <w:t>Shift+End</w:t>
             </w:r>
-            <w:proofErr w:type="spellEnd"/>
           </w:p>
         </w:tc>
         <w:tc>
@@ -4918,15 +4881,7 @@
         <w:t>default,</w:t>
       </w:r>
       <w:r>
-        <w:t xml:space="preserve"> these commands use the soft stop of the RHC or ACA. To get full deflection of the attitude controller and command direct/</w:t>
-      </w:r>
-      <w:proofErr w:type="spellStart"/>
-      <w:r>
-        <w:t>hardover</w:t>
-      </w:r>
-      <w:proofErr w:type="spellEnd"/>
-      <w:r>
-        <w:t xml:space="preserve"> RCS firing in the CSM/LM respectively, hold the left or right Alt key while commanding rotation. To move the ACA out of detent in the LM without commanding RCS thrust, hold Ctrl and Alt while commanding rotation.</w:t>
+        <w:t xml:space="preserve"> these commands use the soft stop of the RHC or ACA. To get full deflection of the attitude controller and command direct/hardover RCS firing in the CSM/LM respectively, hold the left or right Alt key while commanding rotation. To move the ACA out of detent in the LM without commanding RCS thrust, hold Ctrl and Alt while commanding rotation.</w:t>
       </w:r>
     </w:p>
     <w:p>
@@ -6184,7 +6139,6 @@
                 <w14:ligatures w14:val="none"/>
               </w:rPr>
             </w:pPr>
-            <w:proofErr w:type="spellStart"/>
             <w:r>
               <w:rPr>
                 <w:rFonts w:eastAsia="Times New Roman" w:cs="Times New Roman"/>
@@ -6194,7 +6148,6 @@
               </w:rPr>
               <w:t>Shift+W</w:t>
             </w:r>
-            <w:proofErr w:type="spellEnd"/>
           </w:p>
         </w:tc>
         <w:tc>
@@ -6259,7 +6212,6 @@
                 <w14:ligatures w14:val="none"/>
               </w:rPr>
             </w:pPr>
-            <w:proofErr w:type="spellStart"/>
             <w:r>
               <w:rPr>
                 <w:rFonts w:eastAsia="Times New Roman" w:cs="Times New Roman"/>
@@ -6269,7 +6221,6 @@
               </w:rPr>
               <w:t>Shift+S</w:t>
             </w:r>
-            <w:proofErr w:type="spellEnd"/>
           </w:p>
         </w:tc>
         <w:tc>
@@ -6334,7 +6285,6 @@
                 <w14:ligatures w14:val="none"/>
               </w:rPr>
             </w:pPr>
-            <w:proofErr w:type="spellStart"/>
             <w:r>
               <w:rPr>
                 <w:rFonts w:eastAsia="Times New Roman" w:cs="Times New Roman"/>
@@ -6344,7 +6294,6 @@
               </w:rPr>
               <w:t>Shift+A</w:t>
             </w:r>
-            <w:proofErr w:type="spellEnd"/>
           </w:p>
         </w:tc>
         <w:tc>
@@ -6409,7 +6358,6 @@
                 <w14:ligatures w14:val="none"/>
               </w:rPr>
             </w:pPr>
-            <w:proofErr w:type="spellStart"/>
             <w:r>
               <w:rPr>
                 <w:rFonts w:eastAsia="Times New Roman" w:cs="Times New Roman"/>
@@ -6419,7 +6367,6 @@
               </w:rPr>
               <w:t>Shift+D</w:t>
             </w:r>
-            <w:proofErr w:type="spellEnd"/>
           </w:p>
         </w:tc>
         <w:tc>
@@ -6484,7 +6431,6 @@
                 <w14:ligatures w14:val="none"/>
               </w:rPr>
             </w:pPr>
-            <w:proofErr w:type="spellStart"/>
             <w:r>
               <w:rPr>
                 <w:rFonts w:eastAsia="Times New Roman" w:cs="Times New Roman"/>
@@ -6494,7 +6440,6 @@
               </w:rPr>
               <w:t>Shift+Q</w:t>
             </w:r>
-            <w:proofErr w:type="spellEnd"/>
           </w:p>
         </w:tc>
         <w:tc>
@@ -6559,7 +6504,6 @@
                 <w14:ligatures w14:val="none"/>
               </w:rPr>
             </w:pPr>
-            <w:proofErr w:type="spellStart"/>
             <w:r>
               <w:rPr>
                 <w:rFonts w:eastAsia="Times New Roman" w:cs="Times New Roman"/>
@@ -6569,7 +6513,6 @@
               </w:rPr>
               <w:t>Shift+E</w:t>
             </w:r>
-            <w:proofErr w:type="spellEnd"/>
           </w:p>
         </w:tc>
         <w:tc>
@@ -7797,25 +7740,14 @@
                 <w14:ligatures w14:val="none"/>
               </w:rPr>
             </w:pPr>
-            <w:proofErr w:type="spellStart"/>
-            <w:r>
-              <w:rPr>
-                <w:rFonts w:eastAsia="Times New Roman" w:cs="Times New Roman"/>
-                <w:color w:val="000000"/>
-                <w:kern w:val="0"/>
-                <w14:ligatures w14:val="none"/>
-              </w:rPr>
-              <w:t>Ctrl+Decimal</w:t>
-            </w:r>
-            <w:proofErr w:type="spellEnd"/>
-            <w:r>
-              <w:rPr>
-                <w:rFonts w:eastAsia="Times New Roman" w:cs="Times New Roman"/>
-                <w:color w:val="000000"/>
-                <w:kern w:val="0"/>
-                <w14:ligatures w14:val="none"/>
-              </w:rPr>
-              <w:t xml:space="preserve"> (Numpad .)</w:t>
+            <w:r>
+              <w:rPr>
+                <w:rFonts w:eastAsia="Times New Roman" w:cs="Times New Roman"/>
+                <w:color w:val="000000"/>
+                <w:kern w:val="0"/>
+                <w14:ligatures w14:val="none"/>
+              </w:rPr>
+              <w:t>Ctrl+Decimal (Numpad .)</w:t>
             </w:r>
           </w:p>
         </w:tc>
@@ -7881,25 +7813,14 @@
                 <w14:ligatures w14:val="none"/>
               </w:rPr>
             </w:pPr>
-            <w:proofErr w:type="spellStart"/>
-            <w:r>
-              <w:rPr>
-                <w:rFonts w:eastAsia="Times New Roman" w:cs="Times New Roman"/>
-                <w:color w:val="000000"/>
-                <w:kern w:val="0"/>
-                <w14:ligatures w14:val="none"/>
-              </w:rPr>
-              <w:t>Ctrl+Enter</w:t>
-            </w:r>
-            <w:proofErr w:type="spellEnd"/>
-            <w:r>
-              <w:rPr>
-                <w:rFonts w:eastAsia="Times New Roman" w:cs="Times New Roman"/>
-                <w:color w:val="000000"/>
-                <w:kern w:val="0"/>
-                <w14:ligatures w14:val="none"/>
-              </w:rPr>
-              <w:t xml:space="preserve"> (Numpad)</w:t>
+            <w:r>
+              <w:rPr>
+                <w:rFonts w:eastAsia="Times New Roman" w:cs="Times New Roman"/>
+                <w:color w:val="000000"/>
+                <w:kern w:val="0"/>
+                <w14:ligatures w14:val="none"/>
+              </w:rPr>
+              <w:t>Ctrl+Enter (Numpad)</w:t>
             </w:r>
           </w:p>
         </w:tc>
@@ -7965,25 +7886,14 @@
                 <w14:ligatures w14:val="none"/>
               </w:rPr>
             </w:pPr>
-            <w:proofErr w:type="spellStart"/>
-            <w:r>
-              <w:rPr>
-                <w:rFonts w:eastAsia="Times New Roman" w:cs="Times New Roman"/>
-                <w:color w:val="000000"/>
-                <w:kern w:val="0"/>
-                <w14:ligatures w14:val="none"/>
-              </w:rPr>
-              <w:t>Ctrl+Page</w:t>
-            </w:r>
-            <w:proofErr w:type="spellEnd"/>
-            <w:r>
-              <w:rPr>
-                <w:rFonts w:eastAsia="Times New Roman" w:cs="Times New Roman"/>
-                <w:color w:val="000000"/>
-                <w:kern w:val="0"/>
-                <w14:ligatures w14:val="none"/>
-              </w:rPr>
-              <w:t xml:space="preserve"> Up</w:t>
+            <w:r>
+              <w:rPr>
+                <w:rFonts w:eastAsia="Times New Roman" w:cs="Times New Roman"/>
+                <w:color w:val="000000"/>
+                <w:kern w:val="0"/>
+                <w14:ligatures w14:val="none"/>
+              </w:rPr>
+              <w:t>Ctrl+Page Up</w:t>
             </w:r>
           </w:p>
         </w:tc>
@@ -8049,25 +7959,14 @@
                 <w14:ligatures w14:val="none"/>
               </w:rPr>
             </w:pPr>
-            <w:proofErr w:type="spellStart"/>
-            <w:r>
-              <w:rPr>
-                <w:rFonts w:eastAsia="Times New Roman" w:cs="Times New Roman"/>
-                <w:color w:val="000000"/>
-                <w:kern w:val="0"/>
-                <w14:ligatures w14:val="none"/>
-              </w:rPr>
-              <w:t>Ctrl+Multiply</w:t>
-            </w:r>
-            <w:proofErr w:type="spellEnd"/>
-            <w:r>
-              <w:rPr>
-                <w:rFonts w:eastAsia="Times New Roman" w:cs="Times New Roman"/>
-                <w:color w:val="000000"/>
-                <w:kern w:val="0"/>
-                <w14:ligatures w14:val="none"/>
-              </w:rPr>
-              <w:t xml:space="preserve"> (Numpad *)</w:t>
+            <w:r>
+              <w:rPr>
+                <w:rFonts w:eastAsia="Times New Roman" w:cs="Times New Roman"/>
+                <w:color w:val="000000"/>
+                <w:kern w:val="0"/>
+                <w14:ligatures w14:val="none"/>
+              </w:rPr>
+              <w:t>Ctrl+Multiply (Numpad *)</w:t>
             </w:r>
           </w:p>
         </w:tc>
@@ -8133,25 +8032,14 @@
                 <w14:ligatures w14:val="none"/>
               </w:rPr>
             </w:pPr>
-            <w:proofErr w:type="spellStart"/>
-            <w:r>
-              <w:rPr>
-                <w:rFonts w:eastAsia="Times New Roman" w:cs="Times New Roman"/>
-                <w:color w:val="000000"/>
-                <w:kern w:val="0"/>
-                <w14:ligatures w14:val="none"/>
-              </w:rPr>
-              <w:t>Ctrl+Plus</w:t>
-            </w:r>
-            <w:proofErr w:type="spellEnd"/>
-            <w:r>
-              <w:rPr>
-                <w:rFonts w:eastAsia="Times New Roman" w:cs="Times New Roman"/>
-                <w:color w:val="000000"/>
-                <w:kern w:val="0"/>
-                <w14:ligatures w14:val="none"/>
-              </w:rPr>
-              <w:t xml:space="preserve"> (Numpad +)</w:t>
+            <w:r>
+              <w:rPr>
+                <w:rFonts w:eastAsia="Times New Roman" w:cs="Times New Roman"/>
+                <w:color w:val="000000"/>
+                <w:kern w:val="0"/>
+                <w14:ligatures w14:val="none"/>
+              </w:rPr>
+              <w:t>Ctrl+Plus (Numpad +)</w:t>
             </w:r>
           </w:p>
         </w:tc>
@@ -8217,25 +8105,14 @@
                 <w14:ligatures w14:val="none"/>
               </w:rPr>
             </w:pPr>
-            <w:proofErr w:type="spellStart"/>
-            <w:r>
-              <w:rPr>
-                <w:rFonts w:eastAsia="Times New Roman" w:cs="Times New Roman"/>
-                <w:color w:val="000000"/>
-                <w:kern w:val="0"/>
-                <w14:ligatures w14:val="none"/>
-              </w:rPr>
-              <w:t>Ctrl+Minus</w:t>
-            </w:r>
-            <w:proofErr w:type="spellEnd"/>
-            <w:r>
-              <w:rPr>
-                <w:rFonts w:eastAsia="Times New Roman" w:cs="Times New Roman"/>
-                <w:color w:val="000000"/>
-                <w:kern w:val="0"/>
-                <w14:ligatures w14:val="none"/>
-              </w:rPr>
-              <w:t xml:space="preserve"> (Numpad -)</w:t>
+            <w:r>
+              <w:rPr>
+                <w:rFonts w:eastAsia="Times New Roman" w:cs="Times New Roman"/>
+                <w:color w:val="000000"/>
+                <w:kern w:val="0"/>
+                <w14:ligatures w14:val="none"/>
+              </w:rPr>
+              <w:t>Ctrl+Minus (Numpad -)</w:t>
             </w:r>
           </w:p>
         </w:tc>
@@ -8694,7 +8571,6 @@
                 <w14:ligatures w14:val="none"/>
               </w:rPr>
             </w:pPr>
-            <w:proofErr w:type="spellStart"/>
             <w:r>
               <w:rPr>
                 <w:rFonts w:eastAsia="Times New Roman" w:cs="Times New Roman"/>
@@ -8704,7 +8580,6 @@
               </w:rPr>
               <w:t>Alt+W</w:t>
             </w:r>
-            <w:proofErr w:type="spellEnd"/>
           </w:p>
         </w:tc>
         <w:tc>
@@ -8842,7 +8717,6 @@
                 <w14:ligatures w14:val="none"/>
               </w:rPr>
             </w:pPr>
-            <w:proofErr w:type="spellStart"/>
             <w:r>
               <w:rPr>
                 <w:rFonts w:eastAsia="Times New Roman" w:cs="Times New Roman"/>
@@ -8852,7 +8726,6 @@
               </w:rPr>
               <w:t>Alt+S</w:t>
             </w:r>
-            <w:proofErr w:type="spellEnd"/>
           </w:p>
         </w:tc>
         <w:tc>
@@ -9271,14 +9144,25 @@
                 <w14:ligatures w14:val="none"/>
               </w:rPr>
             </w:pPr>
-            <w:r>
-              <w:rPr>
-                <w:rFonts w:eastAsia="Times New Roman" w:cs="Times New Roman"/>
-                <w:color w:val="000000"/>
-                <w:kern w:val="0"/>
-                <w14:ligatures w14:val="none"/>
-              </w:rPr>
-              <w:t>Increase Descent Rate</w:t>
+            <w:proofErr w:type="gramStart"/>
+            <w:r>
+              <w:rPr>
+                <w:rFonts w:eastAsia="Times New Roman" w:cs="Times New Roman"/>
+                <w:color w:val="000000"/>
+                <w:kern w:val="0"/>
+                <w14:ligatures w14:val="none"/>
+              </w:rPr>
+              <w:t>Increase</w:t>
+            </w:r>
+            <w:proofErr w:type="gramEnd"/>
+            <w:r>
+              <w:rPr>
+                <w:rFonts w:eastAsia="Times New Roman" w:cs="Times New Roman"/>
+                <w:color w:val="000000"/>
+                <w:kern w:val="0"/>
+                <w14:ligatures w14:val="none"/>
+              </w:rPr>
+              <w:t xml:space="preserve"> Descent Rate</w:t>
             </w:r>
           </w:p>
         </w:tc>
@@ -9837,14 +9721,25 @@
                 <w14:ligatures w14:val="none"/>
               </w:rPr>
             </w:pPr>
-            <w:r>
-              <w:rPr>
-                <w:rFonts w:eastAsia="Times New Roman" w:cs="Times New Roman"/>
-                <w:color w:val="000000"/>
-                <w:kern w:val="0"/>
-                <w14:ligatures w14:val="none"/>
-              </w:rPr>
-              <w:t>Abort Stage PUSH</w:t>
+            <w:proofErr w:type="gramStart"/>
+            <w:r>
+              <w:rPr>
+                <w:rFonts w:eastAsia="Times New Roman" w:cs="Times New Roman"/>
+                <w:color w:val="000000"/>
+                <w:kern w:val="0"/>
+                <w14:ligatures w14:val="none"/>
+              </w:rPr>
+              <w:t>Abort</w:t>
+            </w:r>
+            <w:proofErr w:type="gramEnd"/>
+            <w:r>
+              <w:rPr>
+                <w:rFonts w:eastAsia="Times New Roman" w:cs="Times New Roman"/>
+                <w:color w:val="000000"/>
+                <w:kern w:val="0"/>
+                <w14:ligatures w14:val="none"/>
+              </w:rPr>
+              <w:t xml:space="preserve"> Stage PUSH</w:t>
             </w:r>
           </w:p>
         </w:tc>
@@ -10167,7 +10062,6 @@
                 <w14:ligatures w14:val="none"/>
               </w:rPr>
             </w:pPr>
-            <w:proofErr w:type="spellStart"/>
             <w:r>
               <w:rPr>
                 <w:rFonts w:eastAsia="Times New Roman" w:cs="Times New Roman"/>
@@ -10177,7 +10071,6 @@
               </w:rPr>
               <w:t>Alt+Numpad</w:t>
             </w:r>
-            <w:proofErr w:type="spellEnd"/>
           </w:p>
         </w:tc>
         <w:tc>
@@ -10209,19 +10102,8 @@
                 <w:kern w:val="0"/>
                 <w14:ligatures w14:val="none"/>
               </w:rPr>
-              <w:t xml:space="preserve">ACA </w:t>
-            </w:r>
-            <w:proofErr w:type="spellStart"/>
-            <w:r>
-              <w:rPr>
-                <w:rFonts w:eastAsia="Times New Roman" w:cs="Times New Roman"/>
-                <w:color w:val="000000"/>
-                <w:kern w:val="0"/>
-                <w14:ligatures w14:val="none"/>
-              </w:rPr>
-              <w:t>Hardover</w:t>
-            </w:r>
-            <w:proofErr w:type="spellEnd"/>
+              <w:t>ACA Hardover</w:t>
+            </w:r>
           </w:p>
         </w:tc>
       </w:tr>
@@ -10251,7 +10133,6 @@
                 <w14:ligatures w14:val="none"/>
               </w:rPr>
             </w:pPr>
-            <w:proofErr w:type="spellStart"/>
             <w:r>
               <w:rPr>
                 <w:rFonts w:eastAsia="Times New Roman" w:cs="Times New Roman"/>
@@ -10261,7 +10142,6 @@
               </w:rPr>
               <w:t>Ctrl+Alt+Numpad</w:t>
             </w:r>
-            <w:proofErr w:type="spellEnd"/>
           </w:p>
         </w:tc>
         <w:tc>
@@ -10293,7 +10173,27 @@
                 <w:kern w:val="0"/>
                 <w14:ligatures w14:val="none"/>
               </w:rPr>
-              <w:t>ACA Out Of Detent</w:t>
+              <w:t xml:space="preserve">ACA Out </w:t>
+            </w:r>
+            <w:proofErr w:type="gramStart"/>
+            <w:r>
+              <w:rPr>
+                <w:rFonts w:eastAsia="Times New Roman" w:cs="Times New Roman"/>
+                <w:color w:val="000000"/>
+                <w:kern w:val="0"/>
+                <w14:ligatures w14:val="none"/>
+              </w:rPr>
+              <w:t>Of</w:t>
+            </w:r>
+            <w:proofErr w:type="gramEnd"/>
+            <w:r>
+              <w:rPr>
+                <w:rFonts w:eastAsia="Times New Roman" w:cs="Times New Roman"/>
+                <w:color w:val="000000"/>
+                <w:kern w:val="0"/>
+                <w14:ligatures w14:val="none"/>
+              </w:rPr>
+              <w:t xml:space="preserve"> Detent</w:t>
             </w:r>
           </w:p>
         </w:tc>

</xml_diff>

<commit_message>
Add cue card info and keybinds
</commit_message>
<xml_diff>
--- a/Doc/Project Apollo - NASSP/Programmers Notes/NASSP Quick Start Guide.docx
+++ b/Doc/Project Apollo - NASSP/Programmers Notes/NASSP Quick Start Guide.docx
@@ -2635,26 +2635,43 @@
       <w:r>
         <w:t xml:space="preserve"> the habit of paying attention to this is highly recommended.</w:t>
       </w:r>
+      <w:r>
+        <w:br/>
+      </w:r>
     </w:p>
     <w:p>
       <w:pPr>
+        <w:spacing w:after="0"/>
         <w:ind w:left="360"/>
+        <w:rPr>
+          <w:b/>
+          <w:bCs/>
+        </w:rPr>
       </w:pPr>
+      <w:r>
+        <w:rPr>
+          <w:b/>
+          <w:bCs/>
+        </w:rPr>
+        <w:t>Cue cards and special click spots!</w:t>
+      </w:r>
     </w:p>
     <w:p>
       <w:pPr>
+        <w:spacing w:after="0"/>
         <w:ind w:left="360"/>
       </w:pPr>
-    </w:p>
-    <w:p>
-      <w:pPr>
-        <w:ind w:left="360"/>
-      </w:pPr>
-    </w:p>
-    <w:p>
-      <w:pPr>
-        <w:ind w:left="360"/>
-      </w:pPr>
+      <w:r>
+        <w:t xml:space="preserve">If you look carefully, you will notice there are Velcro patches around the CM and LM. Clicking these will allow you to utilize various mission cue cards, window shades, glareshields etc. that were used during flight. One caveat is they are mostly Apollo 15 cue cards currently, so keep that in mind when flying other flights. We are working to find/create more mission specific cue cards </w:t>
+      </w:r>
+      <w:proofErr w:type="gramStart"/>
+      <w:r>
+        <w:t>in the near future</w:t>
+      </w:r>
+      <w:proofErr w:type="gramEnd"/>
+      <w:r>
+        <w:t>.</w:t>
+      </w:r>
     </w:p>
     <w:p>
       <w:pPr>
@@ -2825,7 +2842,8 @@
         <w:tblLook w:val="04A0" w:firstRow="1" w:lastRow="0" w:firstColumn="1" w:lastColumn="0" w:noHBand="0" w:noVBand="1"/>
       </w:tblPr>
       <w:tblGrid>
-        <w:gridCol w:w="3143"/>
+        <w:gridCol w:w="2618"/>
+        <w:gridCol w:w="525"/>
         <w:gridCol w:w="6207"/>
       </w:tblGrid>
       <w:tr>
@@ -2835,7 +2853,7 @@
         <w:tc>
           <w:tcPr>
             <w:tcW w:w="5000" w:type="pct"/>
-            <w:gridSpan w:val="2"/>
+            <w:gridSpan w:val="3"/>
             <w:tcBorders>
               <w:top w:val="single" w:sz="4" w:space="0" w:color="auto"/>
               <w:left w:val="single" w:sz="4" w:space="0" w:color="auto"/>
@@ -2880,6 +2898,7 @@
         <w:tc>
           <w:tcPr>
             <w:tcW w:w="1681" w:type="pct"/>
+            <w:gridSpan w:val="2"/>
             <w:tcBorders>
               <w:top w:val="nil"/>
               <w:left w:val="single" w:sz="4" w:space="0" w:color="auto"/>
@@ -2953,6 +2972,7 @@
         <w:tc>
           <w:tcPr>
             <w:tcW w:w="1681" w:type="pct"/>
+            <w:gridSpan w:val="2"/>
             <w:tcBorders>
               <w:top w:val="nil"/>
               <w:left w:val="single" w:sz="4" w:space="0" w:color="auto"/>
@@ -3026,6 +3046,7 @@
         <w:tc>
           <w:tcPr>
             <w:tcW w:w="1681" w:type="pct"/>
+            <w:gridSpan w:val="2"/>
             <w:tcBorders>
               <w:top w:val="nil"/>
               <w:left w:val="single" w:sz="4" w:space="0" w:color="auto"/>
@@ -3110,6 +3131,7 @@
         <w:tc>
           <w:tcPr>
             <w:tcW w:w="1681" w:type="pct"/>
+            <w:gridSpan w:val="2"/>
             <w:tcBorders>
               <w:top w:val="nil"/>
               <w:left w:val="nil"/>
@@ -3166,7 +3188,7 @@
         <w:tc>
           <w:tcPr>
             <w:tcW w:w="5000" w:type="pct"/>
-            <w:gridSpan w:val="2"/>
+            <w:gridSpan w:val="3"/>
             <w:tcBorders>
               <w:top w:val="single" w:sz="4" w:space="0" w:color="auto"/>
               <w:left w:val="single" w:sz="4" w:space="0" w:color="auto"/>
@@ -3211,6 +3233,7 @@
         <w:tc>
           <w:tcPr>
             <w:tcW w:w="1681" w:type="pct"/>
+            <w:gridSpan w:val="2"/>
             <w:tcBorders>
               <w:top w:val="nil"/>
               <w:left w:val="single" w:sz="4" w:space="0" w:color="auto"/>
@@ -3293,6 +3316,7 @@
         <w:tc>
           <w:tcPr>
             <w:tcW w:w="1681" w:type="pct"/>
+            <w:gridSpan w:val="2"/>
             <w:tcBorders>
               <w:top w:val="nil"/>
               <w:left w:val="single" w:sz="4" w:space="0" w:color="auto"/>
@@ -3375,6 +3399,7 @@
         <w:tc>
           <w:tcPr>
             <w:tcW w:w="1681" w:type="pct"/>
+            <w:gridSpan w:val="2"/>
             <w:tcBorders>
               <w:top w:val="nil"/>
               <w:left w:val="single" w:sz="4" w:space="0" w:color="auto"/>
@@ -3457,6 +3482,7 @@
         <w:tc>
           <w:tcPr>
             <w:tcW w:w="1681" w:type="pct"/>
+            <w:gridSpan w:val="2"/>
             <w:tcBorders>
               <w:top w:val="nil"/>
               <w:left w:val="single" w:sz="4" w:space="0" w:color="auto"/>
@@ -3528,52 +3554,70 @@
         <w:tc>
           <w:tcPr>
             <w:tcW w:w="1681" w:type="pct"/>
+            <w:gridSpan w:val="2"/>
+            <w:tcBorders>
+              <w:top w:val="nil"/>
+              <w:left w:val="single" w:sz="4" w:space="0" w:color="auto"/>
+              <w:bottom w:val="single" w:sz="4" w:space="0" w:color="auto"/>
+              <w:right w:val="single" w:sz="4" w:space="0" w:color="auto"/>
+            </w:tcBorders>
+            <w:noWrap/>
+            <w:vAlign w:val="bottom"/>
+          </w:tcPr>
+          <w:p>
+            <w:pPr>
+              <w:spacing w:after="0" w:line="240" w:lineRule="auto"/>
+              <w:rPr>
+                <w:rFonts w:eastAsia="Times New Roman" w:cs="Times New Roman"/>
+                <w:color w:val="000000"/>
+                <w:kern w:val="0"/>
+                <w14:ligatures w14:val="none"/>
+              </w:rPr>
+            </w:pPr>
+            <w:proofErr w:type="spellStart"/>
+            <w:r>
+              <w:rPr>
+                <w:rFonts w:eastAsia="Times New Roman" w:cs="Times New Roman"/>
+                <w:color w:val="000000"/>
+                <w:kern w:val="0"/>
+                <w14:ligatures w14:val="none"/>
+              </w:rPr>
+              <w:t>Ctrl+H</w:t>
+            </w:r>
+            <w:proofErr w:type="spellEnd"/>
+          </w:p>
+        </w:tc>
+        <w:tc>
+          <w:tcPr>
+            <w:tcW w:w="3319" w:type="pct"/>
             <w:tcBorders>
               <w:top w:val="nil"/>
               <w:left w:val="nil"/>
-              <w:bottom w:val="nil"/>
-              <w:right w:val="nil"/>
-            </w:tcBorders>
-            <w:noWrap/>
-            <w:vAlign w:val="bottom"/>
-            <w:hideMark/>
-          </w:tcPr>
-          <w:p>
-            <w:pPr>
-              <w:spacing w:after="0" w:line="240" w:lineRule="auto"/>
-              <w:rPr>
-                <w:rFonts w:eastAsia="Times New Roman" w:cs="Times New Roman"/>
-                <w:color w:val="000000"/>
-                <w:kern w:val="0"/>
-                <w14:ligatures w14:val="none"/>
-              </w:rPr>
-            </w:pPr>
-          </w:p>
-        </w:tc>
-        <w:tc>
-          <w:tcPr>
-            <w:tcW w:w="3319" w:type="pct"/>
-            <w:tcBorders>
-              <w:top w:val="nil"/>
-              <w:left w:val="nil"/>
-              <w:bottom w:val="nil"/>
-              <w:right w:val="nil"/>
-            </w:tcBorders>
-            <w:noWrap/>
-            <w:vAlign w:val="bottom"/>
-            <w:hideMark/>
-          </w:tcPr>
-          <w:p>
-            <w:pPr>
-              <w:spacing w:after="0" w:line="240" w:lineRule="auto"/>
-              <w:rPr>
-                <w:rFonts w:eastAsia="Times New Roman" w:cs="Times New Roman"/>
-                <w:kern w:val="0"/>
-                <w:sz w:val="20"/>
-                <w:szCs w:val="20"/>
-                <w14:ligatures w14:val="none"/>
-              </w:rPr>
-            </w:pPr>
+              <w:bottom w:val="single" w:sz="4" w:space="0" w:color="auto"/>
+              <w:right w:val="single" w:sz="4" w:space="0" w:color="auto"/>
+            </w:tcBorders>
+            <w:noWrap/>
+            <w:vAlign w:val="bottom"/>
+          </w:tcPr>
+          <w:p>
+            <w:pPr>
+              <w:spacing w:after="0" w:line="240" w:lineRule="auto"/>
+              <w:rPr>
+                <w:rFonts w:eastAsia="Times New Roman" w:cs="Times New Roman"/>
+                <w:color w:val="000000"/>
+                <w:kern w:val="0"/>
+                <w14:ligatures w14:val="none"/>
+              </w:rPr>
+            </w:pPr>
+            <w:r>
+              <w:rPr>
+                <w:rFonts w:eastAsia="Times New Roman" w:cs="Times New Roman"/>
+                <w:color w:val="000000"/>
+                <w:kern w:val="0"/>
+                <w14:ligatures w14:val="none"/>
+              </w:rPr>
+              <w:t>Toggle Cue Card Arrows</w:t>
+            </w:r>
           </w:p>
         </w:tc>
       </w:tr>
@@ -3583,42 +3627,54 @@
         </w:trPr>
         <w:tc>
           <w:tcPr>
-            <w:tcW w:w="5000" w:type="pct"/>
+            <w:tcW w:w="1681" w:type="pct"/>
             <w:gridSpan w:val="2"/>
             <w:tcBorders>
-              <w:top w:val="single" w:sz="4" w:space="0" w:color="auto"/>
-              <w:left w:val="single" w:sz="4" w:space="0" w:color="auto"/>
-              <w:bottom w:val="single" w:sz="4" w:space="0" w:color="auto"/>
-              <w:right w:val="single" w:sz="4" w:space="0" w:color="auto"/>
-            </w:tcBorders>
-            <w:noWrap/>
-            <w:vAlign w:val="bottom"/>
-            <w:hideMark/>
-          </w:tcPr>
-          <w:p>
-            <w:pPr>
-              <w:spacing w:after="0" w:line="240" w:lineRule="auto"/>
-              <w:jc w:val="center"/>
-              <w:rPr>
-                <w:rFonts w:eastAsia="Times New Roman" w:cs="Times New Roman"/>
-                <w:b/>
-                <w:bCs/>
-                <w:color w:val="000000"/>
-                <w:kern w:val="0"/>
-                <w14:ligatures w14:val="none"/>
-              </w:rPr>
-            </w:pPr>
-            <w:r>
-              <w:rPr>
-                <w:rFonts w:eastAsia="Times New Roman" w:cs="Times New Roman"/>
-                <w:b/>
-                <w:bCs/>
-                <w:color w:val="000000"/>
-                <w:kern w:val="0"/>
-                <w14:ligatures w14:val="none"/>
-              </w:rPr>
-              <w:t>Spacecraft Rotation</w:t>
-            </w:r>
+              <w:top w:val="nil"/>
+              <w:left w:val="nil"/>
+              <w:bottom w:val="nil"/>
+              <w:right w:val="nil"/>
+            </w:tcBorders>
+            <w:noWrap/>
+            <w:vAlign w:val="bottom"/>
+            <w:hideMark/>
+          </w:tcPr>
+          <w:p>
+            <w:pPr>
+              <w:spacing w:after="0" w:line="240" w:lineRule="auto"/>
+              <w:rPr>
+                <w:rFonts w:eastAsia="Times New Roman" w:cs="Times New Roman"/>
+                <w:color w:val="000000"/>
+                <w:kern w:val="0"/>
+                <w14:ligatures w14:val="none"/>
+              </w:rPr>
+            </w:pPr>
+          </w:p>
+        </w:tc>
+        <w:tc>
+          <w:tcPr>
+            <w:tcW w:w="3319" w:type="pct"/>
+            <w:tcBorders>
+              <w:top w:val="nil"/>
+              <w:left w:val="nil"/>
+              <w:bottom w:val="nil"/>
+              <w:right w:val="nil"/>
+            </w:tcBorders>
+            <w:noWrap/>
+            <w:vAlign w:val="bottom"/>
+            <w:hideMark/>
+          </w:tcPr>
+          <w:p>
+            <w:pPr>
+              <w:spacing w:after="0" w:line="240" w:lineRule="auto"/>
+              <w:rPr>
+                <w:rFonts w:eastAsia="Times New Roman" w:cs="Times New Roman"/>
+                <w:kern w:val="0"/>
+                <w:sz w:val="20"/>
+                <w:szCs w:val="20"/>
+                <w14:ligatures w14:val="none"/>
+              </w:rPr>
+            </w:pPr>
           </w:p>
         </w:tc>
       </w:tr>
@@ -3628,9 +3684,10 @@
         </w:trPr>
         <w:tc>
           <w:tcPr>
-            <w:tcW w:w="1681" w:type="pct"/>
-            <w:tcBorders>
-              <w:top w:val="nil"/>
+            <w:tcW w:w="5000" w:type="pct"/>
+            <w:gridSpan w:val="3"/>
+            <w:tcBorders>
+              <w:top w:val="single" w:sz="4" w:space="0" w:color="auto"/>
               <w:left w:val="single" w:sz="4" w:space="0" w:color="auto"/>
               <w:bottom w:val="single" w:sz="4" w:space="0" w:color="auto"/>
               <w:right w:val="single" w:sz="4" w:space="0" w:color="auto"/>
@@ -3642,55 +3699,26 @@
           <w:p>
             <w:pPr>
               <w:spacing w:after="0" w:line="240" w:lineRule="auto"/>
-              <w:rPr>
-                <w:rFonts w:eastAsia="Times New Roman" w:cs="Times New Roman"/>
-                <w:color w:val="000000"/>
-                <w:kern w:val="0"/>
-                <w14:ligatures w14:val="none"/>
-              </w:rPr>
-            </w:pPr>
-            <w:r>
-              <w:rPr>
-                <w:rFonts w:eastAsia="Times New Roman" w:cs="Times New Roman"/>
-                <w:color w:val="000000"/>
-                <w:kern w:val="0"/>
-                <w14:ligatures w14:val="none"/>
-              </w:rPr>
-              <w:t>2 (Numpad)</w:t>
-            </w:r>
-          </w:p>
-        </w:tc>
-        <w:tc>
-          <w:tcPr>
-            <w:tcW w:w="3319" w:type="pct"/>
-            <w:tcBorders>
-              <w:top w:val="nil"/>
-              <w:left w:val="nil"/>
-              <w:bottom w:val="single" w:sz="4" w:space="0" w:color="auto"/>
-              <w:right w:val="single" w:sz="4" w:space="0" w:color="auto"/>
-            </w:tcBorders>
-            <w:noWrap/>
-            <w:vAlign w:val="bottom"/>
-            <w:hideMark/>
-          </w:tcPr>
-          <w:p>
-            <w:pPr>
-              <w:spacing w:after="0" w:line="240" w:lineRule="auto"/>
-              <w:rPr>
-                <w:rFonts w:eastAsia="Times New Roman" w:cs="Times New Roman"/>
-                <w:color w:val="000000"/>
-                <w:kern w:val="0"/>
-                <w14:ligatures w14:val="none"/>
-              </w:rPr>
-            </w:pPr>
-            <w:r>
-              <w:rPr>
-                <w:rFonts w:eastAsia="Times New Roman" w:cs="Times New Roman"/>
-                <w:color w:val="000000"/>
-                <w:kern w:val="0"/>
-                <w14:ligatures w14:val="none"/>
-              </w:rPr>
-              <w:t>Pitch Up</w:t>
+              <w:jc w:val="center"/>
+              <w:rPr>
+                <w:rFonts w:eastAsia="Times New Roman" w:cs="Times New Roman"/>
+                <w:b/>
+                <w:bCs/>
+                <w:color w:val="000000"/>
+                <w:kern w:val="0"/>
+                <w14:ligatures w14:val="none"/>
+              </w:rPr>
+            </w:pPr>
+            <w:r>
+              <w:rPr>
+                <w:rFonts w:eastAsia="Times New Roman" w:cs="Times New Roman"/>
+                <w:b/>
+                <w:bCs/>
+                <w:color w:val="000000"/>
+                <w:kern w:val="0"/>
+                <w14:ligatures w14:val="none"/>
+              </w:rPr>
+              <w:t>Spacecraft Rotation</w:t>
             </w:r>
           </w:p>
         </w:tc>
@@ -3702,6 +3730,7 @@
         <w:tc>
           <w:tcPr>
             <w:tcW w:w="1681" w:type="pct"/>
+            <w:gridSpan w:val="2"/>
             <w:tcBorders>
               <w:top w:val="nil"/>
               <w:left w:val="single" w:sz="4" w:space="0" w:color="auto"/>
@@ -3729,7 +3758,7 @@
                 <w:kern w:val="0"/>
                 <w14:ligatures w14:val="none"/>
               </w:rPr>
-              <w:t>8 (Numpad)</w:t>
+              <w:t>2 (Numpad)</w:t>
             </w:r>
           </w:p>
         </w:tc>
@@ -3763,7 +3792,7 @@
                 <w:kern w:val="0"/>
                 <w14:ligatures w14:val="none"/>
               </w:rPr>
-              <w:t>Pitch Down</w:t>
+              <w:t>Pitch Up</w:t>
             </w:r>
           </w:p>
         </w:tc>
@@ -3775,6 +3804,7 @@
         <w:tc>
           <w:tcPr>
             <w:tcW w:w="1681" w:type="pct"/>
+            <w:gridSpan w:val="2"/>
             <w:tcBorders>
               <w:top w:val="nil"/>
               <w:left w:val="single" w:sz="4" w:space="0" w:color="auto"/>
@@ -3802,7 +3832,7 @@
                 <w:kern w:val="0"/>
                 <w14:ligatures w14:val="none"/>
               </w:rPr>
-              <w:t>1 (Numpad)</w:t>
+              <w:t>8 (Numpad)</w:t>
             </w:r>
           </w:p>
         </w:tc>
@@ -3836,7 +3866,7 @@
                 <w:kern w:val="0"/>
                 <w14:ligatures w14:val="none"/>
               </w:rPr>
-              <w:t>Yaw Left</w:t>
+              <w:t>Pitch Down</w:t>
             </w:r>
           </w:p>
         </w:tc>
@@ -3848,6 +3878,7 @@
         <w:tc>
           <w:tcPr>
             <w:tcW w:w="1681" w:type="pct"/>
+            <w:gridSpan w:val="2"/>
             <w:tcBorders>
               <w:top w:val="nil"/>
               <w:left w:val="single" w:sz="4" w:space="0" w:color="auto"/>
@@ -3875,7 +3906,7 @@
                 <w:kern w:val="0"/>
                 <w14:ligatures w14:val="none"/>
               </w:rPr>
-              <w:t>3 (Numpad)</w:t>
+              <w:t>1 (Numpad)</w:t>
             </w:r>
           </w:p>
         </w:tc>
@@ -3909,7 +3940,7 @@
                 <w:kern w:val="0"/>
                 <w14:ligatures w14:val="none"/>
               </w:rPr>
-              <w:t>Yaw Right</w:t>
+              <w:t>Yaw Left</w:t>
             </w:r>
           </w:p>
         </w:tc>
@@ -3921,6 +3952,7 @@
         <w:tc>
           <w:tcPr>
             <w:tcW w:w="1681" w:type="pct"/>
+            <w:gridSpan w:val="2"/>
             <w:tcBorders>
               <w:top w:val="nil"/>
               <w:left w:val="single" w:sz="4" w:space="0" w:color="auto"/>
@@ -3948,7 +3980,7 @@
                 <w:kern w:val="0"/>
                 <w14:ligatures w14:val="none"/>
               </w:rPr>
-              <w:t>4 (Numpad)</w:t>
+              <w:t>3 (Numpad)</w:t>
             </w:r>
           </w:p>
         </w:tc>
@@ -3982,7 +4014,7 @@
                 <w:kern w:val="0"/>
                 <w14:ligatures w14:val="none"/>
               </w:rPr>
-              <w:t>Roll Left</w:t>
+              <w:t>Yaw Right</w:t>
             </w:r>
           </w:p>
         </w:tc>
@@ -3994,6 +4026,7 @@
         <w:tc>
           <w:tcPr>
             <w:tcW w:w="1681" w:type="pct"/>
+            <w:gridSpan w:val="2"/>
             <w:tcBorders>
               <w:top w:val="nil"/>
               <w:left w:val="single" w:sz="4" w:space="0" w:color="auto"/>
@@ -4021,7 +4054,7 @@
                 <w:kern w:val="0"/>
                 <w14:ligatures w14:val="none"/>
               </w:rPr>
-              <w:t>6 (Numpad)</w:t>
+              <w:t>4 (Numpad)</w:t>
             </w:r>
           </w:p>
         </w:tc>
@@ -4055,7 +4088,7 @@
                 <w:kern w:val="0"/>
                 <w14:ligatures w14:val="none"/>
               </w:rPr>
-              <w:t>Roll Right</w:t>
+              <w:t>Roll Left</w:t>
             </w:r>
           </w:p>
         </w:tc>
@@ -4067,6 +4100,7 @@
         <w:tc>
           <w:tcPr>
             <w:tcW w:w="1681" w:type="pct"/>
+            <w:gridSpan w:val="2"/>
             <w:tcBorders>
               <w:top w:val="nil"/>
               <w:left w:val="single" w:sz="4" w:space="0" w:color="auto"/>
@@ -4075,28 +4109,27 @@
             </w:tcBorders>
             <w:noWrap/>
             <w:vAlign w:val="bottom"/>
-          </w:tcPr>
-          <w:p>
-            <w:pPr>
-              <w:spacing w:after="0" w:line="240" w:lineRule="auto"/>
-              <w:rPr>
-                <w:rFonts w:eastAsia="Times New Roman" w:cs="Times New Roman"/>
-                <w:color w:val="000000"/>
-                <w:kern w:val="0"/>
-                <w14:ligatures w14:val="none"/>
-              </w:rPr>
-            </w:pPr>
-            <w:proofErr w:type="spellStart"/>
-            <w:r>
-              <w:rPr>
-                <w:rFonts w:eastAsia="Times New Roman" w:cs="Times New Roman"/>
-                <w:color w:val="000000"/>
-                <w:kern w:val="0"/>
-                <w14:ligatures w14:val="none"/>
-              </w:rPr>
-              <w:t>Alt+Numpad</w:t>
-            </w:r>
-            <w:proofErr w:type="spellEnd"/>
+            <w:hideMark/>
+          </w:tcPr>
+          <w:p>
+            <w:pPr>
+              <w:spacing w:after="0" w:line="240" w:lineRule="auto"/>
+              <w:rPr>
+                <w:rFonts w:eastAsia="Times New Roman" w:cs="Times New Roman"/>
+                <w:color w:val="000000"/>
+                <w:kern w:val="0"/>
+                <w14:ligatures w14:val="none"/>
+              </w:rPr>
+            </w:pPr>
+            <w:r>
+              <w:rPr>
+                <w:rFonts w:eastAsia="Times New Roman" w:cs="Times New Roman"/>
+                <w:color w:val="000000"/>
+                <w:kern w:val="0"/>
+                <w14:ligatures w14:val="none"/>
+              </w:rPr>
+              <w:t>6 (Numpad)</w:t>
+            </w:r>
           </w:p>
         </w:tc>
         <w:tc>
@@ -4110,28 +4143,27 @@
             </w:tcBorders>
             <w:noWrap/>
             <w:vAlign w:val="bottom"/>
-          </w:tcPr>
-          <w:p>
-            <w:pPr>
-              <w:spacing w:after="0" w:line="240" w:lineRule="auto"/>
-              <w:rPr>
-                <w:rFonts w:eastAsia="Times New Roman" w:cs="Times New Roman"/>
-                <w:color w:val="000000"/>
-                <w:kern w:val="0"/>
-                <w14:ligatures w14:val="none"/>
-              </w:rPr>
-            </w:pPr>
-            <w:proofErr w:type="spellStart"/>
-            <w:r>
-              <w:rPr>
-                <w:rFonts w:eastAsia="Times New Roman" w:cs="Times New Roman"/>
-                <w:color w:val="000000"/>
-                <w:kern w:val="0"/>
-                <w14:ligatures w14:val="none"/>
-              </w:rPr>
-              <w:t>Hardover</w:t>
-            </w:r>
-            <w:proofErr w:type="spellEnd"/>
+            <w:hideMark/>
+          </w:tcPr>
+          <w:p>
+            <w:pPr>
+              <w:spacing w:after="0" w:line="240" w:lineRule="auto"/>
+              <w:rPr>
+                <w:rFonts w:eastAsia="Times New Roman" w:cs="Times New Roman"/>
+                <w:color w:val="000000"/>
+                <w:kern w:val="0"/>
+                <w14:ligatures w14:val="none"/>
+              </w:rPr>
+            </w:pPr>
+            <w:r>
+              <w:rPr>
+                <w:rFonts w:eastAsia="Times New Roman" w:cs="Times New Roman"/>
+                <w:color w:val="000000"/>
+                <w:kern w:val="0"/>
+                <w14:ligatures w14:val="none"/>
+              </w:rPr>
+              <w:t>Roll Right</w:t>
+            </w:r>
           </w:p>
         </w:tc>
       </w:tr>
@@ -4142,52 +4174,72 @@
         <w:tc>
           <w:tcPr>
             <w:tcW w:w="1681" w:type="pct"/>
+            <w:gridSpan w:val="2"/>
+            <w:tcBorders>
+              <w:top w:val="nil"/>
+              <w:left w:val="single" w:sz="4" w:space="0" w:color="auto"/>
+              <w:bottom w:val="single" w:sz="4" w:space="0" w:color="auto"/>
+              <w:right w:val="single" w:sz="4" w:space="0" w:color="auto"/>
+            </w:tcBorders>
+            <w:noWrap/>
+            <w:vAlign w:val="bottom"/>
+          </w:tcPr>
+          <w:p>
+            <w:pPr>
+              <w:spacing w:after="0" w:line="240" w:lineRule="auto"/>
+              <w:rPr>
+                <w:rFonts w:eastAsia="Times New Roman" w:cs="Times New Roman"/>
+                <w:color w:val="000000"/>
+                <w:kern w:val="0"/>
+                <w14:ligatures w14:val="none"/>
+              </w:rPr>
+            </w:pPr>
+            <w:proofErr w:type="spellStart"/>
+            <w:r>
+              <w:rPr>
+                <w:rFonts w:eastAsia="Times New Roman" w:cs="Times New Roman"/>
+                <w:color w:val="000000"/>
+                <w:kern w:val="0"/>
+                <w14:ligatures w14:val="none"/>
+              </w:rPr>
+              <w:t>Alt+Numpad</w:t>
+            </w:r>
+            <w:proofErr w:type="spellEnd"/>
+          </w:p>
+        </w:tc>
+        <w:tc>
+          <w:tcPr>
+            <w:tcW w:w="3319" w:type="pct"/>
             <w:tcBorders>
               <w:top w:val="nil"/>
               <w:left w:val="nil"/>
-              <w:bottom w:val="nil"/>
-              <w:right w:val="nil"/>
-            </w:tcBorders>
-            <w:noWrap/>
-            <w:vAlign w:val="bottom"/>
-            <w:hideMark/>
-          </w:tcPr>
-          <w:p>
-            <w:pPr>
-              <w:spacing w:after="0" w:line="240" w:lineRule="auto"/>
-              <w:rPr>
-                <w:rFonts w:eastAsia="Times New Roman" w:cs="Times New Roman"/>
-                <w:color w:val="000000"/>
-                <w:kern w:val="0"/>
-                <w14:ligatures w14:val="none"/>
-              </w:rPr>
-            </w:pPr>
-          </w:p>
-        </w:tc>
-        <w:tc>
-          <w:tcPr>
-            <w:tcW w:w="3319" w:type="pct"/>
-            <w:tcBorders>
-              <w:top w:val="nil"/>
-              <w:left w:val="nil"/>
-              <w:bottom w:val="nil"/>
-              <w:right w:val="nil"/>
-            </w:tcBorders>
-            <w:noWrap/>
-            <w:vAlign w:val="bottom"/>
-            <w:hideMark/>
-          </w:tcPr>
-          <w:p>
-            <w:pPr>
-              <w:spacing w:after="0" w:line="240" w:lineRule="auto"/>
-              <w:rPr>
-                <w:rFonts w:eastAsia="Times New Roman" w:cs="Times New Roman"/>
-                <w:kern w:val="0"/>
-                <w:sz w:val="20"/>
-                <w:szCs w:val="20"/>
-                <w14:ligatures w14:val="none"/>
-              </w:rPr>
-            </w:pPr>
+              <w:bottom w:val="single" w:sz="4" w:space="0" w:color="auto"/>
+              <w:right w:val="single" w:sz="4" w:space="0" w:color="auto"/>
+            </w:tcBorders>
+            <w:noWrap/>
+            <w:vAlign w:val="bottom"/>
+          </w:tcPr>
+          <w:p>
+            <w:pPr>
+              <w:spacing w:after="0" w:line="240" w:lineRule="auto"/>
+              <w:rPr>
+                <w:rFonts w:eastAsia="Times New Roman" w:cs="Times New Roman"/>
+                <w:color w:val="000000"/>
+                <w:kern w:val="0"/>
+                <w14:ligatures w14:val="none"/>
+              </w:rPr>
+            </w:pPr>
+            <w:proofErr w:type="spellStart"/>
+            <w:r>
+              <w:rPr>
+                <w:rFonts w:eastAsia="Times New Roman" w:cs="Times New Roman"/>
+                <w:color w:val="000000"/>
+                <w:kern w:val="0"/>
+                <w14:ligatures w14:val="none"/>
+              </w:rPr>
+              <w:t>Hardover</w:t>
+            </w:r>
+            <w:proofErr w:type="spellEnd"/>
           </w:p>
         </w:tc>
       </w:tr>
@@ -4197,42 +4249,54 @@
         </w:trPr>
         <w:tc>
           <w:tcPr>
-            <w:tcW w:w="5000" w:type="pct"/>
+            <w:tcW w:w="1681" w:type="pct"/>
             <w:gridSpan w:val="2"/>
             <w:tcBorders>
-              <w:top w:val="single" w:sz="4" w:space="0" w:color="auto"/>
-              <w:left w:val="single" w:sz="4" w:space="0" w:color="auto"/>
-              <w:bottom w:val="single" w:sz="4" w:space="0" w:color="auto"/>
-              <w:right w:val="single" w:sz="4" w:space="0" w:color="auto"/>
-            </w:tcBorders>
-            <w:noWrap/>
-            <w:vAlign w:val="bottom"/>
-            <w:hideMark/>
-          </w:tcPr>
-          <w:p>
-            <w:pPr>
-              <w:spacing w:after="0" w:line="240" w:lineRule="auto"/>
-              <w:jc w:val="center"/>
-              <w:rPr>
-                <w:rFonts w:eastAsia="Times New Roman" w:cs="Times New Roman"/>
-                <w:b/>
-                <w:bCs/>
-                <w:color w:val="000000"/>
-                <w:kern w:val="0"/>
-                <w14:ligatures w14:val="none"/>
-              </w:rPr>
-            </w:pPr>
-            <w:r>
-              <w:rPr>
-                <w:rFonts w:eastAsia="Times New Roman" w:cs="Times New Roman"/>
-                <w:b/>
-                <w:bCs/>
-                <w:color w:val="000000"/>
-                <w:kern w:val="0"/>
-                <w14:ligatures w14:val="none"/>
-              </w:rPr>
-              <w:t>DSKY</w:t>
-            </w:r>
+              <w:top w:val="nil"/>
+              <w:left w:val="nil"/>
+              <w:bottom w:val="nil"/>
+              <w:right w:val="nil"/>
+            </w:tcBorders>
+            <w:noWrap/>
+            <w:vAlign w:val="bottom"/>
+            <w:hideMark/>
+          </w:tcPr>
+          <w:p>
+            <w:pPr>
+              <w:spacing w:after="0" w:line="240" w:lineRule="auto"/>
+              <w:rPr>
+                <w:rFonts w:eastAsia="Times New Roman" w:cs="Times New Roman"/>
+                <w:color w:val="000000"/>
+                <w:kern w:val="0"/>
+                <w14:ligatures w14:val="none"/>
+              </w:rPr>
+            </w:pPr>
+          </w:p>
+        </w:tc>
+        <w:tc>
+          <w:tcPr>
+            <w:tcW w:w="3319" w:type="pct"/>
+            <w:tcBorders>
+              <w:top w:val="nil"/>
+              <w:left w:val="nil"/>
+              <w:bottom w:val="nil"/>
+              <w:right w:val="nil"/>
+            </w:tcBorders>
+            <w:noWrap/>
+            <w:vAlign w:val="bottom"/>
+            <w:hideMark/>
+          </w:tcPr>
+          <w:p>
+            <w:pPr>
+              <w:spacing w:after="0" w:line="240" w:lineRule="auto"/>
+              <w:rPr>
+                <w:rFonts w:eastAsia="Times New Roman" w:cs="Times New Roman"/>
+                <w:kern w:val="0"/>
+                <w:sz w:val="20"/>
+                <w:szCs w:val="20"/>
+                <w14:ligatures w14:val="none"/>
+              </w:rPr>
+            </w:pPr>
           </w:p>
         </w:tc>
       </w:tr>
@@ -4242,9 +4306,10 @@
         </w:trPr>
         <w:tc>
           <w:tcPr>
-            <w:tcW w:w="1681" w:type="pct"/>
-            <w:tcBorders>
-              <w:top w:val="nil"/>
+            <w:tcW w:w="5000" w:type="pct"/>
+            <w:gridSpan w:val="3"/>
+            <w:tcBorders>
+              <w:top w:val="single" w:sz="4" w:space="0" w:color="auto"/>
               <w:left w:val="single" w:sz="4" w:space="0" w:color="auto"/>
               <w:bottom w:val="single" w:sz="4" w:space="0" w:color="auto"/>
               <w:right w:val="single" w:sz="4" w:space="0" w:color="auto"/>
@@ -4256,66 +4321,26 @@
           <w:p>
             <w:pPr>
               <w:spacing w:after="0" w:line="240" w:lineRule="auto"/>
-              <w:rPr>
-                <w:rFonts w:eastAsia="Times New Roman" w:cs="Times New Roman"/>
-                <w:color w:val="000000"/>
-                <w:kern w:val="0"/>
-                <w14:ligatures w14:val="none"/>
-              </w:rPr>
-            </w:pPr>
-            <w:proofErr w:type="spellStart"/>
-            <w:r>
-              <w:rPr>
-                <w:rFonts w:eastAsia="Times New Roman" w:cs="Times New Roman"/>
-                <w:color w:val="000000"/>
-                <w:kern w:val="0"/>
-                <w14:ligatures w14:val="none"/>
-              </w:rPr>
-              <w:t>Shift+Decimal</w:t>
-            </w:r>
-            <w:proofErr w:type="spellEnd"/>
-            <w:r>
-              <w:rPr>
-                <w:rFonts w:eastAsia="Times New Roman" w:cs="Times New Roman"/>
-                <w:color w:val="000000"/>
-                <w:kern w:val="0"/>
-                <w14:ligatures w14:val="none"/>
-              </w:rPr>
-              <w:t xml:space="preserve"> (Numpad)</w:t>
-            </w:r>
-          </w:p>
-        </w:tc>
-        <w:tc>
-          <w:tcPr>
-            <w:tcW w:w="3319" w:type="pct"/>
-            <w:tcBorders>
-              <w:top w:val="nil"/>
-              <w:left w:val="nil"/>
-              <w:bottom w:val="single" w:sz="4" w:space="0" w:color="auto"/>
-              <w:right w:val="single" w:sz="4" w:space="0" w:color="auto"/>
-            </w:tcBorders>
-            <w:noWrap/>
-            <w:vAlign w:val="bottom"/>
-            <w:hideMark/>
-          </w:tcPr>
-          <w:p>
-            <w:pPr>
-              <w:spacing w:after="0" w:line="240" w:lineRule="auto"/>
-              <w:rPr>
-                <w:rFonts w:eastAsia="Times New Roman" w:cs="Times New Roman"/>
-                <w:color w:val="000000"/>
-                <w:kern w:val="0"/>
-                <w14:ligatures w14:val="none"/>
-              </w:rPr>
-            </w:pPr>
-            <w:r>
-              <w:rPr>
-                <w:rFonts w:eastAsia="Times New Roman" w:cs="Times New Roman"/>
-                <w:color w:val="000000"/>
-                <w:kern w:val="0"/>
-                <w14:ligatures w14:val="none"/>
-              </w:rPr>
-              <w:t>DSKY Clear</w:t>
+              <w:jc w:val="center"/>
+              <w:rPr>
+                <w:rFonts w:eastAsia="Times New Roman" w:cs="Times New Roman"/>
+                <w:b/>
+                <w:bCs/>
+                <w:color w:val="000000"/>
+                <w:kern w:val="0"/>
+                <w14:ligatures w14:val="none"/>
+              </w:rPr>
+            </w:pPr>
+            <w:r>
+              <w:rPr>
+                <w:rFonts w:eastAsia="Times New Roman" w:cs="Times New Roman"/>
+                <w:b/>
+                <w:bCs/>
+                <w:color w:val="000000"/>
+                <w:kern w:val="0"/>
+                <w14:ligatures w14:val="none"/>
+              </w:rPr>
+              <w:t>DSKY</w:t>
             </w:r>
           </w:p>
         </w:tc>
@@ -4327,6 +4352,7 @@
         <w:tc>
           <w:tcPr>
             <w:tcW w:w="1681" w:type="pct"/>
+            <w:gridSpan w:val="2"/>
             <w:tcBorders>
               <w:top w:val="nil"/>
               <w:left w:val="single" w:sz="4" w:space="0" w:color="auto"/>
@@ -4355,7 +4381,7 @@
                 <w:kern w:val="0"/>
                 <w14:ligatures w14:val="none"/>
               </w:rPr>
-              <w:t>Shift+Page</w:t>
+              <w:t>Shift+Decimal</w:t>
             </w:r>
             <w:proofErr w:type="spellEnd"/>
             <w:r>
@@ -4365,7 +4391,7 @@
                 <w:kern w:val="0"/>
                 <w14:ligatures w14:val="none"/>
               </w:rPr>
-              <w:t xml:space="preserve"> Up</w:t>
+              <w:t xml:space="preserve"> (Numpad)</w:t>
             </w:r>
           </w:p>
         </w:tc>
@@ -4399,7 +4425,7 @@
                 <w:kern w:val="0"/>
                 <w14:ligatures w14:val="none"/>
               </w:rPr>
-              <w:t>DSKY Reset</w:t>
+              <w:t>DSKY Clear</w:t>
             </w:r>
           </w:p>
         </w:tc>
@@ -4411,6 +4437,7 @@
         <w:tc>
           <w:tcPr>
             <w:tcW w:w="1681" w:type="pct"/>
+            <w:gridSpan w:val="2"/>
             <w:tcBorders>
               <w:top w:val="nil"/>
               <w:left w:val="single" w:sz="4" w:space="0" w:color="auto"/>
@@ -4439,9 +4466,18 @@
                 <w:kern w:val="0"/>
                 <w14:ligatures w14:val="none"/>
               </w:rPr>
-              <w:t>Shift+Home</w:t>
+              <w:t>Shift+Page</w:t>
             </w:r>
             <w:proofErr w:type="spellEnd"/>
+            <w:r>
+              <w:rPr>
+                <w:rFonts w:eastAsia="Times New Roman" w:cs="Times New Roman"/>
+                <w:color w:val="000000"/>
+                <w:kern w:val="0"/>
+                <w14:ligatures w14:val="none"/>
+              </w:rPr>
+              <w:t xml:space="preserve"> Up</w:t>
+            </w:r>
           </w:p>
         </w:tc>
         <w:tc>
@@ -4474,7 +4510,7 @@
                 <w:kern w:val="0"/>
                 <w14:ligatures w14:val="none"/>
               </w:rPr>
-              <w:t>DSKY Key Release</w:t>
+              <w:t>DSKY Reset</w:t>
             </w:r>
           </w:p>
         </w:tc>
@@ -4486,6 +4522,7 @@
         <w:tc>
           <w:tcPr>
             <w:tcW w:w="1681" w:type="pct"/>
+            <w:gridSpan w:val="2"/>
             <w:tcBorders>
               <w:top w:val="nil"/>
               <w:left w:val="single" w:sz="4" w:space="0" w:color="auto"/>
@@ -4514,18 +4551,9 @@
                 <w:kern w:val="0"/>
                 <w14:ligatures w14:val="none"/>
               </w:rPr>
-              <w:t>Shift+Enter</w:t>
+              <w:t>Shift+Home</w:t>
             </w:r>
             <w:proofErr w:type="spellEnd"/>
-            <w:r>
-              <w:rPr>
-                <w:rFonts w:eastAsia="Times New Roman" w:cs="Times New Roman"/>
-                <w:color w:val="000000"/>
-                <w:kern w:val="0"/>
-                <w14:ligatures w14:val="none"/>
-              </w:rPr>
-              <w:t xml:space="preserve"> (Numpad)</w:t>
-            </w:r>
           </w:p>
         </w:tc>
         <w:tc>
@@ -4558,7 +4586,7 @@
                 <w:kern w:val="0"/>
                 <w14:ligatures w14:val="none"/>
               </w:rPr>
-              <w:t>DSKY Enter</w:t>
+              <w:t>DSKY Key Release</w:t>
             </w:r>
           </w:p>
         </w:tc>
@@ -4570,6 +4598,7 @@
         <w:tc>
           <w:tcPr>
             <w:tcW w:w="1681" w:type="pct"/>
+            <w:gridSpan w:val="2"/>
             <w:tcBorders>
               <w:top w:val="nil"/>
               <w:left w:val="single" w:sz="4" w:space="0" w:color="auto"/>
@@ -4598,7 +4627,7 @@
                 <w:kern w:val="0"/>
                 <w14:ligatures w14:val="none"/>
               </w:rPr>
-              <w:t>Shift+Divide</w:t>
+              <w:t>Shift+Enter</w:t>
             </w:r>
             <w:proofErr w:type="spellEnd"/>
             <w:r>
@@ -4608,7 +4637,7 @@
                 <w:kern w:val="0"/>
                 <w14:ligatures w14:val="none"/>
               </w:rPr>
-              <w:t xml:space="preserve"> (Numpad /)</w:t>
+              <w:t xml:space="preserve"> (Numpad)</w:t>
             </w:r>
           </w:p>
         </w:tc>
@@ -4642,7 +4671,7 @@
                 <w:kern w:val="0"/>
                 <w14:ligatures w14:val="none"/>
               </w:rPr>
-              <w:t>DSKY Verb</w:t>
+              <w:t>DSKY Enter</w:t>
             </w:r>
           </w:p>
         </w:tc>
@@ -4654,6 +4683,7 @@
         <w:tc>
           <w:tcPr>
             <w:tcW w:w="1681" w:type="pct"/>
+            <w:gridSpan w:val="2"/>
             <w:tcBorders>
               <w:top w:val="nil"/>
               <w:left w:val="single" w:sz="4" w:space="0" w:color="auto"/>
@@ -4682,7 +4712,7 @@
                 <w:kern w:val="0"/>
                 <w14:ligatures w14:val="none"/>
               </w:rPr>
-              <w:t>Shift+Multiply</w:t>
+              <w:t>Shift+Divide</w:t>
             </w:r>
             <w:proofErr w:type="spellEnd"/>
             <w:r>
@@ -4692,7 +4722,7 @@
                 <w:kern w:val="0"/>
                 <w14:ligatures w14:val="none"/>
               </w:rPr>
-              <w:t xml:space="preserve"> (Numpad *)</w:t>
+              <w:t xml:space="preserve"> (Numpad /)</w:t>
             </w:r>
           </w:p>
         </w:tc>
@@ -4726,7 +4756,7 @@
                 <w:kern w:val="0"/>
                 <w14:ligatures w14:val="none"/>
               </w:rPr>
-              <w:t>DSKY Noun</w:t>
+              <w:t>DSKY Verb</w:t>
             </w:r>
           </w:p>
         </w:tc>
@@ -4738,6 +4768,7 @@
         <w:tc>
           <w:tcPr>
             <w:tcW w:w="1681" w:type="pct"/>
+            <w:gridSpan w:val="2"/>
             <w:tcBorders>
               <w:top w:val="nil"/>
               <w:left w:val="single" w:sz="4" w:space="0" w:color="auto"/>
@@ -4766,7 +4797,7 @@
                 <w:kern w:val="0"/>
                 <w14:ligatures w14:val="none"/>
               </w:rPr>
-              <w:t>Shift+Plus</w:t>
+              <w:t>Shift+Multiply</w:t>
             </w:r>
             <w:proofErr w:type="spellEnd"/>
             <w:r>
@@ -4776,7 +4807,7 @@
                 <w:kern w:val="0"/>
                 <w14:ligatures w14:val="none"/>
               </w:rPr>
-              <w:t xml:space="preserve"> (Numpad +)</w:t>
+              <w:t xml:space="preserve"> (Numpad *)</w:t>
             </w:r>
           </w:p>
         </w:tc>
@@ -4810,7 +4841,7 @@
                 <w:kern w:val="0"/>
                 <w14:ligatures w14:val="none"/>
               </w:rPr>
-              <w:t>DSKY Plus</w:t>
+              <w:t>DSKY Noun</w:t>
             </w:r>
           </w:p>
         </w:tc>
@@ -4822,6 +4853,7 @@
         <w:tc>
           <w:tcPr>
             <w:tcW w:w="1681" w:type="pct"/>
+            <w:gridSpan w:val="2"/>
             <w:tcBorders>
               <w:top w:val="nil"/>
               <w:left w:val="single" w:sz="4" w:space="0" w:color="auto"/>
@@ -4850,7 +4882,7 @@
                 <w:kern w:val="0"/>
                 <w14:ligatures w14:val="none"/>
               </w:rPr>
-              <w:t>Shift+Minus</w:t>
+              <w:t>Shift+Plus</w:t>
             </w:r>
             <w:proofErr w:type="spellEnd"/>
             <w:r>
@@ -4860,7 +4892,7 @@
                 <w:kern w:val="0"/>
                 <w14:ligatures w14:val="none"/>
               </w:rPr>
-              <w:t xml:space="preserve"> (Numpad -)</w:t>
+              <w:t xml:space="preserve"> (Numpad +)</w:t>
             </w:r>
           </w:p>
         </w:tc>
@@ -4894,7 +4926,7 @@
                 <w:kern w:val="0"/>
                 <w14:ligatures w14:val="none"/>
               </w:rPr>
-              <w:t>DSKY Minus</w:t>
+              <w:t>DSKY Plus</w:t>
             </w:r>
           </w:p>
         </w:tc>
@@ -4906,6 +4938,7 @@
         <w:tc>
           <w:tcPr>
             <w:tcW w:w="1681" w:type="pct"/>
+            <w:gridSpan w:val="2"/>
             <w:tcBorders>
               <w:top w:val="nil"/>
               <w:left w:val="single" w:sz="4" w:space="0" w:color="auto"/>
@@ -4934,9 +4967,18 @@
                 <w:kern w:val="0"/>
                 <w14:ligatures w14:val="none"/>
               </w:rPr>
-              <w:t>Shift+End</w:t>
+              <w:t>Shift+Minus</w:t>
             </w:r>
             <w:proofErr w:type="spellEnd"/>
+            <w:r>
+              <w:rPr>
+                <w:rFonts w:eastAsia="Times New Roman" w:cs="Times New Roman"/>
+                <w:color w:val="000000"/>
+                <w:kern w:val="0"/>
+                <w14:ligatures w14:val="none"/>
+              </w:rPr>
+              <w:t xml:space="preserve"> (Numpad -)</w:t>
+            </w:r>
           </w:p>
         </w:tc>
         <w:tc>
@@ -4969,7 +5011,7 @@
                 <w:kern w:val="0"/>
                 <w14:ligatures w14:val="none"/>
               </w:rPr>
-              <w:t>DSKY Proceed</w:t>
+              <w:t>DSKY Minus</w:t>
             </w:r>
           </w:p>
         </w:tc>
@@ -4981,6 +5023,7 @@
         <w:tc>
           <w:tcPr>
             <w:tcW w:w="1681" w:type="pct"/>
+            <w:gridSpan w:val="2"/>
             <w:tcBorders>
               <w:top w:val="nil"/>
               <w:left w:val="single" w:sz="4" w:space="0" w:color="auto"/>
@@ -5001,15 +5044,17 @@
                 <w14:ligatures w14:val="none"/>
               </w:rPr>
             </w:pPr>
-            <w:r>
-              <w:rPr>
-                <w:rFonts w:eastAsia="Times New Roman" w:cs="Times New Roman"/>
-                <w:color w:val="000000"/>
-                <w:kern w:val="0"/>
-                <w14:ligatures w14:val="none"/>
-              </w:rPr>
-              <w:t>Shift+ 0-9 (Numpad)</w:t>
-            </w:r>
+            <w:proofErr w:type="spellStart"/>
+            <w:r>
+              <w:rPr>
+                <w:rFonts w:eastAsia="Times New Roman" w:cs="Times New Roman"/>
+                <w:color w:val="000000"/>
+                <w:kern w:val="0"/>
+                <w14:ligatures w14:val="none"/>
+              </w:rPr>
+              <w:t>Shift+End</w:t>
+            </w:r>
+            <w:proofErr w:type="spellEnd"/>
           </w:p>
         </w:tc>
         <w:tc>
@@ -5042,64 +5087,7 @@
                 <w:kern w:val="0"/>
                 <w14:ligatures w14:val="none"/>
               </w:rPr>
-              <w:t>DSKY 0-9</w:t>
-            </w:r>
-          </w:p>
-        </w:tc>
-      </w:tr>
-    </w:tbl>
-    <w:p/>
-    <w:p/>
-    <w:tbl>
-      <w:tblPr>
-        <w:tblW w:w="5000" w:type="pct"/>
-        <w:tblLook w:val="04A0" w:firstRow="1" w:lastRow="0" w:firstColumn="1" w:lastColumn="0" w:noHBand="0" w:noVBand="1"/>
-      </w:tblPr>
-      <w:tblGrid>
-        <w:gridCol w:w="2618"/>
-        <w:gridCol w:w="6732"/>
-      </w:tblGrid>
-      <w:tr>
-        <w:trPr>
-          <w:trHeight w:val="300"/>
-        </w:trPr>
-        <w:tc>
-          <w:tcPr>
-            <w:tcW w:w="5000" w:type="pct"/>
-            <w:gridSpan w:val="2"/>
-            <w:tcBorders>
-              <w:top w:val="single" w:sz="4" w:space="0" w:color="auto"/>
-              <w:left w:val="single" w:sz="4" w:space="0" w:color="auto"/>
-              <w:bottom w:val="single" w:sz="4" w:space="0" w:color="auto"/>
-              <w:right w:val="single" w:sz="4" w:space="0" w:color="auto"/>
-            </w:tcBorders>
-            <w:noWrap/>
-            <w:vAlign w:val="bottom"/>
-            <w:hideMark/>
-          </w:tcPr>
-          <w:p>
-            <w:pPr>
-              <w:spacing w:after="0" w:line="240" w:lineRule="auto"/>
-              <w:jc w:val="center"/>
-              <w:rPr>
-                <w:rFonts w:eastAsia="Times New Roman" w:cs="Times New Roman"/>
-                <w:b/>
-                <w:bCs/>
-                <w:color w:val="000000"/>
-                <w:kern w:val="0"/>
-                <w14:ligatures w14:val="none"/>
-              </w:rPr>
-            </w:pPr>
-            <w:r>
-              <w:rPr>
-                <w:rFonts w:eastAsia="Times New Roman" w:cs="Times New Roman"/>
-                <w:b/>
-                <w:bCs/>
-                <w:color w:val="000000"/>
-                <w:kern w:val="0"/>
-                <w14:ligatures w14:val="none"/>
-              </w:rPr>
-              <w:t>ORDEAL</w:t>
+              <w:t>DSKY Proceed</w:t>
             </w:r>
           </w:p>
         </w:tc>
@@ -5110,7 +5098,8 @@
         </w:trPr>
         <w:tc>
           <w:tcPr>
-            <w:tcW w:w="1400" w:type="pct"/>
+            <w:tcW w:w="1681" w:type="pct"/>
+            <w:gridSpan w:val="2"/>
             <w:tcBorders>
               <w:top w:val="nil"/>
               <w:left w:val="single" w:sz="4" w:space="0" w:color="auto"/>
@@ -5138,13 +5127,13 @@
                 <w:kern w:val="0"/>
                 <w14:ligatures w14:val="none"/>
               </w:rPr>
-              <w:t>Alt-O</w:t>
-            </w:r>
-          </w:p>
-        </w:tc>
-        <w:tc>
-          <w:tcPr>
-            <w:tcW w:w="3600" w:type="pct"/>
+              <w:t>Shift+ 0-9 (Numpad)</w:t>
+            </w:r>
+          </w:p>
+        </w:tc>
+        <w:tc>
+          <w:tcPr>
+            <w:tcW w:w="3319" w:type="pct"/>
             <w:tcBorders>
               <w:top w:val="nil"/>
               <w:left w:val="nil"/>
@@ -5172,7 +5161,7 @@
                 <w:kern w:val="0"/>
                 <w14:ligatures w14:val="none"/>
               </w:rPr>
-              <w:t>Slew ORDEAL Up</w:t>
+              <w:t>DSKY 0-9</w:t>
             </w:r>
           </w:p>
         </w:tc>
@@ -5183,6 +5172,52 @@
         </w:trPr>
         <w:tc>
           <w:tcPr>
+            <w:tcW w:w="5000" w:type="pct"/>
+            <w:gridSpan w:val="3"/>
+            <w:tcBorders>
+              <w:top w:val="single" w:sz="4" w:space="0" w:color="auto"/>
+              <w:left w:val="single" w:sz="4" w:space="0" w:color="auto"/>
+              <w:bottom w:val="single" w:sz="4" w:space="0" w:color="auto"/>
+              <w:right w:val="single" w:sz="4" w:space="0" w:color="auto"/>
+            </w:tcBorders>
+            <w:noWrap/>
+            <w:vAlign w:val="bottom"/>
+            <w:hideMark/>
+          </w:tcPr>
+          <w:p>
+            <w:pPr>
+              <w:spacing w:after="0" w:line="240" w:lineRule="auto"/>
+              <w:jc w:val="center"/>
+              <w:rPr>
+                <w:rFonts w:eastAsia="Times New Roman" w:cs="Times New Roman"/>
+                <w:b/>
+                <w:bCs/>
+                <w:color w:val="000000"/>
+                <w:kern w:val="0"/>
+                <w14:ligatures w14:val="none"/>
+              </w:rPr>
+            </w:pPr>
+            <w:r>
+              <w:rPr>
+                <w:rFonts w:eastAsia="Times New Roman" w:cs="Times New Roman"/>
+                <w:b/>
+                <w:bCs/>
+                <w:color w:val="000000"/>
+                <w:kern w:val="0"/>
+                <w14:ligatures w14:val="none"/>
+              </w:rPr>
+              <w:lastRenderedPageBreak/>
+              <w:t>ORDEAL</w:t>
+            </w:r>
+          </w:p>
+        </w:tc>
+      </w:tr>
+      <w:tr>
+        <w:trPr>
+          <w:trHeight w:val="300"/>
+        </w:trPr>
+        <w:tc>
+          <w:tcPr>
             <w:tcW w:w="1400" w:type="pct"/>
             <w:tcBorders>
               <w:top w:val="nil"/>
@@ -5211,6 +5246,80 @@
                 <w:kern w:val="0"/>
                 <w14:ligatures w14:val="none"/>
               </w:rPr>
+              <w:t>Alt-O</w:t>
+            </w:r>
+          </w:p>
+        </w:tc>
+        <w:tc>
+          <w:tcPr>
+            <w:tcW w:w="3600" w:type="pct"/>
+            <w:gridSpan w:val="2"/>
+            <w:tcBorders>
+              <w:top w:val="nil"/>
+              <w:left w:val="nil"/>
+              <w:bottom w:val="single" w:sz="4" w:space="0" w:color="auto"/>
+              <w:right w:val="single" w:sz="4" w:space="0" w:color="auto"/>
+            </w:tcBorders>
+            <w:noWrap/>
+            <w:vAlign w:val="bottom"/>
+            <w:hideMark/>
+          </w:tcPr>
+          <w:p>
+            <w:pPr>
+              <w:spacing w:after="0" w:line="240" w:lineRule="auto"/>
+              <w:rPr>
+                <w:rFonts w:eastAsia="Times New Roman" w:cs="Times New Roman"/>
+                <w:color w:val="000000"/>
+                <w:kern w:val="0"/>
+                <w14:ligatures w14:val="none"/>
+              </w:rPr>
+            </w:pPr>
+            <w:r>
+              <w:rPr>
+                <w:rFonts w:eastAsia="Times New Roman" w:cs="Times New Roman"/>
+                <w:color w:val="000000"/>
+                <w:kern w:val="0"/>
+                <w14:ligatures w14:val="none"/>
+              </w:rPr>
+              <w:t>Slew ORDEAL Up</w:t>
+            </w:r>
+          </w:p>
+        </w:tc>
+      </w:tr>
+      <w:tr>
+        <w:trPr>
+          <w:trHeight w:val="300"/>
+        </w:trPr>
+        <w:tc>
+          <w:tcPr>
+            <w:tcW w:w="1400" w:type="pct"/>
+            <w:tcBorders>
+              <w:top w:val="nil"/>
+              <w:left w:val="single" w:sz="4" w:space="0" w:color="auto"/>
+              <w:bottom w:val="single" w:sz="4" w:space="0" w:color="auto"/>
+              <w:right w:val="single" w:sz="4" w:space="0" w:color="auto"/>
+            </w:tcBorders>
+            <w:noWrap/>
+            <w:vAlign w:val="bottom"/>
+            <w:hideMark/>
+          </w:tcPr>
+          <w:p>
+            <w:pPr>
+              <w:spacing w:after="0" w:line="240" w:lineRule="auto"/>
+              <w:rPr>
+                <w:rFonts w:eastAsia="Times New Roman" w:cs="Times New Roman"/>
+                <w:color w:val="000000"/>
+                <w:kern w:val="0"/>
+                <w14:ligatures w14:val="none"/>
+              </w:rPr>
+            </w:pPr>
+            <w:r>
+              <w:rPr>
+                <w:rFonts w:eastAsia="Times New Roman" w:cs="Times New Roman"/>
+                <w:color w:val="000000"/>
+                <w:kern w:val="0"/>
+                <w14:ligatures w14:val="none"/>
+              </w:rPr>
               <w:t>Alt-L</w:t>
             </w:r>
           </w:p>
@@ -5218,6 +5327,7 @@
         <w:tc>
           <w:tcPr>
             <w:tcW w:w="3600" w:type="pct"/>
+            <w:gridSpan w:val="2"/>
             <w:tcBorders>
               <w:top w:val="nil"/>
               <w:left w:val="nil"/>

</xml_diff>

<commit_message>
Add notes on high res drive downloads
</commit_message>
<xml_diff>
--- a/Doc/Project Apollo - NASSP/Programmers Notes/NASSP Quick Start Guide.docx
+++ b/Doc/Project Apollo - NASSP/Programmers Notes/NASSP Quick Start Guide.docx
@@ -42,7 +42,7 @@
           <w:b w:val="0"/>
           <w:bCs w:val="0"/>
         </w:rPr>
-        <w:t>2</w:t>
+        <w:t>3</w:t>
       </w:r>
     </w:p>
     <w:p>
@@ -60,7 +60,7 @@
           <w:b w:val="0"/>
           <w:bCs w:val="0"/>
         </w:rPr>
-        <w:t>6</w:t>
+        <w:t>12</w:t>
       </w:r>
       <w:r>
         <w:rPr>
@@ -68,7 +68,15 @@
           <w:b w:val="0"/>
           <w:bCs w:val="0"/>
         </w:rPr>
-        <w:t xml:space="preserve"> MAR</w:t>
+        <w:t xml:space="preserve"> </w:t>
+      </w:r>
+      <w:r>
+        <w:rPr>
+          <w:rStyle w:val="IntenseReference"/>
+          <w:b w:val="0"/>
+          <w:bCs w:val="0"/>
+        </w:rPr>
+        <w:t>APR</w:t>
       </w:r>
       <w:r>
         <w:rPr>
@@ -141,7 +149,7 @@
           <w:r>
             <w:fldChar w:fldCharType="separate"/>
           </w:r>
-          <w:hyperlink w:anchor="_Toc223681304" w:history="1">
+          <w:hyperlink w:anchor="_Toc226959764" w:history="1">
             <w:r>
               <w:rPr>
                 <w:rStyle w:val="Hyperlink"/>
@@ -168,7 +176,7 @@
                 <w:noProof/>
                 <w:webHidden/>
               </w:rPr>
-              <w:instrText xml:space="preserve"> PAGEREF _Toc223681304 \h </w:instrText>
+              <w:instrText xml:space="preserve"> PAGEREF _Toc226959764 \h </w:instrText>
             </w:r>
             <w:r>
               <w:rPr>
@@ -212,7 +220,7 @@
               <w:szCs w:val="24"/>
             </w:rPr>
           </w:pPr>
-          <w:hyperlink w:anchor="_Toc223681305" w:history="1">
+          <w:hyperlink w:anchor="_Toc226959765" w:history="1">
             <w:r>
               <w:rPr>
                 <w:rStyle w:val="Hyperlink"/>
@@ -239,7 +247,7 @@
                 <w:noProof/>
                 <w:webHidden/>
               </w:rPr>
-              <w:instrText xml:space="preserve"> PAGEREF _Toc223681305 \h </w:instrText>
+              <w:instrText xml:space="preserve"> PAGEREF _Toc226959765 \h </w:instrText>
             </w:r>
             <w:r>
               <w:rPr>
@@ -283,7 +291,7 @@
               <w:szCs w:val="24"/>
             </w:rPr>
           </w:pPr>
-          <w:hyperlink w:anchor="_Toc223681306" w:history="1">
+          <w:hyperlink w:anchor="_Toc226959766" w:history="1">
             <w:r>
               <w:rPr>
                 <w:rStyle w:val="Hyperlink"/>
@@ -310,7 +318,7 @@
                 <w:noProof/>
                 <w:webHidden/>
               </w:rPr>
-              <w:instrText xml:space="preserve"> PAGEREF _Toc223681306 \h </w:instrText>
+              <w:instrText xml:space="preserve"> PAGEREF _Toc226959766 \h </w:instrText>
             </w:r>
             <w:r>
               <w:rPr>
@@ -354,7 +362,7 @@
               <w:szCs w:val="24"/>
             </w:rPr>
           </w:pPr>
-          <w:hyperlink w:anchor="_Toc223681307" w:history="1">
+          <w:hyperlink w:anchor="_Toc226959767" w:history="1">
             <w:r>
               <w:rPr>
                 <w:rStyle w:val="Hyperlink"/>
@@ -381,7 +389,7 @@
                 <w:noProof/>
                 <w:webHidden/>
               </w:rPr>
-              <w:instrText xml:space="preserve"> PAGEREF _Toc223681307 \h </w:instrText>
+              <w:instrText xml:space="preserve"> PAGEREF _Toc226959767 \h </w:instrText>
             </w:r>
             <w:r>
               <w:rPr>
@@ -425,7 +433,7 @@
               <w:szCs w:val="24"/>
             </w:rPr>
           </w:pPr>
-          <w:hyperlink w:anchor="_Toc223681308" w:history="1">
+          <w:hyperlink w:anchor="_Toc226959768" w:history="1">
             <w:r>
               <w:rPr>
                 <w:rStyle w:val="Hyperlink"/>
@@ -452,7 +460,7 @@
                 <w:noProof/>
                 <w:webHidden/>
               </w:rPr>
-              <w:instrText xml:space="preserve"> PAGEREF _Toc223681308 \h </w:instrText>
+              <w:instrText xml:space="preserve"> PAGEREF _Toc226959768 \h </w:instrText>
             </w:r>
             <w:r>
               <w:rPr>
@@ -472,7 +480,7 @@
                 <w:noProof/>
                 <w:webHidden/>
               </w:rPr>
-              <w:t>16</w:t>
+              <w:t>17</w:t>
             </w:r>
             <w:r>
               <w:rPr>
@@ -669,7 +677,7 @@
       <w:pPr>
         <w:pStyle w:val="Heading1"/>
       </w:pPr>
-      <w:bookmarkStart w:id="0" w:name="_Toc223681304"/>
+      <w:bookmarkStart w:id="0" w:name="_Toc226959764"/>
       <w:r>
         <w:t>Installation (NASSP 8</w:t>
       </w:r>
@@ -974,15 +982,7 @@
         </w:r>
       </w:hyperlink>
       <w:r>
-        <w:t> Scroll down to "</w:t>
-      </w:r>
-      <w:proofErr w:type="spellStart"/>
-      <w:r>
-        <w:t>MicroTexture</w:t>
-      </w:r>
-      <w:proofErr w:type="spellEnd"/>
-      <w:r>
-        <w:t xml:space="preserve"> Pack for D3D9Client" and unzip to your Orbiter directory.</w:t>
+        <w:t> Scroll down to "MicroTexture Pack for D3D9Client" and unzip to your Orbiter directory.</w:t>
       </w:r>
       <w:r>
         <w:br/>
@@ -998,15 +998,7 @@
         <w:t>-Optional:</w:t>
       </w:r>
       <w:r>
-        <w:t xml:space="preserve"> Download "Apollo Landing Sites for Orbiter 2016" by </w:t>
-      </w:r>
-      <w:proofErr w:type="spellStart"/>
-      <w:r>
-        <w:t>ggalfi</w:t>
-      </w:r>
-      <w:proofErr w:type="spellEnd"/>
-      <w:r>
-        <w:t xml:space="preserve"> here: </w:t>
+        <w:t> Download "Apollo Landing Sites for Orbiter 2016" by ggalfi here: </w:t>
       </w:r>
       <w:hyperlink r:id="rId15" w:tgtFrame="_blank" w:history="1">
         <w:r>
@@ -1116,23 +1108,7 @@
           <w:b/>
           <w:bCs/>
         </w:rPr>
-        <w:t xml:space="preserve">IMPORTANT: Click "Advanced" and add a check beside "Enable absolute animation handling" to prevent </w:t>
-      </w:r>
-      <w:proofErr w:type="gramStart"/>
-      <w:r>
-        <w:rPr>
-          <w:b/>
-          <w:bCs/>
-        </w:rPr>
-        <w:t>animation drift</w:t>
-      </w:r>
-      <w:proofErr w:type="gramEnd"/>
-      <w:r>
-        <w:rPr>
-          <w:b/>
-          <w:bCs/>
-        </w:rPr>
-        <w:t xml:space="preserve"> </w:t>
+        <w:t xml:space="preserve">IMPORTANT: Click "Advanced" and add a check beside "Enable absolute animation handling" to prevent animation drift </w:t>
       </w:r>
       <w:r>
         <w:rPr>
@@ -1167,15 +1143,7 @@
       </w:r>
       <w:r>
         <w:br/>
-        <w:t xml:space="preserve">4. Install </w:t>
-      </w:r>
-      <w:proofErr w:type="spellStart"/>
-      <w:r>
-        <w:t>XRSound</w:t>
-      </w:r>
-      <w:proofErr w:type="spellEnd"/>
-      <w:r>
-        <w:t xml:space="preserve"> 2.0: </w:t>
+        <w:t>4. Install XRSound 2.0: </w:t>
       </w:r>
       <w:hyperlink r:id="rId18" w:history="1">
         <w:r>
@@ -1207,15 +1175,7 @@
         </w:r>
       </w:hyperlink>
       <w:r>
-        <w:t xml:space="preserve"> and unzip to your Orbiter directory. Do the same with the small </w:t>
-      </w:r>
-      <w:proofErr w:type="spellStart"/>
-      <w:r>
-        <w:t>XRSound</w:t>
-      </w:r>
-      <w:proofErr w:type="spellEnd"/>
-      <w:r>
-        <w:t xml:space="preserve"> config zip file that can be found at the link as well. These files only </w:t>
+        <w:t xml:space="preserve"> and unzip to your Orbiter directory. Do the same with the small XRSound config zip file that can be found at the link as well. These files only </w:t>
       </w:r>
       <w:r>
         <w:t>must</w:t>
@@ -1247,23 +1207,7 @@
           <w:b/>
           <w:bCs/>
         </w:rPr>
-        <w:t xml:space="preserve"> </w:t>
-      </w:r>
-      <w:proofErr w:type="gramStart"/>
-      <w:r>
-        <w:rPr>
-          <w:b/>
-          <w:bCs/>
-        </w:rPr>
-        <w:t>For</w:t>
-      </w:r>
-      <w:proofErr w:type="gramEnd"/>
-      <w:r>
-        <w:rPr>
-          <w:b/>
-          <w:bCs/>
-        </w:rPr>
-        <w:t xml:space="preserve"> Orbiter 2016 Beta</w:t>
+        <w:t xml:space="preserve"> For Orbiter 2016 Beta</w:t>
       </w:r>
       <w:r>
         <w:rPr>
@@ -1296,31 +1240,7 @@
       </w:r>
       <w:r>
         <w:br/>
-        <w:t>2. Go to the "Modules" tab and activate the "</w:t>
-      </w:r>
-      <w:proofErr w:type="spellStart"/>
-      <w:r>
-        <w:t>XRSound</w:t>
-      </w:r>
-      <w:proofErr w:type="spellEnd"/>
-      <w:r>
-        <w:t>" and "</w:t>
-      </w:r>
-      <w:proofErr w:type="spellStart"/>
-      <w:r>
-        <w:t>ProjectApolloMFD</w:t>
-      </w:r>
-      <w:proofErr w:type="spellEnd"/>
-      <w:r>
-        <w:t>" and "</w:t>
-      </w:r>
-      <w:proofErr w:type="spellStart"/>
-      <w:r>
-        <w:t>ApolloRTCCMFD</w:t>
-      </w:r>
-      <w:proofErr w:type="spellEnd"/>
-      <w:r>
-        <w:t>" modules.</w:t>
+        <w:t>2. Go to the "Modules" tab and activate the "XRSound" and "ProjectApolloMFD" and "ApolloRTCCMFD" modules.</w:t>
       </w:r>
       <w:r>
         <w:br/>
@@ -1486,7 +1406,7 @@
       <w:pPr>
         <w:pStyle w:val="Heading1"/>
       </w:pPr>
-      <w:bookmarkStart w:id="1" w:name="_Toc223681305"/>
+      <w:bookmarkStart w:id="1" w:name="_Toc226959765"/>
       <w:r>
         <w:lastRenderedPageBreak/>
         <w:t xml:space="preserve">Installation (NASSP </w:t>
@@ -1605,15 +1525,7 @@
         <w:t xml:space="preserve"> </w:t>
       </w:r>
       <w:r>
-        <w:t xml:space="preserve">This contains only </w:t>
-      </w:r>
-      <w:proofErr w:type="gramStart"/>
-      <w:r>
-        <w:t>Low Res</w:t>
-      </w:r>
-      <w:proofErr w:type="gramEnd"/>
-      <w:r>
-        <w:t xml:space="preserve"> textures</w:t>
+        <w:t>This contains only Low Res textures</w:t>
       </w:r>
     </w:p>
     <w:p>
@@ -1679,6 +1591,16 @@
       </w:hyperlink>
       <w:r>
         <w:t>, make sure you have the folder organization correct (Earth/Archive and Moon/Archive) and put those into the Textures folder of your orbiter root</w:t>
+      </w:r>
+      <w:r>
+        <w:t xml:space="preserve">. </w:t>
+      </w:r>
+      <w:r>
+        <w:rPr>
+          <w:b/>
+          <w:bCs/>
+        </w:rPr>
+        <w:t>Please note that you need to download the individual high-res files from drive and not the folders, otherwise incorrect filenames will be appended</w:t>
       </w:r>
     </w:p>
     <w:p>
@@ -1753,39 +1675,7 @@
         <w:t>g</w:t>
       </w:r>
       <w:r>
-        <w:t>o to the "Modules" tab and activate the "</w:t>
-      </w:r>
-      <w:proofErr w:type="spellStart"/>
-      <w:r>
-        <w:t>ExtMFD</w:t>
-      </w:r>
-      <w:proofErr w:type="spellEnd"/>
-      <w:r>
-        <w:t xml:space="preserve">", </w:t>
-      </w:r>
-      <w:proofErr w:type="spellStart"/>
-      <w:r>
-        <w:t>XRSound</w:t>
-      </w:r>
-      <w:proofErr w:type="spellEnd"/>
-      <w:r>
-        <w:t>", "</w:t>
-      </w:r>
-      <w:proofErr w:type="spellStart"/>
-      <w:r>
-        <w:t>ProjectApolloMFD</w:t>
-      </w:r>
-      <w:proofErr w:type="spellEnd"/>
-      <w:r>
-        <w:t>" and "</w:t>
-      </w:r>
-      <w:proofErr w:type="spellStart"/>
-      <w:r>
-        <w:t>ApolloRTCCMFD</w:t>
-      </w:r>
-      <w:proofErr w:type="spellEnd"/>
-      <w:r>
-        <w:t>" modules. Do not use the DX9MFD as it is known to cause crashes</w:t>
+        <w:t>o to the "Modules" tab and activate the "ExtMFD", XRSound", "ProjectApolloMFD" and "ApolloRTCCMFD" modules. Do not use the DX9MFD as it is known to cause crashes</w:t>
       </w:r>
     </w:p>
     <w:p>
@@ -1796,15 +1686,7 @@
         <w:t>.</w:t>
       </w:r>
       <w:r>
-        <w:t xml:space="preserve"> In Options-&gt;Visual Settings make sure "local light sources" </w:t>
-      </w:r>
-      <w:proofErr w:type="gramStart"/>
-      <w:r>
-        <w:t>is</w:t>
-      </w:r>
-      <w:proofErr w:type="gramEnd"/>
-      <w:r>
-        <w:t xml:space="preserve"> enabled,</w:t>
+        <w:t xml:space="preserve"> In Options-&gt;Visual Settings make sure "local light sources" is enabled,</w:t>
       </w:r>
       <w:r>
         <w:t xml:space="preserve"> enable </w:t>
@@ -1884,6 +1766,7 @@
     </w:p>
     <w:p>
       <w:r>
+        <w:lastRenderedPageBreak/>
         <w:t>8</w:t>
       </w:r>
       <w:r>
@@ -1907,7 +1790,6 @@
     </w:p>
     <w:p>
       <w:r>
-        <w:lastRenderedPageBreak/>
         <w:t>9</w:t>
       </w:r>
       <w:r>
@@ -1920,13 +1802,28 @@
         <w:t>I</w:t>
       </w:r>
       <w:r>
-        <w:t xml:space="preserve">n Extra, go to vessel configuration-&gt;project apollo configuration and at the very least make sure mesh is set to high resolution, FDAI is on smooth scrolling, and on the miscellaneous tab, check </w:t>
+        <w:t>n Extra</w:t>
+      </w:r>
+      <w:r>
+        <w:t>-&gt;</w:t>
+      </w:r>
+      <w:r>
+        <w:t>vessel configuration-&gt;project apollo configuration</w:t>
+      </w:r>
+      <w:r>
+        <w:t>,</w:t>
+      </w:r>
+      <w:r>
+        <w:t xml:space="preserve"> make sure mesh is set to high resolution, FDAI is on smooth scrolling, and on the miscellaneous tab, check </w:t>
       </w:r>
       <w:r>
         <w:t>multi-threading</w:t>
       </w:r>
       <w:r>
         <w:t xml:space="preserve"> in time acceleration</w:t>
+      </w:r>
+      <w:r>
+        <w:t>. You can optionally choose to limit max acceleration (useful to not “over warp”) and a debug line that appears in the LPD view in the virtual cockpit that displays landing information that would normally be called out by the LMP</w:t>
       </w:r>
     </w:p>
     <w:p/>
@@ -1957,9 +1854,8 @@
       <w:pPr>
         <w:pStyle w:val="Heading1"/>
       </w:pPr>
-      <w:bookmarkStart w:id="2" w:name="_Toc223681306"/>
-      <w:r>
-        <w:lastRenderedPageBreak/>
+      <w:bookmarkStart w:id="2" w:name="_Toc226959766"/>
+      <w:r>
         <w:t>Tips For Beginners:</w:t>
       </w:r>
       <w:bookmarkEnd w:id="2"/>
@@ -1983,15 +1879,7 @@
         <w:br/>
       </w:r>
       <w:r>
-        <w:t xml:space="preserve">That's ultimately up to you, but we generally recommend Apollo 8. While Apollo 7 is chronologically first, it's a very long mission that is meant to test vehicle systems and procedures from the relative safety of low Earth orbit. As such, it involves a very unusual and often repetitive schedule, with procedures that are rather unrefined. Apollo 8, by contrast, is a relatively short mission with more straightforward goals and mission design. You get to experience most of the lunar mission milestones without needing to worry about managing two separate vehicles on your first journey. After Apollo 8 concludes, Apollo 11 or 12 would be our next recommendation. You get to use </w:t>
-      </w:r>
-      <w:proofErr w:type="gramStart"/>
-      <w:r>
-        <w:t>the LM</w:t>
-      </w:r>
-      <w:proofErr w:type="gramEnd"/>
-      <w:r>
-        <w:t xml:space="preserve"> and land on the moon, and the procedures have been improved and optimized thanks to the lessons learned on all the previous missions.</w:t>
+        <w:t>That's ultimately up to you, but we generally recommend Apollo 8. While Apollo 7 is chronologically first, it's a very long mission that is meant to test vehicle systems and procedures from the relative safety of low Earth orbit. As such, it involves a very unusual and often repetitive schedule, with procedures that are rather unrefined. Apollo 8, by contrast, is a relatively short mission with more straightforward goals and mission design. You get to experience most of the lunar mission milestones without needing to worry about managing two separate vehicles on your first journey. After Apollo 8 concludes, Apollo 11 or 12 would be our next recommendation. You get to use the LM and land on the moon, and the procedures have been improved and optimized thanks to the lessons learned on all the previous missions.</w:t>
       </w:r>
       <w:r>
         <w:br/>
@@ -2094,11 +1982,11 @@
         <w:br/>
       </w:r>
       <w:r>
-        <w:t xml:space="preserve">The 2D and 3D cockpit views are divided up into multiple viewpoints, usually centered on a specific panel or group of panels. Think of these a bit like choosing which "seat" you're positioned at in the spacecraft. In each view, you can use the arrow keys to move the camera up, down, left, and right. You can switch between </w:t>
+        <w:t xml:space="preserve">The 2D and 3D cockpit views are divided up into multiple viewpoints, usually centered on a specific panel or group of panels. Think of these a bit like choosing </w:t>
       </w:r>
       <w:r>
         <w:lastRenderedPageBreak/>
-        <w:t>these seats by holding the Control/Ctrl key and pressing an arrow key. It may take some time to get used to where each of the viewpoints are located within the cockpit. In the 3D cockpit specifically, from any "seat" you can hold Ctrl and Alt and press an arrow key to adjust the camera to one of several preset angles, to help get a better view of certain switches or components in that area. For example, from the left seat of the CM, you can press Ctrl + Alt + Right Arrow to zoom the camera in on the DSKY, or Ctrl + Alt + Left Arrow to look to your left, at the side panels near your armrest. Every "seat" has its own set of preset views, many of which are very helpful in finding switches that are out of sight or not as easily viewable.</w:t>
+        <w:t>which "seat" you're positioned at in the spacecraft. In each view, you can use the arrow keys to move the camera up, down, left, and right. You can switch between these seats by holding the Control/Ctrl key and pressing an arrow key. It may take some time to get used to where each of the viewpoints are located within the cockpit. In the 3D cockpit specifically, from any "seat" you can hold Ctrl and Alt and press an arrow key to adjust the camera to one of several preset angles, to help get a better view of certain switches or components in that area. For example, from the left seat of the CM, you can press Ctrl + Alt + Right Arrow to zoom the camera in on the DSKY, or Ctrl + Alt + Left Arrow to look to your left, at the side panels near your armrest. Every "seat" has its own set of preset views, many of which are very helpful in finding switches that are out of sight or not as easily viewable.</w:t>
       </w:r>
       <w:r>
         <w:br/>
@@ -2154,29 +2042,13 @@
         <w:br/>
       </w:r>
       <w:r>
-        <w:t xml:space="preserve">These are </w:t>
-      </w:r>
-      <w:proofErr w:type="gramStart"/>
-      <w:r>
-        <w:t>pretty easy</w:t>
-      </w:r>
-      <w:proofErr w:type="gramEnd"/>
-      <w:r>
-        <w:t xml:space="preserve">. You can </w:t>
+        <w:t xml:space="preserve">These are pretty easy. You can </w:t>
       </w:r>
       <w:r>
         <w:t>click on the left</w:t>
       </w:r>
       <w:r>
-        <w:t xml:space="preserve"> circuit breakers to close or open them. For computer keys like the DSKY or DEDA, just click on each button to press it. If you find that the computer isn't always responding to your key presses, you may be letting go of the button too quickly. Each computer key needs to be held for a small fraction of a second, and sometimes a fast click doesn't hold the button down for quite long enough. You don't need to hold them for a long time, only for </w:t>
-      </w:r>
-      <w:proofErr w:type="gramStart"/>
-      <w:r>
-        <w:t>a brief moment</w:t>
-      </w:r>
-      <w:proofErr w:type="gramEnd"/>
-      <w:r>
-        <w:t xml:space="preserve"> to ensure they register.</w:t>
+        <w:t xml:space="preserve"> circuit breakers to close or open them. For computer keys like the DSKY or DEDA, just click on each button to press it. If you find that the computer isn't always responding to your key presses, you may be letting go of the button too quickly. Each computer key needs to be held for a small fraction of a second, and sometimes a fast click doesn't hold the button down for quite long enough. You don't need to hold them for a long time, only for a brief moment to ensure they register.</w:t>
       </w:r>
       <w:r>
         <w:br/>
@@ -2230,15 +2102,11 @@
         <w:ind w:left="360"/>
       </w:pPr>
       <w:r>
-        <w:t xml:space="preserve">Thumbwheels are the vertical numbered controls, found on the gimbal trim control panel and the attitude set control panel. Left-click the upper or lower part of each thumbwheel to increase/decrease its value by 1, or right-click them to increase/decrease by 0.1. The </w:t>
-      </w:r>
-      <w:proofErr w:type="spellStart"/>
-      <w:r>
-        <w:t>dV</w:t>
-      </w:r>
-      <w:proofErr w:type="spellEnd"/>
-      <w:r>
-        <w:t xml:space="preserve">/Range Set switch on the EMS works similarly: hold the switch on the top or bottom to increase or decrease the </w:t>
+        <w:t xml:space="preserve">Thumbwheels are the vertical numbered controls, found on the gimbal trim control panel and the attitude set control panel. Left-click the upper or lower part of each thumbwheel to increase/decrease its value by 1, or right-click them to increase/decrease by 0.1. The dV/Range Set switch on the EMS works similarly: hold </w:t>
+      </w:r>
+      <w:r>
+        <w:lastRenderedPageBreak/>
+        <w:t xml:space="preserve">the switch on the top or bottom to increase or decrease the </w:t>
       </w:r>
       <w:r>
         <w:t>value and</w:t>
@@ -2258,7 +2126,6 @@
         <w:rPr>
           <w:rStyle w:val="Strong"/>
         </w:rPr>
-        <w:lastRenderedPageBreak/>
         <w:t>MFD’s and things.</w:t>
       </w:r>
     </w:p>
@@ -2267,15 +2134,7 @@
         <w:ind w:left="360"/>
       </w:pPr>
       <w:r>
-        <w:t>While the 2D cockpit has MFDs built right into its main panel, the 3D cockpit does not. To open an MFD in the 3D cockpit, move your mouse near the top of the Orbiter window. A menu bar should drop down. Click on "Function" and then choose "External MFD". If this option does not appear, make sure the "</w:t>
-      </w:r>
-      <w:proofErr w:type="spellStart"/>
-      <w:r>
-        <w:t>ExtMFD</w:t>
-      </w:r>
-      <w:proofErr w:type="spellEnd"/>
-      <w:r>
-        <w:t>" module is enabled in the Orbiter settings.</w:t>
+        <w:t>While the 2D cockpit has MFDs built right into its main panel, the 3D cockpit does not. To open an MFD in the 3D cockpit, move your mouse near the top of the Orbiter window. A menu bar should drop down. Click on "Function" and then choose "External MFD". If this option does not appear, make sure the "ExtMFD" module is enabled in the Orbiter settings.</w:t>
       </w:r>
     </w:p>
     <w:p>
@@ -2344,7 +2203,11 @@
         <w:br/>
       </w:r>
       <w:r>
-        <w:t>On missions with automated MCC support, you'll periodically receive Pre-Advisory Data (PAD) on the left side of the screen. Whenever you receive one of these, it's a good idea to take a screenshot of this data and save it somewhere. Each new PAD will replace the previous one, and certain parts of a mission might send you several over the course of a few minutes, so you will often need to keep track of them longer than the automated system keeps them there. Additionally, if you ever encounter problems with a burn or a trajectory calculation, sending us your PAD for that maneuver can be useful for debugging and troubleshooting.</w:t>
+        <w:t xml:space="preserve">On missions with automated MCC support, you'll periodically receive Pre-Advisory Data (PAD) on the left side of the screen. Whenever you receive one of these, it's a good idea to take a screenshot of this data and save it somewhere. Each new PAD will replace the previous one, and certain parts of a mission might send you several over the course of a few minutes, so you will often need to keep track of them longer than the automated system keeps them there. Additionally, if you ever </w:t>
+      </w:r>
+      <w:r>
+        <w:lastRenderedPageBreak/>
+        <w:t>encounter problems with a burn or a trajectory calculation, sending us your PAD for that maneuver can be useful for debugging and troubleshooting.</w:t>
       </w:r>
       <w:r>
         <w:br/>
@@ -2359,7 +2222,6 @@
           <w:b/>
           <w:bCs/>
         </w:rPr>
-        <w:lastRenderedPageBreak/>
         <w:t xml:space="preserve">Save </w:t>
       </w:r>
       <w:r>
@@ -2374,23 +2236,7 @@
           <w:b/>
           <w:bCs/>
         </w:rPr>
-        <w:t xml:space="preserve"> keep </w:t>
-      </w:r>
-      <w:proofErr w:type="gramStart"/>
-      <w:r>
-        <w:rPr>
-          <w:b/>
-          <w:bCs/>
-        </w:rPr>
-        <w:t>your save</w:t>
-      </w:r>
-      <w:proofErr w:type="gramEnd"/>
-      <w:r>
-        <w:rPr>
-          <w:b/>
-          <w:bCs/>
-        </w:rPr>
-        <w:t xml:space="preserve"> files organized!</w:t>
+        <w:t xml:space="preserve"> keep your save files organized!</w:t>
       </w:r>
       <w:r>
         <w:t> </w:t>
@@ -2505,32 +2351,16 @@
         <w:t>time warp</w:t>
       </w:r>
       <w:r>
-        <w:t xml:space="preserve"> normally. It will even affect vessels that you're not currently </w:t>
-      </w:r>
-      <w:proofErr w:type="gramStart"/>
-      <w:r>
-        <w:t>controlling:</w:t>
-      </w:r>
-      <w:proofErr w:type="gramEnd"/>
-      <w:r>
-        <w:t xml:space="preserve"> </w:t>
+        <w:t xml:space="preserve"> normally. It will even affect vessels that you're not currently controlling: </w:t>
       </w:r>
       <w:r>
         <w:t>time warping</w:t>
       </w:r>
       <w:r>
-        <w:t xml:space="preserve"> in the CSM while the LM is trying to hold attitude will cause problems for the LM. Usually going up to about 5x or 10x is safe. If you want </w:t>
-      </w:r>
-      <w:proofErr w:type="gramStart"/>
-      <w:r>
-        <w:t xml:space="preserve">to </w:t>
-      </w:r>
-      <w:r>
-        <w:t>time</w:t>
-      </w:r>
-      <w:proofErr w:type="gramEnd"/>
-      <w:r>
-        <w:t xml:space="preserve"> warp</w:t>
+        <w:t xml:space="preserve"> in the CSM while the LM is trying to hold attitude will cause problems for the LM. Usually going up to about 5x or 10x is safe. If you want to </w:t>
+      </w:r>
+      <w:r>
+        <w:t>time warp</w:t>
       </w:r>
       <w:r>
         <w:t xml:space="preserve"> faster, be sure to disable any kind of attitude-hold mode in the CSM and LM before </w:t>
@@ -2567,23 +2397,7 @@
         <w:br/>
       </w:r>
       <w:r>
-        <w:t xml:space="preserve">When you're performing LM activation, be sure to use </w:t>
-      </w:r>
-      <w:proofErr w:type="gramStart"/>
-      <w:r>
-        <w:t>the Project</w:t>
-      </w:r>
-      <w:proofErr w:type="gramEnd"/>
-      <w:r>
-        <w:t xml:space="preserve"> Apollo MFD's "ECS" section to connect the O2 hose from the CSM. This creates a flow of fresh oxygen into the LM so that the cabin doesn't fill up with deadly CO2 and </w:t>
-      </w:r>
-      <w:proofErr w:type="gramStart"/>
-      <w:r>
-        <w:t>poison</w:t>
-      </w:r>
-      <w:proofErr w:type="gramEnd"/>
-      <w:r>
-        <w:t xml:space="preserve"> your crew before the LM ECS is activated. Having this O2 hose connected also prevents you from closing the CSM forward hatch, so if you can't get it </w:t>
+        <w:t xml:space="preserve">When you're performing LM activation, be sure to use the Project Apollo MFD's "ECS" section to connect the O2 hose from the CSM. This creates a flow of fresh oxygen into the LM so that the cabin doesn't fill up with deadly CO2 and poison your crew before the LM ECS is activated. Having this O2 hose connected also prevents you from closing the CSM forward hatch, so if you can't get it </w:t>
       </w:r>
       <w:r>
         <w:t>too</w:t>
@@ -2595,12 +2409,6 @@
         <w:br/>
       </w:r>
     </w:p>
-    <w:p>
-      <w:pPr>
-        <w:ind w:left="360"/>
-      </w:pPr>
-    </w:p>
-    <w:p/>
     <w:p>
       <w:pPr>
         <w:ind w:left="360"/>
@@ -2661,15 +2469,7 @@
         <w:ind w:left="360"/>
       </w:pPr>
       <w:r>
-        <w:t xml:space="preserve">If you look carefully, you will notice there are Velcro patches around the CM and LM. Clicking these will allow you to utilize various mission cue cards, window shades, glareshields etc. that were used during flight. One caveat is they are mostly Apollo 15 cue cards currently, so keep that in mind when flying other flights. We are working to find/create more mission specific cue cards </w:t>
-      </w:r>
-      <w:proofErr w:type="gramStart"/>
-      <w:r>
-        <w:t>in the near future</w:t>
-      </w:r>
-      <w:proofErr w:type="gramEnd"/>
-      <w:r>
-        <w:t>.</w:t>
+        <w:t>If you look carefully, you will notice there are Velcro patches around the CM and LM. Clicking these will allow you to utilize various mission cue cards, window shades, glareshields etc. that were used during flight. One caveat is they are mostly Apollo 15 cue cards currently, so keep that in mind when flying other flights. We are working to find/create more mission specific cue cards in the near future.</w:t>
       </w:r>
     </w:p>
     <w:p>
@@ -2741,7 +2541,7 @@
       <w:pPr>
         <w:pStyle w:val="Heading1"/>
       </w:pPr>
-      <w:bookmarkStart w:id="3" w:name="_Toc223681307"/>
+      <w:bookmarkStart w:id="3" w:name="_Toc226959767"/>
       <w:r>
         <w:lastRenderedPageBreak/>
         <w:t>Keyboard Commands:</w:t>
@@ -2836,8 +2636,7 @@
         <w:tblLook w:val="04A0" w:firstRow="1" w:lastRow="0" w:firstColumn="1" w:lastColumn="0" w:noHBand="0" w:noVBand="1"/>
       </w:tblPr>
       <w:tblGrid>
-        <w:gridCol w:w="2618"/>
-        <w:gridCol w:w="525"/>
+        <w:gridCol w:w="3143"/>
         <w:gridCol w:w="6207"/>
       </w:tblGrid>
       <w:tr>
@@ -2847,7 +2646,7 @@
         <w:tc>
           <w:tcPr>
             <w:tcW w:w="5000" w:type="pct"/>
-            <w:gridSpan w:val="3"/>
+            <w:gridSpan w:val="2"/>
             <w:tcBorders>
               <w:top w:val="single" w:sz="4" w:space="0" w:color="auto"/>
               <w:left w:val="single" w:sz="4" w:space="0" w:color="auto"/>
@@ -2892,7 +2691,6 @@
         <w:tc>
           <w:tcPr>
             <w:tcW w:w="1681" w:type="pct"/>
-            <w:gridSpan w:val="2"/>
             <w:tcBorders>
               <w:top w:val="nil"/>
               <w:left w:val="single" w:sz="4" w:space="0" w:color="auto"/>
@@ -2954,7 +2752,61 @@
                 <w:kern w:val="0"/>
                 <w14:ligatures w14:val="none"/>
               </w:rPr>
-              <w:t>Switch between rotational and translational controls</w:t>
+              <w:t>Toggles</w:t>
+            </w:r>
+            <w:r>
+              <w:rPr>
+                <w:rFonts w:eastAsia="Times New Roman" w:cs="Times New Roman"/>
+                <w:color w:val="000000"/>
+                <w:kern w:val="0"/>
+                <w14:ligatures w14:val="none"/>
+              </w:rPr>
+              <w:t xml:space="preserve"> </w:t>
+            </w:r>
+            <w:r>
+              <w:rPr>
+                <w:rFonts w:eastAsia="Times New Roman" w:cs="Times New Roman"/>
+                <w:color w:val="000000"/>
+                <w:kern w:val="0"/>
+                <w14:ligatures w14:val="none"/>
+              </w:rPr>
+              <w:t>R</w:t>
+            </w:r>
+            <w:r>
+              <w:rPr>
+                <w:rFonts w:eastAsia="Times New Roman" w:cs="Times New Roman"/>
+                <w:color w:val="000000"/>
+                <w:kern w:val="0"/>
+                <w14:ligatures w14:val="none"/>
+              </w:rPr>
+              <w:t xml:space="preserve">otational and </w:t>
+            </w:r>
+            <w:r>
+              <w:rPr>
+                <w:rFonts w:eastAsia="Times New Roman" w:cs="Times New Roman"/>
+                <w:color w:val="000000"/>
+                <w:kern w:val="0"/>
+                <w14:ligatures w14:val="none"/>
+              </w:rPr>
+              <w:t>T</w:t>
+            </w:r>
+            <w:r>
+              <w:rPr>
+                <w:rFonts w:eastAsia="Times New Roman" w:cs="Times New Roman"/>
+                <w:color w:val="000000"/>
+                <w:kern w:val="0"/>
+                <w14:ligatures w14:val="none"/>
+              </w:rPr>
+              <w:t xml:space="preserve">ranslational </w:t>
+            </w:r>
+            <w:r>
+              <w:rPr>
+                <w:rFonts w:eastAsia="Times New Roman" w:cs="Times New Roman"/>
+                <w:color w:val="000000"/>
+                <w:kern w:val="0"/>
+                <w14:ligatures w14:val="none"/>
+              </w:rPr>
+              <w:t>inputs</w:t>
             </w:r>
           </w:p>
         </w:tc>
@@ -2966,7 +2818,6 @@
         <w:tc>
           <w:tcPr>
             <w:tcW w:w="1681" w:type="pct"/>
-            <w:gridSpan w:val="2"/>
             <w:tcBorders>
               <w:top w:val="nil"/>
               <w:left w:val="single" w:sz="4" w:space="0" w:color="auto"/>
@@ -3040,7 +2891,6 @@
         <w:tc>
           <w:tcPr>
             <w:tcW w:w="1681" w:type="pct"/>
-            <w:gridSpan w:val="2"/>
             <w:tcBorders>
               <w:top w:val="nil"/>
               <w:left w:val="single" w:sz="4" w:space="0" w:color="auto"/>
@@ -3060,17 +2910,15 @@
                 <w14:ligatures w14:val="none"/>
               </w:rPr>
             </w:pPr>
-            <w:proofErr w:type="spellStart"/>
-            <w:r>
-              <w:rPr>
-                <w:rFonts w:eastAsia="Times New Roman" w:cs="Times New Roman"/>
-                <w:color w:val="000000"/>
-                <w:kern w:val="0"/>
-                <w14:ligatures w14:val="none"/>
-              </w:rPr>
-              <w:t>Ctrl+Alt+S</w:t>
-            </w:r>
-            <w:proofErr w:type="spellEnd"/>
+            <w:r>
+              <w:rPr>
+                <w:rFonts w:eastAsia="Times New Roman" w:cs="Times New Roman"/>
+                <w:color w:val="000000"/>
+                <w:kern w:val="0"/>
+                <w14:ligatures w14:val="none"/>
+              </w:rPr>
+              <w:t>F1</w:t>
+            </w:r>
           </w:p>
         </w:tc>
         <w:tc>
@@ -3102,19 +2950,8 @@
                 <w:kern w:val="0"/>
                 <w14:ligatures w14:val="none"/>
               </w:rPr>
-              <w:t xml:space="preserve">Generate Mission Time-Stamped </w:t>
-            </w:r>
-            <w:proofErr w:type="spellStart"/>
-            <w:r>
-              <w:rPr>
-                <w:rFonts w:eastAsia="Times New Roman" w:cs="Times New Roman"/>
-                <w:color w:val="000000"/>
-                <w:kern w:val="0"/>
-                <w14:ligatures w14:val="none"/>
-              </w:rPr>
-              <w:t>Quicksave</w:t>
-            </w:r>
-            <w:proofErr w:type="spellEnd"/>
+              <w:t>Toggles External/Internal Views</w:t>
+            </w:r>
           </w:p>
         </w:tc>
       </w:tr>
@@ -3125,53 +2962,67 @@
         <w:tc>
           <w:tcPr>
             <w:tcW w:w="1681" w:type="pct"/>
-            <w:gridSpan w:val="2"/>
+            <w:tcBorders>
+              <w:top w:val="nil"/>
+              <w:left w:val="single" w:sz="4" w:space="0" w:color="auto"/>
+              <w:bottom w:val="single" w:sz="4" w:space="0" w:color="auto"/>
+              <w:right w:val="single" w:sz="4" w:space="0" w:color="auto"/>
+            </w:tcBorders>
+            <w:noWrap/>
+            <w:vAlign w:val="bottom"/>
+          </w:tcPr>
+          <w:p>
+            <w:pPr>
+              <w:spacing w:after="0" w:line="240" w:lineRule="auto"/>
+              <w:rPr>
+                <w:rFonts w:eastAsia="Times New Roman" w:cs="Times New Roman"/>
+                <w:color w:val="000000"/>
+                <w:kern w:val="0"/>
+                <w14:ligatures w14:val="none"/>
+              </w:rPr>
+            </w:pPr>
+            <w:r>
+              <w:rPr>
+                <w:rFonts w:eastAsia="Times New Roman" w:cs="Times New Roman"/>
+                <w:color w:val="000000"/>
+                <w:kern w:val="0"/>
+                <w14:ligatures w14:val="none"/>
+              </w:rPr>
+              <w:t>F8</w:t>
+            </w:r>
+          </w:p>
+        </w:tc>
+        <w:tc>
+          <w:tcPr>
+            <w:tcW w:w="3319" w:type="pct"/>
             <w:tcBorders>
               <w:top w:val="nil"/>
               <w:left w:val="nil"/>
-              <w:bottom w:val="nil"/>
-              <w:right w:val="nil"/>
-            </w:tcBorders>
-            <w:noWrap/>
-            <w:vAlign w:val="bottom"/>
-            <w:hideMark/>
-          </w:tcPr>
-          <w:p>
-            <w:pPr>
-              <w:spacing w:after="0" w:line="240" w:lineRule="auto"/>
-              <w:rPr>
-                <w:rFonts w:eastAsia="Times New Roman" w:cs="Times New Roman"/>
-                <w:color w:val="000000"/>
-                <w:kern w:val="0"/>
-                <w14:ligatures w14:val="none"/>
-              </w:rPr>
-            </w:pPr>
-          </w:p>
-        </w:tc>
-        <w:tc>
-          <w:tcPr>
-            <w:tcW w:w="3319" w:type="pct"/>
-            <w:tcBorders>
-              <w:top w:val="nil"/>
-              <w:left w:val="nil"/>
-              <w:bottom w:val="nil"/>
-              <w:right w:val="nil"/>
-            </w:tcBorders>
-            <w:noWrap/>
-            <w:vAlign w:val="bottom"/>
-            <w:hideMark/>
-          </w:tcPr>
-          <w:p>
-            <w:pPr>
-              <w:spacing w:after="0" w:line="240" w:lineRule="auto"/>
-              <w:rPr>
-                <w:rFonts w:eastAsia="Times New Roman" w:cs="Times New Roman"/>
-                <w:kern w:val="0"/>
-                <w:sz w:val="20"/>
-                <w:szCs w:val="20"/>
-                <w14:ligatures w14:val="none"/>
-              </w:rPr>
-            </w:pPr>
+              <w:bottom w:val="single" w:sz="4" w:space="0" w:color="auto"/>
+              <w:right w:val="single" w:sz="4" w:space="0" w:color="auto"/>
+            </w:tcBorders>
+            <w:noWrap/>
+            <w:vAlign w:val="bottom"/>
+          </w:tcPr>
+          <w:p>
+            <w:pPr>
+              <w:spacing w:after="0" w:line="240" w:lineRule="auto"/>
+              <w:rPr>
+                <w:rFonts w:eastAsia="Times New Roman" w:cs="Times New Roman"/>
+                <w:color w:val="000000"/>
+                <w:kern w:val="0"/>
+                <w14:ligatures w14:val="none"/>
+              </w:rPr>
+            </w:pPr>
+            <w:r>
+              <w:rPr>
+                <w:rFonts w:eastAsia="Times New Roman" w:cs="Times New Roman"/>
+                <w:color w:val="000000"/>
+                <w:kern w:val="0"/>
+                <w14:ligatures w14:val="none"/>
+              </w:rPr>
+              <w:t>Toggles Internal Views; Orbiter/2D/Virtual Cockpit (3D)</w:t>
+            </w:r>
           </w:p>
         </w:tc>
       </w:tr>
@@ -3181,41 +3032,67 @@
         </w:trPr>
         <w:tc>
           <w:tcPr>
-            <w:tcW w:w="5000" w:type="pct"/>
-            <w:gridSpan w:val="3"/>
-            <w:tcBorders>
-              <w:top w:val="single" w:sz="4" w:space="0" w:color="auto"/>
+            <w:tcW w:w="1681" w:type="pct"/>
+            <w:tcBorders>
+              <w:top w:val="nil"/>
               <w:left w:val="single" w:sz="4" w:space="0" w:color="auto"/>
               <w:bottom w:val="single" w:sz="4" w:space="0" w:color="auto"/>
               <w:right w:val="single" w:sz="4" w:space="0" w:color="auto"/>
             </w:tcBorders>
             <w:noWrap/>
             <w:vAlign w:val="bottom"/>
-            <w:hideMark/>
-          </w:tcPr>
-          <w:p>
-            <w:pPr>
-              <w:spacing w:after="0" w:line="240" w:lineRule="auto"/>
-              <w:jc w:val="center"/>
-              <w:rPr>
-                <w:rFonts w:eastAsia="Times New Roman" w:cs="Times New Roman"/>
-                <w:b/>
-                <w:bCs/>
-                <w:color w:val="000000"/>
-                <w:kern w:val="0"/>
-                <w14:ligatures w14:val="none"/>
-              </w:rPr>
-            </w:pPr>
-            <w:r>
-              <w:rPr>
-                <w:rFonts w:eastAsia="Times New Roman" w:cs="Times New Roman"/>
-                <w:b/>
-                <w:bCs/>
-                <w:color w:val="000000"/>
-                <w:kern w:val="0"/>
-                <w14:ligatures w14:val="none"/>
-              </w:rPr>
-              <w:t>Virtual Cockpit</w:t>
+          </w:tcPr>
+          <w:p>
+            <w:pPr>
+              <w:spacing w:after="0" w:line="240" w:lineRule="auto"/>
+              <w:rPr>
+                <w:rFonts w:eastAsia="Times New Roman" w:cs="Times New Roman"/>
+                <w:color w:val="000000"/>
+                <w:kern w:val="0"/>
+                <w14:ligatures w14:val="none"/>
+              </w:rPr>
+            </w:pPr>
+            <w:r>
+              <w:rPr>
+                <w:rFonts w:eastAsia="Times New Roman" w:cs="Times New Roman"/>
+                <w:color w:val="000000"/>
+                <w:kern w:val="0"/>
+                <w14:ligatures w14:val="none"/>
+              </w:rPr>
+              <w:t>Ctrl+Alt+S</w:t>
+            </w:r>
+          </w:p>
+        </w:tc>
+        <w:tc>
+          <w:tcPr>
+            <w:tcW w:w="3319" w:type="pct"/>
+            <w:tcBorders>
+              <w:top w:val="nil"/>
+              <w:left w:val="nil"/>
+              <w:bottom w:val="single" w:sz="4" w:space="0" w:color="auto"/>
+              <w:right w:val="single" w:sz="4" w:space="0" w:color="auto"/>
+            </w:tcBorders>
+            <w:noWrap/>
+            <w:vAlign w:val="bottom"/>
+          </w:tcPr>
+          <w:p>
+            <w:pPr>
+              <w:spacing w:after="0" w:line="240" w:lineRule="auto"/>
+              <w:rPr>
+                <w:rFonts w:eastAsia="Times New Roman" w:cs="Times New Roman"/>
+                <w:color w:val="000000"/>
+                <w:kern w:val="0"/>
+                <w14:ligatures w14:val="none"/>
+              </w:rPr>
+            </w:pPr>
+            <w:r>
+              <w:rPr>
+                <w:rFonts w:eastAsia="Times New Roman" w:cs="Times New Roman"/>
+                <w:color w:val="000000"/>
+                <w:kern w:val="0"/>
+                <w14:ligatures w14:val="none"/>
+              </w:rPr>
+              <w:t>Generate Mission Time-Stamped Quicksave</w:t>
             </w:r>
           </w:p>
         </w:tc>
@@ -3227,36 +3104,26 @@
         <w:tc>
           <w:tcPr>
             <w:tcW w:w="1681" w:type="pct"/>
-            <w:gridSpan w:val="2"/>
-            <w:tcBorders>
-              <w:top w:val="nil"/>
-              <w:left w:val="single" w:sz="4" w:space="0" w:color="auto"/>
-              <w:bottom w:val="single" w:sz="4" w:space="0" w:color="auto"/>
-              <w:right w:val="single" w:sz="4" w:space="0" w:color="auto"/>
-            </w:tcBorders>
-            <w:noWrap/>
-            <w:vAlign w:val="bottom"/>
-            <w:hideMark/>
-          </w:tcPr>
-          <w:p>
-            <w:pPr>
-              <w:spacing w:after="0" w:line="240" w:lineRule="auto"/>
-              <w:rPr>
-                <w:rFonts w:eastAsia="Times New Roman" w:cs="Times New Roman"/>
-                <w:color w:val="000000"/>
-                <w:kern w:val="0"/>
-                <w14:ligatures w14:val="none"/>
-              </w:rPr>
-            </w:pPr>
-            <w:r>
-              <w:rPr>
-                <w:rFonts w:eastAsia="Times New Roman" w:cs="Times New Roman"/>
-                <w:color w:val="000000"/>
-                <w:kern w:val="0"/>
-                <w14:ligatures w14:val="none"/>
-              </w:rPr>
-              <w:t>Arrow keys</w:t>
-            </w:r>
+            <w:tcBorders>
+              <w:top w:val="nil"/>
+              <w:left w:val="nil"/>
+              <w:bottom w:val="nil"/>
+              <w:right w:val="nil"/>
+            </w:tcBorders>
+            <w:noWrap/>
+            <w:vAlign w:val="bottom"/>
+            <w:hideMark/>
+          </w:tcPr>
+          <w:p>
+            <w:pPr>
+              <w:spacing w:after="0" w:line="240" w:lineRule="auto"/>
+              <w:rPr>
+                <w:rFonts w:eastAsia="Times New Roman" w:cs="Times New Roman"/>
+                <w:color w:val="000000"/>
+                <w:kern w:val="0"/>
+                <w14:ligatures w14:val="none"/>
+              </w:rPr>
+            </w:pPr>
           </w:p>
         </w:tc>
         <w:tc>
@@ -3265,41 +3132,24 @@
             <w:tcBorders>
               <w:top w:val="nil"/>
               <w:left w:val="nil"/>
-              <w:bottom w:val="single" w:sz="4" w:space="0" w:color="auto"/>
-              <w:right w:val="single" w:sz="4" w:space="0" w:color="auto"/>
-            </w:tcBorders>
-            <w:noWrap/>
-            <w:vAlign w:val="bottom"/>
-            <w:hideMark/>
-          </w:tcPr>
-          <w:p>
-            <w:pPr>
-              <w:spacing w:after="0" w:line="240" w:lineRule="auto"/>
-              <w:rPr>
-                <w:rFonts w:eastAsia="Times New Roman" w:cs="Times New Roman"/>
-                <w:color w:val="000000"/>
-                <w:kern w:val="0"/>
-                <w14:ligatures w14:val="none"/>
-              </w:rPr>
-            </w:pPr>
-            <w:r>
-              <w:rPr>
-                <w:rFonts w:eastAsia="Times New Roman" w:cs="Times New Roman"/>
-                <w:color w:val="000000"/>
-                <w:kern w:val="0"/>
-                <w14:ligatures w14:val="none"/>
-              </w:rPr>
-              <w:t>Move</w:t>
-            </w:r>
-            <w:r>
-              <w:rPr>
-                <w:rFonts w:eastAsia="Times New Roman" w:cs="Times New Roman"/>
-                <w:color w:val="000000"/>
-                <w:kern w:val="0"/>
-                <w14:ligatures w14:val="none"/>
-              </w:rPr>
-              <w:t xml:space="preserve"> Left/Right/Up/Down</w:t>
-            </w:r>
+              <w:bottom w:val="nil"/>
+              <w:right w:val="nil"/>
+            </w:tcBorders>
+            <w:noWrap/>
+            <w:vAlign w:val="bottom"/>
+            <w:hideMark/>
+          </w:tcPr>
+          <w:p>
+            <w:pPr>
+              <w:spacing w:after="0" w:line="240" w:lineRule="auto"/>
+              <w:rPr>
+                <w:rFonts w:eastAsia="Times New Roman" w:cs="Times New Roman"/>
+                <w:kern w:val="0"/>
+                <w:sz w:val="20"/>
+                <w:szCs w:val="20"/>
+                <w14:ligatures w14:val="none"/>
+              </w:rPr>
+            </w:pPr>
           </w:p>
         </w:tc>
       </w:tr>
@@ -3309,10 +3159,10 @@
         </w:trPr>
         <w:tc>
           <w:tcPr>
-            <w:tcW w:w="1681" w:type="pct"/>
+            <w:tcW w:w="5000" w:type="pct"/>
             <w:gridSpan w:val="2"/>
             <w:tcBorders>
-              <w:top w:val="nil"/>
+              <w:top w:val="single" w:sz="4" w:space="0" w:color="auto"/>
               <w:left w:val="single" w:sz="4" w:space="0" w:color="auto"/>
               <w:bottom w:val="single" w:sz="4" w:space="0" w:color="auto"/>
               <w:right w:val="single" w:sz="4" w:space="0" w:color="auto"/>
@@ -3324,64 +3174,26 @@
           <w:p>
             <w:pPr>
               <w:spacing w:after="0" w:line="240" w:lineRule="auto"/>
-              <w:rPr>
-                <w:rFonts w:eastAsia="Times New Roman" w:cs="Times New Roman"/>
-                <w:color w:val="000000"/>
-                <w:kern w:val="0"/>
-                <w14:ligatures w14:val="none"/>
-              </w:rPr>
-            </w:pPr>
-            <w:r>
-              <w:rPr>
-                <w:rFonts w:eastAsia="Times New Roman" w:cs="Times New Roman"/>
-                <w:color w:val="000000"/>
-                <w:kern w:val="0"/>
-                <w14:ligatures w14:val="none"/>
-              </w:rPr>
-              <w:t>Insert/Delete</w:t>
-            </w:r>
-          </w:p>
-        </w:tc>
-        <w:tc>
-          <w:tcPr>
-            <w:tcW w:w="3319" w:type="pct"/>
-            <w:tcBorders>
-              <w:top w:val="nil"/>
-              <w:left w:val="nil"/>
-              <w:bottom w:val="single" w:sz="4" w:space="0" w:color="auto"/>
-              <w:right w:val="single" w:sz="4" w:space="0" w:color="auto"/>
-            </w:tcBorders>
-            <w:noWrap/>
-            <w:vAlign w:val="bottom"/>
-            <w:hideMark/>
-          </w:tcPr>
-          <w:p>
-            <w:pPr>
-              <w:spacing w:after="0" w:line="240" w:lineRule="auto"/>
-              <w:rPr>
-                <w:rFonts w:eastAsia="Times New Roman" w:cs="Times New Roman"/>
-                <w:color w:val="000000"/>
-                <w:kern w:val="0"/>
-                <w14:ligatures w14:val="none"/>
-              </w:rPr>
-            </w:pPr>
-            <w:r>
-              <w:rPr>
-                <w:rFonts w:eastAsia="Times New Roman" w:cs="Times New Roman"/>
-                <w:color w:val="000000"/>
-                <w:kern w:val="0"/>
-                <w14:ligatures w14:val="none"/>
-              </w:rPr>
-              <w:t>Move</w:t>
-            </w:r>
-            <w:r>
-              <w:rPr>
-                <w:rFonts w:eastAsia="Times New Roman" w:cs="Times New Roman"/>
-                <w:color w:val="000000"/>
-                <w:kern w:val="0"/>
-                <w14:ligatures w14:val="none"/>
-              </w:rPr>
-              <w:t xml:space="preserve"> Forward/Backward</w:t>
+              <w:jc w:val="center"/>
+              <w:rPr>
+                <w:rFonts w:eastAsia="Times New Roman" w:cs="Times New Roman"/>
+                <w:b/>
+                <w:bCs/>
+                <w:color w:val="000000"/>
+                <w:kern w:val="0"/>
+                <w14:ligatures w14:val="none"/>
+              </w:rPr>
+            </w:pPr>
+            <w:r>
+              <w:rPr>
+                <w:rFonts w:eastAsia="Times New Roman" w:cs="Times New Roman"/>
+                <w:b/>
+                <w:bCs/>
+                <w:color w:val="000000"/>
+                <w:kern w:val="0"/>
+                <w14:ligatures w14:val="none"/>
+              </w:rPr>
+              <w:t>Virtual Cockpit</w:t>
             </w:r>
           </w:p>
         </w:tc>
@@ -3393,7 +3205,6 @@
         <w:tc>
           <w:tcPr>
             <w:tcW w:w="1681" w:type="pct"/>
-            <w:gridSpan w:val="2"/>
             <w:tcBorders>
               <w:top w:val="nil"/>
               <w:left w:val="single" w:sz="4" w:space="0" w:color="auto"/>
@@ -3421,7 +3232,7 @@
                 <w:kern w:val="0"/>
                 <w14:ligatures w14:val="none"/>
               </w:rPr>
-              <w:t>Shift</w:t>
+              <w:t>Arrow keys</w:t>
             </w:r>
           </w:p>
         </w:tc>
@@ -3464,7 +3275,7 @@
                 <w:kern w:val="0"/>
                 <w14:ligatures w14:val="none"/>
               </w:rPr>
-              <w:t xml:space="preserve"> Slowly</w:t>
+              <w:t xml:space="preserve"> Left/Right/Up/Down</w:t>
             </w:r>
           </w:p>
         </w:tc>
@@ -3476,7 +3287,6 @@
         <w:tc>
           <w:tcPr>
             <w:tcW w:w="1681" w:type="pct"/>
-            <w:gridSpan w:val="2"/>
             <w:tcBorders>
               <w:top w:val="nil"/>
               <w:left w:val="single" w:sz="4" w:space="0" w:color="auto"/>
@@ -3485,25 +3295,26 @@
             </w:tcBorders>
             <w:noWrap/>
             <w:vAlign w:val="bottom"/>
-          </w:tcPr>
-          <w:p>
-            <w:pPr>
-              <w:spacing w:after="0" w:line="240" w:lineRule="auto"/>
-              <w:rPr>
-                <w:rFonts w:eastAsia="Times New Roman" w:cs="Times New Roman"/>
-                <w:color w:val="000000"/>
-                <w:kern w:val="0"/>
-                <w14:ligatures w14:val="none"/>
-              </w:rPr>
-            </w:pPr>
-            <w:r>
-              <w:rPr>
-                <w:rFonts w:eastAsia="Times New Roman" w:cs="Times New Roman"/>
-                <w:color w:val="000000"/>
-                <w:kern w:val="0"/>
-                <w14:ligatures w14:val="none"/>
-              </w:rPr>
-              <w:t>F</w:t>
+            <w:hideMark/>
+          </w:tcPr>
+          <w:p>
+            <w:pPr>
+              <w:spacing w:after="0" w:line="240" w:lineRule="auto"/>
+              <w:rPr>
+                <w:rFonts w:eastAsia="Times New Roman" w:cs="Times New Roman"/>
+                <w:color w:val="000000"/>
+                <w:kern w:val="0"/>
+                <w14:ligatures w14:val="none"/>
+              </w:rPr>
+            </w:pPr>
+            <w:r>
+              <w:rPr>
+                <w:rFonts w:eastAsia="Times New Roman" w:cs="Times New Roman"/>
+                <w:color w:val="000000"/>
+                <w:kern w:val="0"/>
+                <w14:ligatures w14:val="none"/>
+              </w:rPr>
+              <w:t>Insert/Delete</w:t>
             </w:r>
           </w:p>
         </w:tc>
@@ -3518,25 +3329,35 @@
             </w:tcBorders>
             <w:noWrap/>
             <w:vAlign w:val="bottom"/>
-          </w:tcPr>
-          <w:p>
-            <w:pPr>
-              <w:spacing w:after="0" w:line="240" w:lineRule="auto"/>
-              <w:rPr>
-                <w:rFonts w:eastAsia="Times New Roman" w:cs="Times New Roman"/>
-                <w:color w:val="000000"/>
-                <w:kern w:val="0"/>
-                <w14:ligatures w14:val="none"/>
-              </w:rPr>
-            </w:pPr>
-            <w:r>
-              <w:rPr>
-                <w:rFonts w:eastAsia="Times New Roman" w:cs="Times New Roman"/>
-                <w:color w:val="000000"/>
-                <w:kern w:val="0"/>
-                <w14:ligatures w14:val="none"/>
-              </w:rPr>
-              <w:t>Enable/Disable Flashlight</w:t>
+            <w:hideMark/>
+          </w:tcPr>
+          <w:p>
+            <w:pPr>
+              <w:spacing w:after="0" w:line="240" w:lineRule="auto"/>
+              <w:rPr>
+                <w:rFonts w:eastAsia="Times New Roman" w:cs="Times New Roman"/>
+                <w:color w:val="000000"/>
+                <w:kern w:val="0"/>
+                <w14:ligatures w14:val="none"/>
+              </w:rPr>
+            </w:pPr>
+            <w:r>
+              <w:rPr>
+                <w:rFonts w:eastAsia="Times New Roman" w:cs="Times New Roman"/>
+                <w:color w:val="000000"/>
+                <w:kern w:val="0"/>
+                <w14:ligatures w14:val="none"/>
+              </w:rPr>
+              <w:t>Move</w:t>
+            </w:r>
+            <w:r>
+              <w:rPr>
+                <w:rFonts w:eastAsia="Times New Roman" w:cs="Times New Roman"/>
+                <w:color w:val="000000"/>
+                <w:kern w:val="0"/>
+                <w14:ligatures w14:val="none"/>
+              </w:rPr>
+              <w:t xml:space="preserve"> Forward/Backward</w:t>
             </w:r>
           </w:p>
         </w:tc>
@@ -3548,7 +3369,6 @@
         <w:tc>
           <w:tcPr>
             <w:tcW w:w="1681" w:type="pct"/>
-            <w:gridSpan w:val="2"/>
             <w:tcBorders>
               <w:top w:val="nil"/>
               <w:left w:val="single" w:sz="4" w:space="0" w:color="auto"/>
@@ -3557,28 +3377,27 @@
             </w:tcBorders>
             <w:noWrap/>
             <w:vAlign w:val="bottom"/>
-          </w:tcPr>
-          <w:p>
-            <w:pPr>
-              <w:spacing w:after="0" w:line="240" w:lineRule="auto"/>
-              <w:rPr>
-                <w:rFonts w:eastAsia="Times New Roman" w:cs="Times New Roman"/>
-                <w:color w:val="000000"/>
-                <w:kern w:val="0"/>
-                <w14:ligatures w14:val="none"/>
-              </w:rPr>
-            </w:pPr>
-            <w:proofErr w:type="spellStart"/>
-            <w:r>
-              <w:rPr>
-                <w:rFonts w:eastAsia="Times New Roman" w:cs="Times New Roman"/>
-                <w:color w:val="000000"/>
-                <w:kern w:val="0"/>
-                <w14:ligatures w14:val="none"/>
-              </w:rPr>
-              <w:t>Ctrl+H</w:t>
-            </w:r>
-            <w:proofErr w:type="spellEnd"/>
+            <w:hideMark/>
+          </w:tcPr>
+          <w:p>
+            <w:pPr>
+              <w:spacing w:after="0" w:line="240" w:lineRule="auto"/>
+              <w:rPr>
+                <w:rFonts w:eastAsia="Times New Roman" w:cs="Times New Roman"/>
+                <w:color w:val="000000"/>
+                <w:kern w:val="0"/>
+                <w14:ligatures w14:val="none"/>
+              </w:rPr>
+            </w:pPr>
+            <w:r>
+              <w:rPr>
+                <w:rFonts w:eastAsia="Times New Roman" w:cs="Times New Roman"/>
+                <w:color w:val="000000"/>
+                <w:kern w:val="0"/>
+                <w14:ligatures w14:val="none"/>
+              </w:rPr>
+              <w:t>Shift</w:t>
+            </w:r>
           </w:p>
         </w:tc>
         <w:tc>
@@ -3592,25 +3411,35 @@
             </w:tcBorders>
             <w:noWrap/>
             <w:vAlign w:val="bottom"/>
-          </w:tcPr>
-          <w:p>
-            <w:pPr>
-              <w:spacing w:after="0" w:line="240" w:lineRule="auto"/>
-              <w:rPr>
-                <w:rFonts w:eastAsia="Times New Roman" w:cs="Times New Roman"/>
-                <w:color w:val="000000"/>
-                <w:kern w:val="0"/>
-                <w14:ligatures w14:val="none"/>
-              </w:rPr>
-            </w:pPr>
-            <w:r>
-              <w:rPr>
-                <w:rFonts w:eastAsia="Times New Roman" w:cs="Times New Roman"/>
-                <w:color w:val="000000"/>
-                <w:kern w:val="0"/>
-                <w14:ligatures w14:val="none"/>
-              </w:rPr>
-              <w:t>Toggle Cue Card Arrows</w:t>
+            <w:hideMark/>
+          </w:tcPr>
+          <w:p>
+            <w:pPr>
+              <w:spacing w:after="0" w:line="240" w:lineRule="auto"/>
+              <w:rPr>
+                <w:rFonts w:eastAsia="Times New Roman" w:cs="Times New Roman"/>
+                <w:color w:val="000000"/>
+                <w:kern w:val="0"/>
+                <w14:ligatures w14:val="none"/>
+              </w:rPr>
+            </w:pPr>
+            <w:r>
+              <w:rPr>
+                <w:rFonts w:eastAsia="Times New Roman" w:cs="Times New Roman"/>
+                <w:color w:val="000000"/>
+                <w:kern w:val="0"/>
+                <w14:ligatures w14:val="none"/>
+              </w:rPr>
+              <w:t>Move</w:t>
+            </w:r>
+            <w:r>
+              <w:rPr>
+                <w:rFonts w:eastAsia="Times New Roman" w:cs="Times New Roman"/>
+                <w:color w:val="000000"/>
+                <w:kern w:val="0"/>
+                <w14:ligatures w14:val="none"/>
+              </w:rPr>
+              <w:t xml:space="preserve"> Slowly</w:t>
             </w:r>
           </w:p>
         </w:tc>
@@ -3622,53 +3451,67 @@
         <w:tc>
           <w:tcPr>
             <w:tcW w:w="1681" w:type="pct"/>
-            <w:gridSpan w:val="2"/>
+            <w:tcBorders>
+              <w:top w:val="nil"/>
+              <w:left w:val="single" w:sz="4" w:space="0" w:color="auto"/>
+              <w:bottom w:val="single" w:sz="4" w:space="0" w:color="auto"/>
+              <w:right w:val="single" w:sz="4" w:space="0" w:color="auto"/>
+            </w:tcBorders>
+            <w:noWrap/>
+            <w:vAlign w:val="bottom"/>
+          </w:tcPr>
+          <w:p>
+            <w:pPr>
+              <w:spacing w:after="0" w:line="240" w:lineRule="auto"/>
+              <w:rPr>
+                <w:rFonts w:eastAsia="Times New Roman" w:cs="Times New Roman"/>
+                <w:color w:val="000000"/>
+                <w:kern w:val="0"/>
+                <w14:ligatures w14:val="none"/>
+              </w:rPr>
+            </w:pPr>
+            <w:r>
+              <w:rPr>
+                <w:rFonts w:eastAsia="Times New Roman" w:cs="Times New Roman"/>
+                <w:color w:val="000000"/>
+                <w:kern w:val="0"/>
+                <w14:ligatures w14:val="none"/>
+              </w:rPr>
+              <w:t>F</w:t>
+            </w:r>
+          </w:p>
+        </w:tc>
+        <w:tc>
+          <w:tcPr>
+            <w:tcW w:w="3319" w:type="pct"/>
             <w:tcBorders>
               <w:top w:val="nil"/>
               <w:left w:val="nil"/>
-              <w:bottom w:val="nil"/>
-              <w:right w:val="nil"/>
-            </w:tcBorders>
-            <w:noWrap/>
-            <w:vAlign w:val="bottom"/>
-            <w:hideMark/>
-          </w:tcPr>
-          <w:p>
-            <w:pPr>
-              <w:spacing w:after="0" w:line="240" w:lineRule="auto"/>
-              <w:rPr>
-                <w:rFonts w:eastAsia="Times New Roman" w:cs="Times New Roman"/>
-                <w:color w:val="000000"/>
-                <w:kern w:val="0"/>
-                <w14:ligatures w14:val="none"/>
-              </w:rPr>
-            </w:pPr>
-          </w:p>
-        </w:tc>
-        <w:tc>
-          <w:tcPr>
-            <w:tcW w:w="3319" w:type="pct"/>
-            <w:tcBorders>
-              <w:top w:val="nil"/>
-              <w:left w:val="nil"/>
-              <w:bottom w:val="nil"/>
-              <w:right w:val="nil"/>
-            </w:tcBorders>
-            <w:noWrap/>
-            <w:vAlign w:val="bottom"/>
-            <w:hideMark/>
-          </w:tcPr>
-          <w:p>
-            <w:pPr>
-              <w:spacing w:after="0" w:line="240" w:lineRule="auto"/>
-              <w:rPr>
-                <w:rFonts w:eastAsia="Times New Roman" w:cs="Times New Roman"/>
-                <w:kern w:val="0"/>
-                <w:sz w:val="20"/>
-                <w:szCs w:val="20"/>
-                <w14:ligatures w14:val="none"/>
-              </w:rPr>
-            </w:pPr>
+              <w:bottom w:val="single" w:sz="4" w:space="0" w:color="auto"/>
+              <w:right w:val="single" w:sz="4" w:space="0" w:color="auto"/>
+            </w:tcBorders>
+            <w:noWrap/>
+            <w:vAlign w:val="bottom"/>
+          </w:tcPr>
+          <w:p>
+            <w:pPr>
+              <w:spacing w:after="0" w:line="240" w:lineRule="auto"/>
+              <w:rPr>
+                <w:rFonts w:eastAsia="Times New Roman" w:cs="Times New Roman"/>
+                <w:color w:val="000000"/>
+                <w:kern w:val="0"/>
+                <w14:ligatures w14:val="none"/>
+              </w:rPr>
+            </w:pPr>
+            <w:r>
+              <w:rPr>
+                <w:rFonts w:eastAsia="Times New Roman" w:cs="Times New Roman"/>
+                <w:color w:val="000000"/>
+                <w:kern w:val="0"/>
+                <w14:ligatures w14:val="none"/>
+              </w:rPr>
+              <w:t>Enable/Disable Flashlight</w:t>
+            </w:r>
           </w:p>
         </w:tc>
       </w:tr>
@@ -3678,41 +3521,67 @@
         </w:trPr>
         <w:tc>
           <w:tcPr>
-            <w:tcW w:w="5000" w:type="pct"/>
-            <w:gridSpan w:val="3"/>
-            <w:tcBorders>
-              <w:top w:val="single" w:sz="4" w:space="0" w:color="auto"/>
+            <w:tcW w:w="1681" w:type="pct"/>
+            <w:tcBorders>
+              <w:top w:val="nil"/>
               <w:left w:val="single" w:sz="4" w:space="0" w:color="auto"/>
               <w:bottom w:val="single" w:sz="4" w:space="0" w:color="auto"/>
               <w:right w:val="single" w:sz="4" w:space="0" w:color="auto"/>
             </w:tcBorders>
             <w:noWrap/>
             <w:vAlign w:val="bottom"/>
-            <w:hideMark/>
-          </w:tcPr>
-          <w:p>
-            <w:pPr>
-              <w:spacing w:after="0" w:line="240" w:lineRule="auto"/>
-              <w:jc w:val="center"/>
-              <w:rPr>
-                <w:rFonts w:eastAsia="Times New Roman" w:cs="Times New Roman"/>
-                <w:b/>
-                <w:bCs/>
-                <w:color w:val="000000"/>
-                <w:kern w:val="0"/>
-                <w14:ligatures w14:val="none"/>
-              </w:rPr>
-            </w:pPr>
-            <w:r>
-              <w:rPr>
-                <w:rFonts w:eastAsia="Times New Roman" w:cs="Times New Roman"/>
-                <w:b/>
-                <w:bCs/>
-                <w:color w:val="000000"/>
-                <w:kern w:val="0"/>
-                <w14:ligatures w14:val="none"/>
-              </w:rPr>
-              <w:t>Spacecraft Rotation</w:t>
+          </w:tcPr>
+          <w:p>
+            <w:pPr>
+              <w:spacing w:after="0" w:line="240" w:lineRule="auto"/>
+              <w:rPr>
+                <w:rFonts w:eastAsia="Times New Roman" w:cs="Times New Roman"/>
+                <w:color w:val="000000"/>
+                <w:kern w:val="0"/>
+                <w14:ligatures w14:val="none"/>
+              </w:rPr>
+            </w:pPr>
+            <w:r>
+              <w:rPr>
+                <w:rFonts w:eastAsia="Times New Roman" w:cs="Times New Roman"/>
+                <w:color w:val="000000"/>
+                <w:kern w:val="0"/>
+                <w14:ligatures w14:val="none"/>
+              </w:rPr>
+              <w:t>Ctrl+H</w:t>
+            </w:r>
+          </w:p>
+        </w:tc>
+        <w:tc>
+          <w:tcPr>
+            <w:tcW w:w="3319" w:type="pct"/>
+            <w:tcBorders>
+              <w:top w:val="nil"/>
+              <w:left w:val="nil"/>
+              <w:bottom w:val="single" w:sz="4" w:space="0" w:color="auto"/>
+              <w:right w:val="single" w:sz="4" w:space="0" w:color="auto"/>
+            </w:tcBorders>
+            <w:noWrap/>
+            <w:vAlign w:val="bottom"/>
+          </w:tcPr>
+          <w:p>
+            <w:pPr>
+              <w:spacing w:after="0" w:line="240" w:lineRule="auto"/>
+              <w:rPr>
+                <w:rFonts w:eastAsia="Times New Roman" w:cs="Times New Roman"/>
+                <w:color w:val="000000"/>
+                <w:kern w:val="0"/>
+                <w14:ligatures w14:val="none"/>
+              </w:rPr>
+            </w:pPr>
+            <w:r>
+              <w:rPr>
+                <w:rFonts w:eastAsia="Times New Roman" w:cs="Times New Roman"/>
+                <w:color w:val="000000"/>
+                <w:kern w:val="0"/>
+                <w14:ligatures w14:val="none"/>
+              </w:rPr>
+              <w:t>Toggle Cue Card Arrows</w:t>
             </w:r>
           </w:p>
         </w:tc>
@@ -3724,36 +3593,26 @@
         <w:tc>
           <w:tcPr>
             <w:tcW w:w="1681" w:type="pct"/>
-            <w:gridSpan w:val="2"/>
-            <w:tcBorders>
-              <w:top w:val="nil"/>
-              <w:left w:val="single" w:sz="4" w:space="0" w:color="auto"/>
-              <w:bottom w:val="single" w:sz="4" w:space="0" w:color="auto"/>
-              <w:right w:val="single" w:sz="4" w:space="0" w:color="auto"/>
-            </w:tcBorders>
-            <w:noWrap/>
-            <w:vAlign w:val="bottom"/>
-            <w:hideMark/>
-          </w:tcPr>
-          <w:p>
-            <w:pPr>
-              <w:spacing w:after="0" w:line="240" w:lineRule="auto"/>
-              <w:rPr>
-                <w:rFonts w:eastAsia="Times New Roman" w:cs="Times New Roman"/>
-                <w:color w:val="000000"/>
-                <w:kern w:val="0"/>
-                <w14:ligatures w14:val="none"/>
-              </w:rPr>
-            </w:pPr>
-            <w:r>
-              <w:rPr>
-                <w:rFonts w:eastAsia="Times New Roman" w:cs="Times New Roman"/>
-                <w:color w:val="000000"/>
-                <w:kern w:val="0"/>
-                <w14:ligatures w14:val="none"/>
-              </w:rPr>
-              <w:t>2 (Numpad)</w:t>
-            </w:r>
+            <w:tcBorders>
+              <w:top w:val="nil"/>
+              <w:left w:val="nil"/>
+              <w:bottom w:val="nil"/>
+              <w:right w:val="nil"/>
+            </w:tcBorders>
+            <w:noWrap/>
+            <w:vAlign w:val="bottom"/>
+            <w:hideMark/>
+          </w:tcPr>
+          <w:p>
+            <w:pPr>
+              <w:spacing w:after="0" w:line="240" w:lineRule="auto"/>
+              <w:rPr>
+                <w:rFonts w:eastAsia="Times New Roman" w:cs="Times New Roman"/>
+                <w:color w:val="000000"/>
+                <w:kern w:val="0"/>
+                <w14:ligatures w14:val="none"/>
+              </w:rPr>
+            </w:pPr>
           </w:p>
         </w:tc>
         <w:tc>
@@ -3762,32 +3621,24 @@
             <w:tcBorders>
               <w:top w:val="nil"/>
               <w:left w:val="nil"/>
-              <w:bottom w:val="single" w:sz="4" w:space="0" w:color="auto"/>
-              <w:right w:val="single" w:sz="4" w:space="0" w:color="auto"/>
-            </w:tcBorders>
-            <w:noWrap/>
-            <w:vAlign w:val="bottom"/>
-            <w:hideMark/>
-          </w:tcPr>
-          <w:p>
-            <w:pPr>
-              <w:spacing w:after="0" w:line="240" w:lineRule="auto"/>
-              <w:rPr>
-                <w:rFonts w:eastAsia="Times New Roman" w:cs="Times New Roman"/>
-                <w:color w:val="000000"/>
-                <w:kern w:val="0"/>
-                <w14:ligatures w14:val="none"/>
-              </w:rPr>
-            </w:pPr>
-            <w:r>
-              <w:rPr>
-                <w:rFonts w:eastAsia="Times New Roman" w:cs="Times New Roman"/>
-                <w:color w:val="000000"/>
-                <w:kern w:val="0"/>
-                <w14:ligatures w14:val="none"/>
-              </w:rPr>
-              <w:t>Pitch Up</w:t>
-            </w:r>
+              <w:bottom w:val="nil"/>
+              <w:right w:val="nil"/>
+            </w:tcBorders>
+            <w:noWrap/>
+            <w:vAlign w:val="bottom"/>
+            <w:hideMark/>
+          </w:tcPr>
+          <w:p>
+            <w:pPr>
+              <w:spacing w:after="0" w:line="240" w:lineRule="auto"/>
+              <w:rPr>
+                <w:rFonts w:eastAsia="Times New Roman" w:cs="Times New Roman"/>
+                <w:kern w:val="0"/>
+                <w:sz w:val="20"/>
+                <w:szCs w:val="20"/>
+                <w14:ligatures w14:val="none"/>
+              </w:rPr>
+            </w:pPr>
           </w:p>
         </w:tc>
       </w:tr>
@@ -3797,10 +3648,10 @@
         </w:trPr>
         <w:tc>
           <w:tcPr>
-            <w:tcW w:w="1681" w:type="pct"/>
+            <w:tcW w:w="5000" w:type="pct"/>
             <w:gridSpan w:val="2"/>
             <w:tcBorders>
-              <w:top w:val="nil"/>
+              <w:top w:val="single" w:sz="4" w:space="0" w:color="auto"/>
               <w:left w:val="single" w:sz="4" w:space="0" w:color="auto"/>
               <w:bottom w:val="single" w:sz="4" w:space="0" w:color="auto"/>
               <w:right w:val="single" w:sz="4" w:space="0" w:color="auto"/>
@@ -3812,55 +3663,26 @@
           <w:p>
             <w:pPr>
               <w:spacing w:after="0" w:line="240" w:lineRule="auto"/>
-              <w:rPr>
-                <w:rFonts w:eastAsia="Times New Roman" w:cs="Times New Roman"/>
-                <w:color w:val="000000"/>
-                <w:kern w:val="0"/>
-                <w14:ligatures w14:val="none"/>
-              </w:rPr>
-            </w:pPr>
-            <w:r>
-              <w:rPr>
-                <w:rFonts w:eastAsia="Times New Roman" w:cs="Times New Roman"/>
-                <w:color w:val="000000"/>
-                <w:kern w:val="0"/>
-                <w14:ligatures w14:val="none"/>
-              </w:rPr>
-              <w:t>8 (Numpad)</w:t>
-            </w:r>
-          </w:p>
-        </w:tc>
-        <w:tc>
-          <w:tcPr>
-            <w:tcW w:w="3319" w:type="pct"/>
-            <w:tcBorders>
-              <w:top w:val="nil"/>
-              <w:left w:val="nil"/>
-              <w:bottom w:val="single" w:sz="4" w:space="0" w:color="auto"/>
-              <w:right w:val="single" w:sz="4" w:space="0" w:color="auto"/>
-            </w:tcBorders>
-            <w:noWrap/>
-            <w:vAlign w:val="bottom"/>
-            <w:hideMark/>
-          </w:tcPr>
-          <w:p>
-            <w:pPr>
-              <w:spacing w:after="0" w:line="240" w:lineRule="auto"/>
-              <w:rPr>
-                <w:rFonts w:eastAsia="Times New Roman" w:cs="Times New Roman"/>
-                <w:color w:val="000000"/>
-                <w:kern w:val="0"/>
-                <w14:ligatures w14:val="none"/>
-              </w:rPr>
-            </w:pPr>
-            <w:r>
-              <w:rPr>
-                <w:rFonts w:eastAsia="Times New Roman" w:cs="Times New Roman"/>
-                <w:color w:val="000000"/>
-                <w:kern w:val="0"/>
-                <w14:ligatures w14:val="none"/>
-              </w:rPr>
-              <w:t>Pitch Down</w:t>
+              <w:jc w:val="center"/>
+              <w:rPr>
+                <w:rFonts w:eastAsia="Times New Roman" w:cs="Times New Roman"/>
+                <w:b/>
+                <w:bCs/>
+                <w:color w:val="000000"/>
+                <w:kern w:val="0"/>
+                <w14:ligatures w14:val="none"/>
+              </w:rPr>
+            </w:pPr>
+            <w:r>
+              <w:rPr>
+                <w:rFonts w:eastAsia="Times New Roman" w:cs="Times New Roman"/>
+                <w:b/>
+                <w:bCs/>
+                <w:color w:val="000000"/>
+                <w:kern w:val="0"/>
+                <w14:ligatures w14:val="none"/>
+              </w:rPr>
+              <w:t>Spacecraft Rotation</w:t>
             </w:r>
           </w:p>
         </w:tc>
@@ -3872,7 +3694,6 @@
         <w:tc>
           <w:tcPr>
             <w:tcW w:w="1681" w:type="pct"/>
-            <w:gridSpan w:val="2"/>
             <w:tcBorders>
               <w:top w:val="nil"/>
               <w:left w:val="single" w:sz="4" w:space="0" w:color="auto"/>
@@ -3900,7 +3721,7 @@
                 <w:kern w:val="0"/>
                 <w14:ligatures w14:val="none"/>
               </w:rPr>
-              <w:t>1 (Numpad)</w:t>
+              <w:t>2 (Numpad)</w:t>
             </w:r>
           </w:p>
         </w:tc>
@@ -3934,7 +3755,7 @@
                 <w:kern w:val="0"/>
                 <w14:ligatures w14:val="none"/>
               </w:rPr>
-              <w:t>Yaw Left</w:t>
+              <w:t>Pitch Up</w:t>
             </w:r>
           </w:p>
         </w:tc>
@@ -3946,7 +3767,6 @@
         <w:tc>
           <w:tcPr>
             <w:tcW w:w="1681" w:type="pct"/>
-            <w:gridSpan w:val="2"/>
             <w:tcBorders>
               <w:top w:val="nil"/>
               <w:left w:val="single" w:sz="4" w:space="0" w:color="auto"/>
@@ -3974,7 +3794,7 @@
                 <w:kern w:val="0"/>
                 <w14:ligatures w14:val="none"/>
               </w:rPr>
-              <w:t>3 (Numpad)</w:t>
+              <w:t>8 (Numpad)</w:t>
             </w:r>
           </w:p>
         </w:tc>
@@ -4008,7 +3828,7 @@
                 <w:kern w:val="0"/>
                 <w14:ligatures w14:val="none"/>
               </w:rPr>
-              <w:t>Yaw Right</w:t>
+              <w:t>Pitch Down</w:t>
             </w:r>
           </w:p>
         </w:tc>
@@ -4020,7 +3840,6 @@
         <w:tc>
           <w:tcPr>
             <w:tcW w:w="1681" w:type="pct"/>
-            <w:gridSpan w:val="2"/>
             <w:tcBorders>
               <w:top w:val="nil"/>
               <w:left w:val="single" w:sz="4" w:space="0" w:color="auto"/>
@@ -4048,7 +3867,7 @@
                 <w:kern w:val="0"/>
                 <w14:ligatures w14:val="none"/>
               </w:rPr>
-              <w:t>4 (Numpad)</w:t>
+              <w:t>1 (Numpad)</w:t>
             </w:r>
           </w:p>
         </w:tc>
@@ -4082,7 +3901,7 @@
                 <w:kern w:val="0"/>
                 <w14:ligatures w14:val="none"/>
               </w:rPr>
-              <w:t>Roll Left</w:t>
+              <w:t>Yaw Left</w:t>
             </w:r>
           </w:p>
         </w:tc>
@@ -4094,7 +3913,6 @@
         <w:tc>
           <w:tcPr>
             <w:tcW w:w="1681" w:type="pct"/>
-            <w:gridSpan w:val="2"/>
             <w:tcBorders>
               <w:top w:val="nil"/>
               <w:left w:val="single" w:sz="4" w:space="0" w:color="auto"/>
@@ -4122,7 +3940,7 @@
                 <w:kern w:val="0"/>
                 <w14:ligatures w14:val="none"/>
               </w:rPr>
-              <w:t>6 (Numpad)</w:t>
+              <w:t>3 (Numpad)</w:t>
             </w:r>
           </w:p>
         </w:tc>
@@ -4156,7 +3974,7 @@
                 <w:kern w:val="0"/>
                 <w14:ligatures w14:val="none"/>
               </w:rPr>
-              <w:t>Roll Right</w:t>
+              <w:t>Yaw Right</w:t>
             </w:r>
           </w:p>
         </w:tc>
@@ -4168,7 +3986,6 @@
         <w:tc>
           <w:tcPr>
             <w:tcW w:w="1681" w:type="pct"/>
-            <w:gridSpan w:val="2"/>
             <w:tcBorders>
               <w:top w:val="nil"/>
               <w:left w:val="single" w:sz="4" w:space="0" w:color="auto"/>
@@ -4177,28 +3994,27 @@
             </w:tcBorders>
             <w:noWrap/>
             <w:vAlign w:val="bottom"/>
-          </w:tcPr>
-          <w:p>
-            <w:pPr>
-              <w:spacing w:after="0" w:line="240" w:lineRule="auto"/>
-              <w:rPr>
-                <w:rFonts w:eastAsia="Times New Roman" w:cs="Times New Roman"/>
-                <w:color w:val="000000"/>
-                <w:kern w:val="0"/>
-                <w14:ligatures w14:val="none"/>
-              </w:rPr>
-            </w:pPr>
-            <w:proofErr w:type="spellStart"/>
-            <w:r>
-              <w:rPr>
-                <w:rFonts w:eastAsia="Times New Roman" w:cs="Times New Roman"/>
-                <w:color w:val="000000"/>
-                <w:kern w:val="0"/>
-                <w14:ligatures w14:val="none"/>
-              </w:rPr>
-              <w:t>Alt+Numpad</w:t>
-            </w:r>
-            <w:proofErr w:type="spellEnd"/>
+            <w:hideMark/>
+          </w:tcPr>
+          <w:p>
+            <w:pPr>
+              <w:spacing w:after="0" w:line="240" w:lineRule="auto"/>
+              <w:rPr>
+                <w:rFonts w:eastAsia="Times New Roman" w:cs="Times New Roman"/>
+                <w:color w:val="000000"/>
+                <w:kern w:val="0"/>
+                <w14:ligatures w14:val="none"/>
+              </w:rPr>
+            </w:pPr>
+            <w:r>
+              <w:rPr>
+                <w:rFonts w:eastAsia="Times New Roman" w:cs="Times New Roman"/>
+                <w:color w:val="000000"/>
+                <w:kern w:val="0"/>
+                <w14:ligatures w14:val="none"/>
+              </w:rPr>
+              <w:t>4 (Numpad)</w:t>
+            </w:r>
           </w:p>
         </w:tc>
         <w:tc>
@@ -4212,28 +4028,27 @@
             </w:tcBorders>
             <w:noWrap/>
             <w:vAlign w:val="bottom"/>
-          </w:tcPr>
-          <w:p>
-            <w:pPr>
-              <w:spacing w:after="0" w:line="240" w:lineRule="auto"/>
-              <w:rPr>
-                <w:rFonts w:eastAsia="Times New Roman" w:cs="Times New Roman"/>
-                <w:color w:val="000000"/>
-                <w:kern w:val="0"/>
-                <w14:ligatures w14:val="none"/>
-              </w:rPr>
-            </w:pPr>
-            <w:proofErr w:type="spellStart"/>
-            <w:r>
-              <w:rPr>
-                <w:rFonts w:eastAsia="Times New Roman" w:cs="Times New Roman"/>
-                <w:color w:val="000000"/>
-                <w:kern w:val="0"/>
-                <w14:ligatures w14:val="none"/>
-              </w:rPr>
-              <w:t>Hardover</w:t>
-            </w:r>
-            <w:proofErr w:type="spellEnd"/>
+            <w:hideMark/>
+          </w:tcPr>
+          <w:p>
+            <w:pPr>
+              <w:spacing w:after="0" w:line="240" w:lineRule="auto"/>
+              <w:rPr>
+                <w:rFonts w:eastAsia="Times New Roman" w:cs="Times New Roman"/>
+                <w:color w:val="000000"/>
+                <w:kern w:val="0"/>
+                <w14:ligatures w14:val="none"/>
+              </w:rPr>
+            </w:pPr>
+            <w:r>
+              <w:rPr>
+                <w:rFonts w:eastAsia="Times New Roman" w:cs="Times New Roman"/>
+                <w:color w:val="000000"/>
+                <w:kern w:val="0"/>
+                <w14:ligatures w14:val="none"/>
+              </w:rPr>
+              <w:t>Roll Left</w:t>
+            </w:r>
           </w:p>
         </w:tc>
       </w:tr>
@@ -4244,53 +4059,69 @@
         <w:tc>
           <w:tcPr>
             <w:tcW w:w="1681" w:type="pct"/>
-            <w:gridSpan w:val="2"/>
+            <w:tcBorders>
+              <w:top w:val="nil"/>
+              <w:left w:val="single" w:sz="4" w:space="0" w:color="auto"/>
+              <w:bottom w:val="single" w:sz="4" w:space="0" w:color="auto"/>
+              <w:right w:val="single" w:sz="4" w:space="0" w:color="auto"/>
+            </w:tcBorders>
+            <w:noWrap/>
+            <w:vAlign w:val="bottom"/>
+            <w:hideMark/>
+          </w:tcPr>
+          <w:p>
+            <w:pPr>
+              <w:spacing w:after="0" w:line="240" w:lineRule="auto"/>
+              <w:rPr>
+                <w:rFonts w:eastAsia="Times New Roman" w:cs="Times New Roman"/>
+                <w:color w:val="000000"/>
+                <w:kern w:val="0"/>
+                <w14:ligatures w14:val="none"/>
+              </w:rPr>
+            </w:pPr>
+            <w:r>
+              <w:rPr>
+                <w:rFonts w:eastAsia="Times New Roman" w:cs="Times New Roman"/>
+                <w:color w:val="000000"/>
+                <w:kern w:val="0"/>
+                <w14:ligatures w14:val="none"/>
+              </w:rPr>
+              <w:t>6 (Numpad)</w:t>
+            </w:r>
+          </w:p>
+        </w:tc>
+        <w:tc>
+          <w:tcPr>
+            <w:tcW w:w="3319" w:type="pct"/>
             <w:tcBorders>
               <w:top w:val="nil"/>
               <w:left w:val="nil"/>
-              <w:bottom w:val="nil"/>
-              <w:right w:val="nil"/>
-            </w:tcBorders>
-            <w:noWrap/>
-            <w:vAlign w:val="bottom"/>
-            <w:hideMark/>
-          </w:tcPr>
-          <w:p>
-            <w:pPr>
-              <w:spacing w:after="0" w:line="240" w:lineRule="auto"/>
-              <w:rPr>
-                <w:rFonts w:eastAsia="Times New Roman" w:cs="Times New Roman"/>
-                <w:color w:val="000000"/>
-                <w:kern w:val="0"/>
-                <w14:ligatures w14:val="none"/>
-              </w:rPr>
-            </w:pPr>
-          </w:p>
-        </w:tc>
-        <w:tc>
-          <w:tcPr>
-            <w:tcW w:w="3319" w:type="pct"/>
-            <w:tcBorders>
-              <w:top w:val="nil"/>
-              <w:left w:val="nil"/>
-              <w:bottom w:val="nil"/>
-              <w:right w:val="nil"/>
-            </w:tcBorders>
-            <w:noWrap/>
-            <w:vAlign w:val="bottom"/>
-            <w:hideMark/>
-          </w:tcPr>
-          <w:p>
-            <w:pPr>
-              <w:spacing w:after="0" w:line="240" w:lineRule="auto"/>
-              <w:rPr>
-                <w:rFonts w:eastAsia="Times New Roman" w:cs="Times New Roman"/>
-                <w:kern w:val="0"/>
-                <w:sz w:val="20"/>
-                <w:szCs w:val="20"/>
-                <w14:ligatures w14:val="none"/>
-              </w:rPr>
-            </w:pPr>
+              <w:bottom w:val="single" w:sz="4" w:space="0" w:color="auto"/>
+              <w:right w:val="single" w:sz="4" w:space="0" w:color="auto"/>
+            </w:tcBorders>
+            <w:noWrap/>
+            <w:vAlign w:val="bottom"/>
+            <w:hideMark/>
+          </w:tcPr>
+          <w:p>
+            <w:pPr>
+              <w:spacing w:after="0" w:line="240" w:lineRule="auto"/>
+              <w:rPr>
+                <w:rFonts w:eastAsia="Times New Roman" w:cs="Times New Roman"/>
+                <w:color w:val="000000"/>
+                <w:kern w:val="0"/>
+                <w14:ligatures w14:val="none"/>
+              </w:rPr>
+            </w:pPr>
+            <w:r>
+              <w:rPr>
+                <w:rFonts w:eastAsia="Times New Roman" w:cs="Times New Roman"/>
+                <w:color w:val="000000"/>
+                <w:kern w:val="0"/>
+                <w14:ligatures w14:val="none"/>
+              </w:rPr>
+              <w:t>Roll Right</w:t>
+            </w:r>
           </w:p>
         </w:tc>
       </w:tr>
@@ -4300,41 +4131,67 @@
         </w:trPr>
         <w:tc>
           <w:tcPr>
-            <w:tcW w:w="5000" w:type="pct"/>
-            <w:gridSpan w:val="3"/>
-            <w:tcBorders>
-              <w:top w:val="single" w:sz="4" w:space="0" w:color="auto"/>
+            <w:tcW w:w="1681" w:type="pct"/>
+            <w:tcBorders>
+              <w:top w:val="nil"/>
               <w:left w:val="single" w:sz="4" w:space="0" w:color="auto"/>
               <w:bottom w:val="single" w:sz="4" w:space="0" w:color="auto"/>
               <w:right w:val="single" w:sz="4" w:space="0" w:color="auto"/>
             </w:tcBorders>
             <w:noWrap/>
             <w:vAlign w:val="bottom"/>
-            <w:hideMark/>
-          </w:tcPr>
-          <w:p>
-            <w:pPr>
-              <w:spacing w:after="0" w:line="240" w:lineRule="auto"/>
-              <w:jc w:val="center"/>
-              <w:rPr>
-                <w:rFonts w:eastAsia="Times New Roman" w:cs="Times New Roman"/>
-                <w:b/>
-                <w:bCs/>
-                <w:color w:val="000000"/>
-                <w:kern w:val="0"/>
-                <w14:ligatures w14:val="none"/>
-              </w:rPr>
-            </w:pPr>
-            <w:r>
-              <w:rPr>
-                <w:rFonts w:eastAsia="Times New Roman" w:cs="Times New Roman"/>
-                <w:b/>
-                <w:bCs/>
-                <w:color w:val="000000"/>
-                <w:kern w:val="0"/>
-                <w14:ligatures w14:val="none"/>
-              </w:rPr>
-              <w:t>DSKY</w:t>
+          </w:tcPr>
+          <w:p>
+            <w:pPr>
+              <w:spacing w:after="0" w:line="240" w:lineRule="auto"/>
+              <w:rPr>
+                <w:rFonts w:eastAsia="Times New Roman" w:cs="Times New Roman"/>
+                <w:color w:val="000000"/>
+                <w:kern w:val="0"/>
+                <w14:ligatures w14:val="none"/>
+              </w:rPr>
+            </w:pPr>
+            <w:r>
+              <w:rPr>
+                <w:rFonts w:eastAsia="Times New Roman" w:cs="Times New Roman"/>
+                <w:color w:val="000000"/>
+                <w:kern w:val="0"/>
+                <w14:ligatures w14:val="none"/>
+              </w:rPr>
+              <w:t>Alt+Numpad</w:t>
+            </w:r>
+          </w:p>
+        </w:tc>
+        <w:tc>
+          <w:tcPr>
+            <w:tcW w:w="3319" w:type="pct"/>
+            <w:tcBorders>
+              <w:top w:val="nil"/>
+              <w:left w:val="nil"/>
+              <w:bottom w:val="single" w:sz="4" w:space="0" w:color="auto"/>
+              <w:right w:val="single" w:sz="4" w:space="0" w:color="auto"/>
+            </w:tcBorders>
+            <w:noWrap/>
+            <w:vAlign w:val="bottom"/>
+          </w:tcPr>
+          <w:p>
+            <w:pPr>
+              <w:spacing w:after="0" w:line="240" w:lineRule="auto"/>
+              <w:rPr>
+                <w:rFonts w:eastAsia="Times New Roman" w:cs="Times New Roman"/>
+                <w:color w:val="000000"/>
+                <w:kern w:val="0"/>
+                <w14:ligatures w14:val="none"/>
+              </w:rPr>
+            </w:pPr>
+            <w:r>
+              <w:rPr>
+                <w:rFonts w:eastAsia="Times New Roman" w:cs="Times New Roman"/>
+                <w:color w:val="000000"/>
+                <w:kern w:val="0"/>
+                <w14:ligatures w14:val="none"/>
+              </w:rPr>
+              <w:t>Hardover</w:t>
             </w:r>
           </w:p>
         </w:tc>
@@ -4346,47 +4203,26 @@
         <w:tc>
           <w:tcPr>
             <w:tcW w:w="1681" w:type="pct"/>
-            <w:gridSpan w:val="2"/>
-            <w:tcBorders>
-              <w:top w:val="nil"/>
-              <w:left w:val="single" w:sz="4" w:space="0" w:color="auto"/>
-              <w:bottom w:val="single" w:sz="4" w:space="0" w:color="auto"/>
-              <w:right w:val="single" w:sz="4" w:space="0" w:color="auto"/>
-            </w:tcBorders>
-            <w:noWrap/>
-            <w:vAlign w:val="bottom"/>
-            <w:hideMark/>
-          </w:tcPr>
-          <w:p>
-            <w:pPr>
-              <w:spacing w:after="0" w:line="240" w:lineRule="auto"/>
-              <w:rPr>
-                <w:rFonts w:eastAsia="Times New Roman" w:cs="Times New Roman"/>
-                <w:color w:val="000000"/>
-                <w:kern w:val="0"/>
-                <w14:ligatures w14:val="none"/>
-              </w:rPr>
-            </w:pPr>
-            <w:proofErr w:type="spellStart"/>
-            <w:r>
-              <w:rPr>
-                <w:rFonts w:eastAsia="Times New Roman" w:cs="Times New Roman"/>
-                <w:color w:val="000000"/>
-                <w:kern w:val="0"/>
-                <w14:ligatures w14:val="none"/>
-              </w:rPr>
-              <w:t>Shift+Decimal</w:t>
-            </w:r>
-            <w:proofErr w:type="spellEnd"/>
-            <w:r>
-              <w:rPr>
-                <w:rFonts w:eastAsia="Times New Roman" w:cs="Times New Roman"/>
-                <w:color w:val="000000"/>
-                <w:kern w:val="0"/>
-                <w14:ligatures w14:val="none"/>
-              </w:rPr>
-              <w:t xml:space="preserve"> (Numpad)</w:t>
-            </w:r>
+            <w:tcBorders>
+              <w:top w:val="nil"/>
+              <w:left w:val="nil"/>
+              <w:bottom w:val="nil"/>
+              <w:right w:val="nil"/>
+            </w:tcBorders>
+            <w:noWrap/>
+            <w:vAlign w:val="bottom"/>
+            <w:hideMark/>
+          </w:tcPr>
+          <w:p>
+            <w:pPr>
+              <w:spacing w:after="0" w:line="240" w:lineRule="auto"/>
+              <w:rPr>
+                <w:rFonts w:eastAsia="Times New Roman" w:cs="Times New Roman"/>
+                <w:color w:val="000000"/>
+                <w:kern w:val="0"/>
+                <w14:ligatures w14:val="none"/>
+              </w:rPr>
+            </w:pPr>
           </w:p>
         </w:tc>
         <w:tc>
@@ -4395,32 +4231,168 @@
             <w:tcBorders>
               <w:top w:val="nil"/>
               <w:left w:val="nil"/>
-              <w:bottom w:val="single" w:sz="4" w:space="0" w:color="auto"/>
-              <w:right w:val="single" w:sz="4" w:space="0" w:color="auto"/>
-            </w:tcBorders>
-            <w:noWrap/>
-            <w:vAlign w:val="bottom"/>
-            <w:hideMark/>
-          </w:tcPr>
-          <w:p>
-            <w:pPr>
-              <w:spacing w:after="0" w:line="240" w:lineRule="auto"/>
-              <w:rPr>
-                <w:rFonts w:eastAsia="Times New Roman" w:cs="Times New Roman"/>
-                <w:color w:val="000000"/>
-                <w:kern w:val="0"/>
-                <w14:ligatures w14:val="none"/>
-              </w:rPr>
-            </w:pPr>
-            <w:r>
-              <w:rPr>
-                <w:rFonts w:eastAsia="Times New Roman" w:cs="Times New Roman"/>
-                <w:color w:val="000000"/>
-                <w:kern w:val="0"/>
-                <w14:ligatures w14:val="none"/>
-              </w:rPr>
-              <w:t>DSKY Clear</w:t>
-            </w:r>
+              <w:bottom w:val="nil"/>
+              <w:right w:val="nil"/>
+            </w:tcBorders>
+            <w:noWrap/>
+            <w:vAlign w:val="bottom"/>
+            <w:hideMark/>
+          </w:tcPr>
+          <w:p>
+            <w:pPr>
+              <w:spacing w:after="0" w:line="240" w:lineRule="auto"/>
+              <w:rPr>
+                <w:rFonts w:eastAsia="Times New Roman" w:cs="Times New Roman"/>
+                <w:kern w:val="0"/>
+                <w:sz w:val="20"/>
+                <w:szCs w:val="20"/>
+                <w14:ligatures w14:val="none"/>
+              </w:rPr>
+            </w:pPr>
+          </w:p>
+          <w:p>
+            <w:pPr>
+              <w:spacing w:after="0" w:line="240" w:lineRule="auto"/>
+              <w:rPr>
+                <w:rFonts w:eastAsia="Times New Roman" w:cs="Times New Roman"/>
+                <w:kern w:val="0"/>
+                <w:sz w:val="20"/>
+                <w:szCs w:val="20"/>
+                <w14:ligatures w14:val="none"/>
+              </w:rPr>
+            </w:pPr>
+          </w:p>
+          <w:p>
+            <w:pPr>
+              <w:spacing w:after="0" w:line="240" w:lineRule="auto"/>
+              <w:rPr>
+                <w:rFonts w:eastAsia="Times New Roman" w:cs="Times New Roman"/>
+                <w:kern w:val="0"/>
+                <w:sz w:val="20"/>
+                <w:szCs w:val="20"/>
+                <w14:ligatures w14:val="none"/>
+              </w:rPr>
+            </w:pPr>
+          </w:p>
+          <w:p>
+            <w:pPr>
+              <w:spacing w:after="0" w:line="240" w:lineRule="auto"/>
+              <w:rPr>
+                <w:rFonts w:eastAsia="Times New Roman" w:cs="Times New Roman"/>
+                <w:kern w:val="0"/>
+                <w:sz w:val="20"/>
+                <w:szCs w:val="20"/>
+                <w14:ligatures w14:val="none"/>
+              </w:rPr>
+            </w:pPr>
+          </w:p>
+          <w:p>
+            <w:pPr>
+              <w:spacing w:after="0" w:line="240" w:lineRule="auto"/>
+              <w:rPr>
+                <w:rFonts w:eastAsia="Times New Roman" w:cs="Times New Roman"/>
+                <w:kern w:val="0"/>
+                <w:sz w:val="20"/>
+                <w:szCs w:val="20"/>
+                <w14:ligatures w14:val="none"/>
+              </w:rPr>
+            </w:pPr>
+          </w:p>
+          <w:p>
+            <w:pPr>
+              <w:spacing w:after="0" w:line="240" w:lineRule="auto"/>
+              <w:rPr>
+                <w:rFonts w:eastAsia="Times New Roman" w:cs="Times New Roman"/>
+                <w:kern w:val="0"/>
+                <w:sz w:val="20"/>
+                <w:szCs w:val="20"/>
+                <w14:ligatures w14:val="none"/>
+              </w:rPr>
+            </w:pPr>
+          </w:p>
+          <w:p>
+            <w:pPr>
+              <w:spacing w:after="0" w:line="240" w:lineRule="auto"/>
+              <w:rPr>
+                <w:rFonts w:eastAsia="Times New Roman" w:cs="Times New Roman"/>
+                <w:kern w:val="0"/>
+                <w:sz w:val="20"/>
+                <w:szCs w:val="20"/>
+                <w14:ligatures w14:val="none"/>
+              </w:rPr>
+            </w:pPr>
+          </w:p>
+          <w:p>
+            <w:pPr>
+              <w:spacing w:after="0" w:line="240" w:lineRule="auto"/>
+              <w:rPr>
+                <w:rFonts w:eastAsia="Times New Roman" w:cs="Times New Roman"/>
+                <w:kern w:val="0"/>
+                <w:sz w:val="20"/>
+                <w:szCs w:val="20"/>
+                <w14:ligatures w14:val="none"/>
+              </w:rPr>
+            </w:pPr>
+          </w:p>
+          <w:p>
+            <w:pPr>
+              <w:spacing w:after="0" w:line="240" w:lineRule="auto"/>
+              <w:rPr>
+                <w:rFonts w:eastAsia="Times New Roman" w:cs="Times New Roman"/>
+                <w:kern w:val="0"/>
+                <w:sz w:val="20"/>
+                <w:szCs w:val="20"/>
+                <w14:ligatures w14:val="none"/>
+              </w:rPr>
+            </w:pPr>
+          </w:p>
+          <w:p>
+            <w:pPr>
+              <w:spacing w:after="0" w:line="240" w:lineRule="auto"/>
+              <w:rPr>
+                <w:rFonts w:eastAsia="Times New Roman" w:cs="Times New Roman"/>
+                <w:kern w:val="0"/>
+                <w:sz w:val="20"/>
+                <w:szCs w:val="20"/>
+                <w14:ligatures w14:val="none"/>
+              </w:rPr>
+            </w:pPr>
+          </w:p>
+          <w:p>
+            <w:pPr>
+              <w:spacing w:after="0" w:line="240" w:lineRule="auto"/>
+              <w:rPr>
+                <w:rFonts w:eastAsia="Times New Roman" w:cs="Times New Roman"/>
+                <w:kern w:val="0"/>
+                <w:sz w:val="20"/>
+                <w:szCs w:val="20"/>
+                <w14:ligatures w14:val="none"/>
+              </w:rPr>
+            </w:pPr>
+          </w:p>
+          <w:p>
+            <w:pPr>
+              <w:spacing w:after="0" w:line="240" w:lineRule="auto"/>
+              <w:rPr>
+                <w:rFonts w:eastAsia="Times New Roman" w:cs="Times New Roman"/>
+                <w:kern w:val="0"/>
+                <w:sz w:val="20"/>
+                <w:szCs w:val="20"/>
+                <w14:ligatures w14:val="none"/>
+              </w:rPr>
+            </w:pPr>
+          </w:p>
+          <w:p>
+            <w:pPr>
+              <w:spacing w:after="0" w:line="240" w:lineRule="auto"/>
+              <w:rPr>
+                <w:rFonts w:eastAsia="Times New Roman" w:cs="Times New Roman"/>
+                <w:kern w:val="0"/>
+                <w:sz w:val="20"/>
+                <w:szCs w:val="20"/>
+                <w14:ligatures w14:val="none"/>
+              </w:rPr>
+            </w:pPr>
           </w:p>
         </w:tc>
       </w:tr>
@@ -4430,10 +4402,10 @@
         </w:trPr>
         <w:tc>
           <w:tcPr>
-            <w:tcW w:w="1681" w:type="pct"/>
+            <w:tcW w:w="5000" w:type="pct"/>
             <w:gridSpan w:val="2"/>
             <w:tcBorders>
-              <w:top w:val="nil"/>
+              <w:top w:val="single" w:sz="4" w:space="0" w:color="auto"/>
               <w:left w:val="single" w:sz="4" w:space="0" w:color="auto"/>
               <w:bottom w:val="single" w:sz="4" w:space="0" w:color="auto"/>
               <w:right w:val="single" w:sz="4" w:space="0" w:color="auto"/>
@@ -4445,66 +4417,27 @@
           <w:p>
             <w:pPr>
               <w:spacing w:after="0" w:line="240" w:lineRule="auto"/>
-              <w:rPr>
-                <w:rFonts w:eastAsia="Times New Roman" w:cs="Times New Roman"/>
-                <w:color w:val="000000"/>
-                <w:kern w:val="0"/>
-                <w14:ligatures w14:val="none"/>
-              </w:rPr>
-            </w:pPr>
-            <w:proofErr w:type="spellStart"/>
-            <w:r>
-              <w:rPr>
-                <w:rFonts w:eastAsia="Times New Roman" w:cs="Times New Roman"/>
-                <w:color w:val="000000"/>
-                <w:kern w:val="0"/>
-                <w14:ligatures w14:val="none"/>
-              </w:rPr>
-              <w:t>Shift+Page</w:t>
-            </w:r>
-            <w:proofErr w:type="spellEnd"/>
-            <w:r>
-              <w:rPr>
-                <w:rFonts w:eastAsia="Times New Roman" w:cs="Times New Roman"/>
-                <w:color w:val="000000"/>
-                <w:kern w:val="0"/>
-                <w14:ligatures w14:val="none"/>
-              </w:rPr>
-              <w:t xml:space="preserve"> Up</w:t>
-            </w:r>
-          </w:p>
-        </w:tc>
-        <w:tc>
-          <w:tcPr>
-            <w:tcW w:w="3319" w:type="pct"/>
-            <w:tcBorders>
-              <w:top w:val="nil"/>
-              <w:left w:val="nil"/>
-              <w:bottom w:val="single" w:sz="4" w:space="0" w:color="auto"/>
-              <w:right w:val="single" w:sz="4" w:space="0" w:color="auto"/>
-            </w:tcBorders>
-            <w:noWrap/>
-            <w:vAlign w:val="bottom"/>
-            <w:hideMark/>
-          </w:tcPr>
-          <w:p>
-            <w:pPr>
-              <w:spacing w:after="0" w:line="240" w:lineRule="auto"/>
-              <w:rPr>
-                <w:rFonts w:eastAsia="Times New Roman" w:cs="Times New Roman"/>
-                <w:color w:val="000000"/>
-                <w:kern w:val="0"/>
-                <w14:ligatures w14:val="none"/>
-              </w:rPr>
-            </w:pPr>
-            <w:r>
-              <w:rPr>
-                <w:rFonts w:eastAsia="Times New Roman" w:cs="Times New Roman"/>
-                <w:color w:val="000000"/>
-                <w:kern w:val="0"/>
-                <w14:ligatures w14:val="none"/>
-              </w:rPr>
-              <w:t>DSKY Reset</w:t>
+              <w:jc w:val="center"/>
+              <w:rPr>
+                <w:rFonts w:eastAsia="Times New Roman" w:cs="Times New Roman"/>
+                <w:b/>
+                <w:bCs/>
+                <w:color w:val="000000"/>
+                <w:kern w:val="0"/>
+                <w14:ligatures w14:val="none"/>
+              </w:rPr>
+            </w:pPr>
+            <w:r>
+              <w:rPr>
+                <w:rFonts w:eastAsia="Times New Roman" w:cs="Times New Roman"/>
+                <w:b/>
+                <w:bCs/>
+                <w:color w:val="000000"/>
+                <w:kern w:val="0"/>
+                <w14:ligatures w14:val="none"/>
+              </w:rPr>
+              <w:lastRenderedPageBreak/>
+              <w:t>DSKY</w:t>
             </w:r>
           </w:p>
         </w:tc>
@@ -4516,7 +4449,6 @@
         <w:tc>
           <w:tcPr>
             <w:tcW w:w="1681" w:type="pct"/>
-            <w:gridSpan w:val="2"/>
             <w:tcBorders>
               <w:top w:val="nil"/>
               <w:left w:val="single" w:sz="4" w:space="0" w:color="auto"/>
@@ -4537,17 +4469,15 @@
                 <w14:ligatures w14:val="none"/>
               </w:rPr>
             </w:pPr>
-            <w:proofErr w:type="spellStart"/>
-            <w:r>
-              <w:rPr>
-                <w:rFonts w:eastAsia="Times New Roman" w:cs="Times New Roman"/>
-                <w:color w:val="000000"/>
-                <w:kern w:val="0"/>
-                <w14:ligatures w14:val="none"/>
-              </w:rPr>
-              <w:t>Shift+Home</w:t>
-            </w:r>
-            <w:proofErr w:type="spellEnd"/>
+            <w:r>
+              <w:rPr>
+                <w:rFonts w:eastAsia="Times New Roman" w:cs="Times New Roman"/>
+                <w:color w:val="000000"/>
+                <w:kern w:val="0"/>
+                <w14:ligatures w14:val="none"/>
+              </w:rPr>
+              <w:t>Shift+Decimal (Numpad)</w:t>
+            </w:r>
           </w:p>
         </w:tc>
         <w:tc>
@@ -4580,7 +4510,7 @@
                 <w:kern w:val="0"/>
                 <w14:ligatures w14:val="none"/>
               </w:rPr>
-              <w:t>DSKY Key Release</w:t>
+              <w:t>DSKY Clear</w:t>
             </w:r>
           </w:p>
         </w:tc>
@@ -4592,7 +4522,6 @@
         <w:tc>
           <w:tcPr>
             <w:tcW w:w="1681" w:type="pct"/>
-            <w:gridSpan w:val="2"/>
             <w:tcBorders>
               <w:top w:val="nil"/>
               <w:left w:val="single" w:sz="4" w:space="0" w:color="auto"/>
@@ -4613,25 +4542,14 @@
                 <w14:ligatures w14:val="none"/>
               </w:rPr>
             </w:pPr>
-            <w:proofErr w:type="spellStart"/>
-            <w:r>
-              <w:rPr>
-                <w:rFonts w:eastAsia="Times New Roman" w:cs="Times New Roman"/>
-                <w:color w:val="000000"/>
-                <w:kern w:val="0"/>
-                <w14:ligatures w14:val="none"/>
-              </w:rPr>
-              <w:t>Shift+Enter</w:t>
-            </w:r>
-            <w:proofErr w:type="spellEnd"/>
-            <w:r>
-              <w:rPr>
-                <w:rFonts w:eastAsia="Times New Roman" w:cs="Times New Roman"/>
-                <w:color w:val="000000"/>
-                <w:kern w:val="0"/>
-                <w14:ligatures w14:val="none"/>
-              </w:rPr>
-              <w:t xml:space="preserve"> (Numpad)</w:t>
+            <w:r>
+              <w:rPr>
+                <w:rFonts w:eastAsia="Times New Roman" w:cs="Times New Roman"/>
+                <w:color w:val="000000"/>
+                <w:kern w:val="0"/>
+                <w14:ligatures w14:val="none"/>
+              </w:rPr>
+              <w:t>Shift+Page Up</w:t>
             </w:r>
           </w:p>
         </w:tc>
@@ -4665,7 +4583,7 @@
                 <w:kern w:val="0"/>
                 <w14:ligatures w14:val="none"/>
               </w:rPr>
-              <w:t>DSKY Enter</w:t>
+              <w:t>DSKY Reset</w:t>
             </w:r>
           </w:p>
         </w:tc>
@@ -4677,7 +4595,6 @@
         <w:tc>
           <w:tcPr>
             <w:tcW w:w="1681" w:type="pct"/>
-            <w:gridSpan w:val="2"/>
             <w:tcBorders>
               <w:top w:val="nil"/>
               <w:left w:val="single" w:sz="4" w:space="0" w:color="auto"/>
@@ -4698,25 +4615,14 @@
                 <w14:ligatures w14:val="none"/>
               </w:rPr>
             </w:pPr>
-            <w:proofErr w:type="spellStart"/>
-            <w:r>
-              <w:rPr>
-                <w:rFonts w:eastAsia="Times New Roman" w:cs="Times New Roman"/>
-                <w:color w:val="000000"/>
-                <w:kern w:val="0"/>
-                <w14:ligatures w14:val="none"/>
-              </w:rPr>
-              <w:t>Shift+Divide</w:t>
-            </w:r>
-            <w:proofErr w:type="spellEnd"/>
-            <w:r>
-              <w:rPr>
-                <w:rFonts w:eastAsia="Times New Roman" w:cs="Times New Roman"/>
-                <w:color w:val="000000"/>
-                <w:kern w:val="0"/>
-                <w14:ligatures w14:val="none"/>
-              </w:rPr>
-              <w:t xml:space="preserve"> (Numpad /)</w:t>
+            <w:r>
+              <w:rPr>
+                <w:rFonts w:eastAsia="Times New Roman" w:cs="Times New Roman"/>
+                <w:color w:val="000000"/>
+                <w:kern w:val="0"/>
+                <w14:ligatures w14:val="none"/>
+              </w:rPr>
+              <w:t>Shift+Home</w:t>
             </w:r>
           </w:p>
         </w:tc>
@@ -4750,7 +4656,7 @@
                 <w:kern w:val="0"/>
                 <w14:ligatures w14:val="none"/>
               </w:rPr>
-              <w:t>DSKY Verb</w:t>
+              <w:t>DSKY Key Release</w:t>
             </w:r>
           </w:p>
         </w:tc>
@@ -4762,7 +4668,6 @@
         <w:tc>
           <w:tcPr>
             <w:tcW w:w="1681" w:type="pct"/>
-            <w:gridSpan w:val="2"/>
             <w:tcBorders>
               <w:top w:val="nil"/>
               <w:left w:val="single" w:sz="4" w:space="0" w:color="auto"/>
@@ -4783,25 +4688,14 @@
                 <w14:ligatures w14:val="none"/>
               </w:rPr>
             </w:pPr>
-            <w:proofErr w:type="spellStart"/>
-            <w:r>
-              <w:rPr>
-                <w:rFonts w:eastAsia="Times New Roman" w:cs="Times New Roman"/>
-                <w:color w:val="000000"/>
-                <w:kern w:val="0"/>
-                <w14:ligatures w14:val="none"/>
-              </w:rPr>
-              <w:t>Shift+Multiply</w:t>
-            </w:r>
-            <w:proofErr w:type="spellEnd"/>
-            <w:r>
-              <w:rPr>
-                <w:rFonts w:eastAsia="Times New Roman" w:cs="Times New Roman"/>
-                <w:color w:val="000000"/>
-                <w:kern w:val="0"/>
-                <w14:ligatures w14:val="none"/>
-              </w:rPr>
-              <w:t xml:space="preserve"> (Numpad *)</w:t>
+            <w:r>
+              <w:rPr>
+                <w:rFonts w:eastAsia="Times New Roman" w:cs="Times New Roman"/>
+                <w:color w:val="000000"/>
+                <w:kern w:val="0"/>
+                <w14:ligatures w14:val="none"/>
+              </w:rPr>
+              <w:t>Shift+Enter (Numpad)</w:t>
             </w:r>
           </w:p>
         </w:tc>
@@ -4835,7 +4729,7 @@
                 <w:kern w:val="0"/>
                 <w14:ligatures w14:val="none"/>
               </w:rPr>
-              <w:t>DSKY Noun</w:t>
+              <w:t>DSKY Enter</w:t>
             </w:r>
           </w:p>
         </w:tc>
@@ -4847,7 +4741,6 @@
         <w:tc>
           <w:tcPr>
             <w:tcW w:w="1681" w:type="pct"/>
-            <w:gridSpan w:val="2"/>
             <w:tcBorders>
               <w:top w:val="nil"/>
               <w:left w:val="single" w:sz="4" w:space="0" w:color="auto"/>
@@ -4868,25 +4761,14 @@
                 <w14:ligatures w14:val="none"/>
               </w:rPr>
             </w:pPr>
-            <w:proofErr w:type="spellStart"/>
-            <w:r>
-              <w:rPr>
-                <w:rFonts w:eastAsia="Times New Roman" w:cs="Times New Roman"/>
-                <w:color w:val="000000"/>
-                <w:kern w:val="0"/>
-                <w14:ligatures w14:val="none"/>
-              </w:rPr>
-              <w:t>Shift+Plus</w:t>
-            </w:r>
-            <w:proofErr w:type="spellEnd"/>
-            <w:r>
-              <w:rPr>
-                <w:rFonts w:eastAsia="Times New Roman" w:cs="Times New Roman"/>
-                <w:color w:val="000000"/>
-                <w:kern w:val="0"/>
-                <w14:ligatures w14:val="none"/>
-              </w:rPr>
-              <w:t xml:space="preserve"> (Numpad +)</w:t>
+            <w:r>
+              <w:rPr>
+                <w:rFonts w:eastAsia="Times New Roman" w:cs="Times New Roman"/>
+                <w:color w:val="000000"/>
+                <w:kern w:val="0"/>
+                <w14:ligatures w14:val="none"/>
+              </w:rPr>
+              <w:t>Shift+Divide (Numpad /)</w:t>
             </w:r>
           </w:p>
         </w:tc>
@@ -4920,7 +4802,7 @@
                 <w:kern w:val="0"/>
                 <w14:ligatures w14:val="none"/>
               </w:rPr>
-              <w:t>DSKY Plus</w:t>
+              <w:t>DSKY Verb</w:t>
             </w:r>
           </w:p>
         </w:tc>
@@ -4932,7 +4814,6 @@
         <w:tc>
           <w:tcPr>
             <w:tcW w:w="1681" w:type="pct"/>
-            <w:gridSpan w:val="2"/>
             <w:tcBorders>
               <w:top w:val="nil"/>
               <w:left w:val="single" w:sz="4" w:space="0" w:color="auto"/>
@@ -4953,25 +4834,14 @@
                 <w14:ligatures w14:val="none"/>
               </w:rPr>
             </w:pPr>
-            <w:proofErr w:type="spellStart"/>
-            <w:r>
-              <w:rPr>
-                <w:rFonts w:eastAsia="Times New Roman" w:cs="Times New Roman"/>
-                <w:color w:val="000000"/>
-                <w:kern w:val="0"/>
-                <w14:ligatures w14:val="none"/>
-              </w:rPr>
-              <w:t>Shift+Minus</w:t>
-            </w:r>
-            <w:proofErr w:type="spellEnd"/>
-            <w:r>
-              <w:rPr>
-                <w:rFonts w:eastAsia="Times New Roman" w:cs="Times New Roman"/>
-                <w:color w:val="000000"/>
-                <w:kern w:val="0"/>
-                <w14:ligatures w14:val="none"/>
-              </w:rPr>
-              <w:t xml:space="preserve"> (Numpad -)</w:t>
+            <w:r>
+              <w:rPr>
+                <w:rFonts w:eastAsia="Times New Roman" w:cs="Times New Roman"/>
+                <w:color w:val="000000"/>
+                <w:kern w:val="0"/>
+                <w14:ligatures w14:val="none"/>
+              </w:rPr>
+              <w:t>Shift+Multiply (Numpad *)</w:t>
             </w:r>
           </w:p>
         </w:tc>
@@ -5005,7 +4875,7 @@
                 <w:kern w:val="0"/>
                 <w14:ligatures w14:val="none"/>
               </w:rPr>
-              <w:t>DSKY Minus</w:t>
+              <w:t>DSKY Noun</w:t>
             </w:r>
           </w:p>
         </w:tc>
@@ -5017,7 +4887,6 @@
         <w:tc>
           <w:tcPr>
             <w:tcW w:w="1681" w:type="pct"/>
-            <w:gridSpan w:val="2"/>
             <w:tcBorders>
               <w:top w:val="nil"/>
               <w:left w:val="single" w:sz="4" w:space="0" w:color="auto"/>
@@ -5038,17 +4907,15 @@
                 <w14:ligatures w14:val="none"/>
               </w:rPr>
             </w:pPr>
-            <w:proofErr w:type="spellStart"/>
-            <w:r>
-              <w:rPr>
-                <w:rFonts w:eastAsia="Times New Roman" w:cs="Times New Roman"/>
-                <w:color w:val="000000"/>
-                <w:kern w:val="0"/>
-                <w14:ligatures w14:val="none"/>
-              </w:rPr>
-              <w:t>Shift+End</w:t>
-            </w:r>
-            <w:proofErr w:type="spellEnd"/>
+            <w:r>
+              <w:rPr>
+                <w:rFonts w:eastAsia="Times New Roman" w:cs="Times New Roman"/>
+                <w:color w:val="000000"/>
+                <w:kern w:val="0"/>
+                <w14:ligatures w14:val="none"/>
+              </w:rPr>
+              <w:t>Shift+Plus (Numpad +)</w:t>
+            </w:r>
           </w:p>
         </w:tc>
         <w:tc>
@@ -5081,7 +4948,7 @@
                 <w:kern w:val="0"/>
                 <w14:ligatures w14:val="none"/>
               </w:rPr>
-              <w:t>DSKY Proceed</w:t>
+              <w:t>DSKY Plus</w:t>
             </w:r>
           </w:p>
         </w:tc>
@@ -5093,7 +4960,6 @@
         <w:tc>
           <w:tcPr>
             <w:tcW w:w="1681" w:type="pct"/>
-            <w:gridSpan w:val="2"/>
             <w:tcBorders>
               <w:top w:val="nil"/>
               <w:left w:val="single" w:sz="4" w:space="0" w:color="auto"/>
@@ -5121,7 +4987,7 @@
                 <w:kern w:val="0"/>
                 <w14:ligatures w14:val="none"/>
               </w:rPr>
-              <w:t>Shift+ 0-9 (Numpad)</w:t>
+              <w:t>Shift+Minus (Numpad -)</w:t>
             </w:r>
           </w:p>
         </w:tc>
@@ -5155,7 +5021,7 @@
                 <w:kern w:val="0"/>
                 <w14:ligatures w14:val="none"/>
               </w:rPr>
-              <w:t>DSKY 0-9</w:t>
+              <w:t>DSKY Minus</w:t>
             </w:r>
           </w:p>
         </w:tc>
@@ -5166,10 +5032,9 @@
         </w:trPr>
         <w:tc>
           <w:tcPr>
-            <w:tcW w:w="5000" w:type="pct"/>
-            <w:gridSpan w:val="3"/>
-            <w:tcBorders>
-              <w:top w:val="single" w:sz="4" w:space="0" w:color="auto"/>
+            <w:tcW w:w="1681" w:type="pct"/>
+            <w:tcBorders>
+              <w:top w:val="nil"/>
               <w:left w:val="single" w:sz="4" w:space="0" w:color="auto"/>
               <w:bottom w:val="single" w:sz="4" w:space="0" w:color="auto"/>
               <w:right w:val="single" w:sz="4" w:space="0" w:color="auto"/>
@@ -5181,27 +5046,55 @@
           <w:p>
             <w:pPr>
               <w:spacing w:after="0" w:line="240" w:lineRule="auto"/>
-              <w:jc w:val="center"/>
-              <w:rPr>
-                <w:rFonts w:eastAsia="Times New Roman" w:cs="Times New Roman"/>
-                <w:b/>
-                <w:bCs/>
-                <w:color w:val="000000"/>
-                <w:kern w:val="0"/>
-                <w14:ligatures w14:val="none"/>
-              </w:rPr>
-            </w:pPr>
-            <w:r>
-              <w:rPr>
-                <w:rFonts w:eastAsia="Times New Roman" w:cs="Times New Roman"/>
-                <w:b/>
-                <w:bCs/>
-                <w:color w:val="000000"/>
-                <w:kern w:val="0"/>
-                <w14:ligatures w14:val="none"/>
-              </w:rPr>
-              <w:lastRenderedPageBreak/>
-              <w:t>ORDEAL</w:t>
+              <w:rPr>
+                <w:rFonts w:eastAsia="Times New Roman" w:cs="Times New Roman"/>
+                <w:color w:val="000000"/>
+                <w:kern w:val="0"/>
+                <w14:ligatures w14:val="none"/>
+              </w:rPr>
+            </w:pPr>
+            <w:r>
+              <w:rPr>
+                <w:rFonts w:eastAsia="Times New Roman" w:cs="Times New Roman"/>
+                <w:color w:val="000000"/>
+                <w:kern w:val="0"/>
+                <w14:ligatures w14:val="none"/>
+              </w:rPr>
+              <w:t>Shift+End</w:t>
+            </w:r>
+          </w:p>
+        </w:tc>
+        <w:tc>
+          <w:tcPr>
+            <w:tcW w:w="3319" w:type="pct"/>
+            <w:tcBorders>
+              <w:top w:val="nil"/>
+              <w:left w:val="nil"/>
+              <w:bottom w:val="single" w:sz="4" w:space="0" w:color="auto"/>
+              <w:right w:val="single" w:sz="4" w:space="0" w:color="auto"/>
+            </w:tcBorders>
+            <w:noWrap/>
+            <w:vAlign w:val="bottom"/>
+            <w:hideMark/>
+          </w:tcPr>
+          <w:p>
+            <w:pPr>
+              <w:spacing w:after="0" w:line="240" w:lineRule="auto"/>
+              <w:rPr>
+                <w:rFonts w:eastAsia="Times New Roman" w:cs="Times New Roman"/>
+                <w:color w:val="000000"/>
+                <w:kern w:val="0"/>
+                <w14:ligatures w14:val="none"/>
+              </w:rPr>
+            </w:pPr>
+            <w:r>
+              <w:rPr>
+                <w:rFonts w:eastAsia="Times New Roman" w:cs="Times New Roman"/>
+                <w:color w:val="000000"/>
+                <w:kern w:val="0"/>
+                <w14:ligatures w14:val="none"/>
+              </w:rPr>
+              <w:t>DSKY Proceed</w:t>
             </w:r>
           </w:p>
         </w:tc>
@@ -5212,7 +5105,7 @@
         </w:trPr>
         <w:tc>
           <w:tcPr>
-            <w:tcW w:w="1400" w:type="pct"/>
+            <w:tcW w:w="1681" w:type="pct"/>
             <w:tcBorders>
               <w:top w:val="nil"/>
               <w:left w:val="single" w:sz="4" w:space="0" w:color="auto"/>
@@ -5240,14 +5133,13 @@
                 <w:kern w:val="0"/>
                 <w14:ligatures w14:val="none"/>
               </w:rPr>
-              <w:t>Alt-O</w:t>
-            </w:r>
-          </w:p>
-        </w:tc>
-        <w:tc>
-          <w:tcPr>
-            <w:tcW w:w="3600" w:type="pct"/>
-            <w:gridSpan w:val="2"/>
+              <w:t>Shift+ 0-9 (Numpad)</w:t>
+            </w:r>
+          </w:p>
+        </w:tc>
+        <w:tc>
+          <w:tcPr>
+            <w:tcW w:w="3319" w:type="pct"/>
             <w:tcBorders>
               <w:top w:val="nil"/>
               <w:left w:val="nil"/>
@@ -5275,81 +5167,7 @@
                 <w:kern w:val="0"/>
                 <w14:ligatures w14:val="none"/>
               </w:rPr>
-              <w:t>Slew ORDEAL Up</w:t>
-            </w:r>
-          </w:p>
-        </w:tc>
-      </w:tr>
-      <w:tr>
-        <w:trPr>
-          <w:trHeight w:val="300"/>
-        </w:trPr>
-        <w:tc>
-          <w:tcPr>
-            <w:tcW w:w="1400" w:type="pct"/>
-            <w:tcBorders>
-              <w:top w:val="nil"/>
-              <w:left w:val="single" w:sz="4" w:space="0" w:color="auto"/>
-              <w:bottom w:val="single" w:sz="4" w:space="0" w:color="auto"/>
-              <w:right w:val="single" w:sz="4" w:space="0" w:color="auto"/>
-            </w:tcBorders>
-            <w:noWrap/>
-            <w:vAlign w:val="bottom"/>
-            <w:hideMark/>
-          </w:tcPr>
-          <w:p>
-            <w:pPr>
-              <w:spacing w:after="0" w:line="240" w:lineRule="auto"/>
-              <w:rPr>
-                <w:rFonts w:eastAsia="Times New Roman" w:cs="Times New Roman"/>
-                <w:color w:val="000000"/>
-                <w:kern w:val="0"/>
-                <w14:ligatures w14:val="none"/>
-              </w:rPr>
-            </w:pPr>
-            <w:r>
-              <w:rPr>
-                <w:rFonts w:eastAsia="Times New Roman" w:cs="Times New Roman"/>
-                <w:color w:val="000000"/>
-                <w:kern w:val="0"/>
-                <w14:ligatures w14:val="none"/>
-              </w:rPr>
-              <w:t>Alt-L</w:t>
-            </w:r>
-          </w:p>
-        </w:tc>
-        <w:tc>
-          <w:tcPr>
-            <w:tcW w:w="3600" w:type="pct"/>
-            <w:gridSpan w:val="2"/>
-            <w:tcBorders>
-              <w:top w:val="nil"/>
-              <w:left w:val="nil"/>
-              <w:bottom w:val="single" w:sz="4" w:space="0" w:color="auto"/>
-              <w:right w:val="single" w:sz="4" w:space="0" w:color="auto"/>
-            </w:tcBorders>
-            <w:noWrap/>
-            <w:vAlign w:val="bottom"/>
-            <w:hideMark/>
-          </w:tcPr>
-          <w:p>
-            <w:pPr>
-              <w:spacing w:after="0" w:line="240" w:lineRule="auto"/>
-              <w:rPr>
-                <w:rFonts w:eastAsia="Times New Roman" w:cs="Times New Roman"/>
-                <w:color w:val="000000"/>
-                <w:kern w:val="0"/>
-                <w14:ligatures w14:val="none"/>
-              </w:rPr>
-            </w:pPr>
-            <w:r>
-              <w:rPr>
-                <w:rFonts w:eastAsia="Times New Roman" w:cs="Times New Roman"/>
-                <w:color w:val="000000"/>
-                <w:kern w:val="0"/>
-                <w14:ligatures w14:val="none"/>
-              </w:rPr>
-              <w:t>Slew ORDEAL Down</w:t>
+              <w:t>DSKY 0-9</w:t>
             </w:r>
           </w:p>
         </w:tc>
@@ -5360,11 +5178,231 @@
         <w:pStyle w:val="Subtitle"/>
       </w:pPr>
     </w:p>
+    <w:tbl>
+      <w:tblPr>
+        <w:tblW w:w="5000" w:type="pct"/>
+        <w:tblLook w:val="04A0" w:firstRow="1" w:lastRow="0" w:firstColumn="1" w:lastColumn="0" w:noHBand="0" w:noVBand="1"/>
+      </w:tblPr>
+      <w:tblGrid>
+        <w:gridCol w:w="3450"/>
+        <w:gridCol w:w="5900"/>
+      </w:tblGrid>
+      <w:tr>
+        <w:trPr>
+          <w:trHeight w:val="300"/>
+        </w:trPr>
+        <w:tc>
+          <w:tcPr>
+            <w:tcW w:w="5000" w:type="pct"/>
+            <w:gridSpan w:val="2"/>
+            <w:tcBorders>
+              <w:top w:val="single" w:sz="4" w:space="0" w:color="auto"/>
+              <w:left w:val="single" w:sz="4" w:space="0" w:color="auto"/>
+              <w:bottom w:val="single" w:sz="4" w:space="0" w:color="auto"/>
+              <w:right w:val="single" w:sz="4" w:space="0" w:color="auto"/>
+            </w:tcBorders>
+            <w:noWrap/>
+            <w:vAlign w:val="bottom"/>
+            <w:hideMark/>
+          </w:tcPr>
+          <w:p>
+            <w:pPr>
+              <w:spacing w:after="0" w:line="240" w:lineRule="auto"/>
+              <w:jc w:val="center"/>
+              <w:rPr>
+                <w:rFonts w:eastAsia="Times New Roman" w:cs="Times New Roman"/>
+                <w:b/>
+                <w:bCs/>
+                <w:color w:val="000000"/>
+                <w:kern w:val="0"/>
+                <w14:ligatures w14:val="none"/>
+              </w:rPr>
+            </w:pPr>
+            <w:r>
+              <w:rPr>
+                <w:rFonts w:eastAsia="Times New Roman" w:cs="Times New Roman"/>
+                <w:b/>
+                <w:bCs/>
+                <w:color w:val="000000"/>
+                <w:kern w:val="0"/>
+                <w14:ligatures w14:val="none"/>
+              </w:rPr>
+              <w:t>ORDEAL</w:t>
+            </w:r>
+          </w:p>
+        </w:tc>
+      </w:tr>
+      <w:tr>
+        <w:trPr>
+          <w:trHeight w:val="300"/>
+        </w:trPr>
+        <w:tc>
+          <w:tcPr>
+            <w:tcW w:w="1845" w:type="pct"/>
+            <w:tcBorders>
+              <w:top w:val="nil"/>
+              <w:left w:val="single" w:sz="4" w:space="0" w:color="auto"/>
+              <w:bottom w:val="single" w:sz="4" w:space="0" w:color="auto"/>
+              <w:right w:val="single" w:sz="4" w:space="0" w:color="auto"/>
+            </w:tcBorders>
+            <w:noWrap/>
+            <w:vAlign w:val="bottom"/>
+            <w:hideMark/>
+          </w:tcPr>
+          <w:p>
+            <w:pPr>
+              <w:spacing w:after="0" w:line="240" w:lineRule="auto"/>
+              <w:rPr>
+                <w:rFonts w:eastAsia="Times New Roman" w:cs="Times New Roman"/>
+                <w:color w:val="000000"/>
+                <w:kern w:val="0"/>
+                <w14:ligatures w14:val="none"/>
+              </w:rPr>
+            </w:pPr>
+            <w:r>
+              <w:rPr>
+                <w:rFonts w:eastAsia="Times New Roman" w:cs="Times New Roman"/>
+                <w:color w:val="000000"/>
+                <w:kern w:val="0"/>
+                <w14:ligatures w14:val="none"/>
+              </w:rPr>
+              <w:t>Alt-O</w:t>
+            </w:r>
+          </w:p>
+        </w:tc>
+        <w:tc>
+          <w:tcPr>
+            <w:tcW w:w="3155" w:type="pct"/>
+            <w:tcBorders>
+              <w:top w:val="nil"/>
+              <w:left w:val="nil"/>
+              <w:bottom w:val="single" w:sz="4" w:space="0" w:color="auto"/>
+              <w:right w:val="single" w:sz="4" w:space="0" w:color="auto"/>
+            </w:tcBorders>
+            <w:noWrap/>
+            <w:vAlign w:val="bottom"/>
+            <w:hideMark/>
+          </w:tcPr>
+          <w:p>
+            <w:pPr>
+              <w:spacing w:after="0" w:line="240" w:lineRule="auto"/>
+              <w:rPr>
+                <w:rFonts w:eastAsia="Times New Roman" w:cs="Times New Roman"/>
+                <w:color w:val="000000"/>
+                <w:kern w:val="0"/>
+                <w14:ligatures w14:val="none"/>
+              </w:rPr>
+            </w:pPr>
+            <w:r>
+              <w:rPr>
+                <w:rFonts w:eastAsia="Times New Roman" w:cs="Times New Roman"/>
+                <w:color w:val="000000"/>
+                <w:kern w:val="0"/>
+                <w14:ligatures w14:val="none"/>
+              </w:rPr>
+              <w:t>Slew ORDEAL Up</w:t>
+            </w:r>
+          </w:p>
+        </w:tc>
+      </w:tr>
+      <w:tr>
+        <w:trPr>
+          <w:trHeight w:val="300"/>
+        </w:trPr>
+        <w:tc>
+          <w:tcPr>
+            <w:tcW w:w="1845" w:type="pct"/>
+            <w:tcBorders>
+              <w:top w:val="nil"/>
+              <w:left w:val="single" w:sz="4" w:space="0" w:color="auto"/>
+              <w:bottom w:val="single" w:sz="4" w:space="0" w:color="auto"/>
+              <w:right w:val="single" w:sz="4" w:space="0" w:color="auto"/>
+            </w:tcBorders>
+            <w:noWrap/>
+            <w:vAlign w:val="bottom"/>
+            <w:hideMark/>
+          </w:tcPr>
+          <w:p>
+            <w:pPr>
+              <w:spacing w:after="0" w:line="240" w:lineRule="auto"/>
+              <w:rPr>
+                <w:rFonts w:eastAsia="Times New Roman" w:cs="Times New Roman"/>
+                <w:color w:val="000000"/>
+                <w:kern w:val="0"/>
+                <w14:ligatures w14:val="none"/>
+              </w:rPr>
+            </w:pPr>
+            <w:r>
+              <w:rPr>
+                <w:rFonts w:eastAsia="Times New Roman" w:cs="Times New Roman"/>
+                <w:color w:val="000000"/>
+                <w:kern w:val="0"/>
+                <w14:ligatures w14:val="none"/>
+              </w:rPr>
+              <w:t>Alt-L</w:t>
+            </w:r>
+          </w:p>
+        </w:tc>
+        <w:tc>
+          <w:tcPr>
+            <w:tcW w:w="3155" w:type="pct"/>
+            <w:tcBorders>
+              <w:top w:val="nil"/>
+              <w:left w:val="nil"/>
+              <w:bottom w:val="single" w:sz="4" w:space="0" w:color="auto"/>
+              <w:right w:val="single" w:sz="4" w:space="0" w:color="auto"/>
+            </w:tcBorders>
+            <w:noWrap/>
+            <w:vAlign w:val="bottom"/>
+            <w:hideMark/>
+          </w:tcPr>
+          <w:p>
+            <w:pPr>
+              <w:spacing w:after="0" w:line="240" w:lineRule="auto"/>
+              <w:rPr>
+                <w:rFonts w:eastAsia="Times New Roman" w:cs="Times New Roman"/>
+                <w:color w:val="000000"/>
+                <w:kern w:val="0"/>
+                <w14:ligatures w14:val="none"/>
+              </w:rPr>
+            </w:pPr>
+            <w:r>
+              <w:rPr>
+                <w:rFonts w:eastAsia="Times New Roman" w:cs="Times New Roman"/>
+                <w:color w:val="000000"/>
+                <w:kern w:val="0"/>
+                <w14:ligatures w14:val="none"/>
+              </w:rPr>
+              <w:t>Slew ORDEAL Down</w:t>
+            </w:r>
+          </w:p>
+        </w:tc>
+      </w:tr>
+    </w:tbl>
+    <w:p/>
+    <w:p/>
+    <w:p/>
+    <w:p/>
+    <w:p/>
+    <w:p/>
+    <w:p/>
+    <w:p/>
+    <w:p/>
+    <w:p/>
+    <w:p/>
+    <w:p/>
+    <w:p/>
+    <w:p/>
+    <w:p/>
+    <w:p/>
+    <w:p/>
+    <w:p/>
     <w:p>
       <w:pPr>
         <w:pStyle w:val="Subtitle"/>
       </w:pPr>
       <w:r>
+        <w:lastRenderedPageBreak/>
         <w:t>C</w:t>
       </w:r>
       <w:r>
@@ -6615,7 +6653,6 @@
                 <w14:ligatures w14:val="none"/>
               </w:rPr>
             </w:pPr>
-            <w:proofErr w:type="spellStart"/>
             <w:r>
               <w:rPr>
                 <w:rFonts w:eastAsia="Times New Roman" w:cs="Times New Roman"/>
@@ -6625,7 +6662,6 @@
               </w:rPr>
               <w:t>Shift+W</w:t>
             </w:r>
-            <w:proofErr w:type="spellEnd"/>
           </w:p>
         </w:tc>
         <w:tc>
@@ -6690,7 +6726,6 @@
                 <w14:ligatures w14:val="none"/>
               </w:rPr>
             </w:pPr>
-            <w:proofErr w:type="spellStart"/>
             <w:r>
               <w:rPr>
                 <w:rFonts w:eastAsia="Times New Roman" w:cs="Times New Roman"/>
@@ -6700,7 +6735,6 @@
               </w:rPr>
               <w:t>Shift+S</w:t>
             </w:r>
-            <w:proofErr w:type="spellEnd"/>
           </w:p>
         </w:tc>
         <w:tc>
@@ -6765,7 +6799,6 @@
                 <w14:ligatures w14:val="none"/>
               </w:rPr>
             </w:pPr>
-            <w:proofErr w:type="spellStart"/>
             <w:r>
               <w:rPr>
                 <w:rFonts w:eastAsia="Times New Roman" w:cs="Times New Roman"/>
@@ -6775,7 +6808,6 @@
               </w:rPr>
               <w:t>Shift+A</w:t>
             </w:r>
-            <w:proofErr w:type="spellEnd"/>
           </w:p>
         </w:tc>
         <w:tc>
@@ -6840,7 +6872,6 @@
                 <w14:ligatures w14:val="none"/>
               </w:rPr>
             </w:pPr>
-            <w:proofErr w:type="spellStart"/>
             <w:r>
               <w:rPr>
                 <w:rFonts w:eastAsia="Times New Roman" w:cs="Times New Roman"/>
@@ -6850,7 +6881,6 @@
               </w:rPr>
               <w:t>Shift+D</w:t>
             </w:r>
-            <w:proofErr w:type="spellEnd"/>
           </w:p>
         </w:tc>
         <w:tc>
@@ -6915,7 +6945,6 @@
                 <w14:ligatures w14:val="none"/>
               </w:rPr>
             </w:pPr>
-            <w:proofErr w:type="spellStart"/>
             <w:r>
               <w:rPr>
                 <w:rFonts w:eastAsia="Times New Roman" w:cs="Times New Roman"/>
@@ -6925,7 +6954,6 @@
               </w:rPr>
               <w:t>Shift+Q</w:t>
             </w:r>
-            <w:proofErr w:type="spellEnd"/>
           </w:p>
         </w:tc>
         <w:tc>
@@ -6990,7 +7018,6 @@
                 <w14:ligatures w14:val="none"/>
               </w:rPr>
             </w:pPr>
-            <w:proofErr w:type="spellStart"/>
             <w:r>
               <w:rPr>
                 <w:rFonts w:eastAsia="Times New Roman" w:cs="Times New Roman"/>
@@ -7000,7 +7027,6 @@
               </w:rPr>
               <w:t>Shift+E</w:t>
             </w:r>
-            <w:proofErr w:type="spellEnd"/>
           </w:p>
         </w:tc>
         <w:tc>
@@ -7544,6 +7570,21 @@
         </w:tc>
       </w:tr>
     </w:tbl>
+    <w:p>
+      <w:pPr>
+        <w:pStyle w:val="Subtitle"/>
+      </w:pPr>
+    </w:p>
+    <w:p>
+      <w:pPr>
+        <w:pStyle w:val="Subtitle"/>
+      </w:pPr>
+    </w:p>
+    <w:p>
+      <w:pPr>
+        <w:pStyle w:val="Subtitle"/>
+      </w:pPr>
+    </w:p>
     <w:p>
       <w:pPr>
         <w:pStyle w:val="Subtitle"/>
@@ -8239,25 +8280,14 @@
                 <w14:ligatures w14:val="none"/>
               </w:rPr>
             </w:pPr>
-            <w:proofErr w:type="spellStart"/>
-            <w:r>
-              <w:rPr>
-                <w:rFonts w:eastAsia="Times New Roman" w:cs="Times New Roman"/>
-                <w:color w:val="000000"/>
-                <w:kern w:val="0"/>
-                <w14:ligatures w14:val="none"/>
-              </w:rPr>
-              <w:t>Ctrl+Decimal</w:t>
-            </w:r>
-            <w:proofErr w:type="spellEnd"/>
-            <w:r>
-              <w:rPr>
-                <w:rFonts w:eastAsia="Times New Roman" w:cs="Times New Roman"/>
-                <w:color w:val="000000"/>
-                <w:kern w:val="0"/>
-                <w14:ligatures w14:val="none"/>
-              </w:rPr>
-              <w:t xml:space="preserve"> (Numpad .)</w:t>
+            <w:r>
+              <w:rPr>
+                <w:rFonts w:eastAsia="Times New Roman" w:cs="Times New Roman"/>
+                <w:color w:val="000000"/>
+                <w:kern w:val="0"/>
+                <w14:ligatures w14:val="none"/>
+              </w:rPr>
+              <w:t>Ctrl+Decimal (Numpad .)</w:t>
             </w:r>
           </w:p>
         </w:tc>
@@ -8323,25 +8353,14 @@
                 <w14:ligatures w14:val="none"/>
               </w:rPr>
             </w:pPr>
-            <w:proofErr w:type="spellStart"/>
-            <w:r>
-              <w:rPr>
-                <w:rFonts w:eastAsia="Times New Roman" w:cs="Times New Roman"/>
-                <w:color w:val="000000"/>
-                <w:kern w:val="0"/>
-                <w14:ligatures w14:val="none"/>
-              </w:rPr>
-              <w:t>Ctrl+Enter</w:t>
-            </w:r>
-            <w:proofErr w:type="spellEnd"/>
-            <w:r>
-              <w:rPr>
-                <w:rFonts w:eastAsia="Times New Roman" w:cs="Times New Roman"/>
-                <w:color w:val="000000"/>
-                <w:kern w:val="0"/>
-                <w14:ligatures w14:val="none"/>
-              </w:rPr>
-              <w:t xml:space="preserve"> (Numpad)</w:t>
+            <w:r>
+              <w:rPr>
+                <w:rFonts w:eastAsia="Times New Roman" w:cs="Times New Roman"/>
+                <w:color w:val="000000"/>
+                <w:kern w:val="0"/>
+                <w14:ligatures w14:val="none"/>
+              </w:rPr>
+              <w:t>Ctrl+Enter (Numpad)</w:t>
             </w:r>
           </w:p>
         </w:tc>
@@ -8407,25 +8426,14 @@
                 <w14:ligatures w14:val="none"/>
               </w:rPr>
             </w:pPr>
-            <w:proofErr w:type="spellStart"/>
-            <w:r>
-              <w:rPr>
-                <w:rFonts w:eastAsia="Times New Roman" w:cs="Times New Roman"/>
-                <w:color w:val="000000"/>
-                <w:kern w:val="0"/>
-                <w14:ligatures w14:val="none"/>
-              </w:rPr>
-              <w:t>Ctrl+Page</w:t>
-            </w:r>
-            <w:proofErr w:type="spellEnd"/>
-            <w:r>
-              <w:rPr>
-                <w:rFonts w:eastAsia="Times New Roman" w:cs="Times New Roman"/>
-                <w:color w:val="000000"/>
-                <w:kern w:val="0"/>
-                <w14:ligatures w14:val="none"/>
-              </w:rPr>
-              <w:t xml:space="preserve"> Up</w:t>
+            <w:r>
+              <w:rPr>
+                <w:rFonts w:eastAsia="Times New Roman" w:cs="Times New Roman"/>
+                <w:color w:val="000000"/>
+                <w:kern w:val="0"/>
+                <w14:ligatures w14:val="none"/>
+              </w:rPr>
+              <w:t>Ctrl+Page Up</w:t>
             </w:r>
           </w:p>
         </w:tc>
@@ -8491,25 +8499,14 @@
                 <w14:ligatures w14:val="none"/>
               </w:rPr>
             </w:pPr>
-            <w:proofErr w:type="spellStart"/>
-            <w:r>
-              <w:rPr>
-                <w:rFonts w:eastAsia="Times New Roman" w:cs="Times New Roman"/>
-                <w:color w:val="000000"/>
-                <w:kern w:val="0"/>
-                <w14:ligatures w14:val="none"/>
-              </w:rPr>
-              <w:t>Ctrl+Multiply</w:t>
-            </w:r>
-            <w:proofErr w:type="spellEnd"/>
-            <w:r>
-              <w:rPr>
-                <w:rFonts w:eastAsia="Times New Roman" w:cs="Times New Roman"/>
-                <w:color w:val="000000"/>
-                <w:kern w:val="0"/>
-                <w14:ligatures w14:val="none"/>
-              </w:rPr>
-              <w:t xml:space="preserve"> (Numpad *)</w:t>
+            <w:r>
+              <w:rPr>
+                <w:rFonts w:eastAsia="Times New Roman" w:cs="Times New Roman"/>
+                <w:color w:val="000000"/>
+                <w:kern w:val="0"/>
+                <w14:ligatures w14:val="none"/>
+              </w:rPr>
+              <w:t>Ctrl+Multiply (Numpad *)</w:t>
             </w:r>
           </w:p>
         </w:tc>
@@ -8575,25 +8572,14 @@
                 <w14:ligatures w14:val="none"/>
               </w:rPr>
             </w:pPr>
-            <w:proofErr w:type="spellStart"/>
-            <w:r>
-              <w:rPr>
-                <w:rFonts w:eastAsia="Times New Roman" w:cs="Times New Roman"/>
-                <w:color w:val="000000"/>
-                <w:kern w:val="0"/>
-                <w14:ligatures w14:val="none"/>
-              </w:rPr>
-              <w:t>Ctrl+Plus</w:t>
-            </w:r>
-            <w:proofErr w:type="spellEnd"/>
-            <w:r>
-              <w:rPr>
-                <w:rFonts w:eastAsia="Times New Roman" w:cs="Times New Roman"/>
-                <w:color w:val="000000"/>
-                <w:kern w:val="0"/>
-                <w14:ligatures w14:val="none"/>
-              </w:rPr>
-              <w:t xml:space="preserve"> (Numpad +)</w:t>
+            <w:r>
+              <w:rPr>
+                <w:rFonts w:eastAsia="Times New Roman" w:cs="Times New Roman"/>
+                <w:color w:val="000000"/>
+                <w:kern w:val="0"/>
+                <w14:ligatures w14:val="none"/>
+              </w:rPr>
+              <w:t>Ctrl+Plus (Numpad +)</w:t>
             </w:r>
           </w:p>
         </w:tc>
@@ -8659,25 +8645,14 @@
                 <w14:ligatures w14:val="none"/>
               </w:rPr>
             </w:pPr>
-            <w:proofErr w:type="spellStart"/>
-            <w:r>
-              <w:rPr>
-                <w:rFonts w:eastAsia="Times New Roman" w:cs="Times New Roman"/>
-                <w:color w:val="000000"/>
-                <w:kern w:val="0"/>
-                <w14:ligatures w14:val="none"/>
-              </w:rPr>
-              <w:t>Ctrl+Minus</w:t>
-            </w:r>
-            <w:proofErr w:type="spellEnd"/>
-            <w:r>
-              <w:rPr>
-                <w:rFonts w:eastAsia="Times New Roman" w:cs="Times New Roman"/>
-                <w:color w:val="000000"/>
-                <w:kern w:val="0"/>
-                <w14:ligatures w14:val="none"/>
-              </w:rPr>
-              <w:t xml:space="preserve"> (Numpad -)</w:t>
+            <w:r>
+              <w:rPr>
+                <w:rFonts w:eastAsia="Times New Roman" w:cs="Times New Roman"/>
+                <w:color w:val="000000"/>
+                <w:kern w:val="0"/>
+                <w14:ligatures w14:val="none"/>
+              </w:rPr>
+              <w:t>Ctrl+Minus (Numpad -)</w:t>
             </w:r>
           </w:p>
         </w:tc>
@@ -9136,7 +9111,6 @@
                 <w14:ligatures w14:val="none"/>
               </w:rPr>
             </w:pPr>
-            <w:proofErr w:type="spellStart"/>
             <w:r>
               <w:rPr>
                 <w:rFonts w:eastAsia="Times New Roman" w:cs="Times New Roman"/>
@@ -9146,7 +9120,6 @@
               </w:rPr>
               <w:t>Alt+W</w:t>
             </w:r>
-            <w:proofErr w:type="spellEnd"/>
           </w:p>
         </w:tc>
         <w:tc>
@@ -9284,7 +9257,6 @@
                 <w14:ligatures w14:val="none"/>
               </w:rPr>
             </w:pPr>
-            <w:proofErr w:type="spellStart"/>
             <w:r>
               <w:rPr>
                 <w:rFonts w:eastAsia="Times New Roman" w:cs="Times New Roman"/>
@@ -9294,7 +9266,6 @@
               </w:rPr>
               <w:t>Alt+S</w:t>
             </w:r>
-            <w:proofErr w:type="spellEnd"/>
           </w:p>
         </w:tc>
         <w:tc>
@@ -9713,25 +9684,14 @@
                 <w14:ligatures w14:val="none"/>
               </w:rPr>
             </w:pPr>
-            <w:proofErr w:type="gramStart"/>
-            <w:r>
-              <w:rPr>
-                <w:rFonts w:eastAsia="Times New Roman" w:cs="Times New Roman"/>
-                <w:color w:val="000000"/>
-                <w:kern w:val="0"/>
-                <w14:ligatures w14:val="none"/>
-              </w:rPr>
-              <w:t>Increase</w:t>
-            </w:r>
-            <w:proofErr w:type="gramEnd"/>
-            <w:r>
-              <w:rPr>
-                <w:rFonts w:eastAsia="Times New Roman" w:cs="Times New Roman"/>
-                <w:color w:val="000000"/>
-                <w:kern w:val="0"/>
-                <w14:ligatures w14:val="none"/>
-              </w:rPr>
-              <w:t xml:space="preserve"> Descent Rate</w:t>
+            <w:r>
+              <w:rPr>
+                <w:rFonts w:eastAsia="Times New Roman" w:cs="Times New Roman"/>
+                <w:color w:val="000000"/>
+                <w:kern w:val="0"/>
+                <w14:ligatures w14:val="none"/>
+              </w:rPr>
+              <w:t>Increase Descent Rate</w:t>
             </w:r>
           </w:p>
         </w:tc>
@@ -10290,25 +10250,14 @@
                 <w14:ligatures w14:val="none"/>
               </w:rPr>
             </w:pPr>
-            <w:proofErr w:type="gramStart"/>
-            <w:r>
-              <w:rPr>
-                <w:rFonts w:eastAsia="Times New Roman" w:cs="Times New Roman"/>
-                <w:color w:val="000000"/>
-                <w:kern w:val="0"/>
-                <w14:ligatures w14:val="none"/>
-              </w:rPr>
-              <w:t>Abort</w:t>
-            </w:r>
-            <w:proofErr w:type="gramEnd"/>
-            <w:r>
-              <w:rPr>
-                <w:rFonts w:eastAsia="Times New Roman" w:cs="Times New Roman"/>
-                <w:color w:val="000000"/>
-                <w:kern w:val="0"/>
-                <w14:ligatures w14:val="none"/>
-              </w:rPr>
-              <w:t xml:space="preserve"> Stage PUSH</w:t>
+            <w:r>
+              <w:rPr>
+                <w:rFonts w:eastAsia="Times New Roman" w:cs="Times New Roman"/>
+                <w:color w:val="000000"/>
+                <w:kern w:val="0"/>
+                <w14:ligatures w14:val="none"/>
+              </w:rPr>
+              <w:t>Abort Stage PUSH</w:t>
             </w:r>
           </w:p>
         </w:tc>
@@ -10631,7 +10580,6 @@
                 <w14:ligatures w14:val="none"/>
               </w:rPr>
             </w:pPr>
-            <w:proofErr w:type="spellStart"/>
             <w:r>
               <w:rPr>
                 <w:rFonts w:eastAsia="Times New Roman" w:cs="Times New Roman"/>
@@ -10641,7 +10589,6 @@
               </w:rPr>
               <w:t>Ctrl+Alt+Numpad</w:t>
             </w:r>
-            <w:proofErr w:type="spellEnd"/>
           </w:p>
         </w:tc>
         <w:tc>
@@ -12526,7 +12473,7 @@
       <w:pPr>
         <w:pStyle w:val="Heading1"/>
       </w:pPr>
-      <w:bookmarkStart w:id="5" w:name="_Toc223681308"/>
+      <w:bookmarkStart w:id="5" w:name="_Toc226959768"/>
       <w:r>
         <w:lastRenderedPageBreak/>
         <w:t>Important Links:</w:t>

</xml_diff>

<commit_message>
add orbiter cdn link
</commit_message>
<xml_diff>
--- a/Doc/Project Apollo - NASSP/Programmers Notes/NASSP Quick Start Guide.docx
+++ b/Doc/Project Apollo - NASSP/Programmers Notes/NASSP Quick Start Guide.docx
@@ -982,7 +982,15 @@
         </w:r>
       </w:hyperlink>
       <w:r>
-        <w:t> Scroll down to "MicroTexture Pack for D3D9Client" and unzip to your Orbiter directory.</w:t>
+        <w:t> Scroll down to "</w:t>
+      </w:r>
+      <w:proofErr w:type="spellStart"/>
+      <w:r>
+        <w:t>MicroTexture</w:t>
+      </w:r>
+      <w:proofErr w:type="spellEnd"/>
+      <w:r>
+        <w:t xml:space="preserve"> Pack for D3D9Client" and unzip to your Orbiter directory.</w:t>
       </w:r>
       <w:r>
         <w:br/>
@@ -998,7 +1006,15 @@
         <w:t>-Optional:</w:t>
       </w:r>
       <w:r>
-        <w:t> Download "Apollo Landing Sites for Orbiter 2016" by ggalfi here: </w:t>
+        <w:t xml:space="preserve"> Download "Apollo Landing Sites for Orbiter 2016" by </w:t>
+      </w:r>
+      <w:proofErr w:type="spellStart"/>
+      <w:r>
+        <w:t>ggalfi</w:t>
+      </w:r>
+      <w:proofErr w:type="spellEnd"/>
+      <w:r>
+        <w:t xml:space="preserve"> here: </w:t>
       </w:r>
       <w:hyperlink r:id="rId15" w:tgtFrame="_blank" w:history="1">
         <w:r>
@@ -1108,7 +1124,23 @@
           <w:b/>
           <w:bCs/>
         </w:rPr>
-        <w:t xml:space="preserve">IMPORTANT: Click "Advanced" and add a check beside "Enable absolute animation handling" to prevent animation drift </w:t>
+        <w:t xml:space="preserve">IMPORTANT: Click "Advanced" and add a check beside "Enable absolute animation handling" to prevent </w:t>
+      </w:r>
+      <w:proofErr w:type="gramStart"/>
+      <w:r>
+        <w:rPr>
+          <w:b/>
+          <w:bCs/>
+        </w:rPr>
+        <w:t>animation drift</w:t>
+      </w:r>
+      <w:proofErr w:type="gramEnd"/>
+      <w:r>
+        <w:rPr>
+          <w:b/>
+          <w:bCs/>
+        </w:rPr>
+        <w:t xml:space="preserve"> </w:t>
       </w:r>
       <w:r>
         <w:rPr>
@@ -1143,7 +1175,15 @@
       </w:r>
       <w:r>
         <w:br/>
-        <w:t>4. Install XRSound 2.0: </w:t>
+        <w:t xml:space="preserve">4. Install </w:t>
+      </w:r>
+      <w:proofErr w:type="spellStart"/>
+      <w:r>
+        <w:t>XRSound</w:t>
+      </w:r>
+      <w:proofErr w:type="spellEnd"/>
+      <w:r>
+        <w:t xml:space="preserve"> 2.0: </w:t>
       </w:r>
       <w:hyperlink r:id="rId18" w:history="1">
         <w:r>
@@ -1175,7 +1215,15 @@
         </w:r>
       </w:hyperlink>
       <w:r>
-        <w:t xml:space="preserve"> and unzip to your Orbiter directory. Do the same with the small XRSound config zip file that can be found at the link as well. These files only </w:t>
+        <w:t xml:space="preserve"> and unzip to your Orbiter directory. Do the same with the small </w:t>
+      </w:r>
+      <w:proofErr w:type="spellStart"/>
+      <w:r>
+        <w:t>XRSound</w:t>
+      </w:r>
+      <w:proofErr w:type="spellEnd"/>
+      <w:r>
+        <w:t xml:space="preserve"> config zip file that can be found at the link as well. These files only </w:t>
       </w:r>
       <w:r>
         <w:t>must</w:t>
@@ -1207,7 +1255,23 @@
           <w:b/>
           <w:bCs/>
         </w:rPr>
-        <w:t xml:space="preserve"> For Orbiter 2016 Beta</w:t>
+        <w:t xml:space="preserve"> </w:t>
+      </w:r>
+      <w:proofErr w:type="gramStart"/>
+      <w:r>
+        <w:rPr>
+          <w:b/>
+          <w:bCs/>
+        </w:rPr>
+        <w:t>For</w:t>
+      </w:r>
+      <w:proofErr w:type="gramEnd"/>
+      <w:r>
+        <w:rPr>
+          <w:b/>
+          <w:bCs/>
+        </w:rPr>
+        <w:t xml:space="preserve"> Orbiter 2016 Beta</w:t>
       </w:r>
       <w:r>
         <w:rPr>
@@ -1240,7 +1304,31 @@
       </w:r>
       <w:r>
         <w:br/>
-        <w:t>2. Go to the "Modules" tab and activate the "XRSound" and "ProjectApolloMFD" and "ApolloRTCCMFD" modules.</w:t>
+        <w:t>2. Go to the "Modules" tab and activate the "</w:t>
+      </w:r>
+      <w:proofErr w:type="spellStart"/>
+      <w:r>
+        <w:t>XRSound</w:t>
+      </w:r>
+      <w:proofErr w:type="spellEnd"/>
+      <w:r>
+        <w:t>" and "</w:t>
+      </w:r>
+      <w:proofErr w:type="spellStart"/>
+      <w:r>
+        <w:t>ProjectApolloMFD</w:t>
+      </w:r>
+      <w:proofErr w:type="spellEnd"/>
+      <w:r>
+        <w:t>" and "</w:t>
+      </w:r>
+      <w:proofErr w:type="spellStart"/>
+      <w:r>
+        <w:t>ApolloRTCCMFD</w:t>
+      </w:r>
+      <w:proofErr w:type="spellEnd"/>
+      <w:r>
+        <w:t>" modules.</w:t>
       </w:r>
       <w:r>
         <w:br/>
@@ -1513,39 +1601,10 @@
         <w:t>.</w:t>
       </w:r>
       <w:r>
-        <w:t xml:space="preserve"> Download Orbiter 2024 Release and extract the textures folder</w:t>
-      </w:r>
-      <w:r>
-        <w:t xml:space="preserve"> into your orbiter root</w:t>
-      </w:r>
-      <w:r>
-        <w:t>.</w:t>
-      </w:r>
-      <w:r>
-        <w:t xml:space="preserve"> </w:t>
-      </w:r>
-      <w:r>
-        <w:t>This contains only Low Res textures</w:t>
-      </w:r>
-    </w:p>
-    <w:p>
-      <w:r>
-        <w:t>1b</w:t>
-      </w:r>
-      <w:r>
-        <w:t>.</w:t>
-      </w:r>
-      <w:r>
-        <w:t xml:space="preserve"> </w:t>
-      </w:r>
-      <w:r>
-        <w:t xml:space="preserve">Optionally you may </w:t>
-      </w:r>
-      <w:r>
-        <w:t xml:space="preserve">instead </w:t>
-      </w:r>
-      <w:r>
-        <w:t xml:space="preserve">download the Low Res and Landing Site Textures </w:t>
+        <w:t xml:space="preserve"> Download Orbiter 2024 Release </w:t>
+      </w:r>
+      <w:r>
+        <w:t xml:space="preserve">CDN </w:t>
       </w:r>
       <w:hyperlink r:id="rId23" w:history="1">
         <w:r>
@@ -1556,30 +1615,50 @@
         </w:r>
       </w:hyperlink>
       <w:r>
+        <w:t xml:space="preserve"> </w:t>
+      </w:r>
+      <w:r>
+        <w:t>and extract the textures folder</w:t>
+      </w:r>
+      <w:r>
+        <w:t xml:space="preserve"> into your orbiter root</w:t>
+      </w:r>
+      <w:r>
         <w:t>.</w:t>
       </w:r>
       <w:r>
-        <w:t xml:space="preserve"> Extract the Textures folder in the Low Res and LS textures zips into the orbiter root</w:t>
+        <w:t xml:space="preserve"> </w:t>
+      </w:r>
+      <w:r>
+        <w:t xml:space="preserve">This contains only </w:t>
+      </w:r>
+      <w:proofErr w:type="gramStart"/>
+      <w:r>
+        <w:t>Low Res</w:t>
+      </w:r>
+      <w:proofErr w:type="gramEnd"/>
+      <w:r>
+        <w:t xml:space="preserve"> textures</w:t>
       </w:r>
     </w:p>
     <w:p>
       <w:r>
-        <w:t>2</w:t>
+        <w:t>1b</w:t>
       </w:r>
       <w:r>
         <w:t>.</w:t>
       </w:r>
       <w:r>
-        <w:t xml:space="preserve"> If you choose to download all the </w:t>
-      </w:r>
-      <w:r>
-        <w:t>high-res</w:t>
-      </w:r>
-      <w:r>
-        <w:t xml:space="preserve"> textures</w:t>
-      </w:r>
-      <w:r>
         <w:t xml:space="preserve"> </w:t>
+      </w:r>
+      <w:r>
+        <w:t xml:space="preserve">Optionally you may </w:t>
+      </w:r>
+      <w:r>
+        <w:t xml:space="preserve">instead </w:t>
+      </w:r>
+      <w:r>
+        <w:t xml:space="preserve">download the Low Res and Landing Site Textures </w:t>
       </w:r>
       <w:hyperlink r:id="rId24" w:history="1">
         <w:r>
@@ -1590,6 +1669,40 @@
         </w:r>
       </w:hyperlink>
       <w:r>
+        <w:t>.</w:t>
+      </w:r>
+      <w:r>
+        <w:t xml:space="preserve"> Extract the Textures folder in the Low Res and LS textures zips into the orbiter root</w:t>
+      </w:r>
+    </w:p>
+    <w:p>
+      <w:r>
+        <w:t>2</w:t>
+      </w:r>
+      <w:r>
+        <w:t>.</w:t>
+      </w:r>
+      <w:r>
+        <w:t xml:space="preserve"> If you choose to download all the </w:t>
+      </w:r>
+      <w:r>
+        <w:t>high-res</w:t>
+      </w:r>
+      <w:r>
+        <w:t xml:space="preserve"> textures</w:t>
+      </w:r>
+      <w:r>
+        <w:t xml:space="preserve"> </w:t>
+      </w:r>
+      <w:hyperlink r:id="rId25" w:history="1">
+        <w:r>
+          <w:rPr>
+            <w:rStyle w:val="Hyperlink"/>
+          </w:rPr>
+          <w:t>here</w:t>
+        </w:r>
+      </w:hyperlink>
+      <w:r>
         <w:t>, make sure you have the folder organization correct (Earth/Archive and Moon/Archive) and put those into the Textures folder of your orbiter root</w:t>
       </w:r>
       <w:r>
@@ -1641,7 +1754,7 @@
       <w:r>
         <w:t xml:space="preserve">Release from </w:t>
       </w:r>
-      <w:hyperlink r:id="rId25" w:history="1">
+      <w:hyperlink r:id="rId26" w:history="1">
         <w:r>
           <w:rPr>
             <w:rStyle w:val="Hyperlink"/>
@@ -1675,7 +1788,39 @@
         <w:t>g</w:t>
       </w:r>
       <w:r>
-        <w:t>o to the "Modules" tab and activate the "ExtMFD", XRSound", "ProjectApolloMFD" and "ApolloRTCCMFD" modules. Do not use the DX9MFD as it is known to cause crashes</w:t>
+        <w:t>o to the "Modules" tab and activate the "</w:t>
+      </w:r>
+      <w:proofErr w:type="spellStart"/>
+      <w:r>
+        <w:t>ExtMFD</w:t>
+      </w:r>
+      <w:proofErr w:type="spellEnd"/>
+      <w:r>
+        <w:t xml:space="preserve">", </w:t>
+      </w:r>
+      <w:proofErr w:type="spellStart"/>
+      <w:r>
+        <w:t>XRSound</w:t>
+      </w:r>
+      <w:proofErr w:type="spellEnd"/>
+      <w:r>
+        <w:t>", "</w:t>
+      </w:r>
+      <w:proofErr w:type="spellStart"/>
+      <w:r>
+        <w:t>ProjectApolloMFD</w:t>
+      </w:r>
+      <w:proofErr w:type="spellEnd"/>
+      <w:r>
+        <w:t>" and "</w:t>
+      </w:r>
+      <w:proofErr w:type="spellStart"/>
+      <w:r>
+        <w:t>ApolloRTCCMFD</w:t>
+      </w:r>
+      <w:proofErr w:type="spellEnd"/>
+      <w:r>
+        <w:t>" modules. Do not use the DX9MFD as it is known to cause crashes</w:t>
       </w:r>
     </w:p>
     <w:p>
@@ -1686,7 +1831,15 @@
         <w:t>.</w:t>
       </w:r>
       <w:r>
-        <w:t xml:space="preserve"> In Options-&gt;Visual Settings make sure "local light sources" is enabled,</w:t>
+        <w:t xml:space="preserve"> In Options-&gt;Visual Settings make sure "local light sources" </w:t>
+      </w:r>
+      <w:proofErr w:type="gramStart"/>
+      <w:r>
+        <w:t>is</w:t>
+      </w:r>
+      <w:proofErr w:type="gramEnd"/>
+      <w:r>
+        <w:t xml:space="preserve"> enabled,</w:t>
       </w:r>
       <w:r>
         <w:t xml:space="preserve"> enable </w:t>
@@ -1879,7 +2032,15 @@
         <w:br/>
       </w:r>
       <w:r>
-        <w:t>That's ultimately up to you, but we generally recommend Apollo 8. While Apollo 7 is chronologically first, it's a very long mission that is meant to test vehicle systems and procedures from the relative safety of low Earth orbit. As such, it involves a very unusual and often repetitive schedule, with procedures that are rather unrefined. Apollo 8, by contrast, is a relatively short mission with more straightforward goals and mission design. You get to experience most of the lunar mission milestones without needing to worry about managing two separate vehicles on your first journey. After Apollo 8 concludes, Apollo 11 or 12 would be our next recommendation. You get to use the LM and land on the moon, and the procedures have been improved and optimized thanks to the lessons learned on all the previous missions.</w:t>
+        <w:t xml:space="preserve">That's ultimately up to you, but we generally recommend Apollo 8. While Apollo 7 is chronologically first, it's a very long mission that is meant to test vehicle systems and procedures from the relative safety of low Earth orbit. As such, it involves a very unusual and often repetitive schedule, with procedures that are rather unrefined. Apollo 8, by contrast, is a relatively short mission with more straightforward goals and mission design. You get to experience most of the lunar mission milestones without needing to worry about managing two separate vehicles on your first journey. After Apollo 8 concludes, Apollo 11 or 12 would be our next recommendation. You get to use </w:t>
+      </w:r>
+      <w:proofErr w:type="gramStart"/>
+      <w:r>
+        <w:t>the LM</w:t>
+      </w:r>
+      <w:proofErr w:type="gramEnd"/>
+      <w:r>
+        <w:t xml:space="preserve"> and land on the moon, and the procedures have been improved and optimized thanks to the lessons learned on all the previous missions.</w:t>
       </w:r>
       <w:r>
         <w:br/>
@@ -2042,13 +2203,29 @@
         <w:br/>
       </w:r>
       <w:r>
-        <w:t xml:space="preserve">These are pretty easy. You can </w:t>
+        <w:t xml:space="preserve">These are </w:t>
+      </w:r>
+      <w:proofErr w:type="gramStart"/>
+      <w:r>
+        <w:t>pretty easy</w:t>
+      </w:r>
+      <w:proofErr w:type="gramEnd"/>
+      <w:r>
+        <w:t xml:space="preserve">. You can </w:t>
       </w:r>
       <w:r>
         <w:t>click on the left</w:t>
       </w:r>
       <w:r>
-        <w:t xml:space="preserve"> circuit breakers to close or open them. For computer keys like the DSKY or DEDA, just click on each button to press it. If you find that the computer isn't always responding to your key presses, you may be letting go of the button too quickly. Each computer key needs to be held for a small fraction of a second, and sometimes a fast click doesn't hold the button down for quite long enough. You don't need to hold them for a long time, only for a brief moment to ensure they register.</w:t>
+        <w:t xml:space="preserve"> circuit breakers to close or open them. For computer keys like the DSKY or DEDA, just click on each button to press it. If you find that the computer isn't always responding to your key presses, you may be letting go of the button too quickly. Each computer key needs to be held for a small fraction of a second, and sometimes a fast click doesn't hold the button down for quite long enough. You don't need to hold them for a long time, only for </w:t>
+      </w:r>
+      <w:proofErr w:type="gramStart"/>
+      <w:r>
+        <w:t>a brief moment</w:t>
+      </w:r>
+      <w:proofErr w:type="gramEnd"/>
+      <w:r>
+        <w:t xml:space="preserve"> to ensure they register.</w:t>
       </w:r>
       <w:r>
         <w:br/>
@@ -2102,7 +2279,15 @@
         <w:ind w:left="360"/>
       </w:pPr>
       <w:r>
-        <w:t xml:space="preserve">Thumbwheels are the vertical numbered controls, found on the gimbal trim control panel and the attitude set control panel. Left-click the upper or lower part of each thumbwheel to increase/decrease its value by 1, or right-click them to increase/decrease by 0.1. The dV/Range Set switch on the EMS works similarly: hold </w:t>
+        <w:t xml:space="preserve">Thumbwheels are the vertical numbered controls, found on the gimbal trim control panel and the attitude set control panel. Left-click the upper or lower part of each thumbwheel to increase/decrease its value by 1, or right-click them to increase/decrease by 0.1. The </w:t>
+      </w:r>
+      <w:proofErr w:type="spellStart"/>
+      <w:r>
+        <w:t>dV</w:t>
+      </w:r>
+      <w:proofErr w:type="spellEnd"/>
+      <w:r>
+        <w:t xml:space="preserve">/Range Set switch on the EMS works similarly: hold </w:t>
       </w:r>
       <w:r>
         <w:lastRenderedPageBreak/>
@@ -2134,7 +2319,15 @@
         <w:ind w:left="360"/>
       </w:pPr>
       <w:r>
-        <w:t>While the 2D cockpit has MFDs built right into its main panel, the 3D cockpit does not. To open an MFD in the 3D cockpit, move your mouse near the top of the Orbiter window. A menu bar should drop down. Click on "Function" and then choose "External MFD". If this option does not appear, make sure the "ExtMFD" module is enabled in the Orbiter settings.</w:t>
+        <w:t>While the 2D cockpit has MFDs built right into its main panel, the 3D cockpit does not. To open an MFD in the 3D cockpit, move your mouse near the top of the Orbiter window. A menu bar should drop down. Click on "Function" and then choose "External MFD". If this option does not appear, make sure the "</w:t>
+      </w:r>
+      <w:proofErr w:type="spellStart"/>
+      <w:r>
+        <w:t>ExtMFD</w:t>
+      </w:r>
+      <w:proofErr w:type="spellEnd"/>
+      <w:r>
+        <w:t>" module is enabled in the Orbiter settings.</w:t>
       </w:r>
     </w:p>
     <w:p>
@@ -2236,7 +2429,23 @@
           <w:b/>
           <w:bCs/>
         </w:rPr>
-        <w:t xml:space="preserve"> keep your save files organized!</w:t>
+        <w:t xml:space="preserve"> keep </w:t>
+      </w:r>
+      <w:proofErr w:type="gramStart"/>
+      <w:r>
+        <w:rPr>
+          <w:b/>
+          <w:bCs/>
+        </w:rPr>
+        <w:t>your save</w:t>
+      </w:r>
+      <w:proofErr w:type="gramEnd"/>
+      <w:r>
+        <w:rPr>
+          <w:b/>
+          <w:bCs/>
+        </w:rPr>
+        <w:t xml:space="preserve"> files organized!</w:t>
       </w:r>
       <w:r>
         <w:t> </w:t>
@@ -2351,16 +2560,32 @@
         <w:t>time warp</w:t>
       </w:r>
       <w:r>
-        <w:t xml:space="preserve"> normally. It will even affect vessels that you're not currently controlling: </w:t>
+        <w:t xml:space="preserve"> normally. It will even affect vessels that you're not currently </w:t>
+      </w:r>
+      <w:proofErr w:type="gramStart"/>
+      <w:r>
+        <w:t>controlling:</w:t>
+      </w:r>
+      <w:proofErr w:type="gramEnd"/>
+      <w:r>
+        <w:t xml:space="preserve"> </w:t>
       </w:r>
       <w:r>
         <w:t>time warping</w:t>
       </w:r>
       <w:r>
-        <w:t xml:space="preserve"> in the CSM while the LM is trying to hold attitude will cause problems for the LM. Usually going up to about 5x or 10x is safe. If you want to </w:t>
-      </w:r>
-      <w:r>
-        <w:t>time warp</w:t>
+        <w:t xml:space="preserve"> in the CSM while the LM is trying to hold attitude will cause problems for the LM. Usually going up to about 5x or 10x is safe. If you want </w:t>
+      </w:r>
+      <w:proofErr w:type="gramStart"/>
+      <w:r>
+        <w:t xml:space="preserve">to </w:t>
+      </w:r>
+      <w:r>
+        <w:t>time</w:t>
+      </w:r>
+      <w:proofErr w:type="gramEnd"/>
+      <w:r>
+        <w:t xml:space="preserve"> warp</w:t>
       </w:r>
       <w:r>
         <w:t xml:space="preserve"> faster, be sure to disable any kind of attitude-hold mode in the CSM and LM before </w:t>
@@ -2397,7 +2622,23 @@
         <w:br/>
       </w:r>
       <w:r>
-        <w:t xml:space="preserve">When you're performing LM activation, be sure to use the Project Apollo MFD's "ECS" section to connect the O2 hose from the CSM. This creates a flow of fresh oxygen into the LM so that the cabin doesn't fill up with deadly CO2 and poison your crew before the LM ECS is activated. Having this O2 hose connected also prevents you from closing the CSM forward hatch, so if you can't get it </w:t>
+        <w:t xml:space="preserve">When you're performing LM activation, be sure to use </w:t>
+      </w:r>
+      <w:proofErr w:type="gramStart"/>
+      <w:r>
+        <w:t>the Project</w:t>
+      </w:r>
+      <w:proofErr w:type="gramEnd"/>
+      <w:r>
+        <w:t xml:space="preserve"> Apollo MFD's "ECS" section to connect the O2 hose from the CSM. This creates a flow of fresh oxygen into the LM so that the cabin doesn't fill up with deadly CO2 and </w:t>
+      </w:r>
+      <w:proofErr w:type="gramStart"/>
+      <w:r>
+        <w:t>poison</w:t>
+      </w:r>
+      <w:proofErr w:type="gramEnd"/>
+      <w:r>
+        <w:t xml:space="preserve"> your crew before the LM ECS is activated. Having this O2 hose connected also prevents you from closing the CSM forward hatch, so if you can't get it </w:t>
       </w:r>
       <w:r>
         <w:t>too</w:t>
@@ -2469,7 +2710,15 @@
         <w:ind w:left="360"/>
       </w:pPr>
       <w:r>
-        <w:t>If you look carefully, you will notice there are Velcro patches around the CM and LM. Clicking these will allow you to utilize various mission cue cards, window shades, glareshields etc. that were used during flight. One caveat is they are mostly Apollo 15 cue cards currently, so keep that in mind when flying other flights. We are working to find/create more mission specific cue cards in the near future.</w:t>
+        <w:t xml:space="preserve">If you look carefully, you will notice there are Velcro patches around the CM and LM. Clicking these will allow you to utilize various mission cue cards, window shades, glareshields etc. that were used during flight. One caveat is they are mostly Apollo 15 cue cards currently, so keep that in mind when flying other flights. We are working to find/create more mission specific cue cards </w:t>
+      </w:r>
+      <w:proofErr w:type="gramStart"/>
+      <w:r>
+        <w:t>in the near future</w:t>
+      </w:r>
+      <w:proofErr w:type="gramEnd"/>
+      <w:r>
+        <w:t>.</w:t>
       </w:r>
     </w:p>
     <w:p>
@@ -3052,6 +3301,7 @@
                 <w14:ligatures w14:val="none"/>
               </w:rPr>
             </w:pPr>
+            <w:proofErr w:type="spellStart"/>
             <w:r>
               <w:rPr>
                 <w:rFonts w:eastAsia="Times New Roman" w:cs="Times New Roman"/>
@@ -3061,6 +3311,7 @@
               </w:rPr>
               <w:t>Ctrl+Alt+S</w:t>
             </w:r>
+            <w:proofErr w:type="spellEnd"/>
           </w:p>
         </w:tc>
         <w:tc>
@@ -3092,8 +3343,19 @@
                 <w:kern w:val="0"/>
                 <w14:ligatures w14:val="none"/>
               </w:rPr>
-              <w:t>Generate Mission Time-Stamped Quicksave</w:t>
-            </w:r>
+              <w:t xml:space="preserve">Generate Mission Time-Stamped </w:t>
+            </w:r>
+            <w:proofErr w:type="spellStart"/>
+            <w:r>
+              <w:rPr>
+                <w:rFonts w:eastAsia="Times New Roman" w:cs="Times New Roman"/>
+                <w:color w:val="000000"/>
+                <w:kern w:val="0"/>
+                <w14:ligatures w14:val="none"/>
+              </w:rPr>
+              <w:t>Quicksave</w:t>
+            </w:r>
+            <w:proofErr w:type="spellEnd"/>
           </w:p>
         </w:tc>
       </w:tr>
@@ -3541,6 +3803,7 @@
                 <w14:ligatures w14:val="none"/>
               </w:rPr>
             </w:pPr>
+            <w:proofErr w:type="spellStart"/>
             <w:r>
               <w:rPr>
                 <w:rFonts w:eastAsia="Times New Roman" w:cs="Times New Roman"/>
@@ -3550,6 +3813,7 @@
               </w:rPr>
               <w:t>Ctrl+H</w:t>
             </w:r>
+            <w:proofErr w:type="spellEnd"/>
           </w:p>
         </w:tc>
         <w:tc>
@@ -4151,6 +4415,7 @@
                 <w14:ligatures w14:val="none"/>
               </w:rPr>
             </w:pPr>
+            <w:proofErr w:type="spellStart"/>
             <w:r>
               <w:rPr>
                 <w:rFonts w:eastAsia="Times New Roman" w:cs="Times New Roman"/>
@@ -4160,6 +4425,7 @@
               </w:rPr>
               <w:t>Alt+Numpad</w:t>
             </w:r>
+            <w:proofErr w:type="spellEnd"/>
           </w:p>
         </w:tc>
         <w:tc>
@@ -4184,6 +4450,7 @@
                 <w14:ligatures w14:val="none"/>
               </w:rPr>
             </w:pPr>
+            <w:proofErr w:type="spellStart"/>
             <w:r>
               <w:rPr>
                 <w:rFonts w:eastAsia="Times New Roman" w:cs="Times New Roman"/>
@@ -4193,6 +4460,7 @@
               </w:rPr>
               <w:t>Hardover</w:t>
             </w:r>
+            <w:proofErr w:type="spellEnd"/>
           </w:p>
         </w:tc>
       </w:tr>
@@ -4436,7 +4704,6 @@
                 <w:kern w:val="0"/>
                 <w14:ligatures w14:val="none"/>
               </w:rPr>
-              <w:lastRenderedPageBreak/>
               <w:t>DSKY</w:t>
             </w:r>
           </w:p>
@@ -4469,14 +4736,26 @@
                 <w14:ligatures w14:val="none"/>
               </w:rPr>
             </w:pPr>
-            <w:r>
-              <w:rPr>
-                <w:rFonts w:eastAsia="Times New Roman" w:cs="Times New Roman"/>
-                <w:color w:val="000000"/>
-                <w:kern w:val="0"/>
-                <w14:ligatures w14:val="none"/>
-              </w:rPr>
-              <w:t>Shift+Decimal (Numpad)</w:t>
+            <w:proofErr w:type="spellStart"/>
+            <w:r>
+              <w:rPr>
+                <w:rFonts w:eastAsia="Times New Roman" w:cs="Times New Roman"/>
+                <w:color w:val="000000"/>
+                <w:kern w:val="0"/>
+                <w14:ligatures w14:val="none"/>
+              </w:rPr>
+              <w:lastRenderedPageBreak/>
+              <w:t>Shift+Decimal</w:t>
+            </w:r>
+            <w:proofErr w:type="spellEnd"/>
+            <w:r>
+              <w:rPr>
+                <w:rFonts w:eastAsia="Times New Roman" w:cs="Times New Roman"/>
+                <w:color w:val="000000"/>
+                <w:kern w:val="0"/>
+                <w14:ligatures w14:val="none"/>
+              </w:rPr>
+              <w:t xml:space="preserve"> (Numpad)</w:t>
             </w:r>
           </w:p>
         </w:tc>
@@ -4542,14 +4821,25 @@
                 <w14:ligatures w14:val="none"/>
               </w:rPr>
             </w:pPr>
-            <w:r>
-              <w:rPr>
-                <w:rFonts w:eastAsia="Times New Roman" w:cs="Times New Roman"/>
-                <w:color w:val="000000"/>
-                <w:kern w:val="0"/>
-                <w14:ligatures w14:val="none"/>
-              </w:rPr>
-              <w:t>Shift+Page Up</w:t>
+            <w:proofErr w:type="spellStart"/>
+            <w:r>
+              <w:rPr>
+                <w:rFonts w:eastAsia="Times New Roman" w:cs="Times New Roman"/>
+                <w:color w:val="000000"/>
+                <w:kern w:val="0"/>
+                <w14:ligatures w14:val="none"/>
+              </w:rPr>
+              <w:t>Shift+Page</w:t>
+            </w:r>
+            <w:proofErr w:type="spellEnd"/>
+            <w:r>
+              <w:rPr>
+                <w:rFonts w:eastAsia="Times New Roman" w:cs="Times New Roman"/>
+                <w:color w:val="000000"/>
+                <w:kern w:val="0"/>
+                <w14:ligatures w14:val="none"/>
+              </w:rPr>
+              <w:t xml:space="preserve"> Up</w:t>
             </w:r>
           </w:p>
         </w:tc>
@@ -4615,6 +4905,7 @@
                 <w14:ligatures w14:val="none"/>
               </w:rPr>
             </w:pPr>
+            <w:proofErr w:type="spellStart"/>
             <w:r>
               <w:rPr>
                 <w:rFonts w:eastAsia="Times New Roman" w:cs="Times New Roman"/>
@@ -4624,6 +4915,7 @@
               </w:rPr>
               <w:t>Shift+Home</w:t>
             </w:r>
+            <w:proofErr w:type="spellEnd"/>
           </w:p>
         </w:tc>
         <w:tc>
@@ -4688,14 +4980,25 @@
                 <w14:ligatures w14:val="none"/>
               </w:rPr>
             </w:pPr>
-            <w:r>
-              <w:rPr>
-                <w:rFonts w:eastAsia="Times New Roman" w:cs="Times New Roman"/>
-                <w:color w:val="000000"/>
-                <w:kern w:val="0"/>
-                <w14:ligatures w14:val="none"/>
-              </w:rPr>
-              <w:t>Shift+Enter (Numpad)</w:t>
+            <w:proofErr w:type="spellStart"/>
+            <w:r>
+              <w:rPr>
+                <w:rFonts w:eastAsia="Times New Roman" w:cs="Times New Roman"/>
+                <w:color w:val="000000"/>
+                <w:kern w:val="0"/>
+                <w14:ligatures w14:val="none"/>
+              </w:rPr>
+              <w:t>Shift+Enter</w:t>
+            </w:r>
+            <w:proofErr w:type="spellEnd"/>
+            <w:r>
+              <w:rPr>
+                <w:rFonts w:eastAsia="Times New Roman" w:cs="Times New Roman"/>
+                <w:color w:val="000000"/>
+                <w:kern w:val="0"/>
+                <w14:ligatures w14:val="none"/>
+              </w:rPr>
+              <w:t xml:space="preserve"> (Numpad)</w:t>
             </w:r>
           </w:p>
         </w:tc>
@@ -4761,14 +5064,25 @@
                 <w14:ligatures w14:val="none"/>
               </w:rPr>
             </w:pPr>
-            <w:r>
-              <w:rPr>
-                <w:rFonts w:eastAsia="Times New Roman" w:cs="Times New Roman"/>
-                <w:color w:val="000000"/>
-                <w:kern w:val="0"/>
-                <w14:ligatures w14:val="none"/>
-              </w:rPr>
-              <w:t>Shift+Divide (Numpad /)</w:t>
+            <w:proofErr w:type="spellStart"/>
+            <w:r>
+              <w:rPr>
+                <w:rFonts w:eastAsia="Times New Roman" w:cs="Times New Roman"/>
+                <w:color w:val="000000"/>
+                <w:kern w:val="0"/>
+                <w14:ligatures w14:val="none"/>
+              </w:rPr>
+              <w:t>Shift+Divide</w:t>
+            </w:r>
+            <w:proofErr w:type="spellEnd"/>
+            <w:r>
+              <w:rPr>
+                <w:rFonts w:eastAsia="Times New Roman" w:cs="Times New Roman"/>
+                <w:color w:val="000000"/>
+                <w:kern w:val="0"/>
+                <w14:ligatures w14:val="none"/>
+              </w:rPr>
+              <w:t xml:space="preserve"> (Numpad /)</w:t>
             </w:r>
           </w:p>
         </w:tc>
@@ -4834,14 +5148,25 @@
                 <w14:ligatures w14:val="none"/>
               </w:rPr>
             </w:pPr>
-            <w:r>
-              <w:rPr>
-                <w:rFonts w:eastAsia="Times New Roman" w:cs="Times New Roman"/>
-                <w:color w:val="000000"/>
-                <w:kern w:val="0"/>
-                <w14:ligatures w14:val="none"/>
-              </w:rPr>
-              <w:t>Shift+Multiply (Numpad *)</w:t>
+            <w:proofErr w:type="spellStart"/>
+            <w:r>
+              <w:rPr>
+                <w:rFonts w:eastAsia="Times New Roman" w:cs="Times New Roman"/>
+                <w:color w:val="000000"/>
+                <w:kern w:val="0"/>
+                <w14:ligatures w14:val="none"/>
+              </w:rPr>
+              <w:t>Shift+Multiply</w:t>
+            </w:r>
+            <w:proofErr w:type="spellEnd"/>
+            <w:r>
+              <w:rPr>
+                <w:rFonts w:eastAsia="Times New Roman" w:cs="Times New Roman"/>
+                <w:color w:val="000000"/>
+                <w:kern w:val="0"/>
+                <w14:ligatures w14:val="none"/>
+              </w:rPr>
+              <w:t xml:space="preserve"> (Numpad *)</w:t>
             </w:r>
           </w:p>
         </w:tc>
@@ -4907,14 +5232,25 @@
                 <w14:ligatures w14:val="none"/>
               </w:rPr>
             </w:pPr>
-            <w:r>
-              <w:rPr>
-                <w:rFonts w:eastAsia="Times New Roman" w:cs="Times New Roman"/>
-                <w:color w:val="000000"/>
-                <w:kern w:val="0"/>
-                <w14:ligatures w14:val="none"/>
-              </w:rPr>
-              <w:t>Shift+Plus (Numpad +)</w:t>
+            <w:proofErr w:type="spellStart"/>
+            <w:r>
+              <w:rPr>
+                <w:rFonts w:eastAsia="Times New Roman" w:cs="Times New Roman"/>
+                <w:color w:val="000000"/>
+                <w:kern w:val="0"/>
+                <w14:ligatures w14:val="none"/>
+              </w:rPr>
+              <w:t>Shift+Plus</w:t>
+            </w:r>
+            <w:proofErr w:type="spellEnd"/>
+            <w:r>
+              <w:rPr>
+                <w:rFonts w:eastAsia="Times New Roman" w:cs="Times New Roman"/>
+                <w:color w:val="000000"/>
+                <w:kern w:val="0"/>
+                <w14:ligatures w14:val="none"/>
+              </w:rPr>
+              <w:t xml:space="preserve"> (Numpad +)</w:t>
             </w:r>
           </w:p>
         </w:tc>
@@ -4980,14 +5316,25 @@
                 <w14:ligatures w14:val="none"/>
               </w:rPr>
             </w:pPr>
-            <w:r>
-              <w:rPr>
-                <w:rFonts w:eastAsia="Times New Roman" w:cs="Times New Roman"/>
-                <w:color w:val="000000"/>
-                <w:kern w:val="0"/>
-                <w14:ligatures w14:val="none"/>
-              </w:rPr>
-              <w:t>Shift+Minus (Numpad -)</w:t>
+            <w:proofErr w:type="spellStart"/>
+            <w:r>
+              <w:rPr>
+                <w:rFonts w:eastAsia="Times New Roman" w:cs="Times New Roman"/>
+                <w:color w:val="000000"/>
+                <w:kern w:val="0"/>
+                <w14:ligatures w14:val="none"/>
+              </w:rPr>
+              <w:t>Shift+Minus</w:t>
+            </w:r>
+            <w:proofErr w:type="spellEnd"/>
+            <w:r>
+              <w:rPr>
+                <w:rFonts w:eastAsia="Times New Roman" w:cs="Times New Roman"/>
+                <w:color w:val="000000"/>
+                <w:kern w:val="0"/>
+                <w14:ligatures w14:val="none"/>
+              </w:rPr>
+              <w:t xml:space="preserve"> (Numpad -)</w:t>
             </w:r>
           </w:p>
         </w:tc>
@@ -5053,6 +5400,7 @@
                 <w14:ligatures w14:val="none"/>
               </w:rPr>
             </w:pPr>
+            <w:proofErr w:type="spellStart"/>
             <w:r>
               <w:rPr>
                 <w:rFonts w:eastAsia="Times New Roman" w:cs="Times New Roman"/>
@@ -5062,6 +5410,7 @@
               </w:rPr>
               <w:t>Shift+End</w:t>
             </w:r>
+            <w:proofErr w:type="spellEnd"/>
           </w:p>
         </w:tc>
         <w:tc>
@@ -6653,6 +7002,7 @@
                 <w14:ligatures w14:val="none"/>
               </w:rPr>
             </w:pPr>
+            <w:proofErr w:type="spellStart"/>
             <w:r>
               <w:rPr>
                 <w:rFonts w:eastAsia="Times New Roman" w:cs="Times New Roman"/>
@@ -6662,6 +7012,7 @@
               </w:rPr>
               <w:t>Shift+W</w:t>
             </w:r>
+            <w:proofErr w:type="spellEnd"/>
           </w:p>
         </w:tc>
         <w:tc>
@@ -6726,6 +7077,7 @@
                 <w14:ligatures w14:val="none"/>
               </w:rPr>
             </w:pPr>
+            <w:proofErr w:type="spellStart"/>
             <w:r>
               <w:rPr>
                 <w:rFonts w:eastAsia="Times New Roman" w:cs="Times New Roman"/>
@@ -6735,6 +7087,7 @@
               </w:rPr>
               <w:t>Shift+S</w:t>
             </w:r>
+            <w:proofErr w:type="spellEnd"/>
           </w:p>
         </w:tc>
         <w:tc>
@@ -6799,6 +7152,7 @@
                 <w14:ligatures w14:val="none"/>
               </w:rPr>
             </w:pPr>
+            <w:proofErr w:type="spellStart"/>
             <w:r>
               <w:rPr>
                 <w:rFonts w:eastAsia="Times New Roman" w:cs="Times New Roman"/>
@@ -6808,6 +7162,7 @@
               </w:rPr>
               <w:t>Shift+A</w:t>
             </w:r>
+            <w:proofErr w:type="spellEnd"/>
           </w:p>
         </w:tc>
         <w:tc>
@@ -6872,6 +7227,7 @@
                 <w14:ligatures w14:val="none"/>
               </w:rPr>
             </w:pPr>
+            <w:proofErr w:type="spellStart"/>
             <w:r>
               <w:rPr>
                 <w:rFonts w:eastAsia="Times New Roman" w:cs="Times New Roman"/>
@@ -6881,6 +7237,7 @@
               </w:rPr>
               <w:t>Shift+D</w:t>
             </w:r>
+            <w:proofErr w:type="spellEnd"/>
           </w:p>
         </w:tc>
         <w:tc>
@@ -6945,6 +7302,7 @@
                 <w14:ligatures w14:val="none"/>
               </w:rPr>
             </w:pPr>
+            <w:proofErr w:type="spellStart"/>
             <w:r>
               <w:rPr>
                 <w:rFonts w:eastAsia="Times New Roman" w:cs="Times New Roman"/>
@@ -6954,6 +7312,7 @@
               </w:rPr>
               <w:t>Shift+Q</w:t>
             </w:r>
+            <w:proofErr w:type="spellEnd"/>
           </w:p>
         </w:tc>
         <w:tc>
@@ -7018,6 +7377,7 @@
                 <w14:ligatures w14:val="none"/>
               </w:rPr>
             </w:pPr>
+            <w:proofErr w:type="spellStart"/>
             <w:r>
               <w:rPr>
                 <w:rFonts w:eastAsia="Times New Roman" w:cs="Times New Roman"/>
@@ -7027,6 +7387,7 @@
               </w:rPr>
               <w:t>Shift+E</w:t>
             </w:r>
+            <w:proofErr w:type="spellEnd"/>
           </w:p>
         </w:tc>
         <w:tc>
@@ -8280,14 +8641,25 @@
                 <w14:ligatures w14:val="none"/>
               </w:rPr>
             </w:pPr>
-            <w:r>
-              <w:rPr>
-                <w:rFonts w:eastAsia="Times New Roman" w:cs="Times New Roman"/>
-                <w:color w:val="000000"/>
-                <w:kern w:val="0"/>
-                <w14:ligatures w14:val="none"/>
-              </w:rPr>
-              <w:t>Ctrl+Decimal (Numpad .)</w:t>
+            <w:proofErr w:type="spellStart"/>
+            <w:r>
+              <w:rPr>
+                <w:rFonts w:eastAsia="Times New Roman" w:cs="Times New Roman"/>
+                <w:color w:val="000000"/>
+                <w:kern w:val="0"/>
+                <w14:ligatures w14:val="none"/>
+              </w:rPr>
+              <w:t>Ctrl+Decimal</w:t>
+            </w:r>
+            <w:proofErr w:type="spellEnd"/>
+            <w:r>
+              <w:rPr>
+                <w:rFonts w:eastAsia="Times New Roman" w:cs="Times New Roman"/>
+                <w:color w:val="000000"/>
+                <w:kern w:val="0"/>
+                <w14:ligatures w14:val="none"/>
+              </w:rPr>
+              <w:t xml:space="preserve"> (Numpad .)</w:t>
             </w:r>
           </w:p>
         </w:tc>
@@ -8353,14 +8725,25 @@
                 <w14:ligatures w14:val="none"/>
               </w:rPr>
             </w:pPr>
-            <w:r>
-              <w:rPr>
-                <w:rFonts w:eastAsia="Times New Roman" w:cs="Times New Roman"/>
-                <w:color w:val="000000"/>
-                <w:kern w:val="0"/>
-                <w14:ligatures w14:val="none"/>
-              </w:rPr>
-              <w:t>Ctrl+Enter (Numpad)</w:t>
+            <w:proofErr w:type="spellStart"/>
+            <w:r>
+              <w:rPr>
+                <w:rFonts w:eastAsia="Times New Roman" w:cs="Times New Roman"/>
+                <w:color w:val="000000"/>
+                <w:kern w:val="0"/>
+                <w14:ligatures w14:val="none"/>
+              </w:rPr>
+              <w:t>Ctrl+Enter</w:t>
+            </w:r>
+            <w:proofErr w:type="spellEnd"/>
+            <w:r>
+              <w:rPr>
+                <w:rFonts w:eastAsia="Times New Roman" w:cs="Times New Roman"/>
+                <w:color w:val="000000"/>
+                <w:kern w:val="0"/>
+                <w14:ligatures w14:val="none"/>
+              </w:rPr>
+              <w:t xml:space="preserve"> (Numpad)</w:t>
             </w:r>
           </w:p>
         </w:tc>
@@ -8426,14 +8809,25 @@
                 <w14:ligatures w14:val="none"/>
               </w:rPr>
             </w:pPr>
-            <w:r>
-              <w:rPr>
-                <w:rFonts w:eastAsia="Times New Roman" w:cs="Times New Roman"/>
-                <w:color w:val="000000"/>
-                <w:kern w:val="0"/>
-                <w14:ligatures w14:val="none"/>
-              </w:rPr>
-              <w:t>Ctrl+Page Up</w:t>
+            <w:proofErr w:type="spellStart"/>
+            <w:r>
+              <w:rPr>
+                <w:rFonts w:eastAsia="Times New Roman" w:cs="Times New Roman"/>
+                <w:color w:val="000000"/>
+                <w:kern w:val="0"/>
+                <w14:ligatures w14:val="none"/>
+              </w:rPr>
+              <w:t>Ctrl+Page</w:t>
+            </w:r>
+            <w:proofErr w:type="spellEnd"/>
+            <w:r>
+              <w:rPr>
+                <w:rFonts w:eastAsia="Times New Roman" w:cs="Times New Roman"/>
+                <w:color w:val="000000"/>
+                <w:kern w:val="0"/>
+                <w14:ligatures w14:val="none"/>
+              </w:rPr>
+              <w:t xml:space="preserve"> Up</w:t>
             </w:r>
           </w:p>
         </w:tc>
@@ -8499,14 +8893,25 @@
                 <w14:ligatures w14:val="none"/>
               </w:rPr>
             </w:pPr>
-            <w:r>
-              <w:rPr>
-                <w:rFonts w:eastAsia="Times New Roman" w:cs="Times New Roman"/>
-                <w:color w:val="000000"/>
-                <w:kern w:val="0"/>
-                <w14:ligatures w14:val="none"/>
-              </w:rPr>
-              <w:t>Ctrl+Multiply (Numpad *)</w:t>
+            <w:proofErr w:type="spellStart"/>
+            <w:r>
+              <w:rPr>
+                <w:rFonts w:eastAsia="Times New Roman" w:cs="Times New Roman"/>
+                <w:color w:val="000000"/>
+                <w:kern w:val="0"/>
+                <w14:ligatures w14:val="none"/>
+              </w:rPr>
+              <w:t>Ctrl+Multiply</w:t>
+            </w:r>
+            <w:proofErr w:type="spellEnd"/>
+            <w:r>
+              <w:rPr>
+                <w:rFonts w:eastAsia="Times New Roman" w:cs="Times New Roman"/>
+                <w:color w:val="000000"/>
+                <w:kern w:val="0"/>
+                <w14:ligatures w14:val="none"/>
+              </w:rPr>
+              <w:t xml:space="preserve"> (Numpad *)</w:t>
             </w:r>
           </w:p>
         </w:tc>
@@ -8572,14 +8977,25 @@
                 <w14:ligatures w14:val="none"/>
               </w:rPr>
             </w:pPr>
-            <w:r>
-              <w:rPr>
-                <w:rFonts w:eastAsia="Times New Roman" w:cs="Times New Roman"/>
-                <w:color w:val="000000"/>
-                <w:kern w:val="0"/>
-                <w14:ligatures w14:val="none"/>
-              </w:rPr>
-              <w:t>Ctrl+Plus (Numpad +)</w:t>
+            <w:proofErr w:type="spellStart"/>
+            <w:r>
+              <w:rPr>
+                <w:rFonts w:eastAsia="Times New Roman" w:cs="Times New Roman"/>
+                <w:color w:val="000000"/>
+                <w:kern w:val="0"/>
+                <w14:ligatures w14:val="none"/>
+              </w:rPr>
+              <w:t>Ctrl+Plus</w:t>
+            </w:r>
+            <w:proofErr w:type="spellEnd"/>
+            <w:r>
+              <w:rPr>
+                <w:rFonts w:eastAsia="Times New Roman" w:cs="Times New Roman"/>
+                <w:color w:val="000000"/>
+                <w:kern w:val="0"/>
+                <w14:ligatures w14:val="none"/>
+              </w:rPr>
+              <w:t xml:space="preserve"> (Numpad +)</w:t>
             </w:r>
           </w:p>
         </w:tc>
@@ -8645,14 +9061,25 @@
                 <w14:ligatures w14:val="none"/>
               </w:rPr>
             </w:pPr>
-            <w:r>
-              <w:rPr>
-                <w:rFonts w:eastAsia="Times New Roman" w:cs="Times New Roman"/>
-                <w:color w:val="000000"/>
-                <w:kern w:val="0"/>
-                <w14:ligatures w14:val="none"/>
-              </w:rPr>
-              <w:t>Ctrl+Minus (Numpad -)</w:t>
+            <w:proofErr w:type="spellStart"/>
+            <w:r>
+              <w:rPr>
+                <w:rFonts w:eastAsia="Times New Roman" w:cs="Times New Roman"/>
+                <w:color w:val="000000"/>
+                <w:kern w:val="0"/>
+                <w14:ligatures w14:val="none"/>
+              </w:rPr>
+              <w:t>Ctrl+Minus</w:t>
+            </w:r>
+            <w:proofErr w:type="spellEnd"/>
+            <w:r>
+              <w:rPr>
+                <w:rFonts w:eastAsia="Times New Roman" w:cs="Times New Roman"/>
+                <w:color w:val="000000"/>
+                <w:kern w:val="0"/>
+                <w14:ligatures w14:val="none"/>
+              </w:rPr>
+              <w:t xml:space="preserve"> (Numpad -)</w:t>
             </w:r>
           </w:p>
         </w:tc>
@@ -9111,6 +9538,7 @@
                 <w14:ligatures w14:val="none"/>
               </w:rPr>
             </w:pPr>
+            <w:proofErr w:type="spellStart"/>
             <w:r>
               <w:rPr>
                 <w:rFonts w:eastAsia="Times New Roman" w:cs="Times New Roman"/>
@@ -9120,6 +9548,7 @@
               </w:rPr>
               <w:t>Alt+W</w:t>
             </w:r>
+            <w:proofErr w:type="spellEnd"/>
           </w:p>
         </w:tc>
         <w:tc>
@@ -9257,6 +9686,7 @@
                 <w14:ligatures w14:val="none"/>
               </w:rPr>
             </w:pPr>
+            <w:proofErr w:type="spellStart"/>
             <w:r>
               <w:rPr>
                 <w:rFonts w:eastAsia="Times New Roman" w:cs="Times New Roman"/>
@@ -9266,6 +9696,7 @@
               </w:rPr>
               <w:t>Alt+S</w:t>
             </w:r>
+            <w:proofErr w:type="spellEnd"/>
           </w:p>
         </w:tc>
         <w:tc>
@@ -9684,14 +10115,25 @@
                 <w14:ligatures w14:val="none"/>
               </w:rPr>
             </w:pPr>
-            <w:r>
-              <w:rPr>
-                <w:rFonts w:eastAsia="Times New Roman" w:cs="Times New Roman"/>
-                <w:color w:val="000000"/>
-                <w:kern w:val="0"/>
-                <w14:ligatures w14:val="none"/>
-              </w:rPr>
-              <w:t>Increase Descent Rate</w:t>
+            <w:proofErr w:type="gramStart"/>
+            <w:r>
+              <w:rPr>
+                <w:rFonts w:eastAsia="Times New Roman" w:cs="Times New Roman"/>
+                <w:color w:val="000000"/>
+                <w:kern w:val="0"/>
+                <w14:ligatures w14:val="none"/>
+              </w:rPr>
+              <w:t>Increase</w:t>
+            </w:r>
+            <w:proofErr w:type="gramEnd"/>
+            <w:r>
+              <w:rPr>
+                <w:rFonts w:eastAsia="Times New Roman" w:cs="Times New Roman"/>
+                <w:color w:val="000000"/>
+                <w:kern w:val="0"/>
+                <w14:ligatures w14:val="none"/>
+              </w:rPr>
+              <w:t xml:space="preserve"> Descent Rate</w:t>
             </w:r>
           </w:p>
         </w:tc>
@@ -10250,14 +10692,25 @@
                 <w14:ligatures w14:val="none"/>
               </w:rPr>
             </w:pPr>
-            <w:r>
-              <w:rPr>
-                <w:rFonts w:eastAsia="Times New Roman" w:cs="Times New Roman"/>
-                <w:color w:val="000000"/>
-                <w:kern w:val="0"/>
-                <w14:ligatures w14:val="none"/>
-              </w:rPr>
-              <w:t>Abort Stage PUSH</w:t>
+            <w:proofErr w:type="gramStart"/>
+            <w:r>
+              <w:rPr>
+                <w:rFonts w:eastAsia="Times New Roman" w:cs="Times New Roman"/>
+                <w:color w:val="000000"/>
+                <w:kern w:val="0"/>
+                <w14:ligatures w14:val="none"/>
+              </w:rPr>
+              <w:t>Abort</w:t>
+            </w:r>
+            <w:proofErr w:type="gramEnd"/>
+            <w:r>
+              <w:rPr>
+                <w:rFonts w:eastAsia="Times New Roman" w:cs="Times New Roman"/>
+                <w:color w:val="000000"/>
+                <w:kern w:val="0"/>
+                <w14:ligatures w14:val="none"/>
+              </w:rPr>
+              <w:t xml:space="preserve"> Stage PUSH</w:t>
             </w:r>
           </w:p>
         </w:tc>
@@ -10580,6 +11033,7 @@
                 <w14:ligatures w14:val="none"/>
               </w:rPr>
             </w:pPr>
+            <w:proofErr w:type="spellStart"/>
             <w:r>
               <w:rPr>
                 <w:rFonts w:eastAsia="Times New Roman" w:cs="Times New Roman"/>
@@ -10589,6 +11043,7 @@
               </w:rPr>
               <w:t>Ctrl+Alt+Numpad</w:t>
             </w:r>
+            <w:proofErr w:type="spellEnd"/>
           </w:p>
         </w:tc>
         <w:tc>
@@ -12481,7 +12936,7 @@
       <w:bookmarkEnd w:id="5"/>
     </w:p>
     <w:p>
-      <w:hyperlink r:id="rId26" w:history="1">
+      <w:hyperlink r:id="rId27" w:history="1">
         <w:r>
           <w:rPr>
             <w:rStyle w:val="Hyperlink"/>
@@ -12500,7 +12955,7 @@
       </w:r>
     </w:p>
     <w:p>
-      <w:hyperlink r:id="rId27" w:history="1">
+      <w:hyperlink r:id="rId28" w:history="1">
         <w:r>
           <w:rPr>
             <w:rStyle w:val="Hyperlink"/>
@@ -12516,7 +12971,7 @@
       </w:r>
     </w:p>
     <w:p>
-      <w:hyperlink r:id="rId28" w:history="1">
+      <w:hyperlink r:id="rId29" w:history="1">
         <w:r>
           <w:rPr>
             <w:rStyle w:val="Hyperlink"/>
@@ -12541,7 +12996,7 @@
       </w:r>
     </w:p>
     <w:p>
-      <w:hyperlink r:id="rId29" w:history="1">
+      <w:hyperlink r:id="rId30" w:history="1">
         <w:r>
           <w:rPr>
             <w:rStyle w:val="Hyperlink"/>
@@ -12554,7 +13009,7 @@
       </w:r>
     </w:p>
     <w:p>
-      <w:hyperlink r:id="rId30" w:history="1">
+      <w:hyperlink r:id="rId31" w:history="1">
         <w:r>
           <w:rPr>
             <w:rStyle w:val="Hyperlink"/>
@@ -12567,7 +13022,7 @@
       </w:r>
     </w:p>
     <w:p>
-      <w:hyperlink r:id="rId31" w:history="1">
+      <w:hyperlink r:id="rId32" w:history="1">
         <w:r>
           <w:rPr>
             <w:rStyle w:val="Hyperlink"/>
@@ -12583,7 +13038,7 @@
       </w:r>
     </w:p>
     <w:p>
-      <w:hyperlink r:id="rId32" w:history="1">
+      <w:hyperlink r:id="rId33" w:history="1">
         <w:r>
           <w:rPr>
             <w:rStyle w:val="Hyperlink"/>
@@ -12597,7 +13052,7 @@
     </w:p>
     <w:p/>
     <w:sectPr>
-      <w:footerReference w:type="default" r:id="rId33"/>
+      <w:footerReference w:type="default" r:id="rId34"/>
       <w:pgSz w:w="12240" w:h="15840"/>
       <w:pgMar w:top="1440" w:right="1440" w:bottom="1440" w:left="1440" w:header="720" w:footer="720" w:gutter="0"/>
       <w:cols w:space="720"/>

</xml_diff>

<commit_message>
Add VC optics notes and suit helmet/gloves notes
</commit_message>
<xml_diff>
--- a/Doc/Project Apollo - NASSP/Programmers Notes/NASSP Quick Start Guide.docx
+++ b/Doc/Project Apollo - NASSP/Programmers Notes/NASSP Quick Start Guide.docx
@@ -42,7 +42,7 @@
           <w:b w:val="0"/>
           <w:bCs w:val="0"/>
         </w:rPr>
-        <w:t>3</w:t>
+        <w:t>4</w:t>
       </w:r>
     </w:p>
     <w:p>
@@ -60,7 +60,15 @@
           <w:b w:val="0"/>
           <w:bCs w:val="0"/>
         </w:rPr>
-        <w:t>12</w:t>
+        <w:t>1</w:t>
+      </w:r>
+      <w:r>
+        <w:rPr>
+          <w:rStyle w:val="IntenseReference"/>
+          <w:b w:val="0"/>
+          <w:bCs w:val="0"/>
+        </w:rPr>
+        <w:t>3</w:t>
       </w:r>
       <w:r>
         <w:rPr>
@@ -76,7 +84,7 @@
           <w:b w:val="0"/>
           <w:bCs w:val="0"/>
         </w:rPr>
-        <w:t>APR</w:t>
+        <w:t>JUN</w:t>
       </w:r>
       <w:r>
         <w:rPr>
@@ -149,7 +157,7 @@
           <w:r>
             <w:fldChar w:fldCharType="separate"/>
           </w:r>
-          <w:hyperlink w:anchor="_Toc229900492" w:history="1">
+          <w:hyperlink w:anchor="_Toc232239547" w:history="1">
             <w:r>
               <w:rPr>
                 <w:rStyle w:val="Hyperlink"/>
@@ -176,7 +184,7 @@
                 <w:noProof/>
                 <w:webHidden/>
               </w:rPr>
-              <w:instrText xml:space="preserve"> PAGEREF _Toc229900492 \h </w:instrText>
+              <w:instrText xml:space="preserve"> PAGEREF _Toc232239547 \h </w:instrText>
             </w:r>
             <w:r>
               <w:rPr>
@@ -220,7 +228,7 @@
               <w:szCs w:val="24"/>
             </w:rPr>
           </w:pPr>
-          <w:hyperlink w:anchor="_Toc229900493" w:history="1">
+          <w:hyperlink w:anchor="_Toc232239548" w:history="1">
             <w:r>
               <w:rPr>
                 <w:rStyle w:val="Hyperlink"/>
@@ -247,7 +255,7 @@
                 <w:noProof/>
                 <w:webHidden/>
               </w:rPr>
-              <w:instrText xml:space="preserve"> PAGEREF _Toc229900493 \h </w:instrText>
+              <w:instrText xml:space="preserve"> PAGEREF _Toc232239548 \h </w:instrText>
             </w:r>
             <w:r>
               <w:rPr>
@@ -291,7 +299,7 @@
               <w:szCs w:val="24"/>
             </w:rPr>
           </w:pPr>
-          <w:hyperlink w:anchor="_Toc229900494" w:history="1">
+          <w:hyperlink w:anchor="_Toc232239549" w:history="1">
             <w:r>
               <w:rPr>
                 <w:rStyle w:val="Hyperlink"/>
@@ -318,7 +326,7 @@
                 <w:noProof/>
                 <w:webHidden/>
               </w:rPr>
-              <w:instrText xml:space="preserve"> PAGEREF _Toc229900494 \h </w:instrText>
+              <w:instrText xml:space="preserve"> PAGEREF _Toc232239549 \h </w:instrText>
             </w:r>
             <w:r>
               <w:rPr>
@@ -362,7 +370,7 @@
               <w:szCs w:val="24"/>
             </w:rPr>
           </w:pPr>
-          <w:hyperlink w:anchor="_Toc229900495" w:history="1">
+          <w:hyperlink w:anchor="_Toc232239550" w:history="1">
             <w:r>
               <w:rPr>
                 <w:rStyle w:val="Hyperlink"/>
@@ -389,7 +397,7 @@
                 <w:noProof/>
                 <w:webHidden/>
               </w:rPr>
-              <w:instrText xml:space="preserve"> PAGEREF _Toc229900495 \h </w:instrText>
+              <w:instrText xml:space="preserve"> PAGEREF _Toc232239550 \h </w:instrText>
             </w:r>
             <w:r>
               <w:rPr>
@@ -409,7 +417,7 @@
                 <w:noProof/>
                 <w:webHidden/>
               </w:rPr>
-              <w:t>12</w:t>
+              <w:t>13</w:t>
             </w:r>
             <w:r>
               <w:rPr>
@@ -433,7 +441,7 @@
               <w:szCs w:val="24"/>
             </w:rPr>
           </w:pPr>
-          <w:hyperlink w:anchor="_Toc229900496" w:history="1">
+          <w:hyperlink w:anchor="_Toc232239551" w:history="1">
             <w:r>
               <w:rPr>
                 <w:rStyle w:val="Hyperlink"/>
@@ -460,7 +468,7 @@
                 <w:noProof/>
                 <w:webHidden/>
               </w:rPr>
-              <w:instrText xml:space="preserve"> PAGEREF _Toc229900496 \h </w:instrText>
+              <w:instrText xml:space="preserve"> PAGEREF _Toc232239551 \h </w:instrText>
             </w:r>
             <w:r>
               <w:rPr>
@@ -480,7 +488,7 @@
                 <w:noProof/>
                 <w:webHidden/>
               </w:rPr>
-              <w:t>17</w:t>
+              <w:t>18</w:t>
             </w:r>
             <w:r>
               <w:rPr>
@@ -677,7 +685,7 @@
       <w:pPr>
         <w:pStyle w:val="Heading1"/>
       </w:pPr>
-      <w:bookmarkStart w:id="0" w:name="_Toc229900492"/>
+      <w:bookmarkStart w:id="0" w:name="_Toc232239547"/>
       <w:r>
         <w:t>Installation (NASSP 8</w:t>
       </w:r>
@@ -982,15 +990,7 @@
         </w:r>
       </w:hyperlink>
       <w:r>
-        <w:t> Scroll down to "</w:t>
-      </w:r>
-      <w:proofErr w:type="spellStart"/>
-      <w:r>
-        <w:t>MicroTexture</w:t>
-      </w:r>
-      <w:proofErr w:type="spellEnd"/>
-      <w:r>
-        <w:t xml:space="preserve"> Pack for D3D9Client" and unzip to your Orbiter directory.</w:t>
+        <w:t> Scroll down to "MicroTexture Pack for D3D9Client" and unzip to your Orbiter directory.</w:t>
       </w:r>
       <w:r>
         <w:br/>
@@ -1006,15 +1006,7 @@
         <w:t>-Optional:</w:t>
       </w:r>
       <w:r>
-        <w:t xml:space="preserve"> Download "Apollo Landing Sites for Orbiter 2016" by </w:t>
-      </w:r>
-      <w:proofErr w:type="spellStart"/>
-      <w:r>
-        <w:t>ggalfi</w:t>
-      </w:r>
-      <w:proofErr w:type="spellEnd"/>
-      <w:r>
-        <w:t xml:space="preserve"> here: </w:t>
+        <w:t> Download "Apollo Landing Sites for Orbiter 2016" by ggalfi here: </w:t>
       </w:r>
       <w:hyperlink r:id="rId15" w:tgtFrame="_blank" w:history="1">
         <w:r>
@@ -1124,23 +1116,7 @@
           <w:b/>
           <w:bCs/>
         </w:rPr>
-        <w:t xml:space="preserve">IMPORTANT: Click "Advanced" and add a check beside "Enable absolute animation handling" to prevent </w:t>
-      </w:r>
-      <w:proofErr w:type="gramStart"/>
-      <w:r>
-        <w:rPr>
-          <w:b/>
-          <w:bCs/>
-        </w:rPr>
-        <w:t>animation drift</w:t>
-      </w:r>
-      <w:proofErr w:type="gramEnd"/>
-      <w:r>
-        <w:rPr>
-          <w:b/>
-          <w:bCs/>
-        </w:rPr>
-        <w:t xml:space="preserve"> </w:t>
+        <w:t xml:space="preserve">IMPORTANT: Click "Advanced" and add a check beside "Enable absolute animation handling" to prevent animation drift </w:t>
       </w:r>
       <w:r>
         <w:rPr>
@@ -1175,15 +1151,7 @@
       </w:r>
       <w:r>
         <w:br/>
-        <w:t xml:space="preserve">4. Install </w:t>
-      </w:r>
-      <w:proofErr w:type="spellStart"/>
-      <w:r>
-        <w:t>XRSound</w:t>
-      </w:r>
-      <w:proofErr w:type="spellEnd"/>
-      <w:r>
-        <w:t xml:space="preserve"> 2.0: </w:t>
+        <w:t>4. Install XRSound 2.0: </w:t>
       </w:r>
       <w:hyperlink r:id="rId18" w:history="1">
         <w:r>
@@ -1215,15 +1183,7 @@
         </w:r>
       </w:hyperlink>
       <w:r>
-        <w:t xml:space="preserve"> and unzip to your Orbiter directory. Do the same with the small </w:t>
-      </w:r>
-      <w:proofErr w:type="spellStart"/>
-      <w:r>
-        <w:t>XRSound</w:t>
-      </w:r>
-      <w:proofErr w:type="spellEnd"/>
-      <w:r>
-        <w:t xml:space="preserve"> config zip file that can be found at the link as well. These files only </w:t>
+        <w:t xml:space="preserve"> and unzip to your Orbiter directory. Do the same with the small XRSound config zip file that can be found at the link as well. These files only </w:t>
       </w:r>
       <w:r>
         <w:t>must</w:t>
@@ -1255,23 +1215,7 @@
           <w:b/>
           <w:bCs/>
         </w:rPr>
-        <w:t xml:space="preserve"> </w:t>
-      </w:r>
-      <w:proofErr w:type="gramStart"/>
-      <w:r>
-        <w:rPr>
-          <w:b/>
-          <w:bCs/>
-        </w:rPr>
-        <w:t>For</w:t>
-      </w:r>
-      <w:proofErr w:type="gramEnd"/>
-      <w:r>
-        <w:rPr>
-          <w:b/>
-          <w:bCs/>
-        </w:rPr>
-        <w:t xml:space="preserve"> Orbiter 2016 Beta</w:t>
+        <w:t xml:space="preserve"> For Orbiter 2016 Beta</w:t>
       </w:r>
       <w:r>
         <w:rPr>
@@ -1304,31 +1248,7 @@
       </w:r>
       <w:r>
         <w:br/>
-        <w:t>2. Go to the "Modules" tab and activate the "</w:t>
-      </w:r>
-      <w:proofErr w:type="spellStart"/>
-      <w:r>
-        <w:t>XRSound</w:t>
-      </w:r>
-      <w:proofErr w:type="spellEnd"/>
-      <w:r>
-        <w:t>" and "</w:t>
-      </w:r>
-      <w:proofErr w:type="spellStart"/>
-      <w:r>
-        <w:t>ProjectApolloMFD</w:t>
-      </w:r>
-      <w:proofErr w:type="spellEnd"/>
-      <w:r>
-        <w:t>" and "</w:t>
-      </w:r>
-      <w:proofErr w:type="spellStart"/>
-      <w:r>
-        <w:t>ApolloRTCCMFD</w:t>
-      </w:r>
-      <w:proofErr w:type="spellEnd"/>
-      <w:r>
-        <w:t>" modules.</w:t>
+        <w:t>2. Go to the "Modules" tab and activate the "XRSound" and "ProjectApolloMFD" and "ApolloRTCCMFD" modules.</w:t>
       </w:r>
       <w:r>
         <w:br/>
@@ -1508,7 +1428,7 @@
       <w:pPr>
         <w:pStyle w:val="Heading1"/>
       </w:pPr>
-      <w:bookmarkStart w:id="1" w:name="_Toc229900493"/>
+      <w:bookmarkStart w:id="1" w:name="_Toc232239548"/>
       <w:r>
         <w:lastRenderedPageBreak/>
         <w:t xml:space="preserve">Installation (NASSP </w:t>
@@ -1644,15 +1564,7 @@
         <w:t xml:space="preserve"> </w:t>
       </w:r>
       <w:r>
-        <w:t xml:space="preserve">This contains only </w:t>
-      </w:r>
-      <w:proofErr w:type="gramStart"/>
-      <w:r>
-        <w:t>Low Res</w:t>
-      </w:r>
-      <w:proofErr w:type="gramEnd"/>
-      <w:r>
-        <w:t xml:space="preserve"> textures</w:t>
+        <w:t>This contains only Low Res textures</w:t>
       </w:r>
     </w:p>
     <w:p>
@@ -1802,39 +1714,7 @@
         <w:t>g</w:t>
       </w:r>
       <w:r>
-        <w:t>o to the "Modules" tab and activate the "</w:t>
-      </w:r>
-      <w:proofErr w:type="spellStart"/>
-      <w:r>
-        <w:t>ExtMFD</w:t>
-      </w:r>
-      <w:proofErr w:type="spellEnd"/>
-      <w:r>
-        <w:t xml:space="preserve">", </w:t>
-      </w:r>
-      <w:proofErr w:type="spellStart"/>
-      <w:r>
-        <w:t>XRSound</w:t>
-      </w:r>
-      <w:proofErr w:type="spellEnd"/>
-      <w:r>
-        <w:t>", "</w:t>
-      </w:r>
-      <w:proofErr w:type="spellStart"/>
-      <w:r>
-        <w:t>ProjectApolloMFD</w:t>
-      </w:r>
-      <w:proofErr w:type="spellEnd"/>
-      <w:r>
-        <w:t>" and "</w:t>
-      </w:r>
-      <w:proofErr w:type="spellStart"/>
-      <w:r>
-        <w:t>ApolloRTCCMFD</w:t>
-      </w:r>
-      <w:proofErr w:type="spellEnd"/>
-      <w:r>
-        <w:t>" modules. Do not use the DX9MFD as it is known to cause crashes</w:t>
+        <w:t>o to the "Modules" tab and activate the "ExtMFD", XRSound", "ProjectApolloMFD" and "ApolloRTCCMFD" modules. Do not use the DX9MFD as it is known to cause crashes</w:t>
       </w:r>
     </w:p>
     <w:p>
@@ -1845,15 +1725,7 @@
         <w:t>.</w:t>
       </w:r>
       <w:r>
-        <w:t xml:space="preserve"> In Options-&gt;Visual Settings make sure "local light sources" </w:t>
-      </w:r>
-      <w:proofErr w:type="gramStart"/>
-      <w:r>
-        <w:t>is</w:t>
-      </w:r>
-      <w:proofErr w:type="gramEnd"/>
-      <w:r>
-        <w:t xml:space="preserve"> enabled,</w:t>
+        <w:t xml:space="preserve"> In Options-&gt;Visual Settings make sure "local light sources" is enabled,</w:t>
       </w:r>
       <w:r>
         <w:t xml:space="preserve"> enable </w:t>
@@ -2019,7 +1891,7 @@
       <w:pPr>
         <w:pStyle w:val="Heading1"/>
       </w:pPr>
-      <w:bookmarkStart w:id="2" w:name="_Toc229900494"/>
+      <w:bookmarkStart w:id="2" w:name="_Toc232239549"/>
       <w:r>
         <w:lastRenderedPageBreak/>
         <w:t>Tips For Beginners:</w:t>
@@ -2045,15 +1917,7 @@
         <w:br/>
       </w:r>
       <w:r>
-        <w:t xml:space="preserve">That's ultimately up to you, but we generally recommend Apollo 8. While Apollo 7 is chronologically first, it's a very long mission that is meant to test vehicle systems and procedures from the relative safety of low Earth orbit. As such, it involves a very unusual and often repetitive schedule, with procedures that are rather unrefined. Apollo 8, by contrast, is a relatively short mission with more straightforward goals and mission design. You get to experience most of the lunar mission milestones without needing to worry about managing two separate vehicles on your first journey. After Apollo 8 concludes, Apollo 11 or 12 would be our next recommendation. You get to use </w:t>
-      </w:r>
-      <w:proofErr w:type="gramStart"/>
-      <w:r>
-        <w:t>the LM</w:t>
-      </w:r>
-      <w:proofErr w:type="gramEnd"/>
-      <w:r>
-        <w:t xml:space="preserve"> and land on the moon, and the procedures have been improved and optimized thanks to the lessons learned on all the previous missions.</w:t>
+        <w:t>That's ultimately up to you, but we generally recommend Apollo 8. While Apollo 7 is chronologically first, it's a very long mission that is meant to test vehicle systems and procedures from the relative safety of low Earth orbit. As such, it involves a very unusual and often repetitive schedule, with procedures that are rather unrefined. Apollo 8, by contrast, is a relatively short mission with more straightforward goals and mission design. You get to experience most of the lunar mission milestones without needing to worry about managing two separate vehicles on your first journey. After Apollo 8 concludes, Apollo 11 or 12 would be our next recommendation. You get to use the LM and land on the moon, and the procedures have been improved and optimized thanks to the lessons learned on all the previous missions.</w:t>
       </w:r>
       <w:r>
         <w:br/>
@@ -2123,535 +1987,13 @@
       <w:r>
         <w:t>of NASSP over the last few years, so we strongly recommend using the 3D cockpit whenever possible. </w:t>
       </w:r>
-      <w:r>
-        <w:rPr>
-          <w:b/>
-          <w:bCs/>
-        </w:rPr>
-        <w:t>To switch between the 2D cockpit and the more modern 3D cockpit, press the F8 key.</w:t>
-      </w:r>
-      <w:r>
-        <w:t> You will need to do this occasionally, because the CSM and LM optics views are only functional in the 2D view. We do hope to add optics support to the 3D cockpit, but adding this functionality is complicated and we don't currently have the knowledge to do so. Also, be sure to use the lighting knobs inside each vehicle's cockpit to adjust the lights to your liking.</w:t>
-      </w:r>
-      <w:r>
-        <w:br/>
-      </w:r>
     </w:p>
     <w:p>
       <w:pPr>
         <w:ind w:left="360"/>
       </w:pPr>
       <w:r>
-        <w:rPr>
-          <w:b/>
-          <w:bCs/>
-        </w:rPr>
-        <w:t>How do I move around the cockpit? </w:t>
-      </w:r>
-      <w:r>
-        <w:rPr>
-          <w:b/>
-          <w:bCs/>
-        </w:rPr>
-        <w:br/>
-      </w:r>
-      <w:r>
-        <w:t xml:space="preserve">The 2D and 3D cockpit views are divided up into multiple viewpoints, usually centered on a specific panel or group of panels. Think of these a bit like choosing which "seat" you're positioned at in the spacecraft. In each view, you can use the arrow keys to move the camera up, down, left, and right. You can switch between </w:t>
-      </w:r>
-      <w:r>
-        <w:lastRenderedPageBreak/>
-        <w:t>these seats by holding the Control/Ctrl key and pressing an arrow key. It may take some time to get used to where each of the viewpoints are located within the cockpit. In the 3D cockpit specifically, from any "seat" you can hold Ctrl and Alt and press an arrow key to adjust the camera to one of several preset angles, to help get a better view of certain switches or components in that area. For example, from the left seat of the CM, you can press Ctrl + Alt + Right Arrow to zoom the camera in on the DSKY, or Ctrl + Alt + Left Arrow to look to your left, at the side panels near your armrest. Every "seat" has its own set of preset views, many of which are very helpful in finding switches that are out of sight or not as easily viewable.</w:t>
-      </w:r>
-      <w:r>
-        <w:br/>
-      </w:r>
-    </w:p>
-    <w:p>
-      <w:pPr>
-        <w:ind w:left="360"/>
-      </w:pPr>
-      <w:r>
-        <w:rPr>
-          <w:b/>
-          <w:bCs/>
-        </w:rPr>
-        <w:t>How do I interact with switches? </w:t>
-      </w:r>
-      <w:r>
-        <w:rPr>
-          <w:b/>
-          <w:bCs/>
-        </w:rPr>
-        <w:br/>
-      </w:r>
-      <w:r>
-        <w:t xml:space="preserve">Most switches can be controlled by </w:t>
-      </w:r>
-      <w:r>
-        <w:t>left clicking</w:t>
-      </w:r>
-      <w:r>
-        <w:t>. Click slightly above the switch to push it up, and slightly below to push it down. Some switches may have three positions, so to move the switch from its "up" position to the "down" position, you'll need to click twice. If a switch has a guard or cover, right-click the switch to open or close its cover.</w:t>
-      </w:r>
-      <w:r>
-        <w:br/>
-      </w:r>
-    </w:p>
-    <w:p>
-      <w:pPr>
-        <w:ind w:left="360"/>
-      </w:pPr>
-      <w:r>
-        <w:rPr>
-          <w:b/>
-          <w:bCs/>
-        </w:rPr>
-        <w:t>How do I interact with circuit breakers and computer keys? </w:t>
-      </w:r>
-      <w:r>
-        <w:rPr>
-          <w:b/>
-          <w:bCs/>
-        </w:rPr>
-        <w:br/>
-      </w:r>
-      <w:r>
-        <w:t xml:space="preserve">These are </w:t>
-      </w:r>
-      <w:proofErr w:type="gramStart"/>
-      <w:r>
-        <w:t>pretty easy</w:t>
-      </w:r>
-      <w:proofErr w:type="gramEnd"/>
-      <w:r>
-        <w:t xml:space="preserve">. You can </w:t>
-      </w:r>
-      <w:r>
-        <w:t>click on the left</w:t>
-      </w:r>
-      <w:r>
-        <w:t xml:space="preserve"> circuit breakers to close or open them. For computer keys like the DSKY or DEDA, just click on each button to press it. If you find that the computer isn't always responding to your key presses, you may be letting go of the button too quickly. Each computer key needs to be held for a small fraction of a second, and sometimes a fast click doesn't hold the button down for quite long enough. You don't need to hold them for a long time, only for </w:t>
-      </w:r>
-      <w:proofErr w:type="gramStart"/>
-      <w:r>
-        <w:t>a brief moment</w:t>
-      </w:r>
-      <w:proofErr w:type="gramEnd"/>
-      <w:r>
-        <w:t xml:space="preserve"> to ensure they register.</w:t>
-      </w:r>
-      <w:r>
-        <w:br/>
-      </w:r>
-    </w:p>
-    <w:p>
-      <w:pPr>
-        <w:ind w:left="360"/>
-        <w:rPr>
-          <w:b/>
-          <w:bCs/>
-        </w:rPr>
-      </w:pPr>
-      <w:r>
-        <w:rPr>
-          <w:b/>
-          <w:bCs/>
-        </w:rPr>
-        <w:t>How do I interact with rheostats/knobs? </w:t>
-      </w:r>
-    </w:p>
-    <w:p>
-      <w:pPr>
-        <w:ind w:left="360"/>
-      </w:pPr>
-      <w:r>
-        <w:t>A "rheostat" is one of the gray knob-like controls. Some of these work differently than others. Certain rheostats for controlling the cockpit lighting or the S-Band antenna angles are continuous, meaning they can be rotated freely to any position. To adjust these, click and hold on the knob, and then drag left or right to adjust its position. For other rheostats with discrete positions, left-click to rotate the knob to the left, and right-click to rotate it to the right.</w:t>
-      </w:r>
-      <w:r>
-        <w:br/>
-      </w:r>
-    </w:p>
-    <w:p>
-      <w:pPr>
-        <w:ind w:left="360"/>
-        <w:rPr>
-          <w:b/>
-          <w:bCs/>
-        </w:rPr>
-      </w:pPr>
-      <w:r>
-        <w:rPr>
-          <w:b/>
-          <w:bCs/>
-        </w:rPr>
-        <w:t>How do I interact with thumbwheels? </w:t>
-      </w:r>
-    </w:p>
-    <w:p>
-      <w:pPr>
-        <w:ind w:left="360"/>
-      </w:pPr>
-      <w:r>
-        <w:t xml:space="preserve">Thumbwheels are the vertical numbered controls, found on the gimbal trim control panel and the attitude set control panel. Left-click the upper or lower part of each thumbwheel to increase/decrease its value by 1, or right-click them to increase/decrease by 0.1. The </w:t>
-      </w:r>
-      <w:proofErr w:type="spellStart"/>
-      <w:r>
-        <w:t>dV</w:t>
-      </w:r>
-      <w:proofErr w:type="spellEnd"/>
-      <w:r>
-        <w:t xml:space="preserve">/Range Set switch on the EMS works similarly: hold the switch on the top or bottom to increase or decrease the </w:t>
-      </w:r>
-      <w:r>
-        <w:t>value and</w:t>
-      </w:r>
-      <w:r>
-        <w:t xml:space="preserve"> left-click or right-click to do so fast/slowly.</w:t>
-      </w:r>
-    </w:p>
-    <w:p>
-      <w:pPr>
-        <w:ind w:left="360"/>
-        <w:rPr>
-          <w:rStyle w:val="Strong"/>
-        </w:rPr>
-      </w:pPr>
-      <w:r>
-        <w:rPr>
-          <w:rStyle w:val="Strong"/>
-        </w:rPr>
-        <w:lastRenderedPageBreak/>
-        <w:t>MFD’s and things.</w:t>
-      </w:r>
-    </w:p>
-    <w:p>
-      <w:pPr>
-        <w:ind w:left="360"/>
-      </w:pPr>
-      <w:r>
-        <w:t>While the 2D cockpit has MFDs built right into its main panel, the 3D cockpit does not. To open an MFD in the 3D cockpit, move your mouse near the top of the Orbiter window. A menu bar should drop down. Click on "Function" and then choose "External MFD". If this option does not appear, make sure the "</w:t>
-      </w:r>
-      <w:proofErr w:type="spellStart"/>
-      <w:r>
-        <w:t>ExtMFD</w:t>
-      </w:r>
-      <w:proofErr w:type="spellEnd"/>
-      <w:r>
-        <w:t>" module is enabled in the Orbiter settings.</w:t>
-      </w:r>
-    </w:p>
-    <w:p>
-      <w:pPr>
-        <w:ind w:left="360"/>
-      </w:pPr>
-      <w:r>
-        <w:t>When looking at the Checklist MFD, you'll notice the text has multiple colors. Green checklist entries will automatically proceed once the relevant switch, circuit breaker, button, etc. is in the correct position. Yellow entries need to be manually verified/</w:t>
-      </w:r>
-      <w:r>
-        <w:t>completed and</w:t>
-      </w:r>
-      <w:r>
-        <w:t xml:space="preserve"> then proceeded past with the "PRO" button on the MFD. Blue entries indicate a jump to another checklist within the current one. Sometimes these happen automatically, or you may need to click "PRO" or "FAIL" to decide whether you want to activate the new checklist or skip it. To enable or disable the auto-proceed function of the checklist, click the "AUTO" button on the MFD.</w:t>
-      </w:r>
-    </w:p>
-    <w:p>
-      <w:pPr>
-        <w:ind w:left="360"/>
-      </w:pPr>
-      <w:r>
-        <w:t>If you need to navigate to another part of the current checklist being displayed, you can use the UP/DN or PG UP/PG DN buttons to temporarily move the cursor to a different entry in the checklist. Then, click "GOTO" to confirm you want to move to this new location, or "BACK" to return to the previous location.</w:t>
-      </w:r>
-    </w:p>
-    <w:p>
-      <w:pPr>
-        <w:ind w:left="360"/>
-      </w:pPr>
-      <w:r>
-        <w:t>For optics sightings, you'll need to enable the AGC star markers. To do this, move your mouse near the top of the Orbiter window. A menu bar should drop down. Choose "Options", then choose "Visual helpers &gt; Planetarium". Make sure to enable "Planetarium mode (F9)" and then enable "Celestial markers</w:t>
-      </w:r>
-      <w:r>
-        <w:t>” and</w:t>
-      </w:r>
-      <w:r>
-        <w:t xml:space="preserve"> ensure "Apollo AGC navigation stars" is selected. Now, you should be able to see green markers indicating the positions, ID numbers, and names of the stars that the AGC knows about. Once you've enabled the markers in the settings window, you can quickly toggle them on or off with the F9 key.</w:t>
-      </w:r>
-    </w:p>
-    <w:p>
-      <w:pPr>
-        <w:ind w:left="360"/>
-      </w:pPr>
-      <w:r>
-        <w:t xml:space="preserve">Additionally, when you mark a star, you want to mark the center of the crosshair and not the star pixel. Orbiter’s star map has current star positions where the computer is expecting the locations circa 1970, so the crosshair center represents the star’s location when Apollo was flying. </w:t>
-      </w:r>
-      <w:r>
-        <w:br/>
-      </w:r>
-    </w:p>
-    <w:p>
-      <w:pPr>
-        <w:ind w:left="360"/>
-      </w:pPr>
-      <w:r>
-        <w:rPr>
-          <w:b/>
-          <w:bCs/>
-        </w:rPr>
-        <w:t>Take screenshots of your PADs, always! </w:t>
-      </w:r>
-      <w:r>
-        <w:rPr>
-          <w:b/>
-          <w:bCs/>
-        </w:rPr>
-        <w:br/>
-      </w:r>
-      <w:r>
-        <w:t>On missions with automated MCC support, you'll periodically receive Pre-Advisory Data (PAD) on the left side of the screen. Whenever you receive one of these, it's a good idea to take a screenshot of this data and save it somewhere. Each new PAD will replace the previous one, and certain parts of a mission might send you several over the course of a few minutes, so you will often need to keep track of them longer than the automated system keeps them there. Additionally, if you ever encounter problems with a burn or a trajectory calculation, sending us your PAD for that maneuver can be useful for debugging and troubleshooting.</w:t>
-      </w:r>
-      <w:r>
-        <w:br/>
-      </w:r>
-    </w:p>
-    <w:p>
-      <w:pPr>
-        <w:ind w:left="360"/>
-      </w:pPr>
-      <w:r>
-        <w:rPr>
-          <w:b/>
-          <w:bCs/>
-        </w:rPr>
-        <w:lastRenderedPageBreak/>
-        <w:t xml:space="preserve">Save </w:t>
-      </w:r>
-      <w:r>
-        <w:rPr>
-          <w:b/>
-          <w:bCs/>
-        </w:rPr>
-        <w:t>frequently and</w:t>
-      </w:r>
-      <w:r>
-        <w:rPr>
-          <w:b/>
-          <w:bCs/>
-        </w:rPr>
-        <w:t xml:space="preserve"> keep </w:t>
-      </w:r>
-      <w:proofErr w:type="gramStart"/>
-      <w:r>
-        <w:rPr>
-          <w:b/>
-          <w:bCs/>
-        </w:rPr>
-        <w:t>your save</w:t>
-      </w:r>
-      <w:proofErr w:type="gramEnd"/>
-      <w:r>
-        <w:rPr>
-          <w:b/>
-          <w:bCs/>
-        </w:rPr>
-        <w:t xml:space="preserve"> files organized!</w:t>
-      </w:r>
-      <w:r>
-        <w:t> </w:t>
-      </w:r>
-      <w:r>
-        <w:br/>
-      </w:r>
-      <w:r>
-        <w:t>While we work hard to make sure the sim is stable and the instructions are clear, glitches and human errors can cause problems. Saving often and organizing those save files will help ensure that any issues don't result in losing hours of progress. I find it's helpful to periodically rename my latest save file to the mission time when I saved, plus a short remark about what I was doing.</w:t>
-      </w:r>
-      <w:r>
-        <w:br/>
-      </w:r>
-    </w:p>
-    <w:p>
-      <w:pPr>
-        <w:ind w:left="360"/>
-      </w:pPr>
-      <w:r>
-        <w:rPr>
-          <w:b/>
-          <w:bCs/>
-        </w:rPr>
-        <w:t xml:space="preserve">Be careful with </w:t>
-      </w:r>
-      <w:r>
-        <w:rPr>
-          <w:b/>
-          <w:bCs/>
-        </w:rPr>
-        <w:t>time warp</w:t>
-      </w:r>
-      <w:r>
-        <w:rPr>
-          <w:b/>
-          <w:bCs/>
-        </w:rPr>
-        <w:t>!</w:t>
-      </w:r>
-      <w:r>
-        <w:t> </w:t>
-      </w:r>
-      <w:r>
-        <w:br/>
-      </w:r>
-      <w:r>
-        <w:t xml:space="preserve">NASSP does a lot of complex calculations in the background, and </w:t>
-      </w:r>
-      <w:r>
-        <w:t>time warping</w:t>
-      </w:r>
-      <w:r>
-        <w:t xml:space="preserve"> too fast can cause these calculations to fail, which can cause your current simulation session to temporarily glitch or completely break. As a rule of thumb, if you notice that the simulator's framerate is dropping significantly when you use </w:t>
-      </w:r>
-      <w:r>
-        <w:t>time warp</w:t>
-      </w:r>
-      <w:r>
-        <w:t xml:space="preserve">, it probably means you are going too fast. We developers have moderately powerful computers, but they're far from high-end, mega-expensive machines. We can usually manage somewhere between 50x and 100x </w:t>
-      </w:r>
-      <w:r>
-        <w:t>time warp</w:t>
-      </w:r>
-      <w:r>
-        <w:t xml:space="preserve"> at the absolute maximum.</w:t>
-      </w:r>
-      <w:r>
-        <w:br/>
-      </w:r>
-    </w:p>
-    <w:p>
-      <w:pPr>
-        <w:ind w:left="360"/>
-      </w:pPr>
-      <w:r>
-        <w:rPr>
-          <w:b/>
-          <w:bCs/>
-        </w:rPr>
-        <w:t xml:space="preserve">Be careful with </w:t>
-      </w:r>
-      <w:r>
-        <w:rPr>
-          <w:b/>
-          <w:bCs/>
-        </w:rPr>
-        <w:t>time warp</w:t>
-      </w:r>
-      <w:r>
-        <w:rPr>
-          <w:b/>
-          <w:bCs/>
-        </w:rPr>
-        <w:t>, part 2!</w:t>
-      </w:r>
-      <w:r>
-        <w:t> </w:t>
-      </w:r>
-      <w:r>
-        <w:br/>
-      </w:r>
-      <w:r>
-        <w:t xml:space="preserve">If any vessel is actively maneuvering or holding attitude (attempting to rotate or remain stationary with RCS turned on), be aware that high </w:t>
-      </w:r>
-      <w:r>
-        <w:t>time warp</w:t>
-      </w:r>
-      <w:r>
-        <w:t xml:space="preserve"> levels can cause them to waste fuel or even spin out of control. This is a limitation of how we simulate the physics of RCS, and it may happen even if your computer is able to deal with fast </w:t>
-      </w:r>
-      <w:r>
-        <w:t>time warp</w:t>
-      </w:r>
-      <w:r>
-        <w:t xml:space="preserve"> normally. It will even affect vessels that you're not currently </w:t>
-      </w:r>
-      <w:proofErr w:type="gramStart"/>
-      <w:r>
-        <w:t>controlling:</w:t>
-      </w:r>
-      <w:proofErr w:type="gramEnd"/>
-      <w:r>
-        <w:t xml:space="preserve"> </w:t>
-      </w:r>
-      <w:r>
-        <w:t>time warping</w:t>
-      </w:r>
-      <w:r>
-        <w:t xml:space="preserve"> in the CSM while the LM is trying to hold attitude will cause problems for the LM. Usually going up to about 5x or 10x is safe. If you want </w:t>
-      </w:r>
-      <w:proofErr w:type="gramStart"/>
-      <w:r>
-        <w:t xml:space="preserve">to </w:t>
-      </w:r>
-      <w:r>
-        <w:t>time</w:t>
-      </w:r>
-      <w:proofErr w:type="gramEnd"/>
-      <w:r>
-        <w:t xml:space="preserve"> warp</w:t>
-      </w:r>
-      <w:r>
-        <w:t xml:space="preserve"> faster, be sure to disable any kind of attitude-hold mode in the CSM and LM before </w:t>
-      </w:r>
-      <w:r>
-        <w:t>continuing but</w:t>
-      </w:r>
-      <w:r>
-        <w:t xml:space="preserve"> watch out to make sure you don't slowly drift into gimbal lock!</w:t>
-      </w:r>
-      <w:r>
-        <w:t xml:space="preserve"> This is especially important for rest periods using any control mode during PTC like Apollo 8. Just as above, on Apollo 8 SCS PTC, disabling attitude control (SC CONT – CMC and CMC MODE – FREE) is advised for rest periods or extended warp in PTC.</w:t>
-      </w:r>
-      <w:r>
-        <w:br/>
-      </w:r>
-    </w:p>
-    <w:p>
-      <w:pPr>
-        <w:ind w:left="360"/>
-      </w:pPr>
-      <w:r>
-        <w:rPr>
-          <w:b/>
-          <w:bCs/>
-        </w:rPr>
-        <w:t>Remember the CSM O2 Hose. </w:t>
-      </w:r>
-      <w:r>
-        <w:rPr>
-          <w:b/>
-          <w:bCs/>
-        </w:rPr>
-        <w:br/>
-      </w:r>
-      <w:r>
-        <w:t xml:space="preserve">When you're performing LM activation, be sure to use </w:t>
-      </w:r>
-      <w:proofErr w:type="gramStart"/>
-      <w:r>
-        <w:t>the Project</w:t>
-      </w:r>
-      <w:proofErr w:type="gramEnd"/>
-      <w:r>
-        <w:t xml:space="preserve"> Apollo MFD's "ECS" section to connect the O2 hose from the CSM. This creates a flow of fresh oxygen into the LM so that the cabin doesn't fill up with deadly CO2 and </w:t>
-      </w:r>
-      <w:proofErr w:type="gramStart"/>
-      <w:r>
-        <w:t>poison</w:t>
-      </w:r>
-      <w:proofErr w:type="gramEnd"/>
-      <w:r>
-        <w:t xml:space="preserve"> your crew before the LM ECS is activated. Having this O2 hose connected also prevents you from closing the CSM forward hatch, so if you can't get it </w:t>
-      </w:r>
-      <w:r>
-        <w:t>too</w:t>
-      </w:r>
-      <w:r>
-        <w:t xml:space="preserve"> close, make sure you've disconnected the hose.</w:t>
+        <w:t>To switch between the 2D cockpit and the more modern 3D cockpit, press the F8 key.  Also, be sure to use the lighting knobs inside each vehicle's cockpit to adjust the lights to your liking.</w:t>
       </w:r>
       <w:r>
         <w:br/>
@@ -2666,12 +2008,570 @@
       <w:pPr>
         <w:ind w:left="360"/>
       </w:pPr>
+    </w:p>
+    <w:p>
+      <w:pPr>
+        <w:ind w:left="360"/>
+      </w:pPr>
+    </w:p>
+    <w:p>
+      <w:pPr>
+        <w:ind w:left="360"/>
+      </w:pPr>
+    </w:p>
+    <w:p>
+      <w:pPr>
+        <w:ind w:left="360"/>
+      </w:pPr>
       <w:r>
         <w:rPr>
           <w:b/>
           <w:bCs/>
         </w:rPr>
         <w:lastRenderedPageBreak/>
+        <w:t>How do I move around the cockpit? </w:t>
+      </w:r>
+      <w:r>
+        <w:rPr>
+          <w:b/>
+          <w:bCs/>
+        </w:rPr>
+        <w:br/>
+      </w:r>
+      <w:r>
+        <w:t>The 2D and 3D cockpit views are divided up into multiple viewpoints, usually centered on a specific panel or group of panels. Think of these a bit like choosing which "seat" you're positioned at in the spacecraft. In each view, you can use the arrow keys to move the camera up, down, left, and right. You can switch between these seats by holding the Control/Ctrl key and pressing an arrow key. It may take some time to get used to where each of the viewpoints are located within the cockpit. In the 3D cockpit specifically, from any "seat" you can hold Ctrl and Alt and press an arrow key to adjust the camera to one of several preset angles, to help get a better view of certain switches or components in that area. For example, from the left seat of the CM, you can press Ctrl + Alt + Right Arrow to zoom the camera in on the DSKY, or Ctrl + Alt + Left Arrow to look to your left, at the side panels near your armrest. Every "seat" has its own set of preset views, many of which are very helpful in finding switches that are out of sight or not as easily viewable.</w:t>
+      </w:r>
+      <w:r>
+        <w:br/>
+      </w:r>
+    </w:p>
+    <w:p>
+      <w:pPr>
+        <w:ind w:left="360"/>
+      </w:pPr>
+      <w:r>
+        <w:rPr>
+          <w:b/>
+          <w:bCs/>
+        </w:rPr>
+        <w:t>How do I interact with switches? </w:t>
+      </w:r>
+      <w:r>
+        <w:rPr>
+          <w:b/>
+          <w:bCs/>
+        </w:rPr>
+        <w:br/>
+      </w:r>
+      <w:r>
+        <w:t xml:space="preserve">Most switches can be controlled by </w:t>
+      </w:r>
+      <w:r>
+        <w:t>left clicking</w:t>
+      </w:r>
+      <w:r>
+        <w:t>. Click slightly above the switch to push it up, and slightly below to push it down. Some switches may have three positions, so to move the switch from its "up" position to the "down" position, you'll need to click twice. If a switch has a guard or cover, right-click the switch to open or close its cover.</w:t>
+      </w:r>
+      <w:r>
+        <w:br/>
+      </w:r>
+    </w:p>
+    <w:p>
+      <w:pPr>
+        <w:ind w:left="360"/>
+      </w:pPr>
+      <w:r>
+        <w:rPr>
+          <w:b/>
+          <w:bCs/>
+        </w:rPr>
+        <w:t>How do I interact with circuit breakers and computer keys? </w:t>
+      </w:r>
+      <w:r>
+        <w:rPr>
+          <w:b/>
+          <w:bCs/>
+        </w:rPr>
+        <w:br/>
+      </w:r>
+      <w:r>
+        <w:t xml:space="preserve">These are pretty easy. You can </w:t>
+      </w:r>
+      <w:r>
+        <w:t>click on the left</w:t>
+      </w:r>
+      <w:r>
+        <w:t xml:space="preserve"> circuit breakers to close or open them. For computer keys like the DSKY or DEDA, just click on each button to press it. If you find that the computer isn't always responding to your key presses, you may be letting go of the button too quickly. Each computer key needs to be held for a small fraction of a second, and sometimes a fast click doesn't hold the button down for quite long enough. You don't need to hold them for a long time, only for a brief moment to ensure they register.</w:t>
+      </w:r>
+      <w:r>
+        <w:br/>
+      </w:r>
+    </w:p>
+    <w:p>
+      <w:pPr>
+        <w:ind w:left="360"/>
+        <w:rPr>
+          <w:b/>
+          <w:bCs/>
+        </w:rPr>
+      </w:pPr>
+      <w:r>
+        <w:rPr>
+          <w:b/>
+          <w:bCs/>
+        </w:rPr>
+        <w:t>How do I interact with rheostats/knobs? </w:t>
+      </w:r>
+    </w:p>
+    <w:p>
+      <w:pPr>
+        <w:ind w:left="360"/>
+      </w:pPr>
+      <w:r>
+        <w:t>A "rheostat" is one of the gray knob-like controls. Some of these work differently than others. Certain rheostats for controlling the cockpit lighting or the S-Band antenna angles are continuous, meaning they can be rotated freely to any position. To adjust these, click and hold on the knob, and then drag left or right to adjust its position. For other rheostats with discrete positions, left-click to rotate the knob to the left, and right-click to rotate it to the right.</w:t>
+      </w:r>
+      <w:r>
+        <w:br/>
+      </w:r>
+    </w:p>
+    <w:p>
+      <w:pPr>
+        <w:ind w:left="360"/>
+      </w:pPr>
+    </w:p>
+    <w:p>
+      <w:pPr>
+        <w:ind w:left="360"/>
+      </w:pPr>
+    </w:p>
+    <w:p>
+      <w:pPr>
+        <w:ind w:left="360"/>
+        <w:rPr>
+          <w:b/>
+          <w:bCs/>
+        </w:rPr>
+      </w:pPr>
+      <w:r>
+        <w:rPr>
+          <w:b/>
+          <w:bCs/>
+        </w:rPr>
+        <w:lastRenderedPageBreak/>
+        <w:t>How do I interact with thumbwheels? </w:t>
+      </w:r>
+    </w:p>
+    <w:p>
+      <w:pPr>
+        <w:ind w:left="360"/>
+      </w:pPr>
+      <w:r>
+        <w:t xml:space="preserve">Thumbwheels are the vertical numbered controls, found on the gimbal trim control panel and the attitude set control panel. Left-click the upper or lower part of each thumbwheel to increase/decrease its value by 1, or right-click them to increase/decrease by 0.1. The dV/Range Set switch on the EMS works similarly: hold the switch on the top or bottom to increase or decrease the </w:t>
+      </w:r>
+      <w:r>
+        <w:t>value and</w:t>
+      </w:r>
+      <w:r>
+        <w:t xml:space="preserve"> left-click or right-click to do so fast/slowly.</w:t>
+      </w:r>
+    </w:p>
+    <w:p>
+      <w:pPr>
+        <w:ind w:left="360"/>
+        <w:rPr>
+          <w:rStyle w:val="Strong"/>
+        </w:rPr>
+      </w:pPr>
+      <w:r>
+        <w:rPr>
+          <w:rStyle w:val="Strong"/>
+        </w:rPr>
+        <w:t>MFD’s and things.</w:t>
+      </w:r>
+    </w:p>
+    <w:p>
+      <w:pPr>
+        <w:ind w:left="360"/>
+      </w:pPr>
+      <w:r>
+        <w:t>While the 2D cockpit has MFDs built right into its main panel, the 3D cockpit does not. To open an MFD in the 3D cockpit, move your mouse near the top of the Orbiter window. A menu bar should drop down. Click on "Function" and then choose "External MFD". If this option does not appear, make sure the "ExtMFD" module is enabled in the Orbiter settings.</w:t>
+      </w:r>
+    </w:p>
+    <w:p>
+      <w:pPr>
+        <w:ind w:left="360"/>
+      </w:pPr>
+      <w:r>
+        <w:t>When looking at the Checklist MFD, you'll notice the text has multiple colors. Green checklist entries will automatically proceed once the relevant switch, circuit breaker, button, etc. is in the correct position. Yellow entries need to be manually verified/</w:t>
+      </w:r>
+      <w:r>
+        <w:t>completed and</w:t>
+      </w:r>
+      <w:r>
+        <w:t xml:space="preserve"> then proceeded past with the "PRO" button on the MFD. Blue entries indicate a jump to another checklist within the current one. Sometimes these happen automatically, or you may need to click "PRO" or "FAIL" to decide whether you want to activate the new checklist or skip it. To enable or disable the auto-proceed function of the checklist, click the "AUTO" button on the MFD.</w:t>
+      </w:r>
+    </w:p>
+    <w:p>
+      <w:pPr>
+        <w:ind w:left="360"/>
+      </w:pPr>
+      <w:r>
+        <w:t>If you need to navigate to another part of the current checklist being displayed, you can use the UP/DN or PG UP/PG DN buttons to temporarily move the cursor to a different entry in the checklist. Then, click "GOTO" to confirm you want to move to this new location, or "BACK" to return to the previous location.</w:t>
+      </w:r>
+    </w:p>
+    <w:p>
+      <w:pPr>
+        <w:ind w:left="360"/>
+      </w:pPr>
+    </w:p>
+    <w:p>
+      <w:pPr>
+        <w:ind w:left="360"/>
+      </w:pPr>
+    </w:p>
+    <w:p>
+      <w:pPr>
+        <w:ind w:left="360"/>
+      </w:pPr>
+    </w:p>
+    <w:p>
+      <w:pPr>
+        <w:ind w:left="360"/>
+      </w:pPr>
+    </w:p>
+    <w:p>
+      <w:pPr>
+        <w:ind w:left="360"/>
+      </w:pPr>
+    </w:p>
+    <w:p>
+      <w:pPr>
+        <w:ind w:left="360"/>
+      </w:pPr>
+    </w:p>
+    <w:p>
+      <w:pPr>
+        <w:ind w:left="360"/>
+      </w:pPr>
+    </w:p>
+    <w:p>
+      <w:pPr>
+        <w:ind w:left="360"/>
+      </w:pPr>
+    </w:p>
+    <w:p>
+      <w:pPr>
+        <w:ind w:left="360"/>
+      </w:pPr>
+    </w:p>
+    <w:p>
+      <w:pPr>
+        <w:ind w:left="360"/>
+      </w:pPr>
+    </w:p>
+    <w:p>
+      <w:pPr>
+        <w:ind w:left="360"/>
+        <w:rPr>
+          <w:rStyle w:val="Strong"/>
+        </w:rPr>
+      </w:pPr>
+      <w:r>
+        <w:rPr>
+          <w:rStyle w:val="Strong"/>
+        </w:rPr>
+        <w:lastRenderedPageBreak/>
+        <w:t>Optics</w:t>
+      </w:r>
+    </w:p>
+    <w:p>
+      <w:pPr>
+        <w:ind w:left="360"/>
+      </w:pPr>
+      <w:r>
+        <w:t>For optics sightings, you'll need to enable the AGC star markers. To do this, move your mouse near the top of the Orbiter window. A menu bar should drop down. Choose "Options", then choose "Visual helpers &gt; Planetarium". Make sure to enable "Planetarium mode (F9)" and then enable "Celestial markers</w:t>
+      </w:r>
+      <w:r>
+        <w:t>” and</w:t>
+      </w:r>
+      <w:r>
+        <w:t xml:space="preserve"> ensure "Apollo AGC navigation stars" is selected. Now, you should be able to see green markers indicating the positions, ID numbers, and names of the stars that the AGC knows about. Once you've enabled the markers in the settings window, you can quickly toggle them on or off with the F9 key.</w:t>
+      </w:r>
+    </w:p>
+    <w:p>
+      <w:pPr>
+        <w:ind w:left="360"/>
+      </w:pPr>
+      <w:r>
+        <w:t xml:space="preserve">Additionally, </w:t>
+      </w:r>
+      <w:r>
+        <w:t>in the “Celestial Sphere” options, you will want to ensure Background Stars are “shown as pixels” so you can better identify the point when doing optics sightings.</w:t>
+      </w:r>
+    </w:p>
+    <w:p>
+      <w:pPr>
+        <w:ind w:left="360"/>
+      </w:pPr>
+      <w:r>
+        <w:t>W</w:t>
+      </w:r>
+      <w:r>
+        <w:t xml:space="preserve">hen you mark a star, you want to mark the center of the crosshair and not the star pixel. Orbiter’s star map has current star positions where the computer is expecting the locations circa 1970, so the crosshair center represents the star’s location when Apollo was flying. </w:t>
+      </w:r>
+    </w:p>
+    <w:p>
+      <w:pPr>
+        <w:ind w:left="360"/>
+      </w:pPr>
+      <w:r>
+        <w:t>For the virtual cockpit optics, to enable superimposed view, you need to click the center of the reticle in addition to using the V key.</w:t>
+      </w:r>
+      <w:r>
+        <w:br/>
+      </w:r>
+    </w:p>
+    <w:p>
+      <w:pPr>
+        <w:ind w:left="360"/>
+      </w:pPr>
+      <w:r>
+        <w:rPr>
+          <w:b/>
+          <w:bCs/>
+        </w:rPr>
+        <w:t>Take screenshots of your PADs, always! </w:t>
+      </w:r>
+      <w:r>
+        <w:rPr>
+          <w:b/>
+          <w:bCs/>
+        </w:rPr>
+        <w:br/>
+      </w:r>
+      <w:r>
+        <w:t>On missions with automated MCC support, you'll periodically receive Pre-Advisory Data (PAD) on the left side of the screen. Whenever you receive one of these, it's a good idea to take a screenshot of this data and save it somewhere. Each new PAD will replace the previous one, and certain parts of a mission might send you several over the course of a few minutes, so you will often need to keep track of them longer than the automated system keeps them there. Additionally, if you ever encounter problems with a burn or a trajectory calculation, sending us your PAD for that maneuver can be useful for debugging and troubleshooting.</w:t>
+      </w:r>
+      <w:r>
+        <w:br/>
+      </w:r>
+    </w:p>
+    <w:p>
+      <w:pPr>
+        <w:ind w:left="360"/>
+      </w:pPr>
+      <w:r>
+        <w:rPr>
+          <w:b/>
+          <w:bCs/>
+        </w:rPr>
+        <w:t xml:space="preserve">Save </w:t>
+      </w:r>
+      <w:r>
+        <w:rPr>
+          <w:b/>
+          <w:bCs/>
+        </w:rPr>
+        <w:t>frequently and</w:t>
+      </w:r>
+      <w:r>
+        <w:rPr>
+          <w:b/>
+          <w:bCs/>
+        </w:rPr>
+        <w:t xml:space="preserve"> keep your save files organized!</w:t>
+      </w:r>
+      <w:r>
+        <w:t> </w:t>
+      </w:r>
+      <w:r>
+        <w:br/>
+      </w:r>
+      <w:r>
+        <w:t>While we work hard to make sure the sim is stable and the instructions are clear, glitches and human errors can cause problems. Saving often and organizing those save files will help ensure that any issues don't result in losing hours of progress. I find it's helpful to periodically rename my latest save file to the mission time when I saved, plus a short remark about what I was doing.</w:t>
+      </w:r>
+      <w:r>
+        <w:br/>
+      </w:r>
+    </w:p>
+    <w:p>
+      <w:pPr>
+        <w:ind w:left="360"/>
+      </w:pPr>
+    </w:p>
+    <w:p>
+      <w:pPr>
+        <w:ind w:left="360"/>
+      </w:pPr>
+    </w:p>
+    <w:p>
+      <w:pPr>
+        <w:ind w:left="360"/>
+      </w:pPr>
+      <w:r>
+        <w:rPr>
+          <w:b/>
+          <w:bCs/>
+        </w:rPr>
+        <w:lastRenderedPageBreak/>
+        <w:t xml:space="preserve">Be careful with </w:t>
+      </w:r>
+      <w:r>
+        <w:rPr>
+          <w:b/>
+          <w:bCs/>
+        </w:rPr>
+        <w:t>time warp</w:t>
+      </w:r>
+      <w:r>
+        <w:rPr>
+          <w:b/>
+          <w:bCs/>
+        </w:rPr>
+        <w:t>!</w:t>
+      </w:r>
+      <w:r>
+        <w:t> </w:t>
+      </w:r>
+      <w:r>
+        <w:br/>
+      </w:r>
+      <w:r>
+        <w:t xml:space="preserve">NASSP does a lot of complex calculations in the background, and </w:t>
+      </w:r>
+      <w:r>
+        <w:t>time warping</w:t>
+      </w:r>
+      <w:r>
+        <w:t xml:space="preserve"> too fast can cause these calculations to fail, which can cause your current simulation session to temporarily glitch or completely break. As a rule of thumb, if you notice that the simulator's framerate is dropping significantly when you use </w:t>
+      </w:r>
+      <w:r>
+        <w:t>time warp</w:t>
+      </w:r>
+      <w:r>
+        <w:t xml:space="preserve">, it probably means you are going too fast. We developers have moderately powerful computers, but they're far from high-end, mega-expensive machines. We can usually manage somewhere between 50x and 100x </w:t>
+      </w:r>
+      <w:r>
+        <w:t>time warp</w:t>
+      </w:r>
+      <w:r>
+        <w:t xml:space="preserve"> at the absolute maximum.</w:t>
+      </w:r>
+      <w:r>
+        <w:br/>
+      </w:r>
+    </w:p>
+    <w:p>
+      <w:pPr>
+        <w:ind w:left="360"/>
+      </w:pPr>
+      <w:r>
+        <w:rPr>
+          <w:b/>
+          <w:bCs/>
+        </w:rPr>
+        <w:t xml:space="preserve">Be careful with </w:t>
+      </w:r>
+      <w:r>
+        <w:rPr>
+          <w:b/>
+          <w:bCs/>
+        </w:rPr>
+        <w:t>time warp</w:t>
+      </w:r>
+      <w:r>
+        <w:rPr>
+          <w:b/>
+          <w:bCs/>
+        </w:rPr>
+        <w:t>, part 2!</w:t>
+      </w:r>
+      <w:r>
+        <w:t> </w:t>
+      </w:r>
+      <w:r>
+        <w:br/>
+      </w:r>
+      <w:r>
+        <w:t xml:space="preserve">If any vessel is actively maneuvering or holding attitude (attempting to rotate or remain stationary with RCS turned on), be aware that high </w:t>
+      </w:r>
+      <w:r>
+        <w:t>time warp</w:t>
+      </w:r>
+      <w:r>
+        <w:t xml:space="preserve"> levels can cause them to waste fuel or even spin out of control. This is a limitation of how we simulate the physics of RCS, and it may happen even if your computer is able to deal with fast </w:t>
+      </w:r>
+      <w:r>
+        <w:t>time warp</w:t>
+      </w:r>
+      <w:r>
+        <w:t xml:space="preserve"> normally. It will even affect vessels that you're not currently controlling: </w:t>
+      </w:r>
+      <w:r>
+        <w:t>time warping</w:t>
+      </w:r>
+      <w:r>
+        <w:t xml:space="preserve"> in the CSM while the LM is trying to hold attitude will cause problems for the LM. Usually going up to about 5x or 10x is safe. If you want to </w:t>
+      </w:r>
+      <w:r>
+        <w:t>time warp</w:t>
+      </w:r>
+      <w:r>
+        <w:t xml:space="preserve"> faster, be sure to disable any kind of attitude-hold mode in the CSM and LM before </w:t>
+      </w:r>
+      <w:r>
+        <w:t>continuing but</w:t>
+      </w:r>
+      <w:r>
+        <w:t xml:space="preserve"> watch out to make sure you don't slowly drift into gimbal lock!</w:t>
+      </w:r>
+      <w:r>
+        <w:t xml:space="preserve"> This is especially important for rest periods using any control mode during PTC like Apollo 8. Just as above, on Apollo 8 SCS PTC, disabling attitude control (SC CONT – CMC and CMC MODE – FREE) is advised for rest periods or extended warp in PTC.</w:t>
+      </w:r>
+      <w:r>
+        <w:br/>
+      </w:r>
+    </w:p>
+    <w:p>
+      <w:pPr>
+        <w:ind w:left="360"/>
+      </w:pPr>
+      <w:r>
+        <w:rPr>
+          <w:b/>
+          <w:bCs/>
+        </w:rPr>
+        <w:t>Remember the CSM O2 Hose. </w:t>
+      </w:r>
+      <w:r>
+        <w:rPr>
+          <w:b/>
+          <w:bCs/>
+        </w:rPr>
+        <w:br/>
+      </w:r>
+      <w:r>
+        <w:t xml:space="preserve">When you're performing LM activation, be sure to use the Project Apollo MFD's "ECS" section to connect the O2 hose from the CSM. This creates a flow of fresh oxygen into the LM so that the cabin doesn't fill up with deadly CO2 and poison your crew before the LM ECS is activated. Having this O2 hose connected also prevents you from closing the CSM forward hatch, so if you can't get it </w:t>
+      </w:r>
+      <w:r>
+        <w:t>too</w:t>
+      </w:r>
+      <w:r>
+        <w:t xml:space="preserve"> close, make sure you've disconnected the hose.</w:t>
+      </w:r>
+      <w:r>
+        <w:br/>
+      </w:r>
+    </w:p>
+    <w:p>
+      <w:pPr>
+        <w:ind w:left="360"/>
+      </w:pPr>
+      <w:r>
+        <w:rPr>
+          <w:b/>
+          <w:bCs/>
+        </w:rPr>
         <w:t>Pay attention to whether your LM crew should be in the cabin or their suits.</w:t>
       </w:r>
       <w:r>
@@ -2681,13 +2581,18 @@
         <w:br/>
       </w:r>
       <w:r>
-        <w:t xml:space="preserve">Some of the most common causes of sim crew death are accidents involving your LM ECS configuration. In addition to the controls in the spacecraft itself, there's also some important options in the Project Apollo MFD, in the "ECS" section. If you're </w:t>
-      </w:r>
-      <w:r>
-        <w:t>depressurizing</w:t>
-      </w:r>
-      <w:r>
-        <w:t xml:space="preserve"> the cabin, be sure both your crew members are in the suits! If the suit hose knob is set to "suit disconnect" for either crewmember, they should probably be in the cabin! If the suits are hooked up to the ECS but the crew are in the cabin, CO2 might be building up without the gauge on the panel being able to detect it, because the airflow is only going through the suits. The checklists should steer you in the right direction, but it is easy for mistakes to happen, so be vigilant. In the future, we intend to overhaul the Command Module ECS to also simulate the crew being suited or unsuited, so getting </w:t>
+        <w:t xml:space="preserve">Some of the most common causes of sim crew death are accidents involving your LM ECS configuration. In addition to the controls in the spacecraft itself, there's also some important options in the Project Apollo MFD, in the "ECS" section. </w:t>
+      </w:r>
+      <w:r>
+        <w:t>LM crew can be in the cabin (unsuited), or suits with a toggleable helmet gloves on or off option.</w:t>
+      </w:r>
+    </w:p>
+    <w:p>
+      <w:pPr>
+        <w:ind w:left="360"/>
+      </w:pPr>
+      <w:r>
+        <w:t xml:space="preserve">The checklists should steer you in the right direction, but it is easy for mistakes to happen, so be vigilant. In the future, we intend to overhaul the Command Module ECS to also simulate the crew being suited or unsuited, so getting </w:t>
       </w:r>
       <w:r>
         <w:t>into</w:t>
@@ -2713,6 +2618,7 @@
           <w:b/>
           <w:bCs/>
         </w:rPr>
+        <w:lastRenderedPageBreak/>
         <w:t>Cue cards and special click spots!</w:t>
       </w:r>
     </w:p>
@@ -2722,16 +2628,53 @@
         <w:ind w:left="360"/>
       </w:pPr>
       <w:r>
-        <w:t xml:space="preserve">If you look carefully, you will notice there are Velcro patches around the CM and LM. Clicking these will allow you to utilize various mission cue cards, window shades, glareshields etc. that were used during flight. One caveat is they are mostly Apollo 15 cue cards currently, so keep that in mind when flying other flights. We are working to find/create more mission specific cue cards </w:t>
-      </w:r>
-      <w:proofErr w:type="gramStart"/>
-      <w:r>
-        <w:t>in the near future</w:t>
-      </w:r>
-      <w:proofErr w:type="gramEnd"/>
-      <w:r>
-        <w:t>.</w:t>
-      </w:r>
+        <w:t>If you look carefully, you will notice there are Velcro patches around the CM and LM. Clicking these will allow you to utilize various mission cue cards, window shades, glareshields etc. that were used during flight. One caveat is they are mostly Apollo 15 cue cards currently, so keep that in mind when flying other flights. We are working to find/create more mission specific cue cards in the near future.</w:t>
+      </w:r>
+    </w:p>
+    <w:p>
+      <w:pPr>
+        <w:ind w:left="360"/>
+      </w:pPr>
+    </w:p>
+    <w:p>
+      <w:pPr>
+        <w:ind w:left="360"/>
+      </w:pPr>
+    </w:p>
+    <w:p>
+      <w:pPr>
+        <w:ind w:left="360"/>
+      </w:pPr>
+    </w:p>
+    <w:p>
+      <w:pPr>
+        <w:ind w:left="360"/>
+      </w:pPr>
+    </w:p>
+    <w:p>
+      <w:pPr>
+        <w:ind w:left="360"/>
+      </w:pPr>
+    </w:p>
+    <w:p>
+      <w:pPr>
+        <w:ind w:left="360"/>
+      </w:pPr>
+    </w:p>
+    <w:p>
+      <w:pPr>
+        <w:ind w:left="360"/>
+      </w:pPr>
+    </w:p>
+    <w:p>
+      <w:pPr>
+        <w:ind w:left="360"/>
+      </w:pPr>
+    </w:p>
+    <w:p>
+      <w:pPr>
+        <w:ind w:left="360"/>
+      </w:pPr>
     </w:p>
     <w:p>
       <w:pPr>
@@ -2802,7 +2745,7 @@
       <w:pPr>
         <w:pStyle w:val="Heading1"/>
       </w:pPr>
-      <w:bookmarkStart w:id="3" w:name="_Toc229900495"/>
+      <w:bookmarkStart w:id="3" w:name="_Toc232239550"/>
       <w:r>
         <w:lastRenderedPageBreak/>
         <w:t>Keyboard Commands:</w:t>
@@ -3313,7 +3256,6 @@
                 <w14:ligatures w14:val="none"/>
               </w:rPr>
             </w:pPr>
-            <w:proofErr w:type="spellStart"/>
             <w:r>
               <w:rPr>
                 <w:rFonts w:eastAsia="Times New Roman" w:cs="Times New Roman"/>
@@ -3323,7 +3265,6 @@
               </w:rPr>
               <w:t>Ctrl+Alt+S</w:t>
             </w:r>
-            <w:proofErr w:type="spellEnd"/>
           </w:p>
         </w:tc>
         <w:tc>
@@ -3355,19 +3296,8 @@
                 <w:kern w:val="0"/>
                 <w14:ligatures w14:val="none"/>
               </w:rPr>
-              <w:t xml:space="preserve">Generate Mission Time-Stamped </w:t>
-            </w:r>
-            <w:proofErr w:type="spellStart"/>
-            <w:r>
-              <w:rPr>
-                <w:rFonts w:eastAsia="Times New Roman" w:cs="Times New Roman"/>
-                <w:color w:val="000000"/>
-                <w:kern w:val="0"/>
-                <w14:ligatures w14:val="none"/>
-              </w:rPr>
-              <w:t>Quicksave</w:t>
-            </w:r>
-            <w:proofErr w:type="spellEnd"/>
+              <w:t>Generate Mission Time-Stamped Quicksave</w:t>
+            </w:r>
           </w:p>
         </w:tc>
       </w:tr>
@@ -3815,7 +3745,6 @@
                 <w14:ligatures w14:val="none"/>
               </w:rPr>
             </w:pPr>
-            <w:proofErr w:type="spellStart"/>
             <w:r>
               <w:rPr>
                 <w:rFonts w:eastAsia="Times New Roman" w:cs="Times New Roman"/>
@@ -3825,7 +3754,6 @@
               </w:rPr>
               <w:t>Ctrl+H</w:t>
             </w:r>
-            <w:proofErr w:type="spellEnd"/>
           </w:p>
         </w:tc>
         <w:tc>
@@ -4427,7 +4355,6 @@
                 <w14:ligatures w14:val="none"/>
               </w:rPr>
             </w:pPr>
-            <w:proofErr w:type="spellStart"/>
             <w:r>
               <w:rPr>
                 <w:rFonts w:eastAsia="Times New Roman" w:cs="Times New Roman"/>
@@ -4437,7 +4364,6 @@
               </w:rPr>
               <w:t>Alt+Numpad</w:t>
             </w:r>
-            <w:proofErr w:type="spellEnd"/>
           </w:p>
         </w:tc>
         <w:tc>
@@ -4462,7 +4388,6 @@
                 <w14:ligatures w14:val="none"/>
               </w:rPr>
             </w:pPr>
-            <w:proofErr w:type="spellStart"/>
             <w:r>
               <w:rPr>
                 <w:rFonts w:eastAsia="Times New Roman" w:cs="Times New Roman"/>
@@ -4472,7 +4397,6 @@
               </w:rPr>
               <w:t>Hardover</w:t>
             </w:r>
-            <w:proofErr w:type="spellEnd"/>
           </w:p>
         </w:tc>
       </w:tr>
@@ -4761,25 +4685,14 @@
                 <w14:ligatures w14:val="none"/>
               </w:rPr>
             </w:pPr>
-            <w:proofErr w:type="spellStart"/>
-            <w:r>
-              <w:rPr>
-                <w:rFonts w:eastAsia="Times New Roman" w:cs="Times New Roman"/>
-                <w:color w:val="000000"/>
-                <w:kern w:val="0"/>
-                <w14:ligatures w14:val="none"/>
-              </w:rPr>
-              <w:t>Shift+Decimal</w:t>
-            </w:r>
-            <w:proofErr w:type="spellEnd"/>
-            <w:r>
-              <w:rPr>
-                <w:rFonts w:eastAsia="Times New Roman" w:cs="Times New Roman"/>
-                <w:color w:val="000000"/>
-                <w:kern w:val="0"/>
-                <w14:ligatures w14:val="none"/>
-              </w:rPr>
-              <w:t xml:space="preserve"> (Numpad)</w:t>
+            <w:r>
+              <w:rPr>
+                <w:rFonts w:eastAsia="Times New Roman" w:cs="Times New Roman"/>
+                <w:color w:val="000000"/>
+                <w:kern w:val="0"/>
+                <w14:ligatures w14:val="none"/>
+              </w:rPr>
+              <w:t>Shift+Decimal (Numpad)</w:t>
             </w:r>
           </w:p>
         </w:tc>
@@ -4845,25 +4758,14 @@
                 <w14:ligatures w14:val="none"/>
               </w:rPr>
             </w:pPr>
-            <w:proofErr w:type="spellStart"/>
-            <w:r>
-              <w:rPr>
-                <w:rFonts w:eastAsia="Times New Roman" w:cs="Times New Roman"/>
-                <w:color w:val="000000"/>
-                <w:kern w:val="0"/>
-                <w14:ligatures w14:val="none"/>
-              </w:rPr>
-              <w:t>Shift+Page</w:t>
-            </w:r>
-            <w:proofErr w:type="spellEnd"/>
-            <w:r>
-              <w:rPr>
-                <w:rFonts w:eastAsia="Times New Roman" w:cs="Times New Roman"/>
-                <w:color w:val="000000"/>
-                <w:kern w:val="0"/>
-                <w14:ligatures w14:val="none"/>
-              </w:rPr>
-              <w:t xml:space="preserve"> Up</w:t>
+            <w:r>
+              <w:rPr>
+                <w:rFonts w:eastAsia="Times New Roman" w:cs="Times New Roman"/>
+                <w:color w:val="000000"/>
+                <w:kern w:val="0"/>
+                <w14:ligatures w14:val="none"/>
+              </w:rPr>
+              <w:t>Shift+Page Up</w:t>
             </w:r>
           </w:p>
         </w:tc>
@@ -4929,7 +4831,6 @@
                 <w14:ligatures w14:val="none"/>
               </w:rPr>
             </w:pPr>
-            <w:proofErr w:type="spellStart"/>
             <w:r>
               <w:rPr>
                 <w:rFonts w:eastAsia="Times New Roman" w:cs="Times New Roman"/>
@@ -4939,7 +4840,6 @@
               </w:rPr>
               <w:t>Shift+Home</w:t>
             </w:r>
-            <w:proofErr w:type="spellEnd"/>
           </w:p>
         </w:tc>
         <w:tc>
@@ -5004,25 +4904,14 @@
                 <w14:ligatures w14:val="none"/>
               </w:rPr>
             </w:pPr>
-            <w:proofErr w:type="spellStart"/>
-            <w:r>
-              <w:rPr>
-                <w:rFonts w:eastAsia="Times New Roman" w:cs="Times New Roman"/>
-                <w:color w:val="000000"/>
-                <w:kern w:val="0"/>
-                <w14:ligatures w14:val="none"/>
-              </w:rPr>
-              <w:t>Shift+Enter</w:t>
-            </w:r>
-            <w:proofErr w:type="spellEnd"/>
-            <w:r>
-              <w:rPr>
-                <w:rFonts w:eastAsia="Times New Roman" w:cs="Times New Roman"/>
-                <w:color w:val="000000"/>
-                <w:kern w:val="0"/>
-                <w14:ligatures w14:val="none"/>
-              </w:rPr>
-              <w:t xml:space="preserve"> (Numpad)</w:t>
+            <w:r>
+              <w:rPr>
+                <w:rFonts w:eastAsia="Times New Roman" w:cs="Times New Roman"/>
+                <w:color w:val="000000"/>
+                <w:kern w:val="0"/>
+                <w14:ligatures w14:val="none"/>
+              </w:rPr>
+              <w:t>Shift+Enter (Numpad)</w:t>
             </w:r>
           </w:p>
         </w:tc>
@@ -5088,25 +4977,14 @@
                 <w14:ligatures w14:val="none"/>
               </w:rPr>
             </w:pPr>
-            <w:proofErr w:type="spellStart"/>
-            <w:r>
-              <w:rPr>
-                <w:rFonts w:eastAsia="Times New Roman" w:cs="Times New Roman"/>
-                <w:color w:val="000000"/>
-                <w:kern w:val="0"/>
-                <w14:ligatures w14:val="none"/>
-              </w:rPr>
-              <w:t>Shift+Divide</w:t>
-            </w:r>
-            <w:proofErr w:type="spellEnd"/>
-            <w:r>
-              <w:rPr>
-                <w:rFonts w:eastAsia="Times New Roman" w:cs="Times New Roman"/>
-                <w:color w:val="000000"/>
-                <w:kern w:val="0"/>
-                <w14:ligatures w14:val="none"/>
-              </w:rPr>
-              <w:t xml:space="preserve"> (Numpad /)</w:t>
+            <w:r>
+              <w:rPr>
+                <w:rFonts w:eastAsia="Times New Roman" w:cs="Times New Roman"/>
+                <w:color w:val="000000"/>
+                <w:kern w:val="0"/>
+                <w14:ligatures w14:val="none"/>
+              </w:rPr>
+              <w:t>Shift+Divide (Numpad /)</w:t>
             </w:r>
           </w:p>
         </w:tc>
@@ -5172,25 +5050,14 @@
                 <w14:ligatures w14:val="none"/>
               </w:rPr>
             </w:pPr>
-            <w:proofErr w:type="spellStart"/>
-            <w:r>
-              <w:rPr>
-                <w:rFonts w:eastAsia="Times New Roman" w:cs="Times New Roman"/>
-                <w:color w:val="000000"/>
-                <w:kern w:val="0"/>
-                <w14:ligatures w14:val="none"/>
-              </w:rPr>
-              <w:t>Shift+Multiply</w:t>
-            </w:r>
-            <w:proofErr w:type="spellEnd"/>
-            <w:r>
-              <w:rPr>
-                <w:rFonts w:eastAsia="Times New Roman" w:cs="Times New Roman"/>
-                <w:color w:val="000000"/>
-                <w:kern w:val="0"/>
-                <w14:ligatures w14:val="none"/>
-              </w:rPr>
-              <w:t xml:space="preserve"> (Numpad *)</w:t>
+            <w:r>
+              <w:rPr>
+                <w:rFonts w:eastAsia="Times New Roman" w:cs="Times New Roman"/>
+                <w:color w:val="000000"/>
+                <w:kern w:val="0"/>
+                <w14:ligatures w14:val="none"/>
+              </w:rPr>
+              <w:t>Shift+Multiply (Numpad *)</w:t>
             </w:r>
           </w:p>
         </w:tc>
@@ -5256,25 +5123,14 @@
                 <w14:ligatures w14:val="none"/>
               </w:rPr>
             </w:pPr>
-            <w:proofErr w:type="spellStart"/>
-            <w:r>
-              <w:rPr>
-                <w:rFonts w:eastAsia="Times New Roman" w:cs="Times New Roman"/>
-                <w:color w:val="000000"/>
-                <w:kern w:val="0"/>
-                <w14:ligatures w14:val="none"/>
-              </w:rPr>
-              <w:t>Shift+Plus</w:t>
-            </w:r>
-            <w:proofErr w:type="spellEnd"/>
-            <w:r>
-              <w:rPr>
-                <w:rFonts w:eastAsia="Times New Roman" w:cs="Times New Roman"/>
-                <w:color w:val="000000"/>
-                <w:kern w:val="0"/>
-                <w14:ligatures w14:val="none"/>
-              </w:rPr>
-              <w:t xml:space="preserve"> (Numpad +)</w:t>
+            <w:r>
+              <w:rPr>
+                <w:rFonts w:eastAsia="Times New Roman" w:cs="Times New Roman"/>
+                <w:color w:val="000000"/>
+                <w:kern w:val="0"/>
+                <w14:ligatures w14:val="none"/>
+              </w:rPr>
+              <w:t>Shift+Plus (Numpad +)</w:t>
             </w:r>
           </w:p>
         </w:tc>
@@ -5340,25 +5196,14 @@
                 <w14:ligatures w14:val="none"/>
               </w:rPr>
             </w:pPr>
-            <w:proofErr w:type="spellStart"/>
-            <w:r>
-              <w:rPr>
-                <w:rFonts w:eastAsia="Times New Roman" w:cs="Times New Roman"/>
-                <w:color w:val="000000"/>
-                <w:kern w:val="0"/>
-                <w14:ligatures w14:val="none"/>
-              </w:rPr>
-              <w:t>Shift+Minus</w:t>
-            </w:r>
-            <w:proofErr w:type="spellEnd"/>
-            <w:r>
-              <w:rPr>
-                <w:rFonts w:eastAsia="Times New Roman" w:cs="Times New Roman"/>
-                <w:color w:val="000000"/>
-                <w:kern w:val="0"/>
-                <w14:ligatures w14:val="none"/>
-              </w:rPr>
-              <w:t xml:space="preserve"> (Numpad -)</w:t>
+            <w:r>
+              <w:rPr>
+                <w:rFonts w:eastAsia="Times New Roman" w:cs="Times New Roman"/>
+                <w:color w:val="000000"/>
+                <w:kern w:val="0"/>
+                <w14:ligatures w14:val="none"/>
+              </w:rPr>
+              <w:t>Shift+Minus (Numpad -)</w:t>
             </w:r>
           </w:p>
         </w:tc>
@@ -5424,7 +5269,6 @@
                 <w14:ligatures w14:val="none"/>
               </w:rPr>
             </w:pPr>
-            <w:proofErr w:type="spellStart"/>
             <w:r>
               <w:rPr>
                 <w:rFonts w:eastAsia="Times New Roman" w:cs="Times New Roman"/>
@@ -5434,7 +5278,6 @@
               </w:rPr>
               <w:t>Shift+End</w:t>
             </w:r>
-            <w:proofErr w:type="spellEnd"/>
           </w:p>
         </w:tc>
         <w:tc>
@@ -7026,7 +6869,6 @@
                 <w14:ligatures w14:val="none"/>
               </w:rPr>
             </w:pPr>
-            <w:proofErr w:type="spellStart"/>
             <w:r>
               <w:rPr>
                 <w:rFonts w:eastAsia="Times New Roman" w:cs="Times New Roman"/>
@@ -7036,7 +6878,6 @@
               </w:rPr>
               <w:t>Shift+W</w:t>
             </w:r>
-            <w:proofErr w:type="spellEnd"/>
           </w:p>
         </w:tc>
         <w:tc>
@@ -7101,7 +6942,6 @@
                 <w14:ligatures w14:val="none"/>
               </w:rPr>
             </w:pPr>
-            <w:proofErr w:type="spellStart"/>
             <w:r>
               <w:rPr>
                 <w:rFonts w:eastAsia="Times New Roman" w:cs="Times New Roman"/>
@@ -7111,7 +6951,6 @@
               </w:rPr>
               <w:t>Shift+S</w:t>
             </w:r>
-            <w:proofErr w:type="spellEnd"/>
           </w:p>
         </w:tc>
         <w:tc>
@@ -7176,7 +7015,6 @@
                 <w14:ligatures w14:val="none"/>
               </w:rPr>
             </w:pPr>
-            <w:proofErr w:type="spellStart"/>
             <w:r>
               <w:rPr>
                 <w:rFonts w:eastAsia="Times New Roman" w:cs="Times New Roman"/>
@@ -7186,7 +7024,6 @@
               </w:rPr>
               <w:t>Shift+A</w:t>
             </w:r>
-            <w:proofErr w:type="spellEnd"/>
           </w:p>
         </w:tc>
         <w:tc>
@@ -7251,7 +7088,6 @@
                 <w14:ligatures w14:val="none"/>
               </w:rPr>
             </w:pPr>
-            <w:proofErr w:type="spellStart"/>
             <w:r>
               <w:rPr>
                 <w:rFonts w:eastAsia="Times New Roman" w:cs="Times New Roman"/>
@@ -7261,7 +7097,6 @@
               </w:rPr>
               <w:t>Shift+D</w:t>
             </w:r>
-            <w:proofErr w:type="spellEnd"/>
           </w:p>
         </w:tc>
         <w:tc>
@@ -7326,7 +7161,6 @@
                 <w14:ligatures w14:val="none"/>
               </w:rPr>
             </w:pPr>
-            <w:proofErr w:type="spellStart"/>
             <w:r>
               <w:rPr>
                 <w:rFonts w:eastAsia="Times New Roman" w:cs="Times New Roman"/>
@@ -7336,7 +7170,6 @@
               </w:rPr>
               <w:t>Shift+Q</w:t>
             </w:r>
-            <w:proofErr w:type="spellEnd"/>
           </w:p>
         </w:tc>
         <w:tc>
@@ -7401,7 +7234,6 @@
                 <w14:ligatures w14:val="none"/>
               </w:rPr>
             </w:pPr>
-            <w:proofErr w:type="spellStart"/>
             <w:r>
               <w:rPr>
                 <w:rFonts w:eastAsia="Times New Roman" w:cs="Times New Roman"/>
@@ -7411,7 +7243,6 @@
               </w:rPr>
               <w:t>Shift+E</w:t>
             </w:r>
-            <w:proofErr w:type="spellEnd"/>
           </w:p>
         </w:tc>
         <w:tc>
@@ -8665,25 +8496,14 @@
                 <w14:ligatures w14:val="none"/>
               </w:rPr>
             </w:pPr>
-            <w:proofErr w:type="spellStart"/>
-            <w:r>
-              <w:rPr>
-                <w:rFonts w:eastAsia="Times New Roman" w:cs="Times New Roman"/>
-                <w:color w:val="000000"/>
-                <w:kern w:val="0"/>
-                <w14:ligatures w14:val="none"/>
-              </w:rPr>
-              <w:t>Ctrl+Decimal</w:t>
-            </w:r>
-            <w:proofErr w:type="spellEnd"/>
-            <w:r>
-              <w:rPr>
-                <w:rFonts w:eastAsia="Times New Roman" w:cs="Times New Roman"/>
-                <w:color w:val="000000"/>
-                <w:kern w:val="0"/>
-                <w14:ligatures w14:val="none"/>
-              </w:rPr>
-              <w:t xml:space="preserve"> (Numpad .)</w:t>
+            <w:r>
+              <w:rPr>
+                <w:rFonts w:eastAsia="Times New Roman" w:cs="Times New Roman"/>
+                <w:color w:val="000000"/>
+                <w:kern w:val="0"/>
+                <w14:ligatures w14:val="none"/>
+              </w:rPr>
+              <w:t>Ctrl+Decimal (Numpad .)</w:t>
             </w:r>
           </w:p>
         </w:tc>
@@ -8749,25 +8569,14 @@
                 <w14:ligatures w14:val="none"/>
               </w:rPr>
             </w:pPr>
-            <w:proofErr w:type="spellStart"/>
-            <w:r>
-              <w:rPr>
-                <w:rFonts w:eastAsia="Times New Roman" w:cs="Times New Roman"/>
-                <w:color w:val="000000"/>
-                <w:kern w:val="0"/>
-                <w14:ligatures w14:val="none"/>
-              </w:rPr>
-              <w:t>Ctrl+Enter</w:t>
-            </w:r>
-            <w:proofErr w:type="spellEnd"/>
-            <w:r>
-              <w:rPr>
-                <w:rFonts w:eastAsia="Times New Roman" w:cs="Times New Roman"/>
-                <w:color w:val="000000"/>
-                <w:kern w:val="0"/>
-                <w14:ligatures w14:val="none"/>
-              </w:rPr>
-              <w:t xml:space="preserve"> (Numpad)</w:t>
+            <w:r>
+              <w:rPr>
+                <w:rFonts w:eastAsia="Times New Roman" w:cs="Times New Roman"/>
+                <w:color w:val="000000"/>
+                <w:kern w:val="0"/>
+                <w14:ligatures w14:val="none"/>
+              </w:rPr>
+              <w:t>Ctrl+Enter (Numpad)</w:t>
             </w:r>
           </w:p>
         </w:tc>
@@ -8833,25 +8642,14 @@
                 <w14:ligatures w14:val="none"/>
               </w:rPr>
             </w:pPr>
-            <w:proofErr w:type="spellStart"/>
-            <w:r>
-              <w:rPr>
-                <w:rFonts w:eastAsia="Times New Roman" w:cs="Times New Roman"/>
-                <w:color w:val="000000"/>
-                <w:kern w:val="0"/>
-                <w14:ligatures w14:val="none"/>
-              </w:rPr>
-              <w:t>Ctrl+Page</w:t>
-            </w:r>
-            <w:proofErr w:type="spellEnd"/>
-            <w:r>
-              <w:rPr>
-                <w:rFonts w:eastAsia="Times New Roman" w:cs="Times New Roman"/>
-                <w:color w:val="000000"/>
-                <w:kern w:val="0"/>
-                <w14:ligatures w14:val="none"/>
-              </w:rPr>
-              <w:t xml:space="preserve"> Up</w:t>
+            <w:r>
+              <w:rPr>
+                <w:rFonts w:eastAsia="Times New Roman" w:cs="Times New Roman"/>
+                <w:color w:val="000000"/>
+                <w:kern w:val="0"/>
+                <w14:ligatures w14:val="none"/>
+              </w:rPr>
+              <w:t>Ctrl+Page Up</w:t>
             </w:r>
           </w:p>
         </w:tc>
@@ -8917,25 +8715,14 @@
                 <w14:ligatures w14:val="none"/>
               </w:rPr>
             </w:pPr>
-            <w:proofErr w:type="spellStart"/>
-            <w:r>
-              <w:rPr>
-                <w:rFonts w:eastAsia="Times New Roman" w:cs="Times New Roman"/>
-                <w:color w:val="000000"/>
-                <w:kern w:val="0"/>
-                <w14:ligatures w14:val="none"/>
-              </w:rPr>
-              <w:t>Ctrl+Multiply</w:t>
-            </w:r>
-            <w:proofErr w:type="spellEnd"/>
-            <w:r>
-              <w:rPr>
-                <w:rFonts w:eastAsia="Times New Roman" w:cs="Times New Roman"/>
-                <w:color w:val="000000"/>
-                <w:kern w:val="0"/>
-                <w14:ligatures w14:val="none"/>
-              </w:rPr>
-              <w:t xml:space="preserve"> (Numpad *)</w:t>
+            <w:r>
+              <w:rPr>
+                <w:rFonts w:eastAsia="Times New Roman" w:cs="Times New Roman"/>
+                <w:color w:val="000000"/>
+                <w:kern w:val="0"/>
+                <w14:ligatures w14:val="none"/>
+              </w:rPr>
+              <w:t>Ctrl+Multiply (Numpad *)</w:t>
             </w:r>
           </w:p>
         </w:tc>
@@ -9001,25 +8788,14 @@
                 <w14:ligatures w14:val="none"/>
               </w:rPr>
             </w:pPr>
-            <w:proofErr w:type="spellStart"/>
-            <w:r>
-              <w:rPr>
-                <w:rFonts w:eastAsia="Times New Roman" w:cs="Times New Roman"/>
-                <w:color w:val="000000"/>
-                <w:kern w:val="0"/>
-                <w14:ligatures w14:val="none"/>
-              </w:rPr>
-              <w:t>Ctrl+Plus</w:t>
-            </w:r>
-            <w:proofErr w:type="spellEnd"/>
-            <w:r>
-              <w:rPr>
-                <w:rFonts w:eastAsia="Times New Roman" w:cs="Times New Roman"/>
-                <w:color w:val="000000"/>
-                <w:kern w:val="0"/>
-                <w14:ligatures w14:val="none"/>
-              </w:rPr>
-              <w:t xml:space="preserve"> (Numpad +)</w:t>
+            <w:r>
+              <w:rPr>
+                <w:rFonts w:eastAsia="Times New Roman" w:cs="Times New Roman"/>
+                <w:color w:val="000000"/>
+                <w:kern w:val="0"/>
+                <w14:ligatures w14:val="none"/>
+              </w:rPr>
+              <w:t>Ctrl+Plus (Numpad +)</w:t>
             </w:r>
           </w:p>
         </w:tc>
@@ -9085,25 +8861,14 @@
                 <w14:ligatures w14:val="none"/>
               </w:rPr>
             </w:pPr>
-            <w:proofErr w:type="spellStart"/>
-            <w:r>
-              <w:rPr>
-                <w:rFonts w:eastAsia="Times New Roman" w:cs="Times New Roman"/>
-                <w:color w:val="000000"/>
-                <w:kern w:val="0"/>
-                <w14:ligatures w14:val="none"/>
-              </w:rPr>
-              <w:t>Ctrl+Minus</w:t>
-            </w:r>
-            <w:proofErr w:type="spellEnd"/>
-            <w:r>
-              <w:rPr>
-                <w:rFonts w:eastAsia="Times New Roman" w:cs="Times New Roman"/>
-                <w:color w:val="000000"/>
-                <w:kern w:val="0"/>
-                <w14:ligatures w14:val="none"/>
-              </w:rPr>
-              <w:t xml:space="preserve"> (Numpad -)</w:t>
+            <w:r>
+              <w:rPr>
+                <w:rFonts w:eastAsia="Times New Roman" w:cs="Times New Roman"/>
+                <w:color w:val="000000"/>
+                <w:kern w:val="0"/>
+                <w14:ligatures w14:val="none"/>
+              </w:rPr>
+              <w:t>Ctrl+Minus (Numpad -)</w:t>
             </w:r>
           </w:p>
         </w:tc>
@@ -9562,7 +9327,6 @@
                 <w14:ligatures w14:val="none"/>
               </w:rPr>
             </w:pPr>
-            <w:proofErr w:type="spellStart"/>
             <w:r>
               <w:rPr>
                 <w:rFonts w:eastAsia="Times New Roman" w:cs="Times New Roman"/>
@@ -9572,7 +9336,6 @@
               </w:rPr>
               <w:t>Alt+W</w:t>
             </w:r>
-            <w:proofErr w:type="spellEnd"/>
           </w:p>
         </w:tc>
         <w:tc>
@@ -9710,7 +9473,6 @@
                 <w14:ligatures w14:val="none"/>
               </w:rPr>
             </w:pPr>
-            <w:proofErr w:type="spellStart"/>
             <w:r>
               <w:rPr>
                 <w:rFonts w:eastAsia="Times New Roman" w:cs="Times New Roman"/>
@@ -9720,7 +9482,6 @@
               </w:rPr>
               <w:t>Alt+S</w:t>
             </w:r>
-            <w:proofErr w:type="spellEnd"/>
           </w:p>
         </w:tc>
         <w:tc>
@@ -10139,25 +9900,14 @@
                 <w14:ligatures w14:val="none"/>
               </w:rPr>
             </w:pPr>
-            <w:proofErr w:type="gramStart"/>
-            <w:r>
-              <w:rPr>
-                <w:rFonts w:eastAsia="Times New Roman" w:cs="Times New Roman"/>
-                <w:color w:val="000000"/>
-                <w:kern w:val="0"/>
-                <w14:ligatures w14:val="none"/>
-              </w:rPr>
-              <w:t>Increase</w:t>
-            </w:r>
-            <w:proofErr w:type="gramEnd"/>
-            <w:r>
-              <w:rPr>
-                <w:rFonts w:eastAsia="Times New Roman" w:cs="Times New Roman"/>
-                <w:color w:val="000000"/>
-                <w:kern w:val="0"/>
-                <w14:ligatures w14:val="none"/>
-              </w:rPr>
-              <w:t xml:space="preserve"> Descent Rate</w:t>
+            <w:r>
+              <w:rPr>
+                <w:rFonts w:eastAsia="Times New Roman" w:cs="Times New Roman"/>
+                <w:color w:val="000000"/>
+                <w:kern w:val="0"/>
+                <w14:ligatures w14:val="none"/>
+              </w:rPr>
+              <w:t>Increase Descent Rate</w:t>
             </w:r>
           </w:p>
         </w:tc>
@@ -10716,25 +10466,14 @@
                 <w14:ligatures w14:val="none"/>
               </w:rPr>
             </w:pPr>
-            <w:proofErr w:type="gramStart"/>
-            <w:r>
-              <w:rPr>
-                <w:rFonts w:eastAsia="Times New Roman" w:cs="Times New Roman"/>
-                <w:color w:val="000000"/>
-                <w:kern w:val="0"/>
-                <w14:ligatures w14:val="none"/>
-              </w:rPr>
-              <w:t>Abort</w:t>
-            </w:r>
-            <w:proofErr w:type="gramEnd"/>
-            <w:r>
-              <w:rPr>
-                <w:rFonts w:eastAsia="Times New Roman" w:cs="Times New Roman"/>
-                <w:color w:val="000000"/>
-                <w:kern w:val="0"/>
-                <w14:ligatures w14:val="none"/>
-              </w:rPr>
-              <w:t xml:space="preserve"> Stage PUSH</w:t>
+            <w:r>
+              <w:rPr>
+                <w:rFonts w:eastAsia="Times New Roman" w:cs="Times New Roman"/>
+                <w:color w:val="000000"/>
+                <w:kern w:val="0"/>
+                <w14:ligatures w14:val="none"/>
+              </w:rPr>
+              <w:t>Abort Stage PUSH</w:t>
             </w:r>
           </w:p>
         </w:tc>
@@ -11057,7 +10796,6 @@
                 <w14:ligatures w14:val="none"/>
               </w:rPr>
             </w:pPr>
-            <w:proofErr w:type="spellStart"/>
             <w:r>
               <w:rPr>
                 <w:rFonts w:eastAsia="Times New Roman" w:cs="Times New Roman"/>
@@ -11067,7 +10805,6 @@
               </w:rPr>
               <w:t>Ctrl+Alt+Numpad</w:t>
             </w:r>
-            <w:proofErr w:type="spellEnd"/>
           </w:p>
         </w:tc>
         <w:tc>
@@ -12952,7 +12689,7 @@
       <w:pPr>
         <w:pStyle w:val="Heading1"/>
       </w:pPr>
-      <w:bookmarkStart w:id="5" w:name="_Toc229900496"/>
+      <w:bookmarkStart w:id="5" w:name="_Toc232239551"/>
       <w:r>
         <w:lastRenderedPageBreak/>
         <w:t>Important Links:</w:t>

</xml_diff>

<commit_message>
Update dead onedrive link
</commit_message>
<xml_diff>
--- a/Doc/Project Apollo - NASSP/Programmers Notes/NASSP Quick Start Guide.docx
+++ b/Doc/Project Apollo - NASSP/Programmers Notes/NASSP Quick Start Guide.docx
@@ -42,7 +42,7 @@
           <w:b w:val="0"/>
           <w:bCs w:val="0"/>
         </w:rPr>
-        <w:t>4</w:t>
+        <w:t>5</w:t>
       </w:r>
     </w:p>
     <w:p>
@@ -68,7 +68,7 @@
           <w:b w:val="0"/>
           <w:bCs w:val="0"/>
         </w:rPr>
-        <w:t>3</w:t>
+        <w:t xml:space="preserve"> </w:t>
       </w:r>
       <w:r>
         <w:rPr>
@@ -76,7 +76,7 @@
           <w:b w:val="0"/>
           <w:bCs w:val="0"/>
         </w:rPr>
-        <w:t xml:space="preserve"> </w:t>
+        <w:t>JU</w:t>
       </w:r>
       <w:r>
         <w:rPr>
@@ -84,7 +84,7 @@
           <w:b w:val="0"/>
           <w:bCs w:val="0"/>
         </w:rPr>
-        <w:t>JUN</w:t>
+        <w:t>L</w:t>
       </w:r>
       <w:r>
         <w:rPr>
@@ -990,15 +990,7 @@
         </w:r>
       </w:hyperlink>
       <w:r>
-        <w:t> Scroll down to "</w:t>
-      </w:r>
-      <w:proofErr w:type="spellStart"/>
-      <w:r>
-        <w:t>MicroTexture</w:t>
-      </w:r>
-      <w:proofErr w:type="spellEnd"/>
-      <w:r>
-        <w:t xml:space="preserve"> Pack for D3D9Client" and unzip to your Orbiter directory.</w:t>
+        <w:t> Scroll down to "MicroTexture Pack for D3D9Client" and unzip to your Orbiter directory.</w:t>
       </w:r>
       <w:r>
         <w:br/>
@@ -1014,15 +1006,7 @@
         <w:t>-Optional:</w:t>
       </w:r>
       <w:r>
-        <w:t xml:space="preserve"> Download "Apollo Landing Sites for Orbiter 2016" by </w:t>
-      </w:r>
-      <w:proofErr w:type="spellStart"/>
-      <w:r>
-        <w:t>ggalfi</w:t>
-      </w:r>
-      <w:proofErr w:type="spellEnd"/>
-      <w:r>
-        <w:t xml:space="preserve"> here: </w:t>
+        <w:t> Download "Apollo Landing Sites for Orbiter 2016" by ggalfi here: </w:t>
       </w:r>
       <w:hyperlink r:id="rId15" w:tgtFrame="_blank" w:history="1">
         <w:r>
@@ -1132,23 +1116,7 @@
           <w:b/>
           <w:bCs/>
         </w:rPr>
-        <w:t xml:space="preserve">IMPORTANT: Click "Advanced" and add a check beside "Enable absolute animation handling" to prevent </w:t>
-      </w:r>
-      <w:proofErr w:type="gramStart"/>
-      <w:r>
-        <w:rPr>
-          <w:b/>
-          <w:bCs/>
-        </w:rPr>
-        <w:t>animation drift</w:t>
-      </w:r>
-      <w:proofErr w:type="gramEnd"/>
-      <w:r>
-        <w:rPr>
-          <w:b/>
-          <w:bCs/>
-        </w:rPr>
-        <w:t xml:space="preserve"> </w:t>
+        <w:t xml:space="preserve">IMPORTANT: Click "Advanced" and add a check beside "Enable absolute animation handling" to prevent animation drift </w:t>
       </w:r>
       <w:r>
         <w:rPr>
@@ -1183,15 +1151,7 @@
       </w:r>
       <w:r>
         <w:br/>
-        <w:t xml:space="preserve">4. Install </w:t>
-      </w:r>
-      <w:proofErr w:type="spellStart"/>
-      <w:r>
-        <w:t>XRSound</w:t>
-      </w:r>
-      <w:proofErr w:type="spellEnd"/>
-      <w:r>
-        <w:t xml:space="preserve"> 2.0: </w:t>
+        <w:t>4. Install XRSound 2.0: </w:t>
       </w:r>
       <w:hyperlink r:id="rId18" w:history="1">
         <w:r>
@@ -1223,15 +1183,7 @@
         </w:r>
       </w:hyperlink>
       <w:r>
-        <w:t xml:space="preserve"> and unzip to your Orbiter directory. Do the same with the small </w:t>
-      </w:r>
-      <w:proofErr w:type="spellStart"/>
-      <w:r>
-        <w:t>XRSound</w:t>
-      </w:r>
-      <w:proofErr w:type="spellEnd"/>
-      <w:r>
-        <w:t xml:space="preserve"> config zip file that can be found at the link as well. These files only </w:t>
+        <w:t xml:space="preserve"> and unzip to your Orbiter directory. Do the same with the small XRSound config zip file that can be found at the link as well. These files only </w:t>
       </w:r>
       <w:r>
         <w:t>must</w:t>
@@ -1263,23 +1215,7 @@
           <w:b/>
           <w:bCs/>
         </w:rPr>
-        <w:t xml:space="preserve"> </w:t>
-      </w:r>
-      <w:proofErr w:type="gramStart"/>
-      <w:r>
-        <w:rPr>
-          <w:b/>
-          <w:bCs/>
-        </w:rPr>
-        <w:t>For</w:t>
-      </w:r>
-      <w:proofErr w:type="gramEnd"/>
-      <w:r>
-        <w:rPr>
-          <w:b/>
-          <w:bCs/>
-        </w:rPr>
-        <w:t xml:space="preserve"> Orbiter 2016 Beta</w:t>
+        <w:t xml:space="preserve"> For Orbiter 2016 Beta</w:t>
       </w:r>
       <w:r>
         <w:rPr>
@@ -1312,31 +1248,7 @@
       </w:r>
       <w:r>
         <w:br/>
-        <w:t>2. Go to the "Modules" tab and activate the "</w:t>
-      </w:r>
-      <w:proofErr w:type="spellStart"/>
-      <w:r>
-        <w:t>XRSound</w:t>
-      </w:r>
-      <w:proofErr w:type="spellEnd"/>
-      <w:r>
-        <w:t>" and "</w:t>
-      </w:r>
-      <w:proofErr w:type="spellStart"/>
-      <w:r>
-        <w:t>ProjectApolloMFD</w:t>
-      </w:r>
-      <w:proofErr w:type="spellEnd"/>
-      <w:r>
-        <w:t>" and "</w:t>
-      </w:r>
-      <w:proofErr w:type="spellStart"/>
-      <w:r>
-        <w:t>ApolloRTCCMFD</w:t>
-      </w:r>
-      <w:proofErr w:type="spellEnd"/>
-      <w:r>
-        <w:t>" modules.</w:t>
+        <w:t>2. Go to the "Modules" tab and activate the "XRSound" and "ProjectApolloMFD" and "ApolloRTCCMFD" modules.</w:t>
       </w:r>
       <w:r>
         <w:br/>
@@ -1349,15 +1261,7 @@
         <w:t>Vessel Configuration-&gt;Project Apollo Configuration</w:t>
       </w:r>
       <w:r>
-        <w:t xml:space="preserve"> on the "Extra" tab. If you have a joystick, this is where you can configure your joystick for use in NASSP. Do not use the normal Orbiter controls page to configure your joystick, there it should be &lt;Disabled&gt;. In the "Miscellaneous" tab, make sure "Multi-Threading in time acceleration" is checked. It is also recommended to set a limit for time </w:t>
-      </w:r>
-      <w:proofErr w:type="gramStart"/>
-      <w:r>
-        <w:t>acceleration,</w:t>
-      </w:r>
-      <w:proofErr w:type="gramEnd"/>
-      <w:r>
-        <w:t xml:space="preserve"> NASSP runs best at 50x or less depending on the hardware you are using.</w:t>
+        <w:t xml:space="preserve"> on the "Extra" tab. If you have a joystick, this is where you can configure your joystick for use in NASSP. Do not use the normal Orbiter controls page to configure your joystick, there it should be &lt;Disabled&gt;. In the "Miscellaneous" tab, make sure "Multi-Threading in time acceleration" is checked. It is also recommended to set a limit for time acceleration, NASSP runs best at 50x or less depending on the hardware you are using.</w:t>
       </w:r>
       <w:r>
         <w:br/>
@@ -1660,15 +1564,7 @@
         <w:t xml:space="preserve"> </w:t>
       </w:r>
       <w:r>
-        <w:t xml:space="preserve">This contains only </w:t>
-      </w:r>
-      <w:proofErr w:type="gramStart"/>
-      <w:r>
-        <w:t>Low Res</w:t>
-      </w:r>
-      <w:proofErr w:type="gramEnd"/>
-      <w:r>
-        <w:t xml:space="preserve"> textures</w:t>
+        <w:t>This contains only Low Res textures</w:t>
       </w:r>
     </w:p>
     <w:p>
@@ -1818,39 +1714,7 @@
         <w:t>g</w:t>
       </w:r>
       <w:r>
-        <w:t>o to the "Modules" tab and activate the "</w:t>
-      </w:r>
-      <w:proofErr w:type="spellStart"/>
-      <w:r>
-        <w:t>ExtMFD</w:t>
-      </w:r>
-      <w:proofErr w:type="spellEnd"/>
-      <w:r>
-        <w:t xml:space="preserve">", </w:t>
-      </w:r>
-      <w:proofErr w:type="spellStart"/>
-      <w:r>
-        <w:t>XRSound</w:t>
-      </w:r>
-      <w:proofErr w:type="spellEnd"/>
-      <w:r>
-        <w:t>", "</w:t>
-      </w:r>
-      <w:proofErr w:type="spellStart"/>
-      <w:r>
-        <w:t>ProjectApolloMFD</w:t>
-      </w:r>
-      <w:proofErr w:type="spellEnd"/>
-      <w:r>
-        <w:t>" and "</w:t>
-      </w:r>
-      <w:proofErr w:type="spellStart"/>
-      <w:r>
-        <w:t>ApolloRTCCMFD</w:t>
-      </w:r>
-      <w:proofErr w:type="spellEnd"/>
-      <w:r>
-        <w:t>" modules. Do not use the DX9MFD as it is known to cause crashes</w:t>
+        <w:t>o to the "Modules" tab and activate the "ExtMFD", XRSound", "ProjectApolloMFD" and "ApolloRTCCMFD" modules. Do not use the DX9MFD as it is known to cause crashes</w:t>
       </w:r>
     </w:p>
     <w:p>
@@ -1861,15 +1725,7 @@
         <w:t>.</w:t>
       </w:r>
       <w:r>
-        <w:t xml:space="preserve"> In Options-&gt;Visual Settings make sure "local light sources" </w:t>
-      </w:r>
-      <w:proofErr w:type="gramStart"/>
-      <w:r>
-        <w:t>is</w:t>
-      </w:r>
-      <w:proofErr w:type="gramEnd"/>
-      <w:r>
-        <w:t xml:space="preserve"> enabled,</w:t>
+        <w:t xml:space="preserve"> In Options-&gt;Visual Settings make sure "local light sources" is enabled,</w:t>
       </w:r>
       <w:r>
         <w:t xml:space="preserve"> enable </w:t>
@@ -2061,15 +1917,7 @@
         <w:br/>
       </w:r>
       <w:r>
-        <w:t xml:space="preserve">That's ultimately up to you, but we generally recommend Apollo 8. While Apollo 7 is chronologically first, it's a very long mission that is meant to test vehicle systems and procedures from the relative safety of low Earth orbit. As such, it involves a very unusual and often repetitive schedule, with procedures that are rather unrefined. Apollo 8, by contrast, is a relatively short mission with more straightforward goals and mission design. You get to experience most of the lunar mission milestones without needing to worry about managing two separate vehicles on your first journey. After Apollo 8 concludes, Apollo 11 or 12 would be our next recommendation. You get to use </w:t>
-      </w:r>
-      <w:proofErr w:type="gramStart"/>
-      <w:r>
-        <w:t>the LM</w:t>
-      </w:r>
-      <w:proofErr w:type="gramEnd"/>
-      <w:r>
-        <w:t xml:space="preserve"> and land on the moon, and the procedures have been improved and optimized thanks to the lessons learned on all the previous missions.</w:t>
+        <w:t>That's ultimately up to you, but we generally recommend Apollo 8. While Apollo 7 is chronologically first, it's a very long mission that is meant to test vehicle systems and procedures from the relative safety of low Earth orbit. As such, it involves a very unusual and often repetitive schedule, with procedures that are rather unrefined. Apollo 8, by contrast, is a relatively short mission with more straightforward goals and mission design. You get to experience most of the lunar mission milestones without needing to worry about managing two separate vehicles on your first journey. After Apollo 8 concludes, Apollo 11 or 12 would be our next recommendation. You get to use the LM and land on the moon, and the procedures have been improved and optimized thanks to the lessons learned on all the previous missions.</w:t>
       </w:r>
       <w:r>
         <w:br/>
@@ -2247,29 +2095,13 @@
         <w:br/>
       </w:r>
       <w:r>
-        <w:t xml:space="preserve">These are </w:t>
-      </w:r>
-      <w:proofErr w:type="gramStart"/>
-      <w:r>
-        <w:t>pretty easy</w:t>
-      </w:r>
-      <w:proofErr w:type="gramEnd"/>
-      <w:r>
-        <w:t xml:space="preserve">. You can </w:t>
+        <w:t xml:space="preserve">These are pretty easy. You can </w:t>
       </w:r>
       <w:r>
         <w:t>click on the left</w:t>
       </w:r>
       <w:r>
-        <w:t xml:space="preserve"> circuit breakers to close or open them. For computer keys like the DSKY or DEDA, just click on each button to press it. If you find that the computer isn't always responding to your key presses, you may be letting go of the button too quickly. Each computer key needs to be held for a small fraction of a second, and sometimes a fast click doesn't hold the button down for quite long enough. You don't need to hold them for a long time, only for </w:t>
-      </w:r>
-      <w:proofErr w:type="gramStart"/>
-      <w:r>
-        <w:t>a brief moment</w:t>
-      </w:r>
-      <w:proofErr w:type="gramEnd"/>
-      <w:r>
-        <w:t xml:space="preserve"> to ensure they register.</w:t>
+        <w:t xml:space="preserve"> circuit breakers to close or open them. For computer keys like the DSKY or DEDA, just click on each button to press it. If you find that the computer isn't always responding to your key presses, you may be letting go of the button too quickly. Each computer key needs to be held for a small fraction of a second, and sometimes a fast click doesn't hold the button down for quite long enough. You don't need to hold them for a long time, only for a brief moment to ensure they register.</w:t>
       </w:r>
       <w:r>
         <w:br/>
@@ -2334,15 +2166,7 @@
         <w:ind w:left="360"/>
       </w:pPr>
       <w:r>
-        <w:t xml:space="preserve">Thumbwheels are the vertical numbered controls, found on the gimbal trim control panel and the attitude set control panel. Left-click the upper or lower part of each thumbwheel to increase/decrease its value by 1, or right-click them to increase/decrease by 0.1. The </w:t>
-      </w:r>
-      <w:proofErr w:type="spellStart"/>
-      <w:r>
-        <w:t>dV</w:t>
-      </w:r>
-      <w:proofErr w:type="spellEnd"/>
-      <w:r>
-        <w:t xml:space="preserve">/Range Set switch on the EMS works similarly: hold the switch on the top or bottom to increase or decrease the </w:t>
+        <w:t xml:space="preserve">Thumbwheels are the vertical numbered controls, found on the gimbal trim control panel and the attitude set control panel. Left-click the upper or lower part of each thumbwheel to increase/decrease its value by 1, or right-click them to increase/decrease by 0.1. The dV/Range Set switch on the EMS works similarly: hold the switch on the top or bottom to increase or decrease the </w:t>
       </w:r>
       <w:r>
         <w:t>value and</w:t>
@@ -2370,15 +2194,7 @@
         <w:ind w:left="360"/>
       </w:pPr>
       <w:r>
-        <w:t>While the 2D cockpit has MFDs built right into its main panel, the 3D cockpit does not. To open an MFD in the 3D cockpit, move your mouse near the top of the Orbiter window. A menu bar should drop down. Click on "Function" and then choose "External MFD". If this option does not appear, make sure the "</w:t>
-      </w:r>
-      <w:proofErr w:type="spellStart"/>
-      <w:r>
-        <w:t>ExtMFD</w:t>
-      </w:r>
-      <w:proofErr w:type="spellEnd"/>
-      <w:r>
-        <w:t>" module is enabled in the Orbiter settings.</w:t>
+        <w:t>While the 2D cockpit has MFDs built right into its main panel, the 3D cockpit does not. To open an MFD in the 3D cockpit, move your mouse near the top of the Orbiter window. A menu bar should drop down. Click on "Function" and then choose "External MFD". If this option does not appear, make sure the "ExtMFD" module is enabled in the Orbiter settings.</w:t>
       </w:r>
     </w:p>
     <w:p>
@@ -2563,23 +2379,7 @@
           <w:b/>
           <w:bCs/>
         </w:rPr>
-        <w:t xml:space="preserve"> keep </w:t>
-      </w:r>
-      <w:proofErr w:type="gramStart"/>
-      <w:r>
-        <w:rPr>
-          <w:b/>
-          <w:bCs/>
-        </w:rPr>
-        <w:t>your save</w:t>
-      </w:r>
-      <w:proofErr w:type="gramEnd"/>
-      <w:r>
-        <w:rPr>
-          <w:b/>
-          <w:bCs/>
-        </w:rPr>
-        <w:t xml:space="preserve"> files organized!</w:t>
+        <w:t xml:space="preserve"> keep your save files organized!</w:t>
       </w:r>
       <w:r>
         <w:t> </w:t>
@@ -2705,32 +2505,16 @@
         <w:t>time warp</w:t>
       </w:r>
       <w:r>
-        <w:t xml:space="preserve"> normally. It will even affect vessels that you're not currently </w:t>
-      </w:r>
-      <w:proofErr w:type="gramStart"/>
-      <w:r>
-        <w:t>controlling:</w:t>
-      </w:r>
-      <w:proofErr w:type="gramEnd"/>
-      <w:r>
-        <w:t xml:space="preserve"> </w:t>
+        <w:t xml:space="preserve"> normally. It will even affect vessels that you're not currently controlling: </w:t>
       </w:r>
       <w:r>
         <w:t>time warping</w:t>
       </w:r>
       <w:r>
-        <w:t xml:space="preserve"> in the CSM while the LM is trying to hold attitude will cause problems for the LM. Usually going up to about 5x or 10x is safe. If you want </w:t>
-      </w:r>
-      <w:proofErr w:type="gramStart"/>
-      <w:r>
-        <w:t xml:space="preserve">to </w:t>
-      </w:r>
-      <w:r>
-        <w:t>time</w:t>
-      </w:r>
-      <w:proofErr w:type="gramEnd"/>
-      <w:r>
-        <w:t xml:space="preserve"> warp</w:t>
+        <w:t xml:space="preserve"> in the CSM while the LM is trying to hold attitude will cause problems for the LM. Usually going up to about 5x or 10x is safe. If you want to </w:t>
+      </w:r>
+      <w:r>
+        <w:t>time warp</w:t>
       </w:r>
       <w:r>
         <w:t xml:space="preserve"> faster, be sure to disable any kind of attitude-hold mode in the CSM and LM before </w:t>
@@ -2767,23 +2551,7 @@
         <w:br/>
       </w:r>
       <w:r>
-        <w:t xml:space="preserve">When you're performing LM activation, be sure to use </w:t>
-      </w:r>
-      <w:proofErr w:type="gramStart"/>
-      <w:r>
-        <w:t>the Project</w:t>
-      </w:r>
-      <w:proofErr w:type="gramEnd"/>
-      <w:r>
-        <w:t xml:space="preserve"> Apollo MFD's "ECS" section to connect the O2 hose from the CSM. This creates a flow of fresh oxygen into the LM so that the cabin doesn't fill up with deadly CO2 and </w:t>
-      </w:r>
-      <w:proofErr w:type="gramStart"/>
-      <w:r>
-        <w:t>poison</w:t>
-      </w:r>
-      <w:proofErr w:type="gramEnd"/>
-      <w:r>
-        <w:t xml:space="preserve"> your crew before the LM ECS is activated. Having this O2 hose connected also prevents you from closing the CSM forward hatch, so if you can't get it </w:t>
+        <w:t xml:space="preserve">When you're performing LM activation, be sure to use the Project Apollo MFD's "ECS" section to connect the O2 hose from the CSM. This creates a flow of fresh oxygen into the LM so that the cabin doesn't fill up with deadly CO2 and poison your crew before the LM ECS is activated. Having this O2 hose connected also prevents you from closing the CSM forward hatch, so if you can't get it </w:t>
       </w:r>
       <w:r>
         <w:t>too</w:t>
@@ -2860,15 +2628,7 @@
         <w:ind w:left="360"/>
       </w:pPr>
       <w:r>
-        <w:t xml:space="preserve">If you look carefully, you will notice there are Velcro patches around the CM and LM. Clicking these will allow you to utilize various mission cue cards, window shades, glareshields etc. that were used during flight. One caveat is they are mostly Apollo 15 cue cards currently, so keep that in mind when flying other flights. We are working to find/create more mission specific cue cards </w:t>
-      </w:r>
-      <w:proofErr w:type="gramStart"/>
-      <w:r>
-        <w:t>in the near future</w:t>
-      </w:r>
-      <w:proofErr w:type="gramEnd"/>
-      <w:r>
-        <w:t>.</w:t>
+        <w:t>If you look carefully, you will notice there are Velcro patches around the CM and LM. Clicking these will allow you to utilize various mission cue cards, window shades, glareshields etc. that were used during flight. One caveat is they are mostly Apollo 15 cue cards currently, so keep that in mind when flying other flights. We are working to find/create more mission specific cue cards in the near future.</w:t>
       </w:r>
     </w:p>
     <w:p>
@@ -3496,7 +3256,6 @@
                 <w14:ligatures w14:val="none"/>
               </w:rPr>
             </w:pPr>
-            <w:proofErr w:type="spellStart"/>
             <w:r>
               <w:rPr>
                 <w:rFonts w:eastAsia="Times New Roman" w:cs="Times New Roman"/>
@@ -3506,7 +3265,6 @@
               </w:rPr>
               <w:t>Ctrl+Alt+S</w:t>
             </w:r>
-            <w:proofErr w:type="spellEnd"/>
           </w:p>
         </w:tc>
         <w:tc>
@@ -3538,19 +3296,8 @@
                 <w:kern w:val="0"/>
                 <w14:ligatures w14:val="none"/>
               </w:rPr>
-              <w:t xml:space="preserve">Generate Mission Time-Stamped </w:t>
-            </w:r>
-            <w:proofErr w:type="spellStart"/>
-            <w:r>
-              <w:rPr>
-                <w:rFonts w:eastAsia="Times New Roman" w:cs="Times New Roman"/>
-                <w:color w:val="000000"/>
-                <w:kern w:val="0"/>
-                <w14:ligatures w14:val="none"/>
-              </w:rPr>
-              <w:t>Quicksave</w:t>
-            </w:r>
-            <w:proofErr w:type="spellEnd"/>
+              <w:t>Generate Mission Time-Stamped Quicksave</w:t>
+            </w:r>
           </w:p>
         </w:tc>
       </w:tr>
@@ -3998,7 +3745,6 @@
                 <w14:ligatures w14:val="none"/>
               </w:rPr>
             </w:pPr>
-            <w:proofErr w:type="spellStart"/>
             <w:r>
               <w:rPr>
                 <w:rFonts w:eastAsia="Times New Roman" w:cs="Times New Roman"/>
@@ -4008,7 +3754,6 @@
               </w:rPr>
               <w:t>Ctrl+H</w:t>
             </w:r>
-            <w:proofErr w:type="spellEnd"/>
           </w:p>
         </w:tc>
         <w:tc>
@@ -4610,7 +4355,6 @@
                 <w14:ligatures w14:val="none"/>
               </w:rPr>
             </w:pPr>
-            <w:proofErr w:type="spellStart"/>
             <w:r>
               <w:rPr>
                 <w:rFonts w:eastAsia="Times New Roman" w:cs="Times New Roman"/>
@@ -4620,7 +4364,6 @@
               </w:rPr>
               <w:t>Alt+Numpad</w:t>
             </w:r>
-            <w:proofErr w:type="spellEnd"/>
           </w:p>
         </w:tc>
         <w:tc>
@@ -4645,7 +4388,6 @@
                 <w14:ligatures w14:val="none"/>
               </w:rPr>
             </w:pPr>
-            <w:proofErr w:type="spellStart"/>
             <w:r>
               <w:rPr>
                 <w:rFonts w:eastAsia="Times New Roman" w:cs="Times New Roman"/>
@@ -4655,7 +4397,6 @@
               </w:rPr>
               <w:t>Hardover</w:t>
             </w:r>
-            <w:proofErr w:type="spellEnd"/>
           </w:p>
         </w:tc>
       </w:tr>
@@ -4944,25 +4685,14 @@
                 <w14:ligatures w14:val="none"/>
               </w:rPr>
             </w:pPr>
-            <w:proofErr w:type="spellStart"/>
-            <w:r>
-              <w:rPr>
-                <w:rFonts w:eastAsia="Times New Roman" w:cs="Times New Roman"/>
-                <w:color w:val="000000"/>
-                <w:kern w:val="0"/>
-                <w14:ligatures w14:val="none"/>
-              </w:rPr>
-              <w:t>Shift+Decimal</w:t>
-            </w:r>
-            <w:proofErr w:type="spellEnd"/>
-            <w:r>
-              <w:rPr>
-                <w:rFonts w:eastAsia="Times New Roman" w:cs="Times New Roman"/>
-                <w:color w:val="000000"/>
-                <w:kern w:val="0"/>
-                <w14:ligatures w14:val="none"/>
-              </w:rPr>
-              <w:t xml:space="preserve"> (Numpad)</w:t>
+            <w:r>
+              <w:rPr>
+                <w:rFonts w:eastAsia="Times New Roman" w:cs="Times New Roman"/>
+                <w:color w:val="000000"/>
+                <w:kern w:val="0"/>
+                <w14:ligatures w14:val="none"/>
+              </w:rPr>
+              <w:t>Shift+Decimal (Numpad)</w:t>
             </w:r>
           </w:p>
         </w:tc>
@@ -5028,25 +4758,14 @@
                 <w14:ligatures w14:val="none"/>
               </w:rPr>
             </w:pPr>
-            <w:proofErr w:type="spellStart"/>
-            <w:r>
-              <w:rPr>
-                <w:rFonts w:eastAsia="Times New Roman" w:cs="Times New Roman"/>
-                <w:color w:val="000000"/>
-                <w:kern w:val="0"/>
-                <w14:ligatures w14:val="none"/>
-              </w:rPr>
-              <w:t>Shift+Page</w:t>
-            </w:r>
-            <w:proofErr w:type="spellEnd"/>
-            <w:r>
-              <w:rPr>
-                <w:rFonts w:eastAsia="Times New Roman" w:cs="Times New Roman"/>
-                <w:color w:val="000000"/>
-                <w:kern w:val="0"/>
-                <w14:ligatures w14:val="none"/>
-              </w:rPr>
-              <w:t xml:space="preserve"> Up</w:t>
+            <w:r>
+              <w:rPr>
+                <w:rFonts w:eastAsia="Times New Roman" w:cs="Times New Roman"/>
+                <w:color w:val="000000"/>
+                <w:kern w:val="0"/>
+                <w14:ligatures w14:val="none"/>
+              </w:rPr>
+              <w:t>Shift+Page Up</w:t>
             </w:r>
           </w:p>
         </w:tc>
@@ -5112,7 +4831,6 @@
                 <w14:ligatures w14:val="none"/>
               </w:rPr>
             </w:pPr>
-            <w:proofErr w:type="spellStart"/>
             <w:r>
               <w:rPr>
                 <w:rFonts w:eastAsia="Times New Roman" w:cs="Times New Roman"/>
@@ -5122,7 +4840,6 @@
               </w:rPr>
               <w:t>Shift+Home</w:t>
             </w:r>
-            <w:proofErr w:type="spellEnd"/>
           </w:p>
         </w:tc>
         <w:tc>
@@ -5187,25 +4904,14 @@
                 <w14:ligatures w14:val="none"/>
               </w:rPr>
             </w:pPr>
-            <w:proofErr w:type="spellStart"/>
-            <w:r>
-              <w:rPr>
-                <w:rFonts w:eastAsia="Times New Roman" w:cs="Times New Roman"/>
-                <w:color w:val="000000"/>
-                <w:kern w:val="0"/>
-                <w14:ligatures w14:val="none"/>
-              </w:rPr>
-              <w:t>Shift+Enter</w:t>
-            </w:r>
-            <w:proofErr w:type="spellEnd"/>
-            <w:r>
-              <w:rPr>
-                <w:rFonts w:eastAsia="Times New Roman" w:cs="Times New Roman"/>
-                <w:color w:val="000000"/>
-                <w:kern w:val="0"/>
-                <w14:ligatures w14:val="none"/>
-              </w:rPr>
-              <w:t xml:space="preserve"> (Numpad)</w:t>
+            <w:r>
+              <w:rPr>
+                <w:rFonts w:eastAsia="Times New Roman" w:cs="Times New Roman"/>
+                <w:color w:val="000000"/>
+                <w:kern w:val="0"/>
+                <w14:ligatures w14:val="none"/>
+              </w:rPr>
+              <w:t>Shift+Enter (Numpad)</w:t>
             </w:r>
           </w:p>
         </w:tc>
@@ -5271,25 +4977,14 @@
                 <w14:ligatures w14:val="none"/>
               </w:rPr>
             </w:pPr>
-            <w:proofErr w:type="spellStart"/>
-            <w:r>
-              <w:rPr>
-                <w:rFonts w:eastAsia="Times New Roman" w:cs="Times New Roman"/>
-                <w:color w:val="000000"/>
-                <w:kern w:val="0"/>
-                <w14:ligatures w14:val="none"/>
-              </w:rPr>
-              <w:t>Shift+Divide</w:t>
-            </w:r>
-            <w:proofErr w:type="spellEnd"/>
-            <w:r>
-              <w:rPr>
-                <w:rFonts w:eastAsia="Times New Roman" w:cs="Times New Roman"/>
-                <w:color w:val="000000"/>
-                <w:kern w:val="0"/>
-                <w14:ligatures w14:val="none"/>
-              </w:rPr>
-              <w:t xml:space="preserve"> (Numpad /)</w:t>
+            <w:r>
+              <w:rPr>
+                <w:rFonts w:eastAsia="Times New Roman" w:cs="Times New Roman"/>
+                <w:color w:val="000000"/>
+                <w:kern w:val="0"/>
+                <w14:ligatures w14:val="none"/>
+              </w:rPr>
+              <w:t>Shift+Divide (Numpad /)</w:t>
             </w:r>
           </w:p>
         </w:tc>
@@ -5355,25 +5050,14 @@
                 <w14:ligatures w14:val="none"/>
               </w:rPr>
             </w:pPr>
-            <w:proofErr w:type="spellStart"/>
-            <w:r>
-              <w:rPr>
-                <w:rFonts w:eastAsia="Times New Roman" w:cs="Times New Roman"/>
-                <w:color w:val="000000"/>
-                <w:kern w:val="0"/>
-                <w14:ligatures w14:val="none"/>
-              </w:rPr>
-              <w:t>Shift+Multiply</w:t>
-            </w:r>
-            <w:proofErr w:type="spellEnd"/>
-            <w:r>
-              <w:rPr>
-                <w:rFonts w:eastAsia="Times New Roman" w:cs="Times New Roman"/>
-                <w:color w:val="000000"/>
-                <w:kern w:val="0"/>
-                <w14:ligatures w14:val="none"/>
-              </w:rPr>
-              <w:t xml:space="preserve"> (Numpad *)</w:t>
+            <w:r>
+              <w:rPr>
+                <w:rFonts w:eastAsia="Times New Roman" w:cs="Times New Roman"/>
+                <w:color w:val="000000"/>
+                <w:kern w:val="0"/>
+                <w14:ligatures w14:val="none"/>
+              </w:rPr>
+              <w:t>Shift+Multiply (Numpad *)</w:t>
             </w:r>
           </w:p>
         </w:tc>
@@ -5439,25 +5123,14 @@
                 <w14:ligatures w14:val="none"/>
               </w:rPr>
             </w:pPr>
-            <w:proofErr w:type="spellStart"/>
-            <w:r>
-              <w:rPr>
-                <w:rFonts w:eastAsia="Times New Roman" w:cs="Times New Roman"/>
-                <w:color w:val="000000"/>
-                <w:kern w:val="0"/>
-                <w14:ligatures w14:val="none"/>
-              </w:rPr>
-              <w:t>Shift+Plus</w:t>
-            </w:r>
-            <w:proofErr w:type="spellEnd"/>
-            <w:r>
-              <w:rPr>
-                <w:rFonts w:eastAsia="Times New Roman" w:cs="Times New Roman"/>
-                <w:color w:val="000000"/>
-                <w:kern w:val="0"/>
-                <w14:ligatures w14:val="none"/>
-              </w:rPr>
-              <w:t xml:space="preserve"> (Numpad +)</w:t>
+            <w:r>
+              <w:rPr>
+                <w:rFonts w:eastAsia="Times New Roman" w:cs="Times New Roman"/>
+                <w:color w:val="000000"/>
+                <w:kern w:val="0"/>
+                <w14:ligatures w14:val="none"/>
+              </w:rPr>
+              <w:t>Shift+Plus (Numpad +)</w:t>
             </w:r>
           </w:p>
         </w:tc>
@@ -5523,25 +5196,14 @@
                 <w14:ligatures w14:val="none"/>
               </w:rPr>
             </w:pPr>
-            <w:proofErr w:type="spellStart"/>
-            <w:r>
-              <w:rPr>
-                <w:rFonts w:eastAsia="Times New Roman" w:cs="Times New Roman"/>
-                <w:color w:val="000000"/>
-                <w:kern w:val="0"/>
-                <w14:ligatures w14:val="none"/>
-              </w:rPr>
-              <w:t>Shift+Minus</w:t>
-            </w:r>
-            <w:proofErr w:type="spellEnd"/>
-            <w:r>
-              <w:rPr>
-                <w:rFonts w:eastAsia="Times New Roman" w:cs="Times New Roman"/>
-                <w:color w:val="000000"/>
-                <w:kern w:val="0"/>
-                <w14:ligatures w14:val="none"/>
-              </w:rPr>
-              <w:t xml:space="preserve"> (Numpad -)</w:t>
+            <w:r>
+              <w:rPr>
+                <w:rFonts w:eastAsia="Times New Roman" w:cs="Times New Roman"/>
+                <w:color w:val="000000"/>
+                <w:kern w:val="0"/>
+                <w14:ligatures w14:val="none"/>
+              </w:rPr>
+              <w:t>Shift+Minus (Numpad -)</w:t>
             </w:r>
           </w:p>
         </w:tc>
@@ -5607,7 +5269,6 @@
                 <w14:ligatures w14:val="none"/>
               </w:rPr>
             </w:pPr>
-            <w:proofErr w:type="spellStart"/>
             <w:r>
               <w:rPr>
                 <w:rFonts w:eastAsia="Times New Roman" w:cs="Times New Roman"/>
@@ -5617,7 +5278,6 @@
               </w:rPr>
               <w:t>Shift+End</w:t>
             </w:r>
-            <w:proofErr w:type="spellEnd"/>
           </w:p>
         </w:tc>
         <w:tc>
@@ -7209,7 +6869,6 @@
                 <w14:ligatures w14:val="none"/>
               </w:rPr>
             </w:pPr>
-            <w:proofErr w:type="spellStart"/>
             <w:r>
               <w:rPr>
                 <w:rFonts w:eastAsia="Times New Roman" w:cs="Times New Roman"/>
@@ -7219,7 +6878,6 @@
               </w:rPr>
               <w:t>Shift+W</w:t>
             </w:r>
-            <w:proofErr w:type="spellEnd"/>
           </w:p>
         </w:tc>
         <w:tc>
@@ -7284,7 +6942,6 @@
                 <w14:ligatures w14:val="none"/>
               </w:rPr>
             </w:pPr>
-            <w:proofErr w:type="spellStart"/>
             <w:r>
               <w:rPr>
                 <w:rFonts w:eastAsia="Times New Roman" w:cs="Times New Roman"/>
@@ -7294,7 +6951,6 @@
               </w:rPr>
               <w:t>Shift+S</w:t>
             </w:r>
-            <w:proofErr w:type="spellEnd"/>
           </w:p>
         </w:tc>
         <w:tc>
@@ -7359,7 +7015,6 @@
                 <w14:ligatures w14:val="none"/>
               </w:rPr>
             </w:pPr>
-            <w:proofErr w:type="spellStart"/>
             <w:r>
               <w:rPr>
                 <w:rFonts w:eastAsia="Times New Roman" w:cs="Times New Roman"/>
@@ -7369,7 +7024,6 @@
               </w:rPr>
               <w:t>Shift+A</w:t>
             </w:r>
-            <w:proofErr w:type="spellEnd"/>
           </w:p>
         </w:tc>
         <w:tc>
@@ -7434,7 +7088,6 @@
                 <w14:ligatures w14:val="none"/>
               </w:rPr>
             </w:pPr>
-            <w:proofErr w:type="spellStart"/>
             <w:r>
               <w:rPr>
                 <w:rFonts w:eastAsia="Times New Roman" w:cs="Times New Roman"/>
@@ -7444,7 +7097,6 @@
               </w:rPr>
               <w:t>Shift+D</w:t>
             </w:r>
-            <w:proofErr w:type="spellEnd"/>
           </w:p>
         </w:tc>
         <w:tc>
@@ -7509,7 +7161,6 @@
                 <w14:ligatures w14:val="none"/>
               </w:rPr>
             </w:pPr>
-            <w:proofErr w:type="spellStart"/>
             <w:r>
               <w:rPr>
                 <w:rFonts w:eastAsia="Times New Roman" w:cs="Times New Roman"/>
@@ -7519,7 +7170,6 @@
               </w:rPr>
               <w:t>Shift+Q</w:t>
             </w:r>
-            <w:proofErr w:type="spellEnd"/>
           </w:p>
         </w:tc>
         <w:tc>
@@ -7584,7 +7234,6 @@
                 <w14:ligatures w14:val="none"/>
               </w:rPr>
             </w:pPr>
-            <w:proofErr w:type="spellStart"/>
             <w:r>
               <w:rPr>
                 <w:rFonts w:eastAsia="Times New Roman" w:cs="Times New Roman"/>
@@ -7594,7 +7243,6 @@
               </w:rPr>
               <w:t>Shift+E</w:t>
             </w:r>
-            <w:proofErr w:type="spellEnd"/>
           </w:p>
         </w:tc>
         <w:tc>
@@ -8848,25 +8496,14 @@
                 <w14:ligatures w14:val="none"/>
               </w:rPr>
             </w:pPr>
-            <w:proofErr w:type="spellStart"/>
-            <w:r>
-              <w:rPr>
-                <w:rFonts w:eastAsia="Times New Roman" w:cs="Times New Roman"/>
-                <w:color w:val="000000"/>
-                <w:kern w:val="0"/>
-                <w14:ligatures w14:val="none"/>
-              </w:rPr>
-              <w:t>Ctrl+Decimal</w:t>
-            </w:r>
-            <w:proofErr w:type="spellEnd"/>
-            <w:r>
-              <w:rPr>
-                <w:rFonts w:eastAsia="Times New Roman" w:cs="Times New Roman"/>
-                <w:color w:val="000000"/>
-                <w:kern w:val="0"/>
-                <w14:ligatures w14:val="none"/>
-              </w:rPr>
-              <w:t xml:space="preserve"> (Numpad .)</w:t>
+            <w:r>
+              <w:rPr>
+                <w:rFonts w:eastAsia="Times New Roman" w:cs="Times New Roman"/>
+                <w:color w:val="000000"/>
+                <w:kern w:val="0"/>
+                <w14:ligatures w14:val="none"/>
+              </w:rPr>
+              <w:t>Ctrl+Decimal (Numpad .)</w:t>
             </w:r>
           </w:p>
         </w:tc>
@@ -8932,25 +8569,14 @@
                 <w14:ligatures w14:val="none"/>
               </w:rPr>
             </w:pPr>
-            <w:proofErr w:type="spellStart"/>
-            <w:r>
-              <w:rPr>
-                <w:rFonts w:eastAsia="Times New Roman" w:cs="Times New Roman"/>
-                <w:color w:val="000000"/>
-                <w:kern w:val="0"/>
-                <w14:ligatures w14:val="none"/>
-              </w:rPr>
-              <w:t>Ctrl+Enter</w:t>
-            </w:r>
-            <w:proofErr w:type="spellEnd"/>
-            <w:r>
-              <w:rPr>
-                <w:rFonts w:eastAsia="Times New Roman" w:cs="Times New Roman"/>
-                <w:color w:val="000000"/>
-                <w:kern w:val="0"/>
-                <w14:ligatures w14:val="none"/>
-              </w:rPr>
-              <w:t xml:space="preserve"> (Numpad)</w:t>
+            <w:r>
+              <w:rPr>
+                <w:rFonts w:eastAsia="Times New Roman" w:cs="Times New Roman"/>
+                <w:color w:val="000000"/>
+                <w:kern w:val="0"/>
+                <w14:ligatures w14:val="none"/>
+              </w:rPr>
+              <w:t>Ctrl+Enter (Numpad)</w:t>
             </w:r>
           </w:p>
         </w:tc>
@@ -9016,25 +8642,14 @@
                 <w14:ligatures w14:val="none"/>
               </w:rPr>
             </w:pPr>
-            <w:proofErr w:type="spellStart"/>
-            <w:r>
-              <w:rPr>
-                <w:rFonts w:eastAsia="Times New Roman" w:cs="Times New Roman"/>
-                <w:color w:val="000000"/>
-                <w:kern w:val="0"/>
-                <w14:ligatures w14:val="none"/>
-              </w:rPr>
-              <w:t>Ctrl+Page</w:t>
-            </w:r>
-            <w:proofErr w:type="spellEnd"/>
-            <w:r>
-              <w:rPr>
-                <w:rFonts w:eastAsia="Times New Roman" w:cs="Times New Roman"/>
-                <w:color w:val="000000"/>
-                <w:kern w:val="0"/>
-                <w14:ligatures w14:val="none"/>
-              </w:rPr>
-              <w:t xml:space="preserve"> Up</w:t>
+            <w:r>
+              <w:rPr>
+                <w:rFonts w:eastAsia="Times New Roman" w:cs="Times New Roman"/>
+                <w:color w:val="000000"/>
+                <w:kern w:val="0"/>
+                <w14:ligatures w14:val="none"/>
+              </w:rPr>
+              <w:t>Ctrl+Page Up</w:t>
             </w:r>
           </w:p>
         </w:tc>
@@ -9100,25 +8715,14 @@
                 <w14:ligatures w14:val="none"/>
               </w:rPr>
             </w:pPr>
-            <w:proofErr w:type="spellStart"/>
-            <w:r>
-              <w:rPr>
-                <w:rFonts w:eastAsia="Times New Roman" w:cs="Times New Roman"/>
-                <w:color w:val="000000"/>
-                <w:kern w:val="0"/>
-                <w14:ligatures w14:val="none"/>
-              </w:rPr>
-              <w:t>Ctrl+Multiply</w:t>
-            </w:r>
-            <w:proofErr w:type="spellEnd"/>
-            <w:r>
-              <w:rPr>
-                <w:rFonts w:eastAsia="Times New Roman" w:cs="Times New Roman"/>
-                <w:color w:val="000000"/>
-                <w:kern w:val="0"/>
-                <w14:ligatures w14:val="none"/>
-              </w:rPr>
-              <w:t xml:space="preserve"> (Numpad *)</w:t>
+            <w:r>
+              <w:rPr>
+                <w:rFonts w:eastAsia="Times New Roman" w:cs="Times New Roman"/>
+                <w:color w:val="000000"/>
+                <w:kern w:val="0"/>
+                <w14:ligatures w14:val="none"/>
+              </w:rPr>
+              <w:t>Ctrl+Multiply (Numpad *)</w:t>
             </w:r>
           </w:p>
         </w:tc>
@@ -9184,25 +8788,14 @@
                 <w14:ligatures w14:val="none"/>
               </w:rPr>
             </w:pPr>
-            <w:proofErr w:type="spellStart"/>
-            <w:r>
-              <w:rPr>
-                <w:rFonts w:eastAsia="Times New Roman" w:cs="Times New Roman"/>
-                <w:color w:val="000000"/>
-                <w:kern w:val="0"/>
-                <w14:ligatures w14:val="none"/>
-              </w:rPr>
-              <w:t>Ctrl+Plus</w:t>
-            </w:r>
-            <w:proofErr w:type="spellEnd"/>
-            <w:r>
-              <w:rPr>
-                <w:rFonts w:eastAsia="Times New Roman" w:cs="Times New Roman"/>
-                <w:color w:val="000000"/>
-                <w:kern w:val="0"/>
-                <w14:ligatures w14:val="none"/>
-              </w:rPr>
-              <w:t xml:space="preserve"> (Numpad +)</w:t>
+            <w:r>
+              <w:rPr>
+                <w:rFonts w:eastAsia="Times New Roman" w:cs="Times New Roman"/>
+                <w:color w:val="000000"/>
+                <w:kern w:val="0"/>
+                <w14:ligatures w14:val="none"/>
+              </w:rPr>
+              <w:t>Ctrl+Plus (Numpad +)</w:t>
             </w:r>
           </w:p>
         </w:tc>
@@ -9268,25 +8861,14 @@
                 <w14:ligatures w14:val="none"/>
               </w:rPr>
             </w:pPr>
-            <w:proofErr w:type="spellStart"/>
-            <w:r>
-              <w:rPr>
-                <w:rFonts w:eastAsia="Times New Roman" w:cs="Times New Roman"/>
-                <w:color w:val="000000"/>
-                <w:kern w:val="0"/>
-                <w14:ligatures w14:val="none"/>
-              </w:rPr>
-              <w:t>Ctrl+Minus</w:t>
-            </w:r>
-            <w:proofErr w:type="spellEnd"/>
-            <w:r>
-              <w:rPr>
-                <w:rFonts w:eastAsia="Times New Roman" w:cs="Times New Roman"/>
-                <w:color w:val="000000"/>
-                <w:kern w:val="0"/>
-                <w14:ligatures w14:val="none"/>
-              </w:rPr>
-              <w:t xml:space="preserve"> (Numpad -)</w:t>
+            <w:r>
+              <w:rPr>
+                <w:rFonts w:eastAsia="Times New Roman" w:cs="Times New Roman"/>
+                <w:color w:val="000000"/>
+                <w:kern w:val="0"/>
+                <w14:ligatures w14:val="none"/>
+              </w:rPr>
+              <w:t>Ctrl+Minus (Numpad -)</w:t>
             </w:r>
           </w:p>
         </w:tc>
@@ -9745,7 +9327,6 @@
                 <w14:ligatures w14:val="none"/>
               </w:rPr>
             </w:pPr>
-            <w:proofErr w:type="spellStart"/>
             <w:r>
               <w:rPr>
                 <w:rFonts w:eastAsia="Times New Roman" w:cs="Times New Roman"/>
@@ -9755,7 +9336,6 @@
               </w:rPr>
               <w:t>Alt+W</w:t>
             </w:r>
-            <w:proofErr w:type="spellEnd"/>
           </w:p>
         </w:tc>
         <w:tc>
@@ -9893,7 +9473,6 @@
                 <w14:ligatures w14:val="none"/>
               </w:rPr>
             </w:pPr>
-            <w:proofErr w:type="spellStart"/>
             <w:r>
               <w:rPr>
                 <w:rFonts w:eastAsia="Times New Roman" w:cs="Times New Roman"/>
@@ -9903,7 +9482,6 @@
               </w:rPr>
               <w:t>Alt+S</w:t>
             </w:r>
-            <w:proofErr w:type="spellEnd"/>
           </w:p>
         </w:tc>
         <w:tc>
@@ -10322,25 +9900,14 @@
                 <w14:ligatures w14:val="none"/>
               </w:rPr>
             </w:pPr>
-            <w:proofErr w:type="gramStart"/>
-            <w:r>
-              <w:rPr>
-                <w:rFonts w:eastAsia="Times New Roman" w:cs="Times New Roman"/>
-                <w:color w:val="000000"/>
-                <w:kern w:val="0"/>
-                <w14:ligatures w14:val="none"/>
-              </w:rPr>
-              <w:t>Increase</w:t>
-            </w:r>
-            <w:proofErr w:type="gramEnd"/>
-            <w:r>
-              <w:rPr>
-                <w:rFonts w:eastAsia="Times New Roman" w:cs="Times New Roman"/>
-                <w:color w:val="000000"/>
-                <w:kern w:val="0"/>
-                <w14:ligatures w14:val="none"/>
-              </w:rPr>
-              <w:t xml:space="preserve"> Descent Rate</w:t>
+            <w:r>
+              <w:rPr>
+                <w:rFonts w:eastAsia="Times New Roman" w:cs="Times New Roman"/>
+                <w:color w:val="000000"/>
+                <w:kern w:val="0"/>
+                <w14:ligatures w14:val="none"/>
+              </w:rPr>
+              <w:t>Increase Descent Rate</w:t>
             </w:r>
           </w:p>
         </w:tc>
@@ -10899,25 +10466,14 @@
                 <w14:ligatures w14:val="none"/>
               </w:rPr>
             </w:pPr>
-            <w:proofErr w:type="gramStart"/>
-            <w:r>
-              <w:rPr>
-                <w:rFonts w:eastAsia="Times New Roman" w:cs="Times New Roman"/>
-                <w:color w:val="000000"/>
-                <w:kern w:val="0"/>
-                <w14:ligatures w14:val="none"/>
-              </w:rPr>
-              <w:t>Abort</w:t>
-            </w:r>
-            <w:proofErr w:type="gramEnd"/>
-            <w:r>
-              <w:rPr>
-                <w:rFonts w:eastAsia="Times New Roman" w:cs="Times New Roman"/>
-                <w:color w:val="000000"/>
-                <w:kern w:val="0"/>
-                <w14:ligatures w14:val="none"/>
-              </w:rPr>
-              <w:t xml:space="preserve"> Stage PUSH</w:t>
+            <w:r>
+              <w:rPr>
+                <w:rFonts w:eastAsia="Times New Roman" w:cs="Times New Roman"/>
+                <w:color w:val="000000"/>
+                <w:kern w:val="0"/>
+                <w14:ligatures w14:val="none"/>
+              </w:rPr>
+              <w:t>Abort Stage PUSH</w:t>
             </w:r>
           </w:p>
         </w:tc>
@@ -11240,7 +10796,6 @@
                 <w14:ligatures w14:val="none"/>
               </w:rPr>
             </w:pPr>
-            <w:proofErr w:type="spellStart"/>
             <w:r>
               <w:rPr>
                 <w:rFonts w:eastAsia="Times New Roman" w:cs="Times New Roman"/>
@@ -11250,7 +10805,6 @@
               </w:rPr>
               <w:t>Ctrl+Alt+Numpad</w:t>
             </w:r>
-            <w:proofErr w:type="spellEnd"/>
           </w:p>
         </w:tc>
         <w:tc>
@@ -14818,6 +14372,18 @@
       <w:bCs/>
     </w:rPr>
   </w:style>
+  <w:style w:type="character" w:styleId="FollowedHyperlink">
+    <w:name w:val="FollowedHyperlink"/>
+    <w:basedOn w:val="DefaultParagraphFont"/>
+    <w:uiPriority w:val="99"/>
+    <w:semiHidden/>
+    <w:unhideWhenUsed/>
+    <w:rsid w:val="00301375"/>
+    <w:rPr>
+      <w:color w:val="9DFFCB" w:themeColor="followedHyperlink"/>
+      <w:u w:val="single"/>
+    </w:rPr>
+  </w:style>
 </w:styles>
 </file>
 

</xml_diff>

<commit_message>
Update dead orbiter links
</commit_message>
<xml_diff>
--- a/Doc/Project Apollo - NASSP/Programmers Notes/NASSP Quick Start Guide.docx
+++ b/Doc/Project Apollo - NASSP/Programmers Notes/NASSP Quick Start Guide.docx
@@ -34,7 +34,7 @@
           <w:b w:val="0"/>
           <w:bCs w:val="0"/>
         </w:rPr>
-        <w:t>4.</w:t>
+        <w:t>5</w:t>
       </w:r>
       <w:r>
         <w:rPr>
@@ -42,7 +42,15 @@
           <w:b w:val="0"/>
           <w:bCs w:val="0"/>
         </w:rPr>
-        <w:t>5</w:t>
+        <w:t>.</w:t>
+      </w:r>
+      <w:r>
+        <w:rPr>
+          <w:rStyle w:val="IntenseReference"/>
+          <w:b w:val="0"/>
+          <w:bCs w:val="0"/>
+        </w:rPr>
+        <w:t>0</w:t>
       </w:r>
     </w:p>
     <w:p>
@@ -61,6 +69,14 @@
           <w:bCs w:val="0"/>
         </w:rPr>
         <w:t>1</w:t>
+      </w:r>
+      <w:r>
+        <w:rPr>
+          <w:rStyle w:val="IntenseReference"/>
+          <w:b w:val="0"/>
+          <w:bCs w:val="0"/>
+        </w:rPr>
+        <w:t>7</w:t>
       </w:r>
       <w:r>
         <w:rPr>
@@ -157,7 +173,7 @@
           <w:r>
             <w:fldChar w:fldCharType="separate"/>
           </w:r>
-          <w:hyperlink w:anchor="_Toc232239547" w:history="1">
+          <w:hyperlink w:anchor="_Toc235168507" w:history="1">
             <w:r>
               <w:rPr>
                 <w:rStyle w:val="Hyperlink"/>
@@ -184,7 +200,7 @@
                 <w:noProof/>
                 <w:webHidden/>
               </w:rPr>
-              <w:instrText xml:space="preserve"> PAGEREF _Toc232239547 \h </w:instrText>
+              <w:instrText xml:space="preserve"> PAGEREF _Toc235168507 \h </w:instrText>
             </w:r>
             <w:r>
               <w:rPr>
@@ -228,7 +244,7 @@
               <w:szCs w:val="24"/>
             </w:rPr>
           </w:pPr>
-          <w:hyperlink w:anchor="_Toc232239548" w:history="1">
+          <w:hyperlink w:anchor="_Toc235168508" w:history="1">
             <w:r>
               <w:rPr>
                 <w:rStyle w:val="Hyperlink"/>
@@ -255,7 +271,7 @@
                 <w:noProof/>
                 <w:webHidden/>
               </w:rPr>
-              <w:instrText xml:space="preserve"> PAGEREF _Toc232239548 \h </w:instrText>
+              <w:instrText xml:space="preserve"> PAGEREF _Toc235168508 \h </w:instrText>
             </w:r>
             <w:r>
               <w:rPr>
@@ -299,7 +315,7 @@
               <w:szCs w:val="24"/>
             </w:rPr>
           </w:pPr>
-          <w:hyperlink w:anchor="_Toc232239549" w:history="1">
+          <w:hyperlink w:anchor="_Toc235168509" w:history="1">
             <w:r>
               <w:rPr>
                 <w:rStyle w:val="Hyperlink"/>
@@ -326,7 +342,7 @@
                 <w:noProof/>
                 <w:webHidden/>
               </w:rPr>
-              <w:instrText xml:space="preserve"> PAGEREF _Toc232239549 \h </w:instrText>
+              <w:instrText xml:space="preserve"> PAGEREF _Toc235168509 \h </w:instrText>
             </w:r>
             <w:r>
               <w:rPr>
@@ -370,7 +386,7 @@
               <w:szCs w:val="24"/>
             </w:rPr>
           </w:pPr>
-          <w:hyperlink w:anchor="_Toc232239550" w:history="1">
+          <w:hyperlink w:anchor="_Toc235168510" w:history="1">
             <w:r>
               <w:rPr>
                 <w:rStyle w:val="Hyperlink"/>
@@ -397,7 +413,7 @@
                 <w:noProof/>
                 <w:webHidden/>
               </w:rPr>
-              <w:instrText xml:space="preserve"> PAGEREF _Toc232239550 \h </w:instrText>
+              <w:instrText xml:space="preserve"> PAGEREF _Toc235168510 \h </w:instrText>
             </w:r>
             <w:r>
               <w:rPr>
@@ -441,7 +457,7 @@
               <w:szCs w:val="24"/>
             </w:rPr>
           </w:pPr>
-          <w:hyperlink w:anchor="_Toc232239551" w:history="1">
+          <w:hyperlink w:anchor="_Toc235168511" w:history="1">
             <w:r>
               <w:rPr>
                 <w:rStyle w:val="Hyperlink"/>
@@ -468,7 +484,7 @@
                 <w:noProof/>
                 <w:webHidden/>
               </w:rPr>
-              <w:instrText xml:space="preserve"> PAGEREF _Toc232239551 \h </w:instrText>
+              <w:instrText xml:space="preserve"> PAGEREF _Toc235168511 \h </w:instrText>
             </w:r>
             <w:r>
               <w:rPr>
@@ -685,7 +701,7 @@
       <w:pPr>
         <w:pStyle w:val="Heading1"/>
       </w:pPr>
-      <w:bookmarkStart w:id="0" w:name="_Toc232239547"/>
+      <w:bookmarkStart w:id="0" w:name="_Toc235168507"/>
       <w:r>
         <w:t>Installation (NASSP 8</w:t>
       </w:r>
@@ -806,34 +822,7 @@
           <w:b/>
           <w:bCs/>
         </w:rPr>
-        <w:t>Installation</w:t>
-      </w:r>
-      <w:r>
-        <w:rPr>
-          <w:b/>
-          <w:bCs/>
-        </w:rPr>
-        <w:t xml:space="preserve"> Instructions</w:t>
-      </w:r>
-      <w:r>
-        <w:rPr>
-          <w:b/>
-          <w:bCs/>
-        </w:rPr>
-        <w:t>:</w:t>
-      </w:r>
-      <w:r>
-        <w:br/>
-      </w:r>
-      <w:r>
-        <w:br/>
-        <w:t xml:space="preserve">1. Install Orbiter </w:t>
-      </w:r>
-      <w:r>
-        <w:t xml:space="preserve">2016 </w:t>
-      </w:r>
-      <w:r>
-        <w:t>Beta:</w:t>
+        <w:t>Download Orbiter:</w:t>
       </w:r>
       <w:r>
         <w:br/>
@@ -864,24 +853,6 @@
       </w:r>
       <w:r>
         <w:br/>
-        <w:t>Alternatively, if you wish to use the old SVN method, follow this link </w:t>
-      </w:r>
-      <w:hyperlink r:id="rId11" w:tgtFrame="_blank" w:history="1">
-        <w:r>
-          <w:rPr>
-            <w:rStyle w:val="Hyperlink"/>
-          </w:rPr>
-          <w:t>http://orbit.medphys.ucl.ac.uk/betainstall.html</w:t>
-        </w:r>
-      </w:hyperlink>
-      <w:r>
-        <w:t> for instructions on how to install the beta version of Orbiter.</w:t>
-      </w:r>
-      <w:r>
-        <w:br/>
-      </w:r>
-      <w:r>
-        <w:br/>
       </w:r>
       <w:r>
         <w:rPr>
@@ -902,48 +873,118 @@
           <w:b/>
           <w:bCs/>
         </w:rPr>
-        <w:t xml:space="preserve"> which is R90, but it is unknown how long this SVN repository will be maintained.</w:t>
-      </w:r>
-      <w:r>
-        <w:br/>
-      </w:r>
-      <w:r>
-        <w:br/>
-        <w:t>2. Texture Installation:</w:t>
-      </w:r>
-      <w:r>
-        <w:br/>
-      </w:r>
-      <w:r>
-        <w:br/>
-        <w:t>-</w:t>
+        <w:t xml:space="preserve"> which is R90</w:t>
       </w:r>
       <w:r>
         <w:rPr>
           <w:b/>
           <w:bCs/>
         </w:rPr>
-        <w:t>Required: </w:t>
-      </w:r>
-      <w:r>
-        <w:t>Download standard orbiter textures under "Orbiter core package download" and choose the zip file:</w:t>
-      </w:r>
-      <w:hyperlink r:id="rId12" w:tgtFrame="_blank" w:history="1">
+        <w:t>.</w:t>
+      </w:r>
+      <w:r>
+        <w:br/>
+      </w:r>
+      <w:r>
+        <w:br/>
+      </w:r>
+      <w:r>
+        <w:rPr>
+          <w:b/>
+          <w:bCs/>
+        </w:rPr>
+        <w:t>Download Textures:</w:t>
+      </w:r>
+    </w:p>
+    <w:p>
+      <w:r>
+        <w:t>1</w:t>
+      </w:r>
+      <w:r>
+        <w:t>a.</w:t>
+      </w:r>
+      <w:r>
+        <w:t xml:space="preserve"> Download Orbiter 20</w:t>
+      </w:r>
+      <w:r>
+        <w:t>16</w:t>
+      </w:r>
+      <w:r>
+        <w:t xml:space="preserve"> Release</w:t>
+      </w:r>
+      <w:r>
+        <w:t xml:space="preserve"> </w:t>
+      </w:r>
+      <w:r>
+        <w:t>here</w:t>
+      </w:r>
+      <w:r>
+        <w:t>:</w:t>
+      </w:r>
+      <w:r>
+        <w:t xml:space="preserve"> </w:t>
+      </w:r>
+      <w:hyperlink r:id="rId11" w:history="1">
         <w:r>
           <w:rPr>
             <w:rStyle w:val="Hyperlink"/>
           </w:rPr>
-          <w:t> http://orbit.medphys.ucl.ac.uk/download.html</w:t>
+          <w:t>https://www.orbiter-forum.com/resources/orbiter-2016-core-zip-edition.5425/</w:t>
         </w:r>
       </w:hyperlink>
       <w:r>
-        <w:t> and copy the Textures folder to your orbiter beta install location.</w:t>
-      </w:r>
-      <w:r>
-        <w:br/>
-      </w:r>
-      <w:r>
-        <w:br/>
+        <w:t xml:space="preserve"> </w:t>
+      </w:r>
+      <w:r>
+        <w:t>and extract the textures folder</w:t>
+      </w:r>
+      <w:r>
+        <w:t xml:space="preserve"> into your orbiter root</w:t>
+      </w:r>
+      <w:r>
+        <w:t xml:space="preserve">. </w:t>
+      </w:r>
+      <w:r>
+        <w:t xml:space="preserve">This contains only </w:t>
+      </w:r>
+      <w:proofErr w:type="gramStart"/>
+      <w:r>
+        <w:t>Low Res</w:t>
+      </w:r>
+      <w:proofErr w:type="gramEnd"/>
+      <w:r>
+        <w:t xml:space="preserve"> textures</w:t>
+      </w:r>
+    </w:p>
+    <w:p>
+      <w:r>
+        <w:t>1b.</w:t>
+      </w:r>
+      <w:r>
+        <w:t xml:space="preserve"> </w:t>
+      </w:r>
+      <w:r>
+        <w:t xml:space="preserve">Optionally you may </w:t>
+      </w:r>
+      <w:r>
+        <w:t xml:space="preserve">instead </w:t>
+      </w:r>
+      <w:r>
+        <w:t xml:space="preserve">download the Low Res and Landing Site Textures </w:t>
+      </w:r>
+      <w:hyperlink r:id="rId12" w:history="1">
+        <w:r>
+          <w:rPr>
+            <w:rStyle w:val="Hyperlink"/>
+          </w:rPr>
+          <w:t>here</w:t>
+        </w:r>
+      </w:hyperlink>
+      <w:r>
+        <w:t>.</w:t>
+      </w:r>
+      <w:r>
+        <w:t xml:space="preserve"> Extract the Textures folder in the Low Res and LS textures zips into the orbiter root</w:t>
       </w:r>
     </w:p>
     <w:p>
@@ -952,22 +993,27 @@
           <w:b/>
           <w:bCs/>
         </w:rPr>
-        <w:lastRenderedPageBreak/>
-        <w:t>-Optional:</w:t>
+        <w:t>Optional:</w:t>
       </w:r>
       <w:r>
         <w:t> Download high-resolution Earth &amp; Moon textures under "Optional high-resolution texture download":</w:t>
       </w:r>
-      <w:hyperlink r:id="rId13" w:tgtFrame="_blank" w:history="1">
+      <w:r>
+        <w:t> </w:t>
+      </w:r>
+      <w:hyperlink r:id="rId13" w:history="1">
         <w:r>
           <w:rPr>
             <w:rStyle w:val="Hyperlink"/>
           </w:rPr>
-          <w:t> http://orbit.medphys.ucl.ac.uk/download.html</w:t>
+          <w:t>https://www.orbiter-forum.com/resources/orbiter-2016-high-resolution-texture-packs.5676/</w:t>
         </w:r>
       </w:hyperlink>
       <w:r>
-        <w:t> and copy to your Textures/Earth and Textures/Moon folders respectively.</w:t>
+        <w:t xml:space="preserve"> </w:t>
+      </w:r>
+      <w:r>
+        <w:t>and copy to your Textures/Earth and Textures/Moon folders respectively.</w:t>
       </w:r>
     </w:p>
     <w:p>
@@ -976,7 +1022,7 @@
           <w:b/>
           <w:bCs/>
         </w:rPr>
-        <w:t>-Optional:</w:t>
+        <w:t>Optional:</w:t>
       </w:r>
       <w:r>
         <w:t> Download the surface micro textures here: </w:t>
@@ -990,10 +1036,15 @@
         </w:r>
       </w:hyperlink>
       <w:r>
-        <w:t> Scroll down to "MicroTexture Pack for D3D9Client" and unzip to your Orbiter directory.</w:t>
-      </w:r>
-      <w:r>
-        <w:br/>
+        <w:t> Scroll down to "</w:t>
+      </w:r>
+      <w:proofErr w:type="spellStart"/>
+      <w:r>
+        <w:t>MicroTexture</w:t>
+      </w:r>
+      <w:proofErr w:type="spellEnd"/>
+      <w:r>
+        <w:t xml:space="preserve"> Pack for D3D9Client" and unzip to your Orbiter directory.</w:t>
       </w:r>
       <w:r>
         <w:br/>
@@ -1003,10 +1054,19 @@
           <w:b/>
           <w:bCs/>
         </w:rPr>
-        <w:t>-Optional:</w:t>
-      </w:r>
-      <w:r>
-        <w:t> Download "Apollo Landing Sites for Orbiter 2016" by ggalfi here: </w:t>
+        <w:lastRenderedPageBreak/>
+        <w:t>Optional:</w:t>
+      </w:r>
+      <w:r>
+        <w:t xml:space="preserve"> Download "Apollo Landing Sites for Orbiter 2016" by </w:t>
+      </w:r>
+      <w:proofErr w:type="spellStart"/>
+      <w:r>
+        <w:t>ggalfi</w:t>
+      </w:r>
+      <w:proofErr w:type="spellEnd"/>
+      <w:r>
+        <w:t xml:space="preserve"> here: </w:t>
       </w:r>
       <w:hyperlink r:id="rId15" w:tgtFrame="_blank" w:history="1">
         <w:r>
@@ -1116,7 +1176,23 @@
           <w:b/>
           <w:bCs/>
         </w:rPr>
-        <w:t xml:space="preserve">IMPORTANT: Click "Advanced" and add a check beside "Enable absolute animation handling" to prevent animation drift </w:t>
+        <w:t xml:space="preserve">IMPORTANT: Click "Advanced" and add a check beside "Enable absolute animation handling" to prevent </w:t>
+      </w:r>
+      <w:proofErr w:type="gramStart"/>
+      <w:r>
+        <w:rPr>
+          <w:b/>
+          <w:bCs/>
+        </w:rPr>
+        <w:t>animation drift</w:t>
+      </w:r>
+      <w:proofErr w:type="gramEnd"/>
+      <w:r>
+        <w:rPr>
+          <w:b/>
+          <w:bCs/>
+        </w:rPr>
+        <w:t xml:space="preserve"> </w:t>
       </w:r>
       <w:r>
         <w:rPr>
@@ -1151,7 +1227,15 @@
       </w:r>
       <w:r>
         <w:br/>
-        <w:t>4. Install XRSound 2.0: </w:t>
+        <w:t xml:space="preserve">4. Install </w:t>
+      </w:r>
+      <w:proofErr w:type="spellStart"/>
+      <w:r>
+        <w:t>XRSound</w:t>
+      </w:r>
+      <w:proofErr w:type="spellEnd"/>
+      <w:r>
+        <w:t xml:space="preserve"> 2.0: </w:t>
       </w:r>
       <w:hyperlink r:id="rId18" w:history="1">
         <w:r>
@@ -1183,7 +1267,15 @@
         </w:r>
       </w:hyperlink>
       <w:r>
-        <w:t xml:space="preserve"> and unzip to your Orbiter directory. Do the same with the small XRSound config zip file that can be found at the link as well. These files only </w:t>
+        <w:t xml:space="preserve"> and unzip to your Orbiter directory. Do the same with the small </w:t>
+      </w:r>
+      <w:proofErr w:type="spellStart"/>
+      <w:r>
+        <w:t>XRSound</w:t>
+      </w:r>
+      <w:proofErr w:type="spellEnd"/>
+      <w:r>
+        <w:t xml:space="preserve"> config zip file that can be found at the link as well. These files only </w:t>
       </w:r>
       <w:r>
         <w:t>must</w:t>
@@ -1207,7 +1299,6 @@
           <w:b/>
           <w:bCs/>
         </w:rPr>
-        <w:lastRenderedPageBreak/>
         <w:t>Configure Project Apollo</w:t>
       </w:r>
       <w:r>
@@ -1215,7 +1306,23 @@
           <w:b/>
           <w:bCs/>
         </w:rPr>
-        <w:t xml:space="preserve"> For Orbiter 2016 Beta</w:t>
+        <w:t xml:space="preserve"> </w:t>
+      </w:r>
+      <w:proofErr w:type="gramStart"/>
+      <w:r>
+        <w:rPr>
+          <w:b/>
+          <w:bCs/>
+        </w:rPr>
+        <w:t>For</w:t>
+      </w:r>
+      <w:proofErr w:type="gramEnd"/>
+      <w:r>
+        <w:rPr>
+          <w:b/>
+          <w:bCs/>
+        </w:rPr>
+        <w:t xml:space="preserve"> Orbiter 2016 Beta</w:t>
       </w:r>
       <w:r>
         <w:rPr>
@@ -1235,7 +1342,11 @@
         <w:t>on</w:t>
       </w:r>
       <w:r>
-        <w:t xml:space="preserve"> some occasions they can cause CTDs with NASSP. Go to "Visual effects" tab and configure to your liking. Make sure to have a check on surface elevation, using LINEAR interpolation </w:t>
+        <w:t xml:space="preserve"> some occasions they can cause CTDs with NASSP. Go to "Visual effects" tab and configure to your liking. Make sure to have a check on surface elevation, using </w:t>
+      </w:r>
+      <w:r>
+        <w:lastRenderedPageBreak/>
+        <w:t xml:space="preserve">LINEAR interpolation </w:t>
       </w:r>
       <w:r>
         <w:t>to</w:t>
@@ -1248,7 +1359,31 @@
       </w:r>
       <w:r>
         <w:br/>
-        <w:t>2. Go to the "Modules" tab and activate the "XRSound" and "ProjectApolloMFD" and "ApolloRTCCMFD" modules.</w:t>
+        <w:t>2. Go to the "Modules" tab and activate the "</w:t>
+      </w:r>
+      <w:proofErr w:type="spellStart"/>
+      <w:r>
+        <w:t>XRSound</w:t>
+      </w:r>
+      <w:proofErr w:type="spellEnd"/>
+      <w:r>
+        <w:t>" and "</w:t>
+      </w:r>
+      <w:proofErr w:type="spellStart"/>
+      <w:r>
+        <w:t>ProjectApolloMFD</w:t>
+      </w:r>
+      <w:proofErr w:type="spellEnd"/>
+      <w:r>
+        <w:t>" and "</w:t>
+      </w:r>
+      <w:proofErr w:type="spellStart"/>
+      <w:r>
+        <w:t>ApolloRTCCMFD</w:t>
+      </w:r>
+      <w:proofErr w:type="spellEnd"/>
+      <w:r>
+        <w:t>" modules.</w:t>
       </w:r>
       <w:r>
         <w:br/>
@@ -1261,7 +1396,15 @@
         <w:t>Vessel Configuration-&gt;Project Apollo Configuration</w:t>
       </w:r>
       <w:r>
-        <w:t xml:space="preserve"> on the "Extra" tab. If you have a joystick, this is where you can configure your joystick for use in NASSP. Do not use the normal Orbiter controls page to configure your joystick, there it should be &lt;Disabled&gt;. In the "Miscellaneous" tab, make sure "Multi-Threading in time acceleration" is checked. It is also recommended to set a limit for time acceleration, NASSP runs best at 50x or less depending on the hardware you are using.</w:t>
+        <w:t xml:space="preserve"> on the "Extra" tab. If you have a joystick, this is where you can configure your joystick for use in NASSP. Do not use the normal Orbiter controls page to configure your joystick, there it should be &lt;Disabled&gt;. In the "Miscellaneous" tab, make sure "Multi-Threading in time acceleration" is checked. It is also recommended to set a limit for time </w:t>
+      </w:r>
+      <w:proofErr w:type="gramStart"/>
+      <w:r>
+        <w:t>acceleration,</w:t>
+      </w:r>
+      <w:proofErr w:type="gramEnd"/>
+      <w:r>
+        <w:t xml:space="preserve"> NASSP runs best at 50x or less depending on the hardware you are using.</w:t>
       </w:r>
       <w:r>
         <w:br/>
@@ -1351,6 +1494,30 @@
         </w:rPr>
         <w:t xml:space="preserve"> not have the latest systems updates. Because of this, they may have alarms and other quirks when loading them. We encourage starting with a fresh launch.</w:t>
       </w:r>
+    </w:p>
+    <w:p>
+      <w:pPr>
+        <w:rPr>
+          <w:b/>
+          <w:bCs/>
+        </w:rPr>
+      </w:pPr>
+    </w:p>
+    <w:p>
+      <w:pPr>
+        <w:rPr>
+          <w:b/>
+          <w:bCs/>
+        </w:rPr>
+      </w:pPr>
+    </w:p>
+    <w:p>
+      <w:pPr>
+        <w:rPr>
+          <w:b/>
+          <w:bCs/>
+        </w:rPr>
+      </w:pPr>
     </w:p>
     <w:p>
       <w:pPr>
@@ -1428,7 +1595,7 @@
       <w:pPr>
         <w:pStyle w:val="Heading1"/>
       </w:pPr>
-      <w:bookmarkStart w:id="1" w:name="_Toc232239548"/>
+      <w:bookmarkStart w:id="1" w:name="_Toc235168508"/>
       <w:r>
         <w:lastRenderedPageBreak/>
         <w:t xml:space="preserve">Installation (NASSP </w:t>
@@ -1564,7 +1731,15 @@
         <w:t xml:space="preserve"> </w:t>
       </w:r>
       <w:r>
-        <w:t>This contains only Low Res textures</w:t>
+        <w:t xml:space="preserve">This contains only </w:t>
+      </w:r>
+      <w:proofErr w:type="gramStart"/>
+      <w:r>
+        <w:t>Low Res</w:t>
+      </w:r>
+      <w:proofErr w:type="gramEnd"/>
+      <w:r>
+        <w:t xml:space="preserve"> textures</w:t>
       </w:r>
     </w:p>
     <w:p>
@@ -1714,7 +1889,39 @@
         <w:t>g</w:t>
       </w:r>
       <w:r>
-        <w:t>o to the "Modules" tab and activate the "ExtMFD", XRSound", "ProjectApolloMFD" and "ApolloRTCCMFD" modules. Do not use the DX9MFD as it is known to cause crashes</w:t>
+        <w:t>o to the "Modules" tab and activate the "</w:t>
+      </w:r>
+      <w:proofErr w:type="spellStart"/>
+      <w:r>
+        <w:t>ExtMFD</w:t>
+      </w:r>
+      <w:proofErr w:type="spellEnd"/>
+      <w:r>
+        <w:t xml:space="preserve">", </w:t>
+      </w:r>
+      <w:proofErr w:type="spellStart"/>
+      <w:r>
+        <w:t>XRSound</w:t>
+      </w:r>
+      <w:proofErr w:type="spellEnd"/>
+      <w:r>
+        <w:t>", "</w:t>
+      </w:r>
+      <w:proofErr w:type="spellStart"/>
+      <w:r>
+        <w:t>ProjectApolloMFD</w:t>
+      </w:r>
+      <w:proofErr w:type="spellEnd"/>
+      <w:r>
+        <w:t>" and "</w:t>
+      </w:r>
+      <w:proofErr w:type="spellStart"/>
+      <w:r>
+        <w:t>ApolloRTCCMFD</w:t>
+      </w:r>
+      <w:proofErr w:type="spellEnd"/>
+      <w:r>
+        <w:t>" modules. Do not use the DX9MFD as it is known to cause crashes</w:t>
       </w:r>
     </w:p>
     <w:p>
@@ -1725,7 +1932,15 @@
         <w:t>.</w:t>
       </w:r>
       <w:r>
-        <w:t xml:space="preserve"> In Options-&gt;Visual Settings make sure "local light sources" is enabled,</w:t>
+        <w:t xml:space="preserve"> In Options-&gt;Visual Settings make sure "local light sources" </w:t>
+      </w:r>
+      <w:proofErr w:type="gramStart"/>
+      <w:r>
+        <w:t>is</w:t>
+      </w:r>
+      <w:proofErr w:type="gramEnd"/>
+      <w:r>
+        <w:t xml:space="preserve"> enabled,</w:t>
       </w:r>
       <w:r>
         <w:t xml:space="preserve"> enable </w:t>
@@ -1891,7 +2106,7 @@
       <w:pPr>
         <w:pStyle w:val="Heading1"/>
       </w:pPr>
-      <w:bookmarkStart w:id="2" w:name="_Toc232239549"/>
+      <w:bookmarkStart w:id="2" w:name="_Toc235168509"/>
       <w:r>
         <w:lastRenderedPageBreak/>
         <w:t>Tips For Beginners:</w:t>
@@ -1917,7 +2132,15 @@
         <w:br/>
       </w:r>
       <w:r>
-        <w:t>That's ultimately up to you, but we generally recommend Apollo 8. While Apollo 7 is chronologically first, it's a very long mission that is meant to test vehicle systems and procedures from the relative safety of low Earth orbit. As such, it involves a very unusual and often repetitive schedule, with procedures that are rather unrefined. Apollo 8, by contrast, is a relatively short mission with more straightforward goals and mission design. You get to experience most of the lunar mission milestones without needing to worry about managing two separate vehicles on your first journey. After Apollo 8 concludes, Apollo 11 or 12 would be our next recommendation. You get to use the LM and land on the moon, and the procedures have been improved and optimized thanks to the lessons learned on all the previous missions.</w:t>
+        <w:t xml:space="preserve">That's ultimately up to you, but we generally recommend Apollo 8. While Apollo 7 is chronologically first, it's a very long mission that is meant to test vehicle systems and procedures from the relative safety of low Earth orbit. As such, it involves a very unusual and often repetitive schedule, with procedures that are rather unrefined. Apollo 8, by contrast, is a relatively short mission with more straightforward goals and mission design. You get to experience most of the lunar mission milestones without needing to worry about managing two separate vehicles on your first journey. After Apollo 8 concludes, Apollo 11 or 12 would be our next recommendation. You get to use </w:t>
+      </w:r>
+      <w:proofErr w:type="gramStart"/>
+      <w:r>
+        <w:t>the LM</w:t>
+      </w:r>
+      <w:proofErr w:type="gramEnd"/>
+      <w:r>
+        <w:t xml:space="preserve"> and land on the moon, and the procedures have been improved and optimized thanks to the lessons learned on all the previous missions.</w:t>
       </w:r>
       <w:r>
         <w:br/>
@@ -2095,13 +2318,29 @@
         <w:br/>
       </w:r>
       <w:r>
-        <w:t xml:space="preserve">These are pretty easy. You can </w:t>
+        <w:t xml:space="preserve">These are </w:t>
+      </w:r>
+      <w:proofErr w:type="gramStart"/>
+      <w:r>
+        <w:t>pretty easy</w:t>
+      </w:r>
+      <w:proofErr w:type="gramEnd"/>
+      <w:r>
+        <w:t xml:space="preserve">. You can </w:t>
       </w:r>
       <w:r>
         <w:t>click on the left</w:t>
       </w:r>
       <w:r>
-        <w:t xml:space="preserve"> circuit breakers to close or open them. For computer keys like the DSKY or DEDA, just click on each button to press it. If you find that the computer isn't always responding to your key presses, you may be letting go of the button too quickly. Each computer key needs to be held for a small fraction of a second, and sometimes a fast click doesn't hold the button down for quite long enough. You don't need to hold them for a long time, only for a brief moment to ensure they register.</w:t>
+        <w:t xml:space="preserve"> circuit breakers to close or open them. For computer keys like the DSKY or DEDA, just click on each button to press it. If you find that the computer isn't always responding to your key presses, you may be letting go of the button too quickly. Each computer key needs to be held for a small fraction of a second, and sometimes a fast click doesn't hold the button down for quite long enough. You don't need to hold them for a long time, only for </w:t>
+      </w:r>
+      <w:proofErr w:type="gramStart"/>
+      <w:r>
+        <w:t>a brief moment</w:t>
+      </w:r>
+      <w:proofErr w:type="gramEnd"/>
+      <w:r>
+        <w:t xml:space="preserve"> to ensure they register.</w:t>
       </w:r>
       <w:r>
         <w:br/>
@@ -2166,7 +2405,15 @@
         <w:ind w:left="360"/>
       </w:pPr>
       <w:r>
-        <w:t xml:space="preserve">Thumbwheels are the vertical numbered controls, found on the gimbal trim control panel and the attitude set control panel. Left-click the upper or lower part of each thumbwheel to increase/decrease its value by 1, or right-click them to increase/decrease by 0.1. The dV/Range Set switch on the EMS works similarly: hold the switch on the top or bottom to increase or decrease the </w:t>
+        <w:t xml:space="preserve">Thumbwheels are the vertical numbered controls, found on the gimbal trim control panel and the attitude set control panel. Left-click the upper or lower part of each thumbwheel to increase/decrease its value by 1, or right-click them to increase/decrease by 0.1. The </w:t>
+      </w:r>
+      <w:proofErr w:type="spellStart"/>
+      <w:r>
+        <w:t>dV</w:t>
+      </w:r>
+      <w:proofErr w:type="spellEnd"/>
+      <w:r>
+        <w:t xml:space="preserve">/Range Set switch on the EMS works similarly: hold the switch on the top or bottom to increase or decrease the </w:t>
       </w:r>
       <w:r>
         <w:t>value and</w:t>
@@ -2194,7 +2441,15 @@
         <w:ind w:left="360"/>
       </w:pPr>
       <w:r>
-        <w:t>While the 2D cockpit has MFDs built right into its main panel, the 3D cockpit does not. To open an MFD in the 3D cockpit, move your mouse near the top of the Orbiter window. A menu bar should drop down. Click on "Function" and then choose "External MFD". If this option does not appear, make sure the "ExtMFD" module is enabled in the Orbiter settings.</w:t>
+        <w:t>While the 2D cockpit has MFDs built right into its main panel, the 3D cockpit does not. To open an MFD in the 3D cockpit, move your mouse near the top of the Orbiter window. A menu bar should drop down. Click on "Function" and then choose "External MFD". If this option does not appear, make sure the "</w:t>
+      </w:r>
+      <w:proofErr w:type="spellStart"/>
+      <w:r>
+        <w:t>ExtMFD</w:t>
+      </w:r>
+      <w:proofErr w:type="spellEnd"/>
+      <w:r>
+        <w:t>" module is enabled in the Orbiter settings.</w:t>
       </w:r>
     </w:p>
     <w:p>
@@ -2379,7 +2634,23 @@
           <w:b/>
           <w:bCs/>
         </w:rPr>
-        <w:t xml:space="preserve"> keep your save files organized!</w:t>
+        <w:t xml:space="preserve"> keep </w:t>
+      </w:r>
+      <w:proofErr w:type="gramStart"/>
+      <w:r>
+        <w:rPr>
+          <w:b/>
+          <w:bCs/>
+        </w:rPr>
+        <w:t>your save</w:t>
+      </w:r>
+      <w:proofErr w:type="gramEnd"/>
+      <w:r>
+        <w:rPr>
+          <w:b/>
+          <w:bCs/>
+        </w:rPr>
+        <w:t xml:space="preserve"> files organized!</w:t>
       </w:r>
       <w:r>
         <w:t> </w:t>
@@ -2505,16 +2776,32 @@
         <w:t>time warp</w:t>
       </w:r>
       <w:r>
-        <w:t xml:space="preserve"> normally. It will even affect vessels that you're not currently controlling: </w:t>
+        <w:t xml:space="preserve"> normally. It will even affect vessels that you're not currently </w:t>
+      </w:r>
+      <w:proofErr w:type="gramStart"/>
+      <w:r>
+        <w:t>controlling:</w:t>
+      </w:r>
+      <w:proofErr w:type="gramEnd"/>
+      <w:r>
+        <w:t xml:space="preserve"> </w:t>
       </w:r>
       <w:r>
         <w:t>time warping</w:t>
       </w:r>
       <w:r>
-        <w:t xml:space="preserve"> in the CSM while the LM is trying to hold attitude will cause problems for the LM. Usually going up to about 5x or 10x is safe. If you want to </w:t>
-      </w:r>
-      <w:r>
-        <w:t>time warp</w:t>
+        <w:t xml:space="preserve"> in the CSM while the LM is trying to hold attitude will cause problems for the LM. Usually going up to about 5x or 10x is safe. If you want </w:t>
+      </w:r>
+      <w:proofErr w:type="gramStart"/>
+      <w:r>
+        <w:t xml:space="preserve">to </w:t>
+      </w:r>
+      <w:r>
+        <w:t>time</w:t>
+      </w:r>
+      <w:proofErr w:type="gramEnd"/>
+      <w:r>
+        <w:t xml:space="preserve"> warp</w:t>
       </w:r>
       <w:r>
         <w:t xml:space="preserve"> faster, be sure to disable any kind of attitude-hold mode in the CSM and LM before </w:t>
@@ -2551,7 +2838,23 @@
         <w:br/>
       </w:r>
       <w:r>
-        <w:t xml:space="preserve">When you're performing LM activation, be sure to use the Project Apollo MFD's "ECS" section to connect the O2 hose from the CSM. This creates a flow of fresh oxygen into the LM so that the cabin doesn't fill up with deadly CO2 and poison your crew before the LM ECS is activated. Having this O2 hose connected also prevents you from closing the CSM forward hatch, so if you can't get it </w:t>
+        <w:t xml:space="preserve">When you're performing LM activation, be sure to use </w:t>
+      </w:r>
+      <w:proofErr w:type="gramStart"/>
+      <w:r>
+        <w:t>the Project</w:t>
+      </w:r>
+      <w:proofErr w:type="gramEnd"/>
+      <w:r>
+        <w:t xml:space="preserve"> Apollo MFD's "ECS" section to connect the O2 hose from the CSM. This creates a flow of fresh oxygen into the LM so that the cabin doesn't fill up with deadly CO2 and </w:t>
+      </w:r>
+      <w:proofErr w:type="gramStart"/>
+      <w:r>
+        <w:t>poison</w:t>
+      </w:r>
+      <w:proofErr w:type="gramEnd"/>
+      <w:r>
+        <w:t xml:space="preserve"> your crew before the LM ECS is activated. Having this O2 hose connected also prevents you from closing the CSM forward hatch, so if you can't get it </w:t>
       </w:r>
       <w:r>
         <w:t>too</w:t>
@@ -2584,7 +2887,15 @@
         <w:t xml:space="preserve">Some of the most common causes of sim crew death are accidents involving your LM ECS configuration. In addition to the controls in the spacecraft itself, there's also some important options in the Project Apollo MFD, in the "ECS" section. </w:t>
       </w:r>
       <w:r>
-        <w:t>LM crew can be in the cabin (unsuited), or suits with a toggleable helmet gloves on or off option.</w:t>
+        <w:t xml:space="preserve">LM crew can be in the cabin (unsuited), or suits with a </w:t>
+      </w:r>
+      <w:proofErr w:type="gramStart"/>
+      <w:r>
+        <w:t>toggleable helmet gloves</w:t>
+      </w:r>
+      <w:proofErr w:type="gramEnd"/>
+      <w:r>
+        <w:t xml:space="preserve"> on or off option.</w:t>
       </w:r>
     </w:p>
     <w:p>
@@ -2628,7 +2939,15 @@
         <w:ind w:left="360"/>
       </w:pPr>
       <w:r>
-        <w:t>If you look carefully, you will notice there are Velcro patches around the CM and LM. Clicking these will allow you to utilize various mission cue cards, window shades, glareshields etc. that were used during flight. One caveat is they are mostly Apollo 15 cue cards currently, so keep that in mind when flying other flights. We are working to find/create more mission specific cue cards in the near future.</w:t>
+        <w:t xml:space="preserve">If you look carefully, you will notice there are Velcro patches around the CM and LM. Clicking these will allow you to utilize various mission cue cards, window shades, glareshields etc. that were used during flight. One caveat is they are mostly Apollo 15 cue cards currently, so keep that in mind when flying other flights. We are working to find/create more mission specific cue cards </w:t>
+      </w:r>
+      <w:proofErr w:type="gramStart"/>
+      <w:r>
+        <w:t>in the near future</w:t>
+      </w:r>
+      <w:proofErr w:type="gramEnd"/>
+      <w:r>
+        <w:t>.</w:t>
       </w:r>
     </w:p>
     <w:p>
@@ -2745,7 +3064,7 @@
       <w:pPr>
         <w:pStyle w:val="Heading1"/>
       </w:pPr>
-      <w:bookmarkStart w:id="3" w:name="_Toc232239550"/>
+      <w:bookmarkStart w:id="3" w:name="_Toc235168510"/>
       <w:r>
         <w:lastRenderedPageBreak/>
         <w:t>Keyboard Commands:</w:t>
@@ -3256,6 +3575,7 @@
                 <w14:ligatures w14:val="none"/>
               </w:rPr>
             </w:pPr>
+            <w:proofErr w:type="spellStart"/>
             <w:r>
               <w:rPr>
                 <w:rFonts w:eastAsia="Times New Roman" w:cs="Times New Roman"/>
@@ -3265,6 +3585,7 @@
               </w:rPr>
               <w:t>Ctrl+Alt+S</w:t>
             </w:r>
+            <w:proofErr w:type="spellEnd"/>
           </w:p>
         </w:tc>
         <w:tc>
@@ -3296,8 +3617,19 @@
                 <w:kern w:val="0"/>
                 <w14:ligatures w14:val="none"/>
               </w:rPr>
-              <w:t>Generate Mission Time-Stamped Quicksave</w:t>
-            </w:r>
+              <w:t xml:space="preserve">Generate Mission Time-Stamped </w:t>
+            </w:r>
+            <w:proofErr w:type="spellStart"/>
+            <w:r>
+              <w:rPr>
+                <w:rFonts w:eastAsia="Times New Roman" w:cs="Times New Roman"/>
+                <w:color w:val="000000"/>
+                <w:kern w:val="0"/>
+                <w14:ligatures w14:val="none"/>
+              </w:rPr>
+              <w:t>Quicksave</w:t>
+            </w:r>
+            <w:proofErr w:type="spellEnd"/>
           </w:p>
         </w:tc>
       </w:tr>
@@ -3745,6 +4077,7 @@
                 <w14:ligatures w14:val="none"/>
               </w:rPr>
             </w:pPr>
+            <w:proofErr w:type="spellStart"/>
             <w:r>
               <w:rPr>
                 <w:rFonts w:eastAsia="Times New Roman" w:cs="Times New Roman"/>
@@ -3754,6 +4087,7 @@
               </w:rPr>
               <w:t>Ctrl+H</w:t>
             </w:r>
+            <w:proofErr w:type="spellEnd"/>
           </w:p>
         </w:tc>
         <w:tc>
@@ -4355,6 +4689,7 @@
                 <w14:ligatures w14:val="none"/>
               </w:rPr>
             </w:pPr>
+            <w:proofErr w:type="spellStart"/>
             <w:r>
               <w:rPr>
                 <w:rFonts w:eastAsia="Times New Roman" w:cs="Times New Roman"/>
@@ -4364,6 +4699,7 @@
               </w:rPr>
               <w:t>Alt+Numpad</w:t>
             </w:r>
+            <w:proofErr w:type="spellEnd"/>
           </w:p>
         </w:tc>
         <w:tc>
@@ -4388,6 +4724,7 @@
                 <w14:ligatures w14:val="none"/>
               </w:rPr>
             </w:pPr>
+            <w:proofErr w:type="spellStart"/>
             <w:r>
               <w:rPr>
                 <w:rFonts w:eastAsia="Times New Roman" w:cs="Times New Roman"/>
@@ -4397,6 +4734,7 @@
               </w:rPr>
               <w:t>Hardover</w:t>
             </w:r>
+            <w:proofErr w:type="spellEnd"/>
           </w:p>
         </w:tc>
       </w:tr>
@@ -4685,14 +5023,25 @@
                 <w14:ligatures w14:val="none"/>
               </w:rPr>
             </w:pPr>
-            <w:r>
-              <w:rPr>
-                <w:rFonts w:eastAsia="Times New Roman" w:cs="Times New Roman"/>
-                <w:color w:val="000000"/>
-                <w:kern w:val="0"/>
-                <w14:ligatures w14:val="none"/>
-              </w:rPr>
-              <w:t>Shift+Decimal (Numpad)</w:t>
+            <w:proofErr w:type="spellStart"/>
+            <w:r>
+              <w:rPr>
+                <w:rFonts w:eastAsia="Times New Roman" w:cs="Times New Roman"/>
+                <w:color w:val="000000"/>
+                <w:kern w:val="0"/>
+                <w14:ligatures w14:val="none"/>
+              </w:rPr>
+              <w:t>Shift+Decimal</w:t>
+            </w:r>
+            <w:proofErr w:type="spellEnd"/>
+            <w:r>
+              <w:rPr>
+                <w:rFonts w:eastAsia="Times New Roman" w:cs="Times New Roman"/>
+                <w:color w:val="000000"/>
+                <w:kern w:val="0"/>
+                <w14:ligatures w14:val="none"/>
+              </w:rPr>
+              <w:t xml:space="preserve"> (Numpad)</w:t>
             </w:r>
           </w:p>
         </w:tc>
@@ -4758,14 +5107,25 @@
                 <w14:ligatures w14:val="none"/>
               </w:rPr>
             </w:pPr>
-            <w:r>
-              <w:rPr>
-                <w:rFonts w:eastAsia="Times New Roman" w:cs="Times New Roman"/>
-                <w:color w:val="000000"/>
-                <w:kern w:val="0"/>
-                <w14:ligatures w14:val="none"/>
-              </w:rPr>
-              <w:t>Shift+Page Up</w:t>
+            <w:proofErr w:type="spellStart"/>
+            <w:r>
+              <w:rPr>
+                <w:rFonts w:eastAsia="Times New Roman" w:cs="Times New Roman"/>
+                <w:color w:val="000000"/>
+                <w:kern w:val="0"/>
+                <w14:ligatures w14:val="none"/>
+              </w:rPr>
+              <w:t>Shift+Page</w:t>
+            </w:r>
+            <w:proofErr w:type="spellEnd"/>
+            <w:r>
+              <w:rPr>
+                <w:rFonts w:eastAsia="Times New Roman" w:cs="Times New Roman"/>
+                <w:color w:val="000000"/>
+                <w:kern w:val="0"/>
+                <w14:ligatures w14:val="none"/>
+              </w:rPr>
+              <w:t xml:space="preserve"> Up</w:t>
             </w:r>
           </w:p>
         </w:tc>
@@ -4831,6 +5191,7 @@
                 <w14:ligatures w14:val="none"/>
               </w:rPr>
             </w:pPr>
+            <w:proofErr w:type="spellStart"/>
             <w:r>
               <w:rPr>
                 <w:rFonts w:eastAsia="Times New Roman" w:cs="Times New Roman"/>
@@ -4840,6 +5201,7 @@
               </w:rPr>
               <w:t>Shift+Home</w:t>
             </w:r>
+            <w:proofErr w:type="spellEnd"/>
           </w:p>
         </w:tc>
         <w:tc>
@@ -4904,14 +5266,25 @@
                 <w14:ligatures w14:val="none"/>
               </w:rPr>
             </w:pPr>
-            <w:r>
-              <w:rPr>
-                <w:rFonts w:eastAsia="Times New Roman" w:cs="Times New Roman"/>
-                <w:color w:val="000000"/>
-                <w:kern w:val="0"/>
-                <w14:ligatures w14:val="none"/>
-              </w:rPr>
-              <w:t>Shift+Enter (Numpad)</w:t>
+            <w:proofErr w:type="spellStart"/>
+            <w:r>
+              <w:rPr>
+                <w:rFonts w:eastAsia="Times New Roman" w:cs="Times New Roman"/>
+                <w:color w:val="000000"/>
+                <w:kern w:val="0"/>
+                <w14:ligatures w14:val="none"/>
+              </w:rPr>
+              <w:t>Shift+Enter</w:t>
+            </w:r>
+            <w:proofErr w:type="spellEnd"/>
+            <w:r>
+              <w:rPr>
+                <w:rFonts w:eastAsia="Times New Roman" w:cs="Times New Roman"/>
+                <w:color w:val="000000"/>
+                <w:kern w:val="0"/>
+                <w14:ligatures w14:val="none"/>
+              </w:rPr>
+              <w:t xml:space="preserve"> (Numpad)</w:t>
             </w:r>
           </w:p>
         </w:tc>
@@ -4977,14 +5350,25 @@
                 <w14:ligatures w14:val="none"/>
               </w:rPr>
             </w:pPr>
-            <w:r>
-              <w:rPr>
-                <w:rFonts w:eastAsia="Times New Roman" w:cs="Times New Roman"/>
-                <w:color w:val="000000"/>
-                <w:kern w:val="0"/>
-                <w14:ligatures w14:val="none"/>
-              </w:rPr>
-              <w:t>Shift+Divide (Numpad /)</w:t>
+            <w:proofErr w:type="spellStart"/>
+            <w:r>
+              <w:rPr>
+                <w:rFonts w:eastAsia="Times New Roman" w:cs="Times New Roman"/>
+                <w:color w:val="000000"/>
+                <w:kern w:val="0"/>
+                <w14:ligatures w14:val="none"/>
+              </w:rPr>
+              <w:t>Shift+Divide</w:t>
+            </w:r>
+            <w:proofErr w:type="spellEnd"/>
+            <w:r>
+              <w:rPr>
+                <w:rFonts w:eastAsia="Times New Roman" w:cs="Times New Roman"/>
+                <w:color w:val="000000"/>
+                <w:kern w:val="0"/>
+                <w14:ligatures w14:val="none"/>
+              </w:rPr>
+              <w:t xml:space="preserve"> (Numpad /)</w:t>
             </w:r>
           </w:p>
         </w:tc>
@@ -5050,14 +5434,25 @@
                 <w14:ligatures w14:val="none"/>
               </w:rPr>
             </w:pPr>
-            <w:r>
-              <w:rPr>
-                <w:rFonts w:eastAsia="Times New Roman" w:cs="Times New Roman"/>
-                <w:color w:val="000000"/>
-                <w:kern w:val="0"/>
-                <w14:ligatures w14:val="none"/>
-              </w:rPr>
-              <w:t>Shift+Multiply (Numpad *)</w:t>
+            <w:proofErr w:type="spellStart"/>
+            <w:r>
+              <w:rPr>
+                <w:rFonts w:eastAsia="Times New Roman" w:cs="Times New Roman"/>
+                <w:color w:val="000000"/>
+                <w:kern w:val="0"/>
+                <w14:ligatures w14:val="none"/>
+              </w:rPr>
+              <w:t>Shift+Multiply</w:t>
+            </w:r>
+            <w:proofErr w:type="spellEnd"/>
+            <w:r>
+              <w:rPr>
+                <w:rFonts w:eastAsia="Times New Roman" w:cs="Times New Roman"/>
+                <w:color w:val="000000"/>
+                <w:kern w:val="0"/>
+                <w14:ligatures w14:val="none"/>
+              </w:rPr>
+              <w:t xml:space="preserve"> (Numpad *)</w:t>
             </w:r>
           </w:p>
         </w:tc>
@@ -5123,14 +5518,25 @@
                 <w14:ligatures w14:val="none"/>
               </w:rPr>
             </w:pPr>
-            <w:r>
-              <w:rPr>
-                <w:rFonts w:eastAsia="Times New Roman" w:cs="Times New Roman"/>
-                <w:color w:val="000000"/>
-                <w:kern w:val="0"/>
-                <w14:ligatures w14:val="none"/>
-              </w:rPr>
-              <w:t>Shift+Plus (Numpad +)</w:t>
+            <w:proofErr w:type="spellStart"/>
+            <w:r>
+              <w:rPr>
+                <w:rFonts w:eastAsia="Times New Roman" w:cs="Times New Roman"/>
+                <w:color w:val="000000"/>
+                <w:kern w:val="0"/>
+                <w14:ligatures w14:val="none"/>
+              </w:rPr>
+              <w:t>Shift+Plus</w:t>
+            </w:r>
+            <w:proofErr w:type="spellEnd"/>
+            <w:r>
+              <w:rPr>
+                <w:rFonts w:eastAsia="Times New Roman" w:cs="Times New Roman"/>
+                <w:color w:val="000000"/>
+                <w:kern w:val="0"/>
+                <w14:ligatures w14:val="none"/>
+              </w:rPr>
+              <w:t xml:space="preserve"> (Numpad +)</w:t>
             </w:r>
           </w:p>
         </w:tc>
@@ -5196,14 +5602,25 @@
                 <w14:ligatures w14:val="none"/>
               </w:rPr>
             </w:pPr>
-            <w:r>
-              <w:rPr>
-                <w:rFonts w:eastAsia="Times New Roman" w:cs="Times New Roman"/>
-                <w:color w:val="000000"/>
-                <w:kern w:val="0"/>
-                <w14:ligatures w14:val="none"/>
-              </w:rPr>
-              <w:t>Shift+Minus (Numpad -)</w:t>
+            <w:proofErr w:type="spellStart"/>
+            <w:r>
+              <w:rPr>
+                <w:rFonts w:eastAsia="Times New Roman" w:cs="Times New Roman"/>
+                <w:color w:val="000000"/>
+                <w:kern w:val="0"/>
+                <w14:ligatures w14:val="none"/>
+              </w:rPr>
+              <w:t>Shift+Minus</w:t>
+            </w:r>
+            <w:proofErr w:type="spellEnd"/>
+            <w:r>
+              <w:rPr>
+                <w:rFonts w:eastAsia="Times New Roman" w:cs="Times New Roman"/>
+                <w:color w:val="000000"/>
+                <w:kern w:val="0"/>
+                <w14:ligatures w14:val="none"/>
+              </w:rPr>
+              <w:t xml:space="preserve"> (Numpad -)</w:t>
             </w:r>
           </w:p>
         </w:tc>
@@ -5269,6 +5686,7 @@
                 <w14:ligatures w14:val="none"/>
               </w:rPr>
             </w:pPr>
+            <w:proofErr w:type="spellStart"/>
             <w:r>
               <w:rPr>
                 <w:rFonts w:eastAsia="Times New Roman" w:cs="Times New Roman"/>
@@ -5278,6 +5696,7 @@
               </w:rPr>
               <w:t>Shift+End</w:t>
             </w:r>
+            <w:proofErr w:type="spellEnd"/>
           </w:p>
         </w:tc>
         <w:tc>
@@ -6942,6 +7361,7 @@
                 <w14:ligatures w14:val="none"/>
               </w:rPr>
             </w:pPr>
+            <w:proofErr w:type="spellStart"/>
             <w:r>
               <w:rPr>
                 <w:rFonts w:eastAsia="Times New Roman" w:cs="Times New Roman"/>
@@ -6951,6 +7371,7 @@
               </w:rPr>
               <w:t>Shift+S</w:t>
             </w:r>
+            <w:proofErr w:type="spellEnd"/>
           </w:p>
         </w:tc>
         <w:tc>
@@ -7015,6 +7436,7 @@
                 <w14:ligatures w14:val="none"/>
               </w:rPr>
             </w:pPr>
+            <w:proofErr w:type="spellStart"/>
             <w:r>
               <w:rPr>
                 <w:rFonts w:eastAsia="Times New Roman" w:cs="Times New Roman"/>
@@ -7024,6 +7446,7 @@
               </w:rPr>
               <w:t>Shift+A</w:t>
             </w:r>
+            <w:proofErr w:type="spellEnd"/>
           </w:p>
         </w:tc>
         <w:tc>
@@ -7088,6 +7511,7 @@
                 <w14:ligatures w14:val="none"/>
               </w:rPr>
             </w:pPr>
+            <w:proofErr w:type="spellStart"/>
             <w:r>
               <w:rPr>
                 <w:rFonts w:eastAsia="Times New Roman" w:cs="Times New Roman"/>
@@ -7097,6 +7521,7 @@
               </w:rPr>
               <w:t>Shift+D</w:t>
             </w:r>
+            <w:proofErr w:type="spellEnd"/>
           </w:p>
         </w:tc>
         <w:tc>
@@ -7161,6 +7586,7 @@
                 <w14:ligatures w14:val="none"/>
               </w:rPr>
             </w:pPr>
+            <w:proofErr w:type="spellStart"/>
             <w:r>
               <w:rPr>
                 <w:rFonts w:eastAsia="Times New Roman" w:cs="Times New Roman"/>
@@ -7170,6 +7596,7 @@
               </w:rPr>
               <w:t>Shift+Q</w:t>
             </w:r>
+            <w:proofErr w:type="spellEnd"/>
           </w:p>
         </w:tc>
         <w:tc>
@@ -7234,6 +7661,7 @@
                 <w14:ligatures w14:val="none"/>
               </w:rPr>
             </w:pPr>
+            <w:proofErr w:type="spellStart"/>
             <w:r>
               <w:rPr>
                 <w:rFonts w:eastAsia="Times New Roman" w:cs="Times New Roman"/>
@@ -7243,6 +7671,7 @@
               </w:rPr>
               <w:t>Shift+E</w:t>
             </w:r>
+            <w:proofErr w:type="spellEnd"/>
           </w:p>
         </w:tc>
         <w:tc>
@@ -8496,14 +8925,25 @@
                 <w14:ligatures w14:val="none"/>
               </w:rPr>
             </w:pPr>
-            <w:r>
-              <w:rPr>
-                <w:rFonts w:eastAsia="Times New Roman" w:cs="Times New Roman"/>
-                <w:color w:val="000000"/>
-                <w:kern w:val="0"/>
-                <w14:ligatures w14:val="none"/>
-              </w:rPr>
-              <w:t>Ctrl+Decimal (Numpad .)</w:t>
+            <w:proofErr w:type="spellStart"/>
+            <w:r>
+              <w:rPr>
+                <w:rFonts w:eastAsia="Times New Roman" w:cs="Times New Roman"/>
+                <w:color w:val="000000"/>
+                <w:kern w:val="0"/>
+                <w14:ligatures w14:val="none"/>
+              </w:rPr>
+              <w:t>Ctrl+Decimal</w:t>
+            </w:r>
+            <w:proofErr w:type="spellEnd"/>
+            <w:r>
+              <w:rPr>
+                <w:rFonts w:eastAsia="Times New Roman" w:cs="Times New Roman"/>
+                <w:color w:val="000000"/>
+                <w:kern w:val="0"/>
+                <w14:ligatures w14:val="none"/>
+              </w:rPr>
+              <w:t xml:space="preserve"> (Numpad .)</w:t>
             </w:r>
           </w:p>
         </w:tc>
@@ -8569,14 +9009,25 @@
                 <w14:ligatures w14:val="none"/>
               </w:rPr>
             </w:pPr>
-            <w:r>
-              <w:rPr>
-                <w:rFonts w:eastAsia="Times New Roman" w:cs="Times New Roman"/>
-                <w:color w:val="000000"/>
-                <w:kern w:val="0"/>
-                <w14:ligatures w14:val="none"/>
-              </w:rPr>
-              <w:t>Ctrl+Enter (Numpad)</w:t>
+            <w:proofErr w:type="spellStart"/>
+            <w:r>
+              <w:rPr>
+                <w:rFonts w:eastAsia="Times New Roman" w:cs="Times New Roman"/>
+                <w:color w:val="000000"/>
+                <w:kern w:val="0"/>
+                <w14:ligatures w14:val="none"/>
+              </w:rPr>
+              <w:t>Ctrl+Enter</w:t>
+            </w:r>
+            <w:proofErr w:type="spellEnd"/>
+            <w:r>
+              <w:rPr>
+                <w:rFonts w:eastAsia="Times New Roman" w:cs="Times New Roman"/>
+                <w:color w:val="000000"/>
+                <w:kern w:val="0"/>
+                <w14:ligatures w14:val="none"/>
+              </w:rPr>
+              <w:t xml:space="preserve"> (Numpad)</w:t>
             </w:r>
           </w:p>
         </w:tc>
@@ -8642,14 +9093,25 @@
                 <w14:ligatures w14:val="none"/>
               </w:rPr>
             </w:pPr>
-            <w:r>
-              <w:rPr>
-                <w:rFonts w:eastAsia="Times New Roman" w:cs="Times New Roman"/>
-                <w:color w:val="000000"/>
-                <w:kern w:val="0"/>
-                <w14:ligatures w14:val="none"/>
-              </w:rPr>
-              <w:t>Ctrl+Page Up</w:t>
+            <w:proofErr w:type="spellStart"/>
+            <w:r>
+              <w:rPr>
+                <w:rFonts w:eastAsia="Times New Roman" w:cs="Times New Roman"/>
+                <w:color w:val="000000"/>
+                <w:kern w:val="0"/>
+                <w14:ligatures w14:val="none"/>
+              </w:rPr>
+              <w:t>Ctrl+Page</w:t>
+            </w:r>
+            <w:proofErr w:type="spellEnd"/>
+            <w:r>
+              <w:rPr>
+                <w:rFonts w:eastAsia="Times New Roman" w:cs="Times New Roman"/>
+                <w:color w:val="000000"/>
+                <w:kern w:val="0"/>
+                <w14:ligatures w14:val="none"/>
+              </w:rPr>
+              <w:t xml:space="preserve"> Up</w:t>
             </w:r>
           </w:p>
         </w:tc>
@@ -8715,14 +9177,25 @@
                 <w14:ligatures w14:val="none"/>
               </w:rPr>
             </w:pPr>
-            <w:r>
-              <w:rPr>
-                <w:rFonts w:eastAsia="Times New Roman" w:cs="Times New Roman"/>
-                <w:color w:val="000000"/>
-                <w:kern w:val="0"/>
-                <w14:ligatures w14:val="none"/>
-              </w:rPr>
-              <w:t>Ctrl+Multiply (Numpad *)</w:t>
+            <w:proofErr w:type="spellStart"/>
+            <w:r>
+              <w:rPr>
+                <w:rFonts w:eastAsia="Times New Roman" w:cs="Times New Roman"/>
+                <w:color w:val="000000"/>
+                <w:kern w:val="0"/>
+                <w14:ligatures w14:val="none"/>
+              </w:rPr>
+              <w:t>Ctrl+Multiply</w:t>
+            </w:r>
+            <w:proofErr w:type="spellEnd"/>
+            <w:r>
+              <w:rPr>
+                <w:rFonts w:eastAsia="Times New Roman" w:cs="Times New Roman"/>
+                <w:color w:val="000000"/>
+                <w:kern w:val="0"/>
+                <w14:ligatures w14:val="none"/>
+              </w:rPr>
+              <w:t xml:space="preserve"> (Numpad *)</w:t>
             </w:r>
           </w:p>
         </w:tc>
@@ -8788,14 +9261,25 @@
                 <w14:ligatures w14:val="none"/>
               </w:rPr>
             </w:pPr>
-            <w:r>
-              <w:rPr>
-                <w:rFonts w:eastAsia="Times New Roman" w:cs="Times New Roman"/>
-                <w:color w:val="000000"/>
-                <w:kern w:val="0"/>
-                <w14:ligatures w14:val="none"/>
-              </w:rPr>
-              <w:t>Ctrl+Plus (Numpad +)</w:t>
+            <w:proofErr w:type="spellStart"/>
+            <w:r>
+              <w:rPr>
+                <w:rFonts w:eastAsia="Times New Roman" w:cs="Times New Roman"/>
+                <w:color w:val="000000"/>
+                <w:kern w:val="0"/>
+                <w14:ligatures w14:val="none"/>
+              </w:rPr>
+              <w:t>Ctrl+Plus</w:t>
+            </w:r>
+            <w:proofErr w:type="spellEnd"/>
+            <w:r>
+              <w:rPr>
+                <w:rFonts w:eastAsia="Times New Roman" w:cs="Times New Roman"/>
+                <w:color w:val="000000"/>
+                <w:kern w:val="0"/>
+                <w14:ligatures w14:val="none"/>
+              </w:rPr>
+              <w:t xml:space="preserve"> (Numpad +)</w:t>
             </w:r>
           </w:p>
         </w:tc>
@@ -8861,14 +9345,25 @@
                 <w14:ligatures w14:val="none"/>
               </w:rPr>
             </w:pPr>
-            <w:r>
-              <w:rPr>
-                <w:rFonts w:eastAsia="Times New Roman" w:cs="Times New Roman"/>
-                <w:color w:val="000000"/>
-                <w:kern w:val="0"/>
-                <w14:ligatures w14:val="none"/>
-              </w:rPr>
-              <w:t>Ctrl+Minus (Numpad -)</w:t>
+            <w:proofErr w:type="spellStart"/>
+            <w:r>
+              <w:rPr>
+                <w:rFonts w:eastAsia="Times New Roman" w:cs="Times New Roman"/>
+                <w:color w:val="000000"/>
+                <w:kern w:val="0"/>
+                <w14:ligatures w14:val="none"/>
+              </w:rPr>
+              <w:t>Ctrl+Minus</w:t>
+            </w:r>
+            <w:proofErr w:type="spellEnd"/>
+            <w:r>
+              <w:rPr>
+                <w:rFonts w:eastAsia="Times New Roman" w:cs="Times New Roman"/>
+                <w:color w:val="000000"/>
+                <w:kern w:val="0"/>
+                <w14:ligatures w14:val="none"/>
+              </w:rPr>
+              <w:t xml:space="preserve"> (Numpad -)</w:t>
             </w:r>
           </w:p>
         </w:tc>
@@ -9327,6 +9822,7 @@
                 <w14:ligatures w14:val="none"/>
               </w:rPr>
             </w:pPr>
+            <w:proofErr w:type="spellStart"/>
             <w:r>
               <w:rPr>
                 <w:rFonts w:eastAsia="Times New Roman" w:cs="Times New Roman"/>
@@ -9336,6 +9832,7 @@
               </w:rPr>
               <w:t>Alt+W</w:t>
             </w:r>
+            <w:proofErr w:type="spellEnd"/>
           </w:p>
         </w:tc>
         <w:tc>
@@ -9473,6 +9970,7 @@
                 <w14:ligatures w14:val="none"/>
               </w:rPr>
             </w:pPr>
+            <w:proofErr w:type="spellStart"/>
             <w:r>
               <w:rPr>
                 <w:rFonts w:eastAsia="Times New Roman" w:cs="Times New Roman"/>
@@ -9482,6 +9980,7 @@
               </w:rPr>
               <w:t>Alt+S</w:t>
             </w:r>
+            <w:proofErr w:type="spellEnd"/>
           </w:p>
         </w:tc>
         <w:tc>
@@ -9900,14 +10399,25 @@
                 <w14:ligatures w14:val="none"/>
               </w:rPr>
             </w:pPr>
-            <w:r>
-              <w:rPr>
-                <w:rFonts w:eastAsia="Times New Roman" w:cs="Times New Roman"/>
-                <w:color w:val="000000"/>
-                <w:kern w:val="0"/>
-                <w14:ligatures w14:val="none"/>
-              </w:rPr>
-              <w:t>Increase Descent Rate</w:t>
+            <w:proofErr w:type="gramStart"/>
+            <w:r>
+              <w:rPr>
+                <w:rFonts w:eastAsia="Times New Roman" w:cs="Times New Roman"/>
+                <w:color w:val="000000"/>
+                <w:kern w:val="0"/>
+                <w14:ligatures w14:val="none"/>
+              </w:rPr>
+              <w:t>Increase</w:t>
+            </w:r>
+            <w:proofErr w:type="gramEnd"/>
+            <w:r>
+              <w:rPr>
+                <w:rFonts w:eastAsia="Times New Roman" w:cs="Times New Roman"/>
+                <w:color w:val="000000"/>
+                <w:kern w:val="0"/>
+                <w14:ligatures w14:val="none"/>
+              </w:rPr>
+              <w:t xml:space="preserve"> Descent Rate</w:t>
             </w:r>
           </w:p>
         </w:tc>
@@ -10466,14 +10976,25 @@
                 <w14:ligatures w14:val="none"/>
               </w:rPr>
             </w:pPr>
-            <w:r>
-              <w:rPr>
-                <w:rFonts w:eastAsia="Times New Roman" w:cs="Times New Roman"/>
-                <w:color w:val="000000"/>
-                <w:kern w:val="0"/>
-                <w14:ligatures w14:val="none"/>
-              </w:rPr>
-              <w:t>Abort Stage PUSH</w:t>
+            <w:proofErr w:type="gramStart"/>
+            <w:r>
+              <w:rPr>
+                <w:rFonts w:eastAsia="Times New Roman" w:cs="Times New Roman"/>
+                <w:color w:val="000000"/>
+                <w:kern w:val="0"/>
+                <w14:ligatures w14:val="none"/>
+              </w:rPr>
+              <w:t>Abort</w:t>
+            </w:r>
+            <w:proofErr w:type="gramEnd"/>
+            <w:r>
+              <w:rPr>
+                <w:rFonts w:eastAsia="Times New Roman" w:cs="Times New Roman"/>
+                <w:color w:val="000000"/>
+                <w:kern w:val="0"/>
+                <w14:ligatures w14:val="none"/>
+              </w:rPr>
+              <w:t xml:space="preserve"> Stage PUSH</w:t>
             </w:r>
           </w:p>
         </w:tc>
@@ -10796,6 +11317,7 @@
                 <w14:ligatures w14:val="none"/>
               </w:rPr>
             </w:pPr>
+            <w:proofErr w:type="spellStart"/>
             <w:r>
               <w:rPr>
                 <w:rFonts w:eastAsia="Times New Roman" w:cs="Times New Roman"/>
@@ -10805,6 +11327,7 @@
               </w:rPr>
               <w:t>Ctrl+Alt+Numpad</w:t>
             </w:r>
+            <w:proofErr w:type="spellEnd"/>
           </w:p>
         </w:tc>
         <w:tc>
@@ -12707,7 +13230,7 @@
       <w:pPr>
         <w:pStyle w:val="Heading1"/>
       </w:pPr>
-      <w:bookmarkStart w:id="5" w:name="_Toc232239551"/>
+      <w:bookmarkStart w:id="5" w:name="_Toc235168511"/>
       <w:r>
         <w:lastRenderedPageBreak/>
         <w:t>Important Links:</w:t>

</xml_diff>